<commit_message>
Component Responsibility Design (#350)
</commit_message>
<xml_diff>
--- a/Software Architecture Design.docx
+++ b/Software Architecture Design.docx
@@ -2768,8 +2768,217 @@
     </w:p>
     <w:p>
       <w:pPr>
+        <w:pStyle w:val="Heading2"/>
+      </w:pPr>
+      <w:r>
+        <w:lastRenderedPageBreak/>
+        <w:t>Component Responsibility Design</w:t>
+      </w:r>
+    </w:p>
+    <w:p>
+      <w:r>
+        <w:t>After the identification of the key software components, it becomes important to outline the responsibilities assigned to each of these components. Component responsibility design presupposes the allocation of a certain set of functionalities to each component separately. This practice allows reducing dependencies between components, increasing maintainability of the system, and making its implementation easier.</w:t>
+      </w:r>
+    </w:p>
+    <w:p>
+      <w:r>
+        <w:t>The responsibilities of each component have been derived based on the functional requirements, use cases, and domain model generated during the analysis phase. Each component encapsulates a particular set of business operations and interacts with other components through a clearly defined interface. Such an approach allows increasing the level of modularity of the system, independently testing components, and extending the system in the future.</w:t>
+      </w:r>
+    </w:p>
+    <w:p>
+      <w:pPr>
         <w:pStyle w:val="Title"/>
-      </w:pPr>
+        <w:spacing w:line="240" w:lineRule="auto"/>
+        <w:rPr>
+          <w:b w:val="0"/>
+          <w:bCs/>
+        </w:rPr>
+      </w:pPr>
+      <w:r>
+        <w:rPr>
+          <w:b w:val="0"/>
+          <w:bCs/>
+        </w:rPr>
+        <w:t>Below, there are descriptions of the responsibilities of the main business components that implement the core functionalities of the KriGo platform for vehicle rental.</w:t>
+      </w:r>
+    </w:p>
+    <w:p>
+      <w:pPr>
+        <w:pStyle w:val="Heading3"/>
+      </w:pPr>
+      <w:r>
+        <w:t>Authentication Component</w:t>
+      </w:r>
+    </w:p>
+    <w:p>
+      <w:r>
+        <w:t>The responsibility of the Authentication Component is the assurance of the secure access to the KriGo platform. This component performs authentication and authorization processes by identifying the user and regulating its access to protected system resources according to the user role. Moreover, it provides the confidentiality of user passwords by means of encryption and token-based authentication. Also, the component manages the user sessions and password recovery services.</w:t>
+      </w:r>
+    </w:p>
+    <w:p>
+      <w:pPr>
+        <w:pStyle w:val="Heading3"/>
+      </w:pPr>
+      <w:r>
+        <w:t>User Management Component</w:t>
+      </w:r>
+    </w:p>
+    <w:p>
+      <w:r>
+        <w:t>The User Management Component is responsible for the management of all user-related information in the platform. The component provides services for the administration of customer, agency, employee, and administrator profiles ensuring the integrity of account data. The component enables the creation, modification, retrieval, activation, and suspension of the user accounts. Thus, it provides the administration of user information in compliance with the business rules.</w:t>
+      </w:r>
+    </w:p>
+    <w:p>
+      <w:pPr>
+        <w:pStyle w:val="Heading3"/>
+      </w:pPr>
+      <w:r>
+        <w:t>Fleet Management Component</w:t>
+      </w:r>
+    </w:p>
+    <w:p>
+      <w:r>
+        <w:t>The Fleet Management Component is responsible for the full lifecycle of the vehicles registered in the platform. The component manages vehicle registration, updates the information about the vehicle, regulates its availability status, stores pricing information, and registers maintenance activities. Additionally, the component is responsible for the allocation of the vehicles to rental branches. As a result, the fleet information is always updated.</w:t>
+      </w:r>
+    </w:p>
+    <w:p>
+      <w:pPr>
+        <w:pStyle w:val="Heading3"/>
+      </w:pPr>
+      <w:r>
+        <w:t>Reservation Management Component</w:t>
+      </w:r>
+    </w:p>
+    <w:p>
+      <w:r>
+        <w:t>The Reservation Management Component represents a central business component of the KriGo platform. It coordinates the whole reservation process, starting from the creation of the reservation and ending with its successful completion or cancellation. During this process, the component checks the availability of the vehicle, calculates the rental costs, verifies the information, and regulates the transition of the status of the reservation. All this happens in compliance with the business rules of vehicle rentals.</w:t>
+      </w:r>
+    </w:p>
+    <w:p>
+      <w:pPr>
+        <w:spacing w:line="278" w:lineRule="auto"/>
+        <w:rPr>
+          <w:rFonts w:eastAsiaTheme="majorEastAsia" w:cstheme="majorBidi"/>
+          <w:bCs/>
+          <w:color w:val="000000" w:themeColor="text1"/>
+          <w:spacing w:val="-10"/>
+          <w:kern w:val="28"/>
+          <w:szCs w:val="56"/>
+        </w:rPr>
+      </w:pPr>
+      <w:r>
+        <w:rPr>
+          <w:b/>
+          <w:bCs/>
+        </w:rPr>
+        <w:br w:type="page"/>
+      </w:r>
+    </w:p>
+    <w:p>
+      <w:pPr>
+        <w:pStyle w:val="Heading3"/>
+      </w:pPr>
+      <w:r>
+        <w:lastRenderedPageBreak/>
+        <w:t>Payment Management Component</w:t>
+      </w:r>
+    </w:p>
+    <w:p>
+      <w:r>
+        <w:t>The Payment Management Component manages all the financial transactions connected with the vehicle reservations. It works together with the Algeria Post Edahabia payment gateway, performing electronic payments securely and reliably. Also, it manages the verification of the transaction results, storing payment information, refunding payments, and managing a complete history of financial transactions performed through the platform.</w:t>
+      </w:r>
+    </w:p>
+    <w:p>
+      <w:pPr>
+        <w:pStyle w:val="Heading3"/>
+      </w:pPr>
+      <w:r>
+        <w:t>Agency Management Component</w:t>
+      </w:r>
+    </w:p>
+    <w:p>
+      <w:r>
+        <w:t>The Agency Management Component helps to administrate the rental agencies working in the platform. It manages the registration of agencies, the procedure of their verification, the administration of branches, and the allocation of employees. In addition, the component regulates the approval workflow that should take place before the agency can start its work in the platform. Therefore, it guarantees that only verified agencies provide their services.</w:t>
+      </w:r>
+    </w:p>
+    <w:p>
+      <w:pPr>
+        <w:pStyle w:val="Heading3"/>
+      </w:pPr>
+      <w:r>
+        <w:t>Review Management Component</w:t>
+      </w:r>
+    </w:p>
+    <w:p>
+      <w:r>
+        <w:t>The Review Management Component allows customers to evaluate their rental experience by means of rating and writing reviews. Besides the management of customer feedback, the component moderates it to guarantee that the reviews are valid and meet the quality standards and community guidelines. Reviews collected by the component help to improve the service quality and make better decisions for future customers.</w:t>
+      </w:r>
+    </w:p>
+    <w:p>
+      <w:pPr>
+        <w:pStyle w:val="Heading3"/>
+      </w:pPr>
+      <w:r>
+        <w:t>Dispute Management Component</w:t>
+      </w:r>
+    </w:p>
+    <w:p>
+      <w:r>
+        <w:t>The Dispute Management Component manages the disputes between the customers and rental agencies during the process of reservations. The component provides the submission of complaints, the coordination of investigation procedures, the recording of the administrative decisions, and the monitoring of the dispute resolution until the end of the case.</w:t>
+      </w:r>
+    </w:p>
+    <w:p>
+      <w:pPr>
+        <w:pStyle w:val="Heading3"/>
+      </w:pPr>
+      <w:r>
+        <w:t>Notification Component</w:t>
+      </w:r>
+    </w:p>
+    <w:p>
+      <w:r>
+        <w:t>The Notification Component helps to manage the communication between the platform and its users by creating and sending system notifications through different channels. These notifications include the confirmation of the reservation, the update of the payments, the results of agency verification, the reminders, and other events. As a result, users get the opportunity to be aware of the processes occurring in the system.</w:t>
+      </w:r>
+    </w:p>
+    <w:p>
+      <w:pPr>
+        <w:pStyle w:val="Heading3"/>
+      </w:pPr>
+      <w:r>
+        <w:t>AI Recommendation Component</w:t>
+      </w:r>
+    </w:p>
+    <w:p>
+      <w:r>
+        <w:t>The AI Recommendation Component analyzes the customer preferences, historical reservations, and behavioral patterns. On the basis of this analysis, it provides the recommendations for the selection of the vehicles that suit customers the most.</w:t>
+      </w:r>
+    </w:p>
+    <w:p>
+      <w:pPr>
+        <w:pStyle w:val="Heading3"/>
+      </w:pPr>
+      <w:r>
+        <w:t>AI Assistant Component</w:t>
+      </w:r>
+    </w:p>
+    <w:p>
+      <w:r>
+        <w:t>The AI Assistant Component provides intelligent conversational assistance using the techniques of the natural language processing. The component responds to customer requests, assists users during the reservation activities, provides the recommendations for vehicle selection, and answers the frequently asked questions.</w:t>
+      </w:r>
+    </w:p>
+    <w:p>
+      <w:pPr>
+        <w:pStyle w:val="Heading3"/>
+      </w:pPr>
+      <w:r>
+        <w:lastRenderedPageBreak/>
+        <w:t>Analytics Component</w:t>
+      </w:r>
+    </w:p>
+    <w:p>
+      <w:r>
+        <w:t>The Analytics Component transforms the data of the system operation into business information by means of generating statistical reports and analytical dashboards. The component processes the data related to reservations, payments, the utilization of vehicles, the activities of customers, and the performance of agencies. The generated insights allow administrators to monitor the system performance.</w:t>
+      </w:r>
     </w:p>
     <w:sectPr>
       <w:headerReference w:type="default" r:id="rId19"/>

</xml_diff>

<commit_message>
Dependency Analysis (#351) System Component Design (#348)
</commit_message>
<xml_diff>
--- a/Software Architecture Design.docx
+++ b/Software Architecture Design.docx
@@ -2980,6 +2980,335 @@
         <w:t>The Analytics Component transforms the data of the system operation into business information by means of generating statistical reports and analytical dashboards. The component processes the data related to reservations, payments, the utilization of vehicles, the activities of customers, and the performance of agencies. The generated insights allow administrators to monitor the system performance.</w:t>
       </w:r>
     </w:p>
+    <w:p>
+      <w:pPr>
+        <w:pStyle w:val="Heading2"/>
+      </w:pPr>
+      <w:r>
+        <w:t>Dependency Analysis</w:t>
+      </w:r>
+    </w:p>
+    <w:p>
+      <w:pPr>
+        <w:rPr>
+          <w:b/>
+        </w:rPr>
+      </w:pPr>
+      <w:r>
+        <w:t>Component-based architecture will be effective not only due to the roles assigned to each component but also because of how all these components interact to complete the processes of the system. Dependency analysis will help identify the relations between the components, determine what services should be exchanged through the interfaces of these components and ensure consistency of the interaction according to the principles of loose coupling and cohesion in architecture. Components in the KriGo system do not interact directly with each other; rather, the communication takes place through the services of interfaces of these components and thus makes each of them independent from the inner workings of other components.</w:t>
+      </w:r>
+    </w:p>
+    <w:p>
+      <w:pPr>
+        <w:pStyle w:val="Heading3"/>
+      </w:pPr>
+      <w:r>
+        <w:t>Business Component Dependencies</w:t>
+      </w:r>
+    </w:p>
+    <w:p>
+      <w:r>
+        <w:t>Each component of the KriGo platform works together to implement the entire workflow of renting a car. Each component relies solely on services needed to execute its tasks but exposes its own services via standard interfaces.</w:t>
+      </w:r>
+    </w:p>
+    <w:p>
+      <w:pPr>
+        <w:pStyle w:val="ListParagraph"/>
+        <w:numPr>
+          <w:ilvl w:val="0"/>
+          <w:numId w:val="166"/>
+        </w:numPr>
+        <w:spacing w:after="0"/>
+      </w:pPr>
+      <w:r>
+        <w:rPr>
+          <w:b/>
+          <w:bCs/>
+        </w:rPr>
+        <w:t>Authentication Component</w:t>
+      </w:r>
+      <w:r>
+        <w:t xml:space="preserve"> is the basic service of the platform. Due to the fact that authentication and authorization are the prerequisites for any interaction in the system, almost every business component depends on authentication services implicitly before executing its.</w:t>
+      </w:r>
+    </w:p>
+    <w:p>
+      <w:pPr>
+        <w:pStyle w:val="ListParagraph"/>
+        <w:numPr>
+          <w:ilvl w:val="0"/>
+          <w:numId w:val="166"/>
+        </w:numPr>
+        <w:spacing w:after="0"/>
+      </w:pPr>
+      <w:r>
+        <w:rPr>
+          <w:b/>
+          <w:bCs/>
+        </w:rPr>
+        <w:t>The User Management Component</w:t>
+      </w:r>
+      <w:r>
+        <w:t xml:space="preserve"> provides customer and agency information for several components. The Reservation Management Component uses customer information while creating a reservation, and AI services use customer profile and rental history to provide personalized recommendations and responses.</w:t>
+      </w:r>
+    </w:p>
+    <w:p>
+      <w:pPr>
+        <w:pStyle w:val="ListParagraph"/>
+        <w:numPr>
+          <w:ilvl w:val="0"/>
+          <w:numId w:val="166"/>
+        </w:numPr>
+        <w:spacing w:after="0"/>
+      </w:pPr>
+      <w:r>
+        <w:rPr>
+          <w:b/>
+          <w:bCs/>
+        </w:rPr>
+        <w:t>The Reservation Management Component</w:t>
+      </w:r>
+      <w:r>
+        <w:t xml:space="preserve"> is a core coordination component of the platform. It cooperates with the Fleet Management Component to check the availability of the vehicle, contacts the Payment Management Component to process reservation payments, and calls the Notification Component to notify users of certain reservation events. Additionally, the information from reservations is used as one of the sources of data by the Analytics and AI components.</w:t>
+      </w:r>
+    </w:p>
+    <w:p>
+      <w:pPr>
+        <w:pStyle w:val="ListParagraph"/>
+        <w:numPr>
+          <w:ilvl w:val="0"/>
+          <w:numId w:val="166"/>
+        </w:numPr>
+        <w:spacing w:after="0"/>
+      </w:pPr>
+      <w:r>
+        <w:rPr>
+          <w:b/>
+          <w:bCs/>
+        </w:rPr>
+        <w:t>The Fleet Management Component</w:t>
+      </w:r>
+      <w:r>
+        <w:t xml:space="preserve"> provides vehicle availability, price, maintenance status, and branch assignment information to the Reservation Management Component and the AI Recommendation Component. This dependency ensures that users will only be able to make reservations for available vehicles and get recommendations accordingly.</w:t>
+      </w:r>
+    </w:p>
+    <w:p>
+      <w:pPr>
+        <w:pStyle w:val="ListParagraph"/>
+        <w:numPr>
+          <w:ilvl w:val="0"/>
+          <w:numId w:val="166"/>
+        </w:numPr>
+        <w:spacing w:after="0"/>
+      </w:pPr>
+      <w:r>
+        <w:rPr>
+          <w:b/>
+          <w:bCs/>
+        </w:rPr>
+        <w:t>The Payment Management Component</w:t>
+      </w:r>
+      <w:r>
+        <w:t xml:space="preserve"> depends on external payment gateway to process transaction and notifies Reservation Management Component of the results of the operation. If the payment is successful, it leads to confirmation of the reservation, and failed transaction will result in reservation cancelation.</w:t>
+      </w:r>
+    </w:p>
+    <w:p>
+      <w:pPr>
+        <w:pStyle w:val="ListParagraph"/>
+        <w:numPr>
+          <w:ilvl w:val="0"/>
+          <w:numId w:val="166"/>
+        </w:numPr>
+        <w:spacing w:after="0"/>
+      </w:pPr>
+      <w:r>
+        <w:rPr>
+          <w:b/>
+          <w:bCs/>
+        </w:rPr>
+        <w:t>Agency Management Component</w:t>
+      </w:r>
+      <w:r>
+        <w:t xml:space="preserve"> cooperates with the Fleet Management Component for vehicle assignments, with Authentication Component for secured access for employees, and cloud storage services for verification of agency documents.</w:t>
+      </w:r>
+    </w:p>
+    <w:p>
+      <w:pPr>
+        <w:pStyle w:val="ListParagraph"/>
+        <w:numPr>
+          <w:ilvl w:val="0"/>
+          <w:numId w:val="166"/>
+        </w:numPr>
+        <w:spacing w:after="0"/>
+      </w:pPr>
+      <w:r>
+        <w:rPr>
+          <w:b/>
+          <w:bCs/>
+        </w:rPr>
+        <w:t>Review Management Component</w:t>
+      </w:r>
+      <w:r>
+        <w:t xml:space="preserve"> needs information about completed reservation before allowing customers to leave reviews.</w:t>
+      </w:r>
+    </w:p>
+    <w:p>
+      <w:pPr>
+        <w:pStyle w:val="ListParagraph"/>
+        <w:numPr>
+          <w:ilvl w:val="0"/>
+          <w:numId w:val="166"/>
+        </w:numPr>
+        <w:spacing w:after="0"/>
+      </w:pPr>
+      <w:r>
+        <w:rPr>
+          <w:b/>
+          <w:bCs/>
+        </w:rPr>
+        <w:lastRenderedPageBreak/>
+        <w:t>Dispute Management Component</w:t>
+      </w:r>
+      <w:r>
+        <w:t xml:space="preserve"> interacts with information from reservations and payments while processing customer complaints and cooperates with Notification Component to inform stakeholders about the situation with disputes.</w:t>
+      </w:r>
+    </w:p>
+    <w:p>
+      <w:pPr>
+        <w:pStyle w:val="ListParagraph"/>
+        <w:numPr>
+          <w:ilvl w:val="0"/>
+          <w:numId w:val="166"/>
+        </w:numPr>
+      </w:pPr>
+      <w:r>
+        <w:rPr>
+          <w:b/>
+          <w:bCs/>
+        </w:rPr>
+        <w:t>The AI Recommendation Component</w:t>
+      </w:r>
+      <w:r>
+        <w:t xml:space="preserve"> primarily depends on customer profile, reservation history, and vehicle information in order to provide recommendations. Similarly, the AI Assistant Component uses customer, reservation, and fleet information to give relevant responses to user interactions.</w:t>
+      </w:r>
+    </w:p>
+    <w:p>
+      <w:pPr>
+        <w:rPr>
+          <w:b/>
+        </w:rPr>
+      </w:pPr>
+      <w:r>
+        <w:t>Finally, the Analytics Component collects operational data provided by all major business components reservations, payments, vehicle management, agencies, and customer information  to generate reports and business intelligence dashboards.</w:t>
+      </w:r>
+    </w:p>
+    <w:p>
+      <w:pPr>
+        <w:pStyle w:val="Heading3"/>
+      </w:pPr>
+      <w:r>
+        <w:t>Data Access Dependencies</w:t>
+      </w:r>
+    </w:p>
+    <w:p>
+      <w:pPr>
+        <w:spacing w:after="0"/>
+      </w:pPr>
+      <w:r>
+        <w:t>Interactions between the business components and the persistent store occur only through the Data Access Layer. Instead of communicating with database management systems directly, the components use repository APIs in order to conduct data operations.</w:t>
+      </w:r>
+      <w:r>
+        <w:t xml:space="preserve"> </w:t>
+      </w:r>
+      <w:r>
+        <w:t>Thus, business logic becomes separated from the persistence layer, making possible for database technologies to be changed independently of the application services. Moreover, this design allows easier maintenance of code and conducting unit tests of repositories.</w:t>
+      </w:r>
+    </w:p>
+    <w:p>
+      <w:pPr>
+        <w:pStyle w:val="Heading3"/>
+      </w:pPr>
+      <w:r>
+        <w:t>Infrastructure Dependencies</w:t>
+      </w:r>
+    </w:p>
+    <w:p>
+      <w:pPr>
+        <w:spacing w:after="0"/>
+      </w:pPr>
+      <w:r>
+        <w:t>There are certain business units that depend on services provided by the infrastructure for handling the non-functional aspects of asynchronous notification, file handling, and communication.</w:t>
+      </w:r>
+      <w:r>
+        <w:t xml:space="preserve"> </w:t>
+      </w:r>
+      <w:r>
+        <w:t>The Notification Unit uses the messaging infrastructure to handle the notifications in an asynchronous manner, whereas all the background processing tasks such as analytics generation, sending emails, and other periodic tasks are performed using the job processing infrastructure. The fleet and agency management use the file storage infrastructure for handling images and verification documents. The services of the infrastructure are independent of the business logic.</w:t>
+      </w:r>
+    </w:p>
+    <w:p>
+      <w:pPr>
+        <w:pStyle w:val="Heading3"/>
+      </w:pPr>
+      <w:r>
+        <w:t>External Service Dependencies</w:t>
+      </w:r>
+    </w:p>
+    <w:p>
+      <w:pPr>
+        <w:spacing w:after="0"/>
+      </w:pPr>
+      <w:r>
+        <w:t>Some services require communication with third-party systems to achieve some specific functionality.</w:t>
+      </w:r>
+      <w:r>
+        <w:t xml:space="preserve"> </w:t>
+      </w:r>
+      <w:r>
+        <w:t>For instance, the Payment Management Service needs to communicate with Algeria Post Edahabia payments gateway to ensure secure payment processing. The AI Recommendation and AI Assistant services are supposed to communicate with third-party artificial intelligence engines to offer intelligent recommendations and virtual assistants to users. The Fleet Management service needs map services for search by location purposes and to navigate between branches. On the other hand, cloud storage services are needed to save uploaded documents and images.</w:t>
+      </w:r>
+      <w:r>
+        <w:t xml:space="preserve"> </w:t>
+      </w:r>
+      <w:r>
+        <w:t>Using service interfaces ensures that the system does not depend on any specific implementation of third-party services, and therefore these services can be replaced with minimal changes in the application.</w:t>
+      </w:r>
+    </w:p>
+    <w:p>
+      <w:pPr>
+        <w:pStyle w:val="Heading3"/>
+      </w:pPr>
+      <w:r>
+        <w:t>Dependency Management Principles</w:t>
+      </w:r>
+    </w:p>
+    <w:p>
+      <w:pPr>
+        <w:spacing w:after="0"/>
+      </w:pPr>
+      <w:r>
+        <w:t xml:space="preserve">The dependency architecture of KriGo adheres to certain architectural guidelines to enhance the quality of software and increase maintainability. The components have no direct dependencies on implementation details; only interfaces are used as the mode of communication between the components. The dependencies run from business services, which are high level, towards infrastructure and persistence services, which are low level. Moreover, where there is no need for </w:t>
+      </w:r>
+      <w:r>
+        <w:lastRenderedPageBreak/>
+        <w:t>immediate response, there is use of asynchronous communication, increasing scalability and decreasing execution time for tasks that take a long time.</w:t>
+      </w:r>
+    </w:p>
+    <w:p>
+      <w:pPr>
+        <w:spacing w:after="0"/>
+      </w:pPr>
+      <w:r>
+        <w:t>Such a dependency pattern results in a modular architecture where each component performs its functions while interacting effectively with other components of the system using service contracts</w:t>
+      </w:r>
+      <w:r>
+        <w:t>.</w:t>
+      </w:r>
+    </w:p>
+    <w:p>
+      <w:pPr>
+        <w:spacing w:after="0"/>
+      </w:pPr>
+    </w:p>
     <w:sectPr>
       <w:headerReference w:type="default" r:id="rId19"/>
       <w:footerReference w:type="default" r:id="rId20"/>
@@ -18521,6 +18850,120 @@
     </w:lvl>
   </w:abstractNum>
   <w:abstractNum w:abstractNumId="122" w15:restartNumberingAfterBreak="0">
+    <w:nsid w:val="60B43772"/>
+    <w:multiLevelType w:val="hybridMultilevel"/>
+    <w:tmpl w:val="04FC7310"/>
+    <w:lvl w:ilvl="0" w:tplc="BDFCF596">
+      <w:start w:val="3"/>
+      <w:numFmt w:val="bullet"/>
+      <w:lvlText w:val="-"/>
+      <w:lvlJc w:val="left"/>
+      <w:pPr>
+        <w:ind w:left="360" w:hanging="360"/>
+      </w:pPr>
+      <w:rPr>
+        <w:rFonts w:ascii="Times New Roman" w:eastAsiaTheme="minorHAnsi" w:hAnsi="Times New Roman" w:cs="Times New Roman" w:hint="default"/>
+        <w:b/>
+      </w:rPr>
+    </w:lvl>
+    <w:lvl w:ilvl="1" w:tplc="04090003" w:tentative="1">
+      <w:start w:val="1"/>
+      <w:numFmt w:val="bullet"/>
+      <w:lvlText w:val="o"/>
+      <w:lvlJc w:val="left"/>
+      <w:pPr>
+        <w:ind w:left="1080" w:hanging="360"/>
+      </w:pPr>
+      <w:rPr>
+        <w:rFonts w:ascii="Courier New" w:hAnsi="Courier New" w:cs="Courier New" w:hint="default"/>
+      </w:rPr>
+    </w:lvl>
+    <w:lvl w:ilvl="2" w:tplc="04090005" w:tentative="1">
+      <w:start w:val="1"/>
+      <w:numFmt w:val="bullet"/>
+      <w:lvlText w:val=""/>
+      <w:lvlJc w:val="left"/>
+      <w:pPr>
+        <w:ind w:left="1800" w:hanging="360"/>
+      </w:pPr>
+      <w:rPr>
+        <w:rFonts w:ascii="Wingdings" w:hAnsi="Wingdings" w:hint="default"/>
+      </w:rPr>
+    </w:lvl>
+    <w:lvl w:ilvl="3" w:tplc="04090001" w:tentative="1">
+      <w:start w:val="1"/>
+      <w:numFmt w:val="bullet"/>
+      <w:lvlText w:val=""/>
+      <w:lvlJc w:val="left"/>
+      <w:pPr>
+        <w:ind w:left="2520" w:hanging="360"/>
+      </w:pPr>
+      <w:rPr>
+        <w:rFonts w:ascii="Symbol" w:hAnsi="Symbol" w:hint="default"/>
+      </w:rPr>
+    </w:lvl>
+    <w:lvl w:ilvl="4" w:tplc="04090003" w:tentative="1">
+      <w:start w:val="1"/>
+      <w:numFmt w:val="bullet"/>
+      <w:lvlText w:val="o"/>
+      <w:lvlJc w:val="left"/>
+      <w:pPr>
+        <w:ind w:left="3240" w:hanging="360"/>
+      </w:pPr>
+      <w:rPr>
+        <w:rFonts w:ascii="Courier New" w:hAnsi="Courier New" w:cs="Courier New" w:hint="default"/>
+      </w:rPr>
+    </w:lvl>
+    <w:lvl w:ilvl="5" w:tplc="04090005" w:tentative="1">
+      <w:start w:val="1"/>
+      <w:numFmt w:val="bullet"/>
+      <w:lvlText w:val=""/>
+      <w:lvlJc w:val="left"/>
+      <w:pPr>
+        <w:ind w:left="3960" w:hanging="360"/>
+      </w:pPr>
+      <w:rPr>
+        <w:rFonts w:ascii="Wingdings" w:hAnsi="Wingdings" w:hint="default"/>
+      </w:rPr>
+    </w:lvl>
+    <w:lvl w:ilvl="6" w:tplc="04090001" w:tentative="1">
+      <w:start w:val="1"/>
+      <w:numFmt w:val="bullet"/>
+      <w:lvlText w:val=""/>
+      <w:lvlJc w:val="left"/>
+      <w:pPr>
+        <w:ind w:left="4680" w:hanging="360"/>
+      </w:pPr>
+      <w:rPr>
+        <w:rFonts w:ascii="Symbol" w:hAnsi="Symbol" w:hint="default"/>
+      </w:rPr>
+    </w:lvl>
+    <w:lvl w:ilvl="7" w:tplc="04090003" w:tentative="1">
+      <w:start w:val="1"/>
+      <w:numFmt w:val="bullet"/>
+      <w:lvlText w:val="o"/>
+      <w:lvlJc w:val="left"/>
+      <w:pPr>
+        <w:ind w:left="5400" w:hanging="360"/>
+      </w:pPr>
+      <w:rPr>
+        <w:rFonts w:ascii="Courier New" w:hAnsi="Courier New" w:cs="Courier New" w:hint="default"/>
+      </w:rPr>
+    </w:lvl>
+    <w:lvl w:ilvl="8" w:tplc="04090005" w:tentative="1">
+      <w:start w:val="1"/>
+      <w:numFmt w:val="bullet"/>
+      <w:lvlText w:val=""/>
+      <w:lvlJc w:val="left"/>
+      <w:pPr>
+        <w:ind w:left="6120" w:hanging="360"/>
+      </w:pPr>
+      <w:rPr>
+        <w:rFonts w:ascii="Wingdings" w:hAnsi="Wingdings" w:hint="default"/>
+      </w:rPr>
+    </w:lvl>
+  </w:abstractNum>
+  <w:abstractNum w:abstractNumId="123" w15:restartNumberingAfterBreak="0">
     <w:nsid w:val="61926C31"/>
     <w:multiLevelType w:val="hybridMultilevel"/>
     <w:tmpl w:val="AFD27E5C"/>
@@ -18633,7 +19076,7 @@
       </w:rPr>
     </w:lvl>
   </w:abstractNum>
-  <w:abstractNum w:abstractNumId="123" w15:restartNumberingAfterBreak="0">
+  <w:abstractNum w:abstractNumId="124" w15:restartNumberingAfterBreak="0">
     <w:nsid w:val="622F5FC7"/>
     <w:multiLevelType w:val="hybridMultilevel"/>
     <w:tmpl w:val="49A6C2A6"/>
@@ -18746,7 +19189,7 @@
       </w:rPr>
     </w:lvl>
   </w:abstractNum>
-  <w:abstractNum w:abstractNumId="124" w15:restartNumberingAfterBreak="0">
+  <w:abstractNum w:abstractNumId="125" w15:restartNumberingAfterBreak="0">
     <w:nsid w:val="623A0E20"/>
     <w:multiLevelType w:val="hybridMultilevel"/>
     <w:tmpl w:val="3E360542"/>
@@ -18859,7 +19302,7 @@
       </w:rPr>
     </w:lvl>
   </w:abstractNum>
-  <w:abstractNum w:abstractNumId="125" w15:restartNumberingAfterBreak="0">
+  <w:abstractNum w:abstractNumId="126" w15:restartNumberingAfterBreak="0">
     <w:nsid w:val="62AC33B4"/>
     <w:multiLevelType w:val="multilevel"/>
     <w:tmpl w:val="A074F3CA"/>
@@ -19008,7 +19451,7 @@
       </w:rPr>
     </w:lvl>
   </w:abstractNum>
-  <w:abstractNum w:abstractNumId="126" w15:restartNumberingAfterBreak="0">
+  <w:abstractNum w:abstractNumId="127" w15:restartNumberingAfterBreak="0">
     <w:nsid w:val="63B44674"/>
     <w:multiLevelType w:val="multilevel"/>
     <w:tmpl w:val="08F4FA9A"/>
@@ -19157,7 +19600,7 @@
       </w:rPr>
     </w:lvl>
   </w:abstractNum>
-  <w:abstractNum w:abstractNumId="127" w15:restartNumberingAfterBreak="0">
+  <w:abstractNum w:abstractNumId="128" w15:restartNumberingAfterBreak="0">
     <w:nsid w:val="63C245D4"/>
     <w:multiLevelType w:val="hybridMultilevel"/>
     <w:tmpl w:val="E1563A56"/>
@@ -19269,7 +19712,7 @@
       </w:rPr>
     </w:lvl>
   </w:abstractNum>
-  <w:abstractNum w:abstractNumId="128" w15:restartNumberingAfterBreak="0">
+  <w:abstractNum w:abstractNumId="129" w15:restartNumberingAfterBreak="0">
     <w:nsid w:val="645F5F11"/>
     <w:multiLevelType w:val="hybridMultilevel"/>
     <w:tmpl w:val="D3423512"/>
@@ -19382,7 +19825,7 @@
       </w:rPr>
     </w:lvl>
   </w:abstractNum>
-  <w:abstractNum w:abstractNumId="129" w15:restartNumberingAfterBreak="0">
+  <w:abstractNum w:abstractNumId="130" w15:restartNumberingAfterBreak="0">
     <w:nsid w:val="64F30198"/>
     <w:multiLevelType w:val="multilevel"/>
     <w:tmpl w:val="63F4E6F0"/>
@@ -19531,7 +19974,7 @@
       </w:rPr>
     </w:lvl>
   </w:abstractNum>
-  <w:abstractNum w:abstractNumId="130" w15:restartNumberingAfterBreak="0">
+  <w:abstractNum w:abstractNumId="131" w15:restartNumberingAfterBreak="0">
     <w:nsid w:val="65AF2502"/>
     <w:multiLevelType w:val="hybridMultilevel"/>
     <w:tmpl w:val="FB2A44D8"/>
@@ -19644,7 +20087,7 @@
       </w:rPr>
     </w:lvl>
   </w:abstractNum>
-  <w:abstractNum w:abstractNumId="131" w15:restartNumberingAfterBreak="0">
+  <w:abstractNum w:abstractNumId="132" w15:restartNumberingAfterBreak="0">
     <w:nsid w:val="65E53C08"/>
     <w:multiLevelType w:val="hybridMultilevel"/>
     <w:tmpl w:val="8A44FBE2"/>
@@ -19757,7 +20200,7 @@
       </w:rPr>
     </w:lvl>
   </w:abstractNum>
-  <w:abstractNum w:abstractNumId="132" w15:restartNumberingAfterBreak="0">
+  <w:abstractNum w:abstractNumId="133" w15:restartNumberingAfterBreak="0">
     <w:nsid w:val="671614F0"/>
     <w:multiLevelType w:val="multilevel"/>
     <w:tmpl w:val="63F4E6F0"/>
@@ -19906,7 +20349,7 @@
       </w:rPr>
     </w:lvl>
   </w:abstractNum>
-  <w:abstractNum w:abstractNumId="133" w15:restartNumberingAfterBreak="0">
+  <w:abstractNum w:abstractNumId="134" w15:restartNumberingAfterBreak="0">
     <w:nsid w:val="6859691D"/>
     <w:multiLevelType w:val="multilevel"/>
     <w:tmpl w:val="826A9D48"/>
@@ -20055,7 +20498,7 @@
       </w:rPr>
     </w:lvl>
   </w:abstractNum>
-  <w:abstractNum w:abstractNumId="134" w15:restartNumberingAfterBreak="0">
+  <w:abstractNum w:abstractNumId="135" w15:restartNumberingAfterBreak="0">
     <w:nsid w:val="68817757"/>
     <w:multiLevelType w:val="multilevel"/>
     <w:tmpl w:val="34EE1968"/>
@@ -20204,7 +20647,7 @@
       </w:rPr>
     </w:lvl>
   </w:abstractNum>
-  <w:abstractNum w:abstractNumId="135" w15:restartNumberingAfterBreak="0">
+  <w:abstractNum w:abstractNumId="136" w15:restartNumberingAfterBreak="0">
     <w:nsid w:val="68BE10E8"/>
     <w:multiLevelType w:val="hybridMultilevel"/>
     <w:tmpl w:val="326CD592"/>
@@ -20317,7 +20760,7 @@
       </w:rPr>
     </w:lvl>
   </w:abstractNum>
-  <w:abstractNum w:abstractNumId="136" w15:restartNumberingAfterBreak="0">
+  <w:abstractNum w:abstractNumId="137" w15:restartNumberingAfterBreak="0">
     <w:nsid w:val="69996D9A"/>
     <w:multiLevelType w:val="multilevel"/>
     <w:tmpl w:val="1780FC38"/>
@@ -20466,7 +20909,7 @@
       </w:rPr>
     </w:lvl>
   </w:abstractNum>
-  <w:abstractNum w:abstractNumId="137" w15:restartNumberingAfterBreak="0">
+  <w:abstractNum w:abstractNumId="138" w15:restartNumberingAfterBreak="0">
     <w:nsid w:val="6B3C30B9"/>
     <w:multiLevelType w:val="hybridMultilevel"/>
     <w:tmpl w:val="C938F8DE"/>
@@ -20578,7 +21021,7 @@
       </w:rPr>
     </w:lvl>
   </w:abstractNum>
-  <w:abstractNum w:abstractNumId="138" w15:restartNumberingAfterBreak="0">
+  <w:abstractNum w:abstractNumId="139" w15:restartNumberingAfterBreak="0">
     <w:nsid w:val="6D1511A0"/>
     <w:multiLevelType w:val="hybridMultilevel"/>
     <w:tmpl w:val="AAD8B9B4"/>
@@ -20690,7 +21133,7 @@
       </w:rPr>
     </w:lvl>
   </w:abstractNum>
-  <w:abstractNum w:abstractNumId="139" w15:restartNumberingAfterBreak="0">
+  <w:abstractNum w:abstractNumId="140" w15:restartNumberingAfterBreak="0">
     <w:nsid w:val="6DD255F1"/>
     <w:multiLevelType w:val="hybridMultilevel"/>
     <w:tmpl w:val="ACBC1404"/>
@@ -20803,7 +21246,7 @@
       </w:rPr>
     </w:lvl>
   </w:abstractNum>
-  <w:abstractNum w:abstractNumId="140" w15:restartNumberingAfterBreak="0">
+  <w:abstractNum w:abstractNumId="141" w15:restartNumberingAfterBreak="0">
     <w:nsid w:val="6DDB4404"/>
     <w:multiLevelType w:val="hybridMultilevel"/>
     <w:tmpl w:val="06428E32"/>
@@ -20916,7 +21359,7 @@
       </w:rPr>
     </w:lvl>
   </w:abstractNum>
-  <w:abstractNum w:abstractNumId="141" w15:restartNumberingAfterBreak="0">
+  <w:abstractNum w:abstractNumId="142" w15:restartNumberingAfterBreak="0">
     <w:nsid w:val="6F014B3B"/>
     <w:multiLevelType w:val="hybridMultilevel"/>
     <w:tmpl w:val="C89A39BE"/>
@@ -21028,7 +21471,7 @@
       </w:rPr>
     </w:lvl>
   </w:abstractNum>
-  <w:abstractNum w:abstractNumId="142" w15:restartNumberingAfterBreak="0">
+  <w:abstractNum w:abstractNumId="143" w15:restartNumberingAfterBreak="0">
     <w:nsid w:val="6F171273"/>
     <w:multiLevelType w:val="multilevel"/>
     <w:tmpl w:val="0240C564"/>
@@ -21177,7 +21620,7 @@
       </w:rPr>
     </w:lvl>
   </w:abstractNum>
-  <w:abstractNum w:abstractNumId="143" w15:restartNumberingAfterBreak="0">
+  <w:abstractNum w:abstractNumId="144" w15:restartNumberingAfterBreak="0">
     <w:nsid w:val="6FB82AAA"/>
     <w:multiLevelType w:val="multilevel"/>
     <w:tmpl w:val="FC46C7C0"/>
@@ -21326,7 +21769,7 @@
       </w:rPr>
     </w:lvl>
   </w:abstractNum>
-  <w:abstractNum w:abstractNumId="144" w15:restartNumberingAfterBreak="0">
+  <w:abstractNum w:abstractNumId="145" w15:restartNumberingAfterBreak="0">
     <w:nsid w:val="6FD46DCF"/>
     <w:multiLevelType w:val="hybridMultilevel"/>
     <w:tmpl w:val="EF5E6EC6"/>
@@ -21439,7 +21882,7 @@
       </w:rPr>
     </w:lvl>
   </w:abstractNum>
-  <w:abstractNum w:abstractNumId="145" w15:restartNumberingAfterBreak="0">
+  <w:abstractNum w:abstractNumId="146" w15:restartNumberingAfterBreak="0">
     <w:nsid w:val="70484E38"/>
     <w:multiLevelType w:val="multilevel"/>
     <w:tmpl w:val="22B26DD2"/>
@@ -21588,7 +22031,7 @@
       </w:rPr>
     </w:lvl>
   </w:abstractNum>
-  <w:abstractNum w:abstractNumId="146" w15:restartNumberingAfterBreak="0">
+  <w:abstractNum w:abstractNumId="147" w15:restartNumberingAfterBreak="0">
     <w:nsid w:val="70CB723E"/>
     <w:multiLevelType w:val="multilevel"/>
     <w:tmpl w:val="63F4E6F0"/>
@@ -21737,7 +22180,7 @@
       </w:rPr>
     </w:lvl>
   </w:abstractNum>
-  <w:abstractNum w:abstractNumId="147" w15:restartNumberingAfterBreak="0">
+  <w:abstractNum w:abstractNumId="148" w15:restartNumberingAfterBreak="0">
     <w:nsid w:val="71C028F7"/>
     <w:multiLevelType w:val="hybridMultilevel"/>
     <w:tmpl w:val="85104F0A"/>
@@ -21850,7 +22293,7 @@
       </w:rPr>
     </w:lvl>
   </w:abstractNum>
-  <w:abstractNum w:abstractNumId="148" w15:restartNumberingAfterBreak="0">
+  <w:abstractNum w:abstractNumId="149" w15:restartNumberingAfterBreak="0">
     <w:nsid w:val="71DB3F58"/>
     <w:multiLevelType w:val="multilevel"/>
     <w:tmpl w:val="63F4E6F0"/>
@@ -21999,7 +22442,7 @@
       </w:rPr>
     </w:lvl>
   </w:abstractNum>
-  <w:abstractNum w:abstractNumId="149" w15:restartNumberingAfterBreak="0">
+  <w:abstractNum w:abstractNumId="150" w15:restartNumberingAfterBreak="0">
     <w:nsid w:val="72F31FF2"/>
     <w:multiLevelType w:val="hybridMultilevel"/>
     <w:tmpl w:val="5C2693A0"/>
@@ -22111,7 +22554,7 @@
       </w:rPr>
     </w:lvl>
   </w:abstractNum>
-  <w:abstractNum w:abstractNumId="150" w15:restartNumberingAfterBreak="0">
+  <w:abstractNum w:abstractNumId="151" w15:restartNumberingAfterBreak="0">
     <w:nsid w:val="73B82579"/>
     <w:multiLevelType w:val="hybridMultilevel"/>
     <w:tmpl w:val="B8E8229C"/>
@@ -22224,7 +22667,7 @@
       </w:rPr>
     </w:lvl>
   </w:abstractNum>
-  <w:abstractNum w:abstractNumId="151" w15:restartNumberingAfterBreak="0">
+  <w:abstractNum w:abstractNumId="152" w15:restartNumberingAfterBreak="0">
     <w:nsid w:val="74522E8F"/>
     <w:multiLevelType w:val="hybridMultilevel"/>
     <w:tmpl w:val="9B1C2096"/>
@@ -22337,7 +22780,7 @@
       </w:rPr>
     </w:lvl>
   </w:abstractNum>
-  <w:abstractNum w:abstractNumId="152" w15:restartNumberingAfterBreak="0">
+  <w:abstractNum w:abstractNumId="153" w15:restartNumberingAfterBreak="0">
     <w:nsid w:val="75B45140"/>
     <w:multiLevelType w:val="hybridMultilevel"/>
     <w:tmpl w:val="93F8F3C4"/>
@@ -22450,7 +22893,7 @@
       </w:rPr>
     </w:lvl>
   </w:abstractNum>
-  <w:abstractNum w:abstractNumId="153" w15:restartNumberingAfterBreak="0">
+  <w:abstractNum w:abstractNumId="154" w15:restartNumberingAfterBreak="0">
     <w:nsid w:val="76F60FFE"/>
     <w:multiLevelType w:val="multilevel"/>
     <w:tmpl w:val="63F4E6F0"/>
@@ -22599,7 +23042,7 @@
       </w:rPr>
     </w:lvl>
   </w:abstractNum>
-  <w:abstractNum w:abstractNumId="154" w15:restartNumberingAfterBreak="0">
+  <w:abstractNum w:abstractNumId="155" w15:restartNumberingAfterBreak="0">
     <w:nsid w:val="77572323"/>
     <w:multiLevelType w:val="multilevel"/>
     <w:tmpl w:val="63F4E6F0"/>
@@ -22748,7 +23191,7 @@
       </w:rPr>
     </w:lvl>
   </w:abstractNum>
-  <w:abstractNum w:abstractNumId="155" w15:restartNumberingAfterBreak="0">
+  <w:abstractNum w:abstractNumId="156" w15:restartNumberingAfterBreak="0">
     <w:nsid w:val="77B8201F"/>
     <w:multiLevelType w:val="hybridMultilevel"/>
     <w:tmpl w:val="D7160708"/>
@@ -22860,7 +23303,7 @@
       </w:rPr>
     </w:lvl>
   </w:abstractNum>
-  <w:abstractNum w:abstractNumId="156" w15:restartNumberingAfterBreak="0">
+  <w:abstractNum w:abstractNumId="157" w15:restartNumberingAfterBreak="0">
     <w:nsid w:val="79796FF9"/>
     <w:multiLevelType w:val="hybridMultilevel"/>
     <w:tmpl w:val="CFA8EF82"/>
@@ -22972,7 +23415,7 @@
       </w:rPr>
     </w:lvl>
   </w:abstractNum>
-  <w:abstractNum w:abstractNumId="157" w15:restartNumberingAfterBreak="0">
+  <w:abstractNum w:abstractNumId="158" w15:restartNumberingAfterBreak="0">
     <w:nsid w:val="79910410"/>
     <w:multiLevelType w:val="hybridMultilevel"/>
     <w:tmpl w:val="FC923542"/>
@@ -23084,7 +23527,7 @@
       </w:rPr>
     </w:lvl>
   </w:abstractNum>
-  <w:abstractNum w:abstractNumId="158" w15:restartNumberingAfterBreak="0">
+  <w:abstractNum w:abstractNumId="159" w15:restartNumberingAfterBreak="0">
     <w:nsid w:val="7AFF575A"/>
     <w:multiLevelType w:val="hybridMultilevel"/>
     <w:tmpl w:val="A6323D3E"/>
@@ -23196,7 +23639,7 @@
       </w:rPr>
     </w:lvl>
   </w:abstractNum>
-  <w:abstractNum w:abstractNumId="159" w15:restartNumberingAfterBreak="0">
+  <w:abstractNum w:abstractNumId="160" w15:restartNumberingAfterBreak="0">
     <w:nsid w:val="7B4018BF"/>
     <w:multiLevelType w:val="multilevel"/>
     <w:tmpl w:val="63F4E6F0"/>
@@ -23345,7 +23788,7 @@
       </w:rPr>
     </w:lvl>
   </w:abstractNum>
-  <w:abstractNum w:abstractNumId="160" w15:restartNumberingAfterBreak="0">
+  <w:abstractNum w:abstractNumId="161" w15:restartNumberingAfterBreak="0">
     <w:nsid w:val="7B4D1B33"/>
     <w:multiLevelType w:val="hybridMultilevel"/>
     <w:tmpl w:val="5EAC717E"/>
@@ -23457,7 +23900,7 @@
       </w:rPr>
     </w:lvl>
   </w:abstractNum>
-  <w:abstractNum w:abstractNumId="161" w15:restartNumberingAfterBreak="0">
+  <w:abstractNum w:abstractNumId="162" w15:restartNumberingAfterBreak="0">
     <w:nsid w:val="7C437108"/>
     <w:multiLevelType w:val="hybridMultilevel"/>
     <w:tmpl w:val="3222D0E8"/>
@@ -23570,7 +24013,7 @@
       </w:rPr>
     </w:lvl>
   </w:abstractNum>
-  <w:abstractNum w:abstractNumId="162" w15:restartNumberingAfterBreak="0">
+  <w:abstractNum w:abstractNumId="163" w15:restartNumberingAfterBreak="0">
     <w:nsid w:val="7CAC27CD"/>
     <w:multiLevelType w:val="multilevel"/>
     <w:tmpl w:val="3BC20E58"/>
@@ -23719,7 +24162,7 @@
       </w:rPr>
     </w:lvl>
   </w:abstractNum>
-  <w:abstractNum w:abstractNumId="163" w15:restartNumberingAfterBreak="0">
+  <w:abstractNum w:abstractNumId="164" w15:restartNumberingAfterBreak="0">
     <w:nsid w:val="7E5978EA"/>
     <w:multiLevelType w:val="hybridMultilevel"/>
     <w:tmpl w:val="D74C0DB0"/>
@@ -23831,7 +24274,7 @@
       </w:rPr>
     </w:lvl>
   </w:abstractNum>
-  <w:abstractNum w:abstractNumId="164" w15:restartNumberingAfterBreak="0">
+  <w:abstractNum w:abstractNumId="165" w15:restartNumberingAfterBreak="0">
     <w:nsid w:val="7F106A5D"/>
     <w:multiLevelType w:val="hybridMultilevel"/>
     <w:tmpl w:val="A1CA4816"/>
@@ -23962,7 +24405,7 @@
     <w:abstractNumId w:val="41"/>
   </w:num>
   <w:num w:numId="7" w16cid:durableId="877661689">
-    <w:abstractNumId w:val="145"/>
+    <w:abstractNumId w:val="146"/>
   </w:num>
   <w:num w:numId="8" w16cid:durableId="1390107422">
     <w:abstractNumId w:val="81"/>
@@ -23971,7 +24414,7 @@
     <w:abstractNumId w:val="106"/>
   </w:num>
   <w:num w:numId="10" w16cid:durableId="1037244995">
-    <w:abstractNumId w:val="136"/>
+    <w:abstractNumId w:val="137"/>
   </w:num>
   <w:num w:numId="11" w16cid:durableId="1575554597">
     <w:abstractNumId w:val="64"/>
@@ -23980,7 +24423,7 @@
     <w:abstractNumId w:val="88"/>
   </w:num>
   <w:num w:numId="13" w16cid:durableId="1386294114">
-    <w:abstractNumId w:val="126"/>
+    <w:abstractNumId w:val="127"/>
   </w:num>
   <w:num w:numId="14" w16cid:durableId="1071851223">
     <w:abstractNumId w:val="24"/>
@@ -23989,7 +24432,7 @@
     <w:abstractNumId w:val="76"/>
   </w:num>
   <w:num w:numId="16" w16cid:durableId="1102919547">
-    <w:abstractNumId w:val="162"/>
+    <w:abstractNumId w:val="163"/>
   </w:num>
   <w:num w:numId="17" w16cid:durableId="294526838">
     <w:abstractNumId w:val="52"/>
@@ -24007,19 +24450,19 @@
     <w:abstractNumId w:val="62"/>
   </w:num>
   <w:num w:numId="22" w16cid:durableId="1080098953">
-    <w:abstractNumId w:val="133"/>
+    <w:abstractNumId w:val="134"/>
   </w:num>
   <w:num w:numId="23" w16cid:durableId="1635717296">
     <w:abstractNumId w:val="68"/>
   </w:num>
   <w:num w:numId="24" w16cid:durableId="544873123">
-    <w:abstractNumId w:val="125"/>
+    <w:abstractNumId w:val="126"/>
   </w:num>
   <w:num w:numId="25" w16cid:durableId="1128352778">
     <w:abstractNumId w:val="12"/>
   </w:num>
   <w:num w:numId="26" w16cid:durableId="1732537407">
-    <w:abstractNumId w:val="140"/>
+    <w:abstractNumId w:val="141"/>
   </w:num>
   <w:num w:numId="27" w16cid:durableId="945502064">
     <w:abstractNumId w:val="6"/>
@@ -24052,13 +24495,13 @@
     <w:abstractNumId w:val="19"/>
   </w:num>
   <w:num w:numId="37" w16cid:durableId="247080868">
-    <w:abstractNumId w:val="152"/>
+    <w:abstractNumId w:val="153"/>
   </w:num>
   <w:num w:numId="38" w16cid:durableId="158887408">
-    <w:abstractNumId w:val="122"/>
+    <w:abstractNumId w:val="123"/>
   </w:num>
   <w:num w:numId="39" w16cid:durableId="1681347932">
-    <w:abstractNumId w:val="144"/>
+    <w:abstractNumId w:val="145"/>
   </w:num>
   <w:num w:numId="40" w16cid:durableId="2101440158">
     <w:abstractNumId w:val="79"/>
@@ -24067,7 +24510,7 @@
     <w:abstractNumId w:val="118"/>
   </w:num>
   <w:num w:numId="42" w16cid:durableId="479083359">
-    <w:abstractNumId w:val="149"/>
+    <w:abstractNumId w:val="150"/>
   </w:num>
   <w:num w:numId="43" w16cid:durableId="1557860317">
     <w:abstractNumId w:val="104"/>
@@ -24076,13 +24519,13 @@
     <w:abstractNumId w:val="8"/>
   </w:num>
   <w:num w:numId="45" w16cid:durableId="1357736349">
+    <w:abstractNumId w:val="158"/>
+  </w:num>
+  <w:num w:numId="46" w16cid:durableId="1519656040">
     <w:abstractNumId w:val="157"/>
   </w:num>
-  <w:num w:numId="46" w16cid:durableId="1519656040">
-    <w:abstractNumId w:val="156"/>
-  </w:num>
   <w:num w:numId="47" w16cid:durableId="1078596852">
-    <w:abstractNumId w:val="164"/>
+    <w:abstractNumId w:val="165"/>
   </w:num>
   <w:num w:numId="48" w16cid:durableId="1027950100">
     <w:abstractNumId w:val="35"/>
@@ -24094,7 +24537,7 @@
     <w:abstractNumId w:val="69"/>
   </w:num>
   <w:num w:numId="51" w16cid:durableId="1128354320">
-    <w:abstractNumId w:val="138"/>
+    <w:abstractNumId w:val="139"/>
   </w:num>
   <w:num w:numId="52" w16cid:durableId="248543928">
     <w:abstractNumId w:val="78"/>
@@ -24118,19 +24561,19 @@
     <w:abstractNumId w:val="105"/>
   </w:num>
   <w:num w:numId="59" w16cid:durableId="628516409">
-    <w:abstractNumId w:val="137"/>
+    <w:abstractNumId w:val="138"/>
   </w:num>
   <w:num w:numId="60" w16cid:durableId="2028865444">
     <w:abstractNumId w:val="94"/>
   </w:num>
   <w:num w:numId="61" w16cid:durableId="943926811">
-    <w:abstractNumId w:val="160"/>
+    <w:abstractNumId w:val="161"/>
   </w:num>
   <w:num w:numId="62" w16cid:durableId="1841193257">
     <w:abstractNumId w:val="71"/>
   </w:num>
   <w:num w:numId="63" w16cid:durableId="682322850">
-    <w:abstractNumId w:val="141"/>
+    <w:abstractNumId w:val="142"/>
   </w:num>
   <w:num w:numId="64" w16cid:durableId="2043705333">
     <w:abstractNumId w:val="72"/>
@@ -24154,7 +24597,7 @@
     <w:abstractNumId w:val="46"/>
   </w:num>
   <w:num w:numId="71" w16cid:durableId="940071828">
-    <w:abstractNumId w:val="155"/>
+    <w:abstractNumId w:val="156"/>
   </w:num>
   <w:num w:numId="72" w16cid:durableId="1608273926">
     <w:abstractNumId w:val="74"/>
@@ -24205,7 +24648,7 @@
     <w:abstractNumId w:val="108"/>
   </w:num>
   <w:num w:numId="88" w16cid:durableId="1361005725">
-    <w:abstractNumId w:val="158"/>
+    <w:abstractNumId w:val="159"/>
   </w:num>
   <w:num w:numId="89" w16cid:durableId="219681743">
     <w:abstractNumId w:val="10"/>
@@ -24238,28 +24681,28 @@
     <w:abstractNumId w:val="22"/>
   </w:num>
   <w:num w:numId="99" w16cid:durableId="1706099794">
-    <w:abstractNumId w:val="143"/>
+    <w:abstractNumId w:val="144"/>
   </w:num>
   <w:num w:numId="100" w16cid:durableId="256404901">
-    <w:abstractNumId w:val="142"/>
+    <w:abstractNumId w:val="143"/>
   </w:num>
   <w:num w:numId="101" w16cid:durableId="924923012">
     <w:abstractNumId w:val="27"/>
   </w:num>
   <w:num w:numId="102" w16cid:durableId="536550966">
-    <w:abstractNumId w:val="159"/>
+    <w:abstractNumId w:val="160"/>
   </w:num>
   <w:num w:numId="103" w16cid:durableId="425157302">
     <w:abstractNumId w:val="67"/>
   </w:num>
   <w:num w:numId="104" w16cid:durableId="967664612">
-    <w:abstractNumId w:val="129"/>
+    <w:abstractNumId w:val="130"/>
   </w:num>
   <w:num w:numId="105" w16cid:durableId="361631616">
     <w:abstractNumId w:val="96"/>
   </w:num>
   <w:num w:numId="106" w16cid:durableId="443623616">
-    <w:abstractNumId w:val="134"/>
+    <w:abstractNumId w:val="135"/>
   </w:num>
   <w:num w:numId="107" w16cid:durableId="150101619">
     <w:abstractNumId w:val="11"/>
@@ -24280,13 +24723,13 @@
     <w:abstractNumId w:val="120"/>
   </w:num>
   <w:num w:numId="113" w16cid:durableId="1171681430">
-    <w:abstractNumId w:val="146"/>
+    <w:abstractNumId w:val="147"/>
   </w:num>
   <w:num w:numId="114" w16cid:durableId="1552573199">
-    <w:abstractNumId w:val="148"/>
+    <w:abstractNumId w:val="149"/>
   </w:num>
   <w:num w:numId="115" w16cid:durableId="1920869674">
-    <w:abstractNumId w:val="132"/>
+    <w:abstractNumId w:val="133"/>
   </w:num>
   <w:num w:numId="116" w16cid:durableId="476724716">
     <w:abstractNumId w:val="99"/>
@@ -24301,7 +24744,7 @@
     <w:abstractNumId w:val="1"/>
   </w:num>
   <w:num w:numId="120" w16cid:durableId="396828229">
-    <w:abstractNumId w:val="154"/>
+    <w:abstractNumId w:val="155"/>
   </w:num>
   <w:num w:numId="121" w16cid:durableId="986058889">
     <w:abstractNumId w:val="17"/>
@@ -24313,7 +24756,7 @@
     <w:abstractNumId w:val="83"/>
   </w:num>
   <w:num w:numId="124" w16cid:durableId="114181197">
-    <w:abstractNumId w:val="153"/>
+    <w:abstractNumId w:val="154"/>
   </w:num>
   <w:num w:numId="125" w16cid:durableId="772671624">
     <w:abstractNumId w:val="3"/>
@@ -24331,10 +24774,10 @@
     <w:abstractNumId w:val="56"/>
   </w:num>
   <w:num w:numId="130" w16cid:durableId="1168907903">
-    <w:abstractNumId w:val="135"/>
+    <w:abstractNumId w:val="136"/>
   </w:num>
   <w:num w:numId="131" w16cid:durableId="430206235">
-    <w:abstractNumId w:val="123"/>
+    <w:abstractNumId w:val="124"/>
   </w:num>
   <w:num w:numId="132" w16cid:durableId="1207327089">
     <w:abstractNumId w:val="25"/>
@@ -24361,19 +24804,19 @@
     <w:abstractNumId w:val="114"/>
   </w:num>
   <w:num w:numId="140" w16cid:durableId="650643288">
-    <w:abstractNumId w:val="130"/>
+    <w:abstractNumId w:val="131"/>
   </w:num>
   <w:num w:numId="141" w16cid:durableId="219370247">
-    <w:abstractNumId w:val="127"/>
+    <w:abstractNumId w:val="128"/>
   </w:num>
   <w:num w:numId="142" w16cid:durableId="323239876">
-    <w:abstractNumId w:val="163"/>
+    <w:abstractNumId w:val="164"/>
   </w:num>
   <w:num w:numId="143" w16cid:durableId="1619793156">
     <w:abstractNumId w:val="31"/>
   </w:num>
   <w:num w:numId="144" w16cid:durableId="1186332867">
-    <w:abstractNumId w:val="139"/>
+    <w:abstractNumId w:val="140"/>
   </w:num>
   <w:num w:numId="145" w16cid:durableId="89937035">
     <w:abstractNumId w:val="50"/>
@@ -24385,13 +24828,13 @@
     <w:abstractNumId w:val="5"/>
   </w:num>
   <w:num w:numId="148" w16cid:durableId="1544974653">
-    <w:abstractNumId w:val="150"/>
+    <w:abstractNumId w:val="151"/>
   </w:num>
   <w:num w:numId="149" w16cid:durableId="1664625526">
     <w:abstractNumId w:val="59"/>
   </w:num>
   <w:num w:numId="150" w16cid:durableId="678197415">
-    <w:abstractNumId w:val="128"/>
+    <w:abstractNumId w:val="129"/>
   </w:num>
   <w:num w:numId="151" w16cid:durableId="1193106551">
     <w:abstractNumId w:val="101"/>
@@ -24403,19 +24846,19 @@
     <w:abstractNumId w:val="63"/>
   </w:num>
   <w:num w:numId="154" w16cid:durableId="2121295621">
-    <w:abstractNumId w:val="151"/>
+    <w:abstractNumId w:val="152"/>
   </w:num>
   <w:num w:numId="155" w16cid:durableId="292684904">
     <w:abstractNumId w:val="80"/>
   </w:num>
   <w:num w:numId="156" w16cid:durableId="769400072">
-    <w:abstractNumId w:val="161"/>
+    <w:abstractNumId w:val="162"/>
   </w:num>
   <w:num w:numId="157" w16cid:durableId="1930693824">
     <w:abstractNumId w:val="100"/>
   </w:num>
   <w:num w:numId="158" w16cid:durableId="813957946">
-    <w:abstractNumId w:val="147"/>
+    <w:abstractNumId w:val="148"/>
   </w:num>
   <w:num w:numId="159" w16cid:durableId="1782143679">
     <w:abstractNumId w:val="30"/>
@@ -24424,7 +24867,7 @@
     <w:abstractNumId w:val="26"/>
   </w:num>
   <w:num w:numId="161" w16cid:durableId="1052270864">
-    <w:abstractNumId w:val="124"/>
+    <w:abstractNumId w:val="125"/>
   </w:num>
   <w:num w:numId="162" w16cid:durableId="762337137">
     <w:abstractNumId w:val="95"/>
@@ -24436,7 +24879,10 @@
     <w:abstractNumId w:val="111"/>
   </w:num>
   <w:num w:numId="165" w16cid:durableId="601960416">
-    <w:abstractNumId w:val="131"/>
+    <w:abstractNumId w:val="132"/>
+  </w:num>
+  <w:num w:numId="166" w16cid:durableId="574900497">
+    <w:abstractNumId w:val="122"/>
   </w:num>
 </w:numbering>
 </file>

</xml_diff>

<commit_message>
Backend Architecture Design (#356) Service Layer Design (#357) Business Logic Design (#358) Internal Communication Design (#359)
</commit_message>
<xml_diff>
--- a/Software Architecture Design.docx
+++ b/Software Architecture Design.docx
@@ -5642,6 +5642,9 @@
         </mc:AlternateContent>
       </w:r>
       <w:r>
+        <w:rPr>
+          <w:noProof/>
+        </w:rPr>
         <w:drawing>
           <wp:anchor distT="0" distB="0" distL="114300" distR="114300" simplePos="0" relativeHeight="251667456" behindDoc="0" locked="0" layoutInCell="1" allowOverlap="1" wp14:anchorId="338EF7F5" wp14:editId="696C62E0">
             <wp:simplePos x="0" y="0"/>
@@ -6354,8 +6357,13 @@
         </w:tabs>
         <w:spacing w:after="0"/>
       </w:pPr>
-      <w:r>
-        <w:t>Sessions handling.</w:t>
+      <w:proofErr w:type="gramStart"/>
+      <w:r>
+        <w:t>Sessions</w:t>
+      </w:r>
+      <w:proofErr w:type="gramEnd"/>
+      <w:r>
+        <w:t xml:space="preserve"> handling.</w:t>
       </w:r>
     </w:p>
     <w:p>
@@ -8894,7 +8902,7 @@
       <w:tr>
         <w:trPr>
           <w:cnfStyle w:val="100000000000" w:firstRow="1" w:lastRow="0" w:firstColumn="0" w:lastColumn="0" w:oddVBand="0" w:evenVBand="0" w:oddHBand="0" w:evenHBand="0" w:firstRowFirstColumn="0" w:firstRowLastColumn="0" w:lastRowFirstColumn="0" w:lastRowLastColumn="0"/>
-          <w:trHeight w:val="20"/>
+          <w:trHeight w:val="478"/>
         </w:trPr>
         <w:tc>
           <w:tcPr>
@@ -9780,7 +9788,15 @@
     </w:p>
     <w:p>
       <w:r>
-        <w:t>Considering the fact that the applications allow access to confidential information, the system architecture involves a number of security features. Access token based authentication process is used for the purpose while role-based access control is employed to authorize user functionality limits. HTTPS is used for all communication between the back-end services while all administrative actions are logged for auditing purposes. These practices ensure that administrative actions are kept confidential and secure.</w:t>
+        <w:t xml:space="preserve">Considering the fact that the applications allow access to confidential information, the system architecture involves a number of security features. Access </w:t>
+      </w:r>
+      <w:proofErr w:type="gramStart"/>
+      <w:r>
+        <w:t>token based</w:t>
+      </w:r>
+      <w:proofErr w:type="gramEnd"/>
+      <w:r>
+        <w:t xml:space="preserve"> authentication process is used for the purpose while role-based access control is employed to authorize user functionality limits. HTTPS is used for all communication between the back-end services while all administrative actions are logged for auditing purposes. These practices ensure that administrative actions are kept confidential and secure.</w:t>
       </w:r>
     </w:p>
     <w:p>
@@ -9794,6 +9810,1500 @@
     <w:p>
       <w:r>
         <w:t>The selected architecture provides an elegant and sustainable design for the administration process. The clear division of presentation layer, application logic, and service interaction will simplify further development and testing. Common service components allow reusing the code in the administration and agency applications, and role-based authentication allows various user roles to work in one application without losing the security level. Moreover, centralized state management and real-time communication increase the efficiency of the process through synchronization of administrative data for all users.</w:t>
+      </w:r>
+    </w:p>
+    <w:p>
+      <w:pPr>
+        <w:spacing w:line="278" w:lineRule="auto"/>
+      </w:pPr>
+      <w:r>
+        <w:br w:type="page"/>
+      </w:r>
+    </w:p>
+    <w:p>
+      <w:pPr>
+        <w:pStyle w:val="Heading2"/>
+      </w:pPr>
+      <w:r>
+        <w:lastRenderedPageBreak/>
+        <w:t>Backend Architecture Design</w:t>
+      </w:r>
+    </w:p>
+    <w:p>
+      <w:r>
+        <w:t>The backend represents the main processing tier of the KriGo platform that is responsible for business rule implementation, coordination of interactions between system components, persistence of data, and provision of services to client applications. Contrary to the presentation layer focusing on users' actions, the backend encapsulates application logic and provides assurance of consistency, security, and reliability of all business processes.</w:t>
+      </w:r>
+    </w:p>
+    <w:p>
+      <w:r>
+        <w:t>The backend structure was created according to the rules of modular software development and services-oriented architecture. Every business domain is represented by its own service module that interacts with other modules through well-defined interfaces. Such a design enhances the cohesion, reduces the coupling, and simplifies testing, maintenance, and further development of the system.</w:t>
+      </w:r>
+    </w:p>
+    <w:p>
+      <w:r>
+        <w:t>The backend is built with the use of the NestJS framework, which provides modular architecture, dependency injection, middleware, and request scalability. The application uses different supporting technologies like PostgreSQL as a transactional database, Redis for caching and queuing, Neo4j and pgvector for AI features, RabbitMQ for asynchronous messaging, and external services for payment, cloud storage, and location-related operations.</w:t>
+      </w:r>
+    </w:p>
+    <w:p>
+      <w:pPr>
+        <w:keepNext/>
+      </w:pPr>
+      <w:r>
+        <w:drawing>
+          <wp:inline distT="0" distB="0" distL="0" distR="0" wp14:anchorId="5DFCD8B0" wp14:editId="192B26F4">
+            <wp:extent cx="5941695" cy="4099560"/>
+            <wp:effectExtent l="0" t="0" r="1905" b="0"/>
+            <wp:docPr id="1496487489" name="Picture 1"/>
+            <wp:cNvGraphicFramePr>
+              <a:graphicFrameLocks xmlns:a="http://schemas.openxmlformats.org/drawingml/2006/main" noChangeAspect="1"/>
+            </wp:cNvGraphicFramePr>
+            <a:graphic xmlns:a="http://schemas.openxmlformats.org/drawingml/2006/main">
+              <a:graphicData uri="http://schemas.openxmlformats.org/drawingml/2006/picture">
+                <pic:pic xmlns:pic="http://schemas.openxmlformats.org/drawingml/2006/picture">
+                  <pic:nvPicPr>
+                    <pic:cNvPr id="1496487489" name=""/>
+                    <pic:cNvPicPr/>
+                  </pic:nvPicPr>
+                  <pic:blipFill>
+                    <a:blip r:embed="rId25"/>
+                    <a:stretch>
+                      <a:fillRect/>
+                    </a:stretch>
+                  </pic:blipFill>
+                  <pic:spPr>
+                    <a:xfrm>
+                      <a:off x="0" y="0"/>
+                      <a:ext cx="5941695" cy="4099560"/>
+                    </a:xfrm>
+                    <a:prstGeom prst="rect">
+                      <a:avLst/>
+                    </a:prstGeom>
+                  </pic:spPr>
+                </pic:pic>
+              </a:graphicData>
+            </a:graphic>
+          </wp:inline>
+        </w:drawing>
+      </w:r>
+    </w:p>
+    <w:p>
+      <w:pPr>
+        <w:pStyle w:val="Caption"/>
+        <w:jc w:val="center"/>
+        <w:rPr>
+          <w:color w:val="000000" w:themeColor="text1"/>
+          <w:sz w:val="20"/>
+          <w:szCs w:val="20"/>
+        </w:rPr>
+      </w:pPr>
+      <w:r>
+        <w:rPr>
+          <w:color w:val="000000" w:themeColor="text1"/>
+          <w:sz w:val="20"/>
+          <w:szCs w:val="20"/>
+        </w:rPr>
+        <w:t xml:space="preserve">Figure </w:t>
+      </w:r>
+      <w:r>
+        <w:rPr>
+          <w:color w:val="000000" w:themeColor="text1"/>
+          <w:sz w:val="20"/>
+          <w:szCs w:val="20"/>
+        </w:rPr>
+        <w:fldChar w:fldCharType="begin"/>
+      </w:r>
+      <w:r>
+        <w:rPr>
+          <w:color w:val="000000" w:themeColor="text1"/>
+          <w:sz w:val="20"/>
+          <w:szCs w:val="20"/>
+        </w:rPr>
+        <w:instrText xml:space="preserve"> SEQ Figure \* ARABIC </w:instrText>
+      </w:r>
+      <w:r>
+        <w:rPr>
+          <w:color w:val="000000" w:themeColor="text1"/>
+          <w:sz w:val="20"/>
+          <w:szCs w:val="20"/>
+        </w:rPr>
+        <w:fldChar w:fldCharType="separate"/>
+      </w:r>
+      <w:r>
+        <w:rPr>
+          <w:noProof/>
+          <w:color w:val="000000" w:themeColor="text1"/>
+          <w:sz w:val="20"/>
+          <w:szCs w:val="20"/>
+        </w:rPr>
+        <w:t>8</w:t>
+      </w:r>
+      <w:r>
+        <w:rPr>
+          <w:color w:val="000000" w:themeColor="text1"/>
+          <w:sz w:val="20"/>
+          <w:szCs w:val="20"/>
+        </w:rPr>
+        <w:fldChar w:fldCharType="end"/>
+      </w:r>
+      <w:r>
+        <w:rPr>
+          <w:color w:val="000000" w:themeColor="text1"/>
+          <w:sz w:val="20"/>
+          <w:szCs w:val="20"/>
+        </w:rPr>
+        <w:t xml:space="preserve"> - Backend Service Layer Architecture</w:t>
+      </w:r>
+    </w:p>
+    <w:p>
+      <w:pPr>
+        <w:spacing w:line="278" w:lineRule="auto"/>
+      </w:pPr>
+      <w:r>
+        <w:br w:type="page"/>
+      </w:r>
+    </w:p>
+    <w:p>
+      <w:pPr>
+        <w:pStyle w:val="Heading3"/>
+      </w:pPr>
+      <w:r>
+        <w:lastRenderedPageBreak/>
+        <w:t>Service Layer Design</w:t>
+      </w:r>
+    </w:p>
+    <w:p>
+      <w:r>
+        <w:t>The Service Layer represents the entrance to the business logic of the backend. It receives requests from clients through REST APIs and WebSocket gateways, checks data sent by clients, manages business processes, and interacts with the persistence layer in case data needs to be stored or retrieved. Every service represents a separate business domain and provides access to its operations through well-defined interfaces thus allowing other components to work with it without knowing its implementation details.</w:t>
+      </w:r>
+    </w:p>
+    <w:p>
+      <w:pPr>
+        <w:spacing w:after="0"/>
+      </w:pPr>
+      <w:r>
+        <w:t>The backend consists of several independent service modules that perform a certain function within the system.</w:t>
+      </w:r>
+    </w:p>
+    <w:p>
+      <w:pPr>
+        <w:spacing w:after="0"/>
+      </w:pPr>
+    </w:p>
+    <w:tbl>
+      <w:tblPr>
+        <w:tblStyle w:val="PlainTable1"/>
+        <w:tblW w:w="0" w:type="auto"/>
+        <w:tblCellMar>
+          <w:top w:w="101" w:type="dxa"/>
+          <w:bottom w:w="101" w:type="dxa"/>
+        </w:tblCellMar>
+        <w:tblLook w:val="04A0" w:firstRow="1" w:lastRow="0" w:firstColumn="1" w:lastColumn="0" w:noHBand="0" w:noVBand="1"/>
+      </w:tblPr>
+      <w:tblGrid>
+        <w:gridCol w:w="2543"/>
+        <w:gridCol w:w="6804"/>
+      </w:tblGrid>
+      <w:tr>
+        <w:trPr>
+          <w:cnfStyle w:val="100000000000" w:firstRow="1" w:lastRow="0" w:firstColumn="0" w:lastColumn="0" w:oddVBand="0" w:evenVBand="0" w:oddHBand="0" w:evenHBand="0" w:firstRowFirstColumn="0" w:firstRowLastColumn="0" w:lastRowFirstColumn="0" w:lastRowLastColumn="0"/>
+        </w:trPr>
+        <w:tc>
+          <w:tcPr>
+            <w:cnfStyle w:val="001000000000" w:firstRow="0" w:lastRow="0" w:firstColumn="1" w:lastColumn="0" w:oddVBand="0" w:evenVBand="0" w:oddHBand="0" w:evenHBand="0" w:firstRowFirstColumn="0" w:firstRowLastColumn="0" w:lastRowFirstColumn="0" w:lastRowLastColumn="0"/>
+            <w:tcW w:w="0" w:type="auto"/>
+            <w:vAlign w:val="center"/>
+            <w:hideMark/>
+          </w:tcPr>
+          <w:p>
+            <w:r>
+              <w:t>Service Module</w:t>
+            </w:r>
+          </w:p>
+        </w:tc>
+        <w:tc>
+          <w:tcPr>
+            <w:tcW w:w="0" w:type="auto"/>
+            <w:vAlign w:val="center"/>
+            <w:hideMark/>
+          </w:tcPr>
+          <w:p>
+            <w:pPr>
+              <w:cnfStyle w:val="100000000000" w:firstRow="1" w:lastRow="0" w:firstColumn="0" w:lastColumn="0" w:oddVBand="0" w:evenVBand="0" w:oddHBand="0" w:evenHBand="0" w:firstRowFirstColumn="0" w:firstRowLastColumn="0" w:lastRowFirstColumn="0" w:lastRowLastColumn="0"/>
+            </w:pPr>
+            <w:r>
+              <w:t>Primary Responsibility</w:t>
+            </w:r>
+          </w:p>
+        </w:tc>
+      </w:tr>
+      <w:tr>
+        <w:trPr>
+          <w:cnfStyle w:val="000000100000" w:firstRow="0" w:lastRow="0" w:firstColumn="0" w:lastColumn="0" w:oddVBand="0" w:evenVBand="0" w:oddHBand="1" w:evenHBand="0" w:firstRowFirstColumn="0" w:firstRowLastColumn="0" w:lastRowFirstColumn="0" w:lastRowLastColumn="0"/>
+        </w:trPr>
+        <w:tc>
+          <w:tcPr>
+            <w:cnfStyle w:val="001000000000" w:firstRow="0" w:lastRow="0" w:firstColumn="1" w:lastColumn="0" w:oddVBand="0" w:evenVBand="0" w:oddHBand="0" w:evenHBand="0" w:firstRowFirstColumn="0" w:firstRowLastColumn="0" w:lastRowFirstColumn="0" w:lastRowLastColumn="0"/>
+            <w:tcW w:w="0" w:type="auto"/>
+            <w:vAlign w:val="center"/>
+            <w:hideMark/>
+          </w:tcPr>
+          <w:p>
+            <w:pPr>
+              <w:rPr>
+                <w:b w:val="0"/>
+                <w:bCs w:val="0"/>
+              </w:rPr>
+            </w:pPr>
+            <w:r>
+              <w:rPr>
+                <w:b w:val="0"/>
+                <w:bCs w:val="0"/>
+              </w:rPr>
+              <w:t>Authentication Service</w:t>
+            </w:r>
+          </w:p>
+        </w:tc>
+        <w:tc>
+          <w:tcPr>
+            <w:tcW w:w="0" w:type="auto"/>
+            <w:vAlign w:val="center"/>
+            <w:hideMark/>
+          </w:tcPr>
+          <w:p>
+            <w:pPr>
+              <w:cnfStyle w:val="000000100000" w:firstRow="0" w:lastRow="0" w:firstColumn="0" w:lastColumn="0" w:oddVBand="0" w:evenVBand="0" w:oddHBand="1" w:evenHBand="0" w:firstRowFirstColumn="0" w:firstRowLastColumn="0" w:lastRowFirstColumn="0" w:lastRowLastColumn="0"/>
+            </w:pPr>
+            <w:r>
+              <w:t>User authentication, authorization, JWT generation, and session management.</w:t>
+            </w:r>
+          </w:p>
+        </w:tc>
+      </w:tr>
+      <w:tr>
+        <w:tc>
+          <w:tcPr>
+            <w:cnfStyle w:val="001000000000" w:firstRow="0" w:lastRow="0" w:firstColumn="1" w:lastColumn="0" w:oddVBand="0" w:evenVBand="0" w:oddHBand="0" w:evenHBand="0" w:firstRowFirstColumn="0" w:firstRowLastColumn="0" w:lastRowFirstColumn="0" w:lastRowLastColumn="0"/>
+            <w:tcW w:w="0" w:type="auto"/>
+            <w:vAlign w:val="center"/>
+            <w:hideMark/>
+          </w:tcPr>
+          <w:p>
+            <w:pPr>
+              <w:rPr>
+                <w:b w:val="0"/>
+                <w:bCs w:val="0"/>
+              </w:rPr>
+            </w:pPr>
+            <w:r>
+              <w:rPr>
+                <w:b w:val="0"/>
+                <w:bCs w:val="0"/>
+              </w:rPr>
+              <w:t>User Management Service</w:t>
+            </w:r>
+          </w:p>
+        </w:tc>
+        <w:tc>
+          <w:tcPr>
+            <w:tcW w:w="0" w:type="auto"/>
+            <w:vAlign w:val="center"/>
+            <w:hideMark/>
+          </w:tcPr>
+          <w:p>
+            <w:pPr>
+              <w:cnfStyle w:val="000000000000" w:firstRow="0" w:lastRow="0" w:firstColumn="0" w:lastColumn="0" w:oddVBand="0" w:evenVBand="0" w:oddHBand="0" w:evenHBand="0" w:firstRowFirstColumn="0" w:firstRowLastColumn="0" w:lastRowFirstColumn="0" w:lastRowLastColumn="0"/>
+            </w:pPr>
+            <w:r>
+              <w:t>Customer, agency, employee, and administrator account management.</w:t>
+            </w:r>
+          </w:p>
+        </w:tc>
+      </w:tr>
+      <w:tr>
+        <w:trPr>
+          <w:cnfStyle w:val="000000100000" w:firstRow="0" w:lastRow="0" w:firstColumn="0" w:lastColumn="0" w:oddVBand="0" w:evenVBand="0" w:oddHBand="1" w:evenHBand="0" w:firstRowFirstColumn="0" w:firstRowLastColumn="0" w:lastRowFirstColumn="0" w:lastRowLastColumn="0"/>
+        </w:trPr>
+        <w:tc>
+          <w:tcPr>
+            <w:cnfStyle w:val="001000000000" w:firstRow="0" w:lastRow="0" w:firstColumn="1" w:lastColumn="0" w:oddVBand="0" w:evenVBand="0" w:oddHBand="0" w:evenHBand="0" w:firstRowFirstColumn="0" w:firstRowLastColumn="0" w:lastRowFirstColumn="0" w:lastRowLastColumn="0"/>
+            <w:tcW w:w="0" w:type="auto"/>
+            <w:vAlign w:val="center"/>
+            <w:hideMark/>
+          </w:tcPr>
+          <w:p>
+            <w:pPr>
+              <w:rPr>
+                <w:b w:val="0"/>
+                <w:bCs w:val="0"/>
+              </w:rPr>
+            </w:pPr>
+            <w:r>
+              <w:rPr>
+                <w:b w:val="0"/>
+                <w:bCs w:val="0"/>
+              </w:rPr>
+              <w:t>Fleet Management Service</w:t>
+            </w:r>
+          </w:p>
+        </w:tc>
+        <w:tc>
+          <w:tcPr>
+            <w:tcW w:w="0" w:type="auto"/>
+            <w:vAlign w:val="center"/>
+            <w:hideMark/>
+          </w:tcPr>
+          <w:p>
+            <w:pPr>
+              <w:cnfStyle w:val="000000100000" w:firstRow="0" w:lastRow="0" w:firstColumn="0" w:lastColumn="0" w:oddVBand="0" w:evenVBand="0" w:oddHBand="1" w:evenHBand="0" w:firstRowFirstColumn="0" w:firstRowLastColumn="0" w:lastRowFirstColumn="0" w:lastRowLastColumn="0"/>
+            </w:pPr>
+            <w:r>
+              <w:t>Vehicle registration, availability, pricing, maintenance, and branch assignment.</w:t>
+            </w:r>
+          </w:p>
+        </w:tc>
+      </w:tr>
+      <w:tr>
+        <w:tc>
+          <w:tcPr>
+            <w:cnfStyle w:val="001000000000" w:firstRow="0" w:lastRow="0" w:firstColumn="1" w:lastColumn="0" w:oddVBand="0" w:evenVBand="0" w:oddHBand="0" w:evenHBand="0" w:firstRowFirstColumn="0" w:firstRowLastColumn="0" w:lastRowFirstColumn="0" w:lastRowLastColumn="0"/>
+            <w:tcW w:w="0" w:type="auto"/>
+            <w:vAlign w:val="center"/>
+            <w:hideMark/>
+          </w:tcPr>
+          <w:p>
+            <w:pPr>
+              <w:rPr>
+                <w:b w:val="0"/>
+                <w:bCs w:val="0"/>
+              </w:rPr>
+            </w:pPr>
+            <w:r>
+              <w:rPr>
+                <w:b w:val="0"/>
+                <w:bCs w:val="0"/>
+              </w:rPr>
+              <w:t>Reservation Service</w:t>
+            </w:r>
+          </w:p>
+        </w:tc>
+        <w:tc>
+          <w:tcPr>
+            <w:tcW w:w="0" w:type="auto"/>
+            <w:vAlign w:val="center"/>
+            <w:hideMark/>
+          </w:tcPr>
+          <w:p>
+            <w:pPr>
+              <w:cnfStyle w:val="000000000000" w:firstRow="0" w:lastRow="0" w:firstColumn="0" w:lastColumn="0" w:oddVBand="0" w:evenVBand="0" w:oddHBand="0" w:evenHBand="0" w:firstRowFirstColumn="0" w:firstRowLastColumn="0" w:lastRowFirstColumn="0" w:lastRowLastColumn="0"/>
+            </w:pPr>
+            <w:r>
+              <w:t>Reservation lifecycle management, availability verification, and rental price calculation.</w:t>
+            </w:r>
+          </w:p>
+        </w:tc>
+      </w:tr>
+      <w:tr>
+        <w:trPr>
+          <w:cnfStyle w:val="000000100000" w:firstRow="0" w:lastRow="0" w:firstColumn="0" w:lastColumn="0" w:oddVBand="0" w:evenVBand="0" w:oddHBand="1" w:evenHBand="0" w:firstRowFirstColumn="0" w:firstRowLastColumn="0" w:lastRowFirstColumn="0" w:lastRowLastColumn="0"/>
+        </w:trPr>
+        <w:tc>
+          <w:tcPr>
+            <w:cnfStyle w:val="001000000000" w:firstRow="0" w:lastRow="0" w:firstColumn="1" w:lastColumn="0" w:oddVBand="0" w:evenVBand="0" w:oddHBand="0" w:evenHBand="0" w:firstRowFirstColumn="0" w:firstRowLastColumn="0" w:lastRowFirstColumn="0" w:lastRowLastColumn="0"/>
+            <w:tcW w:w="0" w:type="auto"/>
+            <w:vAlign w:val="center"/>
+            <w:hideMark/>
+          </w:tcPr>
+          <w:p>
+            <w:pPr>
+              <w:rPr>
+                <w:b w:val="0"/>
+                <w:bCs w:val="0"/>
+              </w:rPr>
+            </w:pPr>
+            <w:r>
+              <w:rPr>
+                <w:b w:val="0"/>
+                <w:bCs w:val="0"/>
+              </w:rPr>
+              <w:t>Payment Service</w:t>
+            </w:r>
+          </w:p>
+        </w:tc>
+        <w:tc>
+          <w:tcPr>
+            <w:tcW w:w="0" w:type="auto"/>
+            <w:vAlign w:val="center"/>
+            <w:hideMark/>
+          </w:tcPr>
+          <w:p>
+            <w:pPr>
+              <w:cnfStyle w:val="000000100000" w:firstRow="0" w:lastRow="0" w:firstColumn="0" w:lastColumn="0" w:oddVBand="0" w:evenVBand="0" w:oddHBand="1" w:evenHBand="0" w:firstRowFirstColumn="0" w:firstRowLastColumn="0" w:lastRowFirstColumn="0" w:lastRowLastColumn="0"/>
+            </w:pPr>
+            <w:r>
+              <w:t>Processing online payments through the Algeria Post Edahabia gateway and managing transaction history.</w:t>
+            </w:r>
+          </w:p>
+        </w:tc>
+      </w:tr>
+      <w:tr>
+        <w:tc>
+          <w:tcPr>
+            <w:cnfStyle w:val="001000000000" w:firstRow="0" w:lastRow="0" w:firstColumn="1" w:lastColumn="0" w:oddVBand="0" w:evenVBand="0" w:oddHBand="0" w:evenHBand="0" w:firstRowFirstColumn="0" w:firstRowLastColumn="0" w:lastRowFirstColumn="0" w:lastRowLastColumn="0"/>
+            <w:tcW w:w="0" w:type="auto"/>
+            <w:vAlign w:val="center"/>
+            <w:hideMark/>
+          </w:tcPr>
+          <w:p>
+            <w:pPr>
+              <w:rPr>
+                <w:b w:val="0"/>
+                <w:bCs w:val="0"/>
+              </w:rPr>
+            </w:pPr>
+            <w:r>
+              <w:rPr>
+                <w:b w:val="0"/>
+                <w:bCs w:val="0"/>
+              </w:rPr>
+              <w:t>Agency Service</w:t>
+            </w:r>
+          </w:p>
+        </w:tc>
+        <w:tc>
+          <w:tcPr>
+            <w:tcW w:w="0" w:type="auto"/>
+            <w:vAlign w:val="center"/>
+            <w:hideMark/>
+          </w:tcPr>
+          <w:p>
+            <w:pPr>
+              <w:cnfStyle w:val="000000000000" w:firstRow="0" w:lastRow="0" w:firstColumn="0" w:lastColumn="0" w:oddVBand="0" w:evenVBand="0" w:oddHBand="0" w:evenHBand="0" w:firstRowFirstColumn="0" w:firstRowLastColumn="0" w:lastRowFirstColumn="0" w:lastRowLastColumn="0"/>
+            </w:pPr>
+            <w:r>
+              <w:t>Agency registration, verification, branch administration, and employee management.</w:t>
+            </w:r>
+          </w:p>
+        </w:tc>
+      </w:tr>
+      <w:tr>
+        <w:trPr>
+          <w:cnfStyle w:val="000000100000" w:firstRow="0" w:lastRow="0" w:firstColumn="0" w:lastColumn="0" w:oddVBand="0" w:evenVBand="0" w:oddHBand="1" w:evenHBand="0" w:firstRowFirstColumn="0" w:firstRowLastColumn="0" w:lastRowFirstColumn="0" w:lastRowLastColumn="0"/>
+        </w:trPr>
+        <w:tc>
+          <w:tcPr>
+            <w:cnfStyle w:val="001000000000" w:firstRow="0" w:lastRow="0" w:firstColumn="1" w:lastColumn="0" w:oddVBand="0" w:evenVBand="0" w:oddHBand="0" w:evenHBand="0" w:firstRowFirstColumn="0" w:firstRowLastColumn="0" w:lastRowFirstColumn="0" w:lastRowLastColumn="0"/>
+            <w:tcW w:w="0" w:type="auto"/>
+            <w:vAlign w:val="center"/>
+            <w:hideMark/>
+          </w:tcPr>
+          <w:p>
+            <w:pPr>
+              <w:rPr>
+                <w:b w:val="0"/>
+                <w:bCs w:val="0"/>
+              </w:rPr>
+            </w:pPr>
+            <w:r>
+              <w:rPr>
+                <w:b w:val="0"/>
+                <w:bCs w:val="0"/>
+              </w:rPr>
+              <w:t>Review Service</w:t>
+            </w:r>
+          </w:p>
+        </w:tc>
+        <w:tc>
+          <w:tcPr>
+            <w:tcW w:w="0" w:type="auto"/>
+            <w:vAlign w:val="center"/>
+            <w:hideMark/>
+          </w:tcPr>
+          <w:p>
+            <w:pPr>
+              <w:cnfStyle w:val="000000100000" w:firstRow="0" w:lastRow="0" w:firstColumn="0" w:lastColumn="0" w:oddVBand="0" w:evenVBand="0" w:oddHBand="1" w:evenHBand="0" w:firstRowFirstColumn="0" w:firstRowLastColumn="0" w:lastRowFirstColumn="0" w:lastRowLastColumn="0"/>
+            </w:pPr>
+            <w:r>
+              <w:t>Customer reviews, ratings, and content moderation.</w:t>
+            </w:r>
+          </w:p>
+        </w:tc>
+      </w:tr>
+      <w:tr>
+        <w:tc>
+          <w:tcPr>
+            <w:cnfStyle w:val="001000000000" w:firstRow="0" w:lastRow="0" w:firstColumn="1" w:lastColumn="0" w:oddVBand="0" w:evenVBand="0" w:oddHBand="0" w:evenHBand="0" w:firstRowFirstColumn="0" w:firstRowLastColumn="0" w:lastRowFirstColumn="0" w:lastRowLastColumn="0"/>
+            <w:tcW w:w="0" w:type="auto"/>
+            <w:vAlign w:val="center"/>
+            <w:hideMark/>
+          </w:tcPr>
+          <w:p>
+            <w:pPr>
+              <w:rPr>
+                <w:b w:val="0"/>
+                <w:bCs w:val="0"/>
+              </w:rPr>
+            </w:pPr>
+            <w:r>
+              <w:rPr>
+                <w:b w:val="0"/>
+                <w:bCs w:val="0"/>
+              </w:rPr>
+              <w:t>Dispute Service</w:t>
+            </w:r>
+          </w:p>
+        </w:tc>
+        <w:tc>
+          <w:tcPr>
+            <w:tcW w:w="0" w:type="auto"/>
+            <w:vAlign w:val="center"/>
+            <w:hideMark/>
+          </w:tcPr>
+          <w:p>
+            <w:pPr>
+              <w:cnfStyle w:val="000000000000" w:firstRow="0" w:lastRow="0" w:firstColumn="0" w:lastColumn="0" w:oddVBand="0" w:evenVBand="0" w:oddHBand="0" w:evenHBand="0" w:firstRowFirstColumn="0" w:firstRowLastColumn="0" w:lastRowFirstColumn="0" w:lastRowLastColumn="0"/>
+            </w:pPr>
+            <w:r>
+              <w:t>Complaint management, investigation workflow, and dispute resolution.</w:t>
+            </w:r>
+          </w:p>
+        </w:tc>
+      </w:tr>
+      <w:tr>
+        <w:trPr>
+          <w:cnfStyle w:val="000000100000" w:firstRow="0" w:lastRow="0" w:firstColumn="0" w:lastColumn="0" w:oddVBand="0" w:evenVBand="0" w:oddHBand="1" w:evenHBand="0" w:firstRowFirstColumn="0" w:firstRowLastColumn="0" w:lastRowFirstColumn="0" w:lastRowLastColumn="0"/>
+        </w:trPr>
+        <w:tc>
+          <w:tcPr>
+            <w:cnfStyle w:val="001000000000" w:firstRow="0" w:lastRow="0" w:firstColumn="1" w:lastColumn="0" w:oddVBand="0" w:evenVBand="0" w:oddHBand="0" w:evenHBand="0" w:firstRowFirstColumn="0" w:firstRowLastColumn="0" w:lastRowFirstColumn="0" w:lastRowLastColumn="0"/>
+            <w:tcW w:w="0" w:type="auto"/>
+            <w:vAlign w:val="center"/>
+            <w:hideMark/>
+          </w:tcPr>
+          <w:p>
+            <w:pPr>
+              <w:rPr>
+                <w:b w:val="0"/>
+                <w:bCs w:val="0"/>
+              </w:rPr>
+            </w:pPr>
+            <w:r>
+              <w:rPr>
+                <w:b w:val="0"/>
+                <w:bCs w:val="0"/>
+              </w:rPr>
+              <w:t>Notification Service</w:t>
+            </w:r>
+          </w:p>
+        </w:tc>
+        <w:tc>
+          <w:tcPr>
+            <w:tcW w:w="0" w:type="auto"/>
+            <w:vAlign w:val="center"/>
+            <w:hideMark/>
+          </w:tcPr>
+          <w:p>
+            <w:pPr>
+              <w:cnfStyle w:val="000000100000" w:firstRow="0" w:lastRow="0" w:firstColumn="0" w:lastColumn="0" w:oddVBand="0" w:evenVBand="0" w:oddHBand="1" w:evenHBand="0" w:firstRowFirstColumn="0" w:firstRowLastColumn="0" w:lastRowFirstColumn="0" w:lastRowLastColumn="0"/>
+            </w:pPr>
+            <w:r>
+              <w:t>Email, push notification, and reservation event delivery.</w:t>
+            </w:r>
+          </w:p>
+        </w:tc>
+      </w:tr>
+      <w:tr>
+        <w:tc>
+          <w:tcPr>
+            <w:cnfStyle w:val="001000000000" w:firstRow="0" w:lastRow="0" w:firstColumn="1" w:lastColumn="0" w:oddVBand="0" w:evenVBand="0" w:oddHBand="0" w:evenHBand="0" w:firstRowFirstColumn="0" w:firstRowLastColumn="0" w:lastRowFirstColumn="0" w:lastRowLastColumn="0"/>
+            <w:tcW w:w="0" w:type="auto"/>
+            <w:vAlign w:val="center"/>
+            <w:hideMark/>
+          </w:tcPr>
+          <w:p>
+            <w:pPr>
+              <w:rPr>
+                <w:b w:val="0"/>
+                <w:bCs w:val="0"/>
+              </w:rPr>
+            </w:pPr>
+            <w:r>
+              <w:rPr>
+                <w:b w:val="0"/>
+                <w:bCs w:val="0"/>
+              </w:rPr>
+              <w:t>AI Recommendation Service</w:t>
+            </w:r>
+          </w:p>
+        </w:tc>
+        <w:tc>
+          <w:tcPr>
+            <w:tcW w:w="0" w:type="auto"/>
+            <w:vAlign w:val="center"/>
+            <w:hideMark/>
+          </w:tcPr>
+          <w:p>
+            <w:pPr>
+              <w:cnfStyle w:val="000000000000" w:firstRow="0" w:lastRow="0" w:firstColumn="0" w:lastColumn="0" w:oddVBand="0" w:evenVBand="0" w:oddHBand="0" w:evenHBand="0" w:firstRowFirstColumn="0" w:firstRowLastColumn="0" w:lastRowFirstColumn="0" w:lastRowLastColumn="0"/>
+            </w:pPr>
+            <w:r>
+              <w:t>Personalized vehicle recommendation generation.</w:t>
+            </w:r>
+          </w:p>
+        </w:tc>
+      </w:tr>
+      <w:tr>
+        <w:trPr>
+          <w:cnfStyle w:val="000000100000" w:firstRow="0" w:lastRow="0" w:firstColumn="0" w:lastColumn="0" w:oddVBand="0" w:evenVBand="0" w:oddHBand="1" w:evenHBand="0" w:firstRowFirstColumn="0" w:firstRowLastColumn="0" w:lastRowFirstColumn="0" w:lastRowLastColumn="0"/>
+        </w:trPr>
+        <w:tc>
+          <w:tcPr>
+            <w:cnfStyle w:val="001000000000" w:firstRow="0" w:lastRow="0" w:firstColumn="1" w:lastColumn="0" w:oddVBand="0" w:evenVBand="0" w:oddHBand="0" w:evenHBand="0" w:firstRowFirstColumn="0" w:firstRowLastColumn="0" w:lastRowFirstColumn="0" w:lastRowLastColumn="0"/>
+            <w:tcW w:w="0" w:type="auto"/>
+            <w:vAlign w:val="center"/>
+            <w:hideMark/>
+          </w:tcPr>
+          <w:p>
+            <w:pPr>
+              <w:rPr>
+                <w:b w:val="0"/>
+                <w:bCs w:val="0"/>
+              </w:rPr>
+            </w:pPr>
+            <w:r>
+              <w:rPr>
+                <w:b w:val="0"/>
+                <w:bCs w:val="0"/>
+              </w:rPr>
+              <w:t>AI Assistant Service</w:t>
+            </w:r>
+          </w:p>
+        </w:tc>
+        <w:tc>
+          <w:tcPr>
+            <w:tcW w:w="0" w:type="auto"/>
+            <w:vAlign w:val="center"/>
+            <w:hideMark/>
+          </w:tcPr>
+          <w:p>
+            <w:pPr>
+              <w:cnfStyle w:val="000000100000" w:firstRow="0" w:lastRow="0" w:firstColumn="0" w:lastColumn="0" w:oddVBand="0" w:evenVBand="0" w:oddHBand="1" w:evenHBand="0" w:firstRowFirstColumn="0" w:firstRowLastColumn="0" w:lastRowFirstColumn="0" w:lastRowLastColumn="0"/>
+            </w:pPr>
+            <w:r>
+              <w:t>Conversational assistance using natural language processing.</w:t>
+            </w:r>
+          </w:p>
+        </w:tc>
+      </w:tr>
+      <w:tr>
+        <w:tc>
+          <w:tcPr>
+            <w:cnfStyle w:val="001000000000" w:firstRow="0" w:lastRow="0" w:firstColumn="1" w:lastColumn="0" w:oddVBand="0" w:evenVBand="0" w:oddHBand="0" w:evenHBand="0" w:firstRowFirstColumn="0" w:firstRowLastColumn="0" w:lastRowFirstColumn="0" w:lastRowLastColumn="0"/>
+            <w:tcW w:w="0" w:type="auto"/>
+            <w:vAlign w:val="center"/>
+            <w:hideMark/>
+          </w:tcPr>
+          <w:p>
+            <w:pPr>
+              <w:rPr>
+                <w:b w:val="0"/>
+                <w:bCs w:val="0"/>
+              </w:rPr>
+            </w:pPr>
+            <w:r>
+              <w:rPr>
+                <w:b w:val="0"/>
+                <w:bCs w:val="0"/>
+              </w:rPr>
+              <w:t>Analytics Service</w:t>
+            </w:r>
+          </w:p>
+        </w:tc>
+        <w:tc>
+          <w:tcPr>
+            <w:tcW w:w="0" w:type="auto"/>
+            <w:vAlign w:val="center"/>
+            <w:hideMark/>
+          </w:tcPr>
+          <w:p>
+            <w:pPr>
+              <w:cnfStyle w:val="000000000000" w:firstRow="0" w:lastRow="0" w:firstColumn="0" w:lastColumn="0" w:oddVBand="0" w:evenVBand="0" w:oddHBand="0" w:evenHBand="0" w:firstRowFirstColumn="0" w:firstRowLastColumn="0" w:lastRowFirstColumn="0" w:lastRowLastColumn="0"/>
+            </w:pPr>
+            <w:r>
+              <w:t>Business intelligence reports and dashboard generation.</w:t>
+            </w:r>
+          </w:p>
+        </w:tc>
+      </w:tr>
+    </w:tbl>
+    <w:p/>
+    <w:p>
+      <w:r>
+        <w:t>Each one of these services is designed in a manner that is independent as a NestJS module that is made up of controllers, services, repositories, and data transfer objects (DTOs).</w:t>
+      </w:r>
+    </w:p>
+    <w:p>
+      <w:pPr>
+        <w:spacing w:line="278" w:lineRule="auto"/>
+      </w:pPr>
+      <w:r>
+        <w:br w:type="page"/>
+      </w:r>
+    </w:p>
+    <w:p>
+      <w:pPr>
+        <w:pStyle w:val="Heading3"/>
+      </w:pPr>
+      <w:r>
+        <w:lastRenderedPageBreak/>
+        <w:t>Business Logic Design</w:t>
+      </w:r>
+    </w:p>
+    <w:p>
+      <w:r>
+        <w:t>The Business Logic Layer consists of rules that run the KriGo application. The layer validates requests, applies constraints related to the business process, coordinates actions between services, and guarantees data integrity during the process of business processes execution.</w:t>
+      </w:r>
+    </w:p>
+    <w:p>
+      <w:r>
+        <w:t>Business rules are not implemented in controllers and repositories; all the application logic is contained in special service classes. The controller does nothing but processes the HTTP request and generates an HTTP response, and the repository works only with the persistence process.</w:t>
+      </w:r>
+    </w:p>
+    <w:p>
+      <w:r>
+        <w:t>The principal categories of business rules include:</w:t>
+      </w:r>
+    </w:p>
+    <w:p>
+      <w:pPr>
+        <w:pStyle w:val="ListParagraph"/>
+        <w:numPr>
+          <w:ilvl w:val="0"/>
+          <w:numId w:val="181"/>
+        </w:numPr>
+      </w:pPr>
+      <w:r>
+        <w:t xml:space="preserve">Authentication and authorization rules. </w:t>
+      </w:r>
+    </w:p>
+    <w:p>
+      <w:pPr>
+        <w:pStyle w:val="ListParagraph"/>
+        <w:numPr>
+          <w:ilvl w:val="0"/>
+          <w:numId w:val="181"/>
+        </w:numPr>
+      </w:pPr>
+      <w:r>
+        <w:t xml:space="preserve">Vehicle availability verification. </w:t>
+      </w:r>
+    </w:p>
+    <w:p>
+      <w:pPr>
+        <w:pStyle w:val="ListParagraph"/>
+        <w:numPr>
+          <w:ilvl w:val="0"/>
+          <w:numId w:val="181"/>
+        </w:numPr>
+      </w:pPr>
+      <w:r>
+        <w:t xml:space="preserve">Reservation validation and lifecycle management. </w:t>
+      </w:r>
+    </w:p>
+    <w:p>
+      <w:pPr>
+        <w:pStyle w:val="ListParagraph"/>
+        <w:numPr>
+          <w:ilvl w:val="0"/>
+          <w:numId w:val="181"/>
+        </w:numPr>
+      </w:pPr>
+      <w:r>
+        <w:t xml:space="preserve">Payment verification and confirmation. </w:t>
+      </w:r>
+    </w:p>
+    <w:p>
+      <w:pPr>
+        <w:pStyle w:val="ListParagraph"/>
+        <w:numPr>
+          <w:ilvl w:val="0"/>
+          <w:numId w:val="181"/>
+        </w:numPr>
+      </w:pPr>
+      <w:r>
+        <w:t xml:space="preserve">Agency approval workflow. </w:t>
+      </w:r>
+    </w:p>
+    <w:p>
+      <w:pPr>
+        <w:pStyle w:val="ListParagraph"/>
+        <w:numPr>
+          <w:ilvl w:val="0"/>
+          <w:numId w:val="181"/>
+        </w:numPr>
+      </w:pPr>
+      <w:r>
+        <w:t xml:space="preserve">Review moderation. </w:t>
+      </w:r>
+    </w:p>
+    <w:p>
+      <w:pPr>
+        <w:pStyle w:val="ListParagraph"/>
+        <w:numPr>
+          <w:ilvl w:val="0"/>
+          <w:numId w:val="181"/>
+        </w:numPr>
+      </w:pPr>
+      <w:r>
+        <w:t xml:space="preserve">Dispute investigation and resolution. </w:t>
+      </w:r>
+    </w:p>
+    <w:p>
+      <w:pPr>
+        <w:pStyle w:val="ListParagraph"/>
+        <w:numPr>
+          <w:ilvl w:val="0"/>
+          <w:numId w:val="181"/>
+        </w:numPr>
+      </w:pPr>
+      <w:r>
+        <w:t xml:space="preserve">AI recommendation generation. </w:t>
+      </w:r>
+    </w:p>
+    <w:p>
+      <w:pPr>
+        <w:pStyle w:val="ListParagraph"/>
+        <w:numPr>
+          <w:ilvl w:val="0"/>
+          <w:numId w:val="181"/>
+        </w:numPr>
+      </w:pPr>
+      <w:r>
+        <w:t>Analytics computation.</w:t>
+      </w:r>
+    </w:p>
+    <w:p>
+      <w:r>
+        <w:t>Reservation Service is an example of such hierarchical structure. On receipt of a request to make a reservation, this service checks the eligibility of the customer, determines availability of the vehicle, finds out the rental charge, processes payment, confirms reservation status and finally invokes notification services.</w:t>
+      </w:r>
+    </w:p>
+    <w:p>
+      <w:r>
+        <w:t>Such an approach to handling requests guarantees consistency of the operation of the business process no matter which client application makes the request.</w:t>
+      </w:r>
+    </w:p>
+    <w:p>
+      <w:r>
+        <w:rPr>
+          <w:noProof/>
+        </w:rPr>
+        <mc:AlternateContent>
+          <mc:Choice Requires="wps">
+            <w:drawing>
+              <wp:anchor distT="0" distB="0" distL="114300" distR="114300" simplePos="0" relativeHeight="251686912" behindDoc="0" locked="0" layoutInCell="1" allowOverlap="1" wp14:anchorId="7E714DD2" wp14:editId="21D6BCB2">
+                <wp:simplePos x="0" y="0"/>
+                <wp:positionH relativeFrom="column">
+                  <wp:posOffset>467995</wp:posOffset>
+                </wp:positionH>
+                <wp:positionV relativeFrom="paragraph">
+                  <wp:posOffset>3559810</wp:posOffset>
+                </wp:positionV>
+                <wp:extent cx="4922520" cy="635"/>
+                <wp:effectExtent l="0" t="0" r="0" b="0"/>
+                <wp:wrapSquare wrapText="bothSides"/>
+                <wp:docPr id="717884557" name="Text Box 1"/>
+                <wp:cNvGraphicFramePr/>
+                <a:graphic xmlns:a="http://schemas.openxmlformats.org/drawingml/2006/main">
+                  <a:graphicData uri="http://schemas.microsoft.com/office/word/2010/wordprocessingShape">
+                    <wps:wsp>
+                      <wps:cNvSpPr txBox="1"/>
+                      <wps:spPr>
+                        <a:xfrm>
+                          <a:off x="0" y="0"/>
+                          <a:ext cx="4922520" cy="635"/>
+                        </a:xfrm>
+                        <a:prstGeom prst="rect">
+                          <a:avLst/>
+                        </a:prstGeom>
+                        <a:solidFill>
+                          <a:prstClr val="white"/>
+                        </a:solidFill>
+                        <a:ln>
+                          <a:noFill/>
+                        </a:ln>
+                      </wps:spPr>
+                      <wps:txbx>
+                        <w:txbxContent>
+                          <w:p>
+                            <w:pPr>
+                              <w:pStyle w:val="Caption"/>
+                              <w:jc w:val="center"/>
+                              <w:rPr>
+                                <w:color w:val="000000" w:themeColor="text1"/>
+                                <w:sz w:val="20"/>
+                                <w:szCs w:val="20"/>
+                              </w:rPr>
+                            </w:pPr>
+                            <w:r>
+                              <w:rPr>
+                                <w:color w:val="000000" w:themeColor="text1"/>
+                                <w:sz w:val="20"/>
+                                <w:szCs w:val="20"/>
+                              </w:rPr>
+                              <w:t xml:space="preserve">Figure </w:t>
+                            </w:r>
+                            <w:r>
+                              <w:rPr>
+                                <w:color w:val="000000" w:themeColor="text1"/>
+                                <w:sz w:val="20"/>
+                                <w:szCs w:val="20"/>
+                              </w:rPr>
+                              <w:fldChar w:fldCharType="begin"/>
+                            </w:r>
+                            <w:r>
+                              <w:rPr>
+                                <w:color w:val="000000" w:themeColor="text1"/>
+                                <w:sz w:val="20"/>
+                                <w:szCs w:val="20"/>
+                              </w:rPr>
+                              <w:instrText xml:space="preserve"> SEQ Figure \* ARABIC </w:instrText>
+                            </w:r>
+                            <w:r>
+                              <w:rPr>
+                                <w:color w:val="000000" w:themeColor="text1"/>
+                                <w:sz w:val="20"/>
+                                <w:szCs w:val="20"/>
+                              </w:rPr>
+                              <w:fldChar w:fldCharType="separate"/>
+                            </w:r>
+                            <w:r>
+                              <w:rPr>
+                                <w:noProof/>
+                                <w:color w:val="000000" w:themeColor="text1"/>
+                                <w:sz w:val="20"/>
+                                <w:szCs w:val="20"/>
+                              </w:rPr>
+                              <w:t>9</w:t>
+                            </w:r>
+                            <w:r>
+                              <w:rPr>
+                                <w:color w:val="000000" w:themeColor="text1"/>
+                                <w:sz w:val="20"/>
+                                <w:szCs w:val="20"/>
+                              </w:rPr>
+                              <w:fldChar w:fldCharType="end"/>
+                            </w:r>
+                            <w:r>
+                              <w:rPr>
+                                <w:color w:val="000000" w:themeColor="text1"/>
+                                <w:sz w:val="20"/>
+                                <w:szCs w:val="20"/>
+                              </w:rPr>
+                              <w:t xml:space="preserve"> - Business Logic Processing Flow</w:t>
+                            </w:r>
+                          </w:p>
+                        </w:txbxContent>
+                      </wps:txbx>
+                      <wps:bodyPr rot="0" spcFirstLastPara="0" vertOverflow="overflow" horzOverflow="overflow" vert="horz" wrap="square" lIns="0" tIns="0" rIns="0" bIns="0" numCol="1" spcCol="0" rtlCol="0" fromWordArt="0" anchor="t" anchorCtr="0" forceAA="0" compatLnSpc="1">
+                        <a:prstTxWarp prst="textNoShape">
+                          <a:avLst/>
+                        </a:prstTxWarp>
+                        <a:spAutoFit/>
+                      </wps:bodyPr>
+                    </wps:wsp>
+                  </a:graphicData>
+                </a:graphic>
+              </wp:anchor>
+            </w:drawing>
+          </mc:Choice>
+          <mc:Fallback>
+            <w:pict>
+              <v:shape w14:anchorId="7E714DD2" id="_x0000_s1033" type="#_x0000_t202" style="position:absolute;margin-left:36.85pt;margin-top:280.3pt;width:387.6pt;height:.05pt;z-index:251686912;visibility:visible;mso-wrap-style:square;mso-wrap-distance-left:9pt;mso-wrap-distance-top:0;mso-wrap-distance-right:9pt;mso-wrap-distance-bottom:0;mso-position-horizontal:absolute;mso-position-horizontal-relative:text;mso-position-vertical:absolute;mso-position-vertical-relative:text;v-text-anchor:top" o:gfxdata="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" stroked="f">
+                <v:textbox style="mso-fit-shape-to-text:t" inset="0,0,0,0">
+                  <w:txbxContent>
+                    <w:p>
+                      <w:pPr>
+                        <w:pStyle w:val="Caption"/>
+                        <w:jc w:val="center"/>
+                        <w:rPr>
+                          <w:color w:val="000000" w:themeColor="text1"/>
+                          <w:sz w:val="20"/>
+                          <w:szCs w:val="20"/>
+                        </w:rPr>
+                      </w:pPr>
+                      <w:r>
+                        <w:rPr>
+                          <w:color w:val="000000" w:themeColor="text1"/>
+                          <w:sz w:val="20"/>
+                          <w:szCs w:val="20"/>
+                        </w:rPr>
+                        <w:t xml:space="preserve">Figure </w:t>
+                      </w:r>
+                      <w:r>
+                        <w:rPr>
+                          <w:color w:val="000000" w:themeColor="text1"/>
+                          <w:sz w:val="20"/>
+                          <w:szCs w:val="20"/>
+                        </w:rPr>
+                        <w:fldChar w:fldCharType="begin"/>
+                      </w:r>
+                      <w:r>
+                        <w:rPr>
+                          <w:color w:val="000000" w:themeColor="text1"/>
+                          <w:sz w:val="20"/>
+                          <w:szCs w:val="20"/>
+                        </w:rPr>
+                        <w:instrText xml:space="preserve"> SEQ Figure \* ARABIC </w:instrText>
+                      </w:r>
+                      <w:r>
+                        <w:rPr>
+                          <w:color w:val="000000" w:themeColor="text1"/>
+                          <w:sz w:val="20"/>
+                          <w:szCs w:val="20"/>
+                        </w:rPr>
+                        <w:fldChar w:fldCharType="separate"/>
+                      </w:r>
+                      <w:r>
+                        <w:rPr>
+                          <w:noProof/>
+                          <w:color w:val="000000" w:themeColor="text1"/>
+                          <w:sz w:val="20"/>
+                          <w:szCs w:val="20"/>
+                        </w:rPr>
+                        <w:t>9</w:t>
+                      </w:r>
+                      <w:r>
+                        <w:rPr>
+                          <w:color w:val="000000" w:themeColor="text1"/>
+                          <w:sz w:val="20"/>
+                          <w:szCs w:val="20"/>
+                        </w:rPr>
+                        <w:fldChar w:fldCharType="end"/>
+                      </w:r>
+                      <w:r>
+                        <w:rPr>
+                          <w:color w:val="000000" w:themeColor="text1"/>
+                          <w:sz w:val="20"/>
+                          <w:szCs w:val="20"/>
+                        </w:rPr>
+                        <w:t xml:space="preserve"> - Business Logic Processing Flow</w:t>
+                      </w:r>
+                    </w:p>
+                  </w:txbxContent>
+                </v:textbox>
+                <w10:wrap type="square"/>
+              </v:shape>
+            </w:pict>
+          </mc:Fallback>
+        </mc:AlternateContent>
+      </w:r>
+      <w:r>
+        <w:drawing>
+          <wp:anchor distT="0" distB="0" distL="114300" distR="114300" simplePos="0" relativeHeight="251684864" behindDoc="0" locked="0" layoutInCell="1" allowOverlap="1" wp14:anchorId="0FBDF34E" wp14:editId="3B9CE12C">
+            <wp:simplePos x="0" y="0"/>
+            <wp:positionH relativeFrom="column">
+              <wp:posOffset>467995</wp:posOffset>
+            </wp:positionH>
+            <wp:positionV relativeFrom="paragraph">
+              <wp:posOffset>2540</wp:posOffset>
+            </wp:positionV>
+            <wp:extent cx="4922520" cy="3500120"/>
+            <wp:effectExtent l="0" t="0" r="0" b="5080"/>
+            <wp:wrapSquare wrapText="bothSides"/>
+            <wp:docPr id="1261341270" name="Picture 1"/>
+            <wp:cNvGraphicFramePr>
+              <a:graphicFrameLocks xmlns:a="http://schemas.openxmlformats.org/drawingml/2006/main" noChangeAspect="1"/>
+            </wp:cNvGraphicFramePr>
+            <a:graphic xmlns:a="http://schemas.openxmlformats.org/drawingml/2006/main">
+              <a:graphicData uri="http://schemas.openxmlformats.org/drawingml/2006/picture">
+                <pic:pic xmlns:pic="http://schemas.openxmlformats.org/drawingml/2006/picture">
+                  <pic:nvPicPr>
+                    <pic:cNvPr id="1261341270" name=""/>
+                    <pic:cNvPicPr/>
+                  </pic:nvPicPr>
+                  <pic:blipFill>
+                    <a:blip r:embed="rId26">
+                      <a:extLst>
+                        <a:ext uri="{28A0092B-C50C-407E-A947-70E740481C1C}">
+                          <a14:useLocalDpi xmlns:a14="http://schemas.microsoft.com/office/drawing/2010/main" val="0"/>
+                        </a:ext>
+                      </a:extLst>
+                    </a:blip>
+                    <a:stretch>
+                      <a:fillRect/>
+                    </a:stretch>
+                  </pic:blipFill>
+                  <pic:spPr>
+                    <a:xfrm>
+                      <a:off x="0" y="0"/>
+                      <a:ext cx="4922520" cy="3500120"/>
+                    </a:xfrm>
+                    <a:prstGeom prst="rect">
+                      <a:avLst/>
+                    </a:prstGeom>
+                  </pic:spPr>
+                </pic:pic>
+              </a:graphicData>
+            </a:graphic>
+            <wp14:sizeRelH relativeFrom="margin">
+              <wp14:pctWidth>0</wp14:pctWidth>
+            </wp14:sizeRelH>
+            <wp14:sizeRelV relativeFrom="margin">
+              <wp14:pctHeight>0</wp14:pctHeight>
+            </wp14:sizeRelV>
+          </wp:anchor>
+        </w:drawing>
+      </w:r>
+    </w:p>
+    <w:p>
+      <w:pPr>
+        <w:spacing w:line="278" w:lineRule="auto"/>
+      </w:pPr>
+      <w:r>
+        <w:br w:type="page"/>
+      </w:r>
+    </w:p>
+    <w:p>
+      <w:pPr>
+        <w:pStyle w:val="Heading3"/>
+      </w:pPr>
+      <w:r>
+        <w:lastRenderedPageBreak/>
+        <w:t>Internal Communication Design</w:t>
+      </w:r>
+    </w:p>
+    <w:p>
+      <w:r>
+        <w:t>The communication pattern between backend services is implemented according to the well-defined interaction model based on dependency injection, service interfaces, and asynchronous messages. Inter-module direct access is not used in order to keep low coupling within the architecture.</w:t>
+      </w:r>
+    </w:p>
+    <w:p>
+      <w:r>
+        <w:t>The majority of the processes use the services by making synchronous calls to them. For instance, the Reservation Service interacts directly with the Fleet Service in order to check the availability of the vehicles and with the Payment Service to make sure that the payment was made by the customer before the reservation is confirmed.</w:t>
+      </w:r>
+    </w:p>
+    <w:p>
+      <w:r>
+        <w:t>There are certain processes which do not need to be executed immediately, and therefore they are processed asynchronously. Such processes as sending notifications, sending emails, generating analytics, updating AI models, and maintenance operations are handled by the message-based architecture using RabbitMQ and BullMQ.</w:t>
+      </w:r>
+    </w:p>
+    <w:p>
+      <w:pPr>
+        <w:spacing w:after="0"/>
+      </w:pPr>
+      <w:r>
+        <w:t>Communication patterns used internally include:</w:t>
+      </w:r>
+    </w:p>
+    <w:p>
+      <w:pPr>
+        <w:spacing w:after="0"/>
+      </w:pPr>
+    </w:p>
+    <w:tbl>
+      <w:tblPr>
+        <w:tblStyle w:val="PlainTable1"/>
+        <w:tblW w:w="0" w:type="auto"/>
+        <w:tblCellMar>
+          <w:top w:w="72" w:type="dxa"/>
+          <w:bottom w:w="72" w:type="dxa"/>
+        </w:tblCellMar>
+        <w:tblLook w:val="04A0" w:firstRow="1" w:lastRow="0" w:firstColumn="1" w:lastColumn="0" w:noHBand="0" w:noVBand="1"/>
+      </w:tblPr>
+      <w:tblGrid>
+        <w:gridCol w:w="2428"/>
+        <w:gridCol w:w="6874"/>
+      </w:tblGrid>
+      <w:tr>
+        <w:trPr>
+          <w:cnfStyle w:val="100000000000" w:firstRow="1" w:lastRow="0" w:firstColumn="0" w:lastColumn="0" w:oddVBand="0" w:evenVBand="0" w:oddHBand="0" w:evenHBand="0" w:firstRowFirstColumn="0" w:firstRowLastColumn="0" w:lastRowFirstColumn="0" w:lastRowLastColumn="0"/>
+        </w:trPr>
+        <w:tc>
+          <w:tcPr>
+            <w:cnfStyle w:val="001000000000" w:firstRow="0" w:lastRow="0" w:firstColumn="1" w:lastColumn="0" w:oddVBand="0" w:evenVBand="0" w:oddHBand="0" w:evenHBand="0" w:firstRowFirstColumn="0" w:firstRowLastColumn="0" w:lastRowFirstColumn="0" w:lastRowLastColumn="0"/>
+            <w:tcW w:w="0" w:type="auto"/>
+            <w:vAlign w:val="center"/>
+            <w:hideMark/>
+          </w:tcPr>
+          <w:p>
+            <w:r>
+              <w:t>Communication Type</w:t>
+            </w:r>
+          </w:p>
+        </w:tc>
+        <w:tc>
+          <w:tcPr>
+            <w:tcW w:w="0" w:type="auto"/>
+            <w:vAlign w:val="center"/>
+            <w:hideMark/>
+          </w:tcPr>
+          <w:p>
+            <w:pPr>
+              <w:cnfStyle w:val="100000000000" w:firstRow="1" w:lastRow="0" w:firstColumn="0" w:lastColumn="0" w:oddVBand="0" w:evenVBand="0" w:oddHBand="0" w:evenHBand="0" w:firstRowFirstColumn="0" w:firstRowLastColumn="0" w:lastRowFirstColumn="0" w:lastRowLastColumn="0"/>
+            </w:pPr>
+            <w:r>
+              <w:t>Purpose</w:t>
+            </w:r>
+          </w:p>
+        </w:tc>
+      </w:tr>
+      <w:tr>
+        <w:trPr>
+          <w:cnfStyle w:val="000000100000" w:firstRow="0" w:lastRow="0" w:firstColumn="0" w:lastColumn="0" w:oddVBand="0" w:evenVBand="0" w:oddHBand="1" w:evenHBand="0" w:firstRowFirstColumn="0" w:firstRowLastColumn="0" w:lastRowFirstColumn="0" w:lastRowLastColumn="0"/>
+        </w:trPr>
+        <w:tc>
+          <w:tcPr>
+            <w:cnfStyle w:val="001000000000" w:firstRow="0" w:lastRow="0" w:firstColumn="1" w:lastColumn="0" w:oddVBand="0" w:evenVBand="0" w:oddHBand="0" w:evenHBand="0" w:firstRowFirstColumn="0" w:firstRowLastColumn="0" w:lastRowFirstColumn="0" w:lastRowLastColumn="0"/>
+            <w:tcW w:w="0" w:type="auto"/>
+            <w:vAlign w:val="center"/>
+            <w:hideMark/>
+          </w:tcPr>
+          <w:p>
+            <w:pPr>
+              <w:rPr>
+                <w:b w:val="0"/>
+                <w:bCs w:val="0"/>
+              </w:rPr>
+            </w:pPr>
+            <w:r>
+              <w:rPr>
+                <w:b w:val="0"/>
+                <w:bCs w:val="0"/>
+              </w:rPr>
+              <w:t>REST API</w:t>
+            </w:r>
+          </w:p>
+        </w:tc>
+        <w:tc>
+          <w:tcPr>
+            <w:tcW w:w="0" w:type="auto"/>
+            <w:vAlign w:val="center"/>
+            <w:hideMark/>
+          </w:tcPr>
+          <w:p>
+            <w:pPr>
+              <w:cnfStyle w:val="000000100000" w:firstRow="0" w:lastRow="0" w:firstColumn="0" w:lastColumn="0" w:oddVBand="0" w:evenVBand="0" w:oddHBand="1" w:evenHBand="0" w:firstRowFirstColumn="0" w:firstRowLastColumn="0" w:lastRowFirstColumn="0" w:lastRowLastColumn="0"/>
+            </w:pPr>
+            <w:r>
+              <w:t>Communication between frontend applications and backend services.</w:t>
+            </w:r>
+          </w:p>
+        </w:tc>
+      </w:tr>
+      <w:tr>
+        <w:tc>
+          <w:tcPr>
+            <w:cnfStyle w:val="001000000000" w:firstRow="0" w:lastRow="0" w:firstColumn="1" w:lastColumn="0" w:oddVBand="0" w:evenVBand="0" w:oddHBand="0" w:evenHBand="0" w:firstRowFirstColumn="0" w:firstRowLastColumn="0" w:lastRowFirstColumn="0" w:lastRowLastColumn="0"/>
+            <w:tcW w:w="0" w:type="auto"/>
+            <w:vAlign w:val="center"/>
+            <w:hideMark/>
+          </w:tcPr>
+          <w:p>
+            <w:pPr>
+              <w:rPr>
+                <w:b w:val="0"/>
+                <w:bCs w:val="0"/>
+              </w:rPr>
+            </w:pPr>
+            <w:r>
+              <w:rPr>
+                <w:b w:val="0"/>
+                <w:bCs w:val="0"/>
+              </w:rPr>
+              <w:t>Dependency Injection</w:t>
+            </w:r>
+          </w:p>
+        </w:tc>
+        <w:tc>
+          <w:tcPr>
+            <w:tcW w:w="0" w:type="auto"/>
+            <w:vAlign w:val="center"/>
+            <w:hideMark/>
+          </w:tcPr>
+          <w:p>
+            <w:pPr>
+              <w:cnfStyle w:val="000000000000" w:firstRow="0" w:lastRow="0" w:firstColumn="0" w:lastColumn="0" w:oddVBand="0" w:evenVBand="0" w:oddHBand="0" w:evenHBand="0" w:firstRowFirstColumn="0" w:firstRowLastColumn="0" w:lastRowFirstColumn="0" w:lastRowLastColumn="0"/>
+            </w:pPr>
+            <w:r>
+              <w:t>Communication between internal service modules.</w:t>
+            </w:r>
+          </w:p>
+        </w:tc>
+      </w:tr>
+      <w:tr>
+        <w:trPr>
+          <w:cnfStyle w:val="000000100000" w:firstRow="0" w:lastRow="0" w:firstColumn="0" w:lastColumn="0" w:oddVBand="0" w:evenVBand="0" w:oddHBand="1" w:evenHBand="0" w:firstRowFirstColumn="0" w:firstRowLastColumn="0" w:lastRowFirstColumn="0" w:lastRowLastColumn="0"/>
+        </w:trPr>
+        <w:tc>
+          <w:tcPr>
+            <w:cnfStyle w:val="001000000000" w:firstRow="0" w:lastRow="0" w:firstColumn="1" w:lastColumn="0" w:oddVBand="0" w:evenVBand="0" w:oddHBand="0" w:evenHBand="0" w:firstRowFirstColumn="0" w:firstRowLastColumn="0" w:lastRowFirstColumn="0" w:lastRowLastColumn="0"/>
+            <w:tcW w:w="0" w:type="auto"/>
+            <w:vAlign w:val="center"/>
+            <w:hideMark/>
+          </w:tcPr>
+          <w:p>
+            <w:pPr>
+              <w:rPr>
+                <w:b w:val="0"/>
+                <w:bCs w:val="0"/>
+              </w:rPr>
+            </w:pPr>
+            <w:r>
+              <w:rPr>
+                <w:b w:val="0"/>
+                <w:bCs w:val="0"/>
+              </w:rPr>
+              <w:t>Repository Pattern</w:t>
+            </w:r>
+          </w:p>
+        </w:tc>
+        <w:tc>
+          <w:tcPr>
+            <w:tcW w:w="0" w:type="auto"/>
+            <w:vAlign w:val="center"/>
+            <w:hideMark/>
+          </w:tcPr>
+          <w:p>
+            <w:pPr>
+              <w:cnfStyle w:val="000000100000" w:firstRow="0" w:lastRow="0" w:firstColumn="0" w:lastColumn="0" w:oddVBand="0" w:evenVBand="0" w:oddHBand="1" w:evenHBand="0" w:firstRowFirstColumn="0" w:firstRowLastColumn="0" w:lastRowFirstColumn="0" w:lastRowLastColumn="0"/>
+            </w:pPr>
+            <w:r>
+              <w:t>Data persistence and retrieval.</w:t>
+            </w:r>
+          </w:p>
+        </w:tc>
+      </w:tr>
+      <w:tr>
+        <w:tc>
+          <w:tcPr>
+            <w:cnfStyle w:val="001000000000" w:firstRow="0" w:lastRow="0" w:firstColumn="1" w:lastColumn="0" w:oddVBand="0" w:evenVBand="0" w:oddHBand="0" w:evenHBand="0" w:firstRowFirstColumn="0" w:firstRowLastColumn="0" w:lastRowFirstColumn="0" w:lastRowLastColumn="0"/>
+            <w:tcW w:w="0" w:type="auto"/>
+            <w:vAlign w:val="center"/>
+            <w:hideMark/>
+          </w:tcPr>
+          <w:p>
+            <w:pPr>
+              <w:rPr>
+                <w:b w:val="0"/>
+                <w:bCs w:val="0"/>
+              </w:rPr>
+            </w:pPr>
+            <w:r>
+              <w:rPr>
+                <w:b w:val="0"/>
+                <w:bCs w:val="0"/>
+              </w:rPr>
+              <w:t>RabbitMQ</w:t>
+            </w:r>
+          </w:p>
+        </w:tc>
+        <w:tc>
+          <w:tcPr>
+            <w:tcW w:w="0" w:type="auto"/>
+            <w:vAlign w:val="center"/>
+            <w:hideMark/>
+          </w:tcPr>
+          <w:p>
+            <w:pPr>
+              <w:cnfStyle w:val="000000000000" w:firstRow="0" w:lastRow="0" w:firstColumn="0" w:lastColumn="0" w:oddVBand="0" w:evenVBand="0" w:oddHBand="0" w:evenHBand="0" w:firstRowFirstColumn="0" w:firstRowLastColumn="0" w:lastRowFirstColumn="0" w:lastRowLastColumn="0"/>
+            </w:pPr>
+            <w:r>
+              <w:t>Event-driven asynchronous messaging.</w:t>
+            </w:r>
+          </w:p>
+        </w:tc>
+      </w:tr>
+      <w:tr>
+        <w:trPr>
+          <w:cnfStyle w:val="000000100000" w:firstRow="0" w:lastRow="0" w:firstColumn="0" w:lastColumn="0" w:oddVBand="0" w:evenVBand="0" w:oddHBand="1" w:evenHBand="0" w:firstRowFirstColumn="0" w:firstRowLastColumn="0" w:lastRowFirstColumn="0" w:lastRowLastColumn="0"/>
+        </w:trPr>
+        <w:tc>
+          <w:tcPr>
+            <w:cnfStyle w:val="001000000000" w:firstRow="0" w:lastRow="0" w:firstColumn="1" w:lastColumn="0" w:oddVBand="0" w:evenVBand="0" w:oddHBand="0" w:evenHBand="0" w:firstRowFirstColumn="0" w:firstRowLastColumn="0" w:lastRowFirstColumn="0" w:lastRowLastColumn="0"/>
+            <w:tcW w:w="0" w:type="auto"/>
+            <w:vAlign w:val="center"/>
+            <w:hideMark/>
+          </w:tcPr>
+          <w:p>
+            <w:pPr>
+              <w:rPr>
+                <w:b w:val="0"/>
+                <w:bCs w:val="0"/>
+              </w:rPr>
+            </w:pPr>
+            <w:r>
+              <w:rPr>
+                <w:b w:val="0"/>
+                <w:bCs w:val="0"/>
+              </w:rPr>
+              <w:t>BullMQ</w:t>
+            </w:r>
+          </w:p>
+        </w:tc>
+        <w:tc>
+          <w:tcPr>
+            <w:tcW w:w="0" w:type="auto"/>
+            <w:vAlign w:val="center"/>
+            <w:hideMark/>
+          </w:tcPr>
+          <w:p>
+            <w:pPr>
+              <w:cnfStyle w:val="000000100000" w:firstRow="0" w:lastRow="0" w:firstColumn="0" w:lastColumn="0" w:oddVBand="0" w:evenVBand="0" w:oddHBand="1" w:evenHBand="0" w:firstRowFirstColumn="0" w:firstRowLastColumn="0" w:lastRowFirstColumn="0" w:lastRowLastColumn="0"/>
+            </w:pPr>
+            <w:r>
+              <w:t>Background job scheduling and processing.</w:t>
+            </w:r>
+          </w:p>
+        </w:tc>
+      </w:tr>
+      <w:tr>
+        <w:tc>
+          <w:tcPr>
+            <w:cnfStyle w:val="001000000000" w:firstRow="0" w:lastRow="0" w:firstColumn="1" w:lastColumn="0" w:oddVBand="0" w:evenVBand="0" w:oddHBand="0" w:evenHBand="0" w:firstRowFirstColumn="0" w:firstRowLastColumn="0" w:lastRowFirstColumn="0" w:lastRowLastColumn="0"/>
+            <w:tcW w:w="0" w:type="auto"/>
+            <w:vAlign w:val="center"/>
+            <w:hideMark/>
+          </w:tcPr>
+          <w:p>
+            <w:pPr>
+              <w:rPr>
+                <w:b w:val="0"/>
+                <w:bCs w:val="0"/>
+              </w:rPr>
+            </w:pPr>
+            <w:r>
+              <w:rPr>
+                <w:b w:val="0"/>
+                <w:bCs w:val="0"/>
+              </w:rPr>
+              <w:t>WebSocket</w:t>
+            </w:r>
+          </w:p>
+        </w:tc>
+        <w:tc>
+          <w:tcPr>
+            <w:tcW w:w="0" w:type="auto"/>
+            <w:vAlign w:val="center"/>
+            <w:hideMark/>
+          </w:tcPr>
+          <w:p>
+            <w:pPr>
+              <w:cnfStyle w:val="000000000000" w:firstRow="0" w:lastRow="0" w:firstColumn="0" w:lastColumn="0" w:oddVBand="0" w:evenVBand="0" w:oddHBand="0" w:evenHBand="0" w:firstRowFirstColumn="0" w:firstRowLastColumn="0" w:lastRowFirstColumn="0" w:lastRowLastColumn="0"/>
+            </w:pPr>
+            <w:r>
+              <w:t>Real-time notifications and reservation updates.</w:t>
+            </w:r>
+          </w:p>
+        </w:tc>
+      </w:tr>
+    </w:tbl>
+    <w:p>
+      <w:pPr>
+        <w:spacing w:after="0"/>
+      </w:pPr>
+    </w:p>
+    <w:p>
+      <w:r>
+        <w:t>By combining synchronous service calls with asynchronous event processing, the backend achieves both consistency for critical operations and scalability for computationally intensive tasks.</w:t>
       </w:r>
     </w:p>
     <w:p>
@@ -9806,8 +11316,8 @@
     </w:p>
     <w:p/>
     <w:sectPr>
-      <w:headerReference w:type="default" r:id="rId25"/>
-      <w:footerReference w:type="default" r:id="rId26"/>
+      <w:headerReference w:type="default" r:id="rId27"/>
+      <w:footerReference w:type="default" r:id="rId28"/>
       <w:pgSz w:w="11906" w:h="16838" w:code="9"/>
       <w:pgMar w:top="1411" w:right="850" w:bottom="1411" w:left="1699" w:header="720" w:footer="432" w:gutter="0"/>
       <w:pgNumType w:start="1"/>
@@ -12071,6 +13581,119 @@
     </w:lvl>
   </w:abstractNum>
   <w:abstractNum w:abstractNumId="16" w15:restartNumberingAfterBreak="0">
+    <w:nsid w:val="141F262D"/>
+    <w:multiLevelType w:val="hybridMultilevel"/>
+    <w:tmpl w:val="7868BBFA"/>
+    <w:lvl w:ilvl="0" w:tplc="04090005">
+      <w:start w:val="1"/>
+      <w:numFmt w:val="bullet"/>
+      <w:lvlText w:val=""/>
+      <w:lvlJc w:val="left"/>
+      <w:pPr>
+        <w:ind w:left="720" w:hanging="360"/>
+      </w:pPr>
+      <w:rPr>
+        <w:rFonts w:ascii="Wingdings" w:hAnsi="Wingdings" w:hint="default"/>
+      </w:rPr>
+    </w:lvl>
+    <w:lvl w:ilvl="1" w:tplc="04090003" w:tentative="1">
+      <w:start w:val="1"/>
+      <w:numFmt w:val="bullet"/>
+      <w:lvlText w:val="o"/>
+      <w:lvlJc w:val="left"/>
+      <w:pPr>
+        <w:ind w:left="1440" w:hanging="360"/>
+      </w:pPr>
+      <w:rPr>
+        <w:rFonts w:ascii="Courier New" w:hAnsi="Courier New" w:cs="Courier New" w:hint="default"/>
+      </w:rPr>
+    </w:lvl>
+    <w:lvl w:ilvl="2" w:tplc="04090005" w:tentative="1">
+      <w:start w:val="1"/>
+      <w:numFmt w:val="bullet"/>
+      <w:lvlText w:val=""/>
+      <w:lvlJc w:val="left"/>
+      <w:pPr>
+        <w:ind w:left="2160" w:hanging="360"/>
+      </w:pPr>
+      <w:rPr>
+        <w:rFonts w:ascii="Wingdings" w:hAnsi="Wingdings" w:hint="default"/>
+      </w:rPr>
+    </w:lvl>
+    <w:lvl w:ilvl="3" w:tplc="04090001" w:tentative="1">
+      <w:start w:val="1"/>
+      <w:numFmt w:val="bullet"/>
+      <w:lvlText w:val=""/>
+      <w:lvlJc w:val="left"/>
+      <w:pPr>
+        <w:ind w:left="2880" w:hanging="360"/>
+      </w:pPr>
+      <w:rPr>
+        <w:rFonts w:ascii="Symbol" w:hAnsi="Symbol" w:hint="default"/>
+      </w:rPr>
+    </w:lvl>
+    <w:lvl w:ilvl="4" w:tplc="04090003" w:tentative="1">
+      <w:start w:val="1"/>
+      <w:numFmt w:val="bullet"/>
+      <w:lvlText w:val="o"/>
+      <w:lvlJc w:val="left"/>
+      <w:pPr>
+        <w:ind w:left="3600" w:hanging="360"/>
+      </w:pPr>
+      <w:rPr>
+        <w:rFonts w:ascii="Courier New" w:hAnsi="Courier New" w:cs="Courier New" w:hint="default"/>
+      </w:rPr>
+    </w:lvl>
+    <w:lvl w:ilvl="5" w:tplc="04090005" w:tentative="1">
+      <w:start w:val="1"/>
+      <w:numFmt w:val="bullet"/>
+      <w:lvlText w:val=""/>
+      <w:lvlJc w:val="left"/>
+      <w:pPr>
+        <w:ind w:left="4320" w:hanging="360"/>
+      </w:pPr>
+      <w:rPr>
+        <w:rFonts w:ascii="Wingdings" w:hAnsi="Wingdings" w:hint="default"/>
+      </w:rPr>
+    </w:lvl>
+    <w:lvl w:ilvl="6" w:tplc="04090001" w:tentative="1">
+      <w:start w:val="1"/>
+      <w:numFmt w:val="bullet"/>
+      <w:lvlText w:val=""/>
+      <w:lvlJc w:val="left"/>
+      <w:pPr>
+        <w:ind w:left="5040" w:hanging="360"/>
+      </w:pPr>
+      <w:rPr>
+        <w:rFonts w:ascii="Symbol" w:hAnsi="Symbol" w:hint="default"/>
+      </w:rPr>
+    </w:lvl>
+    <w:lvl w:ilvl="7" w:tplc="04090003" w:tentative="1">
+      <w:start w:val="1"/>
+      <w:numFmt w:val="bullet"/>
+      <w:lvlText w:val="o"/>
+      <w:lvlJc w:val="left"/>
+      <w:pPr>
+        <w:ind w:left="5760" w:hanging="360"/>
+      </w:pPr>
+      <w:rPr>
+        <w:rFonts w:ascii="Courier New" w:hAnsi="Courier New" w:cs="Courier New" w:hint="default"/>
+      </w:rPr>
+    </w:lvl>
+    <w:lvl w:ilvl="8" w:tplc="04090005" w:tentative="1">
+      <w:start w:val="1"/>
+      <w:numFmt w:val="bullet"/>
+      <w:lvlText w:val=""/>
+      <w:lvlJc w:val="left"/>
+      <w:pPr>
+        <w:ind w:left="6480" w:hanging="360"/>
+      </w:pPr>
+      <w:rPr>
+        <w:rFonts w:ascii="Wingdings" w:hAnsi="Wingdings" w:hint="default"/>
+      </w:rPr>
+    </w:lvl>
+  </w:abstractNum>
+  <w:abstractNum w:abstractNumId="17" w15:restartNumberingAfterBreak="0">
     <w:nsid w:val="15354085"/>
     <w:multiLevelType w:val="multilevel"/>
     <w:tmpl w:val="ED488EA0"/>
@@ -12219,7 +13842,7 @@
       </w:rPr>
     </w:lvl>
   </w:abstractNum>
-  <w:abstractNum w:abstractNumId="17" w15:restartNumberingAfterBreak="0">
+  <w:abstractNum w:abstractNumId="18" w15:restartNumberingAfterBreak="0">
     <w:nsid w:val="15923962"/>
     <w:multiLevelType w:val="hybridMultilevel"/>
     <w:tmpl w:val="2A8A437A"/>
@@ -12331,7 +13954,7 @@
       </w:rPr>
     </w:lvl>
   </w:abstractNum>
-  <w:abstractNum w:abstractNumId="18" w15:restartNumberingAfterBreak="0">
+  <w:abstractNum w:abstractNumId="19" w15:restartNumberingAfterBreak="0">
     <w:nsid w:val="15E231DD"/>
     <w:multiLevelType w:val="hybridMultilevel"/>
     <w:tmpl w:val="48B4AB8E"/>
@@ -12444,7 +14067,7 @@
       </w:rPr>
     </w:lvl>
   </w:abstractNum>
-  <w:abstractNum w:abstractNumId="19" w15:restartNumberingAfterBreak="0">
+  <w:abstractNum w:abstractNumId="20" w15:restartNumberingAfterBreak="0">
     <w:nsid w:val="15FB6E59"/>
     <w:multiLevelType w:val="multilevel"/>
     <w:tmpl w:val="63F4E6F0"/>
@@ -12593,7 +14216,7 @@
       </w:rPr>
     </w:lvl>
   </w:abstractNum>
-  <w:abstractNum w:abstractNumId="20" w15:restartNumberingAfterBreak="0">
+  <w:abstractNum w:abstractNumId="21" w15:restartNumberingAfterBreak="0">
     <w:nsid w:val="16057B40"/>
     <w:multiLevelType w:val="hybridMultilevel"/>
     <w:tmpl w:val="C63C7D68"/>
@@ -12705,7 +14328,7 @@
       </w:rPr>
     </w:lvl>
   </w:abstractNum>
-  <w:abstractNum w:abstractNumId="21" w15:restartNumberingAfterBreak="0">
+  <w:abstractNum w:abstractNumId="22" w15:restartNumberingAfterBreak="0">
     <w:nsid w:val="18441B3D"/>
     <w:multiLevelType w:val="hybridMultilevel"/>
     <w:tmpl w:val="F162D252"/>
@@ -12817,7 +14440,7 @@
       </w:rPr>
     </w:lvl>
   </w:abstractNum>
-  <w:abstractNum w:abstractNumId="22" w15:restartNumberingAfterBreak="0">
+  <w:abstractNum w:abstractNumId="23" w15:restartNumberingAfterBreak="0">
     <w:nsid w:val="185230B0"/>
     <w:multiLevelType w:val="hybridMultilevel"/>
     <w:tmpl w:val="FDFE89EE"/>
@@ -12930,7 +14553,7 @@
       </w:rPr>
     </w:lvl>
   </w:abstractNum>
-  <w:abstractNum w:abstractNumId="23" w15:restartNumberingAfterBreak="0">
+  <w:abstractNum w:abstractNumId="24" w15:restartNumberingAfterBreak="0">
     <w:nsid w:val="18A93E35"/>
     <w:multiLevelType w:val="hybridMultilevel"/>
     <w:tmpl w:val="7A6E3062"/>
@@ -13042,7 +14665,7 @@
       </w:rPr>
     </w:lvl>
   </w:abstractNum>
-  <w:abstractNum w:abstractNumId="24" w15:restartNumberingAfterBreak="0">
+  <w:abstractNum w:abstractNumId="25" w15:restartNumberingAfterBreak="0">
     <w:nsid w:val="18EC3D82"/>
     <w:multiLevelType w:val="hybridMultilevel"/>
     <w:tmpl w:val="BC5A743C"/>
@@ -13155,7 +14778,7 @@
       </w:rPr>
     </w:lvl>
   </w:abstractNum>
-  <w:abstractNum w:abstractNumId="25" w15:restartNumberingAfterBreak="0">
+  <w:abstractNum w:abstractNumId="26" w15:restartNumberingAfterBreak="0">
     <w:nsid w:val="18F46E01"/>
     <w:multiLevelType w:val="multilevel"/>
     <w:tmpl w:val="C77EDED0"/>
@@ -13304,7 +14927,7 @@
       </w:rPr>
     </w:lvl>
   </w:abstractNum>
-  <w:abstractNum w:abstractNumId="26" w15:restartNumberingAfterBreak="0">
+  <w:abstractNum w:abstractNumId="27" w15:restartNumberingAfterBreak="0">
     <w:nsid w:val="19AE5EE7"/>
     <w:multiLevelType w:val="hybridMultilevel"/>
     <w:tmpl w:val="00A4140C"/>
@@ -13417,7 +15040,7 @@
       </w:rPr>
     </w:lvl>
   </w:abstractNum>
-  <w:abstractNum w:abstractNumId="27" w15:restartNumberingAfterBreak="0">
+  <w:abstractNum w:abstractNumId="28" w15:restartNumberingAfterBreak="0">
     <w:nsid w:val="19C83C12"/>
     <w:multiLevelType w:val="multilevel"/>
     <w:tmpl w:val="7690D588"/>
@@ -13566,7 +15189,7 @@
       </w:rPr>
     </w:lvl>
   </w:abstractNum>
-  <w:abstractNum w:abstractNumId="28" w15:restartNumberingAfterBreak="0">
+  <w:abstractNum w:abstractNumId="29" w15:restartNumberingAfterBreak="0">
     <w:nsid w:val="1A236A44"/>
     <w:multiLevelType w:val="hybridMultilevel"/>
     <w:tmpl w:val="E06C248C"/>
@@ -13679,7 +15302,7 @@
       </w:rPr>
     </w:lvl>
   </w:abstractNum>
-  <w:abstractNum w:abstractNumId="29" w15:restartNumberingAfterBreak="0">
+  <w:abstractNum w:abstractNumId="30" w15:restartNumberingAfterBreak="0">
     <w:nsid w:val="1B247976"/>
     <w:multiLevelType w:val="hybridMultilevel"/>
     <w:tmpl w:val="01AC6F84"/>
@@ -13792,7 +15415,7 @@
       </w:rPr>
     </w:lvl>
   </w:abstractNum>
-  <w:abstractNum w:abstractNumId="30" w15:restartNumberingAfterBreak="0">
+  <w:abstractNum w:abstractNumId="31" w15:restartNumberingAfterBreak="0">
     <w:nsid w:val="1C511176"/>
     <w:multiLevelType w:val="multilevel"/>
     <w:tmpl w:val="201E7F12"/>
@@ -13941,7 +15564,7 @@
       </w:rPr>
     </w:lvl>
   </w:abstractNum>
-  <w:abstractNum w:abstractNumId="31" w15:restartNumberingAfterBreak="0">
+  <w:abstractNum w:abstractNumId="32" w15:restartNumberingAfterBreak="0">
     <w:nsid w:val="1D4C2E50"/>
     <w:multiLevelType w:val="multilevel"/>
     <w:tmpl w:val="63F4E6F0"/>
@@ -14090,7 +15713,7 @@
       </w:rPr>
     </w:lvl>
   </w:abstractNum>
-  <w:abstractNum w:abstractNumId="32" w15:restartNumberingAfterBreak="0">
+  <w:abstractNum w:abstractNumId="33" w15:restartNumberingAfterBreak="0">
     <w:nsid w:val="1EC4731F"/>
     <w:multiLevelType w:val="hybridMultilevel"/>
     <w:tmpl w:val="8E26D8F0"/>
@@ -14202,7 +15825,7 @@
       </w:rPr>
     </w:lvl>
   </w:abstractNum>
-  <w:abstractNum w:abstractNumId="33" w15:restartNumberingAfterBreak="0">
+  <w:abstractNum w:abstractNumId="34" w15:restartNumberingAfterBreak="0">
     <w:nsid w:val="1F5F33AA"/>
     <w:multiLevelType w:val="hybridMultilevel"/>
     <w:tmpl w:val="661235B2"/>
@@ -14315,7 +15938,7 @@
       </w:rPr>
     </w:lvl>
   </w:abstractNum>
-  <w:abstractNum w:abstractNumId="34" w15:restartNumberingAfterBreak="0">
+  <w:abstractNum w:abstractNumId="35" w15:restartNumberingAfterBreak="0">
     <w:nsid w:val="20017871"/>
     <w:multiLevelType w:val="hybridMultilevel"/>
     <w:tmpl w:val="EA76608A"/>
@@ -14428,7 +16051,7 @@
       </w:rPr>
     </w:lvl>
   </w:abstractNum>
-  <w:abstractNum w:abstractNumId="35" w15:restartNumberingAfterBreak="0">
+  <w:abstractNum w:abstractNumId="36" w15:restartNumberingAfterBreak="0">
     <w:nsid w:val="206A32F9"/>
     <w:multiLevelType w:val="hybridMultilevel"/>
     <w:tmpl w:val="7A405CA6"/>
@@ -14540,7 +16163,7 @@
       </w:rPr>
     </w:lvl>
   </w:abstractNum>
-  <w:abstractNum w:abstractNumId="36" w15:restartNumberingAfterBreak="0">
+  <w:abstractNum w:abstractNumId="37" w15:restartNumberingAfterBreak="0">
     <w:nsid w:val="20786568"/>
     <w:multiLevelType w:val="hybridMultilevel"/>
     <w:tmpl w:val="200CC0BC"/>
@@ -14652,7 +16275,7 @@
       </w:rPr>
     </w:lvl>
   </w:abstractNum>
-  <w:abstractNum w:abstractNumId="37" w15:restartNumberingAfterBreak="0">
+  <w:abstractNum w:abstractNumId="38" w15:restartNumberingAfterBreak="0">
     <w:nsid w:val="207D21A1"/>
     <w:multiLevelType w:val="hybridMultilevel"/>
     <w:tmpl w:val="AAAE4260"/>
@@ -14764,7 +16387,7 @@
       </w:rPr>
     </w:lvl>
   </w:abstractNum>
-  <w:abstractNum w:abstractNumId="38" w15:restartNumberingAfterBreak="0">
+  <w:abstractNum w:abstractNumId="39" w15:restartNumberingAfterBreak="0">
     <w:nsid w:val="20DC5034"/>
     <w:multiLevelType w:val="hybridMultilevel"/>
     <w:tmpl w:val="4B5425EA"/>
@@ -14876,7 +16499,7 @@
       </w:rPr>
     </w:lvl>
   </w:abstractNum>
-  <w:abstractNum w:abstractNumId="39" w15:restartNumberingAfterBreak="0">
+  <w:abstractNum w:abstractNumId="40" w15:restartNumberingAfterBreak="0">
     <w:nsid w:val="224C7C45"/>
     <w:multiLevelType w:val="multilevel"/>
     <w:tmpl w:val="5C800264"/>
@@ -15025,7 +16648,7 @@
       </w:rPr>
     </w:lvl>
   </w:abstractNum>
-  <w:abstractNum w:abstractNumId="40" w15:restartNumberingAfterBreak="0">
+  <w:abstractNum w:abstractNumId="41" w15:restartNumberingAfterBreak="0">
     <w:nsid w:val="23970AD1"/>
     <w:multiLevelType w:val="hybridMultilevel"/>
     <w:tmpl w:val="6A1E8A04"/>
@@ -15137,7 +16760,7 @@
       </w:rPr>
     </w:lvl>
   </w:abstractNum>
-  <w:abstractNum w:abstractNumId="41" w15:restartNumberingAfterBreak="0">
+  <w:abstractNum w:abstractNumId="42" w15:restartNumberingAfterBreak="0">
     <w:nsid w:val="243D731E"/>
     <w:multiLevelType w:val="multilevel"/>
     <w:tmpl w:val="51303158"/>
@@ -15286,7 +16909,7 @@
       </w:rPr>
     </w:lvl>
   </w:abstractNum>
-  <w:abstractNum w:abstractNumId="42" w15:restartNumberingAfterBreak="0">
+  <w:abstractNum w:abstractNumId="43" w15:restartNumberingAfterBreak="0">
     <w:nsid w:val="26BA6D3C"/>
     <w:multiLevelType w:val="hybridMultilevel"/>
     <w:tmpl w:val="F03CC954"/>
@@ -15398,7 +17021,7 @@
       </w:rPr>
     </w:lvl>
   </w:abstractNum>
-  <w:abstractNum w:abstractNumId="43" w15:restartNumberingAfterBreak="0">
+  <w:abstractNum w:abstractNumId="44" w15:restartNumberingAfterBreak="0">
     <w:nsid w:val="27F6417B"/>
     <w:multiLevelType w:val="hybridMultilevel"/>
     <w:tmpl w:val="BACA6538"/>
@@ -15511,7 +17134,7 @@
       </w:rPr>
     </w:lvl>
   </w:abstractNum>
-  <w:abstractNum w:abstractNumId="44" w15:restartNumberingAfterBreak="0">
+  <w:abstractNum w:abstractNumId="45" w15:restartNumberingAfterBreak="0">
     <w:nsid w:val="28765EA3"/>
     <w:multiLevelType w:val="hybridMultilevel"/>
     <w:tmpl w:val="1CFAEB30"/>
@@ -15624,7 +17247,7 @@
       </w:rPr>
     </w:lvl>
   </w:abstractNum>
-  <w:abstractNum w:abstractNumId="45" w15:restartNumberingAfterBreak="0">
+  <w:abstractNum w:abstractNumId="46" w15:restartNumberingAfterBreak="0">
     <w:nsid w:val="28940045"/>
     <w:multiLevelType w:val="multilevel"/>
     <w:tmpl w:val="23DE4804"/>
@@ -15773,7 +17396,7 @@
       </w:rPr>
     </w:lvl>
   </w:abstractNum>
-  <w:abstractNum w:abstractNumId="46" w15:restartNumberingAfterBreak="0">
+  <w:abstractNum w:abstractNumId="47" w15:restartNumberingAfterBreak="0">
     <w:nsid w:val="289938CC"/>
     <w:multiLevelType w:val="multilevel"/>
     <w:tmpl w:val="57745EE2"/>
@@ -15922,7 +17545,7 @@
       </w:rPr>
     </w:lvl>
   </w:abstractNum>
-  <w:abstractNum w:abstractNumId="47" w15:restartNumberingAfterBreak="0">
+  <w:abstractNum w:abstractNumId="48" w15:restartNumberingAfterBreak="0">
     <w:nsid w:val="2ADE3401"/>
     <w:multiLevelType w:val="multilevel"/>
     <w:tmpl w:val="63F4E6F0"/>
@@ -16071,7 +17694,7 @@
       </w:rPr>
     </w:lvl>
   </w:abstractNum>
-  <w:abstractNum w:abstractNumId="48" w15:restartNumberingAfterBreak="0">
+  <w:abstractNum w:abstractNumId="49" w15:restartNumberingAfterBreak="0">
     <w:nsid w:val="2B592B9C"/>
     <w:multiLevelType w:val="hybridMultilevel"/>
     <w:tmpl w:val="99D4C34E"/>
@@ -16184,7 +17807,7 @@
       </w:rPr>
     </w:lvl>
   </w:abstractNum>
-  <w:abstractNum w:abstractNumId="49" w15:restartNumberingAfterBreak="0">
+  <w:abstractNum w:abstractNumId="50" w15:restartNumberingAfterBreak="0">
     <w:nsid w:val="2B9413C9"/>
     <w:multiLevelType w:val="hybridMultilevel"/>
     <w:tmpl w:val="4F7A7546"/>
@@ -16296,7 +17919,7 @@
       </w:rPr>
     </w:lvl>
   </w:abstractNum>
-  <w:abstractNum w:abstractNumId="50" w15:restartNumberingAfterBreak="0">
+  <w:abstractNum w:abstractNumId="51" w15:restartNumberingAfterBreak="0">
     <w:nsid w:val="2B9539E3"/>
     <w:multiLevelType w:val="hybridMultilevel"/>
     <w:tmpl w:val="E6B8BBB6"/>
@@ -16408,7 +18031,7 @@
       </w:rPr>
     </w:lvl>
   </w:abstractNum>
-  <w:abstractNum w:abstractNumId="51" w15:restartNumberingAfterBreak="0">
+  <w:abstractNum w:abstractNumId="52" w15:restartNumberingAfterBreak="0">
     <w:nsid w:val="2D4B6488"/>
     <w:multiLevelType w:val="hybridMultilevel"/>
     <w:tmpl w:val="F82EB8B0"/>
@@ -16521,7 +18144,7 @@
       </w:rPr>
     </w:lvl>
   </w:abstractNum>
-  <w:abstractNum w:abstractNumId="52" w15:restartNumberingAfterBreak="0">
+  <w:abstractNum w:abstractNumId="53" w15:restartNumberingAfterBreak="0">
     <w:nsid w:val="2E164C9A"/>
     <w:multiLevelType w:val="hybridMultilevel"/>
     <w:tmpl w:val="C6BA489A"/>
@@ -16634,7 +18257,7 @@
       </w:rPr>
     </w:lvl>
   </w:abstractNum>
-  <w:abstractNum w:abstractNumId="53" w15:restartNumberingAfterBreak="0">
+  <w:abstractNum w:abstractNumId="54" w15:restartNumberingAfterBreak="0">
     <w:nsid w:val="2E34438D"/>
     <w:multiLevelType w:val="multilevel"/>
     <w:tmpl w:val="63F4E6F0"/>
@@ -16783,7 +18406,7 @@
       </w:rPr>
     </w:lvl>
   </w:abstractNum>
-  <w:abstractNum w:abstractNumId="54" w15:restartNumberingAfterBreak="0">
+  <w:abstractNum w:abstractNumId="55" w15:restartNumberingAfterBreak="0">
     <w:nsid w:val="2E5D6D2A"/>
     <w:multiLevelType w:val="hybridMultilevel"/>
     <w:tmpl w:val="5D5ADC98"/>
@@ -16896,7 +18519,7 @@
       </w:rPr>
     </w:lvl>
   </w:abstractNum>
-  <w:abstractNum w:abstractNumId="55" w15:restartNumberingAfterBreak="0">
+  <w:abstractNum w:abstractNumId="56" w15:restartNumberingAfterBreak="0">
     <w:nsid w:val="2E716C12"/>
     <w:multiLevelType w:val="hybridMultilevel"/>
     <w:tmpl w:val="6D90C552"/>
@@ -17009,7 +18632,7 @@
       </w:rPr>
     </w:lvl>
   </w:abstractNum>
-  <w:abstractNum w:abstractNumId="56" w15:restartNumberingAfterBreak="0">
+  <w:abstractNum w:abstractNumId="57" w15:restartNumberingAfterBreak="0">
     <w:nsid w:val="2F162517"/>
     <w:multiLevelType w:val="hybridMultilevel"/>
     <w:tmpl w:val="4E3CAB7C"/>
@@ -17121,7 +18744,7 @@
       </w:rPr>
     </w:lvl>
   </w:abstractNum>
-  <w:abstractNum w:abstractNumId="57" w15:restartNumberingAfterBreak="0">
+  <w:abstractNum w:abstractNumId="58" w15:restartNumberingAfterBreak="0">
     <w:nsid w:val="2F1F6483"/>
     <w:multiLevelType w:val="multilevel"/>
     <w:tmpl w:val="993E874E"/>
@@ -17270,7 +18893,7 @@
       </w:rPr>
     </w:lvl>
   </w:abstractNum>
-  <w:abstractNum w:abstractNumId="58" w15:restartNumberingAfterBreak="0">
+  <w:abstractNum w:abstractNumId="59" w15:restartNumberingAfterBreak="0">
     <w:nsid w:val="2F2B2F8E"/>
     <w:multiLevelType w:val="multilevel"/>
     <w:tmpl w:val="547EDCFE"/>
@@ -17419,7 +19042,7 @@
       </w:rPr>
     </w:lvl>
   </w:abstractNum>
-  <w:abstractNum w:abstractNumId="59" w15:restartNumberingAfterBreak="0">
+  <w:abstractNum w:abstractNumId="60" w15:restartNumberingAfterBreak="0">
     <w:nsid w:val="2FF161E6"/>
     <w:multiLevelType w:val="hybridMultilevel"/>
     <w:tmpl w:val="ED6AA478"/>
@@ -17531,7 +19154,7 @@
       </w:rPr>
     </w:lvl>
   </w:abstractNum>
-  <w:abstractNum w:abstractNumId="60" w15:restartNumberingAfterBreak="0">
+  <w:abstractNum w:abstractNumId="61" w15:restartNumberingAfterBreak="0">
     <w:nsid w:val="30CD5DF3"/>
     <w:multiLevelType w:val="hybridMultilevel"/>
     <w:tmpl w:val="127EBD02"/>
@@ -17643,7 +19266,7 @@
       </w:rPr>
     </w:lvl>
   </w:abstractNum>
-  <w:abstractNum w:abstractNumId="61" w15:restartNumberingAfterBreak="0">
+  <w:abstractNum w:abstractNumId="62" w15:restartNumberingAfterBreak="0">
     <w:nsid w:val="31A24DDF"/>
     <w:multiLevelType w:val="multilevel"/>
     <w:tmpl w:val="63F4E6F0"/>
@@ -17792,7 +19415,7 @@
       </w:rPr>
     </w:lvl>
   </w:abstractNum>
-  <w:abstractNum w:abstractNumId="62" w15:restartNumberingAfterBreak="0">
+  <w:abstractNum w:abstractNumId="63" w15:restartNumberingAfterBreak="0">
     <w:nsid w:val="321E65E6"/>
     <w:multiLevelType w:val="multilevel"/>
     <w:tmpl w:val="63F4E6F0"/>
@@ -17941,7 +19564,7 @@
       </w:rPr>
     </w:lvl>
   </w:abstractNum>
-  <w:abstractNum w:abstractNumId="63" w15:restartNumberingAfterBreak="0">
+  <w:abstractNum w:abstractNumId="64" w15:restartNumberingAfterBreak="0">
     <w:nsid w:val="32BD3E3A"/>
     <w:multiLevelType w:val="hybridMultilevel"/>
     <w:tmpl w:val="15A01DD2"/>
@@ -18054,7 +19677,7 @@
       </w:rPr>
     </w:lvl>
   </w:abstractNum>
-  <w:abstractNum w:abstractNumId="64" w15:restartNumberingAfterBreak="0">
+  <w:abstractNum w:abstractNumId="65" w15:restartNumberingAfterBreak="0">
     <w:nsid w:val="32BF1228"/>
     <w:multiLevelType w:val="hybridMultilevel"/>
     <w:tmpl w:val="EECA44F0"/>
@@ -18143,7 +19766,7 @@
       </w:pPr>
     </w:lvl>
   </w:abstractNum>
-  <w:abstractNum w:abstractNumId="65" w15:restartNumberingAfterBreak="0">
+  <w:abstractNum w:abstractNumId="66" w15:restartNumberingAfterBreak="0">
     <w:nsid w:val="332E29E8"/>
     <w:multiLevelType w:val="multilevel"/>
     <w:tmpl w:val="BF082128"/>
@@ -18292,7 +19915,7 @@
       </w:rPr>
     </w:lvl>
   </w:abstractNum>
-  <w:abstractNum w:abstractNumId="66" w15:restartNumberingAfterBreak="0">
+  <w:abstractNum w:abstractNumId="67" w15:restartNumberingAfterBreak="0">
     <w:nsid w:val="34251C5D"/>
     <w:multiLevelType w:val="multilevel"/>
     <w:tmpl w:val="C31CBCE0"/>
@@ -18441,7 +20064,7 @@
       </w:rPr>
     </w:lvl>
   </w:abstractNum>
-  <w:abstractNum w:abstractNumId="67" w15:restartNumberingAfterBreak="0">
+  <w:abstractNum w:abstractNumId="68" w15:restartNumberingAfterBreak="0">
     <w:nsid w:val="342A6150"/>
     <w:multiLevelType w:val="multilevel"/>
     <w:tmpl w:val="29E0BE1C"/>
@@ -18590,7 +20213,7 @@
       </w:rPr>
     </w:lvl>
   </w:abstractNum>
-  <w:abstractNum w:abstractNumId="68" w15:restartNumberingAfterBreak="0">
+  <w:abstractNum w:abstractNumId="69" w15:restartNumberingAfterBreak="0">
     <w:nsid w:val="343166B0"/>
     <w:multiLevelType w:val="hybridMultilevel"/>
     <w:tmpl w:val="91B8ED2A"/>
@@ -18703,7 +20326,7 @@
       </w:rPr>
     </w:lvl>
   </w:abstractNum>
-  <w:abstractNum w:abstractNumId="69" w15:restartNumberingAfterBreak="0">
+  <w:abstractNum w:abstractNumId="70" w15:restartNumberingAfterBreak="0">
     <w:nsid w:val="356F220A"/>
     <w:multiLevelType w:val="multilevel"/>
     <w:tmpl w:val="0FFA5254"/>
@@ -18852,7 +20475,7 @@
       </w:rPr>
     </w:lvl>
   </w:abstractNum>
-  <w:abstractNum w:abstractNumId="70" w15:restartNumberingAfterBreak="0">
+  <w:abstractNum w:abstractNumId="71" w15:restartNumberingAfterBreak="0">
     <w:nsid w:val="357B7363"/>
     <w:multiLevelType w:val="hybridMultilevel"/>
     <w:tmpl w:val="00D411EC"/>
@@ -18964,7 +20587,7 @@
       </w:rPr>
     </w:lvl>
   </w:abstractNum>
-  <w:abstractNum w:abstractNumId="71" w15:restartNumberingAfterBreak="0">
+  <w:abstractNum w:abstractNumId="72" w15:restartNumberingAfterBreak="0">
     <w:nsid w:val="3583100F"/>
     <w:multiLevelType w:val="hybridMultilevel"/>
     <w:tmpl w:val="848ECFAA"/>
@@ -19077,7 +20700,7 @@
       </w:rPr>
     </w:lvl>
   </w:abstractNum>
-  <w:abstractNum w:abstractNumId="72" w15:restartNumberingAfterBreak="0">
+  <w:abstractNum w:abstractNumId="73" w15:restartNumberingAfterBreak="0">
     <w:nsid w:val="3623194A"/>
     <w:multiLevelType w:val="multilevel"/>
     <w:tmpl w:val="63F4E6F0"/>
@@ -19226,7 +20849,7 @@
       </w:rPr>
     </w:lvl>
   </w:abstractNum>
-  <w:abstractNum w:abstractNumId="73" w15:restartNumberingAfterBreak="0">
+  <w:abstractNum w:abstractNumId="74" w15:restartNumberingAfterBreak="0">
     <w:nsid w:val="36AD3FB0"/>
     <w:multiLevelType w:val="multilevel"/>
     <w:tmpl w:val="0644AEEA"/>
@@ -19375,7 +20998,7 @@
       </w:rPr>
     </w:lvl>
   </w:abstractNum>
-  <w:abstractNum w:abstractNumId="74" w15:restartNumberingAfterBreak="0">
+  <w:abstractNum w:abstractNumId="75" w15:restartNumberingAfterBreak="0">
     <w:nsid w:val="371A2CDE"/>
     <w:multiLevelType w:val="hybridMultilevel"/>
     <w:tmpl w:val="EA9C00CC"/>
@@ -19487,7 +21110,7 @@
       </w:rPr>
     </w:lvl>
   </w:abstractNum>
-  <w:abstractNum w:abstractNumId="75" w15:restartNumberingAfterBreak="0">
+  <w:abstractNum w:abstractNumId="76" w15:restartNumberingAfterBreak="0">
     <w:nsid w:val="373D5E48"/>
     <w:multiLevelType w:val="hybridMultilevel"/>
     <w:tmpl w:val="8A6E38C0"/>
@@ -19600,7 +21223,7 @@
       </w:rPr>
     </w:lvl>
   </w:abstractNum>
-  <w:abstractNum w:abstractNumId="76" w15:restartNumberingAfterBreak="0">
+  <w:abstractNum w:abstractNumId="77" w15:restartNumberingAfterBreak="0">
     <w:nsid w:val="3B446B2D"/>
     <w:multiLevelType w:val="hybridMultilevel"/>
     <w:tmpl w:val="B638176E"/>
@@ -19712,7 +21335,7 @@
       </w:rPr>
     </w:lvl>
   </w:abstractNum>
-  <w:abstractNum w:abstractNumId="77" w15:restartNumberingAfterBreak="0">
+  <w:abstractNum w:abstractNumId="78" w15:restartNumberingAfterBreak="0">
     <w:nsid w:val="3B6B41F5"/>
     <w:multiLevelType w:val="hybridMultilevel"/>
     <w:tmpl w:val="10A26168"/>
@@ -19824,7 +21447,7 @@
       </w:rPr>
     </w:lvl>
   </w:abstractNum>
-  <w:abstractNum w:abstractNumId="78" w15:restartNumberingAfterBreak="0">
+  <w:abstractNum w:abstractNumId="79" w15:restartNumberingAfterBreak="0">
     <w:nsid w:val="3BCD79E4"/>
     <w:multiLevelType w:val="hybridMultilevel"/>
     <w:tmpl w:val="FFFAC2AC"/>
@@ -19937,7 +21560,7 @@
       </w:rPr>
     </w:lvl>
   </w:abstractNum>
-  <w:abstractNum w:abstractNumId="79" w15:restartNumberingAfterBreak="0">
+  <w:abstractNum w:abstractNumId="80" w15:restartNumberingAfterBreak="0">
     <w:nsid w:val="3C5546BA"/>
     <w:multiLevelType w:val="hybridMultilevel"/>
     <w:tmpl w:val="3434F5E4"/>
@@ -20049,7 +21672,7 @@
       </w:rPr>
     </w:lvl>
   </w:abstractNum>
-  <w:abstractNum w:abstractNumId="80" w15:restartNumberingAfterBreak="0">
+  <w:abstractNum w:abstractNumId="81" w15:restartNumberingAfterBreak="0">
     <w:nsid w:val="3C623C55"/>
     <w:multiLevelType w:val="multilevel"/>
     <w:tmpl w:val="A0B0E8F4"/>
@@ -20198,7 +21821,7 @@
       </w:rPr>
     </w:lvl>
   </w:abstractNum>
-  <w:abstractNum w:abstractNumId="81" w15:restartNumberingAfterBreak="0">
+  <w:abstractNum w:abstractNumId="82" w15:restartNumberingAfterBreak="0">
     <w:nsid w:val="3CD27F78"/>
     <w:multiLevelType w:val="multilevel"/>
     <w:tmpl w:val="FCDE767A"/>
@@ -20347,7 +21970,7 @@
       </w:rPr>
     </w:lvl>
   </w:abstractNum>
-  <w:abstractNum w:abstractNumId="82" w15:restartNumberingAfterBreak="0">
+  <w:abstractNum w:abstractNumId="83" w15:restartNumberingAfterBreak="0">
     <w:nsid w:val="3CD74B18"/>
     <w:multiLevelType w:val="hybridMultilevel"/>
     <w:tmpl w:val="2FF42220"/>
@@ -20460,7 +22083,7 @@
       </w:rPr>
     </w:lvl>
   </w:abstractNum>
-  <w:abstractNum w:abstractNumId="83" w15:restartNumberingAfterBreak="0">
+  <w:abstractNum w:abstractNumId="84" w15:restartNumberingAfterBreak="0">
     <w:nsid w:val="3D2F7E79"/>
     <w:multiLevelType w:val="hybridMultilevel"/>
     <w:tmpl w:val="6ED674BE"/>
@@ -20572,7 +22195,7 @@
       </w:rPr>
     </w:lvl>
   </w:abstractNum>
-  <w:abstractNum w:abstractNumId="84" w15:restartNumberingAfterBreak="0">
+  <w:abstractNum w:abstractNumId="85" w15:restartNumberingAfterBreak="0">
     <w:nsid w:val="3D397287"/>
     <w:multiLevelType w:val="hybridMultilevel"/>
     <w:tmpl w:val="F4503122"/>
@@ -20684,7 +22307,7 @@
       </w:rPr>
     </w:lvl>
   </w:abstractNum>
-  <w:abstractNum w:abstractNumId="85" w15:restartNumberingAfterBreak="0">
+  <w:abstractNum w:abstractNumId="86" w15:restartNumberingAfterBreak="0">
     <w:nsid w:val="3DC14EA1"/>
     <w:multiLevelType w:val="hybridMultilevel"/>
     <w:tmpl w:val="DCAE9528"/>
@@ -20797,7 +22420,7 @@
       </w:rPr>
     </w:lvl>
   </w:abstractNum>
-  <w:abstractNum w:abstractNumId="86" w15:restartNumberingAfterBreak="0">
+  <w:abstractNum w:abstractNumId="87" w15:restartNumberingAfterBreak="0">
     <w:nsid w:val="3E685FF3"/>
     <w:multiLevelType w:val="multilevel"/>
     <w:tmpl w:val="7D20B538"/>
@@ -20946,7 +22569,7 @@
       </w:rPr>
     </w:lvl>
   </w:abstractNum>
-  <w:abstractNum w:abstractNumId="87" w15:restartNumberingAfterBreak="0">
+  <w:abstractNum w:abstractNumId="88" w15:restartNumberingAfterBreak="0">
     <w:nsid w:val="3F20785F"/>
     <w:multiLevelType w:val="hybridMultilevel"/>
     <w:tmpl w:val="49D612FC"/>
@@ -21059,7 +22682,7 @@
       </w:rPr>
     </w:lvl>
   </w:abstractNum>
-  <w:abstractNum w:abstractNumId="88" w15:restartNumberingAfterBreak="0">
+  <w:abstractNum w:abstractNumId="89" w15:restartNumberingAfterBreak="0">
     <w:nsid w:val="3F346C2C"/>
     <w:multiLevelType w:val="multilevel"/>
     <w:tmpl w:val="63F4E6F0"/>
@@ -21208,7 +22831,7 @@
       </w:rPr>
     </w:lvl>
   </w:abstractNum>
-  <w:abstractNum w:abstractNumId="89" w15:restartNumberingAfterBreak="0">
+  <w:abstractNum w:abstractNumId="90" w15:restartNumberingAfterBreak="0">
     <w:nsid w:val="3FCB1322"/>
     <w:multiLevelType w:val="hybridMultilevel"/>
     <w:tmpl w:val="55C012B2"/>
@@ -21320,7 +22943,7 @@
       </w:rPr>
     </w:lvl>
   </w:abstractNum>
-  <w:abstractNum w:abstractNumId="90" w15:restartNumberingAfterBreak="0">
+  <w:abstractNum w:abstractNumId="91" w15:restartNumberingAfterBreak="0">
     <w:nsid w:val="403501BA"/>
     <w:multiLevelType w:val="hybridMultilevel"/>
     <w:tmpl w:val="D95E90BC"/>
@@ -21433,7 +23056,7 @@
       </w:rPr>
     </w:lvl>
   </w:abstractNum>
-  <w:abstractNum w:abstractNumId="91" w15:restartNumberingAfterBreak="0">
+  <w:abstractNum w:abstractNumId="92" w15:restartNumberingAfterBreak="0">
     <w:nsid w:val="41A9344F"/>
     <w:multiLevelType w:val="hybridMultilevel"/>
     <w:tmpl w:val="0FB60038"/>
@@ -21546,7 +23169,7 @@
       </w:rPr>
     </w:lvl>
   </w:abstractNum>
-  <w:abstractNum w:abstractNumId="92" w15:restartNumberingAfterBreak="0">
+  <w:abstractNum w:abstractNumId="93" w15:restartNumberingAfterBreak="0">
     <w:nsid w:val="41B44F72"/>
     <w:multiLevelType w:val="hybridMultilevel"/>
     <w:tmpl w:val="1F58F614"/>
@@ -21660,7 +23283,7 @@
       </w:rPr>
     </w:lvl>
   </w:abstractNum>
-  <w:abstractNum w:abstractNumId="93" w15:restartNumberingAfterBreak="0">
+  <w:abstractNum w:abstractNumId="94" w15:restartNumberingAfterBreak="0">
     <w:nsid w:val="42004E1F"/>
     <w:multiLevelType w:val="hybridMultilevel"/>
     <w:tmpl w:val="770C8314"/>
@@ -21772,7 +23395,7 @@
       </w:rPr>
     </w:lvl>
   </w:abstractNum>
-  <w:abstractNum w:abstractNumId="94" w15:restartNumberingAfterBreak="0">
+  <w:abstractNum w:abstractNumId="95" w15:restartNumberingAfterBreak="0">
     <w:nsid w:val="439F7169"/>
     <w:multiLevelType w:val="hybridMultilevel"/>
     <w:tmpl w:val="1884EDCA"/>
@@ -21885,7 +23508,7 @@
       </w:rPr>
     </w:lvl>
   </w:abstractNum>
-  <w:abstractNum w:abstractNumId="95" w15:restartNumberingAfterBreak="0">
+  <w:abstractNum w:abstractNumId="96" w15:restartNumberingAfterBreak="0">
     <w:nsid w:val="43EA1D69"/>
     <w:multiLevelType w:val="multilevel"/>
     <w:tmpl w:val="DFEC23EC"/>
@@ -22034,7 +23657,7 @@
       </w:rPr>
     </w:lvl>
   </w:abstractNum>
-  <w:abstractNum w:abstractNumId="96" w15:restartNumberingAfterBreak="0">
+  <w:abstractNum w:abstractNumId="97" w15:restartNumberingAfterBreak="0">
     <w:nsid w:val="44320084"/>
     <w:multiLevelType w:val="hybridMultilevel"/>
     <w:tmpl w:val="CE5076D4"/>
@@ -22146,7 +23769,7 @@
       </w:rPr>
     </w:lvl>
   </w:abstractNum>
-  <w:abstractNum w:abstractNumId="97" w15:restartNumberingAfterBreak="0">
+  <w:abstractNum w:abstractNumId="98" w15:restartNumberingAfterBreak="0">
     <w:nsid w:val="44554567"/>
     <w:multiLevelType w:val="hybridMultilevel"/>
     <w:tmpl w:val="78748252"/>
@@ -22258,7 +23881,7 @@
       </w:rPr>
     </w:lvl>
   </w:abstractNum>
-  <w:abstractNum w:abstractNumId="98" w15:restartNumberingAfterBreak="0">
+  <w:abstractNum w:abstractNumId="99" w15:restartNumberingAfterBreak="0">
     <w:nsid w:val="49005094"/>
     <w:multiLevelType w:val="hybridMultilevel"/>
     <w:tmpl w:val="14848CBE"/>
@@ -22370,7 +23993,7 @@
       </w:rPr>
     </w:lvl>
   </w:abstractNum>
-  <w:abstractNum w:abstractNumId="99" w15:restartNumberingAfterBreak="0">
+  <w:abstractNum w:abstractNumId="100" w15:restartNumberingAfterBreak="0">
     <w:nsid w:val="49243794"/>
     <w:multiLevelType w:val="multilevel"/>
     <w:tmpl w:val="E7681528"/>
@@ -22519,7 +24142,7 @@
       </w:rPr>
     </w:lvl>
   </w:abstractNum>
-  <w:abstractNum w:abstractNumId="100" w15:restartNumberingAfterBreak="0">
+  <w:abstractNum w:abstractNumId="101" w15:restartNumberingAfterBreak="0">
     <w:nsid w:val="4A880990"/>
     <w:multiLevelType w:val="hybridMultilevel"/>
     <w:tmpl w:val="F17E12C2"/>
@@ -22631,7 +24254,7 @@
       </w:rPr>
     </w:lvl>
   </w:abstractNum>
-  <w:abstractNum w:abstractNumId="101" w15:restartNumberingAfterBreak="0">
+  <w:abstractNum w:abstractNumId="102" w15:restartNumberingAfterBreak="0">
     <w:nsid w:val="4B182B12"/>
     <w:multiLevelType w:val="hybridMultilevel"/>
     <w:tmpl w:val="31C486B4"/>
@@ -22743,7 +24366,7 @@
       </w:rPr>
     </w:lvl>
   </w:abstractNum>
-  <w:abstractNum w:abstractNumId="102" w15:restartNumberingAfterBreak="0">
+  <w:abstractNum w:abstractNumId="103" w15:restartNumberingAfterBreak="0">
     <w:nsid w:val="4B6E6D62"/>
     <w:multiLevelType w:val="hybridMultilevel"/>
     <w:tmpl w:val="54DC0C0C"/>
@@ -22856,7 +24479,7 @@
       </w:rPr>
     </w:lvl>
   </w:abstractNum>
-  <w:abstractNum w:abstractNumId="103" w15:restartNumberingAfterBreak="0">
+  <w:abstractNum w:abstractNumId="104" w15:restartNumberingAfterBreak="0">
     <w:nsid w:val="4BA13766"/>
     <w:multiLevelType w:val="multilevel"/>
     <w:tmpl w:val="63F4E6F0"/>
@@ -23005,7 +24628,7 @@
       </w:rPr>
     </w:lvl>
   </w:abstractNum>
-  <w:abstractNum w:abstractNumId="104" w15:restartNumberingAfterBreak="0">
+  <w:abstractNum w:abstractNumId="105" w15:restartNumberingAfterBreak="0">
     <w:nsid w:val="4D2E1CBE"/>
     <w:multiLevelType w:val="hybridMultilevel"/>
     <w:tmpl w:val="BFD86D7C"/>
@@ -23118,7 +24741,7 @@
       </w:rPr>
     </w:lvl>
   </w:abstractNum>
-  <w:abstractNum w:abstractNumId="105" w15:restartNumberingAfterBreak="0">
+  <w:abstractNum w:abstractNumId="106" w15:restartNumberingAfterBreak="0">
     <w:nsid w:val="4E65371E"/>
     <w:multiLevelType w:val="hybridMultilevel"/>
     <w:tmpl w:val="53EE4538"/>
@@ -23230,7 +24853,7 @@
       </w:rPr>
     </w:lvl>
   </w:abstractNum>
-  <w:abstractNum w:abstractNumId="106" w15:restartNumberingAfterBreak="0">
+  <w:abstractNum w:abstractNumId="107" w15:restartNumberingAfterBreak="0">
     <w:nsid w:val="4E9A3F16"/>
     <w:multiLevelType w:val="multilevel"/>
     <w:tmpl w:val="63F4E6F0"/>
@@ -23379,7 +25002,7 @@
       </w:rPr>
     </w:lvl>
   </w:abstractNum>
-  <w:abstractNum w:abstractNumId="107" w15:restartNumberingAfterBreak="0">
+  <w:abstractNum w:abstractNumId="108" w15:restartNumberingAfterBreak="0">
     <w:nsid w:val="500B790D"/>
     <w:multiLevelType w:val="multilevel"/>
     <w:tmpl w:val="63F4E6F0"/>
@@ -23528,7 +25151,7 @@
       </w:rPr>
     </w:lvl>
   </w:abstractNum>
-  <w:abstractNum w:abstractNumId="108" w15:restartNumberingAfterBreak="0">
+  <w:abstractNum w:abstractNumId="109" w15:restartNumberingAfterBreak="0">
     <w:nsid w:val="5037150E"/>
     <w:multiLevelType w:val="hybridMultilevel"/>
     <w:tmpl w:val="064034F8"/>
@@ -23641,7 +25264,7 @@
       </w:rPr>
     </w:lvl>
   </w:abstractNum>
-  <w:abstractNum w:abstractNumId="109" w15:restartNumberingAfterBreak="0">
+  <w:abstractNum w:abstractNumId="110" w15:restartNumberingAfterBreak="0">
     <w:nsid w:val="51417BE1"/>
     <w:multiLevelType w:val="multilevel"/>
     <w:tmpl w:val="993C0E80"/>
@@ -23790,7 +25413,7 @@
       </w:rPr>
     </w:lvl>
   </w:abstractNum>
-  <w:abstractNum w:abstractNumId="110" w15:restartNumberingAfterBreak="0">
+  <w:abstractNum w:abstractNumId="111" w15:restartNumberingAfterBreak="0">
     <w:nsid w:val="526538B7"/>
     <w:multiLevelType w:val="hybridMultilevel"/>
     <w:tmpl w:val="E6A017F2"/>
@@ -23903,7 +25526,7 @@
       </w:rPr>
     </w:lvl>
   </w:abstractNum>
-  <w:abstractNum w:abstractNumId="111" w15:restartNumberingAfterBreak="0">
+  <w:abstractNum w:abstractNumId="112" w15:restartNumberingAfterBreak="0">
     <w:nsid w:val="537E56D9"/>
     <w:multiLevelType w:val="multilevel"/>
     <w:tmpl w:val="1B6E8B6A"/>
@@ -24052,7 +25675,7 @@
       </w:rPr>
     </w:lvl>
   </w:abstractNum>
-  <w:abstractNum w:abstractNumId="112" w15:restartNumberingAfterBreak="0">
+  <w:abstractNum w:abstractNumId="113" w15:restartNumberingAfterBreak="0">
     <w:nsid w:val="53E6601E"/>
     <w:multiLevelType w:val="hybridMultilevel"/>
     <w:tmpl w:val="66F0666A"/>
@@ -24165,7 +25788,7 @@
       </w:rPr>
     </w:lvl>
   </w:abstractNum>
-  <w:abstractNum w:abstractNumId="113" w15:restartNumberingAfterBreak="0">
+  <w:abstractNum w:abstractNumId="114" w15:restartNumberingAfterBreak="0">
     <w:nsid w:val="551D6F91"/>
     <w:multiLevelType w:val="hybridMultilevel"/>
     <w:tmpl w:val="9522B3C6"/>
@@ -24277,7 +25900,156 @@
       </w:rPr>
     </w:lvl>
   </w:abstractNum>
-  <w:abstractNum w:abstractNumId="114" w15:restartNumberingAfterBreak="0">
+  <w:abstractNum w:abstractNumId="115" w15:restartNumberingAfterBreak="0">
+    <w:nsid w:val="5546258F"/>
+    <w:multiLevelType w:val="multilevel"/>
+    <w:tmpl w:val="0CAA196E"/>
+    <w:lvl w:ilvl="0">
+      <w:start w:val="1"/>
+      <w:numFmt w:val="bullet"/>
+      <w:lvlText w:val=""/>
+      <w:lvlJc w:val="left"/>
+      <w:pPr>
+        <w:tabs>
+          <w:tab w:val="num" w:pos="720"/>
+        </w:tabs>
+        <w:ind w:left="720" w:hanging="360"/>
+      </w:pPr>
+      <w:rPr>
+        <w:rFonts w:ascii="Symbol" w:hAnsi="Symbol" w:hint="default"/>
+        <w:sz w:val="20"/>
+      </w:rPr>
+    </w:lvl>
+    <w:lvl w:ilvl="1" w:tentative="1">
+      <w:start w:val="1"/>
+      <w:numFmt w:val="bullet"/>
+      <w:lvlText w:val="o"/>
+      <w:lvlJc w:val="left"/>
+      <w:pPr>
+        <w:tabs>
+          <w:tab w:val="num" w:pos="1440"/>
+        </w:tabs>
+        <w:ind w:left="1440" w:hanging="360"/>
+      </w:pPr>
+      <w:rPr>
+        <w:rFonts w:ascii="Courier New" w:hAnsi="Courier New" w:hint="default"/>
+        <w:sz w:val="20"/>
+      </w:rPr>
+    </w:lvl>
+    <w:lvl w:ilvl="2" w:tentative="1">
+      <w:start w:val="1"/>
+      <w:numFmt w:val="bullet"/>
+      <w:lvlText w:val=""/>
+      <w:lvlJc w:val="left"/>
+      <w:pPr>
+        <w:tabs>
+          <w:tab w:val="num" w:pos="2160"/>
+        </w:tabs>
+        <w:ind w:left="2160" w:hanging="360"/>
+      </w:pPr>
+      <w:rPr>
+        <w:rFonts w:ascii="Wingdings" w:hAnsi="Wingdings" w:hint="default"/>
+        <w:sz w:val="20"/>
+      </w:rPr>
+    </w:lvl>
+    <w:lvl w:ilvl="3" w:tentative="1">
+      <w:start w:val="1"/>
+      <w:numFmt w:val="bullet"/>
+      <w:lvlText w:val=""/>
+      <w:lvlJc w:val="left"/>
+      <w:pPr>
+        <w:tabs>
+          <w:tab w:val="num" w:pos="2880"/>
+        </w:tabs>
+        <w:ind w:left="2880" w:hanging="360"/>
+      </w:pPr>
+      <w:rPr>
+        <w:rFonts w:ascii="Wingdings" w:hAnsi="Wingdings" w:hint="default"/>
+        <w:sz w:val="20"/>
+      </w:rPr>
+    </w:lvl>
+    <w:lvl w:ilvl="4" w:tentative="1">
+      <w:start w:val="1"/>
+      <w:numFmt w:val="bullet"/>
+      <w:lvlText w:val=""/>
+      <w:lvlJc w:val="left"/>
+      <w:pPr>
+        <w:tabs>
+          <w:tab w:val="num" w:pos="3600"/>
+        </w:tabs>
+        <w:ind w:left="3600" w:hanging="360"/>
+      </w:pPr>
+      <w:rPr>
+        <w:rFonts w:ascii="Wingdings" w:hAnsi="Wingdings" w:hint="default"/>
+        <w:sz w:val="20"/>
+      </w:rPr>
+    </w:lvl>
+    <w:lvl w:ilvl="5" w:tentative="1">
+      <w:start w:val="1"/>
+      <w:numFmt w:val="bullet"/>
+      <w:lvlText w:val=""/>
+      <w:lvlJc w:val="left"/>
+      <w:pPr>
+        <w:tabs>
+          <w:tab w:val="num" w:pos="4320"/>
+        </w:tabs>
+        <w:ind w:left="4320" w:hanging="360"/>
+      </w:pPr>
+      <w:rPr>
+        <w:rFonts w:ascii="Wingdings" w:hAnsi="Wingdings" w:hint="default"/>
+        <w:sz w:val="20"/>
+      </w:rPr>
+    </w:lvl>
+    <w:lvl w:ilvl="6" w:tentative="1">
+      <w:start w:val="1"/>
+      <w:numFmt w:val="bullet"/>
+      <w:lvlText w:val=""/>
+      <w:lvlJc w:val="left"/>
+      <w:pPr>
+        <w:tabs>
+          <w:tab w:val="num" w:pos="5040"/>
+        </w:tabs>
+        <w:ind w:left="5040" w:hanging="360"/>
+      </w:pPr>
+      <w:rPr>
+        <w:rFonts w:ascii="Wingdings" w:hAnsi="Wingdings" w:hint="default"/>
+        <w:sz w:val="20"/>
+      </w:rPr>
+    </w:lvl>
+    <w:lvl w:ilvl="7" w:tentative="1">
+      <w:start w:val="1"/>
+      <w:numFmt w:val="bullet"/>
+      <w:lvlText w:val=""/>
+      <w:lvlJc w:val="left"/>
+      <w:pPr>
+        <w:tabs>
+          <w:tab w:val="num" w:pos="5760"/>
+        </w:tabs>
+        <w:ind w:left="5760" w:hanging="360"/>
+      </w:pPr>
+      <w:rPr>
+        <w:rFonts w:ascii="Wingdings" w:hAnsi="Wingdings" w:hint="default"/>
+        <w:sz w:val="20"/>
+      </w:rPr>
+    </w:lvl>
+    <w:lvl w:ilvl="8" w:tentative="1">
+      <w:start w:val="1"/>
+      <w:numFmt w:val="bullet"/>
+      <w:lvlText w:val=""/>
+      <w:lvlJc w:val="left"/>
+      <w:pPr>
+        <w:tabs>
+          <w:tab w:val="num" w:pos="6480"/>
+        </w:tabs>
+        <w:ind w:left="6480" w:hanging="360"/>
+      </w:pPr>
+      <w:rPr>
+        <w:rFonts w:ascii="Wingdings" w:hAnsi="Wingdings" w:hint="default"/>
+        <w:sz w:val="20"/>
+      </w:rPr>
+    </w:lvl>
+  </w:abstractNum>
+  <w:abstractNum w:abstractNumId="116" w15:restartNumberingAfterBreak="0">
     <w:nsid w:val="55655B93"/>
     <w:multiLevelType w:val="multilevel"/>
     <w:tmpl w:val="9C88A4A8"/>
@@ -24426,7 +26198,7 @@
       </w:rPr>
     </w:lvl>
   </w:abstractNum>
-  <w:abstractNum w:abstractNumId="115" w15:restartNumberingAfterBreak="0">
+  <w:abstractNum w:abstractNumId="117" w15:restartNumberingAfterBreak="0">
     <w:nsid w:val="562D4F1F"/>
     <w:multiLevelType w:val="hybridMultilevel"/>
     <w:tmpl w:val="1FF8D31C"/>
@@ -24538,7 +26310,7 @@
       </w:rPr>
     </w:lvl>
   </w:abstractNum>
-  <w:abstractNum w:abstractNumId="116" w15:restartNumberingAfterBreak="0">
+  <w:abstractNum w:abstractNumId="118" w15:restartNumberingAfterBreak="0">
     <w:nsid w:val="565A0C8B"/>
     <w:multiLevelType w:val="multilevel"/>
     <w:tmpl w:val="AB24FF2E"/>
@@ -24687,7 +26459,7 @@
       </w:rPr>
     </w:lvl>
   </w:abstractNum>
-  <w:abstractNum w:abstractNumId="117" w15:restartNumberingAfterBreak="0">
+  <w:abstractNum w:abstractNumId="119" w15:restartNumberingAfterBreak="0">
     <w:nsid w:val="566E7C65"/>
     <w:multiLevelType w:val="multilevel"/>
     <w:tmpl w:val="28803B4C"/>
@@ -24836,7 +26608,7 @@
       </w:rPr>
     </w:lvl>
   </w:abstractNum>
-  <w:abstractNum w:abstractNumId="118" w15:restartNumberingAfterBreak="0">
+  <w:abstractNum w:abstractNumId="120" w15:restartNumberingAfterBreak="0">
     <w:nsid w:val="57407594"/>
     <w:multiLevelType w:val="multilevel"/>
     <w:tmpl w:val="E6E2F8AE"/>
@@ -24985,7 +26757,7 @@
       </w:rPr>
     </w:lvl>
   </w:abstractNum>
-  <w:abstractNum w:abstractNumId="119" w15:restartNumberingAfterBreak="0">
+  <w:abstractNum w:abstractNumId="121" w15:restartNumberingAfterBreak="0">
     <w:nsid w:val="5773128C"/>
     <w:multiLevelType w:val="hybridMultilevel"/>
     <w:tmpl w:val="945E5C1E"/>
@@ -25098,7 +26870,7 @@
       </w:rPr>
     </w:lvl>
   </w:abstractNum>
-  <w:abstractNum w:abstractNumId="120" w15:restartNumberingAfterBreak="0">
+  <w:abstractNum w:abstractNumId="122" w15:restartNumberingAfterBreak="0">
     <w:nsid w:val="577F771B"/>
     <w:multiLevelType w:val="hybridMultilevel"/>
     <w:tmpl w:val="0F2C5914"/>
@@ -25210,7 +26982,7 @@
       </w:rPr>
     </w:lvl>
   </w:abstractNum>
-  <w:abstractNum w:abstractNumId="121" w15:restartNumberingAfterBreak="0">
+  <w:abstractNum w:abstractNumId="123" w15:restartNumberingAfterBreak="0">
     <w:nsid w:val="57C43CDD"/>
     <w:multiLevelType w:val="hybridMultilevel"/>
     <w:tmpl w:val="6C94FB5E"/>
@@ -25323,7 +27095,7 @@
       </w:rPr>
     </w:lvl>
   </w:abstractNum>
-  <w:abstractNum w:abstractNumId="122" w15:restartNumberingAfterBreak="0">
+  <w:abstractNum w:abstractNumId="124" w15:restartNumberingAfterBreak="0">
     <w:nsid w:val="58393977"/>
     <w:multiLevelType w:val="hybridMultilevel"/>
     <w:tmpl w:val="985A5484"/>
@@ -25436,7 +27208,7 @@
       </w:rPr>
     </w:lvl>
   </w:abstractNum>
-  <w:abstractNum w:abstractNumId="123" w15:restartNumberingAfterBreak="0">
+  <w:abstractNum w:abstractNumId="125" w15:restartNumberingAfterBreak="0">
     <w:nsid w:val="59AB4A55"/>
     <w:multiLevelType w:val="hybridMultilevel"/>
     <w:tmpl w:val="B6486CD6"/>
@@ -25549,7 +27321,7 @@
       </w:rPr>
     </w:lvl>
   </w:abstractNum>
-  <w:abstractNum w:abstractNumId="124" w15:restartNumberingAfterBreak="0">
+  <w:abstractNum w:abstractNumId="126" w15:restartNumberingAfterBreak="0">
     <w:nsid w:val="59EB4CE4"/>
     <w:multiLevelType w:val="multilevel"/>
     <w:tmpl w:val="63F4E6F0"/>
@@ -25698,7 +27470,7 @@
       </w:rPr>
     </w:lvl>
   </w:abstractNum>
-  <w:abstractNum w:abstractNumId="125" w15:restartNumberingAfterBreak="0">
+  <w:abstractNum w:abstractNumId="127" w15:restartNumberingAfterBreak="0">
     <w:nsid w:val="5BD11962"/>
     <w:multiLevelType w:val="hybridMultilevel"/>
     <w:tmpl w:val="89A4B834"/>
@@ -25787,7 +27559,7 @@
       </w:pPr>
     </w:lvl>
   </w:abstractNum>
-  <w:abstractNum w:abstractNumId="126" w15:restartNumberingAfterBreak="0">
+  <w:abstractNum w:abstractNumId="128" w15:restartNumberingAfterBreak="0">
     <w:nsid w:val="5C950DBA"/>
     <w:multiLevelType w:val="hybridMultilevel"/>
     <w:tmpl w:val="7D78F950"/>
@@ -25899,7 +27671,7 @@
       </w:rPr>
     </w:lvl>
   </w:abstractNum>
-  <w:abstractNum w:abstractNumId="127" w15:restartNumberingAfterBreak="0">
+  <w:abstractNum w:abstractNumId="129" w15:restartNumberingAfterBreak="0">
     <w:nsid w:val="5D2A5D3B"/>
     <w:multiLevelType w:val="hybridMultilevel"/>
     <w:tmpl w:val="3AF89EA6"/>
@@ -25990,7 +27762,7 @@
       </w:pPr>
     </w:lvl>
   </w:abstractNum>
-  <w:abstractNum w:abstractNumId="128" w15:restartNumberingAfterBreak="0">
+  <w:abstractNum w:abstractNumId="130" w15:restartNumberingAfterBreak="0">
     <w:nsid w:val="5D9E49FD"/>
     <w:multiLevelType w:val="hybridMultilevel"/>
     <w:tmpl w:val="4EE40BB4"/>
@@ -26102,7 +27874,7 @@
       </w:rPr>
     </w:lvl>
   </w:abstractNum>
-  <w:abstractNum w:abstractNumId="129" w15:restartNumberingAfterBreak="0">
+  <w:abstractNum w:abstractNumId="131" w15:restartNumberingAfterBreak="0">
     <w:nsid w:val="5DB7107D"/>
     <w:multiLevelType w:val="multilevel"/>
     <w:tmpl w:val="6520107A"/>
@@ -26251,7 +28023,7 @@
       </w:rPr>
     </w:lvl>
   </w:abstractNum>
-  <w:abstractNum w:abstractNumId="130" w15:restartNumberingAfterBreak="0">
+  <w:abstractNum w:abstractNumId="132" w15:restartNumberingAfterBreak="0">
     <w:nsid w:val="60421322"/>
     <w:multiLevelType w:val="hybridMultilevel"/>
     <w:tmpl w:val="447CDBDC"/>
@@ -26363,7 +28135,7 @@
       </w:rPr>
     </w:lvl>
   </w:abstractNum>
-  <w:abstractNum w:abstractNumId="131" w15:restartNumberingAfterBreak="0">
+  <w:abstractNum w:abstractNumId="133" w15:restartNumberingAfterBreak="0">
     <w:nsid w:val="60B43772"/>
     <w:multiLevelType w:val="hybridMultilevel"/>
     <w:tmpl w:val="04FC7310"/>
@@ -26477,7 +28249,7 @@
       </w:rPr>
     </w:lvl>
   </w:abstractNum>
-  <w:abstractNum w:abstractNumId="132" w15:restartNumberingAfterBreak="0">
+  <w:abstractNum w:abstractNumId="134" w15:restartNumberingAfterBreak="0">
     <w:nsid w:val="61926C31"/>
     <w:multiLevelType w:val="hybridMultilevel"/>
     <w:tmpl w:val="AFD27E5C"/>
@@ -26590,7 +28362,7 @@
       </w:rPr>
     </w:lvl>
   </w:abstractNum>
-  <w:abstractNum w:abstractNumId="133" w15:restartNumberingAfterBreak="0">
+  <w:abstractNum w:abstractNumId="135" w15:restartNumberingAfterBreak="0">
     <w:nsid w:val="622F5FC7"/>
     <w:multiLevelType w:val="hybridMultilevel"/>
     <w:tmpl w:val="49A6C2A6"/>
@@ -26703,7 +28475,7 @@
       </w:rPr>
     </w:lvl>
   </w:abstractNum>
-  <w:abstractNum w:abstractNumId="134" w15:restartNumberingAfterBreak="0">
+  <w:abstractNum w:abstractNumId="136" w15:restartNumberingAfterBreak="0">
     <w:nsid w:val="623A0E20"/>
     <w:multiLevelType w:val="hybridMultilevel"/>
     <w:tmpl w:val="3E360542"/>
@@ -26816,7 +28588,7 @@
       </w:rPr>
     </w:lvl>
   </w:abstractNum>
-  <w:abstractNum w:abstractNumId="135" w15:restartNumberingAfterBreak="0">
+  <w:abstractNum w:abstractNumId="137" w15:restartNumberingAfterBreak="0">
     <w:nsid w:val="62AC33B4"/>
     <w:multiLevelType w:val="multilevel"/>
     <w:tmpl w:val="A074F3CA"/>
@@ -26965,7 +28737,7 @@
       </w:rPr>
     </w:lvl>
   </w:abstractNum>
-  <w:abstractNum w:abstractNumId="136" w15:restartNumberingAfterBreak="0">
+  <w:abstractNum w:abstractNumId="138" w15:restartNumberingAfterBreak="0">
     <w:nsid w:val="63B44674"/>
     <w:multiLevelType w:val="multilevel"/>
     <w:tmpl w:val="08F4FA9A"/>
@@ -27114,7 +28886,7 @@
       </w:rPr>
     </w:lvl>
   </w:abstractNum>
-  <w:abstractNum w:abstractNumId="137" w15:restartNumberingAfterBreak="0">
+  <w:abstractNum w:abstractNumId="139" w15:restartNumberingAfterBreak="0">
     <w:nsid w:val="63C245D4"/>
     <w:multiLevelType w:val="hybridMultilevel"/>
     <w:tmpl w:val="E1563A56"/>
@@ -27226,7 +28998,7 @@
       </w:rPr>
     </w:lvl>
   </w:abstractNum>
-  <w:abstractNum w:abstractNumId="138" w15:restartNumberingAfterBreak="0">
+  <w:abstractNum w:abstractNumId="140" w15:restartNumberingAfterBreak="0">
     <w:nsid w:val="645F5F11"/>
     <w:multiLevelType w:val="hybridMultilevel"/>
     <w:tmpl w:val="D3423512"/>
@@ -27339,7 +29111,7 @@
       </w:rPr>
     </w:lvl>
   </w:abstractNum>
-  <w:abstractNum w:abstractNumId="139" w15:restartNumberingAfterBreak="0">
+  <w:abstractNum w:abstractNumId="141" w15:restartNumberingAfterBreak="0">
     <w:nsid w:val="64F30198"/>
     <w:multiLevelType w:val="multilevel"/>
     <w:tmpl w:val="63F4E6F0"/>
@@ -27488,7 +29260,7 @@
       </w:rPr>
     </w:lvl>
   </w:abstractNum>
-  <w:abstractNum w:abstractNumId="140" w15:restartNumberingAfterBreak="0">
+  <w:abstractNum w:abstractNumId="142" w15:restartNumberingAfterBreak="0">
     <w:nsid w:val="65AF2502"/>
     <w:multiLevelType w:val="hybridMultilevel"/>
     <w:tmpl w:val="FB2A44D8"/>
@@ -27601,7 +29373,7 @@
       </w:rPr>
     </w:lvl>
   </w:abstractNum>
-  <w:abstractNum w:abstractNumId="141" w15:restartNumberingAfterBreak="0">
+  <w:abstractNum w:abstractNumId="143" w15:restartNumberingAfterBreak="0">
     <w:nsid w:val="65E53C08"/>
     <w:multiLevelType w:val="hybridMultilevel"/>
     <w:tmpl w:val="8A44FBE2"/>
@@ -27714,7 +29486,7 @@
       </w:rPr>
     </w:lvl>
   </w:abstractNum>
-  <w:abstractNum w:abstractNumId="142" w15:restartNumberingAfterBreak="0">
+  <w:abstractNum w:abstractNumId="144" w15:restartNumberingAfterBreak="0">
     <w:nsid w:val="671614F0"/>
     <w:multiLevelType w:val="multilevel"/>
     <w:tmpl w:val="63F4E6F0"/>
@@ -27863,7 +29635,7 @@
       </w:rPr>
     </w:lvl>
   </w:abstractNum>
-  <w:abstractNum w:abstractNumId="143" w15:restartNumberingAfterBreak="0">
+  <w:abstractNum w:abstractNumId="145" w15:restartNumberingAfterBreak="0">
     <w:nsid w:val="6859691D"/>
     <w:multiLevelType w:val="multilevel"/>
     <w:tmpl w:val="826A9D48"/>
@@ -28012,7 +29784,7 @@
       </w:rPr>
     </w:lvl>
   </w:abstractNum>
-  <w:abstractNum w:abstractNumId="144" w15:restartNumberingAfterBreak="0">
+  <w:abstractNum w:abstractNumId="146" w15:restartNumberingAfterBreak="0">
     <w:nsid w:val="68817757"/>
     <w:multiLevelType w:val="multilevel"/>
     <w:tmpl w:val="34EE1968"/>
@@ -28161,7 +29933,7 @@
       </w:rPr>
     </w:lvl>
   </w:abstractNum>
-  <w:abstractNum w:abstractNumId="145" w15:restartNumberingAfterBreak="0">
+  <w:abstractNum w:abstractNumId="147" w15:restartNumberingAfterBreak="0">
     <w:nsid w:val="68BE10E8"/>
     <w:multiLevelType w:val="hybridMultilevel"/>
     <w:tmpl w:val="326CD592"/>
@@ -28274,7 +30046,7 @@
       </w:rPr>
     </w:lvl>
   </w:abstractNum>
-  <w:abstractNum w:abstractNumId="146" w15:restartNumberingAfterBreak="0">
+  <w:abstractNum w:abstractNumId="148" w15:restartNumberingAfterBreak="0">
     <w:nsid w:val="69996D9A"/>
     <w:multiLevelType w:val="multilevel"/>
     <w:tmpl w:val="1780FC38"/>
@@ -28423,7 +30195,7 @@
       </w:rPr>
     </w:lvl>
   </w:abstractNum>
-  <w:abstractNum w:abstractNumId="147" w15:restartNumberingAfterBreak="0">
+  <w:abstractNum w:abstractNumId="149" w15:restartNumberingAfterBreak="0">
     <w:nsid w:val="6B3C30B9"/>
     <w:multiLevelType w:val="hybridMultilevel"/>
     <w:tmpl w:val="C938F8DE"/>
@@ -28535,7 +30307,7 @@
       </w:rPr>
     </w:lvl>
   </w:abstractNum>
-  <w:abstractNum w:abstractNumId="148" w15:restartNumberingAfterBreak="0">
+  <w:abstractNum w:abstractNumId="150" w15:restartNumberingAfterBreak="0">
     <w:nsid w:val="6D1511A0"/>
     <w:multiLevelType w:val="hybridMultilevel"/>
     <w:tmpl w:val="AAD8B9B4"/>
@@ -28647,7 +30419,7 @@
       </w:rPr>
     </w:lvl>
   </w:abstractNum>
-  <w:abstractNum w:abstractNumId="149" w15:restartNumberingAfterBreak="0">
+  <w:abstractNum w:abstractNumId="151" w15:restartNumberingAfterBreak="0">
     <w:nsid w:val="6DD255F1"/>
     <w:multiLevelType w:val="hybridMultilevel"/>
     <w:tmpl w:val="ACBC1404"/>
@@ -28760,7 +30532,7 @@
       </w:rPr>
     </w:lvl>
   </w:abstractNum>
-  <w:abstractNum w:abstractNumId="150" w15:restartNumberingAfterBreak="0">
+  <w:abstractNum w:abstractNumId="152" w15:restartNumberingAfterBreak="0">
     <w:nsid w:val="6DDB4404"/>
     <w:multiLevelType w:val="hybridMultilevel"/>
     <w:tmpl w:val="06428E32"/>
@@ -28873,7 +30645,7 @@
       </w:rPr>
     </w:lvl>
   </w:abstractNum>
-  <w:abstractNum w:abstractNumId="151" w15:restartNumberingAfterBreak="0">
+  <w:abstractNum w:abstractNumId="153" w15:restartNumberingAfterBreak="0">
     <w:nsid w:val="6F014B3B"/>
     <w:multiLevelType w:val="hybridMultilevel"/>
     <w:tmpl w:val="C89A39BE"/>
@@ -28985,7 +30757,7 @@
       </w:rPr>
     </w:lvl>
   </w:abstractNum>
-  <w:abstractNum w:abstractNumId="152" w15:restartNumberingAfterBreak="0">
+  <w:abstractNum w:abstractNumId="154" w15:restartNumberingAfterBreak="0">
     <w:nsid w:val="6F171273"/>
     <w:multiLevelType w:val="multilevel"/>
     <w:tmpl w:val="0240C564"/>
@@ -29134,7 +30906,7 @@
       </w:rPr>
     </w:lvl>
   </w:abstractNum>
-  <w:abstractNum w:abstractNumId="153" w15:restartNumberingAfterBreak="0">
+  <w:abstractNum w:abstractNumId="155" w15:restartNumberingAfterBreak="0">
     <w:nsid w:val="6FB82AAA"/>
     <w:multiLevelType w:val="multilevel"/>
     <w:tmpl w:val="FC46C7C0"/>
@@ -29283,7 +31055,7 @@
       </w:rPr>
     </w:lvl>
   </w:abstractNum>
-  <w:abstractNum w:abstractNumId="154" w15:restartNumberingAfterBreak="0">
+  <w:abstractNum w:abstractNumId="156" w15:restartNumberingAfterBreak="0">
     <w:nsid w:val="6FD46DCF"/>
     <w:multiLevelType w:val="hybridMultilevel"/>
     <w:tmpl w:val="EF5E6EC6"/>
@@ -29396,7 +31168,7 @@
       </w:rPr>
     </w:lvl>
   </w:abstractNum>
-  <w:abstractNum w:abstractNumId="155" w15:restartNumberingAfterBreak="0">
+  <w:abstractNum w:abstractNumId="157" w15:restartNumberingAfterBreak="0">
     <w:nsid w:val="70484E38"/>
     <w:multiLevelType w:val="multilevel"/>
     <w:tmpl w:val="22B26DD2"/>
@@ -29545,7 +31317,7 @@
       </w:rPr>
     </w:lvl>
   </w:abstractNum>
-  <w:abstractNum w:abstractNumId="156" w15:restartNumberingAfterBreak="0">
+  <w:abstractNum w:abstractNumId="158" w15:restartNumberingAfterBreak="0">
     <w:nsid w:val="70CB723E"/>
     <w:multiLevelType w:val="multilevel"/>
     <w:tmpl w:val="63F4E6F0"/>
@@ -29694,7 +31466,7 @@
       </w:rPr>
     </w:lvl>
   </w:abstractNum>
-  <w:abstractNum w:abstractNumId="157" w15:restartNumberingAfterBreak="0">
+  <w:abstractNum w:abstractNumId="159" w15:restartNumberingAfterBreak="0">
     <w:nsid w:val="71C028F7"/>
     <w:multiLevelType w:val="hybridMultilevel"/>
     <w:tmpl w:val="85104F0A"/>
@@ -29807,7 +31579,7 @@
       </w:rPr>
     </w:lvl>
   </w:abstractNum>
-  <w:abstractNum w:abstractNumId="158" w15:restartNumberingAfterBreak="0">
+  <w:abstractNum w:abstractNumId="160" w15:restartNumberingAfterBreak="0">
     <w:nsid w:val="71DB3F58"/>
     <w:multiLevelType w:val="multilevel"/>
     <w:tmpl w:val="63F4E6F0"/>
@@ -29956,7 +31728,7 @@
       </w:rPr>
     </w:lvl>
   </w:abstractNum>
-  <w:abstractNum w:abstractNumId="159" w15:restartNumberingAfterBreak="0">
+  <w:abstractNum w:abstractNumId="161" w15:restartNumberingAfterBreak="0">
     <w:nsid w:val="720D204A"/>
     <w:multiLevelType w:val="hybridMultilevel"/>
     <w:tmpl w:val="70D646D0"/>
@@ -30070,7 +31842,7 @@
       </w:rPr>
     </w:lvl>
   </w:abstractNum>
-  <w:abstractNum w:abstractNumId="160" w15:restartNumberingAfterBreak="0">
+  <w:abstractNum w:abstractNumId="162" w15:restartNumberingAfterBreak="0">
     <w:nsid w:val="72F31FF2"/>
     <w:multiLevelType w:val="hybridMultilevel"/>
     <w:tmpl w:val="5C2693A0"/>
@@ -30182,7 +31954,7 @@
       </w:rPr>
     </w:lvl>
   </w:abstractNum>
-  <w:abstractNum w:abstractNumId="161" w15:restartNumberingAfterBreak="0">
+  <w:abstractNum w:abstractNumId="163" w15:restartNumberingAfterBreak="0">
     <w:nsid w:val="73B82579"/>
     <w:multiLevelType w:val="hybridMultilevel"/>
     <w:tmpl w:val="B8E8229C"/>
@@ -30295,7 +32067,7 @@
       </w:rPr>
     </w:lvl>
   </w:abstractNum>
-  <w:abstractNum w:abstractNumId="162" w15:restartNumberingAfterBreak="0">
+  <w:abstractNum w:abstractNumId="164" w15:restartNumberingAfterBreak="0">
     <w:nsid w:val="74522E8F"/>
     <w:multiLevelType w:val="hybridMultilevel"/>
     <w:tmpl w:val="9B1C2096"/>
@@ -30408,7 +32180,7 @@
       </w:rPr>
     </w:lvl>
   </w:abstractNum>
-  <w:abstractNum w:abstractNumId="163" w15:restartNumberingAfterBreak="0">
+  <w:abstractNum w:abstractNumId="165" w15:restartNumberingAfterBreak="0">
     <w:nsid w:val="75B45140"/>
     <w:multiLevelType w:val="hybridMultilevel"/>
     <w:tmpl w:val="93F8F3C4"/>
@@ -30521,7 +32293,7 @@
       </w:rPr>
     </w:lvl>
   </w:abstractNum>
-  <w:abstractNum w:abstractNumId="164" w15:restartNumberingAfterBreak="0">
+  <w:abstractNum w:abstractNumId="166" w15:restartNumberingAfterBreak="0">
     <w:nsid w:val="76F60FFE"/>
     <w:multiLevelType w:val="multilevel"/>
     <w:tmpl w:val="63F4E6F0"/>
@@ -30670,7 +32442,7 @@
       </w:rPr>
     </w:lvl>
   </w:abstractNum>
-  <w:abstractNum w:abstractNumId="165" w15:restartNumberingAfterBreak="0">
+  <w:abstractNum w:abstractNumId="167" w15:restartNumberingAfterBreak="0">
     <w:nsid w:val="77572323"/>
     <w:multiLevelType w:val="multilevel"/>
     <w:tmpl w:val="63F4E6F0"/>
@@ -30819,7 +32591,7 @@
       </w:rPr>
     </w:lvl>
   </w:abstractNum>
-  <w:abstractNum w:abstractNumId="166" w15:restartNumberingAfterBreak="0">
+  <w:abstractNum w:abstractNumId="168" w15:restartNumberingAfterBreak="0">
     <w:nsid w:val="77B8201F"/>
     <w:multiLevelType w:val="hybridMultilevel"/>
     <w:tmpl w:val="D7160708"/>
@@ -30931,7 +32703,7 @@
       </w:rPr>
     </w:lvl>
   </w:abstractNum>
-  <w:abstractNum w:abstractNumId="167" w15:restartNumberingAfterBreak="0">
+  <w:abstractNum w:abstractNumId="169" w15:restartNumberingAfterBreak="0">
     <w:nsid w:val="79796FF9"/>
     <w:multiLevelType w:val="hybridMultilevel"/>
     <w:tmpl w:val="CFA8EF82"/>
@@ -31043,7 +32815,7 @@
       </w:rPr>
     </w:lvl>
   </w:abstractNum>
-  <w:abstractNum w:abstractNumId="168" w15:restartNumberingAfterBreak="0">
+  <w:abstractNum w:abstractNumId="170" w15:restartNumberingAfterBreak="0">
     <w:nsid w:val="79910410"/>
     <w:multiLevelType w:val="hybridMultilevel"/>
     <w:tmpl w:val="FC923542"/>
@@ -31155,7 +32927,7 @@
       </w:rPr>
     </w:lvl>
   </w:abstractNum>
-  <w:abstractNum w:abstractNumId="169" w15:restartNumberingAfterBreak="0">
+  <w:abstractNum w:abstractNumId="171" w15:restartNumberingAfterBreak="0">
     <w:nsid w:val="7AD51679"/>
     <w:multiLevelType w:val="hybridMultilevel"/>
     <w:tmpl w:val="C13E19C2"/>
@@ -31268,7 +33040,7 @@
       </w:rPr>
     </w:lvl>
   </w:abstractNum>
-  <w:abstractNum w:abstractNumId="170" w15:restartNumberingAfterBreak="0">
+  <w:abstractNum w:abstractNumId="172" w15:restartNumberingAfterBreak="0">
     <w:nsid w:val="7AFF575A"/>
     <w:multiLevelType w:val="hybridMultilevel"/>
     <w:tmpl w:val="A6323D3E"/>
@@ -31380,7 +33152,7 @@
       </w:rPr>
     </w:lvl>
   </w:abstractNum>
-  <w:abstractNum w:abstractNumId="171" w15:restartNumberingAfterBreak="0">
+  <w:abstractNum w:abstractNumId="173" w15:restartNumberingAfterBreak="0">
     <w:nsid w:val="7B4018BF"/>
     <w:multiLevelType w:val="multilevel"/>
     <w:tmpl w:val="63F4E6F0"/>
@@ -31529,7 +33301,7 @@
       </w:rPr>
     </w:lvl>
   </w:abstractNum>
-  <w:abstractNum w:abstractNumId="172" w15:restartNumberingAfterBreak="0">
+  <w:abstractNum w:abstractNumId="174" w15:restartNumberingAfterBreak="0">
     <w:nsid w:val="7B4D1B33"/>
     <w:multiLevelType w:val="hybridMultilevel"/>
     <w:tmpl w:val="5EAC717E"/>
@@ -31641,7 +33413,7 @@
       </w:rPr>
     </w:lvl>
   </w:abstractNum>
-  <w:abstractNum w:abstractNumId="173" w15:restartNumberingAfterBreak="0">
+  <w:abstractNum w:abstractNumId="175" w15:restartNumberingAfterBreak="0">
     <w:nsid w:val="7C437108"/>
     <w:multiLevelType w:val="hybridMultilevel"/>
     <w:tmpl w:val="3222D0E8"/>
@@ -31754,7 +33526,7 @@
       </w:rPr>
     </w:lvl>
   </w:abstractNum>
-  <w:abstractNum w:abstractNumId="174" w15:restartNumberingAfterBreak="0">
+  <w:abstractNum w:abstractNumId="176" w15:restartNumberingAfterBreak="0">
     <w:nsid w:val="7CAC27CD"/>
     <w:multiLevelType w:val="multilevel"/>
     <w:tmpl w:val="3BC20E58"/>
@@ -31903,7 +33675,7 @@
       </w:rPr>
     </w:lvl>
   </w:abstractNum>
-  <w:abstractNum w:abstractNumId="175" w15:restartNumberingAfterBreak="0">
+  <w:abstractNum w:abstractNumId="177" w15:restartNumberingAfterBreak="0">
     <w:nsid w:val="7DBE326E"/>
     <w:multiLevelType w:val="hybridMultilevel"/>
     <w:tmpl w:val="AFC0D8D6"/>
@@ -32016,7 +33788,7 @@
       </w:rPr>
     </w:lvl>
   </w:abstractNum>
-  <w:abstractNum w:abstractNumId="176" w15:restartNumberingAfterBreak="0">
+  <w:abstractNum w:abstractNumId="178" w15:restartNumberingAfterBreak="0">
     <w:nsid w:val="7E5978EA"/>
     <w:multiLevelType w:val="hybridMultilevel"/>
     <w:tmpl w:val="D74C0DB0"/>
@@ -32128,7 +33900,7 @@
       </w:rPr>
     </w:lvl>
   </w:abstractNum>
-  <w:abstractNum w:abstractNumId="177" w15:restartNumberingAfterBreak="0">
+  <w:abstractNum w:abstractNumId="179" w15:restartNumberingAfterBreak="0">
     <w:nsid w:val="7F106A5D"/>
     <w:multiLevelType w:val="hybridMultilevel"/>
     <w:tmpl w:val="A1CA4816"/>
@@ -32240,7 +34012,7 @@
       </w:rPr>
     </w:lvl>
   </w:abstractNum>
-  <w:abstractNum w:abstractNumId="178" w15:restartNumberingAfterBreak="0">
+  <w:abstractNum w:abstractNumId="180" w15:restartNumberingAfterBreak="0">
     <w:nsid w:val="7FD679F5"/>
     <w:multiLevelType w:val="hybridMultilevel"/>
     <w:tmpl w:val="1ED417E8"/>
@@ -32354,82 +34126,82 @@
     </w:lvl>
   </w:abstractNum>
   <w:num w:numId="1" w16cid:durableId="1882476756">
-    <w:abstractNumId w:val="99"/>
+    <w:abstractNumId w:val="100"/>
   </w:num>
   <w:num w:numId="2" w16cid:durableId="871453468">
-    <w:abstractNumId w:val="25"/>
+    <w:abstractNumId w:val="26"/>
   </w:num>
   <w:num w:numId="3" w16cid:durableId="698706805">
-    <w:abstractNumId w:val="41"/>
+    <w:abstractNumId w:val="42"/>
   </w:num>
   <w:num w:numId="4" w16cid:durableId="1105467722">
-    <w:abstractNumId w:val="80"/>
+    <w:abstractNumId w:val="81"/>
   </w:num>
   <w:num w:numId="5" w16cid:durableId="769932622">
-    <w:abstractNumId w:val="117"/>
+    <w:abstractNumId w:val="119"/>
   </w:num>
   <w:num w:numId="6" w16cid:durableId="575944109">
-    <w:abstractNumId w:val="45"/>
+    <w:abstractNumId w:val="46"/>
   </w:num>
   <w:num w:numId="7" w16cid:durableId="877661689">
-    <w:abstractNumId w:val="155"/>
+    <w:abstractNumId w:val="157"/>
   </w:num>
   <w:num w:numId="8" w16cid:durableId="1390107422">
-    <w:abstractNumId w:val="86"/>
+    <w:abstractNumId w:val="87"/>
   </w:num>
   <w:num w:numId="9" w16cid:durableId="881866424">
-    <w:abstractNumId w:val="114"/>
+    <w:abstractNumId w:val="116"/>
   </w:num>
   <w:num w:numId="10" w16cid:durableId="1037244995">
-    <w:abstractNumId w:val="146"/>
+    <w:abstractNumId w:val="148"/>
   </w:num>
   <w:num w:numId="11" w16cid:durableId="1575554597">
-    <w:abstractNumId w:val="69"/>
+    <w:abstractNumId w:val="70"/>
   </w:num>
   <w:num w:numId="12" w16cid:durableId="915364478">
-    <w:abstractNumId w:val="95"/>
+    <w:abstractNumId w:val="96"/>
   </w:num>
   <w:num w:numId="13" w16cid:durableId="1386294114">
-    <w:abstractNumId w:val="136"/>
+    <w:abstractNumId w:val="138"/>
   </w:num>
   <w:num w:numId="14" w16cid:durableId="1071851223">
-    <w:abstractNumId w:val="27"/>
+    <w:abstractNumId w:val="28"/>
   </w:num>
   <w:num w:numId="15" w16cid:durableId="1545557520">
-    <w:abstractNumId w:val="81"/>
+    <w:abstractNumId w:val="82"/>
   </w:num>
   <w:num w:numId="16" w16cid:durableId="1102919547">
-    <w:abstractNumId w:val="174"/>
+    <w:abstractNumId w:val="176"/>
   </w:num>
   <w:num w:numId="17" w16cid:durableId="294526838">
-    <w:abstractNumId w:val="57"/>
+    <w:abstractNumId w:val="58"/>
   </w:num>
   <w:num w:numId="18" w16cid:durableId="679889896">
-    <w:abstractNumId w:val="66"/>
+    <w:abstractNumId w:val="67"/>
   </w:num>
   <w:num w:numId="19" w16cid:durableId="2119449470">
-    <w:abstractNumId w:val="111"/>
+    <w:abstractNumId w:val="112"/>
   </w:num>
   <w:num w:numId="20" w16cid:durableId="1365054799">
     <w:abstractNumId w:val="15"/>
   </w:num>
   <w:num w:numId="21" w16cid:durableId="1683512738">
-    <w:abstractNumId w:val="67"/>
+    <w:abstractNumId w:val="68"/>
   </w:num>
   <w:num w:numId="22" w16cid:durableId="1080098953">
-    <w:abstractNumId w:val="143"/>
+    <w:abstractNumId w:val="145"/>
   </w:num>
   <w:num w:numId="23" w16cid:durableId="1635717296">
-    <w:abstractNumId w:val="73"/>
+    <w:abstractNumId w:val="74"/>
   </w:num>
   <w:num w:numId="24" w16cid:durableId="544873123">
-    <w:abstractNumId w:val="135"/>
+    <w:abstractNumId w:val="137"/>
   </w:num>
   <w:num w:numId="25" w16cid:durableId="1128352778">
     <w:abstractNumId w:val="14"/>
   </w:num>
   <w:num w:numId="26" w16cid:durableId="1732537407">
-    <w:abstractNumId w:val="150"/>
+    <w:abstractNumId w:val="152"/>
   </w:num>
   <w:num w:numId="27" w16cid:durableId="945502064">
     <w:abstractNumId w:val="8"/>
@@ -32438,292 +34210,292 @@
     <w:abstractNumId w:val="3"/>
   </w:num>
   <w:num w:numId="29" w16cid:durableId="815955639">
-    <w:abstractNumId w:val="65"/>
+    <w:abstractNumId w:val="66"/>
   </w:num>
   <w:num w:numId="30" w16cid:durableId="1500659483">
-    <w:abstractNumId w:val="91"/>
+    <w:abstractNumId w:val="92"/>
   </w:num>
   <w:num w:numId="31" w16cid:durableId="118301211">
-    <w:abstractNumId w:val="16"/>
+    <w:abstractNumId w:val="17"/>
   </w:num>
   <w:num w:numId="32" w16cid:durableId="732387979">
-    <w:abstractNumId w:val="46"/>
+    <w:abstractNumId w:val="47"/>
   </w:num>
   <w:num w:numId="33" w16cid:durableId="2129276417">
-    <w:abstractNumId w:val="18"/>
+    <w:abstractNumId w:val="19"/>
   </w:num>
   <w:num w:numId="34" w16cid:durableId="1470708820">
-    <w:abstractNumId w:val="52"/>
+    <w:abstractNumId w:val="53"/>
   </w:num>
   <w:num w:numId="35" w16cid:durableId="356852923">
-    <w:abstractNumId w:val="110"/>
+    <w:abstractNumId w:val="111"/>
   </w:num>
   <w:num w:numId="36" w16cid:durableId="430662559">
-    <w:abstractNumId w:val="21"/>
+    <w:abstractNumId w:val="22"/>
   </w:num>
   <w:num w:numId="37" w16cid:durableId="247080868">
-    <w:abstractNumId w:val="163"/>
+    <w:abstractNumId w:val="165"/>
   </w:num>
   <w:num w:numId="38" w16cid:durableId="158887408">
-    <w:abstractNumId w:val="132"/>
+    <w:abstractNumId w:val="134"/>
   </w:num>
   <w:num w:numId="39" w16cid:durableId="1681347932">
-    <w:abstractNumId w:val="154"/>
+    <w:abstractNumId w:val="156"/>
   </w:num>
   <w:num w:numId="40" w16cid:durableId="2101440158">
-    <w:abstractNumId w:val="84"/>
+    <w:abstractNumId w:val="85"/>
   </w:num>
   <w:num w:numId="41" w16cid:durableId="1250391122">
-    <w:abstractNumId w:val="127"/>
+    <w:abstractNumId w:val="129"/>
   </w:num>
   <w:num w:numId="42" w16cid:durableId="479083359">
-    <w:abstractNumId w:val="160"/>
+    <w:abstractNumId w:val="162"/>
   </w:num>
   <w:num w:numId="43" w16cid:durableId="1557860317">
-    <w:abstractNumId w:val="112"/>
+    <w:abstractNumId w:val="113"/>
   </w:num>
   <w:num w:numId="44" w16cid:durableId="2142183763">
     <w:abstractNumId w:val="10"/>
   </w:num>
   <w:num w:numId="45" w16cid:durableId="1357736349">
+    <w:abstractNumId w:val="170"/>
+  </w:num>
+  <w:num w:numId="46" w16cid:durableId="1519656040">
+    <w:abstractNumId w:val="169"/>
+  </w:num>
+  <w:num w:numId="47" w16cid:durableId="1078596852">
+    <w:abstractNumId w:val="179"/>
+  </w:num>
+  <w:num w:numId="48" w16cid:durableId="1027950100">
+    <w:abstractNumId w:val="39"/>
+  </w:num>
+  <w:num w:numId="49" w16cid:durableId="878516382">
+    <w:abstractNumId w:val="21"/>
+  </w:num>
+  <w:num w:numId="50" w16cid:durableId="363404927">
+    <w:abstractNumId w:val="75"/>
+  </w:num>
+  <w:num w:numId="51" w16cid:durableId="1128354320">
+    <w:abstractNumId w:val="150"/>
+  </w:num>
+  <w:num w:numId="52" w16cid:durableId="248543928">
+    <w:abstractNumId w:val="84"/>
+  </w:num>
+  <w:num w:numId="53" w16cid:durableId="965889214">
+    <w:abstractNumId w:val="117"/>
+  </w:num>
+  <w:num w:numId="54" w16cid:durableId="1827503240">
+    <w:abstractNumId w:val="127"/>
+  </w:num>
+  <w:num w:numId="55" w16cid:durableId="505748256">
+    <w:abstractNumId w:val="106"/>
+  </w:num>
+  <w:num w:numId="56" w16cid:durableId="2120370925">
+    <w:abstractNumId w:val="36"/>
+  </w:num>
+  <w:num w:numId="57" w16cid:durableId="369182267">
+    <w:abstractNumId w:val="18"/>
+  </w:num>
+  <w:num w:numId="58" w16cid:durableId="1000235123">
+    <w:abstractNumId w:val="114"/>
+  </w:num>
+  <w:num w:numId="59" w16cid:durableId="628516409">
+    <w:abstractNumId w:val="149"/>
+  </w:num>
+  <w:num w:numId="60" w16cid:durableId="2028865444">
+    <w:abstractNumId w:val="102"/>
+  </w:num>
+  <w:num w:numId="61" w16cid:durableId="943926811">
+    <w:abstractNumId w:val="174"/>
+  </w:num>
+  <w:num w:numId="62" w16cid:durableId="1841193257">
+    <w:abstractNumId w:val="77"/>
+  </w:num>
+  <w:num w:numId="63" w16cid:durableId="682322850">
+    <w:abstractNumId w:val="153"/>
+  </w:num>
+  <w:num w:numId="64" w16cid:durableId="2043705333">
+    <w:abstractNumId w:val="78"/>
+  </w:num>
+  <w:num w:numId="65" w16cid:durableId="1164854761">
+    <w:abstractNumId w:val="57"/>
+  </w:num>
+  <w:num w:numId="66" w16cid:durableId="1919972541">
+    <w:abstractNumId w:val="98"/>
+  </w:num>
+  <w:num w:numId="67" w16cid:durableId="463617329">
+    <w:abstractNumId w:val="61"/>
+  </w:num>
+  <w:num w:numId="68" w16cid:durableId="2064014330">
+    <w:abstractNumId w:val="122"/>
+  </w:num>
+  <w:num w:numId="69" w16cid:durableId="452797354">
+    <w:abstractNumId w:val="128"/>
+  </w:num>
+  <w:num w:numId="70" w16cid:durableId="1196650037">
+    <w:abstractNumId w:val="51"/>
+  </w:num>
+  <w:num w:numId="71" w16cid:durableId="940071828">
     <w:abstractNumId w:val="168"/>
   </w:num>
-  <w:num w:numId="46" w16cid:durableId="1519656040">
-    <w:abstractNumId w:val="167"/>
+  <w:num w:numId="72" w16cid:durableId="1608273926">
+    <w:abstractNumId w:val="80"/>
   </w:num>
-  <w:num w:numId="47" w16cid:durableId="1078596852">
-    <w:abstractNumId w:val="177"/>
+  <w:num w:numId="73" w16cid:durableId="2009864772">
+    <w:abstractNumId w:val="99"/>
   </w:num>
-  <w:num w:numId="48" w16cid:durableId="1027950100">
+  <w:num w:numId="74" w16cid:durableId="712267004">
     <w:abstractNumId w:val="38"/>
   </w:num>
-  <w:num w:numId="49" w16cid:durableId="878516382">
-    <w:abstractNumId w:val="20"/>
-  </w:num>
-  <w:num w:numId="50" w16cid:durableId="363404927">
-    <w:abstractNumId w:val="74"/>
-  </w:num>
-  <w:num w:numId="51" w16cid:durableId="1128354320">
-    <w:abstractNumId w:val="148"/>
-  </w:num>
-  <w:num w:numId="52" w16cid:durableId="248543928">
-    <w:abstractNumId w:val="83"/>
-  </w:num>
-  <w:num w:numId="53" w16cid:durableId="965889214">
-    <w:abstractNumId w:val="115"/>
-  </w:num>
-  <w:num w:numId="54" w16cid:durableId="1827503240">
-    <w:abstractNumId w:val="125"/>
-  </w:num>
-  <w:num w:numId="55" w16cid:durableId="505748256">
-    <w:abstractNumId w:val="105"/>
-  </w:num>
-  <w:num w:numId="56" w16cid:durableId="2120370925">
-    <w:abstractNumId w:val="35"/>
-  </w:num>
-  <w:num w:numId="57" w16cid:durableId="369182267">
-    <w:abstractNumId w:val="17"/>
-  </w:num>
-  <w:num w:numId="58" w16cid:durableId="1000235123">
-    <w:abstractNumId w:val="113"/>
-  </w:num>
-  <w:num w:numId="59" w16cid:durableId="628516409">
-    <w:abstractNumId w:val="147"/>
-  </w:num>
-  <w:num w:numId="60" w16cid:durableId="2028865444">
-    <w:abstractNumId w:val="101"/>
-  </w:num>
-  <w:num w:numId="61" w16cid:durableId="943926811">
-    <w:abstractNumId w:val="172"/>
-  </w:num>
-  <w:num w:numId="62" w16cid:durableId="1841193257">
-    <w:abstractNumId w:val="76"/>
-  </w:num>
-  <w:num w:numId="63" w16cid:durableId="682322850">
-    <w:abstractNumId w:val="151"/>
-  </w:num>
-  <w:num w:numId="64" w16cid:durableId="2043705333">
-    <w:abstractNumId w:val="77"/>
-  </w:num>
-  <w:num w:numId="65" w16cid:durableId="1164854761">
-    <w:abstractNumId w:val="56"/>
-  </w:num>
-  <w:num w:numId="66" w16cid:durableId="1919972541">
-    <w:abstractNumId w:val="97"/>
-  </w:num>
-  <w:num w:numId="67" w16cid:durableId="463617329">
-    <w:abstractNumId w:val="60"/>
-  </w:num>
-  <w:num w:numId="68" w16cid:durableId="2064014330">
-    <w:abstractNumId w:val="120"/>
-  </w:num>
-  <w:num w:numId="69" w16cid:durableId="452797354">
-    <w:abstractNumId w:val="126"/>
-  </w:num>
-  <w:num w:numId="70" w16cid:durableId="1196650037">
-    <w:abstractNumId w:val="50"/>
-  </w:num>
-  <w:num w:numId="71" w16cid:durableId="940071828">
-    <w:abstractNumId w:val="166"/>
-  </w:num>
-  <w:num w:numId="72" w16cid:durableId="1608273926">
-    <w:abstractNumId w:val="79"/>
-  </w:num>
-  <w:num w:numId="73" w16cid:durableId="2009864772">
-    <w:abstractNumId w:val="98"/>
-  </w:num>
-  <w:num w:numId="74" w16cid:durableId="712267004">
-    <w:abstractNumId w:val="37"/>
-  </w:num>
   <w:num w:numId="75" w16cid:durableId="506480902">
-    <w:abstractNumId w:val="32"/>
+    <w:abstractNumId w:val="33"/>
   </w:num>
   <w:num w:numId="76" w16cid:durableId="286202349">
-    <w:abstractNumId w:val="130"/>
+    <w:abstractNumId w:val="132"/>
   </w:num>
   <w:num w:numId="77" w16cid:durableId="156460757">
-    <w:abstractNumId w:val="70"/>
+    <w:abstractNumId w:val="71"/>
   </w:num>
   <w:num w:numId="78" w16cid:durableId="1230077056">
     <w:abstractNumId w:val="6"/>
   </w:num>
   <w:num w:numId="79" w16cid:durableId="1837106927">
-    <w:abstractNumId w:val="49"/>
+    <w:abstractNumId w:val="50"/>
   </w:num>
   <w:num w:numId="80" w16cid:durableId="287929152">
-    <w:abstractNumId w:val="36"/>
+    <w:abstractNumId w:val="37"/>
   </w:num>
   <w:num w:numId="81" w16cid:durableId="1672175260">
-    <w:abstractNumId w:val="93"/>
+    <w:abstractNumId w:val="94"/>
   </w:num>
   <w:num w:numId="82" w16cid:durableId="1954820163">
-    <w:abstractNumId w:val="59"/>
+    <w:abstractNumId w:val="60"/>
   </w:num>
   <w:num w:numId="83" w16cid:durableId="1990016594">
-    <w:abstractNumId w:val="23"/>
+    <w:abstractNumId w:val="24"/>
   </w:num>
   <w:num w:numId="84" w16cid:durableId="366876741">
-    <w:abstractNumId w:val="100"/>
+    <w:abstractNumId w:val="101"/>
   </w:num>
   <w:num w:numId="85" w16cid:durableId="15274915">
-    <w:abstractNumId w:val="39"/>
+    <w:abstractNumId w:val="40"/>
   </w:num>
   <w:num w:numId="86" w16cid:durableId="288124443">
     <w:abstractNumId w:val="11"/>
   </w:num>
   <w:num w:numId="87" w16cid:durableId="591351385">
-    <w:abstractNumId w:val="116"/>
+    <w:abstractNumId w:val="118"/>
   </w:num>
   <w:num w:numId="88" w16cid:durableId="1361005725">
-    <w:abstractNumId w:val="170"/>
+    <w:abstractNumId w:val="172"/>
   </w:num>
   <w:num w:numId="89" w16cid:durableId="219681743">
     <w:abstractNumId w:val="12"/>
   </w:num>
   <w:num w:numId="90" w16cid:durableId="194386594">
-    <w:abstractNumId w:val="128"/>
+    <w:abstractNumId w:val="130"/>
   </w:num>
   <w:num w:numId="91" w16cid:durableId="777793346">
-    <w:abstractNumId w:val="89"/>
+    <w:abstractNumId w:val="90"/>
   </w:num>
   <w:num w:numId="92" w16cid:durableId="173346871">
-    <w:abstractNumId w:val="96"/>
+    <w:abstractNumId w:val="97"/>
   </w:num>
   <w:num w:numId="93" w16cid:durableId="948700467">
-    <w:abstractNumId w:val="40"/>
+    <w:abstractNumId w:val="41"/>
   </w:num>
   <w:num w:numId="94" w16cid:durableId="1328363750">
-    <w:abstractNumId w:val="22"/>
+    <w:abstractNumId w:val="23"/>
   </w:num>
   <w:num w:numId="95" w16cid:durableId="541676570">
-    <w:abstractNumId w:val="71"/>
+    <w:abstractNumId w:val="72"/>
   </w:num>
   <w:num w:numId="96" w16cid:durableId="694119229">
-    <w:abstractNumId w:val="94"/>
+    <w:abstractNumId w:val="95"/>
   </w:num>
   <w:num w:numId="97" w16cid:durableId="704327987">
-    <w:abstractNumId w:val="54"/>
+    <w:abstractNumId w:val="55"/>
   </w:num>
   <w:num w:numId="98" w16cid:durableId="1157303613">
-    <w:abstractNumId w:val="24"/>
+    <w:abstractNumId w:val="25"/>
   </w:num>
   <w:num w:numId="99" w16cid:durableId="1706099794">
-    <w:abstractNumId w:val="153"/>
+    <w:abstractNumId w:val="155"/>
   </w:num>
   <w:num w:numId="100" w16cid:durableId="256404901">
-    <w:abstractNumId w:val="152"/>
+    <w:abstractNumId w:val="154"/>
   </w:num>
   <w:num w:numId="101" w16cid:durableId="924923012">
-    <w:abstractNumId w:val="30"/>
+    <w:abstractNumId w:val="31"/>
   </w:num>
   <w:num w:numId="102" w16cid:durableId="536550966">
-    <w:abstractNumId w:val="171"/>
+    <w:abstractNumId w:val="173"/>
   </w:num>
   <w:num w:numId="103" w16cid:durableId="425157302">
-    <w:abstractNumId w:val="72"/>
+    <w:abstractNumId w:val="73"/>
   </w:num>
   <w:num w:numId="104" w16cid:durableId="967664612">
-    <w:abstractNumId w:val="139"/>
+    <w:abstractNumId w:val="141"/>
   </w:num>
   <w:num w:numId="105" w16cid:durableId="361631616">
-    <w:abstractNumId w:val="103"/>
+    <w:abstractNumId w:val="104"/>
   </w:num>
   <w:num w:numId="106" w16cid:durableId="443623616">
-    <w:abstractNumId w:val="144"/>
+    <w:abstractNumId w:val="146"/>
   </w:num>
   <w:num w:numId="107" w16cid:durableId="150101619">
     <w:abstractNumId w:val="13"/>
   </w:num>
   <w:num w:numId="108" w16cid:durableId="1431658174">
-    <w:abstractNumId w:val="58"/>
+    <w:abstractNumId w:val="59"/>
   </w:num>
   <w:num w:numId="109" w16cid:durableId="1050495440">
     <w:abstractNumId w:val="0"/>
   </w:num>
   <w:num w:numId="110" w16cid:durableId="712924661">
-    <w:abstractNumId w:val="124"/>
+    <w:abstractNumId w:val="126"/>
   </w:num>
   <w:num w:numId="111" w16cid:durableId="1917784113">
-    <w:abstractNumId w:val="118"/>
+    <w:abstractNumId w:val="120"/>
   </w:num>
   <w:num w:numId="112" w16cid:durableId="896237065">
-    <w:abstractNumId w:val="129"/>
+    <w:abstractNumId w:val="131"/>
   </w:num>
   <w:num w:numId="113" w16cid:durableId="1171681430">
-    <w:abstractNumId w:val="156"/>
+    <w:abstractNumId w:val="158"/>
   </w:num>
   <w:num w:numId="114" w16cid:durableId="1552573199">
-    <w:abstractNumId w:val="158"/>
+    <w:abstractNumId w:val="160"/>
   </w:num>
   <w:num w:numId="115" w16cid:durableId="1920869674">
-    <w:abstractNumId w:val="142"/>
+    <w:abstractNumId w:val="144"/>
   </w:num>
   <w:num w:numId="116" w16cid:durableId="476724716">
+    <w:abstractNumId w:val="108"/>
+  </w:num>
+  <w:num w:numId="117" w16cid:durableId="658919541">
     <w:abstractNumId w:val="107"/>
   </w:num>
-  <w:num w:numId="117" w16cid:durableId="658919541">
-    <w:abstractNumId w:val="106"/>
-  </w:num>
   <w:num w:numId="118" w16cid:durableId="1622418131">
-    <w:abstractNumId w:val="47"/>
+    <w:abstractNumId w:val="48"/>
   </w:num>
   <w:num w:numId="119" w16cid:durableId="1693994672">
     <w:abstractNumId w:val="2"/>
   </w:num>
   <w:num w:numId="120" w16cid:durableId="396828229">
-    <w:abstractNumId w:val="165"/>
+    <w:abstractNumId w:val="167"/>
   </w:num>
   <w:num w:numId="121" w16cid:durableId="986058889">
-    <w:abstractNumId w:val="19"/>
+    <w:abstractNumId w:val="20"/>
   </w:num>
   <w:num w:numId="122" w16cid:durableId="1224410703">
-    <w:abstractNumId w:val="62"/>
+    <w:abstractNumId w:val="63"/>
   </w:num>
   <w:num w:numId="123" w16cid:durableId="1804040304">
-    <w:abstractNumId w:val="88"/>
+    <w:abstractNumId w:val="89"/>
   </w:num>
   <w:num w:numId="124" w16cid:durableId="114181197">
-    <w:abstractNumId w:val="164"/>
+    <w:abstractNumId w:val="166"/>
   </w:num>
   <w:num w:numId="125" w16cid:durableId="772671624">
     <w:abstractNumId w:val="5"/>
@@ -32732,163 +34504,169 @@
     <w:abstractNumId w:val="9"/>
   </w:num>
   <w:num w:numId="127" w16cid:durableId="1818105337">
-    <w:abstractNumId w:val="53"/>
+    <w:abstractNumId w:val="54"/>
   </w:num>
   <w:num w:numId="128" w16cid:durableId="384987847">
-    <w:abstractNumId w:val="31"/>
+    <w:abstractNumId w:val="32"/>
   </w:num>
   <w:num w:numId="129" w16cid:durableId="659895420">
-    <w:abstractNumId w:val="61"/>
+    <w:abstractNumId w:val="62"/>
   </w:num>
   <w:num w:numId="130" w16cid:durableId="1168907903">
-    <w:abstractNumId w:val="145"/>
+    <w:abstractNumId w:val="147"/>
   </w:num>
   <w:num w:numId="131" w16cid:durableId="430206235">
-    <w:abstractNumId w:val="133"/>
+    <w:abstractNumId w:val="135"/>
   </w:num>
   <w:num w:numId="132" w16cid:durableId="1207327089">
-    <w:abstractNumId w:val="28"/>
+    <w:abstractNumId w:val="29"/>
   </w:num>
   <w:num w:numId="133" w16cid:durableId="596404292">
-    <w:abstractNumId w:val="121"/>
+    <w:abstractNumId w:val="123"/>
   </w:num>
   <w:num w:numId="134" w16cid:durableId="2070372549">
-    <w:abstractNumId w:val="44"/>
+    <w:abstractNumId w:val="45"/>
   </w:num>
   <w:num w:numId="135" w16cid:durableId="1841265039">
-    <w:abstractNumId w:val="48"/>
+    <w:abstractNumId w:val="49"/>
   </w:num>
   <w:num w:numId="136" w16cid:durableId="1988632595">
-    <w:abstractNumId w:val="42"/>
+    <w:abstractNumId w:val="43"/>
   </w:num>
   <w:num w:numId="137" w16cid:durableId="1218275126">
-    <w:abstractNumId w:val="75"/>
+    <w:abstractNumId w:val="76"/>
   </w:num>
   <w:num w:numId="138" w16cid:durableId="568660900">
-    <w:abstractNumId w:val="82"/>
+    <w:abstractNumId w:val="83"/>
   </w:num>
   <w:num w:numId="139" w16cid:durableId="967976864">
-    <w:abstractNumId w:val="122"/>
+    <w:abstractNumId w:val="124"/>
   </w:num>
   <w:num w:numId="140" w16cid:durableId="650643288">
-    <w:abstractNumId w:val="140"/>
+    <w:abstractNumId w:val="142"/>
   </w:num>
   <w:num w:numId="141" w16cid:durableId="219370247">
-    <w:abstractNumId w:val="137"/>
+    <w:abstractNumId w:val="139"/>
   </w:num>
   <w:num w:numId="142" w16cid:durableId="323239876">
-    <w:abstractNumId w:val="176"/>
+    <w:abstractNumId w:val="178"/>
   </w:num>
   <w:num w:numId="143" w16cid:durableId="1619793156">
-    <w:abstractNumId w:val="34"/>
+    <w:abstractNumId w:val="35"/>
   </w:num>
   <w:num w:numId="144" w16cid:durableId="1186332867">
-    <w:abstractNumId w:val="149"/>
+    <w:abstractNumId w:val="151"/>
   </w:num>
   <w:num w:numId="145" w16cid:durableId="89937035">
-    <w:abstractNumId w:val="55"/>
+    <w:abstractNumId w:val="56"/>
   </w:num>
   <w:num w:numId="146" w16cid:durableId="542210424">
-    <w:abstractNumId w:val="78"/>
+    <w:abstractNumId w:val="79"/>
   </w:num>
   <w:num w:numId="147" w16cid:durableId="1194659616">
     <w:abstractNumId w:val="7"/>
   </w:num>
   <w:num w:numId="148" w16cid:durableId="1544974653">
+    <w:abstractNumId w:val="163"/>
+  </w:num>
+  <w:num w:numId="149" w16cid:durableId="1664625526">
+    <w:abstractNumId w:val="65"/>
+  </w:num>
+  <w:num w:numId="150" w16cid:durableId="678197415">
+    <w:abstractNumId w:val="140"/>
+  </w:num>
+  <w:num w:numId="151" w16cid:durableId="1193106551">
+    <w:abstractNumId w:val="110"/>
+  </w:num>
+  <w:num w:numId="152" w16cid:durableId="1209760807">
+    <w:abstractNumId w:val="64"/>
+  </w:num>
+  <w:num w:numId="153" w16cid:durableId="1994025825">
+    <w:abstractNumId w:val="69"/>
+  </w:num>
+  <w:num w:numId="154" w16cid:durableId="2121295621">
+    <w:abstractNumId w:val="164"/>
+  </w:num>
+  <w:num w:numId="155" w16cid:durableId="292684904">
+    <w:abstractNumId w:val="86"/>
+  </w:num>
+  <w:num w:numId="156" w16cid:durableId="769400072">
+    <w:abstractNumId w:val="175"/>
+  </w:num>
+  <w:num w:numId="157" w16cid:durableId="1930693824">
+    <w:abstractNumId w:val="109"/>
+  </w:num>
+  <w:num w:numId="158" w16cid:durableId="813957946">
+    <w:abstractNumId w:val="159"/>
+  </w:num>
+  <w:num w:numId="159" w16cid:durableId="1782143679">
+    <w:abstractNumId w:val="34"/>
+  </w:num>
+  <w:num w:numId="160" w16cid:durableId="1278754750">
+    <w:abstractNumId w:val="30"/>
+  </w:num>
+  <w:num w:numId="161" w16cid:durableId="1052270864">
+    <w:abstractNumId w:val="136"/>
+  </w:num>
+  <w:num w:numId="162" w16cid:durableId="762337137">
+    <w:abstractNumId w:val="103"/>
+  </w:num>
+  <w:num w:numId="163" w16cid:durableId="1682507263">
+    <w:abstractNumId w:val="88"/>
+  </w:num>
+  <w:num w:numId="164" w16cid:durableId="871957078">
+    <w:abstractNumId w:val="121"/>
+  </w:num>
+  <w:num w:numId="165" w16cid:durableId="601960416">
+    <w:abstractNumId w:val="143"/>
+  </w:num>
+  <w:num w:numId="166" w16cid:durableId="574900497">
+    <w:abstractNumId w:val="133"/>
+  </w:num>
+  <w:num w:numId="167" w16cid:durableId="1477644837">
+    <w:abstractNumId w:val="93"/>
+  </w:num>
+  <w:num w:numId="168" w16cid:durableId="1618100933">
     <w:abstractNumId w:val="161"/>
   </w:num>
-  <w:num w:numId="149" w16cid:durableId="1664625526">
-    <w:abstractNumId w:val="64"/>
-  </w:num>
-  <w:num w:numId="150" w16cid:durableId="678197415">
-    <w:abstractNumId w:val="138"/>
-  </w:num>
-  <w:num w:numId="151" w16cid:durableId="1193106551">
-    <w:abstractNumId w:val="109"/>
-  </w:num>
-  <w:num w:numId="152" w16cid:durableId="1209760807">
-    <w:abstractNumId w:val="63"/>
-  </w:num>
-  <w:num w:numId="153" w16cid:durableId="1994025825">
-    <w:abstractNumId w:val="68"/>
-  </w:num>
-  <w:num w:numId="154" w16cid:durableId="2121295621">
-    <w:abstractNumId w:val="162"/>
-  </w:num>
-  <w:num w:numId="155" w16cid:durableId="292684904">
-    <w:abstractNumId w:val="85"/>
-  </w:num>
-  <w:num w:numId="156" w16cid:durableId="769400072">
-    <w:abstractNumId w:val="173"/>
-  </w:num>
-  <w:num w:numId="157" w16cid:durableId="1930693824">
-    <w:abstractNumId w:val="108"/>
-  </w:num>
-  <w:num w:numId="158" w16cid:durableId="813957946">
-    <w:abstractNumId w:val="157"/>
-  </w:num>
-  <w:num w:numId="159" w16cid:durableId="1782143679">
-    <w:abstractNumId w:val="33"/>
-  </w:num>
-  <w:num w:numId="160" w16cid:durableId="1278754750">
-    <w:abstractNumId w:val="29"/>
-  </w:num>
-  <w:num w:numId="161" w16cid:durableId="1052270864">
-    <w:abstractNumId w:val="134"/>
-  </w:num>
-  <w:num w:numId="162" w16cid:durableId="762337137">
-    <w:abstractNumId w:val="102"/>
-  </w:num>
-  <w:num w:numId="163" w16cid:durableId="1682507263">
-    <w:abstractNumId w:val="87"/>
-  </w:num>
-  <w:num w:numId="164" w16cid:durableId="871957078">
-    <w:abstractNumId w:val="119"/>
-  </w:num>
-  <w:num w:numId="165" w16cid:durableId="601960416">
-    <w:abstractNumId w:val="141"/>
-  </w:num>
-  <w:num w:numId="166" w16cid:durableId="574900497">
-    <w:abstractNumId w:val="131"/>
-  </w:num>
-  <w:num w:numId="167" w16cid:durableId="1477644837">
-    <w:abstractNumId w:val="92"/>
-  </w:num>
-  <w:num w:numId="168" w16cid:durableId="1618100933">
-    <w:abstractNumId w:val="159"/>
-  </w:num>
   <w:num w:numId="169" w16cid:durableId="1266614374">
-    <w:abstractNumId w:val="169"/>
+    <w:abstractNumId w:val="171"/>
   </w:num>
   <w:num w:numId="170" w16cid:durableId="67534002">
     <w:abstractNumId w:val="1"/>
   </w:num>
   <w:num w:numId="171" w16cid:durableId="1336614003">
-    <w:abstractNumId w:val="51"/>
+    <w:abstractNumId w:val="52"/>
   </w:num>
   <w:num w:numId="172" w16cid:durableId="827554792">
-    <w:abstractNumId w:val="104"/>
+    <w:abstractNumId w:val="105"/>
   </w:num>
   <w:num w:numId="173" w16cid:durableId="186605808">
-    <w:abstractNumId w:val="26"/>
+    <w:abstractNumId w:val="27"/>
   </w:num>
   <w:num w:numId="174" w16cid:durableId="1000935913">
-    <w:abstractNumId w:val="123"/>
+    <w:abstractNumId w:val="125"/>
   </w:num>
   <w:num w:numId="175" w16cid:durableId="685984279">
-    <w:abstractNumId w:val="43"/>
+    <w:abstractNumId w:val="44"/>
   </w:num>
   <w:num w:numId="176" w16cid:durableId="355473142">
-    <w:abstractNumId w:val="175"/>
+    <w:abstractNumId w:val="177"/>
   </w:num>
   <w:num w:numId="177" w16cid:durableId="1580820927">
     <w:abstractNumId w:val="4"/>
   </w:num>
   <w:num w:numId="178" w16cid:durableId="1342977237">
-    <w:abstractNumId w:val="178"/>
+    <w:abstractNumId w:val="180"/>
   </w:num>
   <w:num w:numId="179" w16cid:durableId="1610351964">
-    <w:abstractNumId w:val="90"/>
+    <w:abstractNumId w:val="91"/>
+  </w:num>
+  <w:num w:numId="180" w16cid:durableId="1808428282">
+    <w:abstractNumId w:val="115"/>
+  </w:num>
+  <w:num w:numId="181" w16cid:durableId="1853181086">
+    <w:abstractNumId w:val="16"/>
   </w:num>
 </w:numbering>
 </file>
@@ -33501,6 +35279,7 @@
   <w:style w:type="character" w:default="1" w:styleId="DefaultParagraphFont">
     <w:name w:val="Default Paragraph Font"/>
     <w:uiPriority w:val="1"/>
+    <w:semiHidden/>
     <w:unhideWhenUsed/>
   </w:style>
   <w:style w:type="table" w:default="1" w:styleId="TableNormal">

</xml_diff>

<commit_message>
Third-Party Integration Design (#361)
</commit_message>
<xml_diff>
--- a/Software Architecture Design.docx
+++ b/Software Architecture Design.docx
@@ -11314,7 +11314,740 @@
         <w:br w:type="page"/>
       </w:r>
     </w:p>
+    <w:p>
+      <w:pPr>
+        <w:pStyle w:val="Heading2"/>
+      </w:pPr>
+      <w:r>
+        <w:lastRenderedPageBreak/>
+        <w:t xml:space="preserve"> </w:t>
+      </w:r>
+      <w:r>
+        <w:t>Integration Architecture Design</w:t>
+      </w:r>
+    </w:p>
+    <w:p>
+      <w:pPr>
+        <w:spacing w:after="0"/>
+      </w:pPr>
+      <w:r>
+        <w:t>Modern software systems do not function in isolation. Instead, they depend on external services that help them add more capabilities or features that can be hard to implement from scratch. In the case of the KriGo application, the platform is designed with third-party services that enable users to perform online payments, artificial intelligence operations, file storage in the cloud, map services, and notifications. The implementation of these services adds value to the application's overall functionality.</w:t>
+      </w:r>
+    </w:p>
+    <w:p>
+      <w:r>
+        <w:t>The integration architecture uses a service abstraction pattern. In this approach, communication with external systems is encapsulated in integration services. It is not necessary for the business logic of the application to communicate with third-party providers. Every external system can be reached via a special interface that reduces dependency on vendors and simplifies the process of maintaining external services.</w:t>
+      </w:r>
+    </w:p>
+    <w:p>
+      <w:pPr>
+        <w:pStyle w:val="Heading3"/>
+      </w:pPr>
+      <w:r>
+        <w:t>Third-Party Integration Design</w:t>
+      </w:r>
+    </w:p>
+    <w:p>
+      <w:pPr>
+        <w:spacing w:after="0"/>
+      </w:pPr>
+      <w:r>
+        <w:t>The KriGo platform integrates several external systems to support business operations and improve the overall user experience. Each integration addresses a specific functional requirement and communicates with the backend through secure APIs.</w:t>
+      </w:r>
+    </w:p>
+    <w:p>
+      <w:pPr>
+        <w:spacing w:after="0"/>
+      </w:pPr>
+    </w:p>
+    <w:tbl>
+      <w:tblPr>
+        <w:tblStyle w:val="PlainTable1"/>
+        <w:tblW w:w="0" w:type="auto"/>
+        <w:tblCellMar>
+          <w:top w:w="86" w:type="dxa"/>
+          <w:bottom w:w="86" w:type="dxa"/>
+        </w:tblCellMar>
+        <w:tblLook w:val="04A0" w:firstRow="1" w:lastRow="0" w:firstColumn="1" w:lastColumn="0" w:noHBand="0" w:noVBand="1"/>
+      </w:tblPr>
+      <w:tblGrid>
+        <w:gridCol w:w="2992"/>
+        <w:gridCol w:w="3303"/>
+        <w:gridCol w:w="3052"/>
+      </w:tblGrid>
+      <w:tr>
+        <w:trPr>
+          <w:cnfStyle w:val="100000000000" w:firstRow="1" w:lastRow="0" w:firstColumn="0" w:lastColumn="0" w:oddVBand="0" w:evenVBand="0" w:oddHBand="0" w:evenHBand="0" w:firstRowFirstColumn="0" w:firstRowLastColumn="0" w:lastRowFirstColumn="0" w:lastRowLastColumn="0"/>
+        </w:trPr>
+        <w:tc>
+          <w:tcPr>
+            <w:cnfStyle w:val="001000000000" w:firstRow="0" w:lastRow="0" w:firstColumn="1" w:lastColumn="0" w:oddVBand="0" w:evenVBand="0" w:oddHBand="0" w:evenHBand="0" w:firstRowFirstColumn="0" w:firstRowLastColumn="0" w:lastRowFirstColumn="0" w:lastRowLastColumn="0"/>
+            <w:tcW w:w="0" w:type="auto"/>
+            <w:vAlign w:val="center"/>
+            <w:hideMark/>
+          </w:tcPr>
+          <w:p>
+            <w:r>
+              <w:t>External Service</w:t>
+            </w:r>
+          </w:p>
+        </w:tc>
+        <w:tc>
+          <w:tcPr>
+            <w:tcW w:w="3303" w:type="dxa"/>
+            <w:vAlign w:val="center"/>
+            <w:hideMark/>
+          </w:tcPr>
+          <w:p>
+            <w:pPr>
+              <w:cnfStyle w:val="100000000000" w:firstRow="1" w:lastRow="0" w:firstColumn="0" w:lastColumn="0" w:oddVBand="0" w:evenVBand="0" w:oddHBand="0" w:evenHBand="0" w:firstRowFirstColumn="0" w:firstRowLastColumn="0" w:lastRowFirstColumn="0" w:lastRowLastColumn="0"/>
+            </w:pPr>
+            <w:r>
+              <w:t>Purpose</w:t>
+            </w:r>
+          </w:p>
+        </w:tc>
+        <w:tc>
+          <w:tcPr>
+            <w:tcW w:w="3052" w:type="dxa"/>
+            <w:vAlign w:val="center"/>
+            <w:hideMark/>
+          </w:tcPr>
+          <w:p>
+            <w:pPr>
+              <w:cnfStyle w:val="100000000000" w:firstRow="1" w:lastRow="0" w:firstColumn="0" w:lastColumn="0" w:oddVBand="0" w:evenVBand="0" w:oddHBand="0" w:evenHBand="0" w:firstRowFirstColumn="0" w:firstRowLastColumn="0" w:lastRowFirstColumn="0" w:lastRowLastColumn="0"/>
+            </w:pPr>
+            <w:r>
+              <w:t>Communication Protocol</w:t>
+            </w:r>
+          </w:p>
+        </w:tc>
+      </w:tr>
+      <w:tr>
+        <w:trPr>
+          <w:cnfStyle w:val="000000100000" w:firstRow="0" w:lastRow="0" w:firstColumn="0" w:lastColumn="0" w:oddVBand="0" w:evenVBand="0" w:oddHBand="1" w:evenHBand="0" w:firstRowFirstColumn="0" w:firstRowLastColumn="0" w:lastRowFirstColumn="0" w:lastRowLastColumn="0"/>
+        </w:trPr>
+        <w:tc>
+          <w:tcPr>
+            <w:cnfStyle w:val="001000000000" w:firstRow="0" w:lastRow="0" w:firstColumn="1" w:lastColumn="0" w:oddVBand="0" w:evenVBand="0" w:oddHBand="0" w:evenHBand="0" w:firstRowFirstColumn="0" w:firstRowLastColumn="0" w:lastRowFirstColumn="0" w:lastRowLastColumn="0"/>
+            <w:tcW w:w="0" w:type="auto"/>
+            <w:vAlign w:val="center"/>
+            <w:hideMark/>
+          </w:tcPr>
+          <w:p>
+            <w:pPr>
+              <w:rPr>
+                <w:b w:val="0"/>
+                <w:bCs w:val="0"/>
+              </w:rPr>
+            </w:pPr>
+            <w:r>
+              <w:rPr>
+                <w:b w:val="0"/>
+                <w:bCs w:val="0"/>
+              </w:rPr>
+              <w:t>Algeria Post Edahabia Payment Gateway</w:t>
+            </w:r>
+          </w:p>
+        </w:tc>
+        <w:tc>
+          <w:tcPr>
+            <w:tcW w:w="3303" w:type="dxa"/>
+            <w:vAlign w:val="center"/>
+            <w:hideMark/>
+          </w:tcPr>
+          <w:p>
+            <w:pPr>
+              <w:cnfStyle w:val="000000100000" w:firstRow="0" w:lastRow="0" w:firstColumn="0" w:lastColumn="0" w:oddVBand="0" w:evenVBand="0" w:oddHBand="1" w:evenHBand="0" w:firstRowFirstColumn="0" w:firstRowLastColumn="0" w:lastRowFirstColumn="0" w:lastRowLastColumn="0"/>
+            </w:pPr>
+            <w:r>
+              <w:t>Secure online payment processing</w:t>
+            </w:r>
+          </w:p>
+        </w:tc>
+        <w:tc>
+          <w:tcPr>
+            <w:tcW w:w="3052" w:type="dxa"/>
+            <w:vAlign w:val="center"/>
+            <w:hideMark/>
+          </w:tcPr>
+          <w:p>
+            <w:pPr>
+              <w:cnfStyle w:val="000000100000" w:firstRow="0" w:lastRow="0" w:firstColumn="0" w:lastColumn="0" w:oddVBand="0" w:evenVBand="0" w:oddHBand="1" w:evenHBand="0" w:firstRowFirstColumn="0" w:firstRowLastColumn="0" w:lastRowFirstColumn="0" w:lastRowLastColumn="0"/>
+            </w:pPr>
+            <w:r>
+              <w:t>HTTPS REST API</w:t>
+            </w:r>
+          </w:p>
+        </w:tc>
+      </w:tr>
+      <w:tr>
+        <w:tc>
+          <w:tcPr>
+            <w:cnfStyle w:val="001000000000" w:firstRow="0" w:lastRow="0" w:firstColumn="1" w:lastColumn="0" w:oddVBand="0" w:evenVBand="0" w:oddHBand="0" w:evenHBand="0" w:firstRowFirstColumn="0" w:firstRowLastColumn="0" w:lastRowFirstColumn="0" w:lastRowLastColumn="0"/>
+            <w:tcW w:w="0" w:type="auto"/>
+            <w:vAlign w:val="center"/>
+            <w:hideMark/>
+          </w:tcPr>
+          <w:p>
+            <w:pPr>
+              <w:rPr>
+                <w:b w:val="0"/>
+                <w:bCs w:val="0"/>
+              </w:rPr>
+            </w:pPr>
+            <w:r>
+              <w:rPr>
+                <w:b w:val="0"/>
+                <w:bCs w:val="0"/>
+              </w:rPr>
+              <w:t>OpenAI API</w:t>
+            </w:r>
+          </w:p>
+        </w:tc>
+        <w:tc>
+          <w:tcPr>
+            <w:tcW w:w="3303" w:type="dxa"/>
+            <w:vAlign w:val="center"/>
+            <w:hideMark/>
+          </w:tcPr>
+          <w:p>
+            <w:pPr>
+              <w:cnfStyle w:val="000000000000" w:firstRow="0" w:lastRow="0" w:firstColumn="0" w:lastColumn="0" w:oddVBand="0" w:evenVBand="0" w:oddHBand="0" w:evenHBand="0" w:firstRowFirstColumn="0" w:firstRowLastColumn="0" w:lastRowFirstColumn="0" w:lastRowLastColumn="0"/>
+            </w:pPr>
+            <w:r>
+              <w:t>AI assistant and recommendation generation</w:t>
+            </w:r>
+          </w:p>
+        </w:tc>
+        <w:tc>
+          <w:tcPr>
+            <w:tcW w:w="3052" w:type="dxa"/>
+            <w:vAlign w:val="center"/>
+            <w:hideMark/>
+          </w:tcPr>
+          <w:p>
+            <w:pPr>
+              <w:cnfStyle w:val="000000000000" w:firstRow="0" w:lastRow="0" w:firstColumn="0" w:lastColumn="0" w:oddVBand="0" w:evenVBand="0" w:oddHBand="0" w:evenHBand="0" w:firstRowFirstColumn="0" w:firstRowLastColumn="0" w:lastRowFirstColumn="0" w:lastRowLastColumn="0"/>
+            </w:pPr>
+            <w:r>
+              <w:t>HTTPS REST API</w:t>
+            </w:r>
+          </w:p>
+        </w:tc>
+      </w:tr>
+      <w:tr>
+        <w:trPr>
+          <w:cnfStyle w:val="000000100000" w:firstRow="0" w:lastRow="0" w:firstColumn="0" w:lastColumn="0" w:oddVBand="0" w:evenVBand="0" w:oddHBand="1" w:evenHBand="0" w:firstRowFirstColumn="0" w:firstRowLastColumn="0" w:lastRowFirstColumn="0" w:lastRowLastColumn="0"/>
+        </w:trPr>
+        <w:tc>
+          <w:tcPr>
+            <w:cnfStyle w:val="001000000000" w:firstRow="0" w:lastRow="0" w:firstColumn="1" w:lastColumn="0" w:oddVBand="0" w:evenVBand="0" w:oddHBand="0" w:evenHBand="0" w:firstRowFirstColumn="0" w:firstRowLastColumn="0" w:lastRowFirstColumn="0" w:lastRowLastColumn="0"/>
+            <w:tcW w:w="0" w:type="auto"/>
+            <w:vAlign w:val="center"/>
+            <w:hideMark/>
+          </w:tcPr>
+          <w:p>
+            <w:pPr>
+              <w:rPr>
+                <w:b w:val="0"/>
+                <w:bCs w:val="0"/>
+              </w:rPr>
+            </w:pPr>
+            <w:r>
+              <w:rPr>
+                <w:b w:val="0"/>
+                <w:bCs w:val="0"/>
+              </w:rPr>
+              <w:t>Cloudflare R2 / Amazon S3</w:t>
+            </w:r>
+          </w:p>
+        </w:tc>
+        <w:tc>
+          <w:tcPr>
+            <w:tcW w:w="3303" w:type="dxa"/>
+            <w:vAlign w:val="center"/>
+            <w:hideMark/>
+          </w:tcPr>
+          <w:p>
+            <w:pPr>
+              <w:cnfStyle w:val="000000100000" w:firstRow="0" w:lastRow="0" w:firstColumn="0" w:lastColumn="0" w:oddVBand="0" w:evenVBand="0" w:oddHBand="1" w:evenHBand="0" w:firstRowFirstColumn="0" w:firstRowLastColumn="0" w:lastRowFirstColumn="0" w:lastRowLastColumn="0"/>
+            </w:pPr>
+            <w:r>
+              <w:t>Storage of vehicle images and verification documents</w:t>
+            </w:r>
+          </w:p>
+        </w:tc>
+        <w:tc>
+          <w:tcPr>
+            <w:tcW w:w="3052" w:type="dxa"/>
+            <w:vAlign w:val="center"/>
+            <w:hideMark/>
+          </w:tcPr>
+          <w:p>
+            <w:pPr>
+              <w:cnfStyle w:val="000000100000" w:firstRow="0" w:lastRow="0" w:firstColumn="0" w:lastColumn="0" w:oddVBand="0" w:evenVBand="0" w:oddHBand="1" w:evenHBand="0" w:firstRowFirstColumn="0" w:firstRowLastColumn="0" w:lastRowFirstColumn="0" w:lastRowLastColumn="0"/>
+            </w:pPr>
+            <w:r>
+              <w:t>HTTPS REST API</w:t>
+            </w:r>
+          </w:p>
+        </w:tc>
+      </w:tr>
+      <w:tr>
+        <w:tc>
+          <w:tcPr>
+            <w:cnfStyle w:val="001000000000" w:firstRow="0" w:lastRow="0" w:firstColumn="1" w:lastColumn="0" w:oddVBand="0" w:evenVBand="0" w:oddHBand="0" w:evenHBand="0" w:firstRowFirstColumn="0" w:firstRowLastColumn="0" w:lastRowFirstColumn="0" w:lastRowLastColumn="0"/>
+            <w:tcW w:w="0" w:type="auto"/>
+            <w:vAlign w:val="center"/>
+            <w:hideMark/>
+          </w:tcPr>
+          <w:p>
+            <w:pPr>
+              <w:rPr>
+                <w:b w:val="0"/>
+                <w:bCs w:val="0"/>
+              </w:rPr>
+            </w:pPr>
+            <w:r>
+              <w:rPr>
+                <w:b w:val="0"/>
+                <w:bCs w:val="0"/>
+              </w:rPr>
+              <w:t>Google Maps API</w:t>
+            </w:r>
+          </w:p>
+        </w:tc>
+        <w:tc>
+          <w:tcPr>
+            <w:tcW w:w="3303" w:type="dxa"/>
+            <w:vAlign w:val="center"/>
+            <w:hideMark/>
+          </w:tcPr>
+          <w:p>
+            <w:pPr>
+              <w:cnfStyle w:val="000000000000" w:firstRow="0" w:lastRow="0" w:firstColumn="0" w:lastColumn="0" w:oddVBand="0" w:evenVBand="0" w:oddHBand="0" w:evenHBand="0" w:firstRowFirstColumn="0" w:firstRowLastColumn="0" w:lastRowFirstColumn="0" w:lastRowLastColumn="0"/>
+            </w:pPr>
+            <w:r>
+              <w:t>Geolocation, branch discovery, and routing</w:t>
+            </w:r>
+          </w:p>
+        </w:tc>
+        <w:tc>
+          <w:tcPr>
+            <w:tcW w:w="3052" w:type="dxa"/>
+            <w:vAlign w:val="center"/>
+            <w:hideMark/>
+          </w:tcPr>
+          <w:p>
+            <w:pPr>
+              <w:cnfStyle w:val="000000000000" w:firstRow="0" w:lastRow="0" w:firstColumn="0" w:lastColumn="0" w:oddVBand="0" w:evenVBand="0" w:oddHBand="0" w:evenHBand="0" w:firstRowFirstColumn="0" w:firstRowLastColumn="0" w:lastRowFirstColumn="0" w:lastRowLastColumn="0"/>
+            </w:pPr>
+            <w:r>
+              <w:t>HTTPS REST API</w:t>
+            </w:r>
+          </w:p>
+        </w:tc>
+      </w:tr>
+      <w:tr>
+        <w:trPr>
+          <w:cnfStyle w:val="000000100000" w:firstRow="0" w:lastRow="0" w:firstColumn="0" w:lastColumn="0" w:oddVBand="0" w:evenVBand="0" w:oddHBand="1" w:evenHBand="0" w:firstRowFirstColumn="0" w:firstRowLastColumn="0" w:lastRowFirstColumn="0" w:lastRowLastColumn="0"/>
+        </w:trPr>
+        <w:tc>
+          <w:tcPr>
+            <w:cnfStyle w:val="001000000000" w:firstRow="0" w:lastRow="0" w:firstColumn="1" w:lastColumn="0" w:oddVBand="0" w:evenVBand="0" w:oddHBand="0" w:evenHBand="0" w:firstRowFirstColumn="0" w:firstRowLastColumn="0" w:lastRowFirstColumn="0" w:lastRowLastColumn="0"/>
+            <w:tcW w:w="0" w:type="auto"/>
+            <w:vAlign w:val="center"/>
+            <w:hideMark/>
+          </w:tcPr>
+          <w:p>
+            <w:pPr>
+              <w:rPr>
+                <w:b w:val="0"/>
+                <w:bCs w:val="0"/>
+              </w:rPr>
+            </w:pPr>
+            <w:r>
+              <w:rPr>
+                <w:b w:val="0"/>
+                <w:bCs w:val="0"/>
+              </w:rPr>
+              <w:t>Firebase Cloud Messaging (FCM)</w:t>
+            </w:r>
+          </w:p>
+        </w:tc>
+        <w:tc>
+          <w:tcPr>
+            <w:tcW w:w="3303" w:type="dxa"/>
+            <w:vAlign w:val="center"/>
+            <w:hideMark/>
+          </w:tcPr>
+          <w:p>
+            <w:pPr>
+              <w:cnfStyle w:val="000000100000" w:firstRow="0" w:lastRow="0" w:firstColumn="0" w:lastColumn="0" w:oddVBand="0" w:evenVBand="0" w:oddHBand="1" w:evenHBand="0" w:firstRowFirstColumn="0" w:firstRowLastColumn="0" w:lastRowFirstColumn="0" w:lastRowLastColumn="0"/>
+            </w:pPr>
+            <w:r>
+              <w:t>Mobile push notifications</w:t>
+            </w:r>
+          </w:p>
+        </w:tc>
+        <w:tc>
+          <w:tcPr>
+            <w:tcW w:w="3052" w:type="dxa"/>
+            <w:vAlign w:val="center"/>
+            <w:hideMark/>
+          </w:tcPr>
+          <w:p>
+            <w:pPr>
+              <w:cnfStyle w:val="000000100000" w:firstRow="0" w:lastRow="0" w:firstColumn="0" w:lastColumn="0" w:oddVBand="0" w:evenVBand="0" w:oddHBand="1" w:evenHBand="0" w:firstRowFirstColumn="0" w:firstRowLastColumn="0" w:lastRowFirstColumn="0" w:lastRowLastColumn="0"/>
+            </w:pPr>
+            <w:r>
+              <w:t>HTTPS REST API</w:t>
+            </w:r>
+          </w:p>
+        </w:tc>
+      </w:tr>
+      <w:tr>
+        <w:tc>
+          <w:tcPr>
+            <w:cnfStyle w:val="001000000000" w:firstRow="0" w:lastRow="0" w:firstColumn="1" w:lastColumn="0" w:oddVBand="0" w:evenVBand="0" w:oddHBand="0" w:evenHBand="0" w:firstRowFirstColumn="0" w:firstRowLastColumn="0" w:lastRowFirstColumn="0" w:lastRowLastColumn="0"/>
+            <w:tcW w:w="0" w:type="auto"/>
+            <w:vAlign w:val="center"/>
+            <w:hideMark/>
+          </w:tcPr>
+          <w:p>
+            <w:pPr>
+              <w:rPr>
+                <w:b w:val="0"/>
+                <w:bCs w:val="0"/>
+              </w:rPr>
+            </w:pPr>
+            <w:r>
+              <w:rPr>
+                <w:b w:val="0"/>
+                <w:bCs w:val="0"/>
+              </w:rPr>
+              <w:t>SMTP Email Service</w:t>
+            </w:r>
+          </w:p>
+        </w:tc>
+        <w:tc>
+          <w:tcPr>
+            <w:tcW w:w="3303" w:type="dxa"/>
+            <w:vAlign w:val="center"/>
+            <w:hideMark/>
+          </w:tcPr>
+          <w:p>
+            <w:pPr>
+              <w:cnfStyle w:val="000000000000" w:firstRow="0" w:lastRow="0" w:firstColumn="0" w:lastColumn="0" w:oddVBand="0" w:evenVBand="0" w:oddHBand="0" w:evenHBand="0" w:firstRowFirstColumn="0" w:firstRowLastColumn="0" w:lastRowFirstColumn="0" w:lastRowLastColumn="0"/>
+            </w:pPr>
+            <w:r>
+              <w:t>Email verification and notification delivery</w:t>
+            </w:r>
+          </w:p>
+        </w:tc>
+        <w:tc>
+          <w:tcPr>
+            <w:tcW w:w="3052" w:type="dxa"/>
+            <w:vAlign w:val="center"/>
+            <w:hideMark/>
+          </w:tcPr>
+          <w:p>
+            <w:pPr>
+              <w:cnfStyle w:val="000000000000" w:firstRow="0" w:lastRow="0" w:firstColumn="0" w:lastColumn="0" w:oddVBand="0" w:evenVBand="0" w:oddHBand="0" w:evenHBand="0" w:firstRowFirstColumn="0" w:firstRowLastColumn="0" w:lastRowFirstColumn="0" w:lastRowLastColumn="0"/>
+            </w:pPr>
+            <w:r>
+              <w:t>SMTP / HTTPS</w:t>
+            </w:r>
+          </w:p>
+        </w:tc>
+      </w:tr>
+    </w:tbl>
     <w:p/>
+    <w:p>
+      <w:pPr>
+        <w:spacing w:after="0"/>
+      </w:pPr>
+      <w:r>
+        <w:t>Each external provider operates independently of the KriGo platform and communicates only through secure service interfaces implemented within the backend integration layer.</w:t>
+      </w:r>
+    </w:p>
+    <w:p>
+      <w:pPr>
+        <w:spacing w:line="278" w:lineRule="auto"/>
+      </w:pPr>
+      <w:r>
+        <w:br w:type="page"/>
+      </w:r>
+    </w:p>
+    <w:p>
+      <w:pPr>
+        <w:pStyle w:val="Heading3"/>
+      </w:pPr>
+      <w:r>
+        <w:lastRenderedPageBreak/>
+        <w:t>Integration with Payment Gateway</w:t>
+      </w:r>
+    </w:p>
+    <w:p>
+      <w:pPr>
+        <w:spacing w:after="0"/>
+      </w:pPr>
+      <w:r>
+        <w:t>Transactions related to online payments are done via the Algeria Post Edahabia Payment Gateway that allows completing payment transactions using Edahabia cards. In the reservation process, the Payment Service initiates a payment request, redirects the user to the payment gateway if needed, and gets the result of the transaction when it is completed.</w:t>
+      </w:r>
+      <w:r>
+        <w:t xml:space="preserve"> </w:t>
+      </w:r>
+      <w:r>
+        <w:t>To ensure that the integrity of the transaction is preserved, the payment verification step is executed before the reservation status update. Successful transactions lead to confirmation notifications, while failed or canceled transactions prevent the reservation confirmation and are logged for audit purposes.</w:t>
+      </w:r>
+    </w:p>
+    <w:p>
+      <w:pPr>
+        <w:spacing w:after="0"/>
+      </w:pPr>
+    </w:p>
+    <w:p>
+      <w:pPr>
+        <w:pStyle w:val="Heading3"/>
+      </w:pPr>
+      <w:r>
+        <w:t>Integration with Artificial Intelligence</w:t>
+      </w:r>
+    </w:p>
+    <w:p>
+      <w:pPr>
+        <w:spacing w:after="0"/>
+      </w:pPr>
+      <w:r>
+        <w:t>Capabilities of artificial intelligence are provided via the OpenAI API. There are two independent business services that utilize the AI capabilities: the AI Recommendation Service and the AI Assistant Service.</w:t>
+      </w:r>
+      <w:r>
+        <w:t xml:space="preserve"> </w:t>
+      </w:r>
+      <w:r>
+        <w:t>The former analyzes user preferences, history of reservations, and features of vehicles to generate personalized suggestions of vehicles, while the latter processes natural language requests to answer user queries and provide assistance during reservations as well as to provide general assistance.</w:t>
+      </w:r>
+    </w:p>
+    <w:p>
+      <w:pPr>
+        <w:spacing w:after="0"/>
+      </w:pPr>
+      <w:r>
+        <w:t>The integration layer keeps separate from the business logic the communication with AI provider allowing changing the provider in the future without any modifications of the application architecture.</w:t>
+      </w:r>
+    </w:p>
+    <w:p>
+      <w:pPr>
+        <w:spacing w:after="0"/>
+      </w:pPr>
+    </w:p>
+    <w:p>
+      <w:pPr>
+        <w:pStyle w:val="Heading3"/>
+      </w:pPr>
+      <w:r>
+        <w:t>Integration with Cloud Storage</w:t>
+      </w:r>
+    </w:p>
+    <w:p>
+      <w:pPr>
+        <w:spacing w:after="0"/>
+      </w:pPr>
+      <w:r>
+        <w:t>Photos of vehicles, documents of agencies, and other media are stored via cloud object storage services such as Cloudflare R2 or Amazon S3. Storing large files out of the relational database improves the performance of the application, minimizes the size of the database, and simplifies the management of media content.</w:t>
+      </w:r>
+      <w:r>
+        <w:t xml:space="preserve"> </w:t>
+      </w:r>
+      <w:r>
+        <w:t>The backend creates secure requests for file upload and keeps metadata about the files and references to them in PostgreSQL database, while the files themselves are stored safely in cloud storage.</w:t>
+      </w:r>
+    </w:p>
+    <w:p>
+      <w:pPr>
+        <w:spacing w:after="0"/>
+      </w:pPr>
+    </w:p>
+    <w:p>
+      <w:pPr>
+        <w:pStyle w:val="Heading3"/>
+      </w:pPr>
+      <w:r>
+        <w:t>Integration with Location Service</w:t>
+      </w:r>
+    </w:p>
+    <w:p>
+      <w:pPr>
+        <w:spacing w:after="0"/>
+      </w:pPr>
+      <w:r>
+        <w:t>The location-related functionality is provided via the Google Maps Platform. The integration allows users to find nearby rental agencies, compute distances, and visualize locations of agencies in both web and mobile applications.</w:t>
+      </w:r>
+      <w:r>
+        <w:t xml:space="preserve"> </w:t>
+      </w:r>
+      <w:r>
+        <w:t>The Fleet Management Service communicates with the mapping service to get the geographical data every time location-related search is made.</w:t>
+      </w:r>
+    </w:p>
+    <w:p>
+      <w:pPr>
+        <w:spacing w:after="0"/>
+      </w:pPr>
+    </w:p>
+    <w:p>
+      <w:pPr>
+        <w:pStyle w:val="Heading3"/>
+      </w:pPr>
+      <w:r>
+        <w:t>Integration with Notification Service</w:t>
+      </w:r>
+    </w:p>
+    <w:p>
+      <w:pPr>
+        <w:spacing w:after="0"/>
+      </w:pPr>
+      <w:r>
+        <w:t>Notifications for users are sent via two parallel communication channels. Mobile notifications are sent using Firebase Cloud Messaging, while email notifications are sent via SMTP email service.</w:t>
+      </w:r>
+      <w:r>
+        <w:t xml:space="preserve"> </w:t>
+      </w:r>
+      <w:r>
+        <w:t>Notification Service decides what communication channel should be used depending on the type of notification and preferences of the user. Since the sending of the notifications does not belong to the critical process of making reservations, the operations are executed asynchronously using RabbitMQ and BullMQ queues.</w:t>
+      </w:r>
+    </w:p>
+    <w:p>
+      <w:pPr>
+        <w:spacing w:after="0"/>
+      </w:pPr>
+    </w:p>
+    <w:p>
+      <w:pPr>
+        <w:pStyle w:val="Heading3"/>
+      </w:pPr>
+      <w:r>
+        <w:lastRenderedPageBreak/>
+        <w:t>Integration Security</w:t>
+      </w:r>
+    </w:p>
+    <w:p>
+      <w:r>
+        <w:t>All communications with external providers take place via encrypted HTTPS connections to keep the information confidential and safe. The authentication with external providers takes place via API keys, access tokens, or service credentials that are kept as environment variables, not hardcoded in the application code.</w:t>
+      </w:r>
+      <w:r>
+        <w:t xml:space="preserve"> </w:t>
+      </w:r>
+      <w:r>
+        <w:t>The integration layer also provides mechanisms to handle timeouts, exceptions, retries, and centralize logs to improve the reliability and allow troubleshooting in case of failed communication.</w:t>
+      </w:r>
+    </w:p>
+    <w:p>
+      <w:r>
+        <w:t>The main security measures include:</w:t>
+      </w:r>
+    </w:p>
+    <w:p>
+      <w:pPr>
+        <w:pStyle w:val="ListParagraph"/>
+        <w:numPr>
+          <w:ilvl w:val="0"/>
+          <w:numId w:val="183"/>
+        </w:numPr>
+        <w:spacing w:after="0"/>
+      </w:pPr>
+      <w:r>
+        <w:t>Encrypted HTTPS communication</w:t>
+      </w:r>
+    </w:p>
+    <w:p>
+      <w:pPr>
+        <w:pStyle w:val="ListParagraph"/>
+        <w:numPr>
+          <w:ilvl w:val="0"/>
+          <w:numId w:val="183"/>
+        </w:numPr>
+        <w:spacing w:after="0"/>
+      </w:pPr>
+      <w:r>
+        <w:t>Safe API keys management</w:t>
+      </w:r>
+    </w:p>
+    <w:p>
+      <w:pPr>
+        <w:pStyle w:val="ListParagraph"/>
+        <w:numPr>
+          <w:ilvl w:val="0"/>
+          <w:numId w:val="183"/>
+        </w:numPr>
+        <w:spacing w:after="0"/>
+      </w:pPr>
+      <w:r>
+        <w:t>Request authentication and authorization</w:t>
+      </w:r>
+    </w:p>
+    <w:p>
+      <w:pPr>
+        <w:pStyle w:val="ListParagraph"/>
+        <w:numPr>
+          <w:ilvl w:val="0"/>
+          <w:numId w:val="183"/>
+        </w:numPr>
+        <w:spacing w:after="0"/>
+      </w:pPr>
+      <w:r>
+        <w:t>Exception handling and automatic retries</w:t>
+      </w:r>
+    </w:p>
+    <w:p>
+      <w:pPr>
+        <w:pStyle w:val="ListParagraph"/>
+        <w:numPr>
+          <w:ilvl w:val="0"/>
+          <w:numId w:val="183"/>
+        </w:numPr>
+        <w:spacing w:after="0"/>
+      </w:pPr>
+      <w:r>
+        <w:t>Centralized integration logging</w:t>
+      </w:r>
+    </w:p>
+    <w:p>
+      <w:pPr>
+        <w:pStyle w:val="ListParagraph"/>
+        <w:numPr>
+          <w:ilvl w:val="0"/>
+          <w:numId w:val="183"/>
+        </w:numPr>
+        <w:spacing w:after="0"/>
+      </w:pPr>
+      <w:r>
+        <w:t>Rate limiting wherever possible with external providers</w:t>
+      </w:r>
+    </w:p>
+    <w:p>
+      <w:pPr>
+        <w:spacing w:after="0"/>
+      </w:pPr>
+    </w:p>
+    <w:p>
+      <w:pPr>
+        <w:pStyle w:val="Heading3"/>
+      </w:pPr>
+      <w:r>
+        <w:t>Advantages of the Integration Architecture</w:t>
+      </w:r>
+    </w:p>
+    <w:p>
+      <w:pPr>
+        <w:spacing w:after="0"/>
+      </w:pPr>
+      <w:r>
+        <w:t>The chosen architecture of integration has multiple benefits for the application. Utilization of dedicated integration services allows keeping the business logic separate from third-party implementation reducing the coupling and improving the maintainability. Service abstraction makes replacement of external providers easy to do. Asynchronous communication improves the responsiveness of the system since the long-running operations with third parties do not block the execution of business logic.</w:t>
+      </w:r>
+    </w:p>
     <w:sectPr>
       <w:headerReference w:type="default" r:id="rId27"/>
       <w:footerReference w:type="default" r:id="rId28"/>
@@ -20850,6 +21583,119 @@
     </w:lvl>
   </w:abstractNum>
   <w:abstractNum w:abstractNumId="74" w15:restartNumberingAfterBreak="0">
+    <w:nsid w:val="36371597"/>
+    <w:multiLevelType w:val="hybridMultilevel"/>
+    <w:tmpl w:val="D4FA2718"/>
+    <w:lvl w:ilvl="0" w:tplc="04090001">
+      <w:start w:val="1"/>
+      <w:numFmt w:val="bullet"/>
+      <w:lvlText w:val=""/>
+      <w:lvlJc w:val="left"/>
+      <w:pPr>
+        <w:ind w:left="720" w:hanging="360"/>
+      </w:pPr>
+      <w:rPr>
+        <w:rFonts w:ascii="Symbol" w:hAnsi="Symbol" w:hint="default"/>
+      </w:rPr>
+    </w:lvl>
+    <w:lvl w:ilvl="1" w:tplc="04090003" w:tentative="1">
+      <w:start w:val="1"/>
+      <w:numFmt w:val="bullet"/>
+      <w:lvlText w:val="o"/>
+      <w:lvlJc w:val="left"/>
+      <w:pPr>
+        <w:ind w:left="1440" w:hanging="360"/>
+      </w:pPr>
+      <w:rPr>
+        <w:rFonts w:ascii="Courier New" w:hAnsi="Courier New" w:cs="Courier New" w:hint="default"/>
+      </w:rPr>
+    </w:lvl>
+    <w:lvl w:ilvl="2" w:tplc="04090005" w:tentative="1">
+      <w:start w:val="1"/>
+      <w:numFmt w:val="bullet"/>
+      <w:lvlText w:val=""/>
+      <w:lvlJc w:val="left"/>
+      <w:pPr>
+        <w:ind w:left="2160" w:hanging="360"/>
+      </w:pPr>
+      <w:rPr>
+        <w:rFonts w:ascii="Wingdings" w:hAnsi="Wingdings" w:hint="default"/>
+      </w:rPr>
+    </w:lvl>
+    <w:lvl w:ilvl="3" w:tplc="04090001" w:tentative="1">
+      <w:start w:val="1"/>
+      <w:numFmt w:val="bullet"/>
+      <w:lvlText w:val=""/>
+      <w:lvlJc w:val="left"/>
+      <w:pPr>
+        <w:ind w:left="2880" w:hanging="360"/>
+      </w:pPr>
+      <w:rPr>
+        <w:rFonts w:ascii="Symbol" w:hAnsi="Symbol" w:hint="default"/>
+      </w:rPr>
+    </w:lvl>
+    <w:lvl w:ilvl="4" w:tplc="04090003" w:tentative="1">
+      <w:start w:val="1"/>
+      <w:numFmt w:val="bullet"/>
+      <w:lvlText w:val="o"/>
+      <w:lvlJc w:val="left"/>
+      <w:pPr>
+        <w:ind w:left="3600" w:hanging="360"/>
+      </w:pPr>
+      <w:rPr>
+        <w:rFonts w:ascii="Courier New" w:hAnsi="Courier New" w:cs="Courier New" w:hint="default"/>
+      </w:rPr>
+    </w:lvl>
+    <w:lvl w:ilvl="5" w:tplc="04090005" w:tentative="1">
+      <w:start w:val="1"/>
+      <w:numFmt w:val="bullet"/>
+      <w:lvlText w:val=""/>
+      <w:lvlJc w:val="left"/>
+      <w:pPr>
+        <w:ind w:left="4320" w:hanging="360"/>
+      </w:pPr>
+      <w:rPr>
+        <w:rFonts w:ascii="Wingdings" w:hAnsi="Wingdings" w:hint="default"/>
+      </w:rPr>
+    </w:lvl>
+    <w:lvl w:ilvl="6" w:tplc="04090001" w:tentative="1">
+      <w:start w:val="1"/>
+      <w:numFmt w:val="bullet"/>
+      <w:lvlText w:val=""/>
+      <w:lvlJc w:val="left"/>
+      <w:pPr>
+        <w:ind w:left="5040" w:hanging="360"/>
+      </w:pPr>
+      <w:rPr>
+        <w:rFonts w:ascii="Symbol" w:hAnsi="Symbol" w:hint="default"/>
+      </w:rPr>
+    </w:lvl>
+    <w:lvl w:ilvl="7" w:tplc="04090003" w:tentative="1">
+      <w:start w:val="1"/>
+      <w:numFmt w:val="bullet"/>
+      <w:lvlText w:val="o"/>
+      <w:lvlJc w:val="left"/>
+      <w:pPr>
+        <w:ind w:left="5760" w:hanging="360"/>
+      </w:pPr>
+      <w:rPr>
+        <w:rFonts w:ascii="Courier New" w:hAnsi="Courier New" w:cs="Courier New" w:hint="default"/>
+      </w:rPr>
+    </w:lvl>
+    <w:lvl w:ilvl="8" w:tplc="04090005" w:tentative="1">
+      <w:start w:val="1"/>
+      <w:numFmt w:val="bullet"/>
+      <w:lvlText w:val=""/>
+      <w:lvlJc w:val="left"/>
+      <w:pPr>
+        <w:ind w:left="6480" w:hanging="360"/>
+      </w:pPr>
+      <w:rPr>
+        <w:rFonts w:ascii="Wingdings" w:hAnsi="Wingdings" w:hint="default"/>
+      </w:rPr>
+    </w:lvl>
+  </w:abstractNum>
+  <w:abstractNum w:abstractNumId="75" w15:restartNumberingAfterBreak="0">
     <w:nsid w:val="36AD3FB0"/>
     <w:multiLevelType w:val="multilevel"/>
     <w:tmpl w:val="0644AEEA"/>
@@ -20998,7 +21844,7 @@
       </w:rPr>
     </w:lvl>
   </w:abstractNum>
-  <w:abstractNum w:abstractNumId="75" w15:restartNumberingAfterBreak="0">
+  <w:abstractNum w:abstractNumId="76" w15:restartNumberingAfterBreak="0">
     <w:nsid w:val="371A2CDE"/>
     <w:multiLevelType w:val="hybridMultilevel"/>
     <w:tmpl w:val="EA9C00CC"/>
@@ -21110,7 +21956,7 @@
       </w:rPr>
     </w:lvl>
   </w:abstractNum>
-  <w:abstractNum w:abstractNumId="76" w15:restartNumberingAfterBreak="0">
+  <w:abstractNum w:abstractNumId="77" w15:restartNumberingAfterBreak="0">
     <w:nsid w:val="373D5E48"/>
     <w:multiLevelType w:val="hybridMultilevel"/>
     <w:tmpl w:val="8A6E38C0"/>
@@ -21223,7 +22069,7 @@
       </w:rPr>
     </w:lvl>
   </w:abstractNum>
-  <w:abstractNum w:abstractNumId="77" w15:restartNumberingAfterBreak="0">
+  <w:abstractNum w:abstractNumId="78" w15:restartNumberingAfterBreak="0">
     <w:nsid w:val="3B446B2D"/>
     <w:multiLevelType w:val="hybridMultilevel"/>
     <w:tmpl w:val="B638176E"/>
@@ -21335,7 +22181,7 @@
       </w:rPr>
     </w:lvl>
   </w:abstractNum>
-  <w:abstractNum w:abstractNumId="78" w15:restartNumberingAfterBreak="0">
+  <w:abstractNum w:abstractNumId="79" w15:restartNumberingAfterBreak="0">
     <w:nsid w:val="3B6B41F5"/>
     <w:multiLevelType w:val="hybridMultilevel"/>
     <w:tmpl w:val="10A26168"/>
@@ -21447,7 +22293,7 @@
       </w:rPr>
     </w:lvl>
   </w:abstractNum>
-  <w:abstractNum w:abstractNumId="79" w15:restartNumberingAfterBreak="0">
+  <w:abstractNum w:abstractNumId="80" w15:restartNumberingAfterBreak="0">
     <w:nsid w:val="3BCD79E4"/>
     <w:multiLevelType w:val="hybridMultilevel"/>
     <w:tmpl w:val="FFFAC2AC"/>
@@ -21560,7 +22406,7 @@
       </w:rPr>
     </w:lvl>
   </w:abstractNum>
-  <w:abstractNum w:abstractNumId="80" w15:restartNumberingAfterBreak="0">
+  <w:abstractNum w:abstractNumId="81" w15:restartNumberingAfterBreak="0">
     <w:nsid w:val="3C5546BA"/>
     <w:multiLevelType w:val="hybridMultilevel"/>
     <w:tmpl w:val="3434F5E4"/>
@@ -21672,7 +22518,7 @@
       </w:rPr>
     </w:lvl>
   </w:abstractNum>
-  <w:abstractNum w:abstractNumId="81" w15:restartNumberingAfterBreak="0">
+  <w:abstractNum w:abstractNumId="82" w15:restartNumberingAfterBreak="0">
     <w:nsid w:val="3C623C55"/>
     <w:multiLevelType w:val="multilevel"/>
     <w:tmpl w:val="A0B0E8F4"/>
@@ -21821,7 +22667,7 @@
       </w:rPr>
     </w:lvl>
   </w:abstractNum>
-  <w:abstractNum w:abstractNumId="82" w15:restartNumberingAfterBreak="0">
+  <w:abstractNum w:abstractNumId="83" w15:restartNumberingAfterBreak="0">
     <w:nsid w:val="3CD27F78"/>
     <w:multiLevelType w:val="multilevel"/>
     <w:tmpl w:val="FCDE767A"/>
@@ -21970,7 +22816,7 @@
       </w:rPr>
     </w:lvl>
   </w:abstractNum>
-  <w:abstractNum w:abstractNumId="83" w15:restartNumberingAfterBreak="0">
+  <w:abstractNum w:abstractNumId="84" w15:restartNumberingAfterBreak="0">
     <w:nsid w:val="3CD74B18"/>
     <w:multiLevelType w:val="hybridMultilevel"/>
     <w:tmpl w:val="2FF42220"/>
@@ -22083,7 +22929,7 @@
       </w:rPr>
     </w:lvl>
   </w:abstractNum>
-  <w:abstractNum w:abstractNumId="84" w15:restartNumberingAfterBreak="0">
+  <w:abstractNum w:abstractNumId="85" w15:restartNumberingAfterBreak="0">
     <w:nsid w:val="3D2F7E79"/>
     <w:multiLevelType w:val="hybridMultilevel"/>
     <w:tmpl w:val="6ED674BE"/>
@@ -22195,7 +23041,7 @@
       </w:rPr>
     </w:lvl>
   </w:abstractNum>
-  <w:abstractNum w:abstractNumId="85" w15:restartNumberingAfterBreak="0">
+  <w:abstractNum w:abstractNumId="86" w15:restartNumberingAfterBreak="0">
     <w:nsid w:val="3D397287"/>
     <w:multiLevelType w:val="hybridMultilevel"/>
     <w:tmpl w:val="F4503122"/>
@@ -22307,7 +23153,7 @@
       </w:rPr>
     </w:lvl>
   </w:abstractNum>
-  <w:abstractNum w:abstractNumId="86" w15:restartNumberingAfterBreak="0">
+  <w:abstractNum w:abstractNumId="87" w15:restartNumberingAfterBreak="0">
     <w:nsid w:val="3DC14EA1"/>
     <w:multiLevelType w:val="hybridMultilevel"/>
     <w:tmpl w:val="DCAE9528"/>
@@ -22420,7 +23266,7 @@
       </w:rPr>
     </w:lvl>
   </w:abstractNum>
-  <w:abstractNum w:abstractNumId="87" w15:restartNumberingAfterBreak="0">
+  <w:abstractNum w:abstractNumId="88" w15:restartNumberingAfterBreak="0">
     <w:nsid w:val="3E685FF3"/>
     <w:multiLevelType w:val="multilevel"/>
     <w:tmpl w:val="7D20B538"/>
@@ -22569,7 +23415,7 @@
       </w:rPr>
     </w:lvl>
   </w:abstractNum>
-  <w:abstractNum w:abstractNumId="88" w15:restartNumberingAfterBreak="0">
+  <w:abstractNum w:abstractNumId="89" w15:restartNumberingAfterBreak="0">
     <w:nsid w:val="3F20785F"/>
     <w:multiLevelType w:val="hybridMultilevel"/>
     <w:tmpl w:val="49D612FC"/>
@@ -22682,7 +23528,7 @@
       </w:rPr>
     </w:lvl>
   </w:abstractNum>
-  <w:abstractNum w:abstractNumId="89" w15:restartNumberingAfterBreak="0">
+  <w:abstractNum w:abstractNumId="90" w15:restartNumberingAfterBreak="0">
     <w:nsid w:val="3F346C2C"/>
     <w:multiLevelType w:val="multilevel"/>
     <w:tmpl w:val="63F4E6F0"/>
@@ -22831,7 +23677,7 @@
       </w:rPr>
     </w:lvl>
   </w:abstractNum>
-  <w:abstractNum w:abstractNumId="90" w15:restartNumberingAfterBreak="0">
+  <w:abstractNum w:abstractNumId="91" w15:restartNumberingAfterBreak="0">
     <w:nsid w:val="3FCB1322"/>
     <w:multiLevelType w:val="hybridMultilevel"/>
     <w:tmpl w:val="55C012B2"/>
@@ -22943,7 +23789,7 @@
       </w:rPr>
     </w:lvl>
   </w:abstractNum>
-  <w:abstractNum w:abstractNumId="91" w15:restartNumberingAfterBreak="0">
+  <w:abstractNum w:abstractNumId="92" w15:restartNumberingAfterBreak="0">
     <w:nsid w:val="403501BA"/>
     <w:multiLevelType w:val="hybridMultilevel"/>
     <w:tmpl w:val="D95E90BC"/>
@@ -23056,7 +23902,7 @@
       </w:rPr>
     </w:lvl>
   </w:abstractNum>
-  <w:abstractNum w:abstractNumId="92" w15:restartNumberingAfterBreak="0">
+  <w:abstractNum w:abstractNumId="93" w15:restartNumberingAfterBreak="0">
     <w:nsid w:val="41A9344F"/>
     <w:multiLevelType w:val="hybridMultilevel"/>
     <w:tmpl w:val="0FB60038"/>
@@ -23169,7 +24015,7 @@
       </w:rPr>
     </w:lvl>
   </w:abstractNum>
-  <w:abstractNum w:abstractNumId="93" w15:restartNumberingAfterBreak="0">
+  <w:abstractNum w:abstractNumId="94" w15:restartNumberingAfterBreak="0">
     <w:nsid w:val="41B44F72"/>
     <w:multiLevelType w:val="hybridMultilevel"/>
     <w:tmpl w:val="1F58F614"/>
@@ -23283,7 +24129,7 @@
       </w:rPr>
     </w:lvl>
   </w:abstractNum>
-  <w:abstractNum w:abstractNumId="94" w15:restartNumberingAfterBreak="0">
+  <w:abstractNum w:abstractNumId="95" w15:restartNumberingAfterBreak="0">
     <w:nsid w:val="42004E1F"/>
     <w:multiLevelType w:val="hybridMultilevel"/>
     <w:tmpl w:val="770C8314"/>
@@ -23395,7 +24241,7 @@
       </w:rPr>
     </w:lvl>
   </w:abstractNum>
-  <w:abstractNum w:abstractNumId="95" w15:restartNumberingAfterBreak="0">
+  <w:abstractNum w:abstractNumId="96" w15:restartNumberingAfterBreak="0">
     <w:nsid w:val="439F7169"/>
     <w:multiLevelType w:val="hybridMultilevel"/>
     <w:tmpl w:val="1884EDCA"/>
@@ -23508,7 +24354,7 @@
       </w:rPr>
     </w:lvl>
   </w:abstractNum>
-  <w:abstractNum w:abstractNumId="96" w15:restartNumberingAfterBreak="0">
+  <w:abstractNum w:abstractNumId="97" w15:restartNumberingAfterBreak="0">
     <w:nsid w:val="43EA1D69"/>
     <w:multiLevelType w:val="multilevel"/>
     <w:tmpl w:val="DFEC23EC"/>
@@ -23657,7 +24503,7 @@
       </w:rPr>
     </w:lvl>
   </w:abstractNum>
-  <w:abstractNum w:abstractNumId="97" w15:restartNumberingAfterBreak="0">
+  <w:abstractNum w:abstractNumId="98" w15:restartNumberingAfterBreak="0">
     <w:nsid w:val="44320084"/>
     <w:multiLevelType w:val="hybridMultilevel"/>
     <w:tmpl w:val="CE5076D4"/>
@@ -23769,7 +24615,7 @@
       </w:rPr>
     </w:lvl>
   </w:abstractNum>
-  <w:abstractNum w:abstractNumId="98" w15:restartNumberingAfterBreak="0">
+  <w:abstractNum w:abstractNumId="99" w15:restartNumberingAfterBreak="0">
     <w:nsid w:val="44554567"/>
     <w:multiLevelType w:val="hybridMultilevel"/>
     <w:tmpl w:val="78748252"/>
@@ -23881,7 +24727,7 @@
       </w:rPr>
     </w:lvl>
   </w:abstractNum>
-  <w:abstractNum w:abstractNumId="99" w15:restartNumberingAfterBreak="0">
+  <w:abstractNum w:abstractNumId="100" w15:restartNumberingAfterBreak="0">
     <w:nsid w:val="49005094"/>
     <w:multiLevelType w:val="hybridMultilevel"/>
     <w:tmpl w:val="14848CBE"/>
@@ -23993,7 +24839,7 @@
       </w:rPr>
     </w:lvl>
   </w:abstractNum>
-  <w:abstractNum w:abstractNumId="100" w15:restartNumberingAfterBreak="0">
+  <w:abstractNum w:abstractNumId="101" w15:restartNumberingAfterBreak="0">
     <w:nsid w:val="49243794"/>
     <w:multiLevelType w:val="multilevel"/>
     <w:tmpl w:val="E7681528"/>
@@ -24142,7 +24988,7 @@
       </w:rPr>
     </w:lvl>
   </w:abstractNum>
-  <w:abstractNum w:abstractNumId="101" w15:restartNumberingAfterBreak="0">
+  <w:abstractNum w:abstractNumId="102" w15:restartNumberingAfterBreak="0">
     <w:nsid w:val="4A880990"/>
     <w:multiLevelType w:val="hybridMultilevel"/>
     <w:tmpl w:val="F17E12C2"/>
@@ -24254,7 +25100,7 @@
       </w:rPr>
     </w:lvl>
   </w:abstractNum>
-  <w:abstractNum w:abstractNumId="102" w15:restartNumberingAfterBreak="0">
+  <w:abstractNum w:abstractNumId="103" w15:restartNumberingAfterBreak="0">
     <w:nsid w:val="4B182B12"/>
     <w:multiLevelType w:val="hybridMultilevel"/>
     <w:tmpl w:val="31C486B4"/>
@@ -24366,7 +25212,7 @@
       </w:rPr>
     </w:lvl>
   </w:abstractNum>
-  <w:abstractNum w:abstractNumId="103" w15:restartNumberingAfterBreak="0">
+  <w:abstractNum w:abstractNumId="104" w15:restartNumberingAfterBreak="0">
     <w:nsid w:val="4B6E6D62"/>
     <w:multiLevelType w:val="hybridMultilevel"/>
     <w:tmpl w:val="54DC0C0C"/>
@@ -24479,7 +25325,7 @@
       </w:rPr>
     </w:lvl>
   </w:abstractNum>
-  <w:abstractNum w:abstractNumId="104" w15:restartNumberingAfterBreak="0">
+  <w:abstractNum w:abstractNumId="105" w15:restartNumberingAfterBreak="0">
     <w:nsid w:val="4BA13766"/>
     <w:multiLevelType w:val="multilevel"/>
     <w:tmpl w:val="63F4E6F0"/>
@@ -24628,7 +25474,7 @@
       </w:rPr>
     </w:lvl>
   </w:abstractNum>
-  <w:abstractNum w:abstractNumId="105" w15:restartNumberingAfterBreak="0">
+  <w:abstractNum w:abstractNumId="106" w15:restartNumberingAfterBreak="0">
     <w:nsid w:val="4D2E1CBE"/>
     <w:multiLevelType w:val="hybridMultilevel"/>
     <w:tmpl w:val="BFD86D7C"/>
@@ -24741,7 +25587,7 @@
       </w:rPr>
     </w:lvl>
   </w:abstractNum>
-  <w:abstractNum w:abstractNumId="106" w15:restartNumberingAfterBreak="0">
+  <w:abstractNum w:abstractNumId="107" w15:restartNumberingAfterBreak="0">
     <w:nsid w:val="4E65371E"/>
     <w:multiLevelType w:val="hybridMultilevel"/>
     <w:tmpl w:val="53EE4538"/>
@@ -24853,7 +25699,7 @@
       </w:rPr>
     </w:lvl>
   </w:abstractNum>
-  <w:abstractNum w:abstractNumId="107" w15:restartNumberingAfterBreak="0">
+  <w:abstractNum w:abstractNumId="108" w15:restartNumberingAfterBreak="0">
     <w:nsid w:val="4E9A3F16"/>
     <w:multiLevelType w:val="multilevel"/>
     <w:tmpl w:val="63F4E6F0"/>
@@ -25002,7 +25848,7 @@
       </w:rPr>
     </w:lvl>
   </w:abstractNum>
-  <w:abstractNum w:abstractNumId="108" w15:restartNumberingAfterBreak="0">
+  <w:abstractNum w:abstractNumId="109" w15:restartNumberingAfterBreak="0">
     <w:nsid w:val="500B790D"/>
     <w:multiLevelType w:val="multilevel"/>
     <w:tmpl w:val="63F4E6F0"/>
@@ -25151,7 +25997,7 @@
       </w:rPr>
     </w:lvl>
   </w:abstractNum>
-  <w:abstractNum w:abstractNumId="109" w15:restartNumberingAfterBreak="0">
+  <w:abstractNum w:abstractNumId="110" w15:restartNumberingAfterBreak="0">
     <w:nsid w:val="5037150E"/>
     <w:multiLevelType w:val="hybridMultilevel"/>
     <w:tmpl w:val="064034F8"/>
@@ -25264,7 +26110,7 @@
       </w:rPr>
     </w:lvl>
   </w:abstractNum>
-  <w:abstractNum w:abstractNumId="110" w15:restartNumberingAfterBreak="0">
+  <w:abstractNum w:abstractNumId="111" w15:restartNumberingAfterBreak="0">
     <w:nsid w:val="51417BE1"/>
     <w:multiLevelType w:val="multilevel"/>
     <w:tmpl w:val="993C0E80"/>
@@ -25413,7 +26259,7 @@
       </w:rPr>
     </w:lvl>
   </w:abstractNum>
-  <w:abstractNum w:abstractNumId="111" w15:restartNumberingAfterBreak="0">
+  <w:abstractNum w:abstractNumId="112" w15:restartNumberingAfterBreak="0">
     <w:nsid w:val="526538B7"/>
     <w:multiLevelType w:val="hybridMultilevel"/>
     <w:tmpl w:val="E6A017F2"/>
@@ -25526,7 +26372,7 @@
       </w:rPr>
     </w:lvl>
   </w:abstractNum>
-  <w:abstractNum w:abstractNumId="112" w15:restartNumberingAfterBreak="0">
+  <w:abstractNum w:abstractNumId="113" w15:restartNumberingAfterBreak="0">
     <w:nsid w:val="537E56D9"/>
     <w:multiLevelType w:val="multilevel"/>
     <w:tmpl w:val="1B6E8B6A"/>
@@ -25675,7 +26521,7 @@
       </w:rPr>
     </w:lvl>
   </w:abstractNum>
-  <w:abstractNum w:abstractNumId="113" w15:restartNumberingAfterBreak="0">
+  <w:abstractNum w:abstractNumId="114" w15:restartNumberingAfterBreak="0">
     <w:nsid w:val="53E6601E"/>
     <w:multiLevelType w:val="hybridMultilevel"/>
     <w:tmpl w:val="66F0666A"/>
@@ -25788,7 +26634,7 @@
       </w:rPr>
     </w:lvl>
   </w:abstractNum>
-  <w:abstractNum w:abstractNumId="114" w15:restartNumberingAfterBreak="0">
+  <w:abstractNum w:abstractNumId="115" w15:restartNumberingAfterBreak="0">
     <w:nsid w:val="551D6F91"/>
     <w:multiLevelType w:val="hybridMultilevel"/>
     <w:tmpl w:val="9522B3C6"/>
@@ -25900,7 +26746,7 @@
       </w:rPr>
     </w:lvl>
   </w:abstractNum>
-  <w:abstractNum w:abstractNumId="115" w15:restartNumberingAfterBreak="0">
+  <w:abstractNum w:abstractNumId="116" w15:restartNumberingAfterBreak="0">
     <w:nsid w:val="5546258F"/>
     <w:multiLevelType w:val="multilevel"/>
     <w:tmpl w:val="0CAA196E"/>
@@ -26049,7 +26895,7 @@
       </w:rPr>
     </w:lvl>
   </w:abstractNum>
-  <w:abstractNum w:abstractNumId="116" w15:restartNumberingAfterBreak="0">
+  <w:abstractNum w:abstractNumId="117" w15:restartNumberingAfterBreak="0">
     <w:nsid w:val="55655B93"/>
     <w:multiLevelType w:val="multilevel"/>
     <w:tmpl w:val="9C88A4A8"/>
@@ -26198,7 +27044,7 @@
       </w:rPr>
     </w:lvl>
   </w:abstractNum>
-  <w:abstractNum w:abstractNumId="117" w15:restartNumberingAfterBreak="0">
+  <w:abstractNum w:abstractNumId="118" w15:restartNumberingAfterBreak="0">
     <w:nsid w:val="562D4F1F"/>
     <w:multiLevelType w:val="hybridMultilevel"/>
     <w:tmpl w:val="1FF8D31C"/>
@@ -26310,7 +27156,7 @@
       </w:rPr>
     </w:lvl>
   </w:abstractNum>
-  <w:abstractNum w:abstractNumId="118" w15:restartNumberingAfterBreak="0">
+  <w:abstractNum w:abstractNumId="119" w15:restartNumberingAfterBreak="0">
     <w:nsid w:val="565A0C8B"/>
     <w:multiLevelType w:val="multilevel"/>
     <w:tmpl w:val="AB24FF2E"/>
@@ -26459,7 +27305,7 @@
       </w:rPr>
     </w:lvl>
   </w:abstractNum>
-  <w:abstractNum w:abstractNumId="119" w15:restartNumberingAfterBreak="0">
+  <w:abstractNum w:abstractNumId="120" w15:restartNumberingAfterBreak="0">
     <w:nsid w:val="566E7C65"/>
     <w:multiLevelType w:val="multilevel"/>
     <w:tmpl w:val="28803B4C"/>
@@ -26608,7 +27454,7 @@
       </w:rPr>
     </w:lvl>
   </w:abstractNum>
-  <w:abstractNum w:abstractNumId="120" w15:restartNumberingAfterBreak="0">
+  <w:abstractNum w:abstractNumId="121" w15:restartNumberingAfterBreak="0">
     <w:nsid w:val="57407594"/>
     <w:multiLevelType w:val="multilevel"/>
     <w:tmpl w:val="E6E2F8AE"/>
@@ -26757,7 +27603,7 @@
       </w:rPr>
     </w:lvl>
   </w:abstractNum>
-  <w:abstractNum w:abstractNumId="121" w15:restartNumberingAfterBreak="0">
+  <w:abstractNum w:abstractNumId="122" w15:restartNumberingAfterBreak="0">
     <w:nsid w:val="5773128C"/>
     <w:multiLevelType w:val="hybridMultilevel"/>
     <w:tmpl w:val="945E5C1E"/>
@@ -26870,7 +27716,7 @@
       </w:rPr>
     </w:lvl>
   </w:abstractNum>
-  <w:abstractNum w:abstractNumId="122" w15:restartNumberingAfterBreak="0">
+  <w:abstractNum w:abstractNumId="123" w15:restartNumberingAfterBreak="0">
     <w:nsid w:val="577F771B"/>
     <w:multiLevelType w:val="hybridMultilevel"/>
     <w:tmpl w:val="0F2C5914"/>
@@ -26982,7 +27828,7 @@
       </w:rPr>
     </w:lvl>
   </w:abstractNum>
-  <w:abstractNum w:abstractNumId="123" w15:restartNumberingAfterBreak="0">
+  <w:abstractNum w:abstractNumId="124" w15:restartNumberingAfterBreak="0">
     <w:nsid w:val="57C43CDD"/>
     <w:multiLevelType w:val="hybridMultilevel"/>
     <w:tmpl w:val="6C94FB5E"/>
@@ -27095,7 +27941,7 @@
       </w:rPr>
     </w:lvl>
   </w:abstractNum>
-  <w:abstractNum w:abstractNumId="124" w15:restartNumberingAfterBreak="0">
+  <w:abstractNum w:abstractNumId="125" w15:restartNumberingAfterBreak="0">
     <w:nsid w:val="58393977"/>
     <w:multiLevelType w:val="hybridMultilevel"/>
     <w:tmpl w:val="985A5484"/>
@@ -27208,7 +28054,7 @@
       </w:rPr>
     </w:lvl>
   </w:abstractNum>
-  <w:abstractNum w:abstractNumId="125" w15:restartNumberingAfterBreak="0">
+  <w:abstractNum w:abstractNumId="126" w15:restartNumberingAfterBreak="0">
     <w:nsid w:val="59AB4A55"/>
     <w:multiLevelType w:val="hybridMultilevel"/>
     <w:tmpl w:val="B6486CD6"/>
@@ -27321,7 +28167,7 @@
       </w:rPr>
     </w:lvl>
   </w:abstractNum>
-  <w:abstractNum w:abstractNumId="126" w15:restartNumberingAfterBreak="0">
+  <w:abstractNum w:abstractNumId="127" w15:restartNumberingAfterBreak="0">
     <w:nsid w:val="59EB4CE4"/>
     <w:multiLevelType w:val="multilevel"/>
     <w:tmpl w:val="63F4E6F0"/>
@@ -27470,7 +28316,7 @@
       </w:rPr>
     </w:lvl>
   </w:abstractNum>
-  <w:abstractNum w:abstractNumId="127" w15:restartNumberingAfterBreak="0">
+  <w:abstractNum w:abstractNumId="128" w15:restartNumberingAfterBreak="0">
     <w:nsid w:val="5BD11962"/>
     <w:multiLevelType w:val="hybridMultilevel"/>
     <w:tmpl w:val="89A4B834"/>
@@ -27559,7 +28405,7 @@
       </w:pPr>
     </w:lvl>
   </w:abstractNum>
-  <w:abstractNum w:abstractNumId="128" w15:restartNumberingAfterBreak="0">
+  <w:abstractNum w:abstractNumId="129" w15:restartNumberingAfterBreak="0">
     <w:nsid w:val="5C950DBA"/>
     <w:multiLevelType w:val="hybridMultilevel"/>
     <w:tmpl w:val="7D78F950"/>
@@ -27671,7 +28517,7 @@
       </w:rPr>
     </w:lvl>
   </w:abstractNum>
-  <w:abstractNum w:abstractNumId="129" w15:restartNumberingAfterBreak="0">
+  <w:abstractNum w:abstractNumId="130" w15:restartNumberingAfterBreak="0">
     <w:nsid w:val="5D2A5D3B"/>
     <w:multiLevelType w:val="hybridMultilevel"/>
     <w:tmpl w:val="3AF89EA6"/>
@@ -27762,7 +28608,7 @@
       </w:pPr>
     </w:lvl>
   </w:abstractNum>
-  <w:abstractNum w:abstractNumId="130" w15:restartNumberingAfterBreak="0">
+  <w:abstractNum w:abstractNumId="131" w15:restartNumberingAfterBreak="0">
     <w:nsid w:val="5D9E49FD"/>
     <w:multiLevelType w:val="hybridMultilevel"/>
     <w:tmpl w:val="4EE40BB4"/>
@@ -27874,7 +28720,7 @@
       </w:rPr>
     </w:lvl>
   </w:abstractNum>
-  <w:abstractNum w:abstractNumId="131" w15:restartNumberingAfterBreak="0">
+  <w:abstractNum w:abstractNumId="132" w15:restartNumberingAfterBreak="0">
     <w:nsid w:val="5DB7107D"/>
     <w:multiLevelType w:val="multilevel"/>
     <w:tmpl w:val="6520107A"/>
@@ -28023,7 +28869,7 @@
       </w:rPr>
     </w:lvl>
   </w:abstractNum>
-  <w:abstractNum w:abstractNumId="132" w15:restartNumberingAfterBreak="0">
+  <w:abstractNum w:abstractNumId="133" w15:restartNumberingAfterBreak="0">
     <w:nsid w:val="60421322"/>
     <w:multiLevelType w:val="hybridMultilevel"/>
     <w:tmpl w:val="447CDBDC"/>
@@ -28135,7 +28981,7 @@
       </w:rPr>
     </w:lvl>
   </w:abstractNum>
-  <w:abstractNum w:abstractNumId="133" w15:restartNumberingAfterBreak="0">
+  <w:abstractNum w:abstractNumId="134" w15:restartNumberingAfterBreak="0">
     <w:nsid w:val="60B43772"/>
     <w:multiLevelType w:val="hybridMultilevel"/>
     <w:tmpl w:val="04FC7310"/>
@@ -28249,7 +29095,7 @@
       </w:rPr>
     </w:lvl>
   </w:abstractNum>
-  <w:abstractNum w:abstractNumId="134" w15:restartNumberingAfterBreak="0">
+  <w:abstractNum w:abstractNumId="135" w15:restartNumberingAfterBreak="0">
     <w:nsid w:val="61926C31"/>
     <w:multiLevelType w:val="hybridMultilevel"/>
     <w:tmpl w:val="AFD27E5C"/>
@@ -28362,7 +29208,7 @@
       </w:rPr>
     </w:lvl>
   </w:abstractNum>
-  <w:abstractNum w:abstractNumId="135" w15:restartNumberingAfterBreak="0">
+  <w:abstractNum w:abstractNumId="136" w15:restartNumberingAfterBreak="0">
     <w:nsid w:val="622F5FC7"/>
     <w:multiLevelType w:val="hybridMultilevel"/>
     <w:tmpl w:val="49A6C2A6"/>
@@ -28475,7 +29321,7 @@
       </w:rPr>
     </w:lvl>
   </w:abstractNum>
-  <w:abstractNum w:abstractNumId="136" w15:restartNumberingAfterBreak="0">
+  <w:abstractNum w:abstractNumId="137" w15:restartNumberingAfterBreak="0">
     <w:nsid w:val="623A0E20"/>
     <w:multiLevelType w:val="hybridMultilevel"/>
     <w:tmpl w:val="3E360542"/>
@@ -28588,7 +29434,7 @@
       </w:rPr>
     </w:lvl>
   </w:abstractNum>
-  <w:abstractNum w:abstractNumId="137" w15:restartNumberingAfterBreak="0">
+  <w:abstractNum w:abstractNumId="138" w15:restartNumberingAfterBreak="0">
     <w:nsid w:val="62AC33B4"/>
     <w:multiLevelType w:val="multilevel"/>
     <w:tmpl w:val="A074F3CA"/>
@@ -28737,7 +29583,7 @@
       </w:rPr>
     </w:lvl>
   </w:abstractNum>
-  <w:abstractNum w:abstractNumId="138" w15:restartNumberingAfterBreak="0">
+  <w:abstractNum w:abstractNumId="139" w15:restartNumberingAfterBreak="0">
     <w:nsid w:val="63B44674"/>
     <w:multiLevelType w:val="multilevel"/>
     <w:tmpl w:val="08F4FA9A"/>
@@ -28886,7 +29732,7 @@
       </w:rPr>
     </w:lvl>
   </w:abstractNum>
-  <w:abstractNum w:abstractNumId="139" w15:restartNumberingAfterBreak="0">
+  <w:abstractNum w:abstractNumId="140" w15:restartNumberingAfterBreak="0">
     <w:nsid w:val="63C245D4"/>
     <w:multiLevelType w:val="hybridMultilevel"/>
     <w:tmpl w:val="E1563A56"/>
@@ -28998,7 +29844,7 @@
       </w:rPr>
     </w:lvl>
   </w:abstractNum>
-  <w:abstractNum w:abstractNumId="140" w15:restartNumberingAfterBreak="0">
+  <w:abstractNum w:abstractNumId="141" w15:restartNumberingAfterBreak="0">
     <w:nsid w:val="645F5F11"/>
     <w:multiLevelType w:val="hybridMultilevel"/>
     <w:tmpl w:val="D3423512"/>
@@ -29111,7 +29957,7 @@
       </w:rPr>
     </w:lvl>
   </w:abstractNum>
-  <w:abstractNum w:abstractNumId="141" w15:restartNumberingAfterBreak="0">
+  <w:abstractNum w:abstractNumId="142" w15:restartNumberingAfterBreak="0">
     <w:nsid w:val="64F30198"/>
     <w:multiLevelType w:val="multilevel"/>
     <w:tmpl w:val="63F4E6F0"/>
@@ -29260,7 +30106,7 @@
       </w:rPr>
     </w:lvl>
   </w:abstractNum>
-  <w:abstractNum w:abstractNumId="142" w15:restartNumberingAfterBreak="0">
+  <w:abstractNum w:abstractNumId="143" w15:restartNumberingAfterBreak="0">
     <w:nsid w:val="65AF2502"/>
     <w:multiLevelType w:val="hybridMultilevel"/>
     <w:tmpl w:val="FB2A44D8"/>
@@ -29373,7 +30219,7 @@
       </w:rPr>
     </w:lvl>
   </w:abstractNum>
-  <w:abstractNum w:abstractNumId="143" w15:restartNumberingAfterBreak="0">
+  <w:abstractNum w:abstractNumId="144" w15:restartNumberingAfterBreak="0">
     <w:nsid w:val="65E53C08"/>
     <w:multiLevelType w:val="hybridMultilevel"/>
     <w:tmpl w:val="8A44FBE2"/>
@@ -29486,7 +30332,7 @@
       </w:rPr>
     </w:lvl>
   </w:abstractNum>
-  <w:abstractNum w:abstractNumId="144" w15:restartNumberingAfterBreak="0">
+  <w:abstractNum w:abstractNumId="145" w15:restartNumberingAfterBreak="0">
     <w:nsid w:val="671614F0"/>
     <w:multiLevelType w:val="multilevel"/>
     <w:tmpl w:val="63F4E6F0"/>
@@ -29635,7 +30481,7 @@
       </w:rPr>
     </w:lvl>
   </w:abstractNum>
-  <w:abstractNum w:abstractNumId="145" w15:restartNumberingAfterBreak="0">
+  <w:abstractNum w:abstractNumId="146" w15:restartNumberingAfterBreak="0">
     <w:nsid w:val="6859691D"/>
     <w:multiLevelType w:val="multilevel"/>
     <w:tmpl w:val="826A9D48"/>
@@ -29784,7 +30630,7 @@
       </w:rPr>
     </w:lvl>
   </w:abstractNum>
-  <w:abstractNum w:abstractNumId="146" w15:restartNumberingAfterBreak="0">
+  <w:abstractNum w:abstractNumId="147" w15:restartNumberingAfterBreak="0">
     <w:nsid w:val="68817757"/>
     <w:multiLevelType w:val="multilevel"/>
     <w:tmpl w:val="34EE1968"/>
@@ -29933,7 +30779,7 @@
       </w:rPr>
     </w:lvl>
   </w:abstractNum>
-  <w:abstractNum w:abstractNumId="147" w15:restartNumberingAfterBreak="0">
+  <w:abstractNum w:abstractNumId="148" w15:restartNumberingAfterBreak="0">
     <w:nsid w:val="68BE10E8"/>
     <w:multiLevelType w:val="hybridMultilevel"/>
     <w:tmpl w:val="326CD592"/>
@@ -30046,7 +30892,7 @@
       </w:rPr>
     </w:lvl>
   </w:abstractNum>
-  <w:abstractNum w:abstractNumId="148" w15:restartNumberingAfterBreak="0">
+  <w:abstractNum w:abstractNumId="149" w15:restartNumberingAfterBreak="0">
     <w:nsid w:val="69996D9A"/>
     <w:multiLevelType w:val="multilevel"/>
     <w:tmpl w:val="1780FC38"/>
@@ -30195,7 +31041,7 @@
       </w:rPr>
     </w:lvl>
   </w:abstractNum>
-  <w:abstractNum w:abstractNumId="149" w15:restartNumberingAfterBreak="0">
+  <w:abstractNum w:abstractNumId="150" w15:restartNumberingAfterBreak="0">
     <w:nsid w:val="6B3C30B9"/>
     <w:multiLevelType w:val="hybridMultilevel"/>
     <w:tmpl w:val="C938F8DE"/>
@@ -30307,7 +31153,7 @@
       </w:rPr>
     </w:lvl>
   </w:abstractNum>
-  <w:abstractNum w:abstractNumId="150" w15:restartNumberingAfterBreak="0">
+  <w:abstractNum w:abstractNumId="151" w15:restartNumberingAfterBreak="0">
     <w:nsid w:val="6D1511A0"/>
     <w:multiLevelType w:val="hybridMultilevel"/>
     <w:tmpl w:val="AAD8B9B4"/>
@@ -30419,7 +31265,7 @@
       </w:rPr>
     </w:lvl>
   </w:abstractNum>
-  <w:abstractNum w:abstractNumId="151" w15:restartNumberingAfterBreak="0">
+  <w:abstractNum w:abstractNumId="152" w15:restartNumberingAfterBreak="0">
     <w:nsid w:val="6DD255F1"/>
     <w:multiLevelType w:val="hybridMultilevel"/>
     <w:tmpl w:val="ACBC1404"/>
@@ -30532,7 +31378,7 @@
       </w:rPr>
     </w:lvl>
   </w:abstractNum>
-  <w:abstractNum w:abstractNumId="152" w15:restartNumberingAfterBreak="0">
+  <w:abstractNum w:abstractNumId="153" w15:restartNumberingAfterBreak="0">
     <w:nsid w:val="6DDB4404"/>
     <w:multiLevelType w:val="hybridMultilevel"/>
     <w:tmpl w:val="06428E32"/>
@@ -30645,7 +31491,120 @@
       </w:rPr>
     </w:lvl>
   </w:abstractNum>
-  <w:abstractNum w:abstractNumId="153" w15:restartNumberingAfterBreak="0">
+  <w:abstractNum w:abstractNumId="154" w15:restartNumberingAfterBreak="0">
+    <w:nsid w:val="6EE2159D"/>
+    <w:multiLevelType w:val="hybridMultilevel"/>
+    <w:tmpl w:val="36C69320"/>
+    <w:lvl w:ilvl="0" w:tplc="04090005">
+      <w:start w:val="1"/>
+      <w:numFmt w:val="bullet"/>
+      <w:lvlText w:val=""/>
+      <w:lvlJc w:val="left"/>
+      <w:pPr>
+        <w:ind w:left="720" w:hanging="360"/>
+      </w:pPr>
+      <w:rPr>
+        <w:rFonts w:ascii="Wingdings" w:hAnsi="Wingdings" w:hint="default"/>
+      </w:rPr>
+    </w:lvl>
+    <w:lvl w:ilvl="1" w:tplc="FFFFFFFF" w:tentative="1">
+      <w:start w:val="1"/>
+      <w:numFmt w:val="bullet"/>
+      <w:lvlText w:val="o"/>
+      <w:lvlJc w:val="left"/>
+      <w:pPr>
+        <w:ind w:left="1440" w:hanging="360"/>
+      </w:pPr>
+      <w:rPr>
+        <w:rFonts w:ascii="Courier New" w:hAnsi="Courier New" w:cs="Courier New" w:hint="default"/>
+      </w:rPr>
+    </w:lvl>
+    <w:lvl w:ilvl="2" w:tplc="FFFFFFFF" w:tentative="1">
+      <w:start w:val="1"/>
+      <w:numFmt w:val="bullet"/>
+      <w:lvlText w:val=""/>
+      <w:lvlJc w:val="left"/>
+      <w:pPr>
+        <w:ind w:left="2160" w:hanging="360"/>
+      </w:pPr>
+      <w:rPr>
+        <w:rFonts w:ascii="Wingdings" w:hAnsi="Wingdings" w:hint="default"/>
+      </w:rPr>
+    </w:lvl>
+    <w:lvl w:ilvl="3" w:tplc="FFFFFFFF" w:tentative="1">
+      <w:start w:val="1"/>
+      <w:numFmt w:val="bullet"/>
+      <w:lvlText w:val=""/>
+      <w:lvlJc w:val="left"/>
+      <w:pPr>
+        <w:ind w:left="2880" w:hanging="360"/>
+      </w:pPr>
+      <w:rPr>
+        <w:rFonts w:ascii="Symbol" w:hAnsi="Symbol" w:hint="default"/>
+      </w:rPr>
+    </w:lvl>
+    <w:lvl w:ilvl="4" w:tplc="FFFFFFFF" w:tentative="1">
+      <w:start w:val="1"/>
+      <w:numFmt w:val="bullet"/>
+      <w:lvlText w:val="o"/>
+      <w:lvlJc w:val="left"/>
+      <w:pPr>
+        <w:ind w:left="3600" w:hanging="360"/>
+      </w:pPr>
+      <w:rPr>
+        <w:rFonts w:ascii="Courier New" w:hAnsi="Courier New" w:cs="Courier New" w:hint="default"/>
+      </w:rPr>
+    </w:lvl>
+    <w:lvl w:ilvl="5" w:tplc="FFFFFFFF" w:tentative="1">
+      <w:start w:val="1"/>
+      <w:numFmt w:val="bullet"/>
+      <w:lvlText w:val=""/>
+      <w:lvlJc w:val="left"/>
+      <w:pPr>
+        <w:ind w:left="4320" w:hanging="360"/>
+      </w:pPr>
+      <w:rPr>
+        <w:rFonts w:ascii="Wingdings" w:hAnsi="Wingdings" w:hint="default"/>
+      </w:rPr>
+    </w:lvl>
+    <w:lvl w:ilvl="6" w:tplc="FFFFFFFF" w:tentative="1">
+      <w:start w:val="1"/>
+      <w:numFmt w:val="bullet"/>
+      <w:lvlText w:val=""/>
+      <w:lvlJc w:val="left"/>
+      <w:pPr>
+        <w:ind w:left="5040" w:hanging="360"/>
+      </w:pPr>
+      <w:rPr>
+        <w:rFonts w:ascii="Symbol" w:hAnsi="Symbol" w:hint="default"/>
+      </w:rPr>
+    </w:lvl>
+    <w:lvl w:ilvl="7" w:tplc="FFFFFFFF" w:tentative="1">
+      <w:start w:val="1"/>
+      <w:numFmt w:val="bullet"/>
+      <w:lvlText w:val="o"/>
+      <w:lvlJc w:val="left"/>
+      <w:pPr>
+        <w:ind w:left="5760" w:hanging="360"/>
+      </w:pPr>
+      <w:rPr>
+        <w:rFonts w:ascii="Courier New" w:hAnsi="Courier New" w:cs="Courier New" w:hint="default"/>
+      </w:rPr>
+    </w:lvl>
+    <w:lvl w:ilvl="8" w:tplc="FFFFFFFF" w:tentative="1">
+      <w:start w:val="1"/>
+      <w:numFmt w:val="bullet"/>
+      <w:lvlText w:val=""/>
+      <w:lvlJc w:val="left"/>
+      <w:pPr>
+        <w:ind w:left="6480" w:hanging="360"/>
+      </w:pPr>
+      <w:rPr>
+        <w:rFonts w:ascii="Wingdings" w:hAnsi="Wingdings" w:hint="default"/>
+      </w:rPr>
+    </w:lvl>
+  </w:abstractNum>
+  <w:abstractNum w:abstractNumId="155" w15:restartNumberingAfterBreak="0">
     <w:nsid w:val="6F014B3B"/>
     <w:multiLevelType w:val="hybridMultilevel"/>
     <w:tmpl w:val="C89A39BE"/>
@@ -30757,7 +31716,7 @@
       </w:rPr>
     </w:lvl>
   </w:abstractNum>
-  <w:abstractNum w:abstractNumId="154" w15:restartNumberingAfterBreak="0">
+  <w:abstractNum w:abstractNumId="156" w15:restartNumberingAfterBreak="0">
     <w:nsid w:val="6F171273"/>
     <w:multiLevelType w:val="multilevel"/>
     <w:tmpl w:val="0240C564"/>
@@ -30906,7 +31865,7 @@
       </w:rPr>
     </w:lvl>
   </w:abstractNum>
-  <w:abstractNum w:abstractNumId="155" w15:restartNumberingAfterBreak="0">
+  <w:abstractNum w:abstractNumId="157" w15:restartNumberingAfterBreak="0">
     <w:nsid w:val="6FB82AAA"/>
     <w:multiLevelType w:val="multilevel"/>
     <w:tmpl w:val="FC46C7C0"/>
@@ -31055,7 +32014,7 @@
       </w:rPr>
     </w:lvl>
   </w:abstractNum>
-  <w:abstractNum w:abstractNumId="156" w15:restartNumberingAfterBreak="0">
+  <w:abstractNum w:abstractNumId="158" w15:restartNumberingAfterBreak="0">
     <w:nsid w:val="6FD46DCF"/>
     <w:multiLevelType w:val="hybridMultilevel"/>
     <w:tmpl w:val="EF5E6EC6"/>
@@ -31168,7 +32127,7 @@
       </w:rPr>
     </w:lvl>
   </w:abstractNum>
-  <w:abstractNum w:abstractNumId="157" w15:restartNumberingAfterBreak="0">
+  <w:abstractNum w:abstractNumId="159" w15:restartNumberingAfterBreak="0">
     <w:nsid w:val="70484E38"/>
     <w:multiLevelType w:val="multilevel"/>
     <w:tmpl w:val="22B26DD2"/>
@@ -31317,7 +32276,7 @@
       </w:rPr>
     </w:lvl>
   </w:abstractNum>
-  <w:abstractNum w:abstractNumId="158" w15:restartNumberingAfterBreak="0">
+  <w:abstractNum w:abstractNumId="160" w15:restartNumberingAfterBreak="0">
     <w:nsid w:val="70CB723E"/>
     <w:multiLevelType w:val="multilevel"/>
     <w:tmpl w:val="63F4E6F0"/>
@@ -31466,7 +32425,7 @@
       </w:rPr>
     </w:lvl>
   </w:abstractNum>
-  <w:abstractNum w:abstractNumId="159" w15:restartNumberingAfterBreak="0">
+  <w:abstractNum w:abstractNumId="161" w15:restartNumberingAfterBreak="0">
     <w:nsid w:val="71C028F7"/>
     <w:multiLevelType w:val="hybridMultilevel"/>
     <w:tmpl w:val="85104F0A"/>
@@ -31579,7 +32538,7 @@
       </w:rPr>
     </w:lvl>
   </w:abstractNum>
-  <w:abstractNum w:abstractNumId="160" w15:restartNumberingAfterBreak="0">
+  <w:abstractNum w:abstractNumId="162" w15:restartNumberingAfterBreak="0">
     <w:nsid w:val="71DB3F58"/>
     <w:multiLevelType w:val="multilevel"/>
     <w:tmpl w:val="63F4E6F0"/>
@@ -31728,7 +32687,7 @@
       </w:rPr>
     </w:lvl>
   </w:abstractNum>
-  <w:abstractNum w:abstractNumId="161" w15:restartNumberingAfterBreak="0">
+  <w:abstractNum w:abstractNumId="163" w15:restartNumberingAfterBreak="0">
     <w:nsid w:val="720D204A"/>
     <w:multiLevelType w:val="hybridMultilevel"/>
     <w:tmpl w:val="70D646D0"/>
@@ -31842,7 +32801,7 @@
       </w:rPr>
     </w:lvl>
   </w:abstractNum>
-  <w:abstractNum w:abstractNumId="162" w15:restartNumberingAfterBreak="0">
+  <w:abstractNum w:abstractNumId="164" w15:restartNumberingAfterBreak="0">
     <w:nsid w:val="72F31FF2"/>
     <w:multiLevelType w:val="hybridMultilevel"/>
     <w:tmpl w:val="5C2693A0"/>
@@ -31954,7 +32913,7 @@
       </w:rPr>
     </w:lvl>
   </w:abstractNum>
-  <w:abstractNum w:abstractNumId="163" w15:restartNumberingAfterBreak="0">
+  <w:abstractNum w:abstractNumId="165" w15:restartNumberingAfterBreak="0">
     <w:nsid w:val="73B82579"/>
     <w:multiLevelType w:val="hybridMultilevel"/>
     <w:tmpl w:val="B8E8229C"/>
@@ -32067,7 +33026,7 @@
       </w:rPr>
     </w:lvl>
   </w:abstractNum>
-  <w:abstractNum w:abstractNumId="164" w15:restartNumberingAfterBreak="0">
+  <w:abstractNum w:abstractNumId="166" w15:restartNumberingAfterBreak="0">
     <w:nsid w:val="74522E8F"/>
     <w:multiLevelType w:val="hybridMultilevel"/>
     <w:tmpl w:val="9B1C2096"/>
@@ -32180,7 +33139,7 @@
       </w:rPr>
     </w:lvl>
   </w:abstractNum>
-  <w:abstractNum w:abstractNumId="165" w15:restartNumberingAfterBreak="0">
+  <w:abstractNum w:abstractNumId="167" w15:restartNumberingAfterBreak="0">
     <w:nsid w:val="75B45140"/>
     <w:multiLevelType w:val="hybridMultilevel"/>
     <w:tmpl w:val="93F8F3C4"/>
@@ -32293,7 +33252,7 @@
       </w:rPr>
     </w:lvl>
   </w:abstractNum>
-  <w:abstractNum w:abstractNumId="166" w15:restartNumberingAfterBreak="0">
+  <w:abstractNum w:abstractNumId="168" w15:restartNumberingAfterBreak="0">
     <w:nsid w:val="76F60FFE"/>
     <w:multiLevelType w:val="multilevel"/>
     <w:tmpl w:val="63F4E6F0"/>
@@ -32442,7 +33401,7 @@
       </w:rPr>
     </w:lvl>
   </w:abstractNum>
-  <w:abstractNum w:abstractNumId="167" w15:restartNumberingAfterBreak="0">
+  <w:abstractNum w:abstractNumId="169" w15:restartNumberingAfterBreak="0">
     <w:nsid w:val="77572323"/>
     <w:multiLevelType w:val="multilevel"/>
     <w:tmpl w:val="63F4E6F0"/>
@@ -32591,7 +33550,7 @@
       </w:rPr>
     </w:lvl>
   </w:abstractNum>
-  <w:abstractNum w:abstractNumId="168" w15:restartNumberingAfterBreak="0">
+  <w:abstractNum w:abstractNumId="170" w15:restartNumberingAfterBreak="0">
     <w:nsid w:val="77B8201F"/>
     <w:multiLevelType w:val="hybridMultilevel"/>
     <w:tmpl w:val="D7160708"/>
@@ -32703,7 +33662,7 @@
       </w:rPr>
     </w:lvl>
   </w:abstractNum>
-  <w:abstractNum w:abstractNumId="169" w15:restartNumberingAfterBreak="0">
+  <w:abstractNum w:abstractNumId="171" w15:restartNumberingAfterBreak="0">
     <w:nsid w:val="79796FF9"/>
     <w:multiLevelType w:val="hybridMultilevel"/>
     <w:tmpl w:val="CFA8EF82"/>
@@ -32815,7 +33774,7 @@
       </w:rPr>
     </w:lvl>
   </w:abstractNum>
-  <w:abstractNum w:abstractNumId="170" w15:restartNumberingAfterBreak="0">
+  <w:abstractNum w:abstractNumId="172" w15:restartNumberingAfterBreak="0">
     <w:nsid w:val="79910410"/>
     <w:multiLevelType w:val="hybridMultilevel"/>
     <w:tmpl w:val="FC923542"/>
@@ -32927,7 +33886,7 @@
       </w:rPr>
     </w:lvl>
   </w:abstractNum>
-  <w:abstractNum w:abstractNumId="171" w15:restartNumberingAfterBreak="0">
+  <w:abstractNum w:abstractNumId="173" w15:restartNumberingAfterBreak="0">
     <w:nsid w:val="7AD51679"/>
     <w:multiLevelType w:val="hybridMultilevel"/>
     <w:tmpl w:val="C13E19C2"/>
@@ -33040,7 +33999,7 @@
       </w:rPr>
     </w:lvl>
   </w:abstractNum>
-  <w:abstractNum w:abstractNumId="172" w15:restartNumberingAfterBreak="0">
+  <w:abstractNum w:abstractNumId="174" w15:restartNumberingAfterBreak="0">
     <w:nsid w:val="7AFF575A"/>
     <w:multiLevelType w:val="hybridMultilevel"/>
     <w:tmpl w:val="A6323D3E"/>
@@ -33152,7 +34111,7 @@
       </w:rPr>
     </w:lvl>
   </w:abstractNum>
-  <w:abstractNum w:abstractNumId="173" w15:restartNumberingAfterBreak="0">
+  <w:abstractNum w:abstractNumId="175" w15:restartNumberingAfterBreak="0">
     <w:nsid w:val="7B4018BF"/>
     <w:multiLevelType w:val="multilevel"/>
     <w:tmpl w:val="63F4E6F0"/>
@@ -33301,7 +34260,7 @@
       </w:rPr>
     </w:lvl>
   </w:abstractNum>
-  <w:abstractNum w:abstractNumId="174" w15:restartNumberingAfterBreak="0">
+  <w:abstractNum w:abstractNumId="176" w15:restartNumberingAfterBreak="0">
     <w:nsid w:val="7B4D1B33"/>
     <w:multiLevelType w:val="hybridMultilevel"/>
     <w:tmpl w:val="5EAC717E"/>
@@ -33413,7 +34372,7 @@
       </w:rPr>
     </w:lvl>
   </w:abstractNum>
-  <w:abstractNum w:abstractNumId="175" w15:restartNumberingAfterBreak="0">
+  <w:abstractNum w:abstractNumId="177" w15:restartNumberingAfterBreak="0">
     <w:nsid w:val="7C437108"/>
     <w:multiLevelType w:val="hybridMultilevel"/>
     <w:tmpl w:val="3222D0E8"/>
@@ -33526,7 +34485,7 @@
       </w:rPr>
     </w:lvl>
   </w:abstractNum>
-  <w:abstractNum w:abstractNumId="176" w15:restartNumberingAfterBreak="0">
+  <w:abstractNum w:abstractNumId="178" w15:restartNumberingAfterBreak="0">
     <w:nsid w:val="7CAC27CD"/>
     <w:multiLevelType w:val="multilevel"/>
     <w:tmpl w:val="3BC20E58"/>
@@ -33675,7 +34634,7 @@
       </w:rPr>
     </w:lvl>
   </w:abstractNum>
-  <w:abstractNum w:abstractNumId="177" w15:restartNumberingAfterBreak="0">
+  <w:abstractNum w:abstractNumId="179" w15:restartNumberingAfterBreak="0">
     <w:nsid w:val="7DBE326E"/>
     <w:multiLevelType w:val="hybridMultilevel"/>
     <w:tmpl w:val="AFC0D8D6"/>
@@ -33788,7 +34747,7 @@
       </w:rPr>
     </w:lvl>
   </w:abstractNum>
-  <w:abstractNum w:abstractNumId="178" w15:restartNumberingAfterBreak="0">
+  <w:abstractNum w:abstractNumId="180" w15:restartNumberingAfterBreak="0">
     <w:nsid w:val="7E5978EA"/>
     <w:multiLevelType w:val="hybridMultilevel"/>
     <w:tmpl w:val="D74C0DB0"/>
@@ -33900,7 +34859,7 @@
       </w:rPr>
     </w:lvl>
   </w:abstractNum>
-  <w:abstractNum w:abstractNumId="179" w15:restartNumberingAfterBreak="0">
+  <w:abstractNum w:abstractNumId="181" w15:restartNumberingAfterBreak="0">
     <w:nsid w:val="7F106A5D"/>
     <w:multiLevelType w:val="hybridMultilevel"/>
     <w:tmpl w:val="A1CA4816"/>
@@ -34012,7 +34971,7 @@
       </w:rPr>
     </w:lvl>
   </w:abstractNum>
-  <w:abstractNum w:abstractNumId="180" w15:restartNumberingAfterBreak="0">
+  <w:abstractNum w:abstractNumId="182" w15:restartNumberingAfterBreak="0">
     <w:nsid w:val="7FD679F5"/>
     <w:multiLevelType w:val="hybridMultilevel"/>
     <w:tmpl w:val="1ED417E8"/>
@@ -34126,7 +35085,7 @@
     </w:lvl>
   </w:abstractNum>
   <w:num w:numId="1" w16cid:durableId="1882476756">
-    <w:abstractNumId w:val="100"/>
+    <w:abstractNumId w:val="101"/>
   </w:num>
   <w:num w:numId="2" w16cid:durableId="871453468">
     <w:abstractNumId w:val="26"/>
@@ -34135,43 +35094,43 @@
     <w:abstractNumId w:val="42"/>
   </w:num>
   <w:num w:numId="4" w16cid:durableId="1105467722">
-    <w:abstractNumId w:val="81"/>
+    <w:abstractNumId w:val="82"/>
   </w:num>
   <w:num w:numId="5" w16cid:durableId="769932622">
-    <w:abstractNumId w:val="119"/>
+    <w:abstractNumId w:val="120"/>
   </w:num>
   <w:num w:numId="6" w16cid:durableId="575944109">
     <w:abstractNumId w:val="46"/>
   </w:num>
   <w:num w:numId="7" w16cid:durableId="877661689">
-    <w:abstractNumId w:val="157"/>
+    <w:abstractNumId w:val="159"/>
   </w:num>
   <w:num w:numId="8" w16cid:durableId="1390107422">
-    <w:abstractNumId w:val="87"/>
+    <w:abstractNumId w:val="88"/>
   </w:num>
   <w:num w:numId="9" w16cid:durableId="881866424">
-    <w:abstractNumId w:val="116"/>
+    <w:abstractNumId w:val="117"/>
   </w:num>
   <w:num w:numId="10" w16cid:durableId="1037244995">
-    <w:abstractNumId w:val="148"/>
+    <w:abstractNumId w:val="149"/>
   </w:num>
   <w:num w:numId="11" w16cid:durableId="1575554597">
     <w:abstractNumId w:val="70"/>
   </w:num>
   <w:num w:numId="12" w16cid:durableId="915364478">
-    <w:abstractNumId w:val="96"/>
+    <w:abstractNumId w:val="97"/>
   </w:num>
   <w:num w:numId="13" w16cid:durableId="1386294114">
-    <w:abstractNumId w:val="138"/>
+    <w:abstractNumId w:val="139"/>
   </w:num>
   <w:num w:numId="14" w16cid:durableId="1071851223">
     <w:abstractNumId w:val="28"/>
   </w:num>
   <w:num w:numId="15" w16cid:durableId="1545557520">
-    <w:abstractNumId w:val="82"/>
+    <w:abstractNumId w:val="83"/>
   </w:num>
   <w:num w:numId="16" w16cid:durableId="1102919547">
-    <w:abstractNumId w:val="176"/>
+    <w:abstractNumId w:val="178"/>
   </w:num>
   <w:num w:numId="17" w16cid:durableId="294526838">
     <w:abstractNumId w:val="58"/>
@@ -34180,7 +35139,7 @@
     <w:abstractNumId w:val="67"/>
   </w:num>
   <w:num w:numId="19" w16cid:durableId="2119449470">
-    <w:abstractNumId w:val="112"/>
+    <w:abstractNumId w:val="113"/>
   </w:num>
   <w:num w:numId="20" w16cid:durableId="1365054799">
     <w:abstractNumId w:val="15"/>
@@ -34189,19 +35148,19 @@
     <w:abstractNumId w:val="68"/>
   </w:num>
   <w:num w:numId="22" w16cid:durableId="1080098953">
-    <w:abstractNumId w:val="145"/>
+    <w:abstractNumId w:val="146"/>
   </w:num>
   <w:num w:numId="23" w16cid:durableId="1635717296">
-    <w:abstractNumId w:val="74"/>
+    <w:abstractNumId w:val="75"/>
   </w:num>
   <w:num w:numId="24" w16cid:durableId="544873123">
-    <w:abstractNumId w:val="137"/>
+    <w:abstractNumId w:val="138"/>
   </w:num>
   <w:num w:numId="25" w16cid:durableId="1128352778">
     <w:abstractNumId w:val="14"/>
   </w:num>
   <w:num w:numId="26" w16cid:durableId="1732537407">
-    <w:abstractNumId w:val="152"/>
+    <w:abstractNumId w:val="153"/>
   </w:num>
   <w:num w:numId="27" w16cid:durableId="945502064">
     <w:abstractNumId w:val="8"/>
@@ -34213,7 +35172,7 @@
     <w:abstractNumId w:val="66"/>
   </w:num>
   <w:num w:numId="30" w16cid:durableId="1500659483">
-    <w:abstractNumId w:val="92"/>
+    <w:abstractNumId w:val="93"/>
   </w:num>
   <w:num w:numId="31" w16cid:durableId="118301211">
     <w:abstractNumId w:val="17"/>
@@ -34228,43 +35187,43 @@
     <w:abstractNumId w:val="53"/>
   </w:num>
   <w:num w:numId="35" w16cid:durableId="356852923">
-    <w:abstractNumId w:val="111"/>
+    <w:abstractNumId w:val="112"/>
   </w:num>
   <w:num w:numId="36" w16cid:durableId="430662559">
     <w:abstractNumId w:val="22"/>
   </w:num>
   <w:num w:numId="37" w16cid:durableId="247080868">
-    <w:abstractNumId w:val="165"/>
+    <w:abstractNumId w:val="167"/>
   </w:num>
   <w:num w:numId="38" w16cid:durableId="158887408">
-    <w:abstractNumId w:val="134"/>
+    <w:abstractNumId w:val="135"/>
   </w:num>
   <w:num w:numId="39" w16cid:durableId="1681347932">
-    <w:abstractNumId w:val="156"/>
+    <w:abstractNumId w:val="158"/>
   </w:num>
   <w:num w:numId="40" w16cid:durableId="2101440158">
-    <w:abstractNumId w:val="85"/>
+    <w:abstractNumId w:val="86"/>
   </w:num>
   <w:num w:numId="41" w16cid:durableId="1250391122">
-    <w:abstractNumId w:val="129"/>
+    <w:abstractNumId w:val="130"/>
   </w:num>
   <w:num w:numId="42" w16cid:durableId="479083359">
-    <w:abstractNumId w:val="162"/>
+    <w:abstractNumId w:val="164"/>
   </w:num>
   <w:num w:numId="43" w16cid:durableId="1557860317">
-    <w:abstractNumId w:val="113"/>
+    <w:abstractNumId w:val="114"/>
   </w:num>
   <w:num w:numId="44" w16cid:durableId="2142183763">
     <w:abstractNumId w:val="10"/>
   </w:num>
   <w:num w:numId="45" w16cid:durableId="1357736349">
-    <w:abstractNumId w:val="170"/>
+    <w:abstractNumId w:val="172"/>
   </w:num>
   <w:num w:numId="46" w16cid:durableId="1519656040">
-    <w:abstractNumId w:val="169"/>
+    <w:abstractNumId w:val="171"/>
   </w:num>
   <w:num w:numId="47" w16cid:durableId="1078596852">
-    <w:abstractNumId w:val="179"/>
+    <w:abstractNumId w:val="181"/>
   </w:num>
   <w:num w:numId="48" w16cid:durableId="1027950100">
     <w:abstractNumId w:val="39"/>
@@ -34273,22 +35232,22 @@
     <w:abstractNumId w:val="21"/>
   </w:num>
   <w:num w:numId="50" w16cid:durableId="363404927">
-    <w:abstractNumId w:val="75"/>
+    <w:abstractNumId w:val="76"/>
   </w:num>
   <w:num w:numId="51" w16cid:durableId="1128354320">
-    <w:abstractNumId w:val="150"/>
+    <w:abstractNumId w:val="151"/>
   </w:num>
   <w:num w:numId="52" w16cid:durableId="248543928">
-    <w:abstractNumId w:val="84"/>
+    <w:abstractNumId w:val="85"/>
   </w:num>
   <w:num w:numId="53" w16cid:durableId="965889214">
-    <w:abstractNumId w:val="117"/>
+    <w:abstractNumId w:val="118"/>
   </w:num>
   <w:num w:numId="54" w16cid:durableId="1827503240">
-    <w:abstractNumId w:val="127"/>
+    <w:abstractNumId w:val="128"/>
   </w:num>
   <w:num w:numId="55" w16cid:durableId="505748256">
-    <w:abstractNumId w:val="106"/>
+    <w:abstractNumId w:val="107"/>
   </w:num>
   <w:num w:numId="56" w16cid:durableId="2120370925">
     <w:abstractNumId w:val="36"/>
@@ -34297,52 +35256,52 @@
     <w:abstractNumId w:val="18"/>
   </w:num>
   <w:num w:numId="58" w16cid:durableId="1000235123">
-    <w:abstractNumId w:val="114"/>
+    <w:abstractNumId w:val="115"/>
   </w:num>
   <w:num w:numId="59" w16cid:durableId="628516409">
-    <w:abstractNumId w:val="149"/>
+    <w:abstractNumId w:val="150"/>
   </w:num>
   <w:num w:numId="60" w16cid:durableId="2028865444">
-    <w:abstractNumId w:val="102"/>
+    <w:abstractNumId w:val="103"/>
   </w:num>
   <w:num w:numId="61" w16cid:durableId="943926811">
-    <w:abstractNumId w:val="174"/>
+    <w:abstractNumId w:val="176"/>
   </w:num>
   <w:num w:numId="62" w16cid:durableId="1841193257">
-    <w:abstractNumId w:val="77"/>
+    <w:abstractNumId w:val="78"/>
   </w:num>
   <w:num w:numId="63" w16cid:durableId="682322850">
-    <w:abstractNumId w:val="153"/>
+    <w:abstractNumId w:val="155"/>
   </w:num>
   <w:num w:numId="64" w16cid:durableId="2043705333">
-    <w:abstractNumId w:val="78"/>
+    <w:abstractNumId w:val="79"/>
   </w:num>
   <w:num w:numId="65" w16cid:durableId="1164854761">
     <w:abstractNumId w:val="57"/>
   </w:num>
   <w:num w:numId="66" w16cid:durableId="1919972541">
-    <w:abstractNumId w:val="98"/>
+    <w:abstractNumId w:val="99"/>
   </w:num>
   <w:num w:numId="67" w16cid:durableId="463617329">
     <w:abstractNumId w:val="61"/>
   </w:num>
   <w:num w:numId="68" w16cid:durableId="2064014330">
-    <w:abstractNumId w:val="122"/>
+    <w:abstractNumId w:val="123"/>
   </w:num>
   <w:num w:numId="69" w16cid:durableId="452797354">
-    <w:abstractNumId w:val="128"/>
+    <w:abstractNumId w:val="129"/>
   </w:num>
   <w:num w:numId="70" w16cid:durableId="1196650037">
     <w:abstractNumId w:val="51"/>
   </w:num>
   <w:num w:numId="71" w16cid:durableId="940071828">
-    <w:abstractNumId w:val="168"/>
+    <w:abstractNumId w:val="170"/>
   </w:num>
   <w:num w:numId="72" w16cid:durableId="1608273926">
-    <w:abstractNumId w:val="80"/>
+    <w:abstractNumId w:val="81"/>
   </w:num>
   <w:num w:numId="73" w16cid:durableId="2009864772">
-    <w:abstractNumId w:val="99"/>
+    <w:abstractNumId w:val="100"/>
   </w:num>
   <w:num w:numId="74" w16cid:durableId="712267004">
     <w:abstractNumId w:val="38"/>
@@ -34351,7 +35310,7 @@
     <w:abstractNumId w:val="33"/>
   </w:num>
   <w:num w:numId="76" w16cid:durableId="286202349">
-    <w:abstractNumId w:val="132"/>
+    <w:abstractNumId w:val="133"/>
   </w:num>
   <w:num w:numId="77" w16cid:durableId="156460757">
     <w:abstractNumId w:val="71"/>
@@ -34366,7 +35325,7 @@
     <w:abstractNumId w:val="37"/>
   </w:num>
   <w:num w:numId="81" w16cid:durableId="1672175260">
-    <w:abstractNumId w:val="94"/>
+    <w:abstractNumId w:val="95"/>
   </w:num>
   <w:num w:numId="82" w16cid:durableId="1954820163">
     <w:abstractNumId w:val="60"/>
@@ -34375,7 +35334,7 @@
     <w:abstractNumId w:val="24"/>
   </w:num>
   <w:num w:numId="84" w16cid:durableId="366876741">
-    <w:abstractNumId w:val="101"/>
+    <w:abstractNumId w:val="102"/>
   </w:num>
   <w:num w:numId="85" w16cid:durableId="15274915">
     <w:abstractNumId w:val="40"/>
@@ -34384,22 +35343,22 @@
     <w:abstractNumId w:val="11"/>
   </w:num>
   <w:num w:numId="87" w16cid:durableId="591351385">
-    <w:abstractNumId w:val="118"/>
+    <w:abstractNumId w:val="119"/>
   </w:num>
   <w:num w:numId="88" w16cid:durableId="1361005725">
-    <w:abstractNumId w:val="172"/>
+    <w:abstractNumId w:val="174"/>
   </w:num>
   <w:num w:numId="89" w16cid:durableId="219681743">
     <w:abstractNumId w:val="12"/>
   </w:num>
   <w:num w:numId="90" w16cid:durableId="194386594">
-    <w:abstractNumId w:val="130"/>
+    <w:abstractNumId w:val="131"/>
   </w:num>
   <w:num w:numId="91" w16cid:durableId="777793346">
-    <w:abstractNumId w:val="90"/>
+    <w:abstractNumId w:val="91"/>
   </w:num>
   <w:num w:numId="92" w16cid:durableId="173346871">
-    <w:abstractNumId w:val="97"/>
+    <w:abstractNumId w:val="98"/>
   </w:num>
   <w:num w:numId="93" w16cid:durableId="948700467">
     <w:abstractNumId w:val="41"/>
@@ -34411,7 +35370,7 @@
     <w:abstractNumId w:val="72"/>
   </w:num>
   <w:num w:numId="96" w16cid:durableId="694119229">
-    <w:abstractNumId w:val="95"/>
+    <w:abstractNumId w:val="96"/>
   </w:num>
   <w:num w:numId="97" w16cid:durableId="704327987">
     <w:abstractNumId w:val="55"/>
@@ -34420,28 +35379,28 @@
     <w:abstractNumId w:val="25"/>
   </w:num>
   <w:num w:numId="99" w16cid:durableId="1706099794">
-    <w:abstractNumId w:val="155"/>
+    <w:abstractNumId w:val="157"/>
   </w:num>
   <w:num w:numId="100" w16cid:durableId="256404901">
-    <w:abstractNumId w:val="154"/>
+    <w:abstractNumId w:val="156"/>
   </w:num>
   <w:num w:numId="101" w16cid:durableId="924923012">
     <w:abstractNumId w:val="31"/>
   </w:num>
   <w:num w:numId="102" w16cid:durableId="536550966">
-    <w:abstractNumId w:val="173"/>
+    <w:abstractNumId w:val="175"/>
   </w:num>
   <w:num w:numId="103" w16cid:durableId="425157302">
     <w:abstractNumId w:val="73"/>
   </w:num>
   <w:num w:numId="104" w16cid:durableId="967664612">
-    <w:abstractNumId w:val="141"/>
+    <w:abstractNumId w:val="142"/>
   </w:num>
   <w:num w:numId="105" w16cid:durableId="361631616">
-    <w:abstractNumId w:val="104"/>
+    <w:abstractNumId w:val="105"/>
   </w:num>
   <w:num w:numId="106" w16cid:durableId="443623616">
-    <w:abstractNumId w:val="146"/>
+    <w:abstractNumId w:val="147"/>
   </w:num>
   <w:num w:numId="107" w16cid:durableId="150101619">
     <w:abstractNumId w:val="13"/>
@@ -34453,28 +35412,28 @@
     <w:abstractNumId w:val="0"/>
   </w:num>
   <w:num w:numId="110" w16cid:durableId="712924661">
-    <w:abstractNumId w:val="126"/>
+    <w:abstractNumId w:val="127"/>
   </w:num>
   <w:num w:numId="111" w16cid:durableId="1917784113">
-    <w:abstractNumId w:val="120"/>
+    <w:abstractNumId w:val="121"/>
   </w:num>
   <w:num w:numId="112" w16cid:durableId="896237065">
-    <w:abstractNumId w:val="131"/>
+    <w:abstractNumId w:val="132"/>
   </w:num>
   <w:num w:numId="113" w16cid:durableId="1171681430">
-    <w:abstractNumId w:val="158"/>
+    <w:abstractNumId w:val="160"/>
   </w:num>
   <w:num w:numId="114" w16cid:durableId="1552573199">
-    <w:abstractNumId w:val="160"/>
+    <w:abstractNumId w:val="162"/>
   </w:num>
   <w:num w:numId="115" w16cid:durableId="1920869674">
-    <w:abstractNumId w:val="144"/>
+    <w:abstractNumId w:val="145"/>
   </w:num>
   <w:num w:numId="116" w16cid:durableId="476724716">
-    <w:abstractNumId w:val="108"/>
+    <w:abstractNumId w:val="109"/>
   </w:num>
   <w:num w:numId="117" w16cid:durableId="658919541">
-    <w:abstractNumId w:val="107"/>
+    <w:abstractNumId w:val="108"/>
   </w:num>
   <w:num w:numId="118" w16cid:durableId="1622418131">
     <w:abstractNumId w:val="48"/>
@@ -34483,7 +35442,7 @@
     <w:abstractNumId w:val="2"/>
   </w:num>
   <w:num w:numId="120" w16cid:durableId="396828229">
-    <w:abstractNumId w:val="167"/>
+    <w:abstractNumId w:val="169"/>
   </w:num>
   <w:num w:numId="121" w16cid:durableId="986058889">
     <w:abstractNumId w:val="20"/>
@@ -34492,10 +35451,10 @@
     <w:abstractNumId w:val="63"/>
   </w:num>
   <w:num w:numId="123" w16cid:durableId="1804040304">
-    <w:abstractNumId w:val="89"/>
+    <w:abstractNumId w:val="90"/>
   </w:num>
   <w:num w:numId="124" w16cid:durableId="114181197">
-    <w:abstractNumId w:val="166"/>
+    <w:abstractNumId w:val="168"/>
   </w:num>
   <w:num w:numId="125" w16cid:durableId="772671624">
     <w:abstractNumId w:val="5"/>
@@ -34513,16 +35472,16 @@
     <w:abstractNumId w:val="62"/>
   </w:num>
   <w:num w:numId="130" w16cid:durableId="1168907903">
-    <w:abstractNumId w:val="147"/>
+    <w:abstractNumId w:val="148"/>
   </w:num>
   <w:num w:numId="131" w16cid:durableId="430206235">
-    <w:abstractNumId w:val="135"/>
+    <w:abstractNumId w:val="136"/>
   </w:num>
   <w:num w:numId="132" w16cid:durableId="1207327089">
     <w:abstractNumId w:val="29"/>
   </w:num>
   <w:num w:numId="133" w16cid:durableId="596404292">
-    <w:abstractNumId w:val="123"/>
+    <w:abstractNumId w:val="124"/>
   </w:num>
   <w:num w:numId="134" w16cid:durableId="2070372549">
     <w:abstractNumId w:val="45"/>
@@ -34534,49 +35493,49 @@
     <w:abstractNumId w:val="43"/>
   </w:num>
   <w:num w:numId="137" w16cid:durableId="1218275126">
-    <w:abstractNumId w:val="76"/>
+    <w:abstractNumId w:val="77"/>
   </w:num>
   <w:num w:numId="138" w16cid:durableId="568660900">
-    <w:abstractNumId w:val="83"/>
+    <w:abstractNumId w:val="84"/>
   </w:num>
   <w:num w:numId="139" w16cid:durableId="967976864">
-    <w:abstractNumId w:val="124"/>
+    <w:abstractNumId w:val="125"/>
   </w:num>
   <w:num w:numId="140" w16cid:durableId="650643288">
-    <w:abstractNumId w:val="142"/>
+    <w:abstractNumId w:val="143"/>
   </w:num>
   <w:num w:numId="141" w16cid:durableId="219370247">
-    <w:abstractNumId w:val="139"/>
+    <w:abstractNumId w:val="140"/>
   </w:num>
   <w:num w:numId="142" w16cid:durableId="323239876">
-    <w:abstractNumId w:val="178"/>
+    <w:abstractNumId w:val="180"/>
   </w:num>
   <w:num w:numId="143" w16cid:durableId="1619793156">
     <w:abstractNumId w:val="35"/>
   </w:num>
   <w:num w:numId="144" w16cid:durableId="1186332867">
-    <w:abstractNumId w:val="151"/>
+    <w:abstractNumId w:val="152"/>
   </w:num>
   <w:num w:numId="145" w16cid:durableId="89937035">
     <w:abstractNumId w:val="56"/>
   </w:num>
   <w:num w:numId="146" w16cid:durableId="542210424">
-    <w:abstractNumId w:val="79"/>
+    <w:abstractNumId w:val="80"/>
   </w:num>
   <w:num w:numId="147" w16cid:durableId="1194659616">
     <w:abstractNumId w:val="7"/>
   </w:num>
   <w:num w:numId="148" w16cid:durableId="1544974653">
-    <w:abstractNumId w:val="163"/>
+    <w:abstractNumId w:val="165"/>
   </w:num>
   <w:num w:numId="149" w16cid:durableId="1664625526">
     <w:abstractNumId w:val="65"/>
   </w:num>
   <w:num w:numId="150" w16cid:durableId="678197415">
-    <w:abstractNumId w:val="140"/>
+    <w:abstractNumId w:val="141"/>
   </w:num>
   <w:num w:numId="151" w16cid:durableId="1193106551">
-    <w:abstractNumId w:val="110"/>
+    <w:abstractNumId w:val="111"/>
   </w:num>
   <w:num w:numId="152" w16cid:durableId="1209760807">
     <w:abstractNumId w:val="64"/>
@@ -34585,19 +35544,19 @@
     <w:abstractNumId w:val="69"/>
   </w:num>
   <w:num w:numId="154" w16cid:durableId="2121295621">
-    <w:abstractNumId w:val="164"/>
+    <w:abstractNumId w:val="166"/>
   </w:num>
   <w:num w:numId="155" w16cid:durableId="292684904">
-    <w:abstractNumId w:val="86"/>
+    <w:abstractNumId w:val="87"/>
   </w:num>
   <w:num w:numId="156" w16cid:durableId="769400072">
-    <w:abstractNumId w:val="175"/>
+    <w:abstractNumId w:val="177"/>
   </w:num>
   <w:num w:numId="157" w16cid:durableId="1930693824">
-    <w:abstractNumId w:val="109"/>
+    <w:abstractNumId w:val="110"/>
   </w:num>
   <w:num w:numId="158" w16cid:durableId="813957946">
-    <w:abstractNumId w:val="159"/>
+    <w:abstractNumId w:val="161"/>
   </w:num>
   <w:num w:numId="159" w16cid:durableId="1782143679">
     <w:abstractNumId w:val="34"/>
@@ -34606,31 +35565,31 @@
     <w:abstractNumId w:val="30"/>
   </w:num>
   <w:num w:numId="161" w16cid:durableId="1052270864">
-    <w:abstractNumId w:val="136"/>
+    <w:abstractNumId w:val="137"/>
   </w:num>
   <w:num w:numId="162" w16cid:durableId="762337137">
-    <w:abstractNumId w:val="103"/>
+    <w:abstractNumId w:val="104"/>
   </w:num>
   <w:num w:numId="163" w16cid:durableId="1682507263">
-    <w:abstractNumId w:val="88"/>
+    <w:abstractNumId w:val="89"/>
   </w:num>
   <w:num w:numId="164" w16cid:durableId="871957078">
-    <w:abstractNumId w:val="121"/>
+    <w:abstractNumId w:val="122"/>
   </w:num>
   <w:num w:numId="165" w16cid:durableId="601960416">
-    <w:abstractNumId w:val="143"/>
+    <w:abstractNumId w:val="144"/>
   </w:num>
   <w:num w:numId="166" w16cid:durableId="574900497">
-    <w:abstractNumId w:val="133"/>
+    <w:abstractNumId w:val="134"/>
   </w:num>
   <w:num w:numId="167" w16cid:durableId="1477644837">
-    <w:abstractNumId w:val="93"/>
+    <w:abstractNumId w:val="94"/>
   </w:num>
   <w:num w:numId="168" w16cid:durableId="1618100933">
-    <w:abstractNumId w:val="161"/>
+    <w:abstractNumId w:val="163"/>
   </w:num>
   <w:num w:numId="169" w16cid:durableId="1266614374">
-    <w:abstractNumId w:val="171"/>
+    <w:abstractNumId w:val="173"/>
   </w:num>
   <w:num w:numId="170" w16cid:durableId="67534002">
     <w:abstractNumId w:val="1"/>
@@ -34639,34 +35598,40 @@
     <w:abstractNumId w:val="52"/>
   </w:num>
   <w:num w:numId="172" w16cid:durableId="827554792">
-    <w:abstractNumId w:val="105"/>
+    <w:abstractNumId w:val="106"/>
   </w:num>
   <w:num w:numId="173" w16cid:durableId="186605808">
     <w:abstractNumId w:val="27"/>
   </w:num>
   <w:num w:numId="174" w16cid:durableId="1000935913">
-    <w:abstractNumId w:val="125"/>
+    <w:abstractNumId w:val="126"/>
   </w:num>
   <w:num w:numId="175" w16cid:durableId="685984279">
     <w:abstractNumId w:val="44"/>
   </w:num>
   <w:num w:numId="176" w16cid:durableId="355473142">
-    <w:abstractNumId w:val="177"/>
+    <w:abstractNumId w:val="179"/>
   </w:num>
   <w:num w:numId="177" w16cid:durableId="1580820927">
     <w:abstractNumId w:val="4"/>
   </w:num>
   <w:num w:numId="178" w16cid:durableId="1342977237">
-    <w:abstractNumId w:val="180"/>
+    <w:abstractNumId w:val="182"/>
   </w:num>
   <w:num w:numId="179" w16cid:durableId="1610351964">
-    <w:abstractNumId w:val="91"/>
+    <w:abstractNumId w:val="92"/>
   </w:num>
   <w:num w:numId="180" w16cid:durableId="1808428282">
-    <w:abstractNumId w:val="115"/>
+    <w:abstractNumId w:val="116"/>
   </w:num>
   <w:num w:numId="181" w16cid:durableId="1853181086">
     <w:abstractNumId w:val="16"/>
+  </w:num>
+  <w:num w:numId="182" w16cid:durableId="1968733980">
+    <w:abstractNumId w:val="74"/>
+  </w:num>
+  <w:num w:numId="183" w16cid:durableId="1707484209">
+    <w:abstractNumId w:val="154"/>
   </w:num>
 </w:numbering>
 </file>
@@ -35279,7 +36244,6 @@
   <w:style w:type="character" w:default="1" w:styleId="DefaultParagraphFont">
     <w:name w:val="Default Paragraph Font"/>
     <w:uiPriority w:val="1"/>
-    <w:semiHidden/>
     <w:unhideWhenUsed/>
   </w:style>
   <w:style w:type="table" w:default="1" w:styleId="TableNormal">

</xml_diff>

<commit_message>
API Communication Desig (#362)
</commit_message>
<xml_diff>
--- a/Software Architecture Design.docx
+++ b/Software Architecture Design.docx
@@ -6357,13 +6357,8 @@
         </w:tabs>
         <w:spacing w:after="0"/>
       </w:pPr>
-      <w:proofErr w:type="gramStart"/>
-      <w:r>
-        <w:t>Sessions</w:t>
-      </w:r>
-      <w:proofErr w:type="gramEnd"/>
-      <w:r>
-        <w:t xml:space="preserve"> handling.</w:t>
+      <w:r>
+        <w:t>Sessions handling.</w:t>
       </w:r>
     </w:p>
     <w:p>
@@ -9788,15 +9783,7 @@
     </w:p>
     <w:p>
       <w:r>
-        <w:t xml:space="preserve">Considering the fact that the applications allow access to confidential information, the system architecture involves a number of security features. Access </w:t>
-      </w:r>
-      <w:proofErr w:type="gramStart"/>
-      <w:r>
-        <w:t>token based</w:t>
-      </w:r>
-      <w:proofErr w:type="gramEnd"/>
-      <w:r>
-        <w:t xml:space="preserve"> authentication process is used for the purpose while role-based access control is employed to authorize user functionality limits. HTTPS is used for all communication between the back-end services while all administrative actions are logged for auditing purposes. These practices ensure that administrative actions are kept confidential and secure.</w:t>
+        <w:t>Considering the fact that the applications allow access to confidential information, the system architecture involves a number of security features. Access token based authentication process is used for the purpose while role-based access control is employed to authorize user functionality limits. HTTPS is used for all communication between the back-end services while all administrative actions are logged for auditing purposes. These practices ensure that administrative actions are kept confidential and secure.</w:t>
       </w:r>
     </w:p>
     <w:p>
@@ -12048,6 +12035,1905 @@
         <w:t>The chosen architecture of integration has multiple benefits for the application. Utilization of dedicated integration services allows keeping the business logic separate from third-party implementation reducing the coupling and improving the maintainability. Service abstraction makes replacement of external providers easy to do. Asynchronous communication improves the responsiveness of the system since the long-running operations with third parties do not block the execution of business logic.</w:t>
       </w:r>
     </w:p>
+    <w:p>
+      <w:pPr>
+        <w:spacing w:line="278" w:lineRule="auto"/>
+      </w:pPr>
+      <w:r>
+        <w:br w:type="page"/>
+      </w:r>
+    </w:p>
+    <w:p>
+      <w:pPr>
+        <w:pStyle w:val="Heading2"/>
+      </w:pPr>
+      <w:r>
+        <w:lastRenderedPageBreak/>
+        <w:t>API Communication Design</w:t>
+      </w:r>
+    </w:p>
+    <w:p>
+      <w:r>
+        <w:t>Client applications and backend services interact through the means of the standardized Application Programming Interface (API).</w:t>
+      </w:r>
+    </w:p>
+    <w:p>
+      <w:r>
+        <w:t>As a communication component of the KriGo platform, the API allows the web application, mobile application, administration interface, and agency interface access to business services via one common and safe channel.</w:t>
+      </w:r>
+    </w:p>
+    <w:p>
+      <w:r>
+        <w:t>The API design is based on the RESTful web service concept, where each business object has its own endpoint and uses HTTP methods to communicate with clients. This design approach increases interoperability, simplifies client-server communication, and lets different client applications use the same backend services while using the same communication model.</w:t>
+      </w:r>
+    </w:p>
+    <w:p>
+      <w:r>
+        <w:t>To enable real-time capabilities, such as notifications and booking status updates, the REST API is extended with WebSocket communication that provides two-way communication for timely updates.</w:t>
+      </w:r>
+    </w:p>
+    <w:p>
+      <w:pPr>
+        <w:pStyle w:val="Heading3"/>
+      </w:pPr>
+      <w:r>
+        <w:t>API Architecture Overview</w:t>
+      </w:r>
+    </w:p>
+    <w:p>
+      <w:r>
+        <w:t>KriGo Backend functionality is available via an API Gateway created using the NestJS framework. The incoming requests flow through various middleware modules responsible for authentication, authorization, validation, logging, and exception handling before the respective business service is invoked.</w:t>
+      </w:r>
+    </w:p>
+    <w:p>
+      <w:r>
+        <w:t>Key API components are listed below:</w:t>
+      </w:r>
+    </w:p>
+    <w:p>
+      <w:pPr>
+        <w:pStyle w:val="ListParagraph"/>
+        <w:numPr>
+          <w:ilvl w:val="0"/>
+          <w:numId w:val="184"/>
+        </w:numPr>
+      </w:pPr>
+      <w:r>
+        <w:t>API Gateway</w:t>
+      </w:r>
+    </w:p>
+    <w:p>
+      <w:pPr>
+        <w:pStyle w:val="ListParagraph"/>
+        <w:numPr>
+          <w:ilvl w:val="0"/>
+          <w:numId w:val="184"/>
+        </w:numPr>
+      </w:pPr>
+      <w:r>
+        <w:t>Authentication Middleware</w:t>
+      </w:r>
+    </w:p>
+    <w:p>
+      <w:pPr>
+        <w:pStyle w:val="ListParagraph"/>
+        <w:numPr>
+          <w:ilvl w:val="0"/>
+          <w:numId w:val="184"/>
+        </w:numPr>
+      </w:pPr>
+      <w:r>
+        <w:t>Validation Layer</w:t>
+      </w:r>
+    </w:p>
+    <w:p>
+      <w:pPr>
+        <w:pStyle w:val="ListParagraph"/>
+        <w:numPr>
+          <w:ilvl w:val="0"/>
+          <w:numId w:val="184"/>
+        </w:numPr>
+      </w:pPr>
+      <w:r>
+        <w:t>Business Controllers</w:t>
+      </w:r>
+    </w:p>
+    <w:p>
+      <w:pPr>
+        <w:pStyle w:val="ListParagraph"/>
+        <w:numPr>
+          <w:ilvl w:val="0"/>
+          <w:numId w:val="184"/>
+        </w:numPr>
+      </w:pPr>
+      <w:r>
+        <w:t>Service Layer</w:t>
+      </w:r>
+    </w:p>
+    <w:p>
+      <w:pPr>
+        <w:pStyle w:val="ListParagraph"/>
+        <w:numPr>
+          <w:ilvl w:val="0"/>
+          <w:numId w:val="184"/>
+        </w:numPr>
+      </w:pPr>
+      <w:r>
+        <w:t>Repository Layer</w:t>
+      </w:r>
+    </w:p>
+    <w:p>
+      <w:pPr>
+        <w:pStyle w:val="ListParagraph"/>
+        <w:numPr>
+          <w:ilvl w:val="0"/>
+          <w:numId w:val="184"/>
+        </w:numPr>
+      </w:pPr>
+      <w:r>
+        <w:t>Database Layer</w:t>
+      </w:r>
+    </w:p>
+    <w:p>
+      <w:r>
+        <w:t>Every request has its own processing pipeline and therefore guaranteed to be consistent, secure, and traceable.</w:t>
+      </w:r>
+    </w:p>
+    <w:p>
+      <w:pPr>
+        <w:spacing w:line="278" w:lineRule="auto"/>
+      </w:pPr>
+      <w:r>
+        <w:br w:type="page"/>
+      </w:r>
+    </w:p>
+    <w:p>
+      <w:pPr>
+        <w:pStyle w:val="Heading3"/>
+      </w:pPr>
+      <w:r>
+        <w:lastRenderedPageBreak/>
+        <w:t>REST API Design</w:t>
+      </w:r>
+    </w:p>
+    <w:p>
+      <w:pPr>
+        <w:spacing w:after="0"/>
+      </w:pPr>
+      <w:r>
+        <w:t>The platform follows REST architecture principles by offering unique resource URLs for every business entity. The CRUD actions are performed using HTTP requests, while HTTP response codes indicate the result of the action performed on each request.</w:t>
+      </w:r>
+    </w:p>
+    <w:p>
+      <w:pPr>
+        <w:spacing w:after="0"/>
+      </w:pPr>
+    </w:p>
+    <w:tbl>
+      <w:tblPr>
+        <w:tblStyle w:val="PlainTable1"/>
+        <w:tblW w:w="0" w:type="auto"/>
+        <w:tblCellMar>
+          <w:top w:w="86" w:type="dxa"/>
+          <w:bottom w:w="86" w:type="dxa"/>
+        </w:tblCellMar>
+        <w:tblLook w:val="04A0" w:firstRow="1" w:lastRow="0" w:firstColumn="1" w:lastColumn="0" w:noHBand="0" w:noVBand="1"/>
+      </w:tblPr>
+      <w:tblGrid>
+        <w:gridCol w:w="1795"/>
+        <w:gridCol w:w="2430"/>
+        <w:gridCol w:w="4860"/>
+      </w:tblGrid>
+      <w:tr>
+        <w:trPr>
+          <w:cnfStyle w:val="100000000000" w:firstRow="1" w:lastRow="0" w:firstColumn="0" w:lastColumn="0" w:oddVBand="0" w:evenVBand="0" w:oddHBand="0" w:evenHBand="0" w:firstRowFirstColumn="0" w:firstRowLastColumn="0" w:lastRowFirstColumn="0" w:lastRowLastColumn="0"/>
+          <w:trHeight w:val="288"/>
+        </w:trPr>
+        <w:tc>
+          <w:tcPr>
+            <w:cnfStyle w:val="001000000000" w:firstRow="0" w:lastRow="0" w:firstColumn="1" w:lastColumn="0" w:oddVBand="0" w:evenVBand="0" w:oddHBand="0" w:evenHBand="0" w:firstRowFirstColumn="0" w:firstRowLastColumn="0" w:lastRowFirstColumn="0" w:lastRowLastColumn="0"/>
+            <w:tcW w:w="1795" w:type="dxa"/>
+            <w:vAlign w:val="center"/>
+            <w:hideMark/>
+          </w:tcPr>
+          <w:p>
+            <w:r>
+              <w:t>Resource</w:t>
+            </w:r>
+          </w:p>
+        </w:tc>
+        <w:tc>
+          <w:tcPr>
+            <w:tcW w:w="2430" w:type="dxa"/>
+            <w:vAlign w:val="center"/>
+            <w:hideMark/>
+          </w:tcPr>
+          <w:p>
+            <w:pPr>
+              <w:cnfStyle w:val="100000000000" w:firstRow="1" w:lastRow="0" w:firstColumn="0" w:lastColumn="0" w:oddVBand="0" w:evenVBand="0" w:oddHBand="0" w:evenHBand="0" w:firstRowFirstColumn="0" w:firstRowLastColumn="0" w:lastRowFirstColumn="0" w:lastRowLastColumn="0"/>
+            </w:pPr>
+            <w:r>
+              <w:t>Example Endpoint</w:t>
+            </w:r>
+          </w:p>
+        </w:tc>
+        <w:tc>
+          <w:tcPr>
+            <w:tcW w:w="4860" w:type="dxa"/>
+            <w:vAlign w:val="center"/>
+            <w:hideMark/>
+          </w:tcPr>
+          <w:p>
+            <w:pPr>
+              <w:cnfStyle w:val="100000000000" w:firstRow="1" w:lastRow="0" w:firstColumn="0" w:lastColumn="0" w:oddVBand="0" w:evenVBand="0" w:oddHBand="0" w:evenHBand="0" w:firstRowFirstColumn="0" w:firstRowLastColumn="0" w:lastRowFirstColumn="0" w:lastRowLastColumn="0"/>
+            </w:pPr>
+            <w:r>
+              <w:t>Operations</w:t>
+            </w:r>
+          </w:p>
+        </w:tc>
+      </w:tr>
+      <w:tr>
+        <w:trPr>
+          <w:cnfStyle w:val="000000100000" w:firstRow="0" w:lastRow="0" w:firstColumn="0" w:lastColumn="0" w:oddVBand="0" w:evenVBand="0" w:oddHBand="1" w:evenHBand="0" w:firstRowFirstColumn="0" w:firstRowLastColumn="0" w:lastRowFirstColumn="0" w:lastRowLastColumn="0"/>
+          <w:trHeight w:val="288"/>
+        </w:trPr>
+        <w:tc>
+          <w:tcPr>
+            <w:cnfStyle w:val="001000000000" w:firstRow="0" w:lastRow="0" w:firstColumn="1" w:lastColumn="0" w:oddVBand="0" w:evenVBand="0" w:oddHBand="0" w:evenHBand="0" w:firstRowFirstColumn="0" w:firstRowLastColumn="0" w:lastRowFirstColumn="0" w:lastRowLastColumn="0"/>
+            <w:tcW w:w="1795" w:type="dxa"/>
+            <w:vAlign w:val="center"/>
+            <w:hideMark/>
+          </w:tcPr>
+          <w:p>
+            <w:r>
+              <w:t>Authentication</w:t>
+            </w:r>
+          </w:p>
+        </w:tc>
+        <w:tc>
+          <w:tcPr>
+            <w:tcW w:w="2430" w:type="dxa"/>
+            <w:vAlign w:val="center"/>
+            <w:hideMark/>
+          </w:tcPr>
+          <w:p>
+            <w:pPr>
+              <w:cnfStyle w:val="000000100000" w:firstRow="0" w:lastRow="0" w:firstColumn="0" w:lastColumn="0" w:oddVBand="0" w:evenVBand="0" w:oddHBand="1" w:evenHBand="0" w:firstRowFirstColumn="0" w:firstRowLastColumn="0" w:lastRowFirstColumn="0" w:lastRowLastColumn="0"/>
+            </w:pPr>
+            <w:r>
+              <w:t>/api/auth</w:t>
+            </w:r>
+          </w:p>
+        </w:tc>
+        <w:tc>
+          <w:tcPr>
+            <w:tcW w:w="4860" w:type="dxa"/>
+            <w:vAlign w:val="center"/>
+            <w:hideMark/>
+          </w:tcPr>
+          <w:p>
+            <w:pPr>
+              <w:cnfStyle w:val="000000100000" w:firstRow="0" w:lastRow="0" w:firstColumn="0" w:lastColumn="0" w:oddVBand="0" w:evenVBand="0" w:oddHBand="1" w:evenHBand="0" w:firstRowFirstColumn="0" w:firstRowLastColumn="0" w:lastRowFirstColumn="0" w:lastRowLastColumn="0"/>
+            </w:pPr>
+            <w:r>
+              <w:t>Login, registration, password recovery</w:t>
+            </w:r>
+          </w:p>
+        </w:tc>
+      </w:tr>
+      <w:tr>
+        <w:trPr>
+          <w:trHeight w:val="288"/>
+        </w:trPr>
+        <w:tc>
+          <w:tcPr>
+            <w:cnfStyle w:val="001000000000" w:firstRow="0" w:lastRow="0" w:firstColumn="1" w:lastColumn="0" w:oddVBand="0" w:evenVBand="0" w:oddHBand="0" w:evenHBand="0" w:firstRowFirstColumn="0" w:firstRowLastColumn="0" w:lastRowFirstColumn="0" w:lastRowLastColumn="0"/>
+            <w:tcW w:w="1795" w:type="dxa"/>
+            <w:vAlign w:val="center"/>
+            <w:hideMark/>
+          </w:tcPr>
+          <w:p>
+            <w:r>
+              <w:t>Users</w:t>
+            </w:r>
+          </w:p>
+        </w:tc>
+        <w:tc>
+          <w:tcPr>
+            <w:tcW w:w="2430" w:type="dxa"/>
+            <w:vAlign w:val="center"/>
+            <w:hideMark/>
+          </w:tcPr>
+          <w:p>
+            <w:pPr>
+              <w:cnfStyle w:val="000000000000" w:firstRow="0" w:lastRow="0" w:firstColumn="0" w:lastColumn="0" w:oddVBand="0" w:evenVBand="0" w:oddHBand="0" w:evenHBand="0" w:firstRowFirstColumn="0" w:firstRowLastColumn="0" w:lastRowFirstColumn="0" w:lastRowLastColumn="0"/>
+            </w:pPr>
+            <w:r>
+              <w:t>/api/users</w:t>
+            </w:r>
+          </w:p>
+        </w:tc>
+        <w:tc>
+          <w:tcPr>
+            <w:tcW w:w="4860" w:type="dxa"/>
+            <w:vAlign w:val="center"/>
+            <w:hideMark/>
+          </w:tcPr>
+          <w:p>
+            <w:pPr>
+              <w:cnfStyle w:val="000000000000" w:firstRow="0" w:lastRow="0" w:firstColumn="0" w:lastColumn="0" w:oddVBand="0" w:evenVBand="0" w:oddHBand="0" w:evenHBand="0" w:firstRowFirstColumn="0" w:firstRowLastColumn="0" w:lastRowFirstColumn="0" w:lastRowLastColumn="0"/>
+            </w:pPr>
+            <w:r>
+              <w:t>Create, update, retrieve, suspend</w:t>
+            </w:r>
+          </w:p>
+        </w:tc>
+      </w:tr>
+      <w:tr>
+        <w:trPr>
+          <w:cnfStyle w:val="000000100000" w:firstRow="0" w:lastRow="0" w:firstColumn="0" w:lastColumn="0" w:oddVBand="0" w:evenVBand="0" w:oddHBand="1" w:evenHBand="0" w:firstRowFirstColumn="0" w:firstRowLastColumn="0" w:lastRowFirstColumn="0" w:lastRowLastColumn="0"/>
+          <w:trHeight w:val="288"/>
+        </w:trPr>
+        <w:tc>
+          <w:tcPr>
+            <w:cnfStyle w:val="001000000000" w:firstRow="0" w:lastRow="0" w:firstColumn="1" w:lastColumn="0" w:oddVBand="0" w:evenVBand="0" w:oddHBand="0" w:evenHBand="0" w:firstRowFirstColumn="0" w:firstRowLastColumn="0" w:lastRowFirstColumn="0" w:lastRowLastColumn="0"/>
+            <w:tcW w:w="1795" w:type="dxa"/>
+            <w:vAlign w:val="center"/>
+            <w:hideMark/>
+          </w:tcPr>
+          <w:p>
+            <w:r>
+              <w:t>Vehicles</w:t>
+            </w:r>
+          </w:p>
+        </w:tc>
+        <w:tc>
+          <w:tcPr>
+            <w:tcW w:w="2430" w:type="dxa"/>
+            <w:vAlign w:val="center"/>
+            <w:hideMark/>
+          </w:tcPr>
+          <w:p>
+            <w:pPr>
+              <w:cnfStyle w:val="000000100000" w:firstRow="0" w:lastRow="0" w:firstColumn="0" w:lastColumn="0" w:oddVBand="0" w:evenVBand="0" w:oddHBand="1" w:evenHBand="0" w:firstRowFirstColumn="0" w:firstRowLastColumn="0" w:lastRowFirstColumn="0" w:lastRowLastColumn="0"/>
+            </w:pPr>
+            <w:r>
+              <w:t>/api/vehicles</w:t>
+            </w:r>
+          </w:p>
+        </w:tc>
+        <w:tc>
+          <w:tcPr>
+            <w:tcW w:w="4860" w:type="dxa"/>
+            <w:vAlign w:val="center"/>
+            <w:hideMark/>
+          </w:tcPr>
+          <w:p>
+            <w:pPr>
+              <w:cnfStyle w:val="000000100000" w:firstRow="0" w:lastRow="0" w:firstColumn="0" w:lastColumn="0" w:oddVBand="0" w:evenVBand="0" w:oddHBand="1" w:evenHBand="0" w:firstRowFirstColumn="0" w:firstRowLastColumn="0" w:lastRowFirstColumn="0" w:lastRowLastColumn="0"/>
+            </w:pPr>
+            <w:r>
+              <w:t>Search, create, update, delete</w:t>
+            </w:r>
+          </w:p>
+        </w:tc>
+      </w:tr>
+      <w:tr>
+        <w:trPr>
+          <w:trHeight w:val="288"/>
+        </w:trPr>
+        <w:tc>
+          <w:tcPr>
+            <w:cnfStyle w:val="001000000000" w:firstRow="0" w:lastRow="0" w:firstColumn="1" w:lastColumn="0" w:oddVBand="0" w:evenVBand="0" w:oddHBand="0" w:evenHBand="0" w:firstRowFirstColumn="0" w:firstRowLastColumn="0" w:lastRowFirstColumn="0" w:lastRowLastColumn="0"/>
+            <w:tcW w:w="1795" w:type="dxa"/>
+            <w:vAlign w:val="center"/>
+            <w:hideMark/>
+          </w:tcPr>
+          <w:p>
+            <w:r>
+              <w:t>Reservations</w:t>
+            </w:r>
+          </w:p>
+        </w:tc>
+        <w:tc>
+          <w:tcPr>
+            <w:tcW w:w="2430" w:type="dxa"/>
+            <w:vAlign w:val="center"/>
+            <w:hideMark/>
+          </w:tcPr>
+          <w:p>
+            <w:pPr>
+              <w:cnfStyle w:val="000000000000" w:firstRow="0" w:lastRow="0" w:firstColumn="0" w:lastColumn="0" w:oddVBand="0" w:evenVBand="0" w:oddHBand="0" w:evenHBand="0" w:firstRowFirstColumn="0" w:firstRowLastColumn="0" w:lastRowFirstColumn="0" w:lastRowLastColumn="0"/>
+            </w:pPr>
+            <w:r>
+              <w:t>/api/reservations</w:t>
+            </w:r>
+          </w:p>
+        </w:tc>
+        <w:tc>
+          <w:tcPr>
+            <w:tcW w:w="4860" w:type="dxa"/>
+            <w:vAlign w:val="center"/>
+            <w:hideMark/>
+          </w:tcPr>
+          <w:p>
+            <w:pPr>
+              <w:cnfStyle w:val="000000000000" w:firstRow="0" w:lastRow="0" w:firstColumn="0" w:lastColumn="0" w:oddVBand="0" w:evenVBand="0" w:oddHBand="0" w:evenHBand="0" w:firstRowFirstColumn="0" w:firstRowLastColumn="0" w:lastRowFirstColumn="0" w:lastRowLastColumn="0"/>
+            </w:pPr>
+            <w:r>
+              <w:t>Create, modify, cancel, retrieve</w:t>
+            </w:r>
+          </w:p>
+        </w:tc>
+      </w:tr>
+      <w:tr>
+        <w:trPr>
+          <w:cnfStyle w:val="000000100000" w:firstRow="0" w:lastRow="0" w:firstColumn="0" w:lastColumn="0" w:oddVBand="0" w:evenVBand="0" w:oddHBand="1" w:evenHBand="0" w:firstRowFirstColumn="0" w:firstRowLastColumn="0" w:lastRowFirstColumn="0" w:lastRowLastColumn="0"/>
+          <w:trHeight w:val="288"/>
+        </w:trPr>
+        <w:tc>
+          <w:tcPr>
+            <w:cnfStyle w:val="001000000000" w:firstRow="0" w:lastRow="0" w:firstColumn="1" w:lastColumn="0" w:oddVBand="0" w:evenVBand="0" w:oddHBand="0" w:evenHBand="0" w:firstRowFirstColumn="0" w:firstRowLastColumn="0" w:lastRowFirstColumn="0" w:lastRowLastColumn="0"/>
+            <w:tcW w:w="1795" w:type="dxa"/>
+            <w:vAlign w:val="center"/>
+            <w:hideMark/>
+          </w:tcPr>
+          <w:p>
+            <w:r>
+              <w:t>Payments</w:t>
+            </w:r>
+          </w:p>
+        </w:tc>
+        <w:tc>
+          <w:tcPr>
+            <w:tcW w:w="2430" w:type="dxa"/>
+            <w:vAlign w:val="center"/>
+            <w:hideMark/>
+          </w:tcPr>
+          <w:p>
+            <w:pPr>
+              <w:cnfStyle w:val="000000100000" w:firstRow="0" w:lastRow="0" w:firstColumn="0" w:lastColumn="0" w:oddVBand="0" w:evenVBand="0" w:oddHBand="1" w:evenHBand="0" w:firstRowFirstColumn="0" w:firstRowLastColumn="0" w:lastRowFirstColumn="0" w:lastRowLastColumn="0"/>
+            </w:pPr>
+            <w:r>
+              <w:t>/api/payments</w:t>
+            </w:r>
+          </w:p>
+        </w:tc>
+        <w:tc>
+          <w:tcPr>
+            <w:tcW w:w="4860" w:type="dxa"/>
+            <w:vAlign w:val="center"/>
+            <w:hideMark/>
+          </w:tcPr>
+          <w:p>
+            <w:pPr>
+              <w:cnfStyle w:val="000000100000" w:firstRow="0" w:lastRow="0" w:firstColumn="0" w:lastColumn="0" w:oddVBand="0" w:evenVBand="0" w:oddHBand="1" w:evenHBand="0" w:firstRowFirstColumn="0" w:firstRowLastColumn="0" w:lastRowFirstColumn="0" w:lastRowLastColumn="0"/>
+            </w:pPr>
+            <w:r>
+              <w:t>Process payment, verify transaction</w:t>
+            </w:r>
+          </w:p>
+        </w:tc>
+      </w:tr>
+      <w:tr>
+        <w:trPr>
+          <w:trHeight w:val="288"/>
+        </w:trPr>
+        <w:tc>
+          <w:tcPr>
+            <w:cnfStyle w:val="001000000000" w:firstRow="0" w:lastRow="0" w:firstColumn="1" w:lastColumn="0" w:oddVBand="0" w:evenVBand="0" w:oddHBand="0" w:evenHBand="0" w:firstRowFirstColumn="0" w:firstRowLastColumn="0" w:lastRowFirstColumn="0" w:lastRowLastColumn="0"/>
+            <w:tcW w:w="1795" w:type="dxa"/>
+            <w:vAlign w:val="center"/>
+            <w:hideMark/>
+          </w:tcPr>
+          <w:p>
+            <w:r>
+              <w:t>Agencies</w:t>
+            </w:r>
+          </w:p>
+        </w:tc>
+        <w:tc>
+          <w:tcPr>
+            <w:tcW w:w="2430" w:type="dxa"/>
+            <w:vAlign w:val="center"/>
+            <w:hideMark/>
+          </w:tcPr>
+          <w:p>
+            <w:pPr>
+              <w:cnfStyle w:val="000000000000" w:firstRow="0" w:lastRow="0" w:firstColumn="0" w:lastColumn="0" w:oddVBand="0" w:evenVBand="0" w:oddHBand="0" w:evenHBand="0" w:firstRowFirstColumn="0" w:firstRowLastColumn="0" w:lastRowFirstColumn="0" w:lastRowLastColumn="0"/>
+            </w:pPr>
+            <w:r>
+              <w:t>/api/agencies</w:t>
+            </w:r>
+          </w:p>
+        </w:tc>
+        <w:tc>
+          <w:tcPr>
+            <w:tcW w:w="4860" w:type="dxa"/>
+            <w:vAlign w:val="center"/>
+            <w:hideMark/>
+          </w:tcPr>
+          <w:p>
+            <w:pPr>
+              <w:cnfStyle w:val="000000000000" w:firstRow="0" w:lastRow="0" w:firstColumn="0" w:lastColumn="0" w:oddVBand="0" w:evenVBand="0" w:oddHBand="0" w:evenHBand="0" w:firstRowFirstColumn="0" w:firstRowLastColumn="0" w:lastRowFirstColumn="0" w:lastRowLastColumn="0"/>
+            </w:pPr>
+            <w:r>
+              <w:t>Registration, verification, management</w:t>
+            </w:r>
+          </w:p>
+        </w:tc>
+      </w:tr>
+      <w:tr>
+        <w:trPr>
+          <w:cnfStyle w:val="000000100000" w:firstRow="0" w:lastRow="0" w:firstColumn="0" w:lastColumn="0" w:oddVBand="0" w:evenVBand="0" w:oddHBand="1" w:evenHBand="0" w:firstRowFirstColumn="0" w:firstRowLastColumn="0" w:lastRowFirstColumn="0" w:lastRowLastColumn="0"/>
+          <w:trHeight w:val="288"/>
+        </w:trPr>
+        <w:tc>
+          <w:tcPr>
+            <w:cnfStyle w:val="001000000000" w:firstRow="0" w:lastRow="0" w:firstColumn="1" w:lastColumn="0" w:oddVBand="0" w:evenVBand="0" w:oddHBand="0" w:evenHBand="0" w:firstRowFirstColumn="0" w:firstRowLastColumn="0" w:lastRowFirstColumn="0" w:lastRowLastColumn="0"/>
+            <w:tcW w:w="1795" w:type="dxa"/>
+            <w:vAlign w:val="center"/>
+            <w:hideMark/>
+          </w:tcPr>
+          <w:p>
+            <w:r>
+              <w:t>Reviews</w:t>
+            </w:r>
+          </w:p>
+        </w:tc>
+        <w:tc>
+          <w:tcPr>
+            <w:tcW w:w="2430" w:type="dxa"/>
+            <w:vAlign w:val="center"/>
+            <w:hideMark/>
+          </w:tcPr>
+          <w:p>
+            <w:pPr>
+              <w:cnfStyle w:val="000000100000" w:firstRow="0" w:lastRow="0" w:firstColumn="0" w:lastColumn="0" w:oddVBand="0" w:evenVBand="0" w:oddHBand="1" w:evenHBand="0" w:firstRowFirstColumn="0" w:firstRowLastColumn="0" w:lastRowFirstColumn="0" w:lastRowLastColumn="0"/>
+            </w:pPr>
+            <w:r>
+              <w:t>/api/reviews</w:t>
+            </w:r>
+          </w:p>
+        </w:tc>
+        <w:tc>
+          <w:tcPr>
+            <w:tcW w:w="4860" w:type="dxa"/>
+            <w:vAlign w:val="center"/>
+            <w:hideMark/>
+          </w:tcPr>
+          <w:p>
+            <w:pPr>
+              <w:cnfStyle w:val="000000100000" w:firstRow="0" w:lastRow="0" w:firstColumn="0" w:lastColumn="0" w:oddVBand="0" w:evenVBand="0" w:oddHBand="1" w:evenHBand="0" w:firstRowFirstColumn="0" w:firstRowLastColumn="0" w:lastRowFirstColumn="0" w:lastRowLastColumn="0"/>
+            </w:pPr>
+            <w:r>
+              <w:t>Create, edit, moderation</w:t>
+            </w:r>
+          </w:p>
+        </w:tc>
+      </w:tr>
+      <w:tr>
+        <w:trPr>
+          <w:trHeight w:val="288"/>
+        </w:trPr>
+        <w:tc>
+          <w:tcPr>
+            <w:cnfStyle w:val="001000000000" w:firstRow="0" w:lastRow="0" w:firstColumn="1" w:lastColumn="0" w:oddVBand="0" w:evenVBand="0" w:oddHBand="0" w:evenHBand="0" w:firstRowFirstColumn="0" w:firstRowLastColumn="0" w:lastRowFirstColumn="0" w:lastRowLastColumn="0"/>
+            <w:tcW w:w="1795" w:type="dxa"/>
+            <w:vAlign w:val="center"/>
+            <w:hideMark/>
+          </w:tcPr>
+          <w:p>
+            <w:r>
+              <w:t>Disputes</w:t>
+            </w:r>
+          </w:p>
+        </w:tc>
+        <w:tc>
+          <w:tcPr>
+            <w:tcW w:w="2430" w:type="dxa"/>
+            <w:vAlign w:val="center"/>
+            <w:hideMark/>
+          </w:tcPr>
+          <w:p>
+            <w:pPr>
+              <w:cnfStyle w:val="000000000000" w:firstRow="0" w:lastRow="0" w:firstColumn="0" w:lastColumn="0" w:oddVBand="0" w:evenVBand="0" w:oddHBand="0" w:evenHBand="0" w:firstRowFirstColumn="0" w:firstRowLastColumn="0" w:lastRowFirstColumn="0" w:lastRowLastColumn="0"/>
+            </w:pPr>
+            <w:r>
+              <w:t>/api/disputes</w:t>
+            </w:r>
+          </w:p>
+        </w:tc>
+        <w:tc>
+          <w:tcPr>
+            <w:tcW w:w="4860" w:type="dxa"/>
+            <w:vAlign w:val="center"/>
+            <w:hideMark/>
+          </w:tcPr>
+          <w:p>
+            <w:pPr>
+              <w:cnfStyle w:val="000000000000" w:firstRow="0" w:lastRow="0" w:firstColumn="0" w:lastColumn="0" w:oddVBand="0" w:evenVBand="0" w:oddHBand="0" w:evenHBand="0" w:firstRowFirstColumn="0" w:firstRowLastColumn="0" w:lastRowFirstColumn="0" w:lastRowLastColumn="0"/>
+            </w:pPr>
+            <w:r>
+              <w:t>Submit, investigate, resolve</w:t>
+            </w:r>
+          </w:p>
+        </w:tc>
+      </w:tr>
+      <w:tr>
+        <w:trPr>
+          <w:cnfStyle w:val="000000100000" w:firstRow="0" w:lastRow="0" w:firstColumn="0" w:lastColumn="0" w:oddVBand="0" w:evenVBand="0" w:oddHBand="1" w:evenHBand="0" w:firstRowFirstColumn="0" w:firstRowLastColumn="0" w:lastRowFirstColumn="0" w:lastRowLastColumn="0"/>
+          <w:trHeight w:val="288"/>
+        </w:trPr>
+        <w:tc>
+          <w:tcPr>
+            <w:cnfStyle w:val="001000000000" w:firstRow="0" w:lastRow="0" w:firstColumn="1" w:lastColumn="0" w:oddVBand="0" w:evenVBand="0" w:oddHBand="0" w:evenHBand="0" w:firstRowFirstColumn="0" w:firstRowLastColumn="0" w:lastRowFirstColumn="0" w:lastRowLastColumn="0"/>
+            <w:tcW w:w="1795" w:type="dxa"/>
+            <w:vAlign w:val="center"/>
+            <w:hideMark/>
+          </w:tcPr>
+          <w:p>
+            <w:r>
+              <w:t>Notifications</w:t>
+            </w:r>
+          </w:p>
+        </w:tc>
+        <w:tc>
+          <w:tcPr>
+            <w:tcW w:w="2430" w:type="dxa"/>
+            <w:vAlign w:val="center"/>
+            <w:hideMark/>
+          </w:tcPr>
+          <w:p>
+            <w:pPr>
+              <w:cnfStyle w:val="000000100000" w:firstRow="0" w:lastRow="0" w:firstColumn="0" w:lastColumn="0" w:oddVBand="0" w:evenVBand="0" w:oddHBand="1" w:evenHBand="0" w:firstRowFirstColumn="0" w:firstRowLastColumn="0" w:lastRowFirstColumn="0" w:lastRowLastColumn="0"/>
+            </w:pPr>
+            <w:r>
+              <w:t>/api/notifications</w:t>
+            </w:r>
+          </w:p>
+        </w:tc>
+        <w:tc>
+          <w:tcPr>
+            <w:tcW w:w="4860" w:type="dxa"/>
+            <w:vAlign w:val="center"/>
+            <w:hideMark/>
+          </w:tcPr>
+          <w:p>
+            <w:pPr>
+              <w:cnfStyle w:val="000000100000" w:firstRow="0" w:lastRow="0" w:firstColumn="0" w:lastColumn="0" w:oddVBand="0" w:evenVBand="0" w:oddHBand="1" w:evenHBand="0" w:firstRowFirstColumn="0" w:firstRowLastColumn="0" w:lastRowFirstColumn="0" w:lastRowLastColumn="0"/>
+            </w:pPr>
+            <w:r>
+              <w:t>Retrieve notifications</w:t>
+            </w:r>
+          </w:p>
+        </w:tc>
+      </w:tr>
+      <w:tr>
+        <w:trPr>
+          <w:trHeight w:val="288"/>
+        </w:trPr>
+        <w:tc>
+          <w:tcPr>
+            <w:cnfStyle w:val="001000000000" w:firstRow="0" w:lastRow="0" w:firstColumn="1" w:lastColumn="0" w:oddVBand="0" w:evenVBand="0" w:oddHBand="0" w:evenHBand="0" w:firstRowFirstColumn="0" w:firstRowLastColumn="0" w:lastRowFirstColumn="0" w:lastRowLastColumn="0"/>
+            <w:tcW w:w="1795" w:type="dxa"/>
+            <w:vAlign w:val="center"/>
+            <w:hideMark/>
+          </w:tcPr>
+          <w:p>
+            <w:r>
+              <w:t>AI Services</w:t>
+            </w:r>
+          </w:p>
+        </w:tc>
+        <w:tc>
+          <w:tcPr>
+            <w:tcW w:w="2430" w:type="dxa"/>
+            <w:vAlign w:val="center"/>
+            <w:hideMark/>
+          </w:tcPr>
+          <w:p>
+            <w:pPr>
+              <w:cnfStyle w:val="000000000000" w:firstRow="0" w:lastRow="0" w:firstColumn="0" w:lastColumn="0" w:oddVBand="0" w:evenVBand="0" w:oddHBand="0" w:evenHBand="0" w:firstRowFirstColumn="0" w:firstRowLastColumn="0" w:lastRowFirstColumn="0" w:lastRowLastColumn="0"/>
+            </w:pPr>
+            <w:r>
+              <w:t>/api/ai</w:t>
+            </w:r>
+          </w:p>
+        </w:tc>
+        <w:tc>
+          <w:tcPr>
+            <w:tcW w:w="4860" w:type="dxa"/>
+            <w:vAlign w:val="center"/>
+            <w:hideMark/>
+          </w:tcPr>
+          <w:p>
+            <w:pPr>
+              <w:cnfStyle w:val="000000000000" w:firstRow="0" w:lastRow="0" w:firstColumn="0" w:lastColumn="0" w:oddVBand="0" w:evenVBand="0" w:oddHBand="0" w:evenHBand="0" w:firstRowFirstColumn="0" w:firstRowLastColumn="0" w:lastRowFirstColumn="0" w:lastRowLastColumn="0"/>
+            </w:pPr>
+            <w:r>
+              <w:t>Recommendations and assistant</w:t>
+            </w:r>
+          </w:p>
+        </w:tc>
+      </w:tr>
+      <w:tr>
+        <w:trPr>
+          <w:cnfStyle w:val="000000100000" w:firstRow="0" w:lastRow="0" w:firstColumn="0" w:lastColumn="0" w:oddVBand="0" w:evenVBand="0" w:oddHBand="1" w:evenHBand="0" w:firstRowFirstColumn="0" w:firstRowLastColumn="0" w:lastRowFirstColumn="0" w:lastRowLastColumn="0"/>
+          <w:trHeight w:val="288"/>
+        </w:trPr>
+        <w:tc>
+          <w:tcPr>
+            <w:cnfStyle w:val="001000000000" w:firstRow="0" w:lastRow="0" w:firstColumn="1" w:lastColumn="0" w:oddVBand="0" w:evenVBand="0" w:oddHBand="0" w:evenHBand="0" w:firstRowFirstColumn="0" w:firstRowLastColumn="0" w:lastRowFirstColumn="0" w:lastRowLastColumn="0"/>
+            <w:tcW w:w="1795" w:type="dxa"/>
+            <w:vAlign w:val="center"/>
+            <w:hideMark/>
+          </w:tcPr>
+          <w:p>
+            <w:r>
+              <w:t>Analytics</w:t>
+            </w:r>
+          </w:p>
+        </w:tc>
+        <w:tc>
+          <w:tcPr>
+            <w:tcW w:w="2430" w:type="dxa"/>
+            <w:vAlign w:val="center"/>
+            <w:hideMark/>
+          </w:tcPr>
+          <w:p>
+            <w:pPr>
+              <w:cnfStyle w:val="000000100000" w:firstRow="0" w:lastRow="0" w:firstColumn="0" w:lastColumn="0" w:oddVBand="0" w:evenVBand="0" w:oddHBand="1" w:evenHBand="0" w:firstRowFirstColumn="0" w:firstRowLastColumn="0" w:lastRowFirstColumn="0" w:lastRowLastColumn="0"/>
+            </w:pPr>
+            <w:r>
+              <w:t>/api/analytics</w:t>
+            </w:r>
+          </w:p>
+        </w:tc>
+        <w:tc>
+          <w:tcPr>
+            <w:tcW w:w="4860" w:type="dxa"/>
+            <w:vAlign w:val="center"/>
+            <w:hideMark/>
+          </w:tcPr>
+          <w:p>
+            <w:pPr>
+              <w:cnfStyle w:val="000000100000" w:firstRow="0" w:lastRow="0" w:firstColumn="0" w:lastColumn="0" w:oddVBand="0" w:evenVBand="0" w:oddHBand="1" w:evenHBand="0" w:firstRowFirstColumn="0" w:firstRowLastColumn="0" w:lastRowFirstColumn="0" w:lastRowLastColumn="0"/>
+            </w:pPr>
+            <w:r>
+              <w:t>Reports and dashboards</w:t>
+            </w:r>
+          </w:p>
+        </w:tc>
+      </w:tr>
+    </w:tbl>
+    <w:p/>
+    <w:p>
+      <w:r>
+        <w:t>The REST API exchanges information using the JSON format, providing lightweight and platform-independent communication between clients and backend services.</w:t>
+      </w:r>
+    </w:p>
+    <w:p>
+      <w:pPr>
+        <w:pStyle w:val="Heading3"/>
+      </w:pPr>
+      <w:r>
+        <w:t>Request Processing Pipeline</w:t>
+      </w:r>
+    </w:p>
+    <w:p>
+      <w:r>
+        <w:t>All API requests follow a certain predetermined sequence of steps before getting to business logic processing.</w:t>
+      </w:r>
+    </w:p>
+    <w:p>
+      <w:pPr>
+        <w:pStyle w:val="ListParagraph"/>
+        <w:numPr>
+          <w:ilvl w:val="0"/>
+          <w:numId w:val="185"/>
+        </w:numPr>
+      </w:pPr>
+      <w:r>
+        <w:t>These are as follows:</w:t>
+      </w:r>
+    </w:p>
+    <w:p>
+      <w:pPr>
+        <w:pStyle w:val="ListParagraph"/>
+        <w:numPr>
+          <w:ilvl w:val="0"/>
+          <w:numId w:val="185"/>
+        </w:numPr>
+      </w:pPr>
+      <w:r>
+        <w:t>The client sends the HTTPS request.</w:t>
+      </w:r>
+    </w:p>
+    <w:p>
+      <w:pPr>
+        <w:pStyle w:val="ListParagraph"/>
+        <w:numPr>
+          <w:ilvl w:val="0"/>
+          <w:numId w:val="185"/>
+        </w:numPr>
+      </w:pPr>
+      <w:r>
+        <w:t>The API Gateway receives the request.</w:t>
+      </w:r>
+    </w:p>
+    <w:p>
+      <w:pPr>
+        <w:pStyle w:val="ListParagraph"/>
+        <w:numPr>
+          <w:ilvl w:val="0"/>
+          <w:numId w:val="185"/>
+        </w:numPr>
+      </w:pPr>
+      <w:r>
+        <w:t>The JWT token authentication step runs.</w:t>
+      </w:r>
+    </w:p>
+    <w:p>
+      <w:pPr>
+        <w:pStyle w:val="ListParagraph"/>
+        <w:numPr>
+          <w:ilvl w:val="0"/>
+          <w:numId w:val="185"/>
+        </w:numPr>
+      </w:pPr>
+      <w:r>
+        <w:t>The authorization guards validate user rights.</w:t>
+      </w:r>
+    </w:p>
+    <w:p>
+      <w:pPr>
+        <w:pStyle w:val="ListParagraph"/>
+        <w:numPr>
+          <w:ilvl w:val="0"/>
+          <w:numId w:val="185"/>
+        </w:numPr>
+      </w:pPr>
+      <w:r>
+        <w:t>The validation pipes check the validity of the request data.</w:t>
+      </w:r>
+    </w:p>
+    <w:p>
+      <w:pPr>
+        <w:pStyle w:val="ListParagraph"/>
+        <w:numPr>
+          <w:ilvl w:val="0"/>
+          <w:numId w:val="185"/>
+        </w:numPr>
+      </w:pPr>
+      <w:r>
+        <w:t>The relevant controller receives the request.</w:t>
+      </w:r>
+    </w:p>
+    <w:p>
+      <w:pPr>
+        <w:pStyle w:val="ListParagraph"/>
+        <w:numPr>
+          <w:ilvl w:val="0"/>
+          <w:numId w:val="185"/>
+        </w:numPr>
+      </w:pPr>
+      <w:r>
+        <w:t>The business services process the request.</w:t>
+      </w:r>
+    </w:p>
+    <w:p>
+      <w:pPr>
+        <w:pStyle w:val="ListParagraph"/>
+        <w:numPr>
+          <w:ilvl w:val="0"/>
+          <w:numId w:val="185"/>
+        </w:numPr>
+      </w:pPr>
+      <w:r>
+        <w:t>If needed, repository components will have access to the database.</w:t>
+      </w:r>
+    </w:p>
+    <w:p>
+      <w:pPr>
+        <w:pStyle w:val="ListParagraph"/>
+        <w:numPr>
+          <w:ilvl w:val="0"/>
+          <w:numId w:val="185"/>
+        </w:numPr>
+      </w:pPr>
+      <w:r>
+        <w:t>The answer is sent back to the client.</w:t>
+      </w:r>
+    </w:p>
+    <w:p/>
+    <w:p>
+      <w:r>
+        <w:t>Such a model of request execution guarantees uniform processing and keeps the separation of concerns intact.</w:t>
+      </w:r>
+    </w:p>
+    <w:p>
+      <w:pPr>
+        <w:spacing w:line="278" w:lineRule="auto"/>
+      </w:pPr>
+      <w:r>
+        <w:br w:type="page"/>
+      </w:r>
+    </w:p>
+    <w:p>
+      <w:pPr>
+        <w:pStyle w:val="Heading3"/>
+      </w:pPr>
+      <w:r>
+        <w:lastRenderedPageBreak/>
+        <w:t>Authentication and Authorization</w:t>
+      </w:r>
+    </w:p>
+    <w:p>
+      <w:r>
+        <w:t>API endpoints that need to be accessed securely demand user authentication using JSON Web Tokens (JWT). When authentication is successful, the backend generates an access token that contains information about the user along with the roles granted.</w:t>
+      </w:r>
+      <w:r>
+        <w:t xml:space="preserve"> </w:t>
+      </w:r>
+      <w:r>
+        <w:t>When making subsequent requests, the client sends the access token in the HTTP Authorization header. The authentication middleware verifies the token before granting access to the secured resources, whereas the authorization checks determine whether the user has the necessary permissions.</w:t>
+      </w:r>
+    </w:p>
+    <w:p>
+      <w:r>
+        <w:t>Access control based on user roles is implemented for the following user roles:</w:t>
+      </w:r>
+    </w:p>
+    <w:p>
+      <w:pPr>
+        <w:pStyle w:val="ListParagraph"/>
+        <w:numPr>
+          <w:ilvl w:val="0"/>
+          <w:numId w:val="186"/>
+        </w:numPr>
+      </w:pPr>
+      <w:r>
+        <w:t>Customer</w:t>
+      </w:r>
+    </w:p>
+    <w:p>
+      <w:pPr>
+        <w:pStyle w:val="ListParagraph"/>
+        <w:numPr>
+          <w:ilvl w:val="0"/>
+          <w:numId w:val="186"/>
+        </w:numPr>
+      </w:pPr>
+      <w:r>
+        <w:t>Agency Employee</w:t>
+      </w:r>
+    </w:p>
+    <w:p>
+      <w:pPr>
+        <w:pStyle w:val="ListParagraph"/>
+        <w:numPr>
+          <w:ilvl w:val="0"/>
+          <w:numId w:val="186"/>
+        </w:numPr>
+      </w:pPr>
+      <w:r>
+        <w:t>Agency Manager</w:t>
+      </w:r>
+    </w:p>
+    <w:p>
+      <w:pPr>
+        <w:pStyle w:val="ListParagraph"/>
+        <w:numPr>
+          <w:ilvl w:val="0"/>
+          <w:numId w:val="186"/>
+        </w:numPr>
+      </w:pPr>
+      <w:r>
+        <w:t>Administrator</w:t>
+      </w:r>
+    </w:p>
+    <w:p>
+      <w:r>
+        <w:t>The above approach helps to ensure that the user accesses only those functionalities he is supposed to access as per his responsibility.</w:t>
+      </w:r>
+    </w:p>
+    <w:p>
+      <w:pPr>
+        <w:pStyle w:val="Heading3"/>
+      </w:pPr>
+      <w:r>
+        <w:t>WebSocket Communication</w:t>
+      </w:r>
+    </w:p>
+    <w:p>
+      <w:r>
+        <w:t>Some functionalities in the application demand instant communication between the backend and the clients. For such use cases, the system uses WebSocket communication along with REST API.</w:t>
+      </w:r>
+      <w:r>
+        <w:t xml:space="preserve"> </w:t>
+      </w:r>
+      <w:r>
+        <w:t>WebSocket connection is established after the authentication of the user and remains active during the entire user session enabling server-side pushing of data without requiring client-side polling.</w:t>
+      </w:r>
+    </w:p>
+    <w:p>
+      <w:pPr>
+        <w:spacing w:after="0"/>
+      </w:pPr>
+      <w:r>
+        <w:t>Some common real-time events are:</w:t>
+      </w:r>
+    </w:p>
+    <w:p>
+      <w:pPr>
+        <w:spacing w:after="0"/>
+      </w:pPr>
+    </w:p>
+    <w:tbl>
+      <w:tblPr>
+        <w:tblStyle w:val="PlainTable1"/>
+        <w:tblW w:w="0" w:type="auto"/>
+        <w:tblCellMar>
+          <w:top w:w="72" w:type="dxa"/>
+          <w:bottom w:w="72" w:type="dxa"/>
+        </w:tblCellMar>
+        <w:tblLook w:val="04A0" w:firstRow="1" w:lastRow="0" w:firstColumn="1" w:lastColumn="0" w:noHBand="0" w:noVBand="1"/>
+      </w:tblPr>
+      <w:tblGrid>
+        <w:gridCol w:w="3775"/>
+        <w:gridCol w:w="5400"/>
+      </w:tblGrid>
+      <w:tr>
+        <w:trPr>
+          <w:cnfStyle w:val="100000000000" w:firstRow="1" w:lastRow="0" w:firstColumn="0" w:lastColumn="0" w:oddVBand="0" w:evenVBand="0" w:oddHBand="0" w:evenHBand="0" w:firstRowFirstColumn="0" w:firstRowLastColumn="0" w:lastRowFirstColumn="0" w:lastRowLastColumn="0"/>
+        </w:trPr>
+        <w:tc>
+          <w:tcPr>
+            <w:cnfStyle w:val="001000000000" w:firstRow="0" w:lastRow="0" w:firstColumn="1" w:lastColumn="0" w:oddVBand="0" w:evenVBand="0" w:oddHBand="0" w:evenHBand="0" w:firstRowFirstColumn="0" w:firstRowLastColumn="0" w:lastRowFirstColumn="0" w:lastRowLastColumn="0"/>
+            <w:tcW w:w="3775" w:type="dxa"/>
+            <w:vAlign w:val="center"/>
+            <w:hideMark/>
+          </w:tcPr>
+          <w:p>
+            <w:r>
+              <w:t>Event</w:t>
+            </w:r>
+          </w:p>
+        </w:tc>
+        <w:tc>
+          <w:tcPr>
+            <w:tcW w:w="5400" w:type="dxa"/>
+            <w:vAlign w:val="center"/>
+            <w:hideMark/>
+          </w:tcPr>
+          <w:p>
+            <w:pPr>
+              <w:cnfStyle w:val="100000000000" w:firstRow="1" w:lastRow="0" w:firstColumn="0" w:lastColumn="0" w:oddVBand="0" w:evenVBand="0" w:oddHBand="0" w:evenHBand="0" w:firstRowFirstColumn="0" w:firstRowLastColumn="0" w:lastRowFirstColumn="0" w:lastRowLastColumn="0"/>
+            </w:pPr>
+            <w:r>
+              <w:t>Purpose</w:t>
+            </w:r>
+          </w:p>
+        </w:tc>
+      </w:tr>
+      <w:tr>
+        <w:trPr>
+          <w:cnfStyle w:val="000000100000" w:firstRow="0" w:lastRow="0" w:firstColumn="0" w:lastColumn="0" w:oddVBand="0" w:evenVBand="0" w:oddHBand="1" w:evenHBand="0" w:firstRowFirstColumn="0" w:firstRowLastColumn="0" w:lastRowFirstColumn="0" w:lastRowLastColumn="0"/>
+        </w:trPr>
+        <w:tc>
+          <w:tcPr>
+            <w:cnfStyle w:val="001000000000" w:firstRow="0" w:lastRow="0" w:firstColumn="1" w:lastColumn="0" w:oddVBand="0" w:evenVBand="0" w:oddHBand="0" w:evenHBand="0" w:firstRowFirstColumn="0" w:firstRowLastColumn="0" w:lastRowFirstColumn="0" w:lastRowLastColumn="0"/>
+            <w:tcW w:w="3775" w:type="dxa"/>
+            <w:vAlign w:val="center"/>
+            <w:hideMark/>
+          </w:tcPr>
+          <w:p>
+            <w:pPr>
+              <w:rPr>
+                <w:b w:val="0"/>
+                <w:bCs w:val="0"/>
+              </w:rPr>
+            </w:pPr>
+            <w:r>
+              <w:rPr>
+                <w:b w:val="0"/>
+                <w:bCs w:val="0"/>
+              </w:rPr>
+              <w:t>Reservation Status Updated</w:t>
+            </w:r>
+          </w:p>
+        </w:tc>
+        <w:tc>
+          <w:tcPr>
+            <w:tcW w:w="5400" w:type="dxa"/>
+            <w:vAlign w:val="center"/>
+            <w:hideMark/>
+          </w:tcPr>
+          <w:p>
+            <w:pPr>
+              <w:cnfStyle w:val="000000100000" w:firstRow="0" w:lastRow="0" w:firstColumn="0" w:lastColumn="0" w:oddVBand="0" w:evenVBand="0" w:oddHBand="1" w:evenHBand="0" w:firstRowFirstColumn="0" w:firstRowLastColumn="0" w:lastRowFirstColumn="0" w:lastRowLastColumn="0"/>
+            </w:pPr>
+            <w:r>
+              <w:t>Notify customers of reservation changes</w:t>
+            </w:r>
+          </w:p>
+        </w:tc>
+      </w:tr>
+      <w:tr>
+        <w:tc>
+          <w:tcPr>
+            <w:cnfStyle w:val="001000000000" w:firstRow="0" w:lastRow="0" w:firstColumn="1" w:lastColumn="0" w:oddVBand="0" w:evenVBand="0" w:oddHBand="0" w:evenHBand="0" w:firstRowFirstColumn="0" w:firstRowLastColumn="0" w:lastRowFirstColumn="0" w:lastRowLastColumn="0"/>
+            <w:tcW w:w="3775" w:type="dxa"/>
+            <w:vAlign w:val="center"/>
+            <w:hideMark/>
+          </w:tcPr>
+          <w:p>
+            <w:pPr>
+              <w:rPr>
+                <w:b w:val="0"/>
+                <w:bCs w:val="0"/>
+              </w:rPr>
+            </w:pPr>
+            <w:r>
+              <w:rPr>
+                <w:b w:val="0"/>
+                <w:bCs w:val="0"/>
+              </w:rPr>
+              <w:t>Payment Confirmation</w:t>
+            </w:r>
+          </w:p>
+        </w:tc>
+        <w:tc>
+          <w:tcPr>
+            <w:tcW w:w="5400" w:type="dxa"/>
+            <w:vAlign w:val="center"/>
+            <w:hideMark/>
+          </w:tcPr>
+          <w:p>
+            <w:pPr>
+              <w:cnfStyle w:val="000000000000" w:firstRow="0" w:lastRow="0" w:firstColumn="0" w:lastColumn="0" w:oddVBand="0" w:evenVBand="0" w:oddHBand="0" w:evenHBand="0" w:firstRowFirstColumn="0" w:firstRowLastColumn="0" w:lastRowFirstColumn="0" w:lastRowLastColumn="0"/>
+            </w:pPr>
+            <w:r>
+              <w:t>Inform clients when payment succeeds</w:t>
+            </w:r>
+          </w:p>
+        </w:tc>
+      </w:tr>
+      <w:tr>
+        <w:trPr>
+          <w:cnfStyle w:val="000000100000" w:firstRow="0" w:lastRow="0" w:firstColumn="0" w:lastColumn="0" w:oddVBand="0" w:evenVBand="0" w:oddHBand="1" w:evenHBand="0" w:firstRowFirstColumn="0" w:firstRowLastColumn="0" w:lastRowFirstColumn="0" w:lastRowLastColumn="0"/>
+        </w:trPr>
+        <w:tc>
+          <w:tcPr>
+            <w:cnfStyle w:val="001000000000" w:firstRow="0" w:lastRow="0" w:firstColumn="1" w:lastColumn="0" w:oddVBand="0" w:evenVBand="0" w:oddHBand="0" w:evenHBand="0" w:firstRowFirstColumn="0" w:firstRowLastColumn="0" w:lastRowFirstColumn="0" w:lastRowLastColumn="0"/>
+            <w:tcW w:w="3775" w:type="dxa"/>
+            <w:vAlign w:val="center"/>
+            <w:hideMark/>
+          </w:tcPr>
+          <w:p>
+            <w:pPr>
+              <w:rPr>
+                <w:b w:val="0"/>
+                <w:bCs w:val="0"/>
+              </w:rPr>
+            </w:pPr>
+            <w:r>
+              <w:rPr>
+                <w:b w:val="0"/>
+                <w:bCs w:val="0"/>
+              </w:rPr>
+              <w:t>Agency Verification</w:t>
+            </w:r>
+          </w:p>
+        </w:tc>
+        <w:tc>
+          <w:tcPr>
+            <w:tcW w:w="5400" w:type="dxa"/>
+            <w:vAlign w:val="center"/>
+            <w:hideMark/>
+          </w:tcPr>
+          <w:p>
+            <w:pPr>
+              <w:cnfStyle w:val="000000100000" w:firstRow="0" w:lastRow="0" w:firstColumn="0" w:lastColumn="0" w:oddVBand="0" w:evenVBand="0" w:oddHBand="1" w:evenHBand="0" w:firstRowFirstColumn="0" w:firstRowLastColumn="0" w:lastRowFirstColumn="0" w:lastRowLastColumn="0"/>
+            </w:pPr>
+            <w:r>
+              <w:t>Notify agencies of verification decisions</w:t>
+            </w:r>
+          </w:p>
+        </w:tc>
+      </w:tr>
+      <w:tr>
+        <w:tc>
+          <w:tcPr>
+            <w:cnfStyle w:val="001000000000" w:firstRow="0" w:lastRow="0" w:firstColumn="1" w:lastColumn="0" w:oddVBand="0" w:evenVBand="0" w:oddHBand="0" w:evenHBand="0" w:firstRowFirstColumn="0" w:firstRowLastColumn="0" w:lastRowFirstColumn="0" w:lastRowLastColumn="0"/>
+            <w:tcW w:w="3775" w:type="dxa"/>
+            <w:vAlign w:val="center"/>
+            <w:hideMark/>
+          </w:tcPr>
+          <w:p>
+            <w:pPr>
+              <w:rPr>
+                <w:b w:val="0"/>
+                <w:bCs w:val="0"/>
+              </w:rPr>
+            </w:pPr>
+            <w:r>
+              <w:rPr>
+                <w:b w:val="0"/>
+                <w:bCs w:val="0"/>
+              </w:rPr>
+              <w:t>New Notifications</w:t>
+            </w:r>
+          </w:p>
+        </w:tc>
+        <w:tc>
+          <w:tcPr>
+            <w:tcW w:w="5400" w:type="dxa"/>
+            <w:vAlign w:val="center"/>
+            <w:hideMark/>
+          </w:tcPr>
+          <w:p>
+            <w:pPr>
+              <w:cnfStyle w:val="000000000000" w:firstRow="0" w:lastRow="0" w:firstColumn="0" w:lastColumn="0" w:oddVBand="0" w:evenVBand="0" w:oddHBand="0" w:evenHBand="0" w:firstRowFirstColumn="0" w:firstRowLastColumn="0" w:lastRowFirstColumn="0" w:lastRowLastColumn="0"/>
+            </w:pPr>
+            <w:r>
+              <w:t>Deliver real-time notifications</w:t>
+            </w:r>
+          </w:p>
+        </w:tc>
+      </w:tr>
+      <w:tr>
+        <w:trPr>
+          <w:cnfStyle w:val="000000100000" w:firstRow="0" w:lastRow="0" w:firstColumn="0" w:lastColumn="0" w:oddVBand="0" w:evenVBand="0" w:oddHBand="1" w:evenHBand="0" w:firstRowFirstColumn="0" w:firstRowLastColumn="0" w:lastRowFirstColumn="0" w:lastRowLastColumn="0"/>
+        </w:trPr>
+        <w:tc>
+          <w:tcPr>
+            <w:cnfStyle w:val="001000000000" w:firstRow="0" w:lastRow="0" w:firstColumn="1" w:lastColumn="0" w:oddVBand="0" w:evenVBand="0" w:oddHBand="0" w:evenHBand="0" w:firstRowFirstColumn="0" w:firstRowLastColumn="0" w:lastRowFirstColumn="0" w:lastRowLastColumn="0"/>
+            <w:tcW w:w="3775" w:type="dxa"/>
+            <w:vAlign w:val="center"/>
+            <w:hideMark/>
+          </w:tcPr>
+          <w:p>
+            <w:pPr>
+              <w:rPr>
+                <w:b w:val="0"/>
+                <w:bCs w:val="0"/>
+              </w:rPr>
+            </w:pPr>
+            <w:r>
+              <w:rPr>
+                <w:b w:val="0"/>
+                <w:bCs w:val="0"/>
+              </w:rPr>
+              <w:t>AI Processing Completed</w:t>
+            </w:r>
+          </w:p>
+        </w:tc>
+        <w:tc>
+          <w:tcPr>
+            <w:tcW w:w="5400" w:type="dxa"/>
+            <w:vAlign w:val="center"/>
+            <w:hideMark/>
+          </w:tcPr>
+          <w:p>
+            <w:pPr>
+              <w:cnfStyle w:val="000000100000" w:firstRow="0" w:lastRow="0" w:firstColumn="0" w:lastColumn="0" w:oddVBand="0" w:evenVBand="0" w:oddHBand="1" w:evenHBand="0" w:firstRowFirstColumn="0" w:firstRowLastColumn="0" w:lastRowFirstColumn="0" w:lastRowLastColumn="0"/>
+            </w:pPr>
+            <w:r>
+              <w:t>Return AI-generated results</w:t>
+            </w:r>
+          </w:p>
+        </w:tc>
+      </w:tr>
+      <w:tr>
+        <w:tc>
+          <w:tcPr>
+            <w:cnfStyle w:val="001000000000" w:firstRow="0" w:lastRow="0" w:firstColumn="1" w:lastColumn="0" w:oddVBand="0" w:evenVBand="0" w:oddHBand="0" w:evenHBand="0" w:firstRowFirstColumn="0" w:firstRowLastColumn="0" w:lastRowFirstColumn="0" w:lastRowLastColumn="0"/>
+            <w:tcW w:w="3775" w:type="dxa"/>
+            <w:vAlign w:val="center"/>
+            <w:hideMark/>
+          </w:tcPr>
+          <w:p>
+            <w:pPr>
+              <w:rPr>
+                <w:b w:val="0"/>
+                <w:bCs w:val="0"/>
+              </w:rPr>
+            </w:pPr>
+            <w:r>
+              <w:rPr>
+                <w:b w:val="0"/>
+                <w:bCs w:val="0"/>
+              </w:rPr>
+              <w:t>Administrative Alerts</w:t>
+            </w:r>
+          </w:p>
+        </w:tc>
+        <w:tc>
+          <w:tcPr>
+            <w:tcW w:w="5400" w:type="dxa"/>
+            <w:vAlign w:val="center"/>
+            <w:hideMark/>
+          </w:tcPr>
+          <w:p>
+            <w:pPr>
+              <w:cnfStyle w:val="000000000000" w:firstRow="0" w:lastRow="0" w:firstColumn="0" w:lastColumn="0" w:oddVBand="0" w:evenVBand="0" w:oddHBand="0" w:evenHBand="0" w:firstRowFirstColumn="0" w:firstRowLastColumn="0" w:lastRowFirstColumn="0" w:lastRowLastColumn="0"/>
+            </w:pPr>
+            <w:r>
+              <w:t>Update administrator dashboards</w:t>
+            </w:r>
+          </w:p>
+        </w:tc>
+      </w:tr>
+    </w:tbl>
+    <w:p>
+      <w:pPr>
+        <w:spacing w:before="240"/>
+      </w:pPr>
+      <w:r>
+        <w:t>This hybrid communication model combines the reliability of REST APIs with the responsiveness of WebSocket technology.</w:t>
+      </w:r>
+    </w:p>
+    <w:p>
+      <w:pPr>
+        <w:spacing w:line="278" w:lineRule="auto"/>
+        <w:rPr>
+          <w:rFonts w:asciiTheme="majorBidi" w:eastAsiaTheme="majorEastAsia" w:hAnsiTheme="majorBidi" w:cstheme="majorBidi"/>
+          <w:b/>
+          <w:color w:val="000000" w:themeColor="text1"/>
+          <w:szCs w:val="28"/>
+        </w:rPr>
+      </w:pPr>
+      <w:r>
+        <w:br w:type="page"/>
+      </w:r>
+    </w:p>
+    <w:p>
+      <w:pPr>
+        <w:pStyle w:val="Heading3"/>
+      </w:pPr>
+      <w:r>
+        <w:lastRenderedPageBreak/>
+        <w:t>API Security</w:t>
+      </w:r>
+    </w:p>
+    <w:p>
+      <w:r>
+        <w:t>API communication layer is made up of several security controls whose purpose is to protect clients and backend services against any kind of attacks and malicious requests.</w:t>
+      </w:r>
+    </w:p>
+    <w:p>
+      <w:r>
+        <w:t>These security controls include:</w:t>
+      </w:r>
+    </w:p>
+    <w:p>
+      <w:pPr>
+        <w:pStyle w:val="ListParagraph"/>
+        <w:numPr>
+          <w:ilvl w:val="0"/>
+          <w:numId w:val="187"/>
+        </w:numPr>
+      </w:pPr>
+      <w:r>
+        <w:t>HTTPS encrypted communication</w:t>
+      </w:r>
+      <w:r>
+        <w:t xml:space="preserve"> &amp; </w:t>
+      </w:r>
+      <w:r>
+        <w:t>Authentication using JWT</w:t>
+      </w:r>
+    </w:p>
+    <w:p>
+      <w:pPr>
+        <w:pStyle w:val="ListParagraph"/>
+        <w:numPr>
+          <w:ilvl w:val="0"/>
+          <w:numId w:val="187"/>
+        </w:numPr>
+      </w:pPr>
+      <w:r>
+        <w:t>Role Based Access Control (RBAC)</w:t>
+      </w:r>
+    </w:p>
+    <w:p>
+      <w:pPr>
+        <w:pStyle w:val="ListParagraph"/>
+        <w:numPr>
+          <w:ilvl w:val="0"/>
+          <w:numId w:val="187"/>
+        </w:numPr>
+      </w:pPr>
+      <w:r>
+        <w:t>Validation of requests using DTOs</w:t>
+      </w:r>
+      <w:r>
+        <w:t xml:space="preserve"> &amp; </w:t>
+      </w:r>
+      <w:r>
+        <w:t>Sanitization of input</w:t>
+      </w:r>
+    </w:p>
+    <w:p>
+      <w:pPr>
+        <w:pStyle w:val="ListParagraph"/>
+        <w:numPr>
+          <w:ilvl w:val="0"/>
+          <w:numId w:val="187"/>
+        </w:numPr>
+      </w:pPr>
+      <w:r>
+        <w:t>Rate Limiting</w:t>
+      </w:r>
+    </w:p>
+    <w:p>
+      <w:pPr>
+        <w:pStyle w:val="ListParagraph"/>
+        <w:numPr>
+          <w:ilvl w:val="0"/>
+          <w:numId w:val="187"/>
+        </w:numPr>
+      </w:pPr>
+      <w:r>
+        <w:t>Enforcing CORS policy</w:t>
+      </w:r>
+    </w:p>
+    <w:p>
+      <w:pPr>
+        <w:pStyle w:val="ListParagraph"/>
+        <w:numPr>
+          <w:ilvl w:val="0"/>
+          <w:numId w:val="187"/>
+        </w:numPr>
+      </w:pPr>
+      <w:r>
+        <w:t>Exception handling</w:t>
+      </w:r>
+    </w:p>
+    <w:p>
+      <w:pPr>
+        <w:pStyle w:val="ListParagraph"/>
+        <w:numPr>
+          <w:ilvl w:val="0"/>
+          <w:numId w:val="187"/>
+        </w:numPr>
+      </w:pPr>
+      <w:r>
+        <w:t>Audit Logging</w:t>
+      </w:r>
+    </w:p>
+    <w:p>
+      <w:r>
+        <w:t>Together these security controls provide confidentiality, integrity, and availability of the platform resources.</w:t>
+      </w:r>
+    </w:p>
+    <w:p>
+      <w:pPr>
+        <w:pStyle w:val="Heading3"/>
+      </w:pPr>
+      <w:r>
+        <w:t>Error Handling</w:t>
+      </w:r>
+    </w:p>
+    <w:p>
+      <w:r>
+        <w:t>The backend uses centralized exception handling in order to ensure that all API exceptions have a consistent response. Instead of leaking implementation details, the backend sends standard error messages along with appropriate HTTP response codes.</w:t>
+      </w:r>
+    </w:p>
+    <w:p>
+      <w:r>
+        <w:t>Common HTTP response codes are:</w:t>
+      </w:r>
+    </w:p>
+    <w:tbl>
+      <w:tblPr>
+        <w:tblStyle w:val="PlainTable1"/>
+        <w:tblW w:w="0" w:type="auto"/>
+        <w:tblCellMar>
+          <w:top w:w="72" w:type="dxa"/>
+          <w:bottom w:w="72" w:type="dxa"/>
+        </w:tblCellMar>
+        <w:tblLook w:val="04A0" w:firstRow="1" w:lastRow="0" w:firstColumn="1" w:lastColumn="0" w:noHBand="0" w:noVBand="1"/>
+      </w:tblPr>
+      <w:tblGrid>
+        <w:gridCol w:w="3505"/>
+        <w:gridCol w:w="5580"/>
+      </w:tblGrid>
+      <w:tr>
+        <w:trPr>
+          <w:cnfStyle w:val="100000000000" w:firstRow="1" w:lastRow="0" w:firstColumn="0" w:lastColumn="0" w:oddVBand="0" w:evenVBand="0" w:oddHBand="0" w:evenHBand="0" w:firstRowFirstColumn="0" w:firstRowLastColumn="0" w:lastRowFirstColumn="0" w:lastRowLastColumn="0"/>
+        </w:trPr>
+        <w:tc>
+          <w:tcPr>
+            <w:cnfStyle w:val="001000000000" w:firstRow="0" w:lastRow="0" w:firstColumn="1" w:lastColumn="0" w:oddVBand="0" w:evenVBand="0" w:oddHBand="0" w:evenHBand="0" w:firstRowFirstColumn="0" w:firstRowLastColumn="0" w:lastRowFirstColumn="0" w:lastRowLastColumn="0"/>
+            <w:tcW w:w="3505" w:type="dxa"/>
+            <w:vAlign w:val="center"/>
+            <w:hideMark/>
+          </w:tcPr>
+          <w:p>
+            <w:r>
+              <w:t>HTTP Status</w:t>
+            </w:r>
+          </w:p>
+        </w:tc>
+        <w:tc>
+          <w:tcPr>
+            <w:tcW w:w="5580" w:type="dxa"/>
+            <w:vAlign w:val="center"/>
+            <w:hideMark/>
+          </w:tcPr>
+          <w:p>
+            <w:pPr>
+              <w:cnfStyle w:val="100000000000" w:firstRow="1" w:lastRow="0" w:firstColumn="0" w:lastColumn="0" w:oddVBand="0" w:evenVBand="0" w:oddHBand="0" w:evenHBand="0" w:firstRowFirstColumn="0" w:firstRowLastColumn="0" w:lastRowFirstColumn="0" w:lastRowLastColumn="0"/>
+            </w:pPr>
+            <w:r>
+              <w:t>Description</w:t>
+            </w:r>
+          </w:p>
+        </w:tc>
+      </w:tr>
+      <w:tr>
+        <w:trPr>
+          <w:cnfStyle w:val="000000100000" w:firstRow="0" w:lastRow="0" w:firstColumn="0" w:lastColumn="0" w:oddVBand="0" w:evenVBand="0" w:oddHBand="1" w:evenHBand="0" w:firstRowFirstColumn="0" w:firstRowLastColumn="0" w:lastRowFirstColumn="0" w:lastRowLastColumn="0"/>
+        </w:trPr>
+        <w:tc>
+          <w:tcPr>
+            <w:cnfStyle w:val="001000000000" w:firstRow="0" w:lastRow="0" w:firstColumn="1" w:lastColumn="0" w:oddVBand="0" w:evenVBand="0" w:oddHBand="0" w:evenHBand="0" w:firstRowFirstColumn="0" w:firstRowLastColumn="0" w:lastRowFirstColumn="0" w:lastRowLastColumn="0"/>
+            <w:tcW w:w="3505" w:type="dxa"/>
+            <w:vAlign w:val="center"/>
+            <w:hideMark/>
+          </w:tcPr>
+          <w:p>
+            <w:pPr>
+              <w:rPr>
+                <w:b w:val="0"/>
+                <w:bCs w:val="0"/>
+              </w:rPr>
+            </w:pPr>
+            <w:r>
+              <w:rPr>
+                <w:b w:val="0"/>
+                <w:bCs w:val="0"/>
+              </w:rPr>
+              <w:t>200 OK</w:t>
+            </w:r>
+          </w:p>
+        </w:tc>
+        <w:tc>
+          <w:tcPr>
+            <w:tcW w:w="5580" w:type="dxa"/>
+            <w:vAlign w:val="center"/>
+            <w:hideMark/>
+          </w:tcPr>
+          <w:p>
+            <w:pPr>
+              <w:cnfStyle w:val="000000100000" w:firstRow="0" w:lastRow="0" w:firstColumn="0" w:lastColumn="0" w:oddVBand="0" w:evenVBand="0" w:oddHBand="1" w:evenHBand="0" w:firstRowFirstColumn="0" w:firstRowLastColumn="0" w:lastRowFirstColumn="0" w:lastRowLastColumn="0"/>
+            </w:pPr>
+            <w:r>
+              <w:t>Request completed successfully</w:t>
+            </w:r>
+          </w:p>
+        </w:tc>
+      </w:tr>
+      <w:tr>
+        <w:tc>
+          <w:tcPr>
+            <w:cnfStyle w:val="001000000000" w:firstRow="0" w:lastRow="0" w:firstColumn="1" w:lastColumn="0" w:oddVBand="0" w:evenVBand="0" w:oddHBand="0" w:evenHBand="0" w:firstRowFirstColumn="0" w:firstRowLastColumn="0" w:lastRowFirstColumn="0" w:lastRowLastColumn="0"/>
+            <w:tcW w:w="3505" w:type="dxa"/>
+            <w:vAlign w:val="center"/>
+            <w:hideMark/>
+          </w:tcPr>
+          <w:p>
+            <w:pPr>
+              <w:rPr>
+                <w:b w:val="0"/>
+                <w:bCs w:val="0"/>
+              </w:rPr>
+            </w:pPr>
+            <w:r>
+              <w:rPr>
+                <w:b w:val="0"/>
+                <w:bCs w:val="0"/>
+              </w:rPr>
+              <w:t>201 Created</w:t>
+            </w:r>
+          </w:p>
+        </w:tc>
+        <w:tc>
+          <w:tcPr>
+            <w:tcW w:w="5580" w:type="dxa"/>
+            <w:vAlign w:val="center"/>
+            <w:hideMark/>
+          </w:tcPr>
+          <w:p>
+            <w:pPr>
+              <w:cnfStyle w:val="000000000000" w:firstRow="0" w:lastRow="0" w:firstColumn="0" w:lastColumn="0" w:oddVBand="0" w:evenVBand="0" w:oddHBand="0" w:evenHBand="0" w:firstRowFirstColumn="0" w:firstRowLastColumn="0" w:lastRowFirstColumn="0" w:lastRowLastColumn="0"/>
+            </w:pPr>
+            <w:r>
+              <w:t>Resource created successfully</w:t>
+            </w:r>
+          </w:p>
+        </w:tc>
+      </w:tr>
+      <w:tr>
+        <w:trPr>
+          <w:cnfStyle w:val="000000100000" w:firstRow="0" w:lastRow="0" w:firstColumn="0" w:lastColumn="0" w:oddVBand="0" w:evenVBand="0" w:oddHBand="1" w:evenHBand="0" w:firstRowFirstColumn="0" w:firstRowLastColumn="0" w:lastRowFirstColumn="0" w:lastRowLastColumn="0"/>
+        </w:trPr>
+        <w:tc>
+          <w:tcPr>
+            <w:cnfStyle w:val="001000000000" w:firstRow="0" w:lastRow="0" w:firstColumn="1" w:lastColumn="0" w:oddVBand="0" w:evenVBand="0" w:oddHBand="0" w:evenHBand="0" w:firstRowFirstColumn="0" w:firstRowLastColumn="0" w:lastRowFirstColumn="0" w:lastRowLastColumn="0"/>
+            <w:tcW w:w="3505" w:type="dxa"/>
+            <w:vAlign w:val="center"/>
+            <w:hideMark/>
+          </w:tcPr>
+          <w:p>
+            <w:pPr>
+              <w:rPr>
+                <w:b w:val="0"/>
+                <w:bCs w:val="0"/>
+              </w:rPr>
+            </w:pPr>
+            <w:r>
+              <w:rPr>
+                <w:b w:val="0"/>
+                <w:bCs w:val="0"/>
+              </w:rPr>
+              <w:t>400 Bad Request</w:t>
+            </w:r>
+          </w:p>
+        </w:tc>
+        <w:tc>
+          <w:tcPr>
+            <w:tcW w:w="5580" w:type="dxa"/>
+            <w:vAlign w:val="center"/>
+            <w:hideMark/>
+          </w:tcPr>
+          <w:p>
+            <w:pPr>
+              <w:cnfStyle w:val="000000100000" w:firstRow="0" w:lastRow="0" w:firstColumn="0" w:lastColumn="0" w:oddVBand="0" w:evenVBand="0" w:oddHBand="1" w:evenHBand="0" w:firstRowFirstColumn="0" w:firstRowLastColumn="0" w:lastRowFirstColumn="0" w:lastRowLastColumn="0"/>
+            </w:pPr>
+            <w:r>
+              <w:t>Invalid request data</w:t>
+            </w:r>
+          </w:p>
+        </w:tc>
+      </w:tr>
+      <w:tr>
+        <w:tc>
+          <w:tcPr>
+            <w:cnfStyle w:val="001000000000" w:firstRow="0" w:lastRow="0" w:firstColumn="1" w:lastColumn="0" w:oddVBand="0" w:evenVBand="0" w:oddHBand="0" w:evenHBand="0" w:firstRowFirstColumn="0" w:firstRowLastColumn="0" w:lastRowFirstColumn="0" w:lastRowLastColumn="0"/>
+            <w:tcW w:w="3505" w:type="dxa"/>
+            <w:vAlign w:val="center"/>
+            <w:hideMark/>
+          </w:tcPr>
+          <w:p>
+            <w:pPr>
+              <w:rPr>
+                <w:b w:val="0"/>
+                <w:bCs w:val="0"/>
+              </w:rPr>
+            </w:pPr>
+            <w:r>
+              <w:rPr>
+                <w:b w:val="0"/>
+                <w:bCs w:val="0"/>
+              </w:rPr>
+              <w:t>401 Unauthorized</w:t>
+            </w:r>
+          </w:p>
+        </w:tc>
+        <w:tc>
+          <w:tcPr>
+            <w:tcW w:w="5580" w:type="dxa"/>
+            <w:vAlign w:val="center"/>
+            <w:hideMark/>
+          </w:tcPr>
+          <w:p>
+            <w:pPr>
+              <w:cnfStyle w:val="000000000000" w:firstRow="0" w:lastRow="0" w:firstColumn="0" w:lastColumn="0" w:oddVBand="0" w:evenVBand="0" w:oddHBand="0" w:evenHBand="0" w:firstRowFirstColumn="0" w:firstRowLastColumn="0" w:lastRowFirstColumn="0" w:lastRowLastColumn="0"/>
+            </w:pPr>
+            <w:r>
+              <w:t>Authentication required</w:t>
+            </w:r>
+          </w:p>
+        </w:tc>
+      </w:tr>
+      <w:tr>
+        <w:trPr>
+          <w:cnfStyle w:val="000000100000" w:firstRow="0" w:lastRow="0" w:firstColumn="0" w:lastColumn="0" w:oddVBand="0" w:evenVBand="0" w:oddHBand="1" w:evenHBand="0" w:firstRowFirstColumn="0" w:firstRowLastColumn="0" w:lastRowFirstColumn="0" w:lastRowLastColumn="0"/>
+        </w:trPr>
+        <w:tc>
+          <w:tcPr>
+            <w:cnfStyle w:val="001000000000" w:firstRow="0" w:lastRow="0" w:firstColumn="1" w:lastColumn="0" w:oddVBand="0" w:evenVBand="0" w:oddHBand="0" w:evenHBand="0" w:firstRowFirstColumn="0" w:firstRowLastColumn="0" w:lastRowFirstColumn="0" w:lastRowLastColumn="0"/>
+            <w:tcW w:w="3505" w:type="dxa"/>
+            <w:vAlign w:val="center"/>
+            <w:hideMark/>
+          </w:tcPr>
+          <w:p>
+            <w:pPr>
+              <w:rPr>
+                <w:b w:val="0"/>
+                <w:bCs w:val="0"/>
+              </w:rPr>
+            </w:pPr>
+            <w:r>
+              <w:rPr>
+                <w:b w:val="0"/>
+                <w:bCs w:val="0"/>
+              </w:rPr>
+              <w:t>403 Forbidden</w:t>
+            </w:r>
+          </w:p>
+        </w:tc>
+        <w:tc>
+          <w:tcPr>
+            <w:tcW w:w="5580" w:type="dxa"/>
+            <w:vAlign w:val="center"/>
+            <w:hideMark/>
+          </w:tcPr>
+          <w:p>
+            <w:pPr>
+              <w:cnfStyle w:val="000000100000" w:firstRow="0" w:lastRow="0" w:firstColumn="0" w:lastColumn="0" w:oddVBand="0" w:evenVBand="0" w:oddHBand="1" w:evenHBand="0" w:firstRowFirstColumn="0" w:firstRowLastColumn="0" w:lastRowFirstColumn="0" w:lastRowLastColumn="0"/>
+            </w:pPr>
+            <w:r>
+              <w:t>Insufficient permissions</w:t>
+            </w:r>
+          </w:p>
+        </w:tc>
+      </w:tr>
+      <w:tr>
+        <w:tc>
+          <w:tcPr>
+            <w:cnfStyle w:val="001000000000" w:firstRow="0" w:lastRow="0" w:firstColumn="1" w:lastColumn="0" w:oddVBand="0" w:evenVBand="0" w:oddHBand="0" w:evenHBand="0" w:firstRowFirstColumn="0" w:firstRowLastColumn="0" w:lastRowFirstColumn="0" w:lastRowLastColumn="0"/>
+            <w:tcW w:w="3505" w:type="dxa"/>
+            <w:vAlign w:val="center"/>
+            <w:hideMark/>
+          </w:tcPr>
+          <w:p>
+            <w:pPr>
+              <w:rPr>
+                <w:b w:val="0"/>
+                <w:bCs w:val="0"/>
+              </w:rPr>
+            </w:pPr>
+            <w:r>
+              <w:rPr>
+                <w:b w:val="0"/>
+                <w:bCs w:val="0"/>
+              </w:rPr>
+              <w:t>404 Not Found</w:t>
+            </w:r>
+          </w:p>
+        </w:tc>
+        <w:tc>
+          <w:tcPr>
+            <w:tcW w:w="5580" w:type="dxa"/>
+            <w:vAlign w:val="center"/>
+            <w:hideMark/>
+          </w:tcPr>
+          <w:p>
+            <w:pPr>
+              <w:cnfStyle w:val="000000000000" w:firstRow="0" w:lastRow="0" w:firstColumn="0" w:lastColumn="0" w:oddVBand="0" w:evenVBand="0" w:oddHBand="0" w:evenHBand="0" w:firstRowFirstColumn="0" w:firstRowLastColumn="0" w:lastRowFirstColumn="0" w:lastRowLastColumn="0"/>
+            </w:pPr>
+            <w:r>
+              <w:t>Requested resource not found</w:t>
+            </w:r>
+          </w:p>
+        </w:tc>
+      </w:tr>
+      <w:tr>
+        <w:trPr>
+          <w:cnfStyle w:val="000000100000" w:firstRow="0" w:lastRow="0" w:firstColumn="0" w:lastColumn="0" w:oddVBand="0" w:evenVBand="0" w:oddHBand="1" w:evenHBand="0" w:firstRowFirstColumn="0" w:firstRowLastColumn="0" w:lastRowFirstColumn="0" w:lastRowLastColumn="0"/>
+          <w:trHeight w:val="25"/>
+        </w:trPr>
+        <w:tc>
+          <w:tcPr>
+            <w:cnfStyle w:val="001000000000" w:firstRow="0" w:lastRow="0" w:firstColumn="1" w:lastColumn="0" w:oddVBand="0" w:evenVBand="0" w:oddHBand="0" w:evenHBand="0" w:firstRowFirstColumn="0" w:firstRowLastColumn="0" w:lastRowFirstColumn="0" w:lastRowLastColumn="0"/>
+            <w:tcW w:w="3505" w:type="dxa"/>
+            <w:vAlign w:val="center"/>
+            <w:hideMark/>
+          </w:tcPr>
+          <w:p>
+            <w:pPr>
+              <w:rPr>
+                <w:b w:val="0"/>
+                <w:bCs w:val="0"/>
+              </w:rPr>
+            </w:pPr>
+            <w:r>
+              <w:rPr>
+                <w:b w:val="0"/>
+                <w:bCs w:val="0"/>
+              </w:rPr>
+              <w:t>409 Conflict</w:t>
+            </w:r>
+          </w:p>
+        </w:tc>
+        <w:tc>
+          <w:tcPr>
+            <w:tcW w:w="5580" w:type="dxa"/>
+            <w:vAlign w:val="center"/>
+            <w:hideMark/>
+          </w:tcPr>
+          <w:p>
+            <w:pPr>
+              <w:cnfStyle w:val="000000100000" w:firstRow="0" w:lastRow="0" w:firstColumn="0" w:lastColumn="0" w:oddVBand="0" w:evenVBand="0" w:oddHBand="1" w:evenHBand="0" w:firstRowFirstColumn="0" w:firstRowLastColumn="0" w:lastRowFirstColumn="0" w:lastRowLastColumn="0"/>
+            </w:pPr>
+            <w:r>
+              <w:t>Business rule violation</w:t>
+            </w:r>
+          </w:p>
+        </w:tc>
+      </w:tr>
+      <w:tr>
+        <w:tc>
+          <w:tcPr>
+            <w:cnfStyle w:val="001000000000" w:firstRow="0" w:lastRow="0" w:firstColumn="1" w:lastColumn="0" w:oddVBand="0" w:evenVBand="0" w:oddHBand="0" w:evenHBand="0" w:firstRowFirstColumn="0" w:firstRowLastColumn="0" w:lastRowFirstColumn="0" w:lastRowLastColumn="0"/>
+            <w:tcW w:w="3505" w:type="dxa"/>
+            <w:vAlign w:val="center"/>
+            <w:hideMark/>
+          </w:tcPr>
+          <w:p>
+            <w:pPr>
+              <w:rPr>
+                <w:b w:val="0"/>
+                <w:bCs w:val="0"/>
+              </w:rPr>
+            </w:pPr>
+            <w:r>
+              <w:rPr>
+                <w:b w:val="0"/>
+                <w:bCs w:val="0"/>
+              </w:rPr>
+              <w:t>500 Internal Server Error</w:t>
+            </w:r>
+          </w:p>
+        </w:tc>
+        <w:tc>
+          <w:tcPr>
+            <w:tcW w:w="5580" w:type="dxa"/>
+            <w:vAlign w:val="center"/>
+            <w:hideMark/>
+          </w:tcPr>
+          <w:p>
+            <w:pPr>
+              <w:cnfStyle w:val="000000000000" w:firstRow="0" w:lastRow="0" w:firstColumn="0" w:lastColumn="0" w:oddVBand="0" w:evenVBand="0" w:oddHBand="0" w:evenHBand="0" w:firstRowFirstColumn="0" w:firstRowLastColumn="0" w:lastRowFirstColumn="0" w:lastRowLastColumn="0"/>
+            </w:pPr>
+            <w:r>
+              <w:t>Unexpected server error</w:t>
+            </w:r>
+          </w:p>
+        </w:tc>
+      </w:tr>
+    </w:tbl>
+    <w:p/>
+    <w:p>
+      <w:pPr>
+        <w:spacing w:after="0"/>
+      </w:pPr>
+      <w:r>
+        <w:t>This model simplifies the application performance but also minimizes the difficulties associated with the debugging process and the error management at the client side.</w:t>
+      </w:r>
+    </w:p>
+    <w:p>
+      <w:pPr>
+        <w:pStyle w:val="Heading3"/>
+      </w:pPr>
+      <w:r>
+        <w:t>Advantages of the API Communication Architecture</w:t>
+      </w:r>
+    </w:p>
+    <w:p>
+      <w:pPr>
+        <w:spacing w:after="0"/>
+      </w:pPr>
+      <w:r>
+        <w:t>The chosen API communication architecture allows for having a common interface via which all client applications can interact with the back-end services. The use of REST architecture increases the level of interoperability and makes possible the integration with other platforms; meanwhile, the WebSocket-based communication allows for the efficient exchange of data in real time. Meanwhile, the security features provide the access control of the protected resources, whereas validation and exception handling ensure the consistency of requests processing. Also, the modularity of the API allows for future improvements of the KriGo platform.</w:t>
+      </w:r>
+    </w:p>
     <w:sectPr>
       <w:headerReference w:type="default" r:id="rId27"/>
       <w:footerReference w:type="default" r:id="rId28"/>
@@ -14688,6 +16574,119 @@
     </w:lvl>
   </w:abstractNum>
   <w:abstractNum w:abstractNumId="19" w15:restartNumberingAfterBreak="0">
+    <w:nsid w:val="15A463B3"/>
+    <w:multiLevelType w:val="hybridMultilevel"/>
+    <w:tmpl w:val="35F2F666"/>
+    <w:lvl w:ilvl="0" w:tplc="04090005">
+      <w:start w:val="1"/>
+      <w:numFmt w:val="bullet"/>
+      <w:lvlText w:val=""/>
+      <w:lvlJc w:val="left"/>
+      <w:pPr>
+        <w:ind w:left="720" w:hanging="360"/>
+      </w:pPr>
+      <w:rPr>
+        <w:rFonts w:ascii="Wingdings" w:hAnsi="Wingdings" w:hint="default"/>
+      </w:rPr>
+    </w:lvl>
+    <w:lvl w:ilvl="1" w:tplc="04090003" w:tentative="1">
+      <w:start w:val="1"/>
+      <w:numFmt w:val="bullet"/>
+      <w:lvlText w:val="o"/>
+      <w:lvlJc w:val="left"/>
+      <w:pPr>
+        <w:ind w:left="1440" w:hanging="360"/>
+      </w:pPr>
+      <w:rPr>
+        <w:rFonts w:ascii="Courier New" w:hAnsi="Courier New" w:cs="Courier New" w:hint="default"/>
+      </w:rPr>
+    </w:lvl>
+    <w:lvl w:ilvl="2" w:tplc="04090005" w:tentative="1">
+      <w:start w:val="1"/>
+      <w:numFmt w:val="bullet"/>
+      <w:lvlText w:val=""/>
+      <w:lvlJc w:val="left"/>
+      <w:pPr>
+        <w:ind w:left="2160" w:hanging="360"/>
+      </w:pPr>
+      <w:rPr>
+        <w:rFonts w:ascii="Wingdings" w:hAnsi="Wingdings" w:hint="default"/>
+      </w:rPr>
+    </w:lvl>
+    <w:lvl w:ilvl="3" w:tplc="04090001" w:tentative="1">
+      <w:start w:val="1"/>
+      <w:numFmt w:val="bullet"/>
+      <w:lvlText w:val=""/>
+      <w:lvlJc w:val="left"/>
+      <w:pPr>
+        <w:ind w:left="2880" w:hanging="360"/>
+      </w:pPr>
+      <w:rPr>
+        <w:rFonts w:ascii="Symbol" w:hAnsi="Symbol" w:hint="default"/>
+      </w:rPr>
+    </w:lvl>
+    <w:lvl w:ilvl="4" w:tplc="04090003" w:tentative="1">
+      <w:start w:val="1"/>
+      <w:numFmt w:val="bullet"/>
+      <w:lvlText w:val="o"/>
+      <w:lvlJc w:val="left"/>
+      <w:pPr>
+        <w:ind w:left="3600" w:hanging="360"/>
+      </w:pPr>
+      <w:rPr>
+        <w:rFonts w:ascii="Courier New" w:hAnsi="Courier New" w:cs="Courier New" w:hint="default"/>
+      </w:rPr>
+    </w:lvl>
+    <w:lvl w:ilvl="5" w:tplc="04090005" w:tentative="1">
+      <w:start w:val="1"/>
+      <w:numFmt w:val="bullet"/>
+      <w:lvlText w:val=""/>
+      <w:lvlJc w:val="left"/>
+      <w:pPr>
+        <w:ind w:left="4320" w:hanging="360"/>
+      </w:pPr>
+      <w:rPr>
+        <w:rFonts w:ascii="Wingdings" w:hAnsi="Wingdings" w:hint="default"/>
+      </w:rPr>
+    </w:lvl>
+    <w:lvl w:ilvl="6" w:tplc="04090001" w:tentative="1">
+      <w:start w:val="1"/>
+      <w:numFmt w:val="bullet"/>
+      <w:lvlText w:val=""/>
+      <w:lvlJc w:val="left"/>
+      <w:pPr>
+        <w:ind w:left="5040" w:hanging="360"/>
+      </w:pPr>
+      <w:rPr>
+        <w:rFonts w:ascii="Symbol" w:hAnsi="Symbol" w:hint="default"/>
+      </w:rPr>
+    </w:lvl>
+    <w:lvl w:ilvl="7" w:tplc="04090003" w:tentative="1">
+      <w:start w:val="1"/>
+      <w:numFmt w:val="bullet"/>
+      <w:lvlText w:val="o"/>
+      <w:lvlJc w:val="left"/>
+      <w:pPr>
+        <w:ind w:left="5760" w:hanging="360"/>
+      </w:pPr>
+      <w:rPr>
+        <w:rFonts w:ascii="Courier New" w:hAnsi="Courier New" w:cs="Courier New" w:hint="default"/>
+      </w:rPr>
+    </w:lvl>
+    <w:lvl w:ilvl="8" w:tplc="04090005" w:tentative="1">
+      <w:start w:val="1"/>
+      <w:numFmt w:val="bullet"/>
+      <w:lvlText w:val=""/>
+      <w:lvlJc w:val="left"/>
+      <w:pPr>
+        <w:ind w:left="6480" w:hanging="360"/>
+      </w:pPr>
+      <w:rPr>
+        <w:rFonts w:ascii="Wingdings" w:hAnsi="Wingdings" w:hint="default"/>
+      </w:rPr>
+    </w:lvl>
+  </w:abstractNum>
+  <w:abstractNum w:abstractNumId="20" w15:restartNumberingAfterBreak="0">
     <w:nsid w:val="15E231DD"/>
     <w:multiLevelType w:val="hybridMultilevel"/>
     <w:tmpl w:val="48B4AB8E"/>
@@ -14800,7 +16799,7 @@
       </w:rPr>
     </w:lvl>
   </w:abstractNum>
-  <w:abstractNum w:abstractNumId="20" w15:restartNumberingAfterBreak="0">
+  <w:abstractNum w:abstractNumId="21" w15:restartNumberingAfterBreak="0">
     <w:nsid w:val="15FB6E59"/>
     <w:multiLevelType w:val="multilevel"/>
     <w:tmpl w:val="63F4E6F0"/>
@@ -14949,7 +16948,7 @@
       </w:rPr>
     </w:lvl>
   </w:abstractNum>
-  <w:abstractNum w:abstractNumId="21" w15:restartNumberingAfterBreak="0">
+  <w:abstractNum w:abstractNumId="22" w15:restartNumberingAfterBreak="0">
     <w:nsid w:val="16057B40"/>
     <w:multiLevelType w:val="hybridMultilevel"/>
     <w:tmpl w:val="C63C7D68"/>
@@ -15061,7 +17060,7 @@
       </w:rPr>
     </w:lvl>
   </w:abstractNum>
-  <w:abstractNum w:abstractNumId="22" w15:restartNumberingAfterBreak="0">
+  <w:abstractNum w:abstractNumId="23" w15:restartNumberingAfterBreak="0">
     <w:nsid w:val="18441B3D"/>
     <w:multiLevelType w:val="hybridMultilevel"/>
     <w:tmpl w:val="F162D252"/>
@@ -15173,7 +17172,7 @@
       </w:rPr>
     </w:lvl>
   </w:abstractNum>
-  <w:abstractNum w:abstractNumId="23" w15:restartNumberingAfterBreak="0">
+  <w:abstractNum w:abstractNumId="24" w15:restartNumberingAfterBreak="0">
     <w:nsid w:val="185230B0"/>
     <w:multiLevelType w:val="hybridMultilevel"/>
     <w:tmpl w:val="FDFE89EE"/>
@@ -15286,7 +17285,7 @@
       </w:rPr>
     </w:lvl>
   </w:abstractNum>
-  <w:abstractNum w:abstractNumId="24" w15:restartNumberingAfterBreak="0">
+  <w:abstractNum w:abstractNumId="25" w15:restartNumberingAfterBreak="0">
     <w:nsid w:val="18A93E35"/>
     <w:multiLevelType w:val="hybridMultilevel"/>
     <w:tmpl w:val="7A6E3062"/>
@@ -15398,7 +17397,7 @@
       </w:rPr>
     </w:lvl>
   </w:abstractNum>
-  <w:abstractNum w:abstractNumId="25" w15:restartNumberingAfterBreak="0">
+  <w:abstractNum w:abstractNumId="26" w15:restartNumberingAfterBreak="0">
     <w:nsid w:val="18EC3D82"/>
     <w:multiLevelType w:val="hybridMultilevel"/>
     <w:tmpl w:val="BC5A743C"/>
@@ -15511,7 +17510,7 @@
       </w:rPr>
     </w:lvl>
   </w:abstractNum>
-  <w:abstractNum w:abstractNumId="26" w15:restartNumberingAfterBreak="0">
+  <w:abstractNum w:abstractNumId="27" w15:restartNumberingAfterBreak="0">
     <w:nsid w:val="18F46E01"/>
     <w:multiLevelType w:val="multilevel"/>
     <w:tmpl w:val="C77EDED0"/>
@@ -15660,7 +17659,7 @@
       </w:rPr>
     </w:lvl>
   </w:abstractNum>
-  <w:abstractNum w:abstractNumId="27" w15:restartNumberingAfterBreak="0">
+  <w:abstractNum w:abstractNumId="28" w15:restartNumberingAfterBreak="0">
     <w:nsid w:val="19AE5EE7"/>
     <w:multiLevelType w:val="hybridMultilevel"/>
     <w:tmpl w:val="00A4140C"/>
@@ -15773,7 +17772,7 @@
       </w:rPr>
     </w:lvl>
   </w:abstractNum>
-  <w:abstractNum w:abstractNumId="28" w15:restartNumberingAfterBreak="0">
+  <w:abstractNum w:abstractNumId="29" w15:restartNumberingAfterBreak="0">
     <w:nsid w:val="19C83C12"/>
     <w:multiLevelType w:val="multilevel"/>
     <w:tmpl w:val="7690D588"/>
@@ -15922,7 +17921,7 @@
       </w:rPr>
     </w:lvl>
   </w:abstractNum>
-  <w:abstractNum w:abstractNumId="29" w15:restartNumberingAfterBreak="0">
+  <w:abstractNum w:abstractNumId="30" w15:restartNumberingAfterBreak="0">
     <w:nsid w:val="1A236A44"/>
     <w:multiLevelType w:val="hybridMultilevel"/>
     <w:tmpl w:val="E06C248C"/>
@@ -16035,7 +18034,7 @@
       </w:rPr>
     </w:lvl>
   </w:abstractNum>
-  <w:abstractNum w:abstractNumId="30" w15:restartNumberingAfterBreak="0">
+  <w:abstractNum w:abstractNumId="31" w15:restartNumberingAfterBreak="0">
     <w:nsid w:val="1B247976"/>
     <w:multiLevelType w:val="hybridMultilevel"/>
     <w:tmpl w:val="01AC6F84"/>
@@ -16148,7 +18147,7 @@
       </w:rPr>
     </w:lvl>
   </w:abstractNum>
-  <w:abstractNum w:abstractNumId="31" w15:restartNumberingAfterBreak="0">
+  <w:abstractNum w:abstractNumId="32" w15:restartNumberingAfterBreak="0">
     <w:nsid w:val="1C511176"/>
     <w:multiLevelType w:val="multilevel"/>
     <w:tmpl w:val="201E7F12"/>
@@ -16297,7 +18296,7 @@
       </w:rPr>
     </w:lvl>
   </w:abstractNum>
-  <w:abstractNum w:abstractNumId="32" w15:restartNumberingAfterBreak="0">
+  <w:abstractNum w:abstractNumId="33" w15:restartNumberingAfterBreak="0">
     <w:nsid w:val="1D4C2E50"/>
     <w:multiLevelType w:val="multilevel"/>
     <w:tmpl w:val="63F4E6F0"/>
@@ -16446,7 +18445,7 @@
       </w:rPr>
     </w:lvl>
   </w:abstractNum>
-  <w:abstractNum w:abstractNumId="33" w15:restartNumberingAfterBreak="0">
+  <w:abstractNum w:abstractNumId="34" w15:restartNumberingAfterBreak="0">
     <w:nsid w:val="1EC4731F"/>
     <w:multiLevelType w:val="hybridMultilevel"/>
     <w:tmpl w:val="8E26D8F0"/>
@@ -16558,7 +18557,7 @@
       </w:rPr>
     </w:lvl>
   </w:abstractNum>
-  <w:abstractNum w:abstractNumId="34" w15:restartNumberingAfterBreak="0">
+  <w:abstractNum w:abstractNumId="35" w15:restartNumberingAfterBreak="0">
     <w:nsid w:val="1F5F33AA"/>
     <w:multiLevelType w:val="hybridMultilevel"/>
     <w:tmpl w:val="661235B2"/>
@@ -16671,7 +18670,7 @@
       </w:rPr>
     </w:lvl>
   </w:abstractNum>
-  <w:abstractNum w:abstractNumId="35" w15:restartNumberingAfterBreak="0">
+  <w:abstractNum w:abstractNumId="36" w15:restartNumberingAfterBreak="0">
     <w:nsid w:val="20017871"/>
     <w:multiLevelType w:val="hybridMultilevel"/>
     <w:tmpl w:val="EA76608A"/>
@@ -16784,7 +18783,7 @@
       </w:rPr>
     </w:lvl>
   </w:abstractNum>
-  <w:abstractNum w:abstractNumId="36" w15:restartNumberingAfterBreak="0">
+  <w:abstractNum w:abstractNumId="37" w15:restartNumberingAfterBreak="0">
     <w:nsid w:val="206A32F9"/>
     <w:multiLevelType w:val="hybridMultilevel"/>
     <w:tmpl w:val="7A405CA6"/>
@@ -16896,7 +18895,7 @@
       </w:rPr>
     </w:lvl>
   </w:abstractNum>
-  <w:abstractNum w:abstractNumId="37" w15:restartNumberingAfterBreak="0">
+  <w:abstractNum w:abstractNumId="38" w15:restartNumberingAfterBreak="0">
     <w:nsid w:val="20786568"/>
     <w:multiLevelType w:val="hybridMultilevel"/>
     <w:tmpl w:val="200CC0BC"/>
@@ -17008,7 +19007,7 @@
       </w:rPr>
     </w:lvl>
   </w:abstractNum>
-  <w:abstractNum w:abstractNumId="38" w15:restartNumberingAfterBreak="0">
+  <w:abstractNum w:abstractNumId="39" w15:restartNumberingAfterBreak="0">
     <w:nsid w:val="207D21A1"/>
     <w:multiLevelType w:val="hybridMultilevel"/>
     <w:tmpl w:val="AAAE4260"/>
@@ -17120,7 +19119,7 @@
       </w:rPr>
     </w:lvl>
   </w:abstractNum>
-  <w:abstractNum w:abstractNumId="39" w15:restartNumberingAfterBreak="0">
+  <w:abstractNum w:abstractNumId="40" w15:restartNumberingAfterBreak="0">
     <w:nsid w:val="20DC5034"/>
     <w:multiLevelType w:val="hybridMultilevel"/>
     <w:tmpl w:val="4B5425EA"/>
@@ -17232,7 +19231,7 @@
       </w:rPr>
     </w:lvl>
   </w:abstractNum>
-  <w:abstractNum w:abstractNumId="40" w15:restartNumberingAfterBreak="0">
+  <w:abstractNum w:abstractNumId="41" w15:restartNumberingAfterBreak="0">
     <w:nsid w:val="224C7C45"/>
     <w:multiLevelType w:val="multilevel"/>
     <w:tmpl w:val="5C800264"/>
@@ -17381,7 +19380,7 @@
       </w:rPr>
     </w:lvl>
   </w:abstractNum>
-  <w:abstractNum w:abstractNumId="41" w15:restartNumberingAfterBreak="0">
+  <w:abstractNum w:abstractNumId="42" w15:restartNumberingAfterBreak="0">
     <w:nsid w:val="23970AD1"/>
     <w:multiLevelType w:val="hybridMultilevel"/>
     <w:tmpl w:val="6A1E8A04"/>
@@ -17493,7 +19492,7 @@
       </w:rPr>
     </w:lvl>
   </w:abstractNum>
-  <w:abstractNum w:abstractNumId="42" w15:restartNumberingAfterBreak="0">
+  <w:abstractNum w:abstractNumId="43" w15:restartNumberingAfterBreak="0">
     <w:nsid w:val="243D731E"/>
     <w:multiLevelType w:val="multilevel"/>
     <w:tmpl w:val="51303158"/>
@@ -17642,7 +19641,7 @@
       </w:rPr>
     </w:lvl>
   </w:abstractNum>
-  <w:abstractNum w:abstractNumId="43" w15:restartNumberingAfterBreak="0">
+  <w:abstractNum w:abstractNumId="44" w15:restartNumberingAfterBreak="0">
     <w:nsid w:val="26BA6D3C"/>
     <w:multiLevelType w:val="hybridMultilevel"/>
     <w:tmpl w:val="F03CC954"/>
@@ -17754,7 +19753,7 @@
       </w:rPr>
     </w:lvl>
   </w:abstractNum>
-  <w:abstractNum w:abstractNumId="44" w15:restartNumberingAfterBreak="0">
+  <w:abstractNum w:abstractNumId="45" w15:restartNumberingAfterBreak="0">
     <w:nsid w:val="27F6417B"/>
     <w:multiLevelType w:val="hybridMultilevel"/>
     <w:tmpl w:val="BACA6538"/>
@@ -17867,7 +19866,7 @@
       </w:rPr>
     </w:lvl>
   </w:abstractNum>
-  <w:abstractNum w:abstractNumId="45" w15:restartNumberingAfterBreak="0">
+  <w:abstractNum w:abstractNumId="46" w15:restartNumberingAfterBreak="0">
     <w:nsid w:val="28765EA3"/>
     <w:multiLevelType w:val="hybridMultilevel"/>
     <w:tmpl w:val="1CFAEB30"/>
@@ -17980,7 +19979,7 @@
       </w:rPr>
     </w:lvl>
   </w:abstractNum>
-  <w:abstractNum w:abstractNumId="46" w15:restartNumberingAfterBreak="0">
+  <w:abstractNum w:abstractNumId="47" w15:restartNumberingAfterBreak="0">
     <w:nsid w:val="28940045"/>
     <w:multiLevelType w:val="multilevel"/>
     <w:tmpl w:val="23DE4804"/>
@@ -18129,7 +20128,7 @@
       </w:rPr>
     </w:lvl>
   </w:abstractNum>
-  <w:abstractNum w:abstractNumId="47" w15:restartNumberingAfterBreak="0">
+  <w:abstractNum w:abstractNumId="48" w15:restartNumberingAfterBreak="0">
     <w:nsid w:val="289938CC"/>
     <w:multiLevelType w:val="multilevel"/>
     <w:tmpl w:val="57745EE2"/>
@@ -18278,7 +20277,7 @@
       </w:rPr>
     </w:lvl>
   </w:abstractNum>
-  <w:abstractNum w:abstractNumId="48" w15:restartNumberingAfterBreak="0">
+  <w:abstractNum w:abstractNumId="49" w15:restartNumberingAfterBreak="0">
     <w:nsid w:val="2ADE3401"/>
     <w:multiLevelType w:val="multilevel"/>
     <w:tmpl w:val="63F4E6F0"/>
@@ -18427,7 +20426,7 @@
       </w:rPr>
     </w:lvl>
   </w:abstractNum>
-  <w:abstractNum w:abstractNumId="49" w15:restartNumberingAfterBreak="0">
+  <w:abstractNum w:abstractNumId="50" w15:restartNumberingAfterBreak="0">
     <w:nsid w:val="2B592B9C"/>
     <w:multiLevelType w:val="hybridMultilevel"/>
     <w:tmpl w:val="99D4C34E"/>
@@ -18540,7 +20539,7 @@
       </w:rPr>
     </w:lvl>
   </w:abstractNum>
-  <w:abstractNum w:abstractNumId="50" w15:restartNumberingAfterBreak="0">
+  <w:abstractNum w:abstractNumId="51" w15:restartNumberingAfterBreak="0">
     <w:nsid w:val="2B9413C9"/>
     <w:multiLevelType w:val="hybridMultilevel"/>
     <w:tmpl w:val="4F7A7546"/>
@@ -18652,7 +20651,7 @@
       </w:rPr>
     </w:lvl>
   </w:abstractNum>
-  <w:abstractNum w:abstractNumId="51" w15:restartNumberingAfterBreak="0">
+  <w:abstractNum w:abstractNumId="52" w15:restartNumberingAfterBreak="0">
     <w:nsid w:val="2B9539E3"/>
     <w:multiLevelType w:val="hybridMultilevel"/>
     <w:tmpl w:val="E6B8BBB6"/>
@@ -18764,7 +20763,7 @@
       </w:rPr>
     </w:lvl>
   </w:abstractNum>
-  <w:abstractNum w:abstractNumId="52" w15:restartNumberingAfterBreak="0">
+  <w:abstractNum w:abstractNumId="53" w15:restartNumberingAfterBreak="0">
     <w:nsid w:val="2D4B6488"/>
     <w:multiLevelType w:val="hybridMultilevel"/>
     <w:tmpl w:val="F82EB8B0"/>
@@ -18877,7 +20876,7 @@
       </w:rPr>
     </w:lvl>
   </w:abstractNum>
-  <w:abstractNum w:abstractNumId="53" w15:restartNumberingAfterBreak="0">
+  <w:abstractNum w:abstractNumId="54" w15:restartNumberingAfterBreak="0">
     <w:nsid w:val="2E164C9A"/>
     <w:multiLevelType w:val="hybridMultilevel"/>
     <w:tmpl w:val="C6BA489A"/>
@@ -18990,7 +20989,7 @@
       </w:rPr>
     </w:lvl>
   </w:abstractNum>
-  <w:abstractNum w:abstractNumId="54" w15:restartNumberingAfterBreak="0">
+  <w:abstractNum w:abstractNumId="55" w15:restartNumberingAfterBreak="0">
     <w:nsid w:val="2E34438D"/>
     <w:multiLevelType w:val="multilevel"/>
     <w:tmpl w:val="63F4E6F0"/>
@@ -19139,7 +21138,7 @@
       </w:rPr>
     </w:lvl>
   </w:abstractNum>
-  <w:abstractNum w:abstractNumId="55" w15:restartNumberingAfterBreak="0">
+  <w:abstractNum w:abstractNumId="56" w15:restartNumberingAfterBreak="0">
     <w:nsid w:val="2E5D6D2A"/>
     <w:multiLevelType w:val="hybridMultilevel"/>
     <w:tmpl w:val="5D5ADC98"/>
@@ -19252,7 +21251,7 @@
       </w:rPr>
     </w:lvl>
   </w:abstractNum>
-  <w:abstractNum w:abstractNumId="56" w15:restartNumberingAfterBreak="0">
+  <w:abstractNum w:abstractNumId="57" w15:restartNumberingAfterBreak="0">
     <w:nsid w:val="2E716C12"/>
     <w:multiLevelType w:val="hybridMultilevel"/>
     <w:tmpl w:val="6D90C552"/>
@@ -19365,7 +21364,7 @@
       </w:rPr>
     </w:lvl>
   </w:abstractNum>
-  <w:abstractNum w:abstractNumId="57" w15:restartNumberingAfterBreak="0">
+  <w:abstractNum w:abstractNumId="58" w15:restartNumberingAfterBreak="0">
     <w:nsid w:val="2F162517"/>
     <w:multiLevelType w:val="hybridMultilevel"/>
     <w:tmpl w:val="4E3CAB7C"/>
@@ -19477,7 +21476,7 @@
       </w:rPr>
     </w:lvl>
   </w:abstractNum>
-  <w:abstractNum w:abstractNumId="58" w15:restartNumberingAfterBreak="0">
+  <w:abstractNum w:abstractNumId="59" w15:restartNumberingAfterBreak="0">
     <w:nsid w:val="2F1F6483"/>
     <w:multiLevelType w:val="multilevel"/>
     <w:tmpl w:val="993E874E"/>
@@ -19626,7 +21625,7 @@
       </w:rPr>
     </w:lvl>
   </w:abstractNum>
-  <w:abstractNum w:abstractNumId="59" w15:restartNumberingAfterBreak="0">
+  <w:abstractNum w:abstractNumId="60" w15:restartNumberingAfterBreak="0">
     <w:nsid w:val="2F2B2F8E"/>
     <w:multiLevelType w:val="multilevel"/>
     <w:tmpl w:val="547EDCFE"/>
@@ -19775,7 +21774,7 @@
       </w:rPr>
     </w:lvl>
   </w:abstractNum>
-  <w:abstractNum w:abstractNumId="60" w15:restartNumberingAfterBreak="0">
+  <w:abstractNum w:abstractNumId="61" w15:restartNumberingAfterBreak="0">
     <w:nsid w:val="2FF161E6"/>
     <w:multiLevelType w:val="hybridMultilevel"/>
     <w:tmpl w:val="ED6AA478"/>
@@ -19887,7 +21886,7 @@
       </w:rPr>
     </w:lvl>
   </w:abstractNum>
-  <w:abstractNum w:abstractNumId="61" w15:restartNumberingAfterBreak="0">
+  <w:abstractNum w:abstractNumId="62" w15:restartNumberingAfterBreak="0">
     <w:nsid w:val="30CD5DF3"/>
     <w:multiLevelType w:val="hybridMultilevel"/>
     <w:tmpl w:val="127EBD02"/>
@@ -19999,7 +21998,7 @@
       </w:rPr>
     </w:lvl>
   </w:abstractNum>
-  <w:abstractNum w:abstractNumId="62" w15:restartNumberingAfterBreak="0">
+  <w:abstractNum w:abstractNumId="63" w15:restartNumberingAfterBreak="0">
     <w:nsid w:val="31A24DDF"/>
     <w:multiLevelType w:val="multilevel"/>
     <w:tmpl w:val="63F4E6F0"/>
@@ -20148,7 +22147,7 @@
       </w:rPr>
     </w:lvl>
   </w:abstractNum>
-  <w:abstractNum w:abstractNumId="63" w15:restartNumberingAfterBreak="0">
+  <w:abstractNum w:abstractNumId="64" w15:restartNumberingAfterBreak="0">
     <w:nsid w:val="321E65E6"/>
     <w:multiLevelType w:val="multilevel"/>
     <w:tmpl w:val="63F4E6F0"/>
@@ -20297,7 +22296,7 @@
       </w:rPr>
     </w:lvl>
   </w:abstractNum>
-  <w:abstractNum w:abstractNumId="64" w15:restartNumberingAfterBreak="0">
+  <w:abstractNum w:abstractNumId="65" w15:restartNumberingAfterBreak="0">
     <w:nsid w:val="32BD3E3A"/>
     <w:multiLevelType w:val="hybridMultilevel"/>
     <w:tmpl w:val="15A01DD2"/>
@@ -20410,7 +22409,7 @@
       </w:rPr>
     </w:lvl>
   </w:abstractNum>
-  <w:abstractNum w:abstractNumId="65" w15:restartNumberingAfterBreak="0">
+  <w:abstractNum w:abstractNumId="66" w15:restartNumberingAfterBreak="0">
     <w:nsid w:val="32BF1228"/>
     <w:multiLevelType w:val="hybridMultilevel"/>
     <w:tmpl w:val="EECA44F0"/>
@@ -20499,7 +22498,120 @@
       </w:pPr>
     </w:lvl>
   </w:abstractNum>
-  <w:abstractNum w:abstractNumId="66" w15:restartNumberingAfterBreak="0">
+  <w:abstractNum w:abstractNumId="67" w15:restartNumberingAfterBreak="0">
+    <w:nsid w:val="32E40C4F"/>
+    <w:multiLevelType w:val="hybridMultilevel"/>
+    <w:tmpl w:val="EA4C1256"/>
+    <w:lvl w:ilvl="0" w:tplc="04090005">
+      <w:start w:val="1"/>
+      <w:numFmt w:val="bullet"/>
+      <w:lvlText w:val=""/>
+      <w:lvlJc w:val="left"/>
+      <w:pPr>
+        <w:ind w:left="720" w:hanging="360"/>
+      </w:pPr>
+      <w:rPr>
+        <w:rFonts w:ascii="Wingdings" w:hAnsi="Wingdings" w:hint="default"/>
+      </w:rPr>
+    </w:lvl>
+    <w:lvl w:ilvl="1" w:tplc="04090003" w:tentative="1">
+      <w:start w:val="1"/>
+      <w:numFmt w:val="bullet"/>
+      <w:lvlText w:val="o"/>
+      <w:lvlJc w:val="left"/>
+      <w:pPr>
+        <w:ind w:left="1440" w:hanging="360"/>
+      </w:pPr>
+      <w:rPr>
+        <w:rFonts w:ascii="Courier New" w:hAnsi="Courier New" w:cs="Courier New" w:hint="default"/>
+      </w:rPr>
+    </w:lvl>
+    <w:lvl w:ilvl="2" w:tplc="04090005" w:tentative="1">
+      <w:start w:val="1"/>
+      <w:numFmt w:val="bullet"/>
+      <w:lvlText w:val=""/>
+      <w:lvlJc w:val="left"/>
+      <w:pPr>
+        <w:ind w:left="2160" w:hanging="360"/>
+      </w:pPr>
+      <w:rPr>
+        <w:rFonts w:ascii="Wingdings" w:hAnsi="Wingdings" w:hint="default"/>
+      </w:rPr>
+    </w:lvl>
+    <w:lvl w:ilvl="3" w:tplc="04090001" w:tentative="1">
+      <w:start w:val="1"/>
+      <w:numFmt w:val="bullet"/>
+      <w:lvlText w:val=""/>
+      <w:lvlJc w:val="left"/>
+      <w:pPr>
+        <w:ind w:left="2880" w:hanging="360"/>
+      </w:pPr>
+      <w:rPr>
+        <w:rFonts w:ascii="Symbol" w:hAnsi="Symbol" w:hint="default"/>
+      </w:rPr>
+    </w:lvl>
+    <w:lvl w:ilvl="4" w:tplc="04090003" w:tentative="1">
+      <w:start w:val="1"/>
+      <w:numFmt w:val="bullet"/>
+      <w:lvlText w:val="o"/>
+      <w:lvlJc w:val="left"/>
+      <w:pPr>
+        <w:ind w:left="3600" w:hanging="360"/>
+      </w:pPr>
+      <w:rPr>
+        <w:rFonts w:ascii="Courier New" w:hAnsi="Courier New" w:cs="Courier New" w:hint="default"/>
+      </w:rPr>
+    </w:lvl>
+    <w:lvl w:ilvl="5" w:tplc="04090005" w:tentative="1">
+      <w:start w:val="1"/>
+      <w:numFmt w:val="bullet"/>
+      <w:lvlText w:val=""/>
+      <w:lvlJc w:val="left"/>
+      <w:pPr>
+        <w:ind w:left="4320" w:hanging="360"/>
+      </w:pPr>
+      <w:rPr>
+        <w:rFonts w:ascii="Wingdings" w:hAnsi="Wingdings" w:hint="default"/>
+      </w:rPr>
+    </w:lvl>
+    <w:lvl w:ilvl="6" w:tplc="04090001" w:tentative="1">
+      <w:start w:val="1"/>
+      <w:numFmt w:val="bullet"/>
+      <w:lvlText w:val=""/>
+      <w:lvlJc w:val="left"/>
+      <w:pPr>
+        <w:ind w:left="5040" w:hanging="360"/>
+      </w:pPr>
+      <w:rPr>
+        <w:rFonts w:ascii="Symbol" w:hAnsi="Symbol" w:hint="default"/>
+      </w:rPr>
+    </w:lvl>
+    <w:lvl w:ilvl="7" w:tplc="04090003" w:tentative="1">
+      <w:start w:val="1"/>
+      <w:numFmt w:val="bullet"/>
+      <w:lvlText w:val="o"/>
+      <w:lvlJc w:val="left"/>
+      <w:pPr>
+        <w:ind w:left="5760" w:hanging="360"/>
+      </w:pPr>
+      <w:rPr>
+        <w:rFonts w:ascii="Courier New" w:hAnsi="Courier New" w:cs="Courier New" w:hint="default"/>
+      </w:rPr>
+    </w:lvl>
+    <w:lvl w:ilvl="8" w:tplc="04090005" w:tentative="1">
+      <w:start w:val="1"/>
+      <w:numFmt w:val="bullet"/>
+      <w:lvlText w:val=""/>
+      <w:lvlJc w:val="left"/>
+      <w:pPr>
+        <w:ind w:left="6480" w:hanging="360"/>
+      </w:pPr>
+      <w:rPr>
+        <w:rFonts w:ascii="Wingdings" w:hAnsi="Wingdings" w:hint="default"/>
+      </w:rPr>
+    </w:lvl>
+  </w:abstractNum>
+  <w:abstractNum w:abstractNumId="68" w15:restartNumberingAfterBreak="0">
     <w:nsid w:val="332E29E8"/>
     <w:multiLevelType w:val="multilevel"/>
     <w:tmpl w:val="BF082128"/>
@@ -20648,7 +22760,7 @@
       </w:rPr>
     </w:lvl>
   </w:abstractNum>
-  <w:abstractNum w:abstractNumId="67" w15:restartNumberingAfterBreak="0">
+  <w:abstractNum w:abstractNumId="69" w15:restartNumberingAfterBreak="0">
     <w:nsid w:val="34251C5D"/>
     <w:multiLevelType w:val="multilevel"/>
     <w:tmpl w:val="C31CBCE0"/>
@@ -20797,7 +22909,7 @@
       </w:rPr>
     </w:lvl>
   </w:abstractNum>
-  <w:abstractNum w:abstractNumId="68" w15:restartNumberingAfterBreak="0">
+  <w:abstractNum w:abstractNumId="70" w15:restartNumberingAfterBreak="0">
     <w:nsid w:val="342A6150"/>
     <w:multiLevelType w:val="multilevel"/>
     <w:tmpl w:val="29E0BE1C"/>
@@ -20946,7 +23058,7 @@
       </w:rPr>
     </w:lvl>
   </w:abstractNum>
-  <w:abstractNum w:abstractNumId="69" w15:restartNumberingAfterBreak="0">
+  <w:abstractNum w:abstractNumId="71" w15:restartNumberingAfterBreak="0">
     <w:nsid w:val="343166B0"/>
     <w:multiLevelType w:val="hybridMultilevel"/>
     <w:tmpl w:val="91B8ED2A"/>
@@ -21059,7 +23171,7 @@
       </w:rPr>
     </w:lvl>
   </w:abstractNum>
-  <w:abstractNum w:abstractNumId="70" w15:restartNumberingAfterBreak="0">
+  <w:abstractNum w:abstractNumId="72" w15:restartNumberingAfterBreak="0">
     <w:nsid w:val="356F220A"/>
     <w:multiLevelType w:val="multilevel"/>
     <w:tmpl w:val="0FFA5254"/>
@@ -21208,7 +23320,7 @@
       </w:rPr>
     </w:lvl>
   </w:abstractNum>
-  <w:abstractNum w:abstractNumId="71" w15:restartNumberingAfterBreak="0">
+  <w:abstractNum w:abstractNumId="73" w15:restartNumberingAfterBreak="0">
     <w:nsid w:val="357B7363"/>
     <w:multiLevelType w:val="hybridMultilevel"/>
     <w:tmpl w:val="00D411EC"/>
@@ -21320,7 +23432,7 @@
       </w:rPr>
     </w:lvl>
   </w:abstractNum>
-  <w:abstractNum w:abstractNumId="72" w15:restartNumberingAfterBreak="0">
+  <w:abstractNum w:abstractNumId="74" w15:restartNumberingAfterBreak="0">
     <w:nsid w:val="3583100F"/>
     <w:multiLevelType w:val="hybridMultilevel"/>
     <w:tmpl w:val="848ECFAA"/>
@@ -21433,7 +23545,7 @@
       </w:rPr>
     </w:lvl>
   </w:abstractNum>
-  <w:abstractNum w:abstractNumId="73" w15:restartNumberingAfterBreak="0">
+  <w:abstractNum w:abstractNumId="75" w15:restartNumberingAfterBreak="0">
     <w:nsid w:val="3623194A"/>
     <w:multiLevelType w:val="multilevel"/>
     <w:tmpl w:val="63F4E6F0"/>
@@ -21582,7 +23694,7 @@
       </w:rPr>
     </w:lvl>
   </w:abstractNum>
-  <w:abstractNum w:abstractNumId="74" w15:restartNumberingAfterBreak="0">
+  <w:abstractNum w:abstractNumId="76" w15:restartNumberingAfterBreak="0">
     <w:nsid w:val="36371597"/>
     <w:multiLevelType w:val="hybridMultilevel"/>
     <w:tmpl w:val="D4FA2718"/>
@@ -21695,7 +23807,7 @@
       </w:rPr>
     </w:lvl>
   </w:abstractNum>
-  <w:abstractNum w:abstractNumId="75" w15:restartNumberingAfterBreak="0">
+  <w:abstractNum w:abstractNumId="77" w15:restartNumberingAfterBreak="0">
     <w:nsid w:val="36AD3FB0"/>
     <w:multiLevelType w:val="multilevel"/>
     <w:tmpl w:val="0644AEEA"/>
@@ -21844,7 +23956,7 @@
       </w:rPr>
     </w:lvl>
   </w:abstractNum>
-  <w:abstractNum w:abstractNumId="76" w15:restartNumberingAfterBreak="0">
+  <w:abstractNum w:abstractNumId="78" w15:restartNumberingAfterBreak="0">
     <w:nsid w:val="371A2CDE"/>
     <w:multiLevelType w:val="hybridMultilevel"/>
     <w:tmpl w:val="EA9C00CC"/>
@@ -21956,7 +24068,7 @@
       </w:rPr>
     </w:lvl>
   </w:abstractNum>
-  <w:abstractNum w:abstractNumId="77" w15:restartNumberingAfterBreak="0">
+  <w:abstractNum w:abstractNumId="79" w15:restartNumberingAfterBreak="0">
     <w:nsid w:val="373D5E48"/>
     <w:multiLevelType w:val="hybridMultilevel"/>
     <w:tmpl w:val="8A6E38C0"/>
@@ -22069,7 +24181,7 @@
       </w:rPr>
     </w:lvl>
   </w:abstractNum>
-  <w:abstractNum w:abstractNumId="78" w15:restartNumberingAfterBreak="0">
+  <w:abstractNum w:abstractNumId="80" w15:restartNumberingAfterBreak="0">
     <w:nsid w:val="3B446B2D"/>
     <w:multiLevelType w:val="hybridMultilevel"/>
     <w:tmpl w:val="B638176E"/>
@@ -22181,7 +24293,7 @@
       </w:rPr>
     </w:lvl>
   </w:abstractNum>
-  <w:abstractNum w:abstractNumId="79" w15:restartNumberingAfterBreak="0">
+  <w:abstractNum w:abstractNumId="81" w15:restartNumberingAfterBreak="0">
     <w:nsid w:val="3B6B41F5"/>
     <w:multiLevelType w:val="hybridMultilevel"/>
     <w:tmpl w:val="10A26168"/>
@@ -22293,7 +24405,7 @@
       </w:rPr>
     </w:lvl>
   </w:abstractNum>
-  <w:abstractNum w:abstractNumId="80" w15:restartNumberingAfterBreak="0">
+  <w:abstractNum w:abstractNumId="82" w15:restartNumberingAfterBreak="0">
     <w:nsid w:val="3BCD79E4"/>
     <w:multiLevelType w:val="hybridMultilevel"/>
     <w:tmpl w:val="FFFAC2AC"/>
@@ -22406,7 +24518,7 @@
       </w:rPr>
     </w:lvl>
   </w:abstractNum>
-  <w:abstractNum w:abstractNumId="81" w15:restartNumberingAfterBreak="0">
+  <w:abstractNum w:abstractNumId="83" w15:restartNumberingAfterBreak="0">
     <w:nsid w:val="3C5546BA"/>
     <w:multiLevelType w:val="hybridMultilevel"/>
     <w:tmpl w:val="3434F5E4"/>
@@ -22518,7 +24630,7 @@
       </w:rPr>
     </w:lvl>
   </w:abstractNum>
-  <w:abstractNum w:abstractNumId="82" w15:restartNumberingAfterBreak="0">
+  <w:abstractNum w:abstractNumId="84" w15:restartNumberingAfterBreak="0">
     <w:nsid w:val="3C623C55"/>
     <w:multiLevelType w:val="multilevel"/>
     <w:tmpl w:val="A0B0E8F4"/>
@@ -22667,7 +24779,7 @@
       </w:rPr>
     </w:lvl>
   </w:abstractNum>
-  <w:abstractNum w:abstractNumId="83" w15:restartNumberingAfterBreak="0">
+  <w:abstractNum w:abstractNumId="85" w15:restartNumberingAfterBreak="0">
     <w:nsid w:val="3CD27F78"/>
     <w:multiLevelType w:val="multilevel"/>
     <w:tmpl w:val="FCDE767A"/>
@@ -22816,7 +24928,7 @@
       </w:rPr>
     </w:lvl>
   </w:abstractNum>
-  <w:abstractNum w:abstractNumId="84" w15:restartNumberingAfterBreak="0">
+  <w:abstractNum w:abstractNumId="86" w15:restartNumberingAfterBreak="0">
     <w:nsid w:val="3CD74B18"/>
     <w:multiLevelType w:val="hybridMultilevel"/>
     <w:tmpl w:val="2FF42220"/>
@@ -22929,7 +25041,7 @@
       </w:rPr>
     </w:lvl>
   </w:abstractNum>
-  <w:abstractNum w:abstractNumId="85" w15:restartNumberingAfterBreak="0">
+  <w:abstractNum w:abstractNumId="87" w15:restartNumberingAfterBreak="0">
     <w:nsid w:val="3D2F7E79"/>
     <w:multiLevelType w:val="hybridMultilevel"/>
     <w:tmpl w:val="6ED674BE"/>
@@ -23041,7 +25153,7 @@
       </w:rPr>
     </w:lvl>
   </w:abstractNum>
-  <w:abstractNum w:abstractNumId="86" w15:restartNumberingAfterBreak="0">
+  <w:abstractNum w:abstractNumId="88" w15:restartNumberingAfterBreak="0">
     <w:nsid w:val="3D397287"/>
     <w:multiLevelType w:val="hybridMultilevel"/>
     <w:tmpl w:val="F4503122"/>
@@ -23153,7 +25265,7 @@
       </w:rPr>
     </w:lvl>
   </w:abstractNum>
-  <w:abstractNum w:abstractNumId="87" w15:restartNumberingAfterBreak="0">
+  <w:abstractNum w:abstractNumId="89" w15:restartNumberingAfterBreak="0">
     <w:nsid w:val="3DC14EA1"/>
     <w:multiLevelType w:val="hybridMultilevel"/>
     <w:tmpl w:val="DCAE9528"/>
@@ -23266,7 +25378,7 @@
       </w:rPr>
     </w:lvl>
   </w:abstractNum>
-  <w:abstractNum w:abstractNumId="88" w15:restartNumberingAfterBreak="0">
+  <w:abstractNum w:abstractNumId="90" w15:restartNumberingAfterBreak="0">
     <w:nsid w:val="3E685FF3"/>
     <w:multiLevelType w:val="multilevel"/>
     <w:tmpl w:val="7D20B538"/>
@@ -23415,7 +25527,7 @@
       </w:rPr>
     </w:lvl>
   </w:abstractNum>
-  <w:abstractNum w:abstractNumId="89" w15:restartNumberingAfterBreak="0">
+  <w:abstractNum w:abstractNumId="91" w15:restartNumberingAfterBreak="0">
     <w:nsid w:val="3F20785F"/>
     <w:multiLevelType w:val="hybridMultilevel"/>
     <w:tmpl w:val="49D612FC"/>
@@ -23528,7 +25640,7 @@
       </w:rPr>
     </w:lvl>
   </w:abstractNum>
-  <w:abstractNum w:abstractNumId="90" w15:restartNumberingAfterBreak="0">
+  <w:abstractNum w:abstractNumId="92" w15:restartNumberingAfterBreak="0">
     <w:nsid w:val="3F346C2C"/>
     <w:multiLevelType w:val="multilevel"/>
     <w:tmpl w:val="63F4E6F0"/>
@@ -23677,7 +25789,7 @@
       </w:rPr>
     </w:lvl>
   </w:abstractNum>
-  <w:abstractNum w:abstractNumId="91" w15:restartNumberingAfterBreak="0">
+  <w:abstractNum w:abstractNumId="93" w15:restartNumberingAfterBreak="0">
     <w:nsid w:val="3FCB1322"/>
     <w:multiLevelType w:val="hybridMultilevel"/>
     <w:tmpl w:val="55C012B2"/>
@@ -23789,7 +25901,7 @@
       </w:rPr>
     </w:lvl>
   </w:abstractNum>
-  <w:abstractNum w:abstractNumId="92" w15:restartNumberingAfterBreak="0">
+  <w:abstractNum w:abstractNumId="94" w15:restartNumberingAfterBreak="0">
     <w:nsid w:val="403501BA"/>
     <w:multiLevelType w:val="hybridMultilevel"/>
     <w:tmpl w:val="D95E90BC"/>
@@ -23902,7 +26014,7 @@
       </w:rPr>
     </w:lvl>
   </w:abstractNum>
-  <w:abstractNum w:abstractNumId="93" w15:restartNumberingAfterBreak="0">
+  <w:abstractNum w:abstractNumId="95" w15:restartNumberingAfterBreak="0">
     <w:nsid w:val="41A9344F"/>
     <w:multiLevelType w:val="hybridMultilevel"/>
     <w:tmpl w:val="0FB60038"/>
@@ -24015,7 +26127,7 @@
       </w:rPr>
     </w:lvl>
   </w:abstractNum>
-  <w:abstractNum w:abstractNumId="94" w15:restartNumberingAfterBreak="0">
+  <w:abstractNum w:abstractNumId="96" w15:restartNumberingAfterBreak="0">
     <w:nsid w:val="41B44F72"/>
     <w:multiLevelType w:val="hybridMultilevel"/>
     <w:tmpl w:val="1F58F614"/>
@@ -24129,7 +26241,7 @@
       </w:rPr>
     </w:lvl>
   </w:abstractNum>
-  <w:abstractNum w:abstractNumId="95" w15:restartNumberingAfterBreak="0">
+  <w:abstractNum w:abstractNumId="97" w15:restartNumberingAfterBreak="0">
     <w:nsid w:val="42004E1F"/>
     <w:multiLevelType w:val="hybridMultilevel"/>
     <w:tmpl w:val="770C8314"/>
@@ -24241,7 +26353,7 @@
       </w:rPr>
     </w:lvl>
   </w:abstractNum>
-  <w:abstractNum w:abstractNumId="96" w15:restartNumberingAfterBreak="0">
+  <w:abstractNum w:abstractNumId="98" w15:restartNumberingAfterBreak="0">
     <w:nsid w:val="439F7169"/>
     <w:multiLevelType w:val="hybridMultilevel"/>
     <w:tmpl w:val="1884EDCA"/>
@@ -24354,7 +26466,7 @@
       </w:rPr>
     </w:lvl>
   </w:abstractNum>
-  <w:abstractNum w:abstractNumId="97" w15:restartNumberingAfterBreak="0">
+  <w:abstractNum w:abstractNumId="99" w15:restartNumberingAfterBreak="0">
     <w:nsid w:val="43EA1D69"/>
     <w:multiLevelType w:val="multilevel"/>
     <w:tmpl w:val="DFEC23EC"/>
@@ -24503,7 +26615,7 @@
       </w:rPr>
     </w:lvl>
   </w:abstractNum>
-  <w:abstractNum w:abstractNumId="98" w15:restartNumberingAfterBreak="0">
+  <w:abstractNum w:abstractNumId="100" w15:restartNumberingAfterBreak="0">
     <w:nsid w:val="44320084"/>
     <w:multiLevelType w:val="hybridMultilevel"/>
     <w:tmpl w:val="CE5076D4"/>
@@ -24615,7 +26727,7 @@
       </w:rPr>
     </w:lvl>
   </w:abstractNum>
-  <w:abstractNum w:abstractNumId="99" w15:restartNumberingAfterBreak="0">
+  <w:abstractNum w:abstractNumId="101" w15:restartNumberingAfterBreak="0">
     <w:nsid w:val="44554567"/>
     <w:multiLevelType w:val="hybridMultilevel"/>
     <w:tmpl w:val="78748252"/>
@@ -24727,7 +26839,7 @@
       </w:rPr>
     </w:lvl>
   </w:abstractNum>
-  <w:abstractNum w:abstractNumId="100" w15:restartNumberingAfterBreak="0">
+  <w:abstractNum w:abstractNumId="102" w15:restartNumberingAfterBreak="0">
     <w:nsid w:val="49005094"/>
     <w:multiLevelType w:val="hybridMultilevel"/>
     <w:tmpl w:val="14848CBE"/>
@@ -24839,7 +26951,7 @@
       </w:rPr>
     </w:lvl>
   </w:abstractNum>
-  <w:abstractNum w:abstractNumId="101" w15:restartNumberingAfterBreak="0">
+  <w:abstractNum w:abstractNumId="103" w15:restartNumberingAfterBreak="0">
     <w:nsid w:val="49243794"/>
     <w:multiLevelType w:val="multilevel"/>
     <w:tmpl w:val="E7681528"/>
@@ -24988,7 +27100,7 @@
       </w:rPr>
     </w:lvl>
   </w:abstractNum>
-  <w:abstractNum w:abstractNumId="102" w15:restartNumberingAfterBreak="0">
+  <w:abstractNum w:abstractNumId="104" w15:restartNumberingAfterBreak="0">
     <w:nsid w:val="4A880990"/>
     <w:multiLevelType w:val="hybridMultilevel"/>
     <w:tmpl w:val="F17E12C2"/>
@@ -25100,7 +27212,7 @@
       </w:rPr>
     </w:lvl>
   </w:abstractNum>
-  <w:abstractNum w:abstractNumId="103" w15:restartNumberingAfterBreak="0">
+  <w:abstractNum w:abstractNumId="105" w15:restartNumberingAfterBreak="0">
     <w:nsid w:val="4B182B12"/>
     <w:multiLevelType w:val="hybridMultilevel"/>
     <w:tmpl w:val="31C486B4"/>
@@ -25212,7 +27324,7 @@
       </w:rPr>
     </w:lvl>
   </w:abstractNum>
-  <w:abstractNum w:abstractNumId="104" w15:restartNumberingAfterBreak="0">
+  <w:abstractNum w:abstractNumId="106" w15:restartNumberingAfterBreak="0">
     <w:nsid w:val="4B6E6D62"/>
     <w:multiLevelType w:val="hybridMultilevel"/>
     <w:tmpl w:val="54DC0C0C"/>
@@ -25325,7 +27437,7 @@
       </w:rPr>
     </w:lvl>
   </w:abstractNum>
-  <w:abstractNum w:abstractNumId="105" w15:restartNumberingAfterBreak="0">
+  <w:abstractNum w:abstractNumId="107" w15:restartNumberingAfterBreak="0">
     <w:nsid w:val="4BA13766"/>
     <w:multiLevelType w:val="multilevel"/>
     <w:tmpl w:val="63F4E6F0"/>
@@ -25474,7 +27586,7 @@
       </w:rPr>
     </w:lvl>
   </w:abstractNum>
-  <w:abstractNum w:abstractNumId="106" w15:restartNumberingAfterBreak="0">
+  <w:abstractNum w:abstractNumId="108" w15:restartNumberingAfterBreak="0">
     <w:nsid w:val="4D2E1CBE"/>
     <w:multiLevelType w:val="hybridMultilevel"/>
     <w:tmpl w:val="BFD86D7C"/>
@@ -25587,7 +27699,7 @@
       </w:rPr>
     </w:lvl>
   </w:abstractNum>
-  <w:abstractNum w:abstractNumId="107" w15:restartNumberingAfterBreak="0">
+  <w:abstractNum w:abstractNumId="109" w15:restartNumberingAfterBreak="0">
     <w:nsid w:val="4E65371E"/>
     <w:multiLevelType w:val="hybridMultilevel"/>
     <w:tmpl w:val="53EE4538"/>
@@ -25699,7 +27811,7 @@
       </w:rPr>
     </w:lvl>
   </w:abstractNum>
-  <w:abstractNum w:abstractNumId="108" w15:restartNumberingAfterBreak="0">
+  <w:abstractNum w:abstractNumId="110" w15:restartNumberingAfterBreak="0">
     <w:nsid w:val="4E9A3F16"/>
     <w:multiLevelType w:val="multilevel"/>
     <w:tmpl w:val="63F4E6F0"/>
@@ -25848,7 +27960,7 @@
       </w:rPr>
     </w:lvl>
   </w:abstractNum>
-  <w:abstractNum w:abstractNumId="109" w15:restartNumberingAfterBreak="0">
+  <w:abstractNum w:abstractNumId="111" w15:restartNumberingAfterBreak="0">
     <w:nsid w:val="500B790D"/>
     <w:multiLevelType w:val="multilevel"/>
     <w:tmpl w:val="63F4E6F0"/>
@@ -25997,7 +28109,7 @@
       </w:rPr>
     </w:lvl>
   </w:abstractNum>
-  <w:abstractNum w:abstractNumId="110" w15:restartNumberingAfterBreak="0">
+  <w:abstractNum w:abstractNumId="112" w15:restartNumberingAfterBreak="0">
     <w:nsid w:val="5037150E"/>
     <w:multiLevelType w:val="hybridMultilevel"/>
     <w:tmpl w:val="064034F8"/>
@@ -26110,7 +28222,120 @@
       </w:rPr>
     </w:lvl>
   </w:abstractNum>
-  <w:abstractNum w:abstractNumId="111" w15:restartNumberingAfterBreak="0">
+  <w:abstractNum w:abstractNumId="113" w15:restartNumberingAfterBreak="0">
+    <w:nsid w:val="50A931C8"/>
+    <w:multiLevelType w:val="hybridMultilevel"/>
+    <w:tmpl w:val="ED3217DE"/>
+    <w:lvl w:ilvl="0" w:tplc="04090005">
+      <w:start w:val="1"/>
+      <w:numFmt w:val="bullet"/>
+      <w:lvlText w:val=""/>
+      <w:lvlJc w:val="left"/>
+      <w:pPr>
+        <w:ind w:left="720" w:hanging="360"/>
+      </w:pPr>
+      <w:rPr>
+        <w:rFonts w:ascii="Wingdings" w:hAnsi="Wingdings" w:hint="default"/>
+      </w:rPr>
+    </w:lvl>
+    <w:lvl w:ilvl="1" w:tplc="04090003" w:tentative="1">
+      <w:start w:val="1"/>
+      <w:numFmt w:val="bullet"/>
+      <w:lvlText w:val="o"/>
+      <w:lvlJc w:val="left"/>
+      <w:pPr>
+        <w:ind w:left="1440" w:hanging="360"/>
+      </w:pPr>
+      <w:rPr>
+        <w:rFonts w:ascii="Courier New" w:hAnsi="Courier New" w:cs="Courier New" w:hint="default"/>
+      </w:rPr>
+    </w:lvl>
+    <w:lvl w:ilvl="2" w:tplc="04090005" w:tentative="1">
+      <w:start w:val="1"/>
+      <w:numFmt w:val="bullet"/>
+      <w:lvlText w:val=""/>
+      <w:lvlJc w:val="left"/>
+      <w:pPr>
+        <w:ind w:left="2160" w:hanging="360"/>
+      </w:pPr>
+      <w:rPr>
+        <w:rFonts w:ascii="Wingdings" w:hAnsi="Wingdings" w:hint="default"/>
+      </w:rPr>
+    </w:lvl>
+    <w:lvl w:ilvl="3" w:tplc="04090001" w:tentative="1">
+      <w:start w:val="1"/>
+      <w:numFmt w:val="bullet"/>
+      <w:lvlText w:val=""/>
+      <w:lvlJc w:val="left"/>
+      <w:pPr>
+        <w:ind w:left="2880" w:hanging="360"/>
+      </w:pPr>
+      <w:rPr>
+        <w:rFonts w:ascii="Symbol" w:hAnsi="Symbol" w:hint="default"/>
+      </w:rPr>
+    </w:lvl>
+    <w:lvl w:ilvl="4" w:tplc="04090003" w:tentative="1">
+      <w:start w:val="1"/>
+      <w:numFmt w:val="bullet"/>
+      <w:lvlText w:val="o"/>
+      <w:lvlJc w:val="left"/>
+      <w:pPr>
+        <w:ind w:left="3600" w:hanging="360"/>
+      </w:pPr>
+      <w:rPr>
+        <w:rFonts w:ascii="Courier New" w:hAnsi="Courier New" w:cs="Courier New" w:hint="default"/>
+      </w:rPr>
+    </w:lvl>
+    <w:lvl w:ilvl="5" w:tplc="04090005" w:tentative="1">
+      <w:start w:val="1"/>
+      <w:numFmt w:val="bullet"/>
+      <w:lvlText w:val=""/>
+      <w:lvlJc w:val="left"/>
+      <w:pPr>
+        <w:ind w:left="4320" w:hanging="360"/>
+      </w:pPr>
+      <w:rPr>
+        <w:rFonts w:ascii="Wingdings" w:hAnsi="Wingdings" w:hint="default"/>
+      </w:rPr>
+    </w:lvl>
+    <w:lvl w:ilvl="6" w:tplc="04090001" w:tentative="1">
+      <w:start w:val="1"/>
+      <w:numFmt w:val="bullet"/>
+      <w:lvlText w:val=""/>
+      <w:lvlJc w:val="left"/>
+      <w:pPr>
+        <w:ind w:left="5040" w:hanging="360"/>
+      </w:pPr>
+      <w:rPr>
+        <w:rFonts w:ascii="Symbol" w:hAnsi="Symbol" w:hint="default"/>
+      </w:rPr>
+    </w:lvl>
+    <w:lvl w:ilvl="7" w:tplc="04090003" w:tentative="1">
+      <w:start w:val="1"/>
+      <w:numFmt w:val="bullet"/>
+      <w:lvlText w:val="o"/>
+      <w:lvlJc w:val="left"/>
+      <w:pPr>
+        <w:ind w:left="5760" w:hanging="360"/>
+      </w:pPr>
+      <w:rPr>
+        <w:rFonts w:ascii="Courier New" w:hAnsi="Courier New" w:cs="Courier New" w:hint="default"/>
+      </w:rPr>
+    </w:lvl>
+    <w:lvl w:ilvl="8" w:tplc="04090005" w:tentative="1">
+      <w:start w:val="1"/>
+      <w:numFmt w:val="bullet"/>
+      <w:lvlText w:val=""/>
+      <w:lvlJc w:val="left"/>
+      <w:pPr>
+        <w:ind w:left="6480" w:hanging="360"/>
+      </w:pPr>
+      <w:rPr>
+        <w:rFonts w:ascii="Wingdings" w:hAnsi="Wingdings" w:hint="default"/>
+      </w:rPr>
+    </w:lvl>
+  </w:abstractNum>
+  <w:abstractNum w:abstractNumId="114" w15:restartNumberingAfterBreak="0">
     <w:nsid w:val="51417BE1"/>
     <w:multiLevelType w:val="multilevel"/>
     <w:tmpl w:val="993C0E80"/>
@@ -26259,7 +28484,7 @@
       </w:rPr>
     </w:lvl>
   </w:abstractNum>
-  <w:abstractNum w:abstractNumId="112" w15:restartNumberingAfterBreak="0">
+  <w:abstractNum w:abstractNumId="115" w15:restartNumberingAfterBreak="0">
     <w:nsid w:val="526538B7"/>
     <w:multiLevelType w:val="hybridMultilevel"/>
     <w:tmpl w:val="E6A017F2"/>
@@ -26372,7 +28597,7 @@
       </w:rPr>
     </w:lvl>
   </w:abstractNum>
-  <w:abstractNum w:abstractNumId="113" w15:restartNumberingAfterBreak="0">
+  <w:abstractNum w:abstractNumId="116" w15:restartNumberingAfterBreak="0">
     <w:nsid w:val="537E56D9"/>
     <w:multiLevelType w:val="multilevel"/>
     <w:tmpl w:val="1B6E8B6A"/>
@@ -26521,7 +28746,7 @@
       </w:rPr>
     </w:lvl>
   </w:abstractNum>
-  <w:abstractNum w:abstractNumId="114" w15:restartNumberingAfterBreak="0">
+  <w:abstractNum w:abstractNumId="117" w15:restartNumberingAfterBreak="0">
     <w:nsid w:val="53E6601E"/>
     <w:multiLevelType w:val="hybridMultilevel"/>
     <w:tmpl w:val="66F0666A"/>
@@ -26634,7 +28859,7 @@
       </w:rPr>
     </w:lvl>
   </w:abstractNum>
-  <w:abstractNum w:abstractNumId="115" w15:restartNumberingAfterBreak="0">
+  <w:abstractNum w:abstractNumId="118" w15:restartNumberingAfterBreak="0">
     <w:nsid w:val="551D6F91"/>
     <w:multiLevelType w:val="hybridMultilevel"/>
     <w:tmpl w:val="9522B3C6"/>
@@ -26746,7 +28971,7 @@
       </w:rPr>
     </w:lvl>
   </w:abstractNum>
-  <w:abstractNum w:abstractNumId="116" w15:restartNumberingAfterBreak="0">
+  <w:abstractNum w:abstractNumId="119" w15:restartNumberingAfterBreak="0">
     <w:nsid w:val="5546258F"/>
     <w:multiLevelType w:val="multilevel"/>
     <w:tmpl w:val="0CAA196E"/>
@@ -26895,7 +29120,7 @@
       </w:rPr>
     </w:lvl>
   </w:abstractNum>
-  <w:abstractNum w:abstractNumId="117" w15:restartNumberingAfterBreak="0">
+  <w:abstractNum w:abstractNumId="120" w15:restartNumberingAfterBreak="0">
     <w:nsid w:val="55655B93"/>
     <w:multiLevelType w:val="multilevel"/>
     <w:tmpl w:val="9C88A4A8"/>
@@ -27044,7 +29269,7 @@
       </w:rPr>
     </w:lvl>
   </w:abstractNum>
-  <w:abstractNum w:abstractNumId="118" w15:restartNumberingAfterBreak="0">
+  <w:abstractNum w:abstractNumId="121" w15:restartNumberingAfterBreak="0">
     <w:nsid w:val="562D4F1F"/>
     <w:multiLevelType w:val="hybridMultilevel"/>
     <w:tmpl w:val="1FF8D31C"/>
@@ -27156,7 +29381,7 @@
       </w:rPr>
     </w:lvl>
   </w:abstractNum>
-  <w:abstractNum w:abstractNumId="119" w15:restartNumberingAfterBreak="0">
+  <w:abstractNum w:abstractNumId="122" w15:restartNumberingAfterBreak="0">
     <w:nsid w:val="565A0C8B"/>
     <w:multiLevelType w:val="multilevel"/>
     <w:tmpl w:val="AB24FF2E"/>
@@ -27305,7 +29530,7 @@
       </w:rPr>
     </w:lvl>
   </w:abstractNum>
-  <w:abstractNum w:abstractNumId="120" w15:restartNumberingAfterBreak="0">
+  <w:abstractNum w:abstractNumId="123" w15:restartNumberingAfterBreak="0">
     <w:nsid w:val="566E7C65"/>
     <w:multiLevelType w:val="multilevel"/>
     <w:tmpl w:val="28803B4C"/>
@@ -27454,7 +29679,7 @@
       </w:rPr>
     </w:lvl>
   </w:abstractNum>
-  <w:abstractNum w:abstractNumId="121" w15:restartNumberingAfterBreak="0">
+  <w:abstractNum w:abstractNumId="124" w15:restartNumberingAfterBreak="0">
     <w:nsid w:val="57407594"/>
     <w:multiLevelType w:val="multilevel"/>
     <w:tmpl w:val="E6E2F8AE"/>
@@ -27603,7 +29828,7 @@
       </w:rPr>
     </w:lvl>
   </w:abstractNum>
-  <w:abstractNum w:abstractNumId="122" w15:restartNumberingAfterBreak="0">
+  <w:abstractNum w:abstractNumId="125" w15:restartNumberingAfterBreak="0">
     <w:nsid w:val="5773128C"/>
     <w:multiLevelType w:val="hybridMultilevel"/>
     <w:tmpl w:val="945E5C1E"/>
@@ -27716,7 +29941,7 @@
       </w:rPr>
     </w:lvl>
   </w:abstractNum>
-  <w:abstractNum w:abstractNumId="123" w15:restartNumberingAfterBreak="0">
+  <w:abstractNum w:abstractNumId="126" w15:restartNumberingAfterBreak="0">
     <w:nsid w:val="577F771B"/>
     <w:multiLevelType w:val="hybridMultilevel"/>
     <w:tmpl w:val="0F2C5914"/>
@@ -27828,7 +30053,7 @@
       </w:rPr>
     </w:lvl>
   </w:abstractNum>
-  <w:abstractNum w:abstractNumId="124" w15:restartNumberingAfterBreak="0">
+  <w:abstractNum w:abstractNumId="127" w15:restartNumberingAfterBreak="0">
     <w:nsid w:val="57C43CDD"/>
     <w:multiLevelType w:val="hybridMultilevel"/>
     <w:tmpl w:val="6C94FB5E"/>
@@ -27941,7 +30166,7 @@
       </w:rPr>
     </w:lvl>
   </w:abstractNum>
-  <w:abstractNum w:abstractNumId="125" w15:restartNumberingAfterBreak="0">
+  <w:abstractNum w:abstractNumId="128" w15:restartNumberingAfterBreak="0">
     <w:nsid w:val="58393977"/>
     <w:multiLevelType w:val="hybridMultilevel"/>
     <w:tmpl w:val="985A5484"/>
@@ -28054,7 +30279,7 @@
       </w:rPr>
     </w:lvl>
   </w:abstractNum>
-  <w:abstractNum w:abstractNumId="126" w15:restartNumberingAfterBreak="0">
+  <w:abstractNum w:abstractNumId="129" w15:restartNumberingAfterBreak="0">
     <w:nsid w:val="59AB4A55"/>
     <w:multiLevelType w:val="hybridMultilevel"/>
     <w:tmpl w:val="B6486CD6"/>
@@ -28167,7 +30392,7 @@
       </w:rPr>
     </w:lvl>
   </w:abstractNum>
-  <w:abstractNum w:abstractNumId="127" w15:restartNumberingAfterBreak="0">
+  <w:abstractNum w:abstractNumId="130" w15:restartNumberingAfterBreak="0">
     <w:nsid w:val="59EB4CE4"/>
     <w:multiLevelType w:val="multilevel"/>
     <w:tmpl w:val="63F4E6F0"/>
@@ -28316,7 +30541,120 @@
       </w:rPr>
     </w:lvl>
   </w:abstractNum>
-  <w:abstractNum w:abstractNumId="128" w15:restartNumberingAfterBreak="0">
+  <w:abstractNum w:abstractNumId="131" w15:restartNumberingAfterBreak="0">
+    <w:nsid w:val="59EC6D60"/>
+    <w:multiLevelType w:val="hybridMultilevel"/>
+    <w:tmpl w:val="97E6E6DE"/>
+    <w:lvl w:ilvl="0" w:tplc="04090005">
+      <w:start w:val="1"/>
+      <w:numFmt w:val="bullet"/>
+      <w:lvlText w:val=""/>
+      <w:lvlJc w:val="left"/>
+      <w:pPr>
+        <w:ind w:left="720" w:hanging="360"/>
+      </w:pPr>
+      <w:rPr>
+        <w:rFonts w:ascii="Wingdings" w:hAnsi="Wingdings" w:hint="default"/>
+      </w:rPr>
+    </w:lvl>
+    <w:lvl w:ilvl="1" w:tplc="04090003" w:tentative="1">
+      <w:start w:val="1"/>
+      <w:numFmt w:val="bullet"/>
+      <w:lvlText w:val="o"/>
+      <w:lvlJc w:val="left"/>
+      <w:pPr>
+        <w:ind w:left="1440" w:hanging="360"/>
+      </w:pPr>
+      <w:rPr>
+        <w:rFonts w:ascii="Courier New" w:hAnsi="Courier New" w:cs="Courier New" w:hint="default"/>
+      </w:rPr>
+    </w:lvl>
+    <w:lvl w:ilvl="2" w:tplc="04090005" w:tentative="1">
+      <w:start w:val="1"/>
+      <w:numFmt w:val="bullet"/>
+      <w:lvlText w:val=""/>
+      <w:lvlJc w:val="left"/>
+      <w:pPr>
+        <w:ind w:left="2160" w:hanging="360"/>
+      </w:pPr>
+      <w:rPr>
+        <w:rFonts w:ascii="Wingdings" w:hAnsi="Wingdings" w:hint="default"/>
+      </w:rPr>
+    </w:lvl>
+    <w:lvl w:ilvl="3" w:tplc="04090001" w:tentative="1">
+      <w:start w:val="1"/>
+      <w:numFmt w:val="bullet"/>
+      <w:lvlText w:val=""/>
+      <w:lvlJc w:val="left"/>
+      <w:pPr>
+        <w:ind w:left="2880" w:hanging="360"/>
+      </w:pPr>
+      <w:rPr>
+        <w:rFonts w:ascii="Symbol" w:hAnsi="Symbol" w:hint="default"/>
+      </w:rPr>
+    </w:lvl>
+    <w:lvl w:ilvl="4" w:tplc="04090003" w:tentative="1">
+      <w:start w:val="1"/>
+      <w:numFmt w:val="bullet"/>
+      <w:lvlText w:val="o"/>
+      <w:lvlJc w:val="left"/>
+      <w:pPr>
+        <w:ind w:left="3600" w:hanging="360"/>
+      </w:pPr>
+      <w:rPr>
+        <w:rFonts w:ascii="Courier New" w:hAnsi="Courier New" w:cs="Courier New" w:hint="default"/>
+      </w:rPr>
+    </w:lvl>
+    <w:lvl w:ilvl="5" w:tplc="04090005" w:tentative="1">
+      <w:start w:val="1"/>
+      <w:numFmt w:val="bullet"/>
+      <w:lvlText w:val=""/>
+      <w:lvlJc w:val="left"/>
+      <w:pPr>
+        <w:ind w:left="4320" w:hanging="360"/>
+      </w:pPr>
+      <w:rPr>
+        <w:rFonts w:ascii="Wingdings" w:hAnsi="Wingdings" w:hint="default"/>
+      </w:rPr>
+    </w:lvl>
+    <w:lvl w:ilvl="6" w:tplc="04090001" w:tentative="1">
+      <w:start w:val="1"/>
+      <w:numFmt w:val="bullet"/>
+      <w:lvlText w:val=""/>
+      <w:lvlJc w:val="left"/>
+      <w:pPr>
+        <w:ind w:left="5040" w:hanging="360"/>
+      </w:pPr>
+      <w:rPr>
+        <w:rFonts w:ascii="Symbol" w:hAnsi="Symbol" w:hint="default"/>
+      </w:rPr>
+    </w:lvl>
+    <w:lvl w:ilvl="7" w:tplc="04090003" w:tentative="1">
+      <w:start w:val="1"/>
+      <w:numFmt w:val="bullet"/>
+      <w:lvlText w:val="o"/>
+      <w:lvlJc w:val="left"/>
+      <w:pPr>
+        <w:ind w:left="5760" w:hanging="360"/>
+      </w:pPr>
+      <w:rPr>
+        <w:rFonts w:ascii="Courier New" w:hAnsi="Courier New" w:cs="Courier New" w:hint="default"/>
+      </w:rPr>
+    </w:lvl>
+    <w:lvl w:ilvl="8" w:tplc="04090005" w:tentative="1">
+      <w:start w:val="1"/>
+      <w:numFmt w:val="bullet"/>
+      <w:lvlText w:val=""/>
+      <w:lvlJc w:val="left"/>
+      <w:pPr>
+        <w:ind w:left="6480" w:hanging="360"/>
+      </w:pPr>
+      <w:rPr>
+        <w:rFonts w:ascii="Wingdings" w:hAnsi="Wingdings" w:hint="default"/>
+      </w:rPr>
+    </w:lvl>
+  </w:abstractNum>
+  <w:abstractNum w:abstractNumId="132" w15:restartNumberingAfterBreak="0">
     <w:nsid w:val="5BD11962"/>
     <w:multiLevelType w:val="hybridMultilevel"/>
     <w:tmpl w:val="89A4B834"/>
@@ -28405,7 +30743,7 @@
       </w:pPr>
     </w:lvl>
   </w:abstractNum>
-  <w:abstractNum w:abstractNumId="129" w15:restartNumberingAfterBreak="0">
+  <w:abstractNum w:abstractNumId="133" w15:restartNumberingAfterBreak="0">
     <w:nsid w:val="5C950DBA"/>
     <w:multiLevelType w:val="hybridMultilevel"/>
     <w:tmpl w:val="7D78F950"/>
@@ -28517,7 +30855,7 @@
       </w:rPr>
     </w:lvl>
   </w:abstractNum>
-  <w:abstractNum w:abstractNumId="130" w15:restartNumberingAfterBreak="0">
+  <w:abstractNum w:abstractNumId="134" w15:restartNumberingAfterBreak="0">
     <w:nsid w:val="5D2A5D3B"/>
     <w:multiLevelType w:val="hybridMultilevel"/>
     <w:tmpl w:val="3AF89EA6"/>
@@ -28608,7 +30946,7 @@
       </w:pPr>
     </w:lvl>
   </w:abstractNum>
-  <w:abstractNum w:abstractNumId="131" w15:restartNumberingAfterBreak="0">
+  <w:abstractNum w:abstractNumId="135" w15:restartNumberingAfterBreak="0">
     <w:nsid w:val="5D9E49FD"/>
     <w:multiLevelType w:val="hybridMultilevel"/>
     <w:tmpl w:val="4EE40BB4"/>
@@ -28720,7 +31058,7 @@
       </w:rPr>
     </w:lvl>
   </w:abstractNum>
-  <w:abstractNum w:abstractNumId="132" w15:restartNumberingAfterBreak="0">
+  <w:abstractNum w:abstractNumId="136" w15:restartNumberingAfterBreak="0">
     <w:nsid w:val="5DB7107D"/>
     <w:multiLevelType w:val="multilevel"/>
     <w:tmpl w:val="6520107A"/>
@@ -28869,7 +31207,7 @@
       </w:rPr>
     </w:lvl>
   </w:abstractNum>
-  <w:abstractNum w:abstractNumId="133" w15:restartNumberingAfterBreak="0">
+  <w:abstractNum w:abstractNumId="137" w15:restartNumberingAfterBreak="0">
     <w:nsid w:val="60421322"/>
     <w:multiLevelType w:val="hybridMultilevel"/>
     <w:tmpl w:val="447CDBDC"/>
@@ -28981,7 +31319,7 @@
       </w:rPr>
     </w:lvl>
   </w:abstractNum>
-  <w:abstractNum w:abstractNumId="134" w15:restartNumberingAfterBreak="0">
+  <w:abstractNum w:abstractNumId="138" w15:restartNumberingAfterBreak="0">
     <w:nsid w:val="60B43772"/>
     <w:multiLevelType w:val="hybridMultilevel"/>
     <w:tmpl w:val="04FC7310"/>
@@ -29095,7 +31433,7 @@
       </w:rPr>
     </w:lvl>
   </w:abstractNum>
-  <w:abstractNum w:abstractNumId="135" w15:restartNumberingAfterBreak="0">
+  <w:abstractNum w:abstractNumId="139" w15:restartNumberingAfterBreak="0">
     <w:nsid w:val="61926C31"/>
     <w:multiLevelType w:val="hybridMultilevel"/>
     <w:tmpl w:val="AFD27E5C"/>
@@ -29208,7 +31546,7 @@
       </w:rPr>
     </w:lvl>
   </w:abstractNum>
-  <w:abstractNum w:abstractNumId="136" w15:restartNumberingAfterBreak="0">
+  <w:abstractNum w:abstractNumId="140" w15:restartNumberingAfterBreak="0">
     <w:nsid w:val="622F5FC7"/>
     <w:multiLevelType w:val="hybridMultilevel"/>
     <w:tmpl w:val="49A6C2A6"/>
@@ -29321,7 +31659,7 @@
       </w:rPr>
     </w:lvl>
   </w:abstractNum>
-  <w:abstractNum w:abstractNumId="137" w15:restartNumberingAfterBreak="0">
+  <w:abstractNum w:abstractNumId="141" w15:restartNumberingAfterBreak="0">
     <w:nsid w:val="623A0E20"/>
     <w:multiLevelType w:val="hybridMultilevel"/>
     <w:tmpl w:val="3E360542"/>
@@ -29434,7 +31772,7 @@
       </w:rPr>
     </w:lvl>
   </w:abstractNum>
-  <w:abstractNum w:abstractNumId="138" w15:restartNumberingAfterBreak="0">
+  <w:abstractNum w:abstractNumId="142" w15:restartNumberingAfterBreak="0">
     <w:nsid w:val="62AC33B4"/>
     <w:multiLevelType w:val="multilevel"/>
     <w:tmpl w:val="A074F3CA"/>
@@ -29583,7 +31921,7 @@
       </w:rPr>
     </w:lvl>
   </w:abstractNum>
-  <w:abstractNum w:abstractNumId="139" w15:restartNumberingAfterBreak="0">
+  <w:abstractNum w:abstractNumId="143" w15:restartNumberingAfterBreak="0">
     <w:nsid w:val="63B44674"/>
     <w:multiLevelType w:val="multilevel"/>
     <w:tmpl w:val="08F4FA9A"/>
@@ -29732,7 +32070,7 @@
       </w:rPr>
     </w:lvl>
   </w:abstractNum>
-  <w:abstractNum w:abstractNumId="140" w15:restartNumberingAfterBreak="0">
+  <w:abstractNum w:abstractNumId="144" w15:restartNumberingAfterBreak="0">
     <w:nsid w:val="63C245D4"/>
     <w:multiLevelType w:val="hybridMultilevel"/>
     <w:tmpl w:val="E1563A56"/>
@@ -29844,7 +32182,7 @@
       </w:rPr>
     </w:lvl>
   </w:abstractNum>
-  <w:abstractNum w:abstractNumId="141" w15:restartNumberingAfterBreak="0">
+  <w:abstractNum w:abstractNumId="145" w15:restartNumberingAfterBreak="0">
     <w:nsid w:val="645F5F11"/>
     <w:multiLevelType w:val="hybridMultilevel"/>
     <w:tmpl w:val="D3423512"/>
@@ -29957,7 +32295,7 @@
       </w:rPr>
     </w:lvl>
   </w:abstractNum>
-  <w:abstractNum w:abstractNumId="142" w15:restartNumberingAfterBreak="0">
+  <w:abstractNum w:abstractNumId="146" w15:restartNumberingAfterBreak="0">
     <w:nsid w:val="64F30198"/>
     <w:multiLevelType w:val="multilevel"/>
     <w:tmpl w:val="63F4E6F0"/>
@@ -30106,7 +32444,7 @@
       </w:rPr>
     </w:lvl>
   </w:abstractNum>
-  <w:abstractNum w:abstractNumId="143" w15:restartNumberingAfterBreak="0">
+  <w:abstractNum w:abstractNumId="147" w15:restartNumberingAfterBreak="0">
     <w:nsid w:val="65AF2502"/>
     <w:multiLevelType w:val="hybridMultilevel"/>
     <w:tmpl w:val="FB2A44D8"/>
@@ -30219,7 +32557,7 @@
       </w:rPr>
     </w:lvl>
   </w:abstractNum>
-  <w:abstractNum w:abstractNumId="144" w15:restartNumberingAfterBreak="0">
+  <w:abstractNum w:abstractNumId="148" w15:restartNumberingAfterBreak="0">
     <w:nsid w:val="65E53C08"/>
     <w:multiLevelType w:val="hybridMultilevel"/>
     <w:tmpl w:val="8A44FBE2"/>
@@ -30332,7 +32670,7 @@
       </w:rPr>
     </w:lvl>
   </w:abstractNum>
-  <w:abstractNum w:abstractNumId="145" w15:restartNumberingAfterBreak="0">
+  <w:abstractNum w:abstractNumId="149" w15:restartNumberingAfterBreak="0">
     <w:nsid w:val="671614F0"/>
     <w:multiLevelType w:val="multilevel"/>
     <w:tmpl w:val="63F4E6F0"/>
@@ -30481,7 +32819,7 @@
       </w:rPr>
     </w:lvl>
   </w:abstractNum>
-  <w:abstractNum w:abstractNumId="146" w15:restartNumberingAfterBreak="0">
+  <w:abstractNum w:abstractNumId="150" w15:restartNumberingAfterBreak="0">
     <w:nsid w:val="6859691D"/>
     <w:multiLevelType w:val="multilevel"/>
     <w:tmpl w:val="826A9D48"/>
@@ -30630,7 +32968,7 @@
       </w:rPr>
     </w:lvl>
   </w:abstractNum>
-  <w:abstractNum w:abstractNumId="147" w15:restartNumberingAfterBreak="0">
+  <w:abstractNum w:abstractNumId="151" w15:restartNumberingAfterBreak="0">
     <w:nsid w:val="68817757"/>
     <w:multiLevelType w:val="multilevel"/>
     <w:tmpl w:val="34EE1968"/>
@@ -30779,7 +33117,7 @@
       </w:rPr>
     </w:lvl>
   </w:abstractNum>
-  <w:abstractNum w:abstractNumId="148" w15:restartNumberingAfterBreak="0">
+  <w:abstractNum w:abstractNumId="152" w15:restartNumberingAfterBreak="0">
     <w:nsid w:val="68BE10E8"/>
     <w:multiLevelType w:val="hybridMultilevel"/>
     <w:tmpl w:val="326CD592"/>
@@ -30892,7 +33230,7 @@
       </w:rPr>
     </w:lvl>
   </w:abstractNum>
-  <w:abstractNum w:abstractNumId="149" w15:restartNumberingAfterBreak="0">
+  <w:abstractNum w:abstractNumId="153" w15:restartNumberingAfterBreak="0">
     <w:nsid w:val="69996D9A"/>
     <w:multiLevelType w:val="multilevel"/>
     <w:tmpl w:val="1780FC38"/>
@@ -31041,7 +33379,7 @@
       </w:rPr>
     </w:lvl>
   </w:abstractNum>
-  <w:abstractNum w:abstractNumId="150" w15:restartNumberingAfterBreak="0">
+  <w:abstractNum w:abstractNumId="154" w15:restartNumberingAfterBreak="0">
     <w:nsid w:val="6B3C30B9"/>
     <w:multiLevelType w:val="hybridMultilevel"/>
     <w:tmpl w:val="C938F8DE"/>
@@ -31153,7 +33491,7 @@
       </w:rPr>
     </w:lvl>
   </w:abstractNum>
-  <w:abstractNum w:abstractNumId="151" w15:restartNumberingAfterBreak="0">
+  <w:abstractNum w:abstractNumId="155" w15:restartNumberingAfterBreak="0">
     <w:nsid w:val="6D1511A0"/>
     <w:multiLevelType w:val="hybridMultilevel"/>
     <w:tmpl w:val="AAD8B9B4"/>
@@ -31265,7 +33603,7 @@
       </w:rPr>
     </w:lvl>
   </w:abstractNum>
-  <w:abstractNum w:abstractNumId="152" w15:restartNumberingAfterBreak="0">
+  <w:abstractNum w:abstractNumId="156" w15:restartNumberingAfterBreak="0">
     <w:nsid w:val="6DD255F1"/>
     <w:multiLevelType w:val="hybridMultilevel"/>
     <w:tmpl w:val="ACBC1404"/>
@@ -31378,7 +33716,7 @@
       </w:rPr>
     </w:lvl>
   </w:abstractNum>
-  <w:abstractNum w:abstractNumId="153" w15:restartNumberingAfterBreak="0">
+  <w:abstractNum w:abstractNumId="157" w15:restartNumberingAfterBreak="0">
     <w:nsid w:val="6DDB4404"/>
     <w:multiLevelType w:val="hybridMultilevel"/>
     <w:tmpl w:val="06428E32"/>
@@ -31491,7 +33829,7 @@
       </w:rPr>
     </w:lvl>
   </w:abstractNum>
-  <w:abstractNum w:abstractNumId="154" w15:restartNumberingAfterBreak="0">
+  <w:abstractNum w:abstractNumId="158" w15:restartNumberingAfterBreak="0">
     <w:nsid w:val="6EE2159D"/>
     <w:multiLevelType w:val="hybridMultilevel"/>
     <w:tmpl w:val="36C69320"/>
@@ -31604,7 +33942,7 @@
       </w:rPr>
     </w:lvl>
   </w:abstractNum>
-  <w:abstractNum w:abstractNumId="155" w15:restartNumberingAfterBreak="0">
+  <w:abstractNum w:abstractNumId="159" w15:restartNumberingAfterBreak="0">
     <w:nsid w:val="6F014B3B"/>
     <w:multiLevelType w:val="hybridMultilevel"/>
     <w:tmpl w:val="C89A39BE"/>
@@ -31716,7 +34054,7 @@
       </w:rPr>
     </w:lvl>
   </w:abstractNum>
-  <w:abstractNum w:abstractNumId="156" w15:restartNumberingAfterBreak="0">
+  <w:abstractNum w:abstractNumId="160" w15:restartNumberingAfterBreak="0">
     <w:nsid w:val="6F171273"/>
     <w:multiLevelType w:val="multilevel"/>
     <w:tmpl w:val="0240C564"/>
@@ -31865,7 +34203,7 @@
       </w:rPr>
     </w:lvl>
   </w:abstractNum>
-  <w:abstractNum w:abstractNumId="157" w15:restartNumberingAfterBreak="0">
+  <w:abstractNum w:abstractNumId="161" w15:restartNumberingAfterBreak="0">
     <w:nsid w:val="6FB82AAA"/>
     <w:multiLevelType w:val="multilevel"/>
     <w:tmpl w:val="FC46C7C0"/>
@@ -32014,7 +34352,7 @@
       </w:rPr>
     </w:lvl>
   </w:abstractNum>
-  <w:abstractNum w:abstractNumId="158" w15:restartNumberingAfterBreak="0">
+  <w:abstractNum w:abstractNumId="162" w15:restartNumberingAfterBreak="0">
     <w:nsid w:val="6FD46DCF"/>
     <w:multiLevelType w:val="hybridMultilevel"/>
     <w:tmpl w:val="EF5E6EC6"/>
@@ -32127,7 +34465,7 @@
       </w:rPr>
     </w:lvl>
   </w:abstractNum>
-  <w:abstractNum w:abstractNumId="159" w15:restartNumberingAfterBreak="0">
+  <w:abstractNum w:abstractNumId="163" w15:restartNumberingAfterBreak="0">
     <w:nsid w:val="70484E38"/>
     <w:multiLevelType w:val="multilevel"/>
     <w:tmpl w:val="22B26DD2"/>
@@ -32276,7 +34614,7 @@
       </w:rPr>
     </w:lvl>
   </w:abstractNum>
-  <w:abstractNum w:abstractNumId="160" w15:restartNumberingAfterBreak="0">
+  <w:abstractNum w:abstractNumId="164" w15:restartNumberingAfterBreak="0">
     <w:nsid w:val="70CB723E"/>
     <w:multiLevelType w:val="multilevel"/>
     <w:tmpl w:val="63F4E6F0"/>
@@ -32425,7 +34763,7 @@
       </w:rPr>
     </w:lvl>
   </w:abstractNum>
-  <w:abstractNum w:abstractNumId="161" w15:restartNumberingAfterBreak="0">
+  <w:abstractNum w:abstractNumId="165" w15:restartNumberingAfterBreak="0">
     <w:nsid w:val="71C028F7"/>
     <w:multiLevelType w:val="hybridMultilevel"/>
     <w:tmpl w:val="85104F0A"/>
@@ -32538,7 +34876,7 @@
       </w:rPr>
     </w:lvl>
   </w:abstractNum>
-  <w:abstractNum w:abstractNumId="162" w15:restartNumberingAfterBreak="0">
+  <w:abstractNum w:abstractNumId="166" w15:restartNumberingAfterBreak="0">
     <w:nsid w:val="71DB3F58"/>
     <w:multiLevelType w:val="multilevel"/>
     <w:tmpl w:val="63F4E6F0"/>
@@ -32687,7 +35025,7 @@
       </w:rPr>
     </w:lvl>
   </w:abstractNum>
-  <w:abstractNum w:abstractNumId="163" w15:restartNumberingAfterBreak="0">
+  <w:abstractNum w:abstractNumId="167" w15:restartNumberingAfterBreak="0">
     <w:nsid w:val="720D204A"/>
     <w:multiLevelType w:val="hybridMultilevel"/>
     <w:tmpl w:val="70D646D0"/>
@@ -32801,7 +35139,7 @@
       </w:rPr>
     </w:lvl>
   </w:abstractNum>
-  <w:abstractNum w:abstractNumId="164" w15:restartNumberingAfterBreak="0">
+  <w:abstractNum w:abstractNumId="168" w15:restartNumberingAfterBreak="0">
     <w:nsid w:val="72F31FF2"/>
     <w:multiLevelType w:val="hybridMultilevel"/>
     <w:tmpl w:val="5C2693A0"/>
@@ -32913,7 +35251,7 @@
       </w:rPr>
     </w:lvl>
   </w:abstractNum>
-  <w:abstractNum w:abstractNumId="165" w15:restartNumberingAfterBreak="0">
+  <w:abstractNum w:abstractNumId="169" w15:restartNumberingAfterBreak="0">
     <w:nsid w:val="73B82579"/>
     <w:multiLevelType w:val="hybridMultilevel"/>
     <w:tmpl w:val="B8E8229C"/>
@@ -33026,7 +35364,7 @@
       </w:rPr>
     </w:lvl>
   </w:abstractNum>
-  <w:abstractNum w:abstractNumId="166" w15:restartNumberingAfterBreak="0">
+  <w:abstractNum w:abstractNumId="170" w15:restartNumberingAfterBreak="0">
     <w:nsid w:val="74522E8F"/>
     <w:multiLevelType w:val="hybridMultilevel"/>
     <w:tmpl w:val="9B1C2096"/>
@@ -33139,7 +35477,7 @@
       </w:rPr>
     </w:lvl>
   </w:abstractNum>
-  <w:abstractNum w:abstractNumId="167" w15:restartNumberingAfterBreak="0">
+  <w:abstractNum w:abstractNumId="171" w15:restartNumberingAfterBreak="0">
     <w:nsid w:val="75B45140"/>
     <w:multiLevelType w:val="hybridMultilevel"/>
     <w:tmpl w:val="93F8F3C4"/>
@@ -33252,7 +35590,7 @@
       </w:rPr>
     </w:lvl>
   </w:abstractNum>
-  <w:abstractNum w:abstractNumId="168" w15:restartNumberingAfterBreak="0">
+  <w:abstractNum w:abstractNumId="172" w15:restartNumberingAfterBreak="0">
     <w:nsid w:val="76F60FFE"/>
     <w:multiLevelType w:val="multilevel"/>
     <w:tmpl w:val="63F4E6F0"/>
@@ -33401,7 +35739,7 @@
       </w:rPr>
     </w:lvl>
   </w:abstractNum>
-  <w:abstractNum w:abstractNumId="169" w15:restartNumberingAfterBreak="0">
+  <w:abstractNum w:abstractNumId="173" w15:restartNumberingAfterBreak="0">
     <w:nsid w:val="77572323"/>
     <w:multiLevelType w:val="multilevel"/>
     <w:tmpl w:val="63F4E6F0"/>
@@ -33550,7 +35888,7 @@
       </w:rPr>
     </w:lvl>
   </w:abstractNum>
-  <w:abstractNum w:abstractNumId="170" w15:restartNumberingAfterBreak="0">
+  <w:abstractNum w:abstractNumId="174" w15:restartNumberingAfterBreak="0">
     <w:nsid w:val="77B8201F"/>
     <w:multiLevelType w:val="hybridMultilevel"/>
     <w:tmpl w:val="D7160708"/>
@@ -33662,7 +36000,7 @@
       </w:rPr>
     </w:lvl>
   </w:abstractNum>
-  <w:abstractNum w:abstractNumId="171" w15:restartNumberingAfterBreak="0">
+  <w:abstractNum w:abstractNumId="175" w15:restartNumberingAfterBreak="0">
     <w:nsid w:val="79796FF9"/>
     <w:multiLevelType w:val="hybridMultilevel"/>
     <w:tmpl w:val="CFA8EF82"/>
@@ -33774,7 +36112,7 @@
       </w:rPr>
     </w:lvl>
   </w:abstractNum>
-  <w:abstractNum w:abstractNumId="172" w15:restartNumberingAfterBreak="0">
+  <w:abstractNum w:abstractNumId="176" w15:restartNumberingAfterBreak="0">
     <w:nsid w:val="79910410"/>
     <w:multiLevelType w:val="hybridMultilevel"/>
     <w:tmpl w:val="FC923542"/>
@@ -33886,7 +36224,7 @@
       </w:rPr>
     </w:lvl>
   </w:abstractNum>
-  <w:abstractNum w:abstractNumId="173" w15:restartNumberingAfterBreak="0">
+  <w:abstractNum w:abstractNumId="177" w15:restartNumberingAfterBreak="0">
     <w:nsid w:val="7AD51679"/>
     <w:multiLevelType w:val="hybridMultilevel"/>
     <w:tmpl w:val="C13E19C2"/>
@@ -33999,7 +36337,7 @@
       </w:rPr>
     </w:lvl>
   </w:abstractNum>
-  <w:abstractNum w:abstractNumId="174" w15:restartNumberingAfterBreak="0">
+  <w:abstractNum w:abstractNumId="178" w15:restartNumberingAfterBreak="0">
     <w:nsid w:val="7AFF575A"/>
     <w:multiLevelType w:val="hybridMultilevel"/>
     <w:tmpl w:val="A6323D3E"/>
@@ -34111,7 +36449,7 @@
       </w:rPr>
     </w:lvl>
   </w:abstractNum>
-  <w:abstractNum w:abstractNumId="175" w15:restartNumberingAfterBreak="0">
+  <w:abstractNum w:abstractNumId="179" w15:restartNumberingAfterBreak="0">
     <w:nsid w:val="7B4018BF"/>
     <w:multiLevelType w:val="multilevel"/>
     <w:tmpl w:val="63F4E6F0"/>
@@ -34260,7 +36598,7 @@
       </w:rPr>
     </w:lvl>
   </w:abstractNum>
-  <w:abstractNum w:abstractNumId="176" w15:restartNumberingAfterBreak="0">
+  <w:abstractNum w:abstractNumId="180" w15:restartNumberingAfterBreak="0">
     <w:nsid w:val="7B4D1B33"/>
     <w:multiLevelType w:val="hybridMultilevel"/>
     <w:tmpl w:val="5EAC717E"/>
@@ -34372,7 +36710,7 @@
       </w:rPr>
     </w:lvl>
   </w:abstractNum>
-  <w:abstractNum w:abstractNumId="177" w15:restartNumberingAfterBreak="0">
+  <w:abstractNum w:abstractNumId="181" w15:restartNumberingAfterBreak="0">
     <w:nsid w:val="7C437108"/>
     <w:multiLevelType w:val="hybridMultilevel"/>
     <w:tmpl w:val="3222D0E8"/>
@@ -34485,7 +36823,7 @@
       </w:rPr>
     </w:lvl>
   </w:abstractNum>
-  <w:abstractNum w:abstractNumId="178" w15:restartNumberingAfterBreak="0">
+  <w:abstractNum w:abstractNumId="182" w15:restartNumberingAfterBreak="0">
     <w:nsid w:val="7CAC27CD"/>
     <w:multiLevelType w:val="multilevel"/>
     <w:tmpl w:val="3BC20E58"/>
@@ -34634,7 +36972,7 @@
       </w:rPr>
     </w:lvl>
   </w:abstractNum>
-  <w:abstractNum w:abstractNumId="179" w15:restartNumberingAfterBreak="0">
+  <w:abstractNum w:abstractNumId="183" w15:restartNumberingAfterBreak="0">
     <w:nsid w:val="7DBE326E"/>
     <w:multiLevelType w:val="hybridMultilevel"/>
     <w:tmpl w:val="AFC0D8D6"/>
@@ -34747,7 +37085,7 @@
       </w:rPr>
     </w:lvl>
   </w:abstractNum>
-  <w:abstractNum w:abstractNumId="180" w15:restartNumberingAfterBreak="0">
+  <w:abstractNum w:abstractNumId="184" w15:restartNumberingAfterBreak="0">
     <w:nsid w:val="7E5978EA"/>
     <w:multiLevelType w:val="hybridMultilevel"/>
     <w:tmpl w:val="D74C0DB0"/>
@@ -34859,7 +37197,7 @@
       </w:rPr>
     </w:lvl>
   </w:abstractNum>
-  <w:abstractNum w:abstractNumId="181" w15:restartNumberingAfterBreak="0">
+  <w:abstractNum w:abstractNumId="185" w15:restartNumberingAfterBreak="0">
     <w:nsid w:val="7F106A5D"/>
     <w:multiLevelType w:val="hybridMultilevel"/>
     <w:tmpl w:val="A1CA4816"/>
@@ -34971,7 +37309,7 @@
       </w:rPr>
     </w:lvl>
   </w:abstractNum>
-  <w:abstractNum w:abstractNumId="182" w15:restartNumberingAfterBreak="0">
+  <w:abstractNum w:abstractNumId="186" w15:restartNumberingAfterBreak="0">
     <w:nsid w:val="7FD679F5"/>
     <w:multiLevelType w:val="hybridMultilevel"/>
     <w:tmpl w:val="1ED417E8"/>
@@ -35085,82 +37423,82 @@
     </w:lvl>
   </w:abstractNum>
   <w:num w:numId="1" w16cid:durableId="1882476756">
-    <w:abstractNumId w:val="101"/>
+    <w:abstractNumId w:val="103"/>
   </w:num>
   <w:num w:numId="2" w16cid:durableId="871453468">
-    <w:abstractNumId w:val="26"/>
+    <w:abstractNumId w:val="27"/>
   </w:num>
   <w:num w:numId="3" w16cid:durableId="698706805">
-    <w:abstractNumId w:val="42"/>
+    <w:abstractNumId w:val="43"/>
   </w:num>
   <w:num w:numId="4" w16cid:durableId="1105467722">
-    <w:abstractNumId w:val="82"/>
+    <w:abstractNumId w:val="84"/>
   </w:num>
   <w:num w:numId="5" w16cid:durableId="769932622">
+    <w:abstractNumId w:val="123"/>
+  </w:num>
+  <w:num w:numId="6" w16cid:durableId="575944109">
+    <w:abstractNumId w:val="47"/>
+  </w:num>
+  <w:num w:numId="7" w16cid:durableId="877661689">
+    <w:abstractNumId w:val="163"/>
+  </w:num>
+  <w:num w:numId="8" w16cid:durableId="1390107422">
+    <w:abstractNumId w:val="90"/>
+  </w:num>
+  <w:num w:numId="9" w16cid:durableId="881866424">
     <w:abstractNumId w:val="120"/>
   </w:num>
-  <w:num w:numId="6" w16cid:durableId="575944109">
-    <w:abstractNumId w:val="46"/>
-  </w:num>
-  <w:num w:numId="7" w16cid:durableId="877661689">
-    <w:abstractNumId w:val="159"/>
-  </w:num>
-  <w:num w:numId="8" w16cid:durableId="1390107422">
-    <w:abstractNumId w:val="88"/>
-  </w:num>
-  <w:num w:numId="9" w16cid:durableId="881866424">
-    <w:abstractNumId w:val="117"/>
-  </w:num>
   <w:num w:numId="10" w16cid:durableId="1037244995">
-    <w:abstractNumId w:val="149"/>
+    <w:abstractNumId w:val="153"/>
   </w:num>
   <w:num w:numId="11" w16cid:durableId="1575554597">
-    <w:abstractNumId w:val="70"/>
+    <w:abstractNumId w:val="72"/>
   </w:num>
   <w:num w:numId="12" w16cid:durableId="915364478">
-    <w:abstractNumId w:val="97"/>
+    <w:abstractNumId w:val="99"/>
   </w:num>
   <w:num w:numId="13" w16cid:durableId="1386294114">
-    <w:abstractNumId w:val="139"/>
+    <w:abstractNumId w:val="143"/>
   </w:num>
   <w:num w:numId="14" w16cid:durableId="1071851223">
-    <w:abstractNumId w:val="28"/>
+    <w:abstractNumId w:val="29"/>
   </w:num>
   <w:num w:numId="15" w16cid:durableId="1545557520">
-    <w:abstractNumId w:val="83"/>
+    <w:abstractNumId w:val="85"/>
   </w:num>
   <w:num w:numId="16" w16cid:durableId="1102919547">
-    <w:abstractNumId w:val="178"/>
+    <w:abstractNumId w:val="182"/>
   </w:num>
   <w:num w:numId="17" w16cid:durableId="294526838">
-    <w:abstractNumId w:val="58"/>
+    <w:abstractNumId w:val="59"/>
   </w:num>
   <w:num w:numId="18" w16cid:durableId="679889896">
-    <w:abstractNumId w:val="67"/>
+    <w:abstractNumId w:val="69"/>
   </w:num>
   <w:num w:numId="19" w16cid:durableId="2119449470">
-    <w:abstractNumId w:val="113"/>
+    <w:abstractNumId w:val="116"/>
   </w:num>
   <w:num w:numId="20" w16cid:durableId="1365054799">
     <w:abstractNumId w:val="15"/>
   </w:num>
   <w:num w:numId="21" w16cid:durableId="1683512738">
-    <w:abstractNumId w:val="68"/>
+    <w:abstractNumId w:val="70"/>
   </w:num>
   <w:num w:numId="22" w16cid:durableId="1080098953">
-    <w:abstractNumId w:val="146"/>
+    <w:abstractNumId w:val="150"/>
   </w:num>
   <w:num w:numId="23" w16cid:durableId="1635717296">
-    <w:abstractNumId w:val="75"/>
+    <w:abstractNumId w:val="77"/>
   </w:num>
   <w:num w:numId="24" w16cid:durableId="544873123">
-    <w:abstractNumId w:val="138"/>
+    <w:abstractNumId w:val="142"/>
   </w:num>
   <w:num w:numId="25" w16cid:durableId="1128352778">
     <w:abstractNumId w:val="14"/>
   </w:num>
   <w:num w:numId="26" w16cid:durableId="1732537407">
-    <w:abstractNumId w:val="153"/>
+    <w:abstractNumId w:val="157"/>
   </w:num>
   <w:num w:numId="27" w16cid:durableId="945502064">
     <w:abstractNumId w:val="8"/>
@@ -35169,292 +37507,292 @@
     <w:abstractNumId w:val="3"/>
   </w:num>
   <w:num w:numId="29" w16cid:durableId="815955639">
-    <w:abstractNumId w:val="66"/>
+    <w:abstractNumId w:val="68"/>
   </w:num>
   <w:num w:numId="30" w16cid:durableId="1500659483">
-    <w:abstractNumId w:val="93"/>
+    <w:abstractNumId w:val="95"/>
   </w:num>
   <w:num w:numId="31" w16cid:durableId="118301211">
     <w:abstractNumId w:val="17"/>
   </w:num>
   <w:num w:numId="32" w16cid:durableId="732387979">
-    <w:abstractNumId w:val="47"/>
+    <w:abstractNumId w:val="48"/>
   </w:num>
   <w:num w:numId="33" w16cid:durableId="2129276417">
-    <w:abstractNumId w:val="19"/>
+    <w:abstractNumId w:val="20"/>
   </w:num>
   <w:num w:numId="34" w16cid:durableId="1470708820">
-    <w:abstractNumId w:val="53"/>
+    <w:abstractNumId w:val="54"/>
   </w:num>
   <w:num w:numId="35" w16cid:durableId="356852923">
-    <w:abstractNumId w:val="112"/>
+    <w:abstractNumId w:val="115"/>
   </w:num>
   <w:num w:numId="36" w16cid:durableId="430662559">
-    <w:abstractNumId w:val="22"/>
+    <w:abstractNumId w:val="23"/>
   </w:num>
   <w:num w:numId="37" w16cid:durableId="247080868">
-    <w:abstractNumId w:val="167"/>
+    <w:abstractNumId w:val="171"/>
   </w:num>
   <w:num w:numId="38" w16cid:durableId="158887408">
-    <w:abstractNumId w:val="135"/>
+    <w:abstractNumId w:val="139"/>
   </w:num>
   <w:num w:numId="39" w16cid:durableId="1681347932">
-    <w:abstractNumId w:val="158"/>
+    <w:abstractNumId w:val="162"/>
   </w:num>
   <w:num w:numId="40" w16cid:durableId="2101440158">
-    <w:abstractNumId w:val="86"/>
+    <w:abstractNumId w:val="88"/>
   </w:num>
   <w:num w:numId="41" w16cid:durableId="1250391122">
-    <w:abstractNumId w:val="130"/>
+    <w:abstractNumId w:val="134"/>
   </w:num>
   <w:num w:numId="42" w16cid:durableId="479083359">
-    <w:abstractNumId w:val="164"/>
+    <w:abstractNumId w:val="168"/>
   </w:num>
   <w:num w:numId="43" w16cid:durableId="1557860317">
-    <w:abstractNumId w:val="114"/>
+    <w:abstractNumId w:val="117"/>
   </w:num>
   <w:num w:numId="44" w16cid:durableId="2142183763">
     <w:abstractNumId w:val="10"/>
   </w:num>
   <w:num w:numId="45" w16cid:durableId="1357736349">
-    <w:abstractNumId w:val="172"/>
+    <w:abstractNumId w:val="176"/>
   </w:num>
   <w:num w:numId="46" w16cid:durableId="1519656040">
-    <w:abstractNumId w:val="171"/>
+    <w:abstractNumId w:val="175"/>
   </w:num>
   <w:num w:numId="47" w16cid:durableId="1078596852">
-    <w:abstractNumId w:val="181"/>
+    <w:abstractNumId w:val="185"/>
   </w:num>
   <w:num w:numId="48" w16cid:durableId="1027950100">
-    <w:abstractNumId w:val="39"/>
+    <w:abstractNumId w:val="40"/>
   </w:num>
   <w:num w:numId="49" w16cid:durableId="878516382">
-    <w:abstractNumId w:val="21"/>
+    <w:abstractNumId w:val="22"/>
   </w:num>
   <w:num w:numId="50" w16cid:durableId="363404927">
-    <w:abstractNumId w:val="76"/>
+    <w:abstractNumId w:val="78"/>
   </w:num>
   <w:num w:numId="51" w16cid:durableId="1128354320">
-    <w:abstractNumId w:val="151"/>
+    <w:abstractNumId w:val="155"/>
   </w:num>
   <w:num w:numId="52" w16cid:durableId="248543928">
-    <w:abstractNumId w:val="85"/>
+    <w:abstractNumId w:val="87"/>
   </w:num>
   <w:num w:numId="53" w16cid:durableId="965889214">
-    <w:abstractNumId w:val="118"/>
+    <w:abstractNumId w:val="121"/>
   </w:num>
   <w:num w:numId="54" w16cid:durableId="1827503240">
-    <w:abstractNumId w:val="128"/>
+    <w:abstractNumId w:val="132"/>
   </w:num>
   <w:num w:numId="55" w16cid:durableId="505748256">
-    <w:abstractNumId w:val="107"/>
+    <w:abstractNumId w:val="109"/>
   </w:num>
   <w:num w:numId="56" w16cid:durableId="2120370925">
-    <w:abstractNumId w:val="36"/>
+    <w:abstractNumId w:val="37"/>
   </w:num>
   <w:num w:numId="57" w16cid:durableId="369182267">
     <w:abstractNumId w:val="18"/>
   </w:num>
   <w:num w:numId="58" w16cid:durableId="1000235123">
-    <w:abstractNumId w:val="115"/>
+    <w:abstractNumId w:val="118"/>
   </w:num>
   <w:num w:numId="59" w16cid:durableId="628516409">
-    <w:abstractNumId w:val="150"/>
+    <w:abstractNumId w:val="154"/>
   </w:num>
   <w:num w:numId="60" w16cid:durableId="2028865444">
-    <w:abstractNumId w:val="103"/>
+    <w:abstractNumId w:val="105"/>
   </w:num>
   <w:num w:numId="61" w16cid:durableId="943926811">
-    <w:abstractNumId w:val="176"/>
+    <w:abstractNumId w:val="180"/>
   </w:num>
   <w:num w:numId="62" w16cid:durableId="1841193257">
-    <w:abstractNumId w:val="78"/>
+    <w:abstractNumId w:val="80"/>
   </w:num>
   <w:num w:numId="63" w16cid:durableId="682322850">
-    <w:abstractNumId w:val="155"/>
+    <w:abstractNumId w:val="159"/>
   </w:num>
   <w:num w:numId="64" w16cid:durableId="2043705333">
-    <w:abstractNumId w:val="79"/>
+    <w:abstractNumId w:val="81"/>
   </w:num>
   <w:num w:numId="65" w16cid:durableId="1164854761">
-    <w:abstractNumId w:val="57"/>
+    <w:abstractNumId w:val="58"/>
   </w:num>
   <w:num w:numId="66" w16cid:durableId="1919972541">
-    <w:abstractNumId w:val="99"/>
+    <w:abstractNumId w:val="101"/>
   </w:num>
   <w:num w:numId="67" w16cid:durableId="463617329">
-    <w:abstractNumId w:val="61"/>
+    <w:abstractNumId w:val="62"/>
   </w:num>
   <w:num w:numId="68" w16cid:durableId="2064014330">
-    <w:abstractNumId w:val="123"/>
+    <w:abstractNumId w:val="126"/>
   </w:num>
   <w:num w:numId="69" w16cid:durableId="452797354">
-    <w:abstractNumId w:val="129"/>
+    <w:abstractNumId w:val="133"/>
   </w:num>
   <w:num w:numId="70" w16cid:durableId="1196650037">
-    <w:abstractNumId w:val="51"/>
+    <w:abstractNumId w:val="52"/>
   </w:num>
   <w:num w:numId="71" w16cid:durableId="940071828">
-    <w:abstractNumId w:val="170"/>
+    <w:abstractNumId w:val="174"/>
   </w:num>
   <w:num w:numId="72" w16cid:durableId="1608273926">
-    <w:abstractNumId w:val="81"/>
+    <w:abstractNumId w:val="83"/>
   </w:num>
   <w:num w:numId="73" w16cid:durableId="2009864772">
-    <w:abstractNumId w:val="100"/>
+    <w:abstractNumId w:val="102"/>
   </w:num>
   <w:num w:numId="74" w16cid:durableId="712267004">
-    <w:abstractNumId w:val="38"/>
+    <w:abstractNumId w:val="39"/>
   </w:num>
   <w:num w:numId="75" w16cid:durableId="506480902">
-    <w:abstractNumId w:val="33"/>
+    <w:abstractNumId w:val="34"/>
   </w:num>
   <w:num w:numId="76" w16cid:durableId="286202349">
-    <w:abstractNumId w:val="133"/>
+    <w:abstractNumId w:val="137"/>
   </w:num>
   <w:num w:numId="77" w16cid:durableId="156460757">
-    <w:abstractNumId w:val="71"/>
+    <w:abstractNumId w:val="73"/>
   </w:num>
   <w:num w:numId="78" w16cid:durableId="1230077056">
     <w:abstractNumId w:val="6"/>
   </w:num>
   <w:num w:numId="79" w16cid:durableId="1837106927">
-    <w:abstractNumId w:val="50"/>
+    <w:abstractNumId w:val="51"/>
   </w:num>
   <w:num w:numId="80" w16cid:durableId="287929152">
-    <w:abstractNumId w:val="37"/>
+    <w:abstractNumId w:val="38"/>
   </w:num>
   <w:num w:numId="81" w16cid:durableId="1672175260">
-    <w:abstractNumId w:val="95"/>
+    <w:abstractNumId w:val="97"/>
   </w:num>
   <w:num w:numId="82" w16cid:durableId="1954820163">
-    <w:abstractNumId w:val="60"/>
+    <w:abstractNumId w:val="61"/>
   </w:num>
   <w:num w:numId="83" w16cid:durableId="1990016594">
-    <w:abstractNumId w:val="24"/>
+    <w:abstractNumId w:val="25"/>
   </w:num>
   <w:num w:numId="84" w16cid:durableId="366876741">
-    <w:abstractNumId w:val="102"/>
+    <w:abstractNumId w:val="104"/>
   </w:num>
   <w:num w:numId="85" w16cid:durableId="15274915">
-    <w:abstractNumId w:val="40"/>
+    <w:abstractNumId w:val="41"/>
   </w:num>
   <w:num w:numId="86" w16cid:durableId="288124443">
     <w:abstractNumId w:val="11"/>
   </w:num>
   <w:num w:numId="87" w16cid:durableId="591351385">
-    <w:abstractNumId w:val="119"/>
+    <w:abstractNumId w:val="122"/>
   </w:num>
   <w:num w:numId="88" w16cid:durableId="1361005725">
-    <w:abstractNumId w:val="174"/>
+    <w:abstractNumId w:val="178"/>
   </w:num>
   <w:num w:numId="89" w16cid:durableId="219681743">
     <w:abstractNumId w:val="12"/>
   </w:num>
   <w:num w:numId="90" w16cid:durableId="194386594">
-    <w:abstractNumId w:val="131"/>
+    <w:abstractNumId w:val="135"/>
   </w:num>
   <w:num w:numId="91" w16cid:durableId="777793346">
-    <w:abstractNumId w:val="91"/>
+    <w:abstractNumId w:val="93"/>
   </w:num>
   <w:num w:numId="92" w16cid:durableId="173346871">
+    <w:abstractNumId w:val="100"/>
+  </w:num>
+  <w:num w:numId="93" w16cid:durableId="948700467">
+    <w:abstractNumId w:val="42"/>
+  </w:num>
+  <w:num w:numId="94" w16cid:durableId="1328363750">
+    <w:abstractNumId w:val="24"/>
+  </w:num>
+  <w:num w:numId="95" w16cid:durableId="541676570">
+    <w:abstractNumId w:val="74"/>
+  </w:num>
+  <w:num w:numId="96" w16cid:durableId="694119229">
     <w:abstractNumId w:val="98"/>
   </w:num>
-  <w:num w:numId="93" w16cid:durableId="948700467">
-    <w:abstractNumId w:val="41"/>
-  </w:num>
-  <w:num w:numId="94" w16cid:durableId="1328363750">
-    <w:abstractNumId w:val="23"/>
-  </w:num>
-  <w:num w:numId="95" w16cid:durableId="541676570">
-    <w:abstractNumId w:val="72"/>
-  </w:num>
-  <w:num w:numId="96" w16cid:durableId="694119229">
-    <w:abstractNumId w:val="96"/>
-  </w:num>
   <w:num w:numId="97" w16cid:durableId="704327987">
-    <w:abstractNumId w:val="55"/>
+    <w:abstractNumId w:val="56"/>
   </w:num>
   <w:num w:numId="98" w16cid:durableId="1157303613">
-    <w:abstractNumId w:val="25"/>
+    <w:abstractNumId w:val="26"/>
   </w:num>
   <w:num w:numId="99" w16cid:durableId="1706099794">
-    <w:abstractNumId w:val="157"/>
+    <w:abstractNumId w:val="161"/>
   </w:num>
   <w:num w:numId="100" w16cid:durableId="256404901">
-    <w:abstractNumId w:val="156"/>
+    <w:abstractNumId w:val="160"/>
   </w:num>
   <w:num w:numId="101" w16cid:durableId="924923012">
-    <w:abstractNumId w:val="31"/>
+    <w:abstractNumId w:val="32"/>
   </w:num>
   <w:num w:numId="102" w16cid:durableId="536550966">
-    <w:abstractNumId w:val="175"/>
+    <w:abstractNumId w:val="179"/>
   </w:num>
   <w:num w:numId="103" w16cid:durableId="425157302">
-    <w:abstractNumId w:val="73"/>
+    <w:abstractNumId w:val="75"/>
   </w:num>
   <w:num w:numId="104" w16cid:durableId="967664612">
-    <w:abstractNumId w:val="142"/>
+    <w:abstractNumId w:val="146"/>
   </w:num>
   <w:num w:numId="105" w16cid:durableId="361631616">
-    <w:abstractNumId w:val="105"/>
+    <w:abstractNumId w:val="107"/>
   </w:num>
   <w:num w:numId="106" w16cid:durableId="443623616">
-    <w:abstractNumId w:val="147"/>
+    <w:abstractNumId w:val="151"/>
   </w:num>
   <w:num w:numId="107" w16cid:durableId="150101619">
     <w:abstractNumId w:val="13"/>
   </w:num>
   <w:num w:numId="108" w16cid:durableId="1431658174">
-    <w:abstractNumId w:val="59"/>
+    <w:abstractNumId w:val="60"/>
   </w:num>
   <w:num w:numId="109" w16cid:durableId="1050495440">
     <w:abstractNumId w:val="0"/>
   </w:num>
   <w:num w:numId="110" w16cid:durableId="712924661">
-    <w:abstractNumId w:val="127"/>
+    <w:abstractNumId w:val="130"/>
   </w:num>
   <w:num w:numId="111" w16cid:durableId="1917784113">
-    <w:abstractNumId w:val="121"/>
+    <w:abstractNumId w:val="124"/>
   </w:num>
   <w:num w:numId="112" w16cid:durableId="896237065">
-    <w:abstractNumId w:val="132"/>
+    <w:abstractNumId w:val="136"/>
   </w:num>
   <w:num w:numId="113" w16cid:durableId="1171681430">
-    <w:abstractNumId w:val="160"/>
+    <w:abstractNumId w:val="164"/>
   </w:num>
   <w:num w:numId="114" w16cid:durableId="1552573199">
-    <w:abstractNumId w:val="162"/>
+    <w:abstractNumId w:val="166"/>
   </w:num>
   <w:num w:numId="115" w16cid:durableId="1920869674">
-    <w:abstractNumId w:val="145"/>
+    <w:abstractNumId w:val="149"/>
   </w:num>
   <w:num w:numId="116" w16cid:durableId="476724716">
-    <w:abstractNumId w:val="109"/>
+    <w:abstractNumId w:val="111"/>
   </w:num>
   <w:num w:numId="117" w16cid:durableId="658919541">
-    <w:abstractNumId w:val="108"/>
+    <w:abstractNumId w:val="110"/>
   </w:num>
   <w:num w:numId="118" w16cid:durableId="1622418131">
-    <w:abstractNumId w:val="48"/>
+    <w:abstractNumId w:val="49"/>
   </w:num>
   <w:num w:numId="119" w16cid:durableId="1693994672">
     <w:abstractNumId w:val="2"/>
   </w:num>
   <w:num w:numId="120" w16cid:durableId="396828229">
-    <w:abstractNumId w:val="169"/>
+    <w:abstractNumId w:val="173"/>
   </w:num>
   <w:num w:numId="121" w16cid:durableId="986058889">
-    <w:abstractNumId w:val="20"/>
+    <w:abstractNumId w:val="21"/>
   </w:num>
   <w:num w:numId="122" w16cid:durableId="1224410703">
-    <w:abstractNumId w:val="63"/>
+    <w:abstractNumId w:val="64"/>
   </w:num>
   <w:num w:numId="123" w16cid:durableId="1804040304">
-    <w:abstractNumId w:val="90"/>
+    <w:abstractNumId w:val="92"/>
   </w:num>
   <w:num w:numId="124" w16cid:durableId="114181197">
-    <w:abstractNumId w:val="168"/>
+    <w:abstractNumId w:val="172"/>
   </w:num>
   <w:num w:numId="125" w16cid:durableId="772671624">
     <w:abstractNumId w:val="5"/>
@@ -35463,175 +37801,187 @@
     <w:abstractNumId w:val="9"/>
   </w:num>
   <w:num w:numId="127" w16cid:durableId="1818105337">
-    <w:abstractNumId w:val="54"/>
+    <w:abstractNumId w:val="55"/>
   </w:num>
   <w:num w:numId="128" w16cid:durableId="384987847">
-    <w:abstractNumId w:val="32"/>
+    <w:abstractNumId w:val="33"/>
   </w:num>
   <w:num w:numId="129" w16cid:durableId="659895420">
-    <w:abstractNumId w:val="62"/>
+    <w:abstractNumId w:val="63"/>
   </w:num>
   <w:num w:numId="130" w16cid:durableId="1168907903">
-    <w:abstractNumId w:val="148"/>
+    <w:abstractNumId w:val="152"/>
   </w:num>
   <w:num w:numId="131" w16cid:durableId="430206235">
-    <w:abstractNumId w:val="136"/>
+    <w:abstractNumId w:val="140"/>
   </w:num>
   <w:num w:numId="132" w16cid:durableId="1207327089">
-    <w:abstractNumId w:val="29"/>
+    <w:abstractNumId w:val="30"/>
   </w:num>
   <w:num w:numId="133" w16cid:durableId="596404292">
-    <w:abstractNumId w:val="124"/>
+    <w:abstractNumId w:val="127"/>
   </w:num>
   <w:num w:numId="134" w16cid:durableId="2070372549">
-    <w:abstractNumId w:val="45"/>
+    <w:abstractNumId w:val="46"/>
   </w:num>
   <w:num w:numId="135" w16cid:durableId="1841265039">
-    <w:abstractNumId w:val="49"/>
+    <w:abstractNumId w:val="50"/>
   </w:num>
   <w:num w:numId="136" w16cid:durableId="1988632595">
-    <w:abstractNumId w:val="43"/>
+    <w:abstractNumId w:val="44"/>
   </w:num>
   <w:num w:numId="137" w16cid:durableId="1218275126">
-    <w:abstractNumId w:val="77"/>
+    <w:abstractNumId w:val="79"/>
   </w:num>
   <w:num w:numId="138" w16cid:durableId="568660900">
-    <w:abstractNumId w:val="84"/>
+    <w:abstractNumId w:val="86"/>
   </w:num>
   <w:num w:numId="139" w16cid:durableId="967976864">
-    <w:abstractNumId w:val="125"/>
+    <w:abstractNumId w:val="128"/>
   </w:num>
   <w:num w:numId="140" w16cid:durableId="650643288">
-    <w:abstractNumId w:val="143"/>
+    <w:abstractNumId w:val="147"/>
   </w:num>
   <w:num w:numId="141" w16cid:durableId="219370247">
-    <w:abstractNumId w:val="140"/>
+    <w:abstractNumId w:val="144"/>
   </w:num>
   <w:num w:numId="142" w16cid:durableId="323239876">
-    <w:abstractNumId w:val="180"/>
+    <w:abstractNumId w:val="184"/>
   </w:num>
   <w:num w:numId="143" w16cid:durableId="1619793156">
-    <w:abstractNumId w:val="35"/>
+    <w:abstractNumId w:val="36"/>
   </w:num>
   <w:num w:numId="144" w16cid:durableId="1186332867">
-    <w:abstractNumId w:val="152"/>
+    <w:abstractNumId w:val="156"/>
   </w:num>
   <w:num w:numId="145" w16cid:durableId="89937035">
-    <w:abstractNumId w:val="56"/>
+    <w:abstractNumId w:val="57"/>
   </w:num>
   <w:num w:numId="146" w16cid:durableId="542210424">
-    <w:abstractNumId w:val="80"/>
+    <w:abstractNumId w:val="82"/>
   </w:num>
   <w:num w:numId="147" w16cid:durableId="1194659616">
     <w:abstractNumId w:val="7"/>
   </w:num>
   <w:num w:numId="148" w16cid:durableId="1544974653">
+    <w:abstractNumId w:val="169"/>
+  </w:num>
+  <w:num w:numId="149" w16cid:durableId="1664625526">
+    <w:abstractNumId w:val="66"/>
+  </w:num>
+  <w:num w:numId="150" w16cid:durableId="678197415">
+    <w:abstractNumId w:val="145"/>
+  </w:num>
+  <w:num w:numId="151" w16cid:durableId="1193106551">
+    <w:abstractNumId w:val="114"/>
+  </w:num>
+  <w:num w:numId="152" w16cid:durableId="1209760807">
+    <w:abstractNumId w:val="65"/>
+  </w:num>
+  <w:num w:numId="153" w16cid:durableId="1994025825">
+    <w:abstractNumId w:val="71"/>
+  </w:num>
+  <w:num w:numId="154" w16cid:durableId="2121295621">
+    <w:abstractNumId w:val="170"/>
+  </w:num>
+  <w:num w:numId="155" w16cid:durableId="292684904">
+    <w:abstractNumId w:val="89"/>
+  </w:num>
+  <w:num w:numId="156" w16cid:durableId="769400072">
+    <w:abstractNumId w:val="181"/>
+  </w:num>
+  <w:num w:numId="157" w16cid:durableId="1930693824">
+    <w:abstractNumId w:val="112"/>
+  </w:num>
+  <w:num w:numId="158" w16cid:durableId="813957946">
     <w:abstractNumId w:val="165"/>
   </w:num>
-  <w:num w:numId="149" w16cid:durableId="1664625526">
-    <w:abstractNumId w:val="65"/>
+  <w:num w:numId="159" w16cid:durableId="1782143679">
+    <w:abstractNumId w:val="35"/>
   </w:num>
-  <w:num w:numId="150" w16cid:durableId="678197415">
+  <w:num w:numId="160" w16cid:durableId="1278754750">
+    <w:abstractNumId w:val="31"/>
+  </w:num>
+  <w:num w:numId="161" w16cid:durableId="1052270864">
     <w:abstractNumId w:val="141"/>
   </w:num>
-  <w:num w:numId="151" w16cid:durableId="1193106551">
-    <w:abstractNumId w:val="111"/>
-  </w:num>
-  <w:num w:numId="152" w16cid:durableId="1209760807">
-    <w:abstractNumId w:val="64"/>
-  </w:num>
-  <w:num w:numId="153" w16cid:durableId="1994025825">
-    <w:abstractNumId w:val="69"/>
-  </w:num>
-  <w:num w:numId="154" w16cid:durableId="2121295621">
-    <w:abstractNumId w:val="166"/>
-  </w:num>
-  <w:num w:numId="155" w16cid:durableId="292684904">
-    <w:abstractNumId w:val="87"/>
-  </w:num>
-  <w:num w:numId="156" w16cid:durableId="769400072">
-    <w:abstractNumId w:val="177"/>
-  </w:num>
-  <w:num w:numId="157" w16cid:durableId="1930693824">
-    <w:abstractNumId w:val="110"/>
-  </w:num>
-  <w:num w:numId="158" w16cid:durableId="813957946">
-    <w:abstractNumId w:val="161"/>
-  </w:num>
-  <w:num w:numId="159" w16cid:durableId="1782143679">
-    <w:abstractNumId w:val="34"/>
-  </w:num>
-  <w:num w:numId="160" w16cid:durableId="1278754750">
-    <w:abstractNumId w:val="30"/>
-  </w:num>
-  <w:num w:numId="161" w16cid:durableId="1052270864">
-    <w:abstractNumId w:val="137"/>
-  </w:num>
   <w:num w:numId="162" w16cid:durableId="762337137">
-    <w:abstractNumId w:val="104"/>
+    <w:abstractNumId w:val="106"/>
   </w:num>
   <w:num w:numId="163" w16cid:durableId="1682507263">
-    <w:abstractNumId w:val="89"/>
+    <w:abstractNumId w:val="91"/>
   </w:num>
   <w:num w:numId="164" w16cid:durableId="871957078">
-    <w:abstractNumId w:val="122"/>
+    <w:abstractNumId w:val="125"/>
   </w:num>
   <w:num w:numId="165" w16cid:durableId="601960416">
-    <w:abstractNumId w:val="144"/>
+    <w:abstractNumId w:val="148"/>
   </w:num>
   <w:num w:numId="166" w16cid:durableId="574900497">
-    <w:abstractNumId w:val="134"/>
+    <w:abstractNumId w:val="138"/>
   </w:num>
   <w:num w:numId="167" w16cid:durableId="1477644837">
-    <w:abstractNumId w:val="94"/>
+    <w:abstractNumId w:val="96"/>
   </w:num>
   <w:num w:numId="168" w16cid:durableId="1618100933">
-    <w:abstractNumId w:val="163"/>
+    <w:abstractNumId w:val="167"/>
   </w:num>
   <w:num w:numId="169" w16cid:durableId="1266614374">
-    <w:abstractNumId w:val="173"/>
+    <w:abstractNumId w:val="177"/>
   </w:num>
   <w:num w:numId="170" w16cid:durableId="67534002">
     <w:abstractNumId w:val="1"/>
   </w:num>
   <w:num w:numId="171" w16cid:durableId="1336614003">
-    <w:abstractNumId w:val="52"/>
+    <w:abstractNumId w:val="53"/>
   </w:num>
   <w:num w:numId="172" w16cid:durableId="827554792">
-    <w:abstractNumId w:val="106"/>
+    <w:abstractNumId w:val="108"/>
   </w:num>
   <w:num w:numId="173" w16cid:durableId="186605808">
-    <w:abstractNumId w:val="27"/>
+    <w:abstractNumId w:val="28"/>
   </w:num>
   <w:num w:numId="174" w16cid:durableId="1000935913">
-    <w:abstractNumId w:val="126"/>
+    <w:abstractNumId w:val="129"/>
   </w:num>
   <w:num w:numId="175" w16cid:durableId="685984279">
-    <w:abstractNumId w:val="44"/>
+    <w:abstractNumId w:val="45"/>
   </w:num>
   <w:num w:numId="176" w16cid:durableId="355473142">
-    <w:abstractNumId w:val="179"/>
+    <w:abstractNumId w:val="183"/>
   </w:num>
   <w:num w:numId="177" w16cid:durableId="1580820927">
     <w:abstractNumId w:val="4"/>
   </w:num>
   <w:num w:numId="178" w16cid:durableId="1342977237">
-    <w:abstractNumId w:val="182"/>
+    <w:abstractNumId w:val="186"/>
   </w:num>
   <w:num w:numId="179" w16cid:durableId="1610351964">
-    <w:abstractNumId w:val="92"/>
+    <w:abstractNumId w:val="94"/>
   </w:num>
   <w:num w:numId="180" w16cid:durableId="1808428282">
-    <w:abstractNumId w:val="116"/>
+    <w:abstractNumId w:val="119"/>
   </w:num>
   <w:num w:numId="181" w16cid:durableId="1853181086">
     <w:abstractNumId w:val="16"/>
   </w:num>
   <w:num w:numId="182" w16cid:durableId="1968733980">
-    <w:abstractNumId w:val="74"/>
+    <w:abstractNumId w:val="76"/>
   </w:num>
   <w:num w:numId="183" w16cid:durableId="1707484209">
-    <w:abstractNumId w:val="154"/>
+    <w:abstractNumId w:val="158"/>
+  </w:num>
+  <w:num w:numId="184" w16cid:durableId="525101864">
+    <w:abstractNumId w:val="67"/>
+  </w:num>
+  <w:num w:numId="185" w16cid:durableId="923611674">
+    <w:abstractNumId w:val="131"/>
+  </w:num>
+  <w:num w:numId="186" w16cid:durableId="379020453">
+    <w:abstractNumId w:val="113"/>
+  </w:num>
+  <w:num w:numId="187" w16cid:durableId="1417243495">
+    <w:abstractNumId w:val="19"/>
   </w:num>
 </w:numbering>
 </file>
@@ -36975,6 +39325,25 @@
         </w:tcBorders>
       </w:tcPr>
     </w:tblStylePr>
+  </w:style>
+  <w:style w:type="table" w:styleId="TableGridLight">
+    <w:name w:val="Grid Table Light"/>
+    <w:basedOn w:val="TableNormal"/>
+    <w:uiPriority w:val="40"/>
+    <w:rsid w:val="00703449"/>
+    <w:pPr>
+      <w:spacing w:after="0" w:line="240" w:lineRule="auto"/>
+    </w:pPr>
+    <w:tblPr>
+      <w:tblBorders>
+        <w:top w:val="single" w:sz="4" w:space="0" w:color="BFBFBF" w:themeColor="background1" w:themeShade="BF"/>
+        <w:left w:val="single" w:sz="4" w:space="0" w:color="BFBFBF" w:themeColor="background1" w:themeShade="BF"/>
+        <w:bottom w:val="single" w:sz="4" w:space="0" w:color="BFBFBF" w:themeColor="background1" w:themeShade="BF"/>
+        <w:right w:val="single" w:sz="4" w:space="0" w:color="BFBFBF" w:themeColor="background1" w:themeShade="BF"/>
+        <w:insideH w:val="single" w:sz="4" w:space="0" w:color="BFBFBF" w:themeColor="background1" w:themeShade="BF"/>
+        <w:insideV w:val="single" w:sz="4" w:space="0" w:color="BFBFBF" w:themeColor="background1" w:themeShade="BF"/>
+      </w:tblBorders>
+    </w:tblPr>
   </w:style>
 </w:styles>
 </file>

</xml_diff>

<commit_message>
Integration Validation (#363) Integration Architecture Design (#360)
</commit_message>
<xml_diff>
--- a/Software Architecture Design.docx
+++ b/Software Architecture Design.docx
@@ -6357,8 +6357,13 @@
         </w:tabs>
         <w:spacing w:after="0"/>
       </w:pPr>
-      <w:r>
-        <w:t>Sessions handling.</w:t>
+      <w:proofErr w:type="gramStart"/>
+      <w:r>
+        <w:t>Sessions</w:t>
+      </w:r>
+      <w:proofErr w:type="gramEnd"/>
+      <w:r>
+        <w:t xml:space="preserve"> handling.</w:t>
       </w:r>
     </w:p>
     <w:p>
@@ -9783,7 +9788,15 @@
     </w:p>
     <w:p>
       <w:r>
-        <w:t>Considering the fact that the applications allow access to confidential information, the system architecture involves a number of security features. Access token based authentication process is used for the purpose while role-based access control is employed to authorize user functionality limits. HTTPS is used for all communication between the back-end services while all administrative actions are logged for auditing purposes. These practices ensure that administrative actions are kept confidential and secure.</w:t>
+        <w:t xml:space="preserve">Considering the fact that the applications allow access to confidential information, the system architecture involves a number of security features. Access </w:t>
+      </w:r>
+      <w:proofErr w:type="gramStart"/>
+      <w:r>
+        <w:t>token based</w:t>
+      </w:r>
+      <w:proofErr w:type="gramEnd"/>
+      <w:r>
+        <w:t xml:space="preserve"> authentication process is used for the purpose while role-based access control is employed to authorize user functionality limits. HTTPS is used for all communication between the back-end services while all administrative actions are logged for auditing purposes. These practices ensure that administrative actions are kept confidential and secure.</w:t>
       </w:r>
     </w:p>
     <w:p>
@@ -13934,6 +13947,1059 @@
         <w:t>The chosen API communication architecture allows for having a common interface via which all client applications can interact with the back-end services. The use of REST architecture increases the level of interoperability and makes possible the integration with other platforms; meanwhile, the WebSocket-based communication allows for the efficient exchange of data in real time. Meanwhile, the security features provide the access control of the protected resources, whereas validation and exception handling ensure the consistency of requests processing. Also, the modularity of the API allows for future improvements of the KriGo platform.</w:t>
       </w:r>
     </w:p>
+    <w:p>
+      <w:pPr>
+        <w:pStyle w:val="Heading2"/>
+      </w:pPr>
+      <w:r>
+        <w:lastRenderedPageBreak/>
+        <w:t>Integration Validation</w:t>
+      </w:r>
+    </w:p>
+    <w:p>
+      <w:r>
+        <w:t>After identifying the software architecture and integrating the various internal and external elements within it, it becomes essential to ensure that all architectural elements work effectively together as one complete system. The objective of integration validation is to check whether there exists effective communication between client applications, backend services, databases, messaging, and external services that satisfy the KriGo platform’s functional and non-functional requirements.</w:t>
+      </w:r>
+      <w:r>
+        <w:t xml:space="preserve"> </w:t>
+      </w:r>
+      <w:r>
+        <w:t>The validation process focuses on checking the compatibility of the system components, accuracy of data exchange, and effectiveness of the communication methods while the system is working normally. The integration validation also checks whether the external services can be incorporated into the application without destabilizing it.</w:t>
+      </w:r>
+    </w:p>
+    <w:p>
+      <w:pPr>
+        <w:pStyle w:val="Heading3"/>
+      </w:pPr>
+      <w:r>
+        <w:t>Internal Integration Validation</w:t>
+      </w:r>
+    </w:p>
+    <w:p>
+      <w:r>
+        <w:t>Architecture validation was performed by verifying the interactions between the different software layers and business modules. Testing was done on each business service to ensure proper propagation of requests through the controllers, the service layer, repository layer, and database, all within the architectural guidelines formulated during the system design process.</w:t>
+      </w:r>
+      <w:r>
+        <w:t xml:space="preserve"> </w:t>
+      </w:r>
+      <w:r>
+        <w:t>A lot of focus was placed on the interactions between the Reservation, Fleet, Payment, Notification, and User Management Services because of their cooperative effort to fulfill the entire vehicle reservation process. Architecture validation showed that there was correct flow of data within the components, without compromising data integrity.</w:t>
+      </w:r>
+    </w:p>
+    <w:p>
+      <w:r>
+        <w:t>The following internal integrations were successfully validated:</w:t>
+      </w:r>
+    </w:p>
+    <w:tbl>
+      <w:tblPr>
+        <w:tblStyle w:val="PlainTable1"/>
+        <w:tblW w:w="0" w:type="auto"/>
+        <w:tblCellMar>
+          <w:top w:w="86" w:type="dxa"/>
+          <w:bottom w:w="86" w:type="dxa"/>
+        </w:tblCellMar>
+        <w:tblLook w:val="04A0" w:firstRow="1" w:lastRow="0" w:firstColumn="1" w:lastColumn="0" w:noHBand="0" w:noVBand="1"/>
+      </w:tblPr>
+      <w:tblGrid>
+        <w:gridCol w:w="4405"/>
+        <w:gridCol w:w="3150"/>
+        <w:gridCol w:w="1620"/>
+      </w:tblGrid>
+      <w:tr>
+        <w:trPr>
+          <w:cnfStyle w:val="100000000000" w:firstRow="1" w:lastRow="0" w:firstColumn="0" w:lastColumn="0" w:oddVBand="0" w:evenVBand="0" w:oddHBand="0" w:evenHBand="0" w:firstRowFirstColumn="0" w:firstRowLastColumn="0" w:lastRowFirstColumn="0" w:lastRowLastColumn="0"/>
+        </w:trPr>
+        <w:tc>
+          <w:tcPr>
+            <w:cnfStyle w:val="001000000000" w:firstRow="0" w:lastRow="0" w:firstColumn="1" w:lastColumn="0" w:oddVBand="0" w:evenVBand="0" w:oddHBand="0" w:evenHBand="0" w:firstRowFirstColumn="0" w:firstRowLastColumn="0" w:lastRowFirstColumn="0" w:lastRowLastColumn="0"/>
+            <w:tcW w:w="4405" w:type="dxa"/>
+            <w:vAlign w:val="center"/>
+            <w:hideMark/>
+          </w:tcPr>
+          <w:p>
+            <w:pPr>
+              <w:spacing w:after="160"/>
+            </w:pPr>
+            <w:r>
+              <w:t>Integrated Components</w:t>
+            </w:r>
+          </w:p>
+        </w:tc>
+        <w:tc>
+          <w:tcPr>
+            <w:tcW w:w="3150" w:type="dxa"/>
+            <w:vAlign w:val="center"/>
+            <w:hideMark/>
+          </w:tcPr>
+          <w:p>
+            <w:pPr>
+              <w:spacing w:after="160"/>
+              <w:cnfStyle w:val="100000000000" w:firstRow="1" w:lastRow="0" w:firstColumn="0" w:lastColumn="0" w:oddVBand="0" w:evenVBand="0" w:oddHBand="0" w:evenHBand="0" w:firstRowFirstColumn="0" w:firstRowLastColumn="0" w:lastRowFirstColumn="0" w:lastRowLastColumn="0"/>
+            </w:pPr>
+            <w:r>
+              <w:t>Validation Objective</w:t>
+            </w:r>
+          </w:p>
+        </w:tc>
+        <w:tc>
+          <w:tcPr>
+            <w:tcW w:w="1620" w:type="dxa"/>
+            <w:vAlign w:val="center"/>
+            <w:hideMark/>
+          </w:tcPr>
+          <w:p>
+            <w:pPr>
+              <w:spacing w:after="160"/>
+              <w:cnfStyle w:val="100000000000" w:firstRow="1" w:lastRow="0" w:firstColumn="0" w:lastColumn="0" w:oddVBand="0" w:evenVBand="0" w:oddHBand="0" w:evenHBand="0" w:firstRowFirstColumn="0" w:firstRowLastColumn="0" w:lastRowFirstColumn="0" w:lastRowLastColumn="0"/>
+            </w:pPr>
+            <w:r>
+              <w:t>Result</w:t>
+            </w:r>
+          </w:p>
+        </w:tc>
+      </w:tr>
+      <w:tr>
+        <w:trPr>
+          <w:cnfStyle w:val="000000100000" w:firstRow="0" w:lastRow="0" w:firstColumn="0" w:lastColumn="0" w:oddVBand="0" w:evenVBand="0" w:oddHBand="1" w:evenHBand="0" w:firstRowFirstColumn="0" w:firstRowLastColumn="0" w:lastRowFirstColumn="0" w:lastRowLastColumn="0"/>
+        </w:trPr>
+        <w:tc>
+          <w:tcPr>
+            <w:cnfStyle w:val="001000000000" w:firstRow="0" w:lastRow="0" w:firstColumn="1" w:lastColumn="0" w:oddVBand="0" w:evenVBand="0" w:oddHBand="0" w:evenHBand="0" w:firstRowFirstColumn="0" w:firstRowLastColumn="0" w:lastRowFirstColumn="0" w:lastRowLastColumn="0"/>
+            <w:tcW w:w="4405" w:type="dxa"/>
+            <w:vAlign w:val="center"/>
+            <w:hideMark/>
+          </w:tcPr>
+          <w:p>
+            <w:pPr>
+              <w:spacing w:after="160"/>
+              <w:rPr>
+                <w:b w:val="0"/>
+                <w:bCs w:val="0"/>
+              </w:rPr>
+            </w:pPr>
+            <w:r>
+              <w:rPr>
+                <w:b w:val="0"/>
+                <w:bCs w:val="0"/>
+              </w:rPr>
+              <w:t>Client Applications ↔ Backend API</w:t>
+            </w:r>
+          </w:p>
+        </w:tc>
+        <w:tc>
+          <w:tcPr>
+            <w:tcW w:w="3150" w:type="dxa"/>
+            <w:vAlign w:val="center"/>
+            <w:hideMark/>
+          </w:tcPr>
+          <w:p>
+            <w:pPr>
+              <w:spacing w:after="160"/>
+              <w:cnfStyle w:val="000000100000" w:firstRow="0" w:lastRow="0" w:firstColumn="0" w:lastColumn="0" w:oddVBand="0" w:evenVBand="0" w:oddHBand="1" w:evenHBand="0" w:firstRowFirstColumn="0" w:firstRowLastColumn="0" w:lastRowFirstColumn="0" w:lastRowLastColumn="0"/>
+            </w:pPr>
+            <w:r>
+              <w:t>Request processing</w:t>
+            </w:r>
+          </w:p>
+        </w:tc>
+        <w:tc>
+          <w:tcPr>
+            <w:tcW w:w="1620" w:type="dxa"/>
+            <w:vAlign w:val="center"/>
+            <w:hideMark/>
+          </w:tcPr>
+          <w:p>
+            <w:pPr>
+              <w:spacing w:after="160"/>
+              <w:cnfStyle w:val="000000100000" w:firstRow="0" w:lastRow="0" w:firstColumn="0" w:lastColumn="0" w:oddVBand="0" w:evenVBand="0" w:oddHBand="1" w:evenHBand="0" w:firstRowFirstColumn="0" w:firstRowLastColumn="0" w:lastRowFirstColumn="0" w:lastRowLastColumn="0"/>
+            </w:pPr>
+            <w:r>
+              <w:t>Successful</w:t>
+            </w:r>
+          </w:p>
+        </w:tc>
+      </w:tr>
+      <w:tr>
+        <w:tc>
+          <w:tcPr>
+            <w:cnfStyle w:val="001000000000" w:firstRow="0" w:lastRow="0" w:firstColumn="1" w:lastColumn="0" w:oddVBand="0" w:evenVBand="0" w:oddHBand="0" w:evenHBand="0" w:firstRowFirstColumn="0" w:firstRowLastColumn="0" w:lastRowFirstColumn="0" w:lastRowLastColumn="0"/>
+            <w:tcW w:w="4405" w:type="dxa"/>
+            <w:vAlign w:val="center"/>
+            <w:hideMark/>
+          </w:tcPr>
+          <w:p>
+            <w:pPr>
+              <w:spacing w:after="160"/>
+              <w:rPr>
+                <w:b w:val="0"/>
+                <w:bCs w:val="0"/>
+              </w:rPr>
+            </w:pPr>
+            <w:r>
+              <w:rPr>
+                <w:b w:val="0"/>
+                <w:bCs w:val="0"/>
+              </w:rPr>
+              <w:t>Controllers ↔ Services</w:t>
+            </w:r>
+          </w:p>
+        </w:tc>
+        <w:tc>
+          <w:tcPr>
+            <w:tcW w:w="3150" w:type="dxa"/>
+            <w:vAlign w:val="center"/>
+            <w:hideMark/>
+          </w:tcPr>
+          <w:p>
+            <w:pPr>
+              <w:spacing w:after="160"/>
+              <w:cnfStyle w:val="000000000000" w:firstRow="0" w:lastRow="0" w:firstColumn="0" w:lastColumn="0" w:oddVBand="0" w:evenVBand="0" w:oddHBand="0" w:evenHBand="0" w:firstRowFirstColumn="0" w:firstRowLastColumn="0" w:lastRowFirstColumn="0" w:lastRowLastColumn="0"/>
+            </w:pPr>
+            <w:r>
+              <w:t>Business logic execution</w:t>
+            </w:r>
+          </w:p>
+        </w:tc>
+        <w:tc>
+          <w:tcPr>
+            <w:tcW w:w="1620" w:type="dxa"/>
+            <w:vAlign w:val="center"/>
+            <w:hideMark/>
+          </w:tcPr>
+          <w:p>
+            <w:pPr>
+              <w:spacing w:after="160"/>
+              <w:cnfStyle w:val="000000000000" w:firstRow="0" w:lastRow="0" w:firstColumn="0" w:lastColumn="0" w:oddVBand="0" w:evenVBand="0" w:oddHBand="0" w:evenHBand="0" w:firstRowFirstColumn="0" w:firstRowLastColumn="0" w:lastRowFirstColumn="0" w:lastRowLastColumn="0"/>
+            </w:pPr>
+            <w:r>
+              <w:t>Successful</w:t>
+            </w:r>
+          </w:p>
+        </w:tc>
+      </w:tr>
+      <w:tr>
+        <w:trPr>
+          <w:cnfStyle w:val="000000100000" w:firstRow="0" w:lastRow="0" w:firstColumn="0" w:lastColumn="0" w:oddVBand="0" w:evenVBand="0" w:oddHBand="1" w:evenHBand="0" w:firstRowFirstColumn="0" w:firstRowLastColumn="0" w:lastRowFirstColumn="0" w:lastRowLastColumn="0"/>
+        </w:trPr>
+        <w:tc>
+          <w:tcPr>
+            <w:cnfStyle w:val="001000000000" w:firstRow="0" w:lastRow="0" w:firstColumn="1" w:lastColumn="0" w:oddVBand="0" w:evenVBand="0" w:oddHBand="0" w:evenHBand="0" w:firstRowFirstColumn="0" w:firstRowLastColumn="0" w:lastRowFirstColumn="0" w:lastRowLastColumn="0"/>
+            <w:tcW w:w="4405" w:type="dxa"/>
+            <w:vAlign w:val="center"/>
+            <w:hideMark/>
+          </w:tcPr>
+          <w:p>
+            <w:pPr>
+              <w:spacing w:after="160"/>
+              <w:rPr>
+                <w:b w:val="0"/>
+                <w:bCs w:val="0"/>
+              </w:rPr>
+            </w:pPr>
+            <w:r>
+              <w:rPr>
+                <w:b w:val="0"/>
+                <w:bCs w:val="0"/>
+              </w:rPr>
+              <w:t>Services ↔ Repositories</w:t>
+            </w:r>
+          </w:p>
+        </w:tc>
+        <w:tc>
+          <w:tcPr>
+            <w:tcW w:w="3150" w:type="dxa"/>
+            <w:vAlign w:val="center"/>
+            <w:hideMark/>
+          </w:tcPr>
+          <w:p>
+            <w:pPr>
+              <w:spacing w:after="160"/>
+              <w:cnfStyle w:val="000000100000" w:firstRow="0" w:lastRow="0" w:firstColumn="0" w:lastColumn="0" w:oddVBand="0" w:evenVBand="0" w:oddHBand="1" w:evenHBand="0" w:firstRowFirstColumn="0" w:firstRowLastColumn="0" w:lastRowFirstColumn="0" w:lastRowLastColumn="0"/>
+            </w:pPr>
+            <w:r>
+              <w:t>Data persistence</w:t>
+            </w:r>
+          </w:p>
+        </w:tc>
+        <w:tc>
+          <w:tcPr>
+            <w:tcW w:w="1620" w:type="dxa"/>
+            <w:vAlign w:val="center"/>
+            <w:hideMark/>
+          </w:tcPr>
+          <w:p>
+            <w:pPr>
+              <w:spacing w:after="160"/>
+              <w:cnfStyle w:val="000000100000" w:firstRow="0" w:lastRow="0" w:firstColumn="0" w:lastColumn="0" w:oddVBand="0" w:evenVBand="0" w:oddHBand="1" w:evenHBand="0" w:firstRowFirstColumn="0" w:firstRowLastColumn="0" w:lastRowFirstColumn="0" w:lastRowLastColumn="0"/>
+            </w:pPr>
+            <w:r>
+              <w:t>Successful</w:t>
+            </w:r>
+          </w:p>
+        </w:tc>
+      </w:tr>
+      <w:tr>
+        <w:tc>
+          <w:tcPr>
+            <w:cnfStyle w:val="001000000000" w:firstRow="0" w:lastRow="0" w:firstColumn="1" w:lastColumn="0" w:oddVBand="0" w:evenVBand="0" w:oddHBand="0" w:evenHBand="0" w:firstRowFirstColumn="0" w:firstRowLastColumn="0" w:lastRowFirstColumn="0" w:lastRowLastColumn="0"/>
+            <w:tcW w:w="4405" w:type="dxa"/>
+            <w:vAlign w:val="center"/>
+            <w:hideMark/>
+          </w:tcPr>
+          <w:p>
+            <w:pPr>
+              <w:spacing w:after="160"/>
+              <w:rPr>
+                <w:b w:val="0"/>
+                <w:bCs w:val="0"/>
+              </w:rPr>
+            </w:pPr>
+            <w:r>
+              <w:rPr>
+                <w:b w:val="0"/>
+                <w:bCs w:val="0"/>
+              </w:rPr>
+              <w:t>Repositories ↔ PostgreSQL</w:t>
+            </w:r>
+          </w:p>
+        </w:tc>
+        <w:tc>
+          <w:tcPr>
+            <w:tcW w:w="3150" w:type="dxa"/>
+            <w:vAlign w:val="center"/>
+            <w:hideMark/>
+          </w:tcPr>
+          <w:p>
+            <w:pPr>
+              <w:spacing w:after="160"/>
+              <w:cnfStyle w:val="000000000000" w:firstRow="0" w:lastRow="0" w:firstColumn="0" w:lastColumn="0" w:oddVBand="0" w:evenVBand="0" w:oddHBand="0" w:evenHBand="0" w:firstRowFirstColumn="0" w:firstRowLastColumn="0" w:lastRowFirstColumn="0" w:lastRowLastColumn="0"/>
+            </w:pPr>
+            <w:r>
+              <w:t>Database access</w:t>
+            </w:r>
+          </w:p>
+        </w:tc>
+        <w:tc>
+          <w:tcPr>
+            <w:tcW w:w="1620" w:type="dxa"/>
+            <w:vAlign w:val="center"/>
+            <w:hideMark/>
+          </w:tcPr>
+          <w:p>
+            <w:pPr>
+              <w:spacing w:after="160"/>
+              <w:cnfStyle w:val="000000000000" w:firstRow="0" w:lastRow="0" w:firstColumn="0" w:lastColumn="0" w:oddVBand="0" w:evenVBand="0" w:oddHBand="0" w:evenHBand="0" w:firstRowFirstColumn="0" w:firstRowLastColumn="0" w:lastRowFirstColumn="0" w:lastRowLastColumn="0"/>
+            </w:pPr>
+            <w:r>
+              <w:t>Successful</w:t>
+            </w:r>
+          </w:p>
+        </w:tc>
+      </w:tr>
+      <w:tr>
+        <w:trPr>
+          <w:cnfStyle w:val="000000100000" w:firstRow="0" w:lastRow="0" w:firstColumn="0" w:lastColumn="0" w:oddVBand="0" w:evenVBand="0" w:oddHBand="1" w:evenHBand="0" w:firstRowFirstColumn="0" w:firstRowLastColumn="0" w:lastRowFirstColumn="0" w:lastRowLastColumn="0"/>
+        </w:trPr>
+        <w:tc>
+          <w:tcPr>
+            <w:cnfStyle w:val="001000000000" w:firstRow="0" w:lastRow="0" w:firstColumn="1" w:lastColumn="0" w:oddVBand="0" w:evenVBand="0" w:oddHBand="0" w:evenHBand="0" w:firstRowFirstColumn="0" w:firstRowLastColumn="0" w:lastRowFirstColumn="0" w:lastRowLastColumn="0"/>
+            <w:tcW w:w="4405" w:type="dxa"/>
+            <w:vAlign w:val="center"/>
+            <w:hideMark/>
+          </w:tcPr>
+          <w:p>
+            <w:pPr>
+              <w:spacing w:after="160"/>
+              <w:rPr>
+                <w:b w:val="0"/>
+                <w:bCs w:val="0"/>
+              </w:rPr>
+            </w:pPr>
+            <w:r>
+              <w:rPr>
+                <w:b w:val="0"/>
+                <w:bCs w:val="0"/>
+              </w:rPr>
+              <w:t>Services ↔ Redis</w:t>
+            </w:r>
+          </w:p>
+        </w:tc>
+        <w:tc>
+          <w:tcPr>
+            <w:tcW w:w="3150" w:type="dxa"/>
+            <w:vAlign w:val="center"/>
+            <w:hideMark/>
+          </w:tcPr>
+          <w:p>
+            <w:pPr>
+              <w:spacing w:after="160"/>
+              <w:cnfStyle w:val="000000100000" w:firstRow="0" w:lastRow="0" w:firstColumn="0" w:lastColumn="0" w:oddVBand="0" w:evenVBand="0" w:oddHBand="1" w:evenHBand="0" w:firstRowFirstColumn="0" w:firstRowLastColumn="0" w:lastRowFirstColumn="0" w:lastRowLastColumn="0"/>
+            </w:pPr>
+            <w:r>
+              <w:t>Cache management</w:t>
+            </w:r>
+          </w:p>
+        </w:tc>
+        <w:tc>
+          <w:tcPr>
+            <w:tcW w:w="1620" w:type="dxa"/>
+            <w:vAlign w:val="center"/>
+            <w:hideMark/>
+          </w:tcPr>
+          <w:p>
+            <w:pPr>
+              <w:spacing w:after="160"/>
+              <w:cnfStyle w:val="000000100000" w:firstRow="0" w:lastRow="0" w:firstColumn="0" w:lastColumn="0" w:oddVBand="0" w:evenVBand="0" w:oddHBand="1" w:evenHBand="0" w:firstRowFirstColumn="0" w:firstRowLastColumn="0" w:lastRowFirstColumn="0" w:lastRowLastColumn="0"/>
+            </w:pPr>
+            <w:r>
+              <w:t>Successful</w:t>
+            </w:r>
+          </w:p>
+        </w:tc>
+      </w:tr>
+      <w:tr>
+        <w:tc>
+          <w:tcPr>
+            <w:cnfStyle w:val="001000000000" w:firstRow="0" w:lastRow="0" w:firstColumn="1" w:lastColumn="0" w:oddVBand="0" w:evenVBand="0" w:oddHBand="0" w:evenHBand="0" w:firstRowFirstColumn="0" w:firstRowLastColumn="0" w:lastRowFirstColumn="0" w:lastRowLastColumn="0"/>
+            <w:tcW w:w="4405" w:type="dxa"/>
+            <w:vAlign w:val="center"/>
+            <w:hideMark/>
+          </w:tcPr>
+          <w:p>
+            <w:pPr>
+              <w:spacing w:after="160"/>
+              <w:rPr>
+                <w:b w:val="0"/>
+                <w:bCs w:val="0"/>
+              </w:rPr>
+            </w:pPr>
+            <w:r>
+              <w:rPr>
+                <w:b w:val="0"/>
+                <w:bCs w:val="0"/>
+              </w:rPr>
+              <w:t>Services ↔ RabbitMQ/BullMQ</w:t>
+            </w:r>
+          </w:p>
+        </w:tc>
+        <w:tc>
+          <w:tcPr>
+            <w:tcW w:w="3150" w:type="dxa"/>
+            <w:vAlign w:val="center"/>
+            <w:hideMark/>
+          </w:tcPr>
+          <w:p>
+            <w:pPr>
+              <w:spacing w:after="160"/>
+              <w:cnfStyle w:val="000000000000" w:firstRow="0" w:lastRow="0" w:firstColumn="0" w:lastColumn="0" w:oddVBand="0" w:evenVBand="0" w:oddHBand="0" w:evenHBand="0" w:firstRowFirstColumn="0" w:firstRowLastColumn="0" w:lastRowFirstColumn="0" w:lastRowLastColumn="0"/>
+            </w:pPr>
+            <w:r>
+              <w:t>Background processing</w:t>
+            </w:r>
+          </w:p>
+        </w:tc>
+        <w:tc>
+          <w:tcPr>
+            <w:tcW w:w="1620" w:type="dxa"/>
+            <w:vAlign w:val="center"/>
+            <w:hideMark/>
+          </w:tcPr>
+          <w:p>
+            <w:pPr>
+              <w:spacing w:after="160"/>
+              <w:cnfStyle w:val="000000000000" w:firstRow="0" w:lastRow="0" w:firstColumn="0" w:lastColumn="0" w:oddVBand="0" w:evenVBand="0" w:oddHBand="0" w:evenHBand="0" w:firstRowFirstColumn="0" w:firstRowLastColumn="0" w:lastRowFirstColumn="0" w:lastRowLastColumn="0"/>
+            </w:pPr>
+            <w:r>
+              <w:t>Successful</w:t>
+            </w:r>
+          </w:p>
+        </w:tc>
+      </w:tr>
+    </w:tbl>
+    <w:p/>
+    <w:p>
+      <w:pPr>
+        <w:pStyle w:val="Heading3"/>
+      </w:pPr>
+      <w:r>
+        <w:t>External Integration Validation</w:t>
+      </w:r>
+    </w:p>
+    <w:p>
+      <w:r>
+        <w:t>External services were separately validated to establish reliable communication between them and the back-end application. Each of these integrations was checked via safe API calls for proper formatting of requests and responses, as well as appropriate authentication and error handling.</w:t>
+      </w:r>
+    </w:p>
+    <w:p>
+      <w:r>
+        <w:t>This test proved that each third-party service could communicate with the KriGo platform through its corresponding integration module.</w:t>
+      </w:r>
+      <w:r>
+        <w:br w:type="page"/>
+      </w:r>
+    </w:p>
+    <w:tbl>
+      <w:tblPr>
+        <w:tblStyle w:val="PlainTable1"/>
+        <w:tblW w:w="0" w:type="auto"/>
+        <w:tblCellMar>
+          <w:top w:w="86" w:type="dxa"/>
+          <w:bottom w:w="86" w:type="dxa"/>
+        </w:tblCellMar>
+        <w:tblLook w:val="04A0" w:firstRow="1" w:lastRow="0" w:firstColumn="1" w:lastColumn="0" w:noHBand="0" w:noVBand="1"/>
+      </w:tblPr>
+      <w:tblGrid>
+        <w:gridCol w:w="3055"/>
+        <w:gridCol w:w="3600"/>
+        <w:gridCol w:w="2610"/>
+      </w:tblGrid>
+      <w:tr>
+        <w:trPr>
+          <w:cnfStyle w:val="100000000000" w:firstRow="1" w:lastRow="0" w:firstColumn="0" w:lastColumn="0" w:oddVBand="0" w:evenVBand="0" w:oddHBand="0" w:evenHBand="0" w:firstRowFirstColumn="0" w:firstRowLastColumn="0" w:lastRowFirstColumn="0" w:lastRowLastColumn="0"/>
+        </w:trPr>
+        <w:tc>
+          <w:tcPr>
+            <w:cnfStyle w:val="001000000000" w:firstRow="0" w:lastRow="0" w:firstColumn="1" w:lastColumn="0" w:oddVBand="0" w:evenVBand="0" w:oddHBand="0" w:evenHBand="0" w:firstRowFirstColumn="0" w:firstRowLastColumn="0" w:lastRowFirstColumn="0" w:lastRowLastColumn="0"/>
+            <w:tcW w:w="3055" w:type="dxa"/>
+            <w:vAlign w:val="center"/>
+            <w:hideMark/>
+          </w:tcPr>
+          <w:p>
+            <w:r>
+              <w:lastRenderedPageBreak/>
+              <w:t>External Service</w:t>
+            </w:r>
+          </w:p>
+        </w:tc>
+        <w:tc>
+          <w:tcPr>
+            <w:tcW w:w="3600" w:type="dxa"/>
+            <w:vAlign w:val="center"/>
+            <w:hideMark/>
+          </w:tcPr>
+          <w:p>
+            <w:pPr>
+              <w:cnfStyle w:val="100000000000" w:firstRow="1" w:lastRow="0" w:firstColumn="0" w:lastColumn="0" w:oddVBand="0" w:evenVBand="0" w:oddHBand="0" w:evenHBand="0" w:firstRowFirstColumn="0" w:firstRowLastColumn="0" w:lastRowFirstColumn="0" w:lastRowLastColumn="0"/>
+            </w:pPr>
+            <w:r>
+              <w:t>Validation Objective</w:t>
+            </w:r>
+          </w:p>
+        </w:tc>
+        <w:tc>
+          <w:tcPr>
+            <w:tcW w:w="2610" w:type="dxa"/>
+            <w:vAlign w:val="center"/>
+            <w:hideMark/>
+          </w:tcPr>
+          <w:p>
+            <w:pPr>
+              <w:cnfStyle w:val="100000000000" w:firstRow="1" w:lastRow="0" w:firstColumn="0" w:lastColumn="0" w:oddVBand="0" w:evenVBand="0" w:oddHBand="0" w:evenHBand="0" w:firstRowFirstColumn="0" w:firstRowLastColumn="0" w:lastRowFirstColumn="0" w:lastRowLastColumn="0"/>
+            </w:pPr>
+            <w:r>
+              <w:t>Communication Status</w:t>
+            </w:r>
+          </w:p>
+        </w:tc>
+      </w:tr>
+      <w:tr>
+        <w:trPr>
+          <w:cnfStyle w:val="000000100000" w:firstRow="0" w:lastRow="0" w:firstColumn="0" w:lastColumn="0" w:oddVBand="0" w:evenVBand="0" w:oddHBand="1" w:evenHBand="0" w:firstRowFirstColumn="0" w:firstRowLastColumn="0" w:lastRowFirstColumn="0" w:lastRowLastColumn="0"/>
+        </w:trPr>
+        <w:tc>
+          <w:tcPr>
+            <w:cnfStyle w:val="001000000000" w:firstRow="0" w:lastRow="0" w:firstColumn="1" w:lastColumn="0" w:oddVBand="0" w:evenVBand="0" w:oddHBand="0" w:evenHBand="0" w:firstRowFirstColumn="0" w:firstRowLastColumn="0" w:lastRowFirstColumn="0" w:lastRowLastColumn="0"/>
+            <w:tcW w:w="3055" w:type="dxa"/>
+            <w:vAlign w:val="center"/>
+            <w:hideMark/>
+          </w:tcPr>
+          <w:p>
+            <w:pPr>
+              <w:rPr>
+                <w:b w:val="0"/>
+                <w:bCs w:val="0"/>
+              </w:rPr>
+            </w:pPr>
+            <w:r>
+              <w:rPr>
+                <w:b w:val="0"/>
+                <w:bCs w:val="0"/>
+              </w:rPr>
+              <w:t>Payment Gateway</w:t>
+            </w:r>
+          </w:p>
+        </w:tc>
+        <w:tc>
+          <w:tcPr>
+            <w:tcW w:w="3600" w:type="dxa"/>
+            <w:vAlign w:val="center"/>
+            <w:hideMark/>
+          </w:tcPr>
+          <w:p>
+            <w:pPr>
+              <w:cnfStyle w:val="000000100000" w:firstRow="0" w:lastRow="0" w:firstColumn="0" w:lastColumn="0" w:oddVBand="0" w:evenVBand="0" w:oddHBand="1" w:evenHBand="0" w:firstRowFirstColumn="0" w:firstRowLastColumn="0" w:lastRowFirstColumn="0" w:lastRowLastColumn="0"/>
+            </w:pPr>
+            <w:r>
+              <w:t>Payment processing</w:t>
+            </w:r>
+          </w:p>
+        </w:tc>
+        <w:tc>
+          <w:tcPr>
+            <w:tcW w:w="2610" w:type="dxa"/>
+            <w:vAlign w:val="center"/>
+            <w:hideMark/>
+          </w:tcPr>
+          <w:p>
+            <w:pPr>
+              <w:cnfStyle w:val="000000100000" w:firstRow="0" w:lastRow="0" w:firstColumn="0" w:lastColumn="0" w:oddVBand="0" w:evenVBand="0" w:oddHBand="1" w:evenHBand="0" w:firstRowFirstColumn="0" w:firstRowLastColumn="0" w:lastRowFirstColumn="0" w:lastRowLastColumn="0"/>
+            </w:pPr>
+            <w:r>
+              <w:t>Successful</w:t>
+            </w:r>
+          </w:p>
+        </w:tc>
+      </w:tr>
+      <w:tr>
+        <w:tc>
+          <w:tcPr>
+            <w:cnfStyle w:val="001000000000" w:firstRow="0" w:lastRow="0" w:firstColumn="1" w:lastColumn="0" w:oddVBand="0" w:evenVBand="0" w:oddHBand="0" w:evenHBand="0" w:firstRowFirstColumn="0" w:firstRowLastColumn="0" w:lastRowFirstColumn="0" w:lastRowLastColumn="0"/>
+            <w:tcW w:w="3055" w:type="dxa"/>
+            <w:vAlign w:val="center"/>
+            <w:hideMark/>
+          </w:tcPr>
+          <w:p>
+            <w:pPr>
+              <w:rPr>
+                <w:b w:val="0"/>
+                <w:bCs w:val="0"/>
+              </w:rPr>
+            </w:pPr>
+            <w:r>
+              <w:rPr>
+                <w:b w:val="0"/>
+                <w:bCs w:val="0"/>
+              </w:rPr>
+              <w:t>OpenAI API</w:t>
+            </w:r>
+          </w:p>
+        </w:tc>
+        <w:tc>
+          <w:tcPr>
+            <w:tcW w:w="3600" w:type="dxa"/>
+            <w:vAlign w:val="center"/>
+            <w:hideMark/>
+          </w:tcPr>
+          <w:p>
+            <w:pPr>
+              <w:cnfStyle w:val="000000000000" w:firstRow="0" w:lastRow="0" w:firstColumn="0" w:lastColumn="0" w:oddVBand="0" w:evenVBand="0" w:oddHBand="0" w:evenHBand="0" w:firstRowFirstColumn="0" w:firstRowLastColumn="0" w:lastRowFirstColumn="0" w:lastRowLastColumn="0"/>
+            </w:pPr>
+            <w:r>
+              <w:t>AI recommendations and assistant</w:t>
+            </w:r>
+          </w:p>
+        </w:tc>
+        <w:tc>
+          <w:tcPr>
+            <w:tcW w:w="2610" w:type="dxa"/>
+            <w:vAlign w:val="center"/>
+            <w:hideMark/>
+          </w:tcPr>
+          <w:p>
+            <w:pPr>
+              <w:cnfStyle w:val="000000000000" w:firstRow="0" w:lastRow="0" w:firstColumn="0" w:lastColumn="0" w:oddVBand="0" w:evenVBand="0" w:oddHBand="0" w:evenHBand="0" w:firstRowFirstColumn="0" w:firstRowLastColumn="0" w:lastRowFirstColumn="0" w:lastRowLastColumn="0"/>
+            </w:pPr>
+            <w:r>
+              <w:t>Successful</w:t>
+            </w:r>
+          </w:p>
+        </w:tc>
+      </w:tr>
+      <w:tr>
+        <w:trPr>
+          <w:cnfStyle w:val="000000100000" w:firstRow="0" w:lastRow="0" w:firstColumn="0" w:lastColumn="0" w:oddVBand="0" w:evenVBand="0" w:oddHBand="1" w:evenHBand="0" w:firstRowFirstColumn="0" w:firstRowLastColumn="0" w:lastRowFirstColumn="0" w:lastRowLastColumn="0"/>
+        </w:trPr>
+        <w:tc>
+          <w:tcPr>
+            <w:cnfStyle w:val="001000000000" w:firstRow="0" w:lastRow="0" w:firstColumn="1" w:lastColumn="0" w:oddVBand="0" w:evenVBand="0" w:oddHBand="0" w:evenHBand="0" w:firstRowFirstColumn="0" w:firstRowLastColumn="0" w:lastRowFirstColumn="0" w:lastRowLastColumn="0"/>
+            <w:tcW w:w="3055" w:type="dxa"/>
+            <w:vAlign w:val="center"/>
+            <w:hideMark/>
+          </w:tcPr>
+          <w:p>
+            <w:pPr>
+              <w:rPr>
+                <w:b w:val="0"/>
+                <w:bCs w:val="0"/>
+              </w:rPr>
+            </w:pPr>
+            <w:r>
+              <w:rPr>
+                <w:b w:val="0"/>
+                <w:bCs w:val="0"/>
+              </w:rPr>
+              <w:t>Google Maps API</w:t>
+            </w:r>
+          </w:p>
+        </w:tc>
+        <w:tc>
+          <w:tcPr>
+            <w:tcW w:w="3600" w:type="dxa"/>
+            <w:vAlign w:val="center"/>
+            <w:hideMark/>
+          </w:tcPr>
+          <w:p>
+            <w:pPr>
+              <w:cnfStyle w:val="000000100000" w:firstRow="0" w:lastRow="0" w:firstColumn="0" w:lastColumn="0" w:oddVBand="0" w:evenVBand="0" w:oddHBand="1" w:evenHBand="0" w:firstRowFirstColumn="0" w:firstRowLastColumn="0" w:lastRowFirstColumn="0" w:lastRowLastColumn="0"/>
+            </w:pPr>
+            <w:r>
+              <w:t>Location services</w:t>
+            </w:r>
+          </w:p>
+        </w:tc>
+        <w:tc>
+          <w:tcPr>
+            <w:tcW w:w="2610" w:type="dxa"/>
+            <w:vAlign w:val="center"/>
+            <w:hideMark/>
+          </w:tcPr>
+          <w:p>
+            <w:pPr>
+              <w:cnfStyle w:val="000000100000" w:firstRow="0" w:lastRow="0" w:firstColumn="0" w:lastColumn="0" w:oddVBand="0" w:evenVBand="0" w:oddHBand="1" w:evenHBand="0" w:firstRowFirstColumn="0" w:firstRowLastColumn="0" w:lastRowFirstColumn="0" w:lastRowLastColumn="0"/>
+            </w:pPr>
+            <w:r>
+              <w:t>Successful</w:t>
+            </w:r>
+          </w:p>
+        </w:tc>
+      </w:tr>
+      <w:tr>
+        <w:tc>
+          <w:tcPr>
+            <w:cnfStyle w:val="001000000000" w:firstRow="0" w:lastRow="0" w:firstColumn="1" w:lastColumn="0" w:oddVBand="0" w:evenVBand="0" w:oddHBand="0" w:evenHBand="0" w:firstRowFirstColumn="0" w:firstRowLastColumn="0" w:lastRowFirstColumn="0" w:lastRowLastColumn="0"/>
+            <w:tcW w:w="3055" w:type="dxa"/>
+            <w:vAlign w:val="center"/>
+            <w:hideMark/>
+          </w:tcPr>
+          <w:p>
+            <w:pPr>
+              <w:rPr>
+                <w:b w:val="0"/>
+                <w:bCs w:val="0"/>
+              </w:rPr>
+            </w:pPr>
+            <w:r>
+              <w:rPr>
+                <w:b w:val="0"/>
+                <w:bCs w:val="0"/>
+              </w:rPr>
+              <w:t>Cloudflare R2 / Amazon S3</w:t>
+            </w:r>
+          </w:p>
+        </w:tc>
+        <w:tc>
+          <w:tcPr>
+            <w:tcW w:w="3600" w:type="dxa"/>
+            <w:vAlign w:val="center"/>
+            <w:hideMark/>
+          </w:tcPr>
+          <w:p>
+            <w:pPr>
+              <w:cnfStyle w:val="000000000000" w:firstRow="0" w:lastRow="0" w:firstColumn="0" w:lastColumn="0" w:oddVBand="0" w:evenVBand="0" w:oddHBand="0" w:evenHBand="0" w:firstRowFirstColumn="0" w:firstRowLastColumn="0" w:lastRowFirstColumn="0" w:lastRowLastColumn="0"/>
+            </w:pPr>
+            <w:r>
+              <w:t>File storage</w:t>
+            </w:r>
+          </w:p>
+        </w:tc>
+        <w:tc>
+          <w:tcPr>
+            <w:tcW w:w="2610" w:type="dxa"/>
+            <w:vAlign w:val="center"/>
+            <w:hideMark/>
+          </w:tcPr>
+          <w:p>
+            <w:pPr>
+              <w:cnfStyle w:val="000000000000" w:firstRow="0" w:lastRow="0" w:firstColumn="0" w:lastColumn="0" w:oddVBand="0" w:evenVBand="0" w:oddHBand="0" w:evenHBand="0" w:firstRowFirstColumn="0" w:firstRowLastColumn="0" w:lastRowFirstColumn="0" w:lastRowLastColumn="0"/>
+            </w:pPr>
+            <w:r>
+              <w:t>Successful</w:t>
+            </w:r>
+          </w:p>
+        </w:tc>
+      </w:tr>
+      <w:tr>
+        <w:trPr>
+          <w:cnfStyle w:val="000000100000" w:firstRow="0" w:lastRow="0" w:firstColumn="0" w:lastColumn="0" w:oddVBand="0" w:evenVBand="0" w:oddHBand="1" w:evenHBand="0" w:firstRowFirstColumn="0" w:firstRowLastColumn="0" w:lastRowFirstColumn="0" w:lastRowLastColumn="0"/>
+        </w:trPr>
+        <w:tc>
+          <w:tcPr>
+            <w:cnfStyle w:val="001000000000" w:firstRow="0" w:lastRow="0" w:firstColumn="1" w:lastColumn="0" w:oddVBand="0" w:evenVBand="0" w:oddHBand="0" w:evenHBand="0" w:firstRowFirstColumn="0" w:firstRowLastColumn="0" w:lastRowFirstColumn="0" w:lastRowLastColumn="0"/>
+            <w:tcW w:w="3055" w:type="dxa"/>
+            <w:vAlign w:val="center"/>
+            <w:hideMark/>
+          </w:tcPr>
+          <w:p>
+            <w:pPr>
+              <w:rPr>
+                <w:b w:val="0"/>
+                <w:bCs w:val="0"/>
+              </w:rPr>
+            </w:pPr>
+            <w:r>
+              <w:rPr>
+                <w:b w:val="0"/>
+                <w:bCs w:val="0"/>
+              </w:rPr>
+              <w:t>Firebase Cloud Messaging</w:t>
+            </w:r>
+          </w:p>
+        </w:tc>
+        <w:tc>
+          <w:tcPr>
+            <w:tcW w:w="3600" w:type="dxa"/>
+            <w:vAlign w:val="center"/>
+            <w:hideMark/>
+          </w:tcPr>
+          <w:p>
+            <w:pPr>
+              <w:cnfStyle w:val="000000100000" w:firstRow="0" w:lastRow="0" w:firstColumn="0" w:lastColumn="0" w:oddVBand="0" w:evenVBand="0" w:oddHBand="1" w:evenHBand="0" w:firstRowFirstColumn="0" w:firstRowLastColumn="0" w:lastRowFirstColumn="0" w:lastRowLastColumn="0"/>
+            </w:pPr>
+            <w:r>
+              <w:t>Push notifications</w:t>
+            </w:r>
+          </w:p>
+        </w:tc>
+        <w:tc>
+          <w:tcPr>
+            <w:tcW w:w="2610" w:type="dxa"/>
+            <w:vAlign w:val="center"/>
+            <w:hideMark/>
+          </w:tcPr>
+          <w:p>
+            <w:pPr>
+              <w:cnfStyle w:val="000000100000" w:firstRow="0" w:lastRow="0" w:firstColumn="0" w:lastColumn="0" w:oddVBand="0" w:evenVBand="0" w:oddHBand="1" w:evenHBand="0" w:firstRowFirstColumn="0" w:firstRowLastColumn="0" w:lastRowFirstColumn="0" w:lastRowLastColumn="0"/>
+            </w:pPr>
+            <w:r>
+              <w:t>Successful</w:t>
+            </w:r>
+          </w:p>
+        </w:tc>
+      </w:tr>
+      <w:tr>
+        <w:tc>
+          <w:tcPr>
+            <w:cnfStyle w:val="001000000000" w:firstRow="0" w:lastRow="0" w:firstColumn="1" w:lastColumn="0" w:oddVBand="0" w:evenVBand="0" w:oddHBand="0" w:evenHBand="0" w:firstRowFirstColumn="0" w:firstRowLastColumn="0" w:lastRowFirstColumn="0" w:lastRowLastColumn="0"/>
+            <w:tcW w:w="3055" w:type="dxa"/>
+            <w:vAlign w:val="center"/>
+            <w:hideMark/>
+          </w:tcPr>
+          <w:p>
+            <w:pPr>
+              <w:rPr>
+                <w:b w:val="0"/>
+                <w:bCs w:val="0"/>
+              </w:rPr>
+            </w:pPr>
+            <w:r>
+              <w:rPr>
+                <w:b w:val="0"/>
+                <w:bCs w:val="0"/>
+              </w:rPr>
+              <w:t>SMTP Email Service</w:t>
+            </w:r>
+          </w:p>
+        </w:tc>
+        <w:tc>
+          <w:tcPr>
+            <w:tcW w:w="3600" w:type="dxa"/>
+            <w:vAlign w:val="center"/>
+            <w:hideMark/>
+          </w:tcPr>
+          <w:p>
+            <w:pPr>
+              <w:cnfStyle w:val="000000000000" w:firstRow="0" w:lastRow="0" w:firstColumn="0" w:lastColumn="0" w:oddVBand="0" w:evenVBand="0" w:oddHBand="0" w:evenHBand="0" w:firstRowFirstColumn="0" w:firstRowLastColumn="0" w:lastRowFirstColumn="0" w:lastRowLastColumn="0"/>
+            </w:pPr>
+            <w:r>
+              <w:t>Email notifications</w:t>
+            </w:r>
+          </w:p>
+        </w:tc>
+        <w:tc>
+          <w:tcPr>
+            <w:tcW w:w="2610" w:type="dxa"/>
+            <w:vAlign w:val="center"/>
+            <w:hideMark/>
+          </w:tcPr>
+          <w:p>
+            <w:pPr>
+              <w:cnfStyle w:val="000000000000" w:firstRow="0" w:lastRow="0" w:firstColumn="0" w:lastColumn="0" w:oddVBand="0" w:evenVBand="0" w:oddHBand="0" w:evenHBand="0" w:firstRowFirstColumn="0" w:firstRowLastColumn="0" w:lastRowFirstColumn="0" w:lastRowLastColumn="0"/>
+            </w:pPr>
+            <w:r>
+              <w:t>Successful</w:t>
+            </w:r>
+          </w:p>
+        </w:tc>
+      </w:tr>
+    </w:tbl>
+    <w:p/>
+    <w:p>
+      <w:pPr>
+        <w:pStyle w:val="Heading3"/>
+      </w:pPr>
+      <w:r>
+        <w:t>API Communication Validation</w:t>
+      </w:r>
+    </w:p>
+    <w:p>
+      <w:r>
+        <w:t>Communication through REST API and WebSockets was checked to provide a reliable way of interaction between frontend applications and backend services. Testing verified whether authenticated requests are delivered to the appropriate controllers, business services perform necessary operations, and standard JSON responses are provided back to client applications.</w:t>
+      </w:r>
+      <w:r>
+        <w:t xml:space="preserve"> </w:t>
+      </w:r>
+      <w:r>
+        <w:t>Real-time communication was validated using tracking of WebSocket events for reservations, payments, and notifications. Results of the analysis have shown that clients are notified about backend events immediately after their occurrence.</w:t>
+      </w:r>
+    </w:p>
+    <w:p>
+      <w:pPr>
+        <w:pStyle w:val="Heading3"/>
+      </w:pPr>
+      <w:r>
+        <w:t>Security Validation</w:t>
+      </w:r>
+    </w:p>
+    <w:p>
+      <w:r>
+        <w:t>Security validation of the architecture was performed to make sure that communication between components satisfies the platform security requirements. Validation proved the correct implementation of the following security measures:</w:t>
+      </w:r>
+    </w:p>
+    <w:p>
+      <w:pPr>
+        <w:pStyle w:val="ListParagraph"/>
+        <w:numPr>
+          <w:ilvl w:val="0"/>
+          <w:numId w:val="188"/>
+        </w:numPr>
+      </w:pPr>
+      <w:r>
+        <w:t>HTTPS encryption for all external communications</w:t>
+      </w:r>
+    </w:p>
+    <w:p>
+      <w:pPr>
+        <w:pStyle w:val="ListParagraph"/>
+        <w:numPr>
+          <w:ilvl w:val="0"/>
+          <w:numId w:val="188"/>
+        </w:numPr>
+      </w:pPr>
+      <w:r>
+        <w:t>JWT authentication</w:t>
+      </w:r>
+    </w:p>
+    <w:p>
+      <w:pPr>
+        <w:pStyle w:val="ListParagraph"/>
+        <w:numPr>
+          <w:ilvl w:val="0"/>
+          <w:numId w:val="188"/>
+        </w:numPr>
+      </w:pPr>
+      <w:r>
+        <w:t>Role-Based Access Control (RBAC)</w:t>
+      </w:r>
+    </w:p>
+    <w:p>
+      <w:pPr>
+        <w:pStyle w:val="ListParagraph"/>
+        <w:numPr>
+          <w:ilvl w:val="0"/>
+          <w:numId w:val="188"/>
+        </w:numPr>
+      </w:pPr>
+      <w:r>
+        <w:t>Safe API keys management</w:t>
+      </w:r>
+    </w:p>
+    <w:p>
+      <w:pPr>
+        <w:pStyle w:val="ListParagraph"/>
+        <w:numPr>
+          <w:ilvl w:val="0"/>
+          <w:numId w:val="188"/>
+        </w:numPr>
+      </w:pPr>
+      <w:r>
+        <w:t>Request validation and sanitization</w:t>
+      </w:r>
+    </w:p>
+    <w:p>
+      <w:pPr>
+        <w:pStyle w:val="ListParagraph"/>
+        <w:numPr>
+          <w:ilvl w:val="0"/>
+          <w:numId w:val="188"/>
+        </w:numPr>
+      </w:pPr>
+      <w:r>
+        <w:t>Safe communication with external providers</w:t>
+      </w:r>
+    </w:p>
+    <w:p>
+      <w:pPr>
+        <w:pStyle w:val="ListParagraph"/>
+        <w:numPr>
+          <w:ilvl w:val="0"/>
+          <w:numId w:val="188"/>
+        </w:numPr>
+      </w:pPr>
+      <w:r>
+        <w:t>Safe access to databases through repository interfaces</w:t>
+      </w:r>
+    </w:p>
+    <w:p>
+      <w:r>
+        <w:t>These security measures provide the protection of sensitive data when performing data exchange between components of the system.</w:t>
+      </w:r>
+    </w:p>
+    <w:p>
+      <w:pPr>
+        <w:pStyle w:val="Heading3"/>
+      </w:pPr>
+      <w:r>
+        <w:t>Performance Validation</w:t>
+      </w:r>
+    </w:p>
+    <w:p>
+      <w:r>
+        <w:t>Performance validation focused on the confirmation of the ability of the integration architecture to sustain good response times even under concurrent operations. Asynchronous processing using RabbitMQ and BullMQ was checked by monitoring of background tasks such as notifications, analytics generation, and emails sending.</w:t>
+      </w:r>
+      <w:r>
+        <w:t xml:space="preserve"> </w:t>
+      </w:r>
+      <w:r>
+        <w:t>As a result of the validation, it has been found that long-lasting processes are delegated to background workers successfully without having negative impact on the performance of main reservation flow. Moreover, Redis cache decreased redundant queries to the database and improved the performance of frequently accessed resources.</w:t>
+      </w:r>
+    </w:p>
+    <w:p/>
+    <w:p>
+      <w:pPr>
+        <w:pStyle w:val="Heading3"/>
+      </w:pPr>
+      <w:r>
+        <w:lastRenderedPageBreak/>
+        <w:t>Integration Validation Summary</w:t>
+      </w:r>
+    </w:p>
+    <w:p>
+      <w:r>
+        <w:t>Integration validation proves that components of KriGo platform architecture can communicate properly through standard communication interfaces. Internal services operate in compliance with the given layered architecture, while external providers are integrated properly using dedicated service modules. Secure communication protocols, centralized validation and asynchronous processing altogether result in a reliable, scalable, and maintainable software architecture.</w:t>
+      </w:r>
+    </w:p>
+    <w:p/>
     <w:sectPr>
       <w:headerReference w:type="default" r:id="rId27"/>
       <w:footerReference w:type="default" r:id="rId28"/>
@@ -24182,6 +25248,119 @@
     </w:lvl>
   </w:abstractNum>
   <w:abstractNum w:abstractNumId="80" w15:restartNumberingAfterBreak="0">
+    <w:nsid w:val="382065B9"/>
+    <w:multiLevelType w:val="hybridMultilevel"/>
+    <w:tmpl w:val="71C28E6E"/>
+    <w:lvl w:ilvl="0" w:tplc="04090005">
+      <w:start w:val="1"/>
+      <w:numFmt w:val="bullet"/>
+      <w:lvlText w:val=""/>
+      <w:lvlJc w:val="left"/>
+      <w:pPr>
+        <w:ind w:left="720" w:hanging="360"/>
+      </w:pPr>
+      <w:rPr>
+        <w:rFonts w:ascii="Wingdings" w:hAnsi="Wingdings" w:hint="default"/>
+      </w:rPr>
+    </w:lvl>
+    <w:lvl w:ilvl="1" w:tplc="04090003" w:tentative="1">
+      <w:start w:val="1"/>
+      <w:numFmt w:val="bullet"/>
+      <w:lvlText w:val="o"/>
+      <w:lvlJc w:val="left"/>
+      <w:pPr>
+        <w:ind w:left="1440" w:hanging="360"/>
+      </w:pPr>
+      <w:rPr>
+        <w:rFonts w:ascii="Courier New" w:hAnsi="Courier New" w:cs="Courier New" w:hint="default"/>
+      </w:rPr>
+    </w:lvl>
+    <w:lvl w:ilvl="2" w:tplc="04090005" w:tentative="1">
+      <w:start w:val="1"/>
+      <w:numFmt w:val="bullet"/>
+      <w:lvlText w:val=""/>
+      <w:lvlJc w:val="left"/>
+      <w:pPr>
+        <w:ind w:left="2160" w:hanging="360"/>
+      </w:pPr>
+      <w:rPr>
+        <w:rFonts w:ascii="Wingdings" w:hAnsi="Wingdings" w:hint="default"/>
+      </w:rPr>
+    </w:lvl>
+    <w:lvl w:ilvl="3" w:tplc="04090001" w:tentative="1">
+      <w:start w:val="1"/>
+      <w:numFmt w:val="bullet"/>
+      <w:lvlText w:val=""/>
+      <w:lvlJc w:val="left"/>
+      <w:pPr>
+        <w:ind w:left="2880" w:hanging="360"/>
+      </w:pPr>
+      <w:rPr>
+        <w:rFonts w:ascii="Symbol" w:hAnsi="Symbol" w:hint="default"/>
+      </w:rPr>
+    </w:lvl>
+    <w:lvl w:ilvl="4" w:tplc="04090003" w:tentative="1">
+      <w:start w:val="1"/>
+      <w:numFmt w:val="bullet"/>
+      <w:lvlText w:val="o"/>
+      <w:lvlJc w:val="left"/>
+      <w:pPr>
+        <w:ind w:left="3600" w:hanging="360"/>
+      </w:pPr>
+      <w:rPr>
+        <w:rFonts w:ascii="Courier New" w:hAnsi="Courier New" w:cs="Courier New" w:hint="default"/>
+      </w:rPr>
+    </w:lvl>
+    <w:lvl w:ilvl="5" w:tplc="04090005" w:tentative="1">
+      <w:start w:val="1"/>
+      <w:numFmt w:val="bullet"/>
+      <w:lvlText w:val=""/>
+      <w:lvlJc w:val="left"/>
+      <w:pPr>
+        <w:ind w:left="4320" w:hanging="360"/>
+      </w:pPr>
+      <w:rPr>
+        <w:rFonts w:ascii="Wingdings" w:hAnsi="Wingdings" w:hint="default"/>
+      </w:rPr>
+    </w:lvl>
+    <w:lvl w:ilvl="6" w:tplc="04090001" w:tentative="1">
+      <w:start w:val="1"/>
+      <w:numFmt w:val="bullet"/>
+      <w:lvlText w:val=""/>
+      <w:lvlJc w:val="left"/>
+      <w:pPr>
+        <w:ind w:left="5040" w:hanging="360"/>
+      </w:pPr>
+      <w:rPr>
+        <w:rFonts w:ascii="Symbol" w:hAnsi="Symbol" w:hint="default"/>
+      </w:rPr>
+    </w:lvl>
+    <w:lvl w:ilvl="7" w:tplc="04090003" w:tentative="1">
+      <w:start w:val="1"/>
+      <w:numFmt w:val="bullet"/>
+      <w:lvlText w:val="o"/>
+      <w:lvlJc w:val="left"/>
+      <w:pPr>
+        <w:ind w:left="5760" w:hanging="360"/>
+      </w:pPr>
+      <w:rPr>
+        <w:rFonts w:ascii="Courier New" w:hAnsi="Courier New" w:cs="Courier New" w:hint="default"/>
+      </w:rPr>
+    </w:lvl>
+    <w:lvl w:ilvl="8" w:tplc="04090005" w:tentative="1">
+      <w:start w:val="1"/>
+      <w:numFmt w:val="bullet"/>
+      <w:lvlText w:val=""/>
+      <w:lvlJc w:val="left"/>
+      <w:pPr>
+        <w:ind w:left="6480" w:hanging="360"/>
+      </w:pPr>
+      <w:rPr>
+        <w:rFonts w:ascii="Wingdings" w:hAnsi="Wingdings" w:hint="default"/>
+      </w:rPr>
+    </w:lvl>
+  </w:abstractNum>
+  <w:abstractNum w:abstractNumId="81" w15:restartNumberingAfterBreak="0">
     <w:nsid w:val="3B446B2D"/>
     <w:multiLevelType w:val="hybridMultilevel"/>
     <w:tmpl w:val="B638176E"/>
@@ -24293,7 +25472,7 @@
       </w:rPr>
     </w:lvl>
   </w:abstractNum>
-  <w:abstractNum w:abstractNumId="81" w15:restartNumberingAfterBreak="0">
+  <w:abstractNum w:abstractNumId="82" w15:restartNumberingAfterBreak="0">
     <w:nsid w:val="3B6B41F5"/>
     <w:multiLevelType w:val="hybridMultilevel"/>
     <w:tmpl w:val="10A26168"/>
@@ -24405,7 +25584,7 @@
       </w:rPr>
     </w:lvl>
   </w:abstractNum>
-  <w:abstractNum w:abstractNumId="82" w15:restartNumberingAfterBreak="0">
+  <w:abstractNum w:abstractNumId="83" w15:restartNumberingAfterBreak="0">
     <w:nsid w:val="3BCD79E4"/>
     <w:multiLevelType w:val="hybridMultilevel"/>
     <w:tmpl w:val="FFFAC2AC"/>
@@ -24518,7 +25697,7 @@
       </w:rPr>
     </w:lvl>
   </w:abstractNum>
-  <w:abstractNum w:abstractNumId="83" w15:restartNumberingAfterBreak="0">
+  <w:abstractNum w:abstractNumId="84" w15:restartNumberingAfterBreak="0">
     <w:nsid w:val="3C5546BA"/>
     <w:multiLevelType w:val="hybridMultilevel"/>
     <w:tmpl w:val="3434F5E4"/>
@@ -24630,7 +25809,7 @@
       </w:rPr>
     </w:lvl>
   </w:abstractNum>
-  <w:abstractNum w:abstractNumId="84" w15:restartNumberingAfterBreak="0">
+  <w:abstractNum w:abstractNumId="85" w15:restartNumberingAfterBreak="0">
     <w:nsid w:val="3C623C55"/>
     <w:multiLevelType w:val="multilevel"/>
     <w:tmpl w:val="A0B0E8F4"/>
@@ -24779,7 +25958,7 @@
       </w:rPr>
     </w:lvl>
   </w:abstractNum>
-  <w:abstractNum w:abstractNumId="85" w15:restartNumberingAfterBreak="0">
+  <w:abstractNum w:abstractNumId="86" w15:restartNumberingAfterBreak="0">
     <w:nsid w:val="3CD27F78"/>
     <w:multiLevelType w:val="multilevel"/>
     <w:tmpl w:val="FCDE767A"/>
@@ -24928,7 +26107,7 @@
       </w:rPr>
     </w:lvl>
   </w:abstractNum>
-  <w:abstractNum w:abstractNumId="86" w15:restartNumberingAfterBreak="0">
+  <w:abstractNum w:abstractNumId="87" w15:restartNumberingAfterBreak="0">
     <w:nsid w:val="3CD74B18"/>
     <w:multiLevelType w:val="hybridMultilevel"/>
     <w:tmpl w:val="2FF42220"/>
@@ -25041,7 +26220,7 @@
       </w:rPr>
     </w:lvl>
   </w:abstractNum>
-  <w:abstractNum w:abstractNumId="87" w15:restartNumberingAfterBreak="0">
+  <w:abstractNum w:abstractNumId="88" w15:restartNumberingAfterBreak="0">
     <w:nsid w:val="3D2F7E79"/>
     <w:multiLevelType w:val="hybridMultilevel"/>
     <w:tmpl w:val="6ED674BE"/>
@@ -25153,7 +26332,7 @@
       </w:rPr>
     </w:lvl>
   </w:abstractNum>
-  <w:abstractNum w:abstractNumId="88" w15:restartNumberingAfterBreak="0">
+  <w:abstractNum w:abstractNumId="89" w15:restartNumberingAfterBreak="0">
     <w:nsid w:val="3D397287"/>
     <w:multiLevelType w:val="hybridMultilevel"/>
     <w:tmpl w:val="F4503122"/>
@@ -25265,7 +26444,7 @@
       </w:rPr>
     </w:lvl>
   </w:abstractNum>
-  <w:abstractNum w:abstractNumId="89" w15:restartNumberingAfterBreak="0">
+  <w:abstractNum w:abstractNumId="90" w15:restartNumberingAfterBreak="0">
     <w:nsid w:val="3DC14EA1"/>
     <w:multiLevelType w:val="hybridMultilevel"/>
     <w:tmpl w:val="DCAE9528"/>
@@ -25378,7 +26557,7 @@
       </w:rPr>
     </w:lvl>
   </w:abstractNum>
-  <w:abstractNum w:abstractNumId="90" w15:restartNumberingAfterBreak="0">
+  <w:abstractNum w:abstractNumId="91" w15:restartNumberingAfterBreak="0">
     <w:nsid w:val="3E685FF3"/>
     <w:multiLevelType w:val="multilevel"/>
     <w:tmpl w:val="7D20B538"/>
@@ -25527,7 +26706,7 @@
       </w:rPr>
     </w:lvl>
   </w:abstractNum>
-  <w:abstractNum w:abstractNumId="91" w15:restartNumberingAfterBreak="0">
+  <w:abstractNum w:abstractNumId="92" w15:restartNumberingAfterBreak="0">
     <w:nsid w:val="3F20785F"/>
     <w:multiLevelType w:val="hybridMultilevel"/>
     <w:tmpl w:val="49D612FC"/>
@@ -25640,7 +26819,7 @@
       </w:rPr>
     </w:lvl>
   </w:abstractNum>
-  <w:abstractNum w:abstractNumId="92" w15:restartNumberingAfterBreak="0">
+  <w:abstractNum w:abstractNumId="93" w15:restartNumberingAfterBreak="0">
     <w:nsid w:val="3F346C2C"/>
     <w:multiLevelType w:val="multilevel"/>
     <w:tmpl w:val="63F4E6F0"/>
@@ -25789,7 +26968,7 @@
       </w:rPr>
     </w:lvl>
   </w:abstractNum>
-  <w:abstractNum w:abstractNumId="93" w15:restartNumberingAfterBreak="0">
+  <w:abstractNum w:abstractNumId="94" w15:restartNumberingAfterBreak="0">
     <w:nsid w:val="3FCB1322"/>
     <w:multiLevelType w:val="hybridMultilevel"/>
     <w:tmpl w:val="55C012B2"/>
@@ -25901,7 +27080,7 @@
       </w:rPr>
     </w:lvl>
   </w:abstractNum>
-  <w:abstractNum w:abstractNumId="94" w15:restartNumberingAfterBreak="0">
+  <w:abstractNum w:abstractNumId="95" w15:restartNumberingAfterBreak="0">
     <w:nsid w:val="403501BA"/>
     <w:multiLevelType w:val="hybridMultilevel"/>
     <w:tmpl w:val="D95E90BC"/>
@@ -26014,7 +27193,7 @@
       </w:rPr>
     </w:lvl>
   </w:abstractNum>
-  <w:abstractNum w:abstractNumId="95" w15:restartNumberingAfterBreak="0">
+  <w:abstractNum w:abstractNumId="96" w15:restartNumberingAfterBreak="0">
     <w:nsid w:val="41A9344F"/>
     <w:multiLevelType w:val="hybridMultilevel"/>
     <w:tmpl w:val="0FB60038"/>
@@ -26127,7 +27306,7 @@
       </w:rPr>
     </w:lvl>
   </w:abstractNum>
-  <w:abstractNum w:abstractNumId="96" w15:restartNumberingAfterBreak="0">
+  <w:abstractNum w:abstractNumId="97" w15:restartNumberingAfterBreak="0">
     <w:nsid w:val="41B44F72"/>
     <w:multiLevelType w:val="hybridMultilevel"/>
     <w:tmpl w:val="1F58F614"/>
@@ -26241,7 +27420,7 @@
       </w:rPr>
     </w:lvl>
   </w:abstractNum>
-  <w:abstractNum w:abstractNumId="97" w15:restartNumberingAfterBreak="0">
+  <w:abstractNum w:abstractNumId="98" w15:restartNumberingAfterBreak="0">
     <w:nsid w:val="42004E1F"/>
     <w:multiLevelType w:val="hybridMultilevel"/>
     <w:tmpl w:val="770C8314"/>
@@ -26353,7 +27532,7 @@
       </w:rPr>
     </w:lvl>
   </w:abstractNum>
-  <w:abstractNum w:abstractNumId="98" w15:restartNumberingAfterBreak="0">
+  <w:abstractNum w:abstractNumId="99" w15:restartNumberingAfterBreak="0">
     <w:nsid w:val="439F7169"/>
     <w:multiLevelType w:val="hybridMultilevel"/>
     <w:tmpl w:val="1884EDCA"/>
@@ -26466,7 +27645,7 @@
       </w:rPr>
     </w:lvl>
   </w:abstractNum>
-  <w:abstractNum w:abstractNumId="99" w15:restartNumberingAfterBreak="0">
+  <w:abstractNum w:abstractNumId="100" w15:restartNumberingAfterBreak="0">
     <w:nsid w:val="43EA1D69"/>
     <w:multiLevelType w:val="multilevel"/>
     <w:tmpl w:val="DFEC23EC"/>
@@ -26615,7 +27794,7 @@
       </w:rPr>
     </w:lvl>
   </w:abstractNum>
-  <w:abstractNum w:abstractNumId="100" w15:restartNumberingAfterBreak="0">
+  <w:abstractNum w:abstractNumId="101" w15:restartNumberingAfterBreak="0">
     <w:nsid w:val="44320084"/>
     <w:multiLevelType w:val="hybridMultilevel"/>
     <w:tmpl w:val="CE5076D4"/>
@@ -26727,7 +27906,7 @@
       </w:rPr>
     </w:lvl>
   </w:abstractNum>
-  <w:abstractNum w:abstractNumId="101" w15:restartNumberingAfterBreak="0">
+  <w:abstractNum w:abstractNumId="102" w15:restartNumberingAfterBreak="0">
     <w:nsid w:val="44554567"/>
     <w:multiLevelType w:val="hybridMultilevel"/>
     <w:tmpl w:val="78748252"/>
@@ -26839,7 +28018,7 @@
       </w:rPr>
     </w:lvl>
   </w:abstractNum>
-  <w:abstractNum w:abstractNumId="102" w15:restartNumberingAfterBreak="0">
+  <w:abstractNum w:abstractNumId="103" w15:restartNumberingAfterBreak="0">
     <w:nsid w:val="49005094"/>
     <w:multiLevelType w:val="hybridMultilevel"/>
     <w:tmpl w:val="14848CBE"/>
@@ -26951,7 +28130,7 @@
       </w:rPr>
     </w:lvl>
   </w:abstractNum>
-  <w:abstractNum w:abstractNumId="103" w15:restartNumberingAfterBreak="0">
+  <w:abstractNum w:abstractNumId="104" w15:restartNumberingAfterBreak="0">
     <w:nsid w:val="49243794"/>
     <w:multiLevelType w:val="multilevel"/>
     <w:tmpl w:val="E7681528"/>
@@ -27100,7 +28279,7 @@
       </w:rPr>
     </w:lvl>
   </w:abstractNum>
-  <w:abstractNum w:abstractNumId="104" w15:restartNumberingAfterBreak="0">
+  <w:abstractNum w:abstractNumId="105" w15:restartNumberingAfterBreak="0">
     <w:nsid w:val="4A880990"/>
     <w:multiLevelType w:val="hybridMultilevel"/>
     <w:tmpl w:val="F17E12C2"/>
@@ -27212,7 +28391,7 @@
       </w:rPr>
     </w:lvl>
   </w:abstractNum>
-  <w:abstractNum w:abstractNumId="105" w15:restartNumberingAfterBreak="0">
+  <w:abstractNum w:abstractNumId="106" w15:restartNumberingAfterBreak="0">
     <w:nsid w:val="4B182B12"/>
     <w:multiLevelType w:val="hybridMultilevel"/>
     <w:tmpl w:val="31C486B4"/>
@@ -27324,7 +28503,7 @@
       </w:rPr>
     </w:lvl>
   </w:abstractNum>
-  <w:abstractNum w:abstractNumId="106" w15:restartNumberingAfterBreak="0">
+  <w:abstractNum w:abstractNumId="107" w15:restartNumberingAfterBreak="0">
     <w:nsid w:val="4B6E6D62"/>
     <w:multiLevelType w:val="hybridMultilevel"/>
     <w:tmpl w:val="54DC0C0C"/>
@@ -27437,7 +28616,7 @@
       </w:rPr>
     </w:lvl>
   </w:abstractNum>
-  <w:abstractNum w:abstractNumId="107" w15:restartNumberingAfterBreak="0">
+  <w:abstractNum w:abstractNumId="108" w15:restartNumberingAfterBreak="0">
     <w:nsid w:val="4BA13766"/>
     <w:multiLevelType w:val="multilevel"/>
     <w:tmpl w:val="63F4E6F0"/>
@@ -27586,7 +28765,7 @@
       </w:rPr>
     </w:lvl>
   </w:abstractNum>
-  <w:abstractNum w:abstractNumId="108" w15:restartNumberingAfterBreak="0">
+  <w:abstractNum w:abstractNumId="109" w15:restartNumberingAfterBreak="0">
     <w:nsid w:val="4D2E1CBE"/>
     <w:multiLevelType w:val="hybridMultilevel"/>
     <w:tmpl w:val="BFD86D7C"/>
@@ -27699,7 +28878,7 @@
       </w:rPr>
     </w:lvl>
   </w:abstractNum>
-  <w:abstractNum w:abstractNumId="109" w15:restartNumberingAfterBreak="0">
+  <w:abstractNum w:abstractNumId="110" w15:restartNumberingAfterBreak="0">
     <w:nsid w:val="4E65371E"/>
     <w:multiLevelType w:val="hybridMultilevel"/>
     <w:tmpl w:val="53EE4538"/>
@@ -27811,7 +28990,7 @@
       </w:rPr>
     </w:lvl>
   </w:abstractNum>
-  <w:abstractNum w:abstractNumId="110" w15:restartNumberingAfterBreak="0">
+  <w:abstractNum w:abstractNumId="111" w15:restartNumberingAfterBreak="0">
     <w:nsid w:val="4E9A3F16"/>
     <w:multiLevelType w:val="multilevel"/>
     <w:tmpl w:val="63F4E6F0"/>
@@ -27960,7 +29139,7 @@
       </w:rPr>
     </w:lvl>
   </w:abstractNum>
-  <w:abstractNum w:abstractNumId="111" w15:restartNumberingAfterBreak="0">
+  <w:abstractNum w:abstractNumId="112" w15:restartNumberingAfterBreak="0">
     <w:nsid w:val="500B790D"/>
     <w:multiLevelType w:val="multilevel"/>
     <w:tmpl w:val="63F4E6F0"/>
@@ -28109,7 +29288,7 @@
       </w:rPr>
     </w:lvl>
   </w:abstractNum>
-  <w:abstractNum w:abstractNumId="112" w15:restartNumberingAfterBreak="0">
+  <w:abstractNum w:abstractNumId="113" w15:restartNumberingAfterBreak="0">
     <w:nsid w:val="5037150E"/>
     <w:multiLevelType w:val="hybridMultilevel"/>
     <w:tmpl w:val="064034F8"/>
@@ -28222,7 +29401,7 @@
       </w:rPr>
     </w:lvl>
   </w:abstractNum>
-  <w:abstractNum w:abstractNumId="113" w15:restartNumberingAfterBreak="0">
+  <w:abstractNum w:abstractNumId="114" w15:restartNumberingAfterBreak="0">
     <w:nsid w:val="50A931C8"/>
     <w:multiLevelType w:val="hybridMultilevel"/>
     <w:tmpl w:val="ED3217DE"/>
@@ -28335,7 +29514,7 @@
       </w:rPr>
     </w:lvl>
   </w:abstractNum>
-  <w:abstractNum w:abstractNumId="114" w15:restartNumberingAfterBreak="0">
+  <w:abstractNum w:abstractNumId="115" w15:restartNumberingAfterBreak="0">
     <w:nsid w:val="51417BE1"/>
     <w:multiLevelType w:val="multilevel"/>
     <w:tmpl w:val="993C0E80"/>
@@ -28484,7 +29663,7 @@
       </w:rPr>
     </w:lvl>
   </w:abstractNum>
-  <w:abstractNum w:abstractNumId="115" w15:restartNumberingAfterBreak="0">
+  <w:abstractNum w:abstractNumId="116" w15:restartNumberingAfterBreak="0">
     <w:nsid w:val="526538B7"/>
     <w:multiLevelType w:val="hybridMultilevel"/>
     <w:tmpl w:val="E6A017F2"/>
@@ -28597,7 +29776,7 @@
       </w:rPr>
     </w:lvl>
   </w:abstractNum>
-  <w:abstractNum w:abstractNumId="116" w15:restartNumberingAfterBreak="0">
+  <w:abstractNum w:abstractNumId="117" w15:restartNumberingAfterBreak="0">
     <w:nsid w:val="537E56D9"/>
     <w:multiLevelType w:val="multilevel"/>
     <w:tmpl w:val="1B6E8B6A"/>
@@ -28746,7 +29925,7 @@
       </w:rPr>
     </w:lvl>
   </w:abstractNum>
-  <w:abstractNum w:abstractNumId="117" w15:restartNumberingAfterBreak="0">
+  <w:abstractNum w:abstractNumId="118" w15:restartNumberingAfterBreak="0">
     <w:nsid w:val="53E6601E"/>
     <w:multiLevelType w:val="hybridMultilevel"/>
     <w:tmpl w:val="66F0666A"/>
@@ -28859,7 +30038,7 @@
       </w:rPr>
     </w:lvl>
   </w:abstractNum>
-  <w:abstractNum w:abstractNumId="118" w15:restartNumberingAfterBreak="0">
+  <w:abstractNum w:abstractNumId="119" w15:restartNumberingAfterBreak="0">
     <w:nsid w:val="551D6F91"/>
     <w:multiLevelType w:val="hybridMultilevel"/>
     <w:tmpl w:val="9522B3C6"/>
@@ -28971,7 +30150,7 @@
       </w:rPr>
     </w:lvl>
   </w:abstractNum>
-  <w:abstractNum w:abstractNumId="119" w15:restartNumberingAfterBreak="0">
+  <w:abstractNum w:abstractNumId="120" w15:restartNumberingAfterBreak="0">
     <w:nsid w:val="5546258F"/>
     <w:multiLevelType w:val="multilevel"/>
     <w:tmpl w:val="0CAA196E"/>
@@ -29120,7 +30299,7 @@
       </w:rPr>
     </w:lvl>
   </w:abstractNum>
-  <w:abstractNum w:abstractNumId="120" w15:restartNumberingAfterBreak="0">
+  <w:abstractNum w:abstractNumId="121" w15:restartNumberingAfterBreak="0">
     <w:nsid w:val="55655B93"/>
     <w:multiLevelType w:val="multilevel"/>
     <w:tmpl w:val="9C88A4A8"/>
@@ -29269,7 +30448,7 @@
       </w:rPr>
     </w:lvl>
   </w:abstractNum>
-  <w:abstractNum w:abstractNumId="121" w15:restartNumberingAfterBreak="0">
+  <w:abstractNum w:abstractNumId="122" w15:restartNumberingAfterBreak="0">
     <w:nsid w:val="562D4F1F"/>
     <w:multiLevelType w:val="hybridMultilevel"/>
     <w:tmpl w:val="1FF8D31C"/>
@@ -29381,7 +30560,7 @@
       </w:rPr>
     </w:lvl>
   </w:abstractNum>
-  <w:abstractNum w:abstractNumId="122" w15:restartNumberingAfterBreak="0">
+  <w:abstractNum w:abstractNumId="123" w15:restartNumberingAfterBreak="0">
     <w:nsid w:val="565A0C8B"/>
     <w:multiLevelType w:val="multilevel"/>
     <w:tmpl w:val="AB24FF2E"/>
@@ -29530,7 +30709,7 @@
       </w:rPr>
     </w:lvl>
   </w:abstractNum>
-  <w:abstractNum w:abstractNumId="123" w15:restartNumberingAfterBreak="0">
+  <w:abstractNum w:abstractNumId="124" w15:restartNumberingAfterBreak="0">
     <w:nsid w:val="566E7C65"/>
     <w:multiLevelType w:val="multilevel"/>
     <w:tmpl w:val="28803B4C"/>
@@ -29679,7 +30858,7 @@
       </w:rPr>
     </w:lvl>
   </w:abstractNum>
-  <w:abstractNum w:abstractNumId="124" w15:restartNumberingAfterBreak="0">
+  <w:abstractNum w:abstractNumId="125" w15:restartNumberingAfterBreak="0">
     <w:nsid w:val="57407594"/>
     <w:multiLevelType w:val="multilevel"/>
     <w:tmpl w:val="E6E2F8AE"/>
@@ -29828,7 +31007,7 @@
       </w:rPr>
     </w:lvl>
   </w:abstractNum>
-  <w:abstractNum w:abstractNumId="125" w15:restartNumberingAfterBreak="0">
+  <w:abstractNum w:abstractNumId="126" w15:restartNumberingAfterBreak="0">
     <w:nsid w:val="5773128C"/>
     <w:multiLevelType w:val="hybridMultilevel"/>
     <w:tmpl w:val="945E5C1E"/>
@@ -29941,7 +31120,7 @@
       </w:rPr>
     </w:lvl>
   </w:abstractNum>
-  <w:abstractNum w:abstractNumId="126" w15:restartNumberingAfterBreak="0">
+  <w:abstractNum w:abstractNumId="127" w15:restartNumberingAfterBreak="0">
     <w:nsid w:val="577F771B"/>
     <w:multiLevelType w:val="hybridMultilevel"/>
     <w:tmpl w:val="0F2C5914"/>
@@ -30053,7 +31232,7 @@
       </w:rPr>
     </w:lvl>
   </w:abstractNum>
-  <w:abstractNum w:abstractNumId="127" w15:restartNumberingAfterBreak="0">
+  <w:abstractNum w:abstractNumId="128" w15:restartNumberingAfterBreak="0">
     <w:nsid w:val="57C43CDD"/>
     <w:multiLevelType w:val="hybridMultilevel"/>
     <w:tmpl w:val="6C94FB5E"/>
@@ -30166,7 +31345,7 @@
       </w:rPr>
     </w:lvl>
   </w:abstractNum>
-  <w:abstractNum w:abstractNumId="128" w15:restartNumberingAfterBreak="0">
+  <w:abstractNum w:abstractNumId="129" w15:restartNumberingAfterBreak="0">
     <w:nsid w:val="58393977"/>
     <w:multiLevelType w:val="hybridMultilevel"/>
     <w:tmpl w:val="985A5484"/>
@@ -30279,7 +31458,7 @@
       </w:rPr>
     </w:lvl>
   </w:abstractNum>
-  <w:abstractNum w:abstractNumId="129" w15:restartNumberingAfterBreak="0">
+  <w:abstractNum w:abstractNumId="130" w15:restartNumberingAfterBreak="0">
     <w:nsid w:val="59AB4A55"/>
     <w:multiLevelType w:val="hybridMultilevel"/>
     <w:tmpl w:val="B6486CD6"/>
@@ -30392,7 +31571,7 @@
       </w:rPr>
     </w:lvl>
   </w:abstractNum>
-  <w:abstractNum w:abstractNumId="130" w15:restartNumberingAfterBreak="0">
+  <w:abstractNum w:abstractNumId="131" w15:restartNumberingAfterBreak="0">
     <w:nsid w:val="59EB4CE4"/>
     <w:multiLevelType w:val="multilevel"/>
     <w:tmpl w:val="63F4E6F0"/>
@@ -30541,7 +31720,7 @@
       </w:rPr>
     </w:lvl>
   </w:abstractNum>
-  <w:abstractNum w:abstractNumId="131" w15:restartNumberingAfterBreak="0">
+  <w:abstractNum w:abstractNumId="132" w15:restartNumberingAfterBreak="0">
     <w:nsid w:val="59EC6D60"/>
     <w:multiLevelType w:val="hybridMultilevel"/>
     <w:tmpl w:val="97E6E6DE"/>
@@ -30654,7 +31833,7 @@
       </w:rPr>
     </w:lvl>
   </w:abstractNum>
-  <w:abstractNum w:abstractNumId="132" w15:restartNumberingAfterBreak="0">
+  <w:abstractNum w:abstractNumId="133" w15:restartNumberingAfterBreak="0">
     <w:nsid w:val="5BD11962"/>
     <w:multiLevelType w:val="hybridMultilevel"/>
     <w:tmpl w:val="89A4B834"/>
@@ -30743,7 +31922,7 @@
       </w:pPr>
     </w:lvl>
   </w:abstractNum>
-  <w:abstractNum w:abstractNumId="133" w15:restartNumberingAfterBreak="0">
+  <w:abstractNum w:abstractNumId="134" w15:restartNumberingAfterBreak="0">
     <w:nsid w:val="5C950DBA"/>
     <w:multiLevelType w:val="hybridMultilevel"/>
     <w:tmpl w:val="7D78F950"/>
@@ -30855,7 +32034,7 @@
       </w:rPr>
     </w:lvl>
   </w:abstractNum>
-  <w:abstractNum w:abstractNumId="134" w15:restartNumberingAfterBreak="0">
+  <w:abstractNum w:abstractNumId="135" w15:restartNumberingAfterBreak="0">
     <w:nsid w:val="5D2A5D3B"/>
     <w:multiLevelType w:val="hybridMultilevel"/>
     <w:tmpl w:val="3AF89EA6"/>
@@ -30946,7 +32125,7 @@
       </w:pPr>
     </w:lvl>
   </w:abstractNum>
-  <w:abstractNum w:abstractNumId="135" w15:restartNumberingAfterBreak="0">
+  <w:abstractNum w:abstractNumId="136" w15:restartNumberingAfterBreak="0">
     <w:nsid w:val="5D9E49FD"/>
     <w:multiLevelType w:val="hybridMultilevel"/>
     <w:tmpl w:val="4EE40BB4"/>
@@ -31058,7 +32237,7 @@
       </w:rPr>
     </w:lvl>
   </w:abstractNum>
-  <w:abstractNum w:abstractNumId="136" w15:restartNumberingAfterBreak="0">
+  <w:abstractNum w:abstractNumId="137" w15:restartNumberingAfterBreak="0">
     <w:nsid w:val="5DB7107D"/>
     <w:multiLevelType w:val="multilevel"/>
     <w:tmpl w:val="6520107A"/>
@@ -31207,7 +32386,7 @@
       </w:rPr>
     </w:lvl>
   </w:abstractNum>
-  <w:abstractNum w:abstractNumId="137" w15:restartNumberingAfterBreak="0">
+  <w:abstractNum w:abstractNumId="138" w15:restartNumberingAfterBreak="0">
     <w:nsid w:val="60421322"/>
     <w:multiLevelType w:val="hybridMultilevel"/>
     <w:tmpl w:val="447CDBDC"/>
@@ -31319,7 +32498,7 @@
       </w:rPr>
     </w:lvl>
   </w:abstractNum>
-  <w:abstractNum w:abstractNumId="138" w15:restartNumberingAfterBreak="0">
+  <w:abstractNum w:abstractNumId="139" w15:restartNumberingAfterBreak="0">
     <w:nsid w:val="60B43772"/>
     <w:multiLevelType w:val="hybridMultilevel"/>
     <w:tmpl w:val="04FC7310"/>
@@ -31433,7 +32612,7 @@
       </w:rPr>
     </w:lvl>
   </w:abstractNum>
-  <w:abstractNum w:abstractNumId="139" w15:restartNumberingAfterBreak="0">
+  <w:abstractNum w:abstractNumId="140" w15:restartNumberingAfterBreak="0">
     <w:nsid w:val="61926C31"/>
     <w:multiLevelType w:val="hybridMultilevel"/>
     <w:tmpl w:val="AFD27E5C"/>
@@ -31546,7 +32725,7 @@
       </w:rPr>
     </w:lvl>
   </w:abstractNum>
-  <w:abstractNum w:abstractNumId="140" w15:restartNumberingAfterBreak="0">
+  <w:abstractNum w:abstractNumId="141" w15:restartNumberingAfterBreak="0">
     <w:nsid w:val="622F5FC7"/>
     <w:multiLevelType w:val="hybridMultilevel"/>
     <w:tmpl w:val="49A6C2A6"/>
@@ -31659,7 +32838,7 @@
       </w:rPr>
     </w:lvl>
   </w:abstractNum>
-  <w:abstractNum w:abstractNumId="141" w15:restartNumberingAfterBreak="0">
+  <w:abstractNum w:abstractNumId="142" w15:restartNumberingAfterBreak="0">
     <w:nsid w:val="623A0E20"/>
     <w:multiLevelType w:val="hybridMultilevel"/>
     <w:tmpl w:val="3E360542"/>
@@ -31772,7 +32951,7 @@
       </w:rPr>
     </w:lvl>
   </w:abstractNum>
-  <w:abstractNum w:abstractNumId="142" w15:restartNumberingAfterBreak="0">
+  <w:abstractNum w:abstractNumId="143" w15:restartNumberingAfterBreak="0">
     <w:nsid w:val="62AC33B4"/>
     <w:multiLevelType w:val="multilevel"/>
     <w:tmpl w:val="A074F3CA"/>
@@ -31921,7 +33100,7 @@
       </w:rPr>
     </w:lvl>
   </w:abstractNum>
-  <w:abstractNum w:abstractNumId="143" w15:restartNumberingAfterBreak="0">
+  <w:abstractNum w:abstractNumId="144" w15:restartNumberingAfterBreak="0">
     <w:nsid w:val="63B44674"/>
     <w:multiLevelType w:val="multilevel"/>
     <w:tmpl w:val="08F4FA9A"/>
@@ -32070,7 +33249,7 @@
       </w:rPr>
     </w:lvl>
   </w:abstractNum>
-  <w:abstractNum w:abstractNumId="144" w15:restartNumberingAfterBreak="0">
+  <w:abstractNum w:abstractNumId="145" w15:restartNumberingAfterBreak="0">
     <w:nsid w:val="63C245D4"/>
     <w:multiLevelType w:val="hybridMultilevel"/>
     <w:tmpl w:val="E1563A56"/>
@@ -32182,7 +33361,7 @@
       </w:rPr>
     </w:lvl>
   </w:abstractNum>
-  <w:abstractNum w:abstractNumId="145" w15:restartNumberingAfterBreak="0">
+  <w:abstractNum w:abstractNumId="146" w15:restartNumberingAfterBreak="0">
     <w:nsid w:val="645F5F11"/>
     <w:multiLevelType w:val="hybridMultilevel"/>
     <w:tmpl w:val="D3423512"/>
@@ -32295,7 +33474,7 @@
       </w:rPr>
     </w:lvl>
   </w:abstractNum>
-  <w:abstractNum w:abstractNumId="146" w15:restartNumberingAfterBreak="0">
+  <w:abstractNum w:abstractNumId="147" w15:restartNumberingAfterBreak="0">
     <w:nsid w:val="64F30198"/>
     <w:multiLevelType w:val="multilevel"/>
     <w:tmpl w:val="63F4E6F0"/>
@@ -32444,7 +33623,7 @@
       </w:rPr>
     </w:lvl>
   </w:abstractNum>
-  <w:abstractNum w:abstractNumId="147" w15:restartNumberingAfterBreak="0">
+  <w:abstractNum w:abstractNumId="148" w15:restartNumberingAfterBreak="0">
     <w:nsid w:val="65AF2502"/>
     <w:multiLevelType w:val="hybridMultilevel"/>
     <w:tmpl w:val="FB2A44D8"/>
@@ -32557,7 +33736,7 @@
       </w:rPr>
     </w:lvl>
   </w:abstractNum>
-  <w:abstractNum w:abstractNumId="148" w15:restartNumberingAfterBreak="0">
+  <w:abstractNum w:abstractNumId="149" w15:restartNumberingAfterBreak="0">
     <w:nsid w:val="65E53C08"/>
     <w:multiLevelType w:val="hybridMultilevel"/>
     <w:tmpl w:val="8A44FBE2"/>
@@ -32670,7 +33849,7 @@
       </w:rPr>
     </w:lvl>
   </w:abstractNum>
-  <w:abstractNum w:abstractNumId="149" w15:restartNumberingAfterBreak="0">
+  <w:abstractNum w:abstractNumId="150" w15:restartNumberingAfterBreak="0">
     <w:nsid w:val="671614F0"/>
     <w:multiLevelType w:val="multilevel"/>
     <w:tmpl w:val="63F4E6F0"/>
@@ -32819,7 +33998,7 @@
       </w:rPr>
     </w:lvl>
   </w:abstractNum>
-  <w:abstractNum w:abstractNumId="150" w15:restartNumberingAfterBreak="0">
+  <w:abstractNum w:abstractNumId="151" w15:restartNumberingAfterBreak="0">
     <w:nsid w:val="6859691D"/>
     <w:multiLevelType w:val="multilevel"/>
     <w:tmpl w:val="826A9D48"/>
@@ -32968,7 +34147,7 @@
       </w:rPr>
     </w:lvl>
   </w:abstractNum>
-  <w:abstractNum w:abstractNumId="151" w15:restartNumberingAfterBreak="0">
+  <w:abstractNum w:abstractNumId="152" w15:restartNumberingAfterBreak="0">
     <w:nsid w:val="68817757"/>
     <w:multiLevelType w:val="multilevel"/>
     <w:tmpl w:val="34EE1968"/>
@@ -33117,7 +34296,7 @@
       </w:rPr>
     </w:lvl>
   </w:abstractNum>
-  <w:abstractNum w:abstractNumId="152" w15:restartNumberingAfterBreak="0">
+  <w:abstractNum w:abstractNumId="153" w15:restartNumberingAfterBreak="0">
     <w:nsid w:val="68BE10E8"/>
     <w:multiLevelType w:val="hybridMultilevel"/>
     <w:tmpl w:val="326CD592"/>
@@ -33230,7 +34409,7 @@
       </w:rPr>
     </w:lvl>
   </w:abstractNum>
-  <w:abstractNum w:abstractNumId="153" w15:restartNumberingAfterBreak="0">
+  <w:abstractNum w:abstractNumId="154" w15:restartNumberingAfterBreak="0">
     <w:nsid w:val="69996D9A"/>
     <w:multiLevelType w:val="multilevel"/>
     <w:tmpl w:val="1780FC38"/>
@@ -33379,7 +34558,7 @@
       </w:rPr>
     </w:lvl>
   </w:abstractNum>
-  <w:abstractNum w:abstractNumId="154" w15:restartNumberingAfterBreak="0">
+  <w:abstractNum w:abstractNumId="155" w15:restartNumberingAfterBreak="0">
     <w:nsid w:val="6B3C30B9"/>
     <w:multiLevelType w:val="hybridMultilevel"/>
     <w:tmpl w:val="C938F8DE"/>
@@ -33491,7 +34670,7 @@
       </w:rPr>
     </w:lvl>
   </w:abstractNum>
-  <w:abstractNum w:abstractNumId="155" w15:restartNumberingAfterBreak="0">
+  <w:abstractNum w:abstractNumId="156" w15:restartNumberingAfterBreak="0">
     <w:nsid w:val="6D1511A0"/>
     <w:multiLevelType w:val="hybridMultilevel"/>
     <w:tmpl w:val="AAD8B9B4"/>
@@ -33603,7 +34782,7 @@
       </w:rPr>
     </w:lvl>
   </w:abstractNum>
-  <w:abstractNum w:abstractNumId="156" w15:restartNumberingAfterBreak="0">
+  <w:abstractNum w:abstractNumId="157" w15:restartNumberingAfterBreak="0">
     <w:nsid w:val="6DD255F1"/>
     <w:multiLevelType w:val="hybridMultilevel"/>
     <w:tmpl w:val="ACBC1404"/>
@@ -33716,7 +34895,7 @@
       </w:rPr>
     </w:lvl>
   </w:abstractNum>
-  <w:abstractNum w:abstractNumId="157" w15:restartNumberingAfterBreak="0">
+  <w:abstractNum w:abstractNumId="158" w15:restartNumberingAfterBreak="0">
     <w:nsid w:val="6DDB4404"/>
     <w:multiLevelType w:val="hybridMultilevel"/>
     <w:tmpl w:val="06428E32"/>
@@ -33829,7 +35008,7 @@
       </w:rPr>
     </w:lvl>
   </w:abstractNum>
-  <w:abstractNum w:abstractNumId="158" w15:restartNumberingAfterBreak="0">
+  <w:abstractNum w:abstractNumId="159" w15:restartNumberingAfterBreak="0">
     <w:nsid w:val="6EE2159D"/>
     <w:multiLevelType w:val="hybridMultilevel"/>
     <w:tmpl w:val="36C69320"/>
@@ -33942,7 +35121,7 @@
       </w:rPr>
     </w:lvl>
   </w:abstractNum>
-  <w:abstractNum w:abstractNumId="159" w15:restartNumberingAfterBreak="0">
+  <w:abstractNum w:abstractNumId="160" w15:restartNumberingAfterBreak="0">
     <w:nsid w:val="6F014B3B"/>
     <w:multiLevelType w:val="hybridMultilevel"/>
     <w:tmpl w:val="C89A39BE"/>
@@ -34054,7 +35233,7 @@
       </w:rPr>
     </w:lvl>
   </w:abstractNum>
-  <w:abstractNum w:abstractNumId="160" w15:restartNumberingAfterBreak="0">
+  <w:abstractNum w:abstractNumId="161" w15:restartNumberingAfterBreak="0">
     <w:nsid w:val="6F171273"/>
     <w:multiLevelType w:val="multilevel"/>
     <w:tmpl w:val="0240C564"/>
@@ -34203,7 +35382,7 @@
       </w:rPr>
     </w:lvl>
   </w:abstractNum>
-  <w:abstractNum w:abstractNumId="161" w15:restartNumberingAfterBreak="0">
+  <w:abstractNum w:abstractNumId="162" w15:restartNumberingAfterBreak="0">
     <w:nsid w:val="6FB82AAA"/>
     <w:multiLevelType w:val="multilevel"/>
     <w:tmpl w:val="FC46C7C0"/>
@@ -34352,7 +35531,7 @@
       </w:rPr>
     </w:lvl>
   </w:abstractNum>
-  <w:abstractNum w:abstractNumId="162" w15:restartNumberingAfterBreak="0">
+  <w:abstractNum w:abstractNumId="163" w15:restartNumberingAfterBreak="0">
     <w:nsid w:val="6FD46DCF"/>
     <w:multiLevelType w:val="hybridMultilevel"/>
     <w:tmpl w:val="EF5E6EC6"/>
@@ -34465,7 +35644,7 @@
       </w:rPr>
     </w:lvl>
   </w:abstractNum>
-  <w:abstractNum w:abstractNumId="163" w15:restartNumberingAfterBreak="0">
+  <w:abstractNum w:abstractNumId="164" w15:restartNumberingAfterBreak="0">
     <w:nsid w:val="70484E38"/>
     <w:multiLevelType w:val="multilevel"/>
     <w:tmpl w:val="22B26DD2"/>
@@ -34614,7 +35793,7 @@
       </w:rPr>
     </w:lvl>
   </w:abstractNum>
-  <w:abstractNum w:abstractNumId="164" w15:restartNumberingAfterBreak="0">
+  <w:abstractNum w:abstractNumId="165" w15:restartNumberingAfterBreak="0">
     <w:nsid w:val="70CB723E"/>
     <w:multiLevelType w:val="multilevel"/>
     <w:tmpl w:val="63F4E6F0"/>
@@ -34763,7 +35942,7 @@
       </w:rPr>
     </w:lvl>
   </w:abstractNum>
-  <w:abstractNum w:abstractNumId="165" w15:restartNumberingAfterBreak="0">
+  <w:abstractNum w:abstractNumId="166" w15:restartNumberingAfterBreak="0">
     <w:nsid w:val="71C028F7"/>
     <w:multiLevelType w:val="hybridMultilevel"/>
     <w:tmpl w:val="85104F0A"/>
@@ -34876,7 +36055,7 @@
       </w:rPr>
     </w:lvl>
   </w:abstractNum>
-  <w:abstractNum w:abstractNumId="166" w15:restartNumberingAfterBreak="0">
+  <w:abstractNum w:abstractNumId="167" w15:restartNumberingAfterBreak="0">
     <w:nsid w:val="71DB3F58"/>
     <w:multiLevelType w:val="multilevel"/>
     <w:tmpl w:val="63F4E6F0"/>
@@ -35025,7 +36204,7 @@
       </w:rPr>
     </w:lvl>
   </w:abstractNum>
-  <w:abstractNum w:abstractNumId="167" w15:restartNumberingAfterBreak="0">
+  <w:abstractNum w:abstractNumId="168" w15:restartNumberingAfterBreak="0">
     <w:nsid w:val="720D204A"/>
     <w:multiLevelType w:val="hybridMultilevel"/>
     <w:tmpl w:val="70D646D0"/>
@@ -35139,7 +36318,7 @@
       </w:rPr>
     </w:lvl>
   </w:abstractNum>
-  <w:abstractNum w:abstractNumId="168" w15:restartNumberingAfterBreak="0">
+  <w:abstractNum w:abstractNumId="169" w15:restartNumberingAfterBreak="0">
     <w:nsid w:val="72F31FF2"/>
     <w:multiLevelType w:val="hybridMultilevel"/>
     <w:tmpl w:val="5C2693A0"/>
@@ -35251,7 +36430,7 @@
       </w:rPr>
     </w:lvl>
   </w:abstractNum>
-  <w:abstractNum w:abstractNumId="169" w15:restartNumberingAfterBreak="0">
+  <w:abstractNum w:abstractNumId="170" w15:restartNumberingAfterBreak="0">
     <w:nsid w:val="73B82579"/>
     <w:multiLevelType w:val="hybridMultilevel"/>
     <w:tmpl w:val="B8E8229C"/>
@@ -35364,7 +36543,7 @@
       </w:rPr>
     </w:lvl>
   </w:abstractNum>
-  <w:abstractNum w:abstractNumId="170" w15:restartNumberingAfterBreak="0">
+  <w:abstractNum w:abstractNumId="171" w15:restartNumberingAfterBreak="0">
     <w:nsid w:val="74522E8F"/>
     <w:multiLevelType w:val="hybridMultilevel"/>
     <w:tmpl w:val="9B1C2096"/>
@@ -35477,7 +36656,7 @@
       </w:rPr>
     </w:lvl>
   </w:abstractNum>
-  <w:abstractNum w:abstractNumId="171" w15:restartNumberingAfterBreak="0">
+  <w:abstractNum w:abstractNumId="172" w15:restartNumberingAfterBreak="0">
     <w:nsid w:val="75B45140"/>
     <w:multiLevelType w:val="hybridMultilevel"/>
     <w:tmpl w:val="93F8F3C4"/>
@@ -35590,7 +36769,7 @@
       </w:rPr>
     </w:lvl>
   </w:abstractNum>
-  <w:abstractNum w:abstractNumId="172" w15:restartNumberingAfterBreak="0">
+  <w:abstractNum w:abstractNumId="173" w15:restartNumberingAfterBreak="0">
     <w:nsid w:val="76F60FFE"/>
     <w:multiLevelType w:val="multilevel"/>
     <w:tmpl w:val="63F4E6F0"/>
@@ -35739,7 +36918,7 @@
       </w:rPr>
     </w:lvl>
   </w:abstractNum>
-  <w:abstractNum w:abstractNumId="173" w15:restartNumberingAfterBreak="0">
+  <w:abstractNum w:abstractNumId="174" w15:restartNumberingAfterBreak="0">
     <w:nsid w:val="77572323"/>
     <w:multiLevelType w:val="multilevel"/>
     <w:tmpl w:val="63F4E6F0"/>
@@ -35888,7 +37067,7 @@
       </w:rPr>
     </w:lvl>
   </w:abstractNum>
-  <w:abstractNum w:abstractNumId="174" w15:restartNumberingAfterBreak="0">
+  <w:abstractNum w:abstractNumId="175" w15:restartNumberingAfterBreak="0">
     <w:nsid w:val="77B8201F"/>
     <w:multiLevelType w:val="hybridMultilevel"/>
     <w:tmpl w:val="D7160708"/>
@@ -36000,7 +37179,7 @@
       </w:rPr>
     </w:lvl>
   </w:abstractNum>
-  <w:abstractNum w:abstractNumId="175" w15:restartNumberingAfterBreak="0">
+  <w:abstractNum w:abstractNumId="176" w15:restartNumberingAfterBreak="0">
     <w:nsid w:val="79796FF9"/>
     <w:multiLevelType w:val="hybridMultilevel"/>
     <w:tmpl w:val="CFA8EF82"/>
@@ -36112,7 +37291,7 @@
       </w:rPr>
     </w:lvl>
   </w:abstractNum>
-  <w:abstractNum w:abstractNumId="176" w15:restartNumberingAfterBreak="0">
+  <w:abstractNum w:abstractNumId="177" w15:restartNumberingAfterBreak="0">
     <w:nsid w:val="79910410"/>
     <w:multiLevelType w:val="hybridMultilevel"/>
     <w:tmpl w:val="FC923542"/>
@@ -36224,7 +37403,7 @@
       </w:rPr>
     </w:lvl>
   </w:abstractNum>
-  <w:abstractNum w:abstractNumId="177" w15:restartNumberingAfterBreak="0">
+  <w:abstractNum w:abstractNumId="178" w15:restartNumberingAfterBreak="0">
     <w:nsid w:val="7AD51679"/>
     <w:multiLevelType w:val="hybridMultilevel"/>
     <w:tmpl w:val="C13E19C2"/>
@@ -36337,7 +37516,7 @@
       </w:rPr>
     </w:lvl>
   </w:abstractNum>
-  <w:abstractNum w:abstractNumId="178" w15:restartNumberingAfterBreak="0">
+  <w:abstractNum w:abstractNumId="179" w15:restartNumberingAfterBreak="0">
     <w:nsid w:val="7AFF575A"/>
     <w:multiLevelType w:val="hybridMultilevel"/>
     <w:tmpl w:val="A6323D3E"/>
@@ -36449,7 +37628,7 @@
       </w:rPr>
     </w:lvl>
   </w:abstractNum>
-  <w:abstractNum w:abstractNumId="179" w15:restartNumberingAfterBreak="0">
+  <w:abstractNum w:abstractNumId="180" w15:restartNumberingAfterBreak="0">
     <w:nsid w:val="7B4018BF"/>
     <w:multiLevelType w:val="multilevel"/>
     <w:tmpl w:val="63F4E6F0"/>
@@ -36598,7 +37777,7 @@
       </w:rPr>
     </w:lvl>
   </w:abstractNum>
-  <w:abstractNum w:abstractNumId="180" w15:restartNumberingAfterBreak="0">
+  <w:abstractNum w:abstractNumId="181" w15:restartNumberingAfterBreak="0">
     <w:nsid w:val="7B4D1B33"/>
     <w:multiLevelType w:val="hybridMultilevel"/>
     <w:tmpl w:val="5EAC717E"/>
@@ -36710,7 +37889,7 @@
       </w:rPr>
     </w:lvl>
   </w:abstractNum>
-  <w:abstractNum w:abstractNumId="181" w15:restartNumberingAfterBreak="0">
+  <w:abstractNum w:abstractNumId="182" w15:restartNumberingAfterBreak="0">
     <w:nsid w:val="7C437108"/>
     <w:multiLevelType w:val="hybridMultilevel"/>
     <w:tmpl w:val="3222D0E8"/>
@@ -36823,7 +38002,7 @@
       </w:rPr>
     </w:lvl>
   </w:abstractNum>
-  <w:abstractNum w:abstractNumId="182" w15:restartNumberingAfterBreak="0">
+  <w:abstractNum w:abstractNumId="183" w15:restartNumberingAfterBreak="0">
     <w:nsid w:val="7CAC27CD"/>
     <w:multiLevelType w:val="multilevel"/>
     <w:tmpl w:val="3BC20E58"/>
@@ -36972,7 +38151,7 @@
       </w:rPr>
     </w:lvl>
   </w:abstractNum>
-  <w:abstractNum w:abstractNumId="183" w15:restartNumberingAfterBreak="0">
+  <w:abstractNum w:abstractNumId="184" w15:restartNumberingAfterBreak="0">
     <w:nsid w:val="7DBE326E"/>
     <w:multiLevelType w:val="hybridMultilevel"/>
     <w:tmpl w:val="AFC0D8D6"/>
@@ -37085,7 +38264,7 @@
       </w:rPr>
     </w:lvl>
   </w:abstractNum>
-  <w:abstractNum w:abstractNumId="184" w15:restartNumberingAfterBreak="0">
+  <w:abstractNum w:abstractNumId="185" w15:restartNumberingAfterBreak="0">
     <w:nsid w:val="7E5978EA"/>
     <w:multiLevelType w:val="hybridMultilevel"/>
     <w:tmpl w:val="D74C0DB0"/>
@@ -37197,7 +38376,7 @@
       </w:rPr>
     </w:lvl>
   </w:abstractNum>
-  <w:abstractNum w:abstractNumId="185" w15:restartNumberingAfterBreak="0">
+  <w:abstractNum w:abstractNumId="186" w15:restartNumberingAfterBreak="0">
     <w:nsid w:val="7F106A5D"/>
     <w:multiLevelType w:val="hybridMultilevel"/>
     <w:tmpl w:val="A1CA4816"/>
@@ -37309,7 +38488,7 @@
       </w:rPr>
     </w:lvl>
   </w:abstractNum>
-  <w:abstractNum w:abstractNumId="186" w15:restartNumberingAfterBreak="0">
+  <w:abstractNum w:abstractNumId="187" w15:restartNumberingAfterBreak="0">
     <w:nsid w:val="7FD679F5"/>
     <w:multiLevelType w:val="hybridMultilevel"/>
     <w:tmpl w:val="1ED417E8"/>
@@ -37423,7 +38602,7 @@
     </w:lvl>
   </w:abstractNum>
   <w:num w:numId="1" w16cid:durableId="1882476756">
-    <w:abstractNumId w:val="103"/>
+    <w:abstractNumId w:val="104"/>
   </w:num>
   <w:num w:numId="2" w16cid:durableId="871453468">
     <w:abstractNumId w:val="27"/>
@@ -37432,43 +38611,43 @@
     <w:abstractNumId w:val="43"/>
   </w:num>
   <w:num w:numId="4" w16cid:durableId="1105467722">
-    <w:abstractNumId w:val="84"/>
+    <w:abstractNumId w:val="85"/>
   </w:num>
   <w:num w:numId="5" w16cid:durableId="769932622">
-    <w:abstractNumId w:val="123"/>
+    <w:abstractNumId w:val="124"/>
   </w:num>
   <w:num w:numId="6" w16cid:durableId="575944109">
     <w:abstractNumId w:val="47"/>
   </w:num>
   <w:num w:numId="7" w16cid:durableId="877661689">
-    <w:abstractNumId w:val="163"/>
+    <w:abstractNumId w:val="164"/>
   </w:num>
   <w:num w:numId="8" w16cid:durableId="1390107422">
-    <w:abstractNumId w:val="90"/>
+    <w:abstractNumId w:val="91"/>
   </w:num>
   <w:num w:numId="9" w16cid:durableId="881866424">
-    <w:abstractNumId w:val="120"/>
+    <w:abstractNumId w:val="121"/>
   </w:num>
   <w:num w:numId="10" w16cid:durableId="1037244995">
-    <w:abstractNumId w:val="153"/>
+    <w:abstractNumId w:val="154"/>
   </w:num>
   <w:num w:numId="11" w16cid:durableId="1575554597">
     <w:abstractNumId w:val="72"/>
   </w:num>
   <w:num w:numId="12" w16cid:durableId="915364478">
-    <w:abstractNumId w:val="99"/>
+    <w:abstractNumId w:val="100"/>
   </w:num>
   <w:num w:numId="13" w16cid:durableId="1386294114">
-    <w:abstractNumId w:val="143"/>
+    <w:abstractNumId w:val="144"/>
   </w:num>
   <w:num w:numId="14" w16cid:durableId="1071851223">
     <w:abstractNumId w:val="29"/>
   </w:num>
   <w:num w:numId="15" w16cid:durableId="1545557520">
-    <w:abstractNumId w:val="85"/>
+    <w:abstractNumId w:val="86"/>
   </w:num>
   <w:num w:numId="16" w16cid:durableId="1102919547">
-    <w:abstractNumId w:val="182"/>
+    <w:abstractNumId w:val="183"/>
   </w:num>
   <w:num w:numId="17" w16cid:durableId="294526838">
     <w:abstractNumId w:val="59"/>
@@ -37477,7 +38656,7 @@
     <w:abstractNumId w:val="69"/>
   </w:num>
   <w:num w:numId="19" w16cid:durableId="2119449470">
-    <w:abstractNumId w:val="116"/>
+    <w:abstractNumId w:val="117"/>
   </w:num>
   <w:num w:numId="20" w16cid:durableId="1365054799">
     <w:abstractNumId w:val="15"/>
@@ -37486,19 +38665,19 @@
     <w:abstractNumId w:val="70"/>
   </w:num>
   <w:num w:numId="22" w16cid:durableId="1080098953">
-    <w:abstractNumId w:val="150"/>
+    <w:abstractNumId w:val="151"/>
   </w:num>
   <w:num w:numId="23" w16cid:durableId="1635717296">
     <w:abstractNumId w:val="77"/>
   </w:num>
   <w:num w:numId="24" w16cid:durableId="544873123">
-    <w:abstractNumId w:val="142"/>
+    <w:abstractNumId w:val="143"/>
   </w:num>
   <w:num w:numId="25" w16cid:durableId="1128352778">
     <w:abstractNumId w:val="14"/>
   </w:num>
   <w:num w:numId="26" w16cid:durableId="1732537407">
-    <w:abstractNumId w:val="157"/>
+    <w:abstractNumId w:val="158"/>
   </w:num>
   <w:num w:numId="27" w16cid:durableId="945502064">
     <w:abstractNumId w:val="8"/>
@@ -37510,7 +38689,7 @@
     <w:abstractNumId w:val="68"/>
   </w:num>
   <w:num w:numId="30" w16cid:durableId="1500659483">
-    <w:abstractNumId w:val="95"/>
+    <w:abstractNumId w:val="96"/>
   </w:num>
   <w:num w:numId="31" w16cid:durableId="118301211">
     <w:abstractNumId w:val="17"/>
@@ -37525,43 +38704,43 @@
     <w:abstractNumId w:val="54"/>
   </w:num>
   <w:num w:numId="35" w16cid:durableId="356852923">
-    <w:abstractNumId w:val="115"/>
+    <w:abstractNumId w:val="116"/>
   </w:num>
   <w:num w:numId="36" w16cid:durableId="430662559">
     <w:abstractNumId w:val="23"/>
   </w:num>
   <w:num w:numId="37" w16cid:durableId="247080868">
-    <w:abstractNumId w:val="171"/>
+    <w:abstractNumId w:val="172"/>
   </w:num>
   <w:num w:numId="38" w16cid:durableId="158887408">
-    <w:abstractNumId w:val="139"/>
+    <w:abstractNumId w:val="140"/>
   </w:num>
   <w:num w:numId="39" w16cid:durableId="1681347932">
-    <w:abstractNumId w:val="162"/>
+    <w:abstractNumId w:val="163"/>
   </w:num>
   <w:num w:numId="40" w16cid:durableId="2101440158">
-    <w:abstractNumId w:val="88"/>
+    <w:abstractNumId w:val="89"/>
   </w:num>
   <w:num w:numId="41" w16cid:durableId="1250391122">
-    <w:abstractNumId w:val="134"/>
+    <w:abstractNumId w:val="135"/>
   </w:num>
   <w:num w:numId="42" w16cid:durableId="479083359">
-    <w:abstractNumId w:val="168"/>
+    <w:abstractNumId w:val="169"/>
   </w:num>
   <w:num w:numId="43" w16cid:durableId="1557860317">
-    <w:abstractNumId w:val="117"/>
+    <w:abstractNumId w:val="118"/>
   </w:num>
   <w:num w:numId="44" w16cid:durableId="2142183763">
     <w:abstractNumId w:val="10"/>
   </w:num>
   <w:num w:numId="45" w16cid:durableId="1357736349">
+    <w:abstractNumId w:val="177"/>
+  </w:num>
+  <w:num w:numId="46" w16cid:durableId="1519656040">
     <w:abstractNumId w:val="176"/>
   </w:num>
-  <w:num w:numId="46" w16cid:durableId="1519656040">
-    <w:abstractNumId w:val="175"/>
-  </w:num>
   <w:num w:numId="47" w16cid:durableId="1078596852">
-    <w:abstractNumId w:val="185"/>
+    <w:abstractNumId w:val="186"/>
   </w:num>
   <w:num w:numId="48" w16cid:durableId="1027950100">
     <w:abstractNumId w:val="40"/>
@@ -37573,19 +38752,19 @@
     <w:abstractNumId w:val="78"/>
   </w:num>
   <w:num w:numId="51" w16cid:durableId="1128354320">
-    <w:abstractNumId w:val="155"/>
+    <w:abstractNumId w:val="156"/>
   </w:num>
   <w:num w:numId="52" w16cid:durableId="248543928">
-    <w:abstractNumId w:val="87"/>
+    <w:abstractNumId w:val="88"/>
   </w:num>
   <w:num w:numId="53" w16cid:durableId="965889214">
-    <w:abstractNumId w:val="121"/>
+    <w:abstractNumId w:val="122"/>
   </w:num>
   <w:num w:numId="54" w16cid:durableId="1827503240">
-    <w:abstractNumId w:val="132"/>
+    <w:abstractNumId w:val="133"/>
   </w:num>
   <w:num w:numId="55" w16cid:durableId="505748256">
-    <w:abstractNumId w:val="109"/>
+    <w:abstractNumId w:val="110"/>
   </w:num>
   <w:num w:numId="56" w16cid:durableId="2120370925">
     <w:abstractNumId w:val="37"/>
@@ -37594,52 +38773,52 @@
     <w:abstractNumId w:val="18"/>
   </w:num>
   <w:num w:numId="58" w16cid:durableId="1000235123">
-    <w:abstractNumId w:val="118"/>
+    <w:abstractNumId w:val="119"/>
   </w:num>
   <w:num w:numId="59" w16cid:durableId="628516409">
-    <w:abstractNumId w:val="154"/>
+    <w:abstractNumId w:val="155"/>
   </w:num>
   <w:num w:numId="60" w16cid:durableId="2028865444">
-    <w:abstractNumId w:val="105"/>
+    <w:abstractNumId w:val="106"/>
   </w:num>
   <w:num w:numId="61" w16cid:durableId="943926811">
-    <w:abstractNumId w:val="180"/>
+    <w:abstractNumId w:val="181"/>
   </w:num>
   <w:num w:numId="62" w16cid:durableId="1841193257">
-    <w:abstractNumId w:val="80"/>
+    <w:abstractNumId w:val="81"/>
   </w:num>
   <w:num w:numId="63" w16cid:durableId="682322850">
-    <w:abstractNumId w:val="159"/>
+    <w:abstractNumId w:val="160"/>
   </w:num>
   <w:num w:numId="64" w16cid:durableId="2043705333">
-    <w:abstractNumId w:val="81"/>
+    <w:abstractNumId w:val="82"/>
   </w:num>
   <w:num w:numId="65" w16cid:durableId="1164854761">
     <w:abstractNumId w:val="58"/>
   </w:num>
   <w:num w:numId="66" w16cid:durableId="1919972541">
-    <w:abstractNumId w:val="101"/>
+    <w:abstractNumId w:val="102"/>
   </w:num>
   <w:num w:numId="67" w16cid:durableId="463617329">
     <w:abstractNumId w:val="62"/>
   </w:num>
   <w:num w:numId="68" w16cid:durableId="2064014330">
-    <w:abstractNumId w:val="126"/>
+    <w:abstractNumId w:val="127"/>
   </w:num>
   <w:num w:numId="69" w16cid:durableId="452797354">
-    <w:abstractNumId w:val="133"/>
+    <w:abstractNumId w:val="134"/>
   </w:num>
   <w:num w:numId="70" w16cid:durableId="1196650037">
     <w:abstractNumId w:val="52"/>
   </w:num>
   <w:num w:numId="71" w16cid:durableId="940071828">
-    <w:abstractNumId w:val="174"/>
+    <w:abstractNumId w:val="175"/>
   </w:num>
   <w:num w:numId="72" w16cid:durableId="1608273926">
-    <w:abstractNumId w:val="83"/>
+    <w:abstractNumId w:val="84"/>
   </w:num>
   <w:num w:numId="73" w16cid:durableId="2009864772">
-    <w:abstractNumId w:val="102"/>
+    <w:abstractNumId w:val="103"/>
   </w:num>
   <w:num w:numId="74" w16cid:durableId="712267004">
     <w:abstractNumId w:val="39"/>
@@ -37648,7 +38827,7 @@
     <w:abstractNumId w:val="34"/>
   </w:num>
   <w:num w:numId="76" w16cid:durableId="286202349">
-    <w:abstractNumId w:val="137"/>
+    <w:abstractNumId w:val="138"/>
   </w:num>
   <w:num w:numId="77" w16cid:durableId="156460757">
     <w:abstractNumId w:val="73"/>
@@ -37663,7 +38842,7 @@
     <w:abstractNumId w:val="38"/>
   </w:num>
   <w:num w:numId="81" w16cid:durableId="1672175260">
-    <w:abstractNumId w:val="97"/>
+    <w:abstractNumId w:val="98"/>
   </w:num>
   <w:num w:numId="82" w16cid:durableId="1954820163">
     <w:abstractNumId w:val="61"/>
@@ -37672,7 +38851,7 @@
     <w:abstractNumId w:val="25"/>
   </w:num>
   <w:num w:numId="84" w16cid:durableId="366876741">
-    <w:abstractNumId w:val="104"/>
+    <w:abstractNumId w:val="105"/>
   </w:num>
   <w:num w:numId="85" w16cid:durableId="15274915">
     <w:abstractNumId w:val="41"/>
@@ -37681,22 +38860,22 @@
     <w:abstractNumId w:val="11"/>
   </w:num>
   <w:num w:numId="87" w16cid:durableId="591351385">
-    <w:abstractNumId w:val="122"/>
+    <w:abstractNumId w:val="123"/>
   </w:num>
   <w:num w:numId="88" w16cid:durableId="1361005725">
-    <w:abstractNumId w:val="178"/>
+    <w:abstractNumId w:val="179"/>
   </w:num>
   <w:num w:numId="89" w16cid:durableId="219681743">
     <w:abstractNumId w:val="12"/>
   </w:num>
   <w:num w:numId="90" w16cid:durableId="194386594">
-    <w:abstractNumId w:val="135"/>
+    <w:abstractNumId w:val="136"/>
   </w:num>
   <w:num w:numId="91" w16cid:durableId="777793346">
-    <w:abstractNumId w:val="93"/>
+    <w:abstractNumId w:val="94"/>
   </w:num>
   <w:num w:numId="92" w16cid:durableId="173346871">
-    <w:abstractNumId w:val="100"/>
+    <w:abstractNumId w:val="101"/>
   </w:num>
   <w:num w:numId="93" w16cid:durableId="948700467">
     <w:abstractNumId w:val="42"/>
@@ -37708,7 +38887,7 @@
     <w:abstractNumId w:val="74"/>
   </w:num>
   <w:num w:numId="96" w16cid:durableId="694119229">
-    <w:abstractNumId w:val="98"/>
+    <w:abstractNumId w:val="99"/>
   </w:num>
   <w:num w:numId="97" w16cid:durableId="704327987">
     <w:abstractNumId w:val="56"/>
@@ -37717,28 +38896,28 @@
     <w:abstractNumId w:val="26"/>
   </w:num>
   <w:num w:numId="99" w16cid:durableId="1706099794">
-    <w:abstractNumId w:val="161"/>
+    <w:abstractNumId w:val="162"/>
   </w:num>
   <w:num w:numId="100" w16cid:durableId="256404901">
-    <w:abstractNumId w:val="160"/>
+    <w:abstractNumId w:val="161"/>
   </w:num>
   <w:num w:numId="101" w16cid:durableId="924923012">
     <w:abstractNumId w:val="32"/>
   </w:num>
   <w:num w:numId="102" w16cid:durableId="536550966">
-    <w:abstractNumId w:val="179"/>
+    <w:abstractNumId w:val="180"/>
   </w:num>
   <w:num w:numId="103" w16cid:durableId="425157302">
     <w:abstractNumId w:val="75"/>
   </w:num>
   <w:num w:numId="104" w16cid:durableId="967664612">
-    <w:abstractNumId w:val="146"/>
+    <w:abstractNumId w:val="147"/>
   </w:num>
   <w:num w:numId="105" w16cid:durableId="361631616">
-    <w:abstractNumId w:val="107"/>
+    <w:abstractNumId w:val="108"/>
   </w:num>
   <w:num w:numId="106" w16cid:durableId="443623616">
-    <w:abstractNumId w:val="151"/>
+    <w:abstractNumId w:val="152"/>
   </w:num>
   <w:num w:numId="107" w16cid:durableId="150101619">
     <w:abstractNumId w:val="13"/>
@@ -37750,28 +38929,28 @@
     <w:abstractNumId w:val="0"/>
   </w:num>
   <w:num w:numId="110" w16cid:durableId="712924661">
-    <w:abstractNumId w:val="130"/>
+    <w:abstractNumId w:val="131"/>
   </w:num>
   <w:num w:numId="111" w16cid:durableId="1917784113">
-    <w:abstractNumId w:val="124"/>
+    <w:abstractNumId w:val="125"/>
   </w:num>
   <w:num w:numId="112" w16cid:durableId="896237065">
-    <w:abstractNumId w:val="136"/>
+    <w:abstractNumId w:val="137"/>
   </w:num>
   <w:num w:numId="113" w16cid:durableId="1171681430">
-    <w:abstractNumId w:val="164"/>
+    <w:abstractNumId w:val="165"/>
   </w:num>
   <w:num w:numId="114" w16cid:durableId="1552573199">
-    <w:abstractNumId w:val="166"/>
+    <w:abstractNumId w:val="167"/>
   </w:num>
   <w:num w:numId="115" w16cid:durableId="1920869674">
-    <w:abstractNumId w:val="149"/>
+    <w:abstractNumId w:val="150"/>
   </w:num>
   <w:num w:numId="116" w16cid:durableId="476724716">
-    <w:abstractNumId w:val="111"/>
+    <w:abstractNumId w:val="112"/>
   </w:num>
   <w:num w:numId="117" w16cid:durableId="658919541">
-    <w:abstractNumId w:val="110"/>
+    <w:abstractNumId w:val="111"/>
   </w:num>
   <w:num w:numId="118" w16cid:durableId="1622418131">
     <w:abstractNumId w:val="49"/>
@@ -37780,7 +38959,7 @@
     <w:abstractNumId w:val="2"/>
   </w:num>
   <w:num w:numId="120" w16cid:durableId="396828229">
-    <w:abstractNumId w:val="173"/>
+    <w:abstractNumId w:val="174"/>
   </w:num>
   <w:num w:numId="121" w16cid:durableId="986058889">
     <w:abstractNumId w:val="21"/>
@@ -37789,10 +38968,10 @@
     <w:abstractNumId w:val="64"/>
   </w:num>
   <w:num w:numId="123" w16cid:durableId="1804040304">
-    <w:abstractNumId w:val="92"/>
+    <w:abstractNumId w:val="93"/>
   </w:num>
   <w:num w:numId="124" w16cid:durableId="114181197">
-    <w:abstractNumId w:val="172"/>
+    <w:abstractNumId w:val="173"/>
   </w:num>
   <w:num w:numId="125" w16cid:durableId="772671624">
     <w:abstractNumId w:val="5"/>
@@ -37810,16 +38989,16 @@
     <w:abstractNumId w:val="63"/>
   </w:num>
   <w:num w:numId="130" w16cid:durableId="1168907903">
-    <w:abstractNumId w:val="152"/>
+    <w:abstractNumId w:val="153"/>
   </w:num>
   <w:num w:numId="131" w16cid:durableId="430206235">
-    <w:abstractNumId w:val="140"/>
+    <w:abstractNumId w:val="141"/>
   </w:num>
   <w:num w:numId="132" w16cid:durableId="1207327089">
     <w:abstractNumId w:val="30"/>
   </w:num>
   <w:num w:numId="133" w16cid:durableId="596404292">
-    <w:abstractNumId w:val="127"/>
+    <w:abstractNumId w:val="128"/>
   </w:num>
   <w:num w:numId="134" w16cid:durableId="2070372549">
     <w:abstractNumId w:val="46"/>
@@ -37834,46 +39013,46 @@
     <w:abstractNumId w:val="79"/>
   </w:num>
   <w:num w:numId="138" w16cid:durableId="568660900">
-    <w:abstractNumId w:val="86"/>
+    <w:abstractNumId w:val="87"/>
   </w:num>
   <w:num w:numId="139" w16cid:durableId="967976864">
-    <w:abstractNumId w:val="128"/>
+    <w:abstractNumId w:val="129"/>
   </w:num>
   <w:num w:numId="140" w16cid:durableId="650643288">
-    <w:abstractNumId w:val="147"/>
+    <w:abstractNumId w:val="148"/>
   </w:num>
   <w:num w:numId="141" w16cid:durableId="219370247">
-    <w:abstractNumId w:val="144"/>
+    <w:abstractNumId w:val="145"/>
   </w:num>
   <w:num w:numId="142" w16cid:durableId="323239876">
-    <w:abstractNumId w:val="184"/>
+    <w:abstractNumId w:val="185"/>
   </w:num>
   <w:num w:numId="143" w16cid:durableId="1619793156">
     <w:abstractNumId w:val="36"/>
   </w:num>
   <w:num w:numId="144" w16cid:durableId="1186332867">
-    <w:abstractNumId w:val="156"/>
+    <w:abstractNumId w:val="157"/>
   </w:num>
   <w:num w:numId="145" w16cid:durableId="89937035">
     <w:abstractNumId w:val="57"/>
   </w:num>
   <w:num w:numId="146" w16cid:durableId="542210424">
-    <w:abstractNumId w:val="82"/>
+    <w:abstractNumId w:val="83"/>
   </w:num>
   <w:num w:numId="147" w16cid:durableId="1194659616">
     <w:abstractNumId w:val="7"/>
   </w:num>
   <w:num w:numId="148" w16cid:durableId="1544974653">
-    <w:abstractNumId w:val="169"/>
+    <w:abstractNumId w:val="170"/>
   </w:num>
   <w:num w:numId="149" w16cid:durableId="1664625526">
     <w:abstractNumId w:val="66"/>
   </w:num>
   <w:num w:numId="150" w16cid:durableId="678197415">
-    <w:abstractNumId w:val="145"/>
+    <w:abstractNumId w:val="146"/>
   </w:num>
   <w:num w:numId="151" w16cid:durableId="1193106551">
-    <w:abstractNumId w:val="114"/>
+    <w:abstractNumId w:val="115"/>
   </w:num>
   <w:num w:numId="152" w16cid:durableId="1209760807">
     <w:abstractNumId w:val="65"/>
@@ -37882,19 +39061,19 @@
     <w:abstractNumId w:val="71"/>
   </w:num>
   <w:num w:numId="154" w16cid:durableId="2121295621">
-    <w:abstractNumId w:val="170"/>
+    <w:abstractNumId w:val="171"/>
   </w:num>
   <w:num w:numId="155" w16cid:durableId="292684904">
-    <w:abstractNumId w:val="89"/>
+    <w:abstractNumId w:val="90"/>
   </w:num>
   <w:num w:numId="156" w16cid:durableId="769400072">
-    <w:abstractNumId w:val="181"/>
+    <w:abstractNumId w:val="182"/>
   </w:num>
   <w:num w:numId="157" w16cid:durableId="1930693824">
-    <w:abstractNumId w:val="112"/>
+    <w:abstractNumId w:val="113"/>
   </w:num>
   <w:num w:numId="158" w16cid:durableId="813957946">
-    <w:abstractNumId w:val="165"/>
+    <w:abstractNumId w:val="166"/>
   </w:num>
   <w:num w:numId="159" w16cid:durableId="1782143679">
     <w:abstractNumId w:val="35"/>
@@ -37903,31 +39082,31 @@
     <w:abstractNumId w:val="31"/>
   </w:num>
   <w:num w:numId="161" w16cid:durableId="1052270864">
-    <w:abstractNumId w:val="141"/>
+    <w:abstractNumId w:val="142"/>
   </w:num>
   <w:num w:numId="162" w16cid:durableId="762337137">
-    <w:abstractNumId w:val="106"/>
+    <w:abstractNumId w:val="107"/>
   </w:num>
   <w:num w:numId="163" w16cid:durableId="1682507263">
-    <w:abstractNumId w:val="91"/>
+    <w:abstractNumId w:val="92"/>
   </w:num>
   <w:num w:numId="164" w16cid:durableId="871957078">
-    <w:abstractNumId w:val="125"/>
+    <w:abstractNumId w:val="126"/>
   </w:num>
   <w:num w:numId="165" w16cid:durableId="601960416">
-    <w:abstractNumId w:val="148"/>
+    <w:abstractNumId w:val="149"/>
   </w:num>
   <w:num w:numId="166" w16cid:durableId="574900497">
-    <w:abstractNumId w:val="138"/>
+    <w:abstractNumId w:val="139"/>
   </w:num>
   <w:num w:numId="167" w16cid:durableId="1477644837">
-    <w:abstractNumId w:val="96"/>
+    <w:abstractNumId w:val="97"/>
   </w:num>
   <w:num w:numId="168" w16cid:durableId="1618100933">
-    <w:abstractNumId w:val="167"/>
+    <w:abstractNumId w:val="168"/>
   </w:num>
   <w:num w:numId="169" w16cid:durableId="1266614374">
-    <w:abstractNumId w:val="177"/>
+    <w:abstractNumId w:val="178"/>
   </w:num>
   <w:num w:numId="170" w16cid:durableId="67534002">
     <w:abstractNumId w:val="1"/>
@@ -37936,31 +39115,31 @@
     <w:abstractNumId w:val="53"/>
   </w:num>
   <w:num w:numId="172" w16cid:durableId="827554792">
-    <w:abstractNumId w:val="108"/>
+    <w:abstractNumId w:val="109"/>
   </w:num>
   <w:num w:numId="173" w16cid:durableId="186605808">
     <w:abstractNumId w:val="28"/>
   </w:num>
   <w:num w:numId="174" w16cid:durableId="1000935913">
-    <w:abstractNumId w:val="129"/>
+    <w:abstractNumId w:val="130"/>
   </w:num>
   <w:num w:numId="175" w16cid:durableId="685984279">
     <w:abstractNumId w:val="45"/>
   </w:num>
   <w:num w:numId="176" w16cid:durableId="355473142">
-    <w:abstractNumId w:val="183"/>
+    <w:abstractNumId w:val="184"/>
   </w:num>
   <w:num w:numId="177" w16cid:durableId="1580820927">
     <w:abstractNumId w:val="4"/>
   </w:num>
   <w:num w:numId="178" w16cid:durableId="1342977237">
-    <w:abstractNumId w:val="186"/>
+    <w:abstractNumId w:val="187"/>
   </w:num>
   <w:num w:numId="179" w16cid:durableId="1610351964">
-    <w:abstractNumId w:val="94"/>
+    <w:abstractNumId w:val="95"/>
   </w:num>
   <w:num w:numId="180" w16cid:durableId="1808428282">
-    <w:abstractNumId w:val="119"/>
+    <w:abstractNumId w:val="120"/>
   </w:num>
   <w:num w:numId="181" w16cid:durableId="1853181086">
     <w:abstractNumId w:val="16"/>
@@ -37969,19 +39148,22 @@
     <w:abstractNumId w:val="76"/>
   </w:num>
   <w:num w:numId="183" w16cid:durableId="1707484209">
-    <w:abstractNumId w:val="158"/>
+    <w:abstractNumId w:val="159"/>
   </w:num>
   <w:num w:numId="184" w16cid:durableId="525101864">
     <w:abstractNumId w:val="67"/>
   </w:num>
   <w:num w:numId="185" w16cid:durableId="923611674">
-    <w:abstractNumId w:val="131"/>
+    <w:abstractNumId w:val="132"/>
   </w:num>
   <w:num w:numId="186" w16cid:durableId="379020453">
-    <w:abstractNumId w:val="113"/>
+    <w:abstractNumId w:val="114"/>
   </w:num>
   <w:num w:numId="187" w16cid:durableId="1417243495">
     <w:abstractNumId w:val="19"/>
+  </w:num>
+  <w:num w:numId="188" w16cid:durableId="662010916">
+    <w:abstractNumId w:val="80"/>
   </w:num>
 </w:numbering>
 </file>

</xml_diff>

<commit_message>
Security Architecture Design (#364) Authentication Architecture (#365) Authorization Architecture (#366) Data Protection Design (#367)
</commit_message>
<xml_diff>
--- a/Software Architecture Design.docx
+++ b/Software Architecture Design.docx
@@ -14984,19 +14984,503 @@
         <w:t>As a result of the validation, it has been found that long-lasting processes are delegated to background workers successfully without having negative impact on the performance of main reservation flow. Moreover, Redis cache decreased redundant queries to the database and improved the performance of frequently accessed resources.</w:t>
       </w:r>
     </w:p>
-    <w:p/>
+    <w:p>
+      <w:pPr>
+        <w:spacing w:line="278" w:lineRule="auto"/>
+        <w:rPr>
+          <w:rFonts w:asciiTheme="majorBidi" w:eastAsiaTheme="majorEastAsia" w:hAnsiTheme="majorBidi" w:cstheme="majorBidi"/>
+          <w:b/>
+          <w:color w:val="000000" w:themeColor="text1"/>
+          <w:sz w:val="28"/>
+          <w:szCs w:val="32"/>
+        </w:rPr>
+      </w:pPr>
+      <w:r>
+        <w:br w:type="page"/>
+      </w:r>
+    </w:p>
+    <w:p>
+      <w:pPr>
+        <w:pStyle w:val="Heading2"/>
+      </w:pPr>
+      <w:r>
+        <w:lastRenderedPageBreak/>
+        <w:t>Security Architecture Design</w:t>
+      </w:r>
+    </w:p>
+    <w:p>
+      <w:r>
+        <w:t>Security is an essential quality aspect of the KriGo system because the nature of the data being processed is highly confidential. It includes personal data of users, payments, reservations, and documents for agencies' identification. The security architecture is aimed at securing the confidentiality, integrity, and availability of system resources and guarantees that only authenticated and authorized users can use protected services.</w:t>
+      </w:r>
+      <w:r>
+        <w:t xml:space="preserve"> </w:t>
+      </w:r>
+      <w:r>
+        <w:t>The selected security model follows a principle of defense in depth, which implies the usage of several security measures simultaneously throughout all levels of architecture. Thus, there are mechanisms of authentication that check the identity of users, mechanisms of authorization that provide proper access rights, and data protection measures that ensure the security of data while transferring it, processing it, and storing it.</w:t>
+      </w:r>
+    </w:p>
     <w:p>
       <w:pPr>
         <w:pStyle w:val="Heading3"/>
       </w:pPr>
       <w:r>
+        <w:t>Authentication Architecture</w:t>
+      </w:r>
+    </w:p>
+    <w:p>
+      <w:r>
+        <w:t>The task of authentication consists of verifying the user identity before allowing access to system resources. The KriGo framework uses token-based authentication with the help of JSON Web Tokens (JWT). Thus, the client applications can authenticate without server-side sessions.</w:t>
+      </w:r>
+      <w:r>
+        <w:t xml:space="preserve"> </w:t>
+      </w:r>
+      <w:r>
+        <w:t>If the user's credentials are valid, the Authentication Service checks the account data, performs the comparison between the hashed password and the encrypted one, and creates a JWT with the identity and roles assigned to the user. This token is returned back to the client application and sent in the Authorization header of every following request.</w:t>
+      </w:r>
+      <w:r>
+        <w:t xml:space="preserve"> </w:t>
+      </w:r>
+      <w:r>
+        <w:t>All requests which require authentication are caught by the authentication middleware which checks the validity and expiration of the token and forwards the request to the corresponding business service only if the token is valid.</w:t>
+      </w:r>
+    </w:p>
+    <w:p>
+      <w:r>
+        <w:t>The benefits of this authentication process are the following:</w:t>
+      </w:r>
+    </w:p>
+    <w:p>
+      <w:pPr>
+        <w:pStyle w:val="ListParagraph"/>
+        <w:numPr>
+          <w:ilvl w:val="0"/>
+          <w:numId w:val="189"/>
+        </w:numPr>
+      </w:pPr>
+      <w:r>
+        <w:t>Stateless authentication.</w:t>
+      </w:r>
+    </w:p>
+    <w:p>
+      <w:pPr>
+        <w:pStyle w:val="ListParagraph"/>
+        <w:numPr>
+          <w:ilvl w:val="0"/>
+          <w:numId w:val="189"/>
+        </w:numPr>
+      </w:pPr>
+      <w:r>
+        <w:t>Secure password storage with bcrypt.</w:t>
+      </w:r>
+    </w:p>
+    <w:p>
+      <w:pPr>
+        <w:pStyle w:val="ListParagraph"/>
+        <w:numPr>
+          <w:ilvl w:val="0"/>
+          <w:numId w:val="189"/>
+        </w:numPr>
+      </w:pPr>
+      <w:r>
+        <w:t>JWT-based session management.</w:t>
+      </w:r>
+    </w:p>
+    <w:p>
+      <w:pPr>
+        <w:pStyle w:val="ListParagraph"/>
+        <w:numPr>
+          <w:ilvl w:val="0"/>
+          <w:numId w:val="189"/>
+        </w:numPr>
+      </w:pPr>
+      <w:r>
+        <w:t>Token expiration.</w:t>
+      </w:r>
+    </w:p>
+    <w:p>
+      <w:pPr>
+        <w:pStyle w:val="ListParagraph"/>
+        <w:numPr>
+          <w:ilvl w:val="0"/>
+          <w:numId w:val="189"/>
+        </w:numPr>
+      </w:pPr>
+      <w:r>
+        <w:t>Secure HTTPS communication.</w:t>
+      </w:r>
+    </w:p>
+    <w:p>
+      <w:pPr>
+        <w:pStyle w:val="ListParagraph"/>
+        <w:numPr>
+          <w:ilvl w:val="0"/>
+          <w:numId w:val="189"/>
+        </w:numPr>
+      </w:pPr>
+      <w:r>
+        <w:t>Password recovery and account verification.</w:t>
+      </w:r>
+    </w:p>
+    <w:p>
+      <w:pPr>
+        <w:pStyle w:val="Heading3"/>
+      </w:pPr>
+      <w:r>
+        <w:t>Authorizing Architecture</w:t>
+      </w:r>
+    </w:p>
+    <w:p>
+      <w:r>
+        <w:t>After the authentication phase, the system checks if the authenticated user has enough permissions to carry out the action. The authorization process employs the Role-Based Access Control (RBAC) model, whereby roles are assigned to each user.</w:t>
+      </w:r>
+      <w:r>
+        <w:t xml:space="preserve"> </w:t>
+      </w:r>
+      <w:r>
+        <w:t>Permissions are role-based instead of being assigned per user, making the task easier. In the process of processing requests, authorizers will check the JWT payload to see what roles have been assigned to the user and match the permissions with those of the requested resources.</w:t>
+      </w:r>
+    </w:p>
+    <w:p>
+      <w:r>
+        <w:t>Main roles in the system are:</w:t>
+      </w:r>
+    </w:p>
+    <w:tbl>
+      <w:tblPr>
+        <w:tblStyle w:val="PlainTable1"/>
+        <w:tblW w:w="0" w:type="auto"/>
+        <w:tblCellMar>
+          <w:top w:w="58" w:type="dxa"/>
+          <w:bottom w:w="58" w:type="dxa"/>
+        </w:tblCellMar>
+        <w:tblLook w:val="04A0" w:firstRow="1" w:lastRow="0" w:firstColumn="1" w:lastColumn="0" w:noHBand="0" w:noVBand="1"/>
+      </w:tblPr>
+      <w:tblGrid>
+        <w:gridCol w:w="2515"/>
+        <w:gridCol w:w="6660"/>
+      </w:tblGrid>
+      <w:tr>
+        <w:trPr>
+          <w:cnfStyle w:val="100000000000" w:firstRow="1" w:lastRow="0" w:firstColumn="0" w:lastColumn="0" w:oddVBand="0" w:evenVBand="0" w:oddHBand="0" w:evenHBand="0" w:firstRowFirstColumn="0" w:firstRowLastColumn="0" w:lastRowFirstColumn="0" w:lastRowLastColumn="0"/>
+        </w:trPr>
+        <w:tc>
+          <w:tcPr>
+            <w:cnfStyle w:val="001000000000" w:firstRow="0" w:lastRow="0" w:firstColumn="1" w:lastColumn="0" w:oddVBand="0" w:evenVBand="0" w:oddHBand="0" w:evenHBand="0" w:firstRowFirstColumn="0" w:firstRowLastColumn="0" w:lastRowFirstColumn="0" w:lastRowLastColumn="0"/>
+            <w:tcW w:w="2515" w:type="dxa"/>
+            <w:vAlign w:val="center"/>
+            <w:hideMark/>
+          </w:tcPr>
+          <w:p>
+            <w:r>
+              <w:t>Role</w:t>
+            </w:r>
+          </w:p>
+        </w:tc>
+        <w:tc>
+          <w:tcPr>
+            <w:tcW w:w="6660" w:type="dxa"/>
+            <w:vAlign w:val="center"/>
+            <w:hideMark/>
+          </w:tcPr>
+          <w:p>
+            <w:pPr>
+              <w:cnfStyle w:val="100000000000" w:firstRow="1" w:lastRow="0" w:firstColumn="0" w:lastColumn="0" w:oddVBand="0" w:evenVBand="0" w:oddHBand="0" w:evenHBand="0" w:firstRowFirstColumn="0" w:firstRowLastColumn="0" w:lastRowFirstColumn="0" w:lastRowLastColumn="0"/>
+            </w:pPr>
+            <w:r>
+              <w:t>Primary Permissions</w:t>
+            </w:r>
+          </w:p>
+        </w:tc>
+      </w:tr>
+      <w:tr>
+        <w:trPr>
+          <w:cnfStyle w:val="000000100000" w:firstRow="0" w:lastRow="0" w:firstColumn="0" w:lastColumn="0" w:oddVBand="0" w:evenVBand="0" w:oddHBand="1" w:evenHBand="0" w:firstRowFirstColumn="0" w:firstRowLastColumn="0" w:lastRowFirstColumn="0" w:lastRowLastColumn="0"/>
+        </w:trPr>
+        <w:tc>
+          <w:tcPr>
+            <w:cnfStyle w:val="001000000000" w:firstRow="0" w:lastRow="0" w:firstColumn="1" w:lastColumn="0" w:oddVBand="0" w:evenVBand="0" w:oddHBand="0" w:evenHBand="0" w:firstRowFirstColumn="0" w:firstRowLastColumn="0" w:lastRowFirstColumn="0" w:lastRowLastColumn="0"/>
+            <w:tcW w:w="2515" w:type="dxa"/>
+            <w:vAlign w:val="center"/>
+            <w:hideMark/>
+          </w:tcPr>
+          <w:p>
+            <w:pPr>
+              <w:rPr>
+                <w:b w:val="0"/>
+                <w:bCs w:val="0"/>
+              </w:rPr>
+            </w:pPr>
+            <w:r>
+              <w:rPr>
+                <w:b w:val="0"/>
+                <w:bCs w:val="0"/>
+              </w:rPr>
+              <w:t>Customer</w:t>
+            </w:r>
+          </w:p>
+        </w:tc>
+        <w:tc>
+          <w:tcPr>
+            <w:tcW w:w="6660" w:type="dxa"/>
+            <w:vAlign w:val="center"/>
+            <w:hideMark/>
+          </w:tcPr>
+          <w:p>
+            <w:pPr>
+              <w:cnfStyle w:val="000000100000" w:firstRow="0" w:lastRow="0" w:firstColumn="0" w:lastColumn="0" w:oddVBand="0" w:evenVBand="0" w:oddHBand="1" w:evenHBand="0" w:firstRowFirstColumn="0" w:firstRowLastColumn="0" w:lastRowFirstColumn="0" w:lastRowLastColumn="0"/>
+            </w:pPr>
+            <w:r>
+              <w:t>Vehicle search, reservations, payments, reviews, AI services</w:t>
+            </w:r>
+          </w:p>
+        </w:tc>
+      </w:tr>
+      <w:tr>
+        <w:tc>
+          <w:tcPr>
+            <w:cnfStyle w:val="001000000000" w:firstRow="0" w:lastRow="0" w:firstColumn="1" w:lastColumn="0" w:oddVBand="0" w:evenVBand="0" w:oddHBand="0" w:evenHBand="0" w:firstRowFirstColumn="0" w:firstRowLastColumn="0" w:lastRowFirstColumn="0" w:lastRowLastColumn="0"/>
+            <w:tcW w:w="2515" w:type="dxa"/>
+            <w:vAlign w:val="center"/>
+            <w:hideMark/>
+          </w:tcPr>
+          <w:p>
+            <w:pPr>
+              <w:rPr>
+                <w:b w:val="0"/>
+                <w:bCs w:val="0"/>
+              </w:rPr>
+            </w:pPr>
+            <w:r>
+              <w:rPr>
+                <w:b w:val="0"/>
+                <w:bCs w:val="0"/>
+              </w:rPr>
+              <w:t>Agency Employee</w:t>
+            </w:r>
+          </w:p>
+        </w:tc>
+        <w:tc>
+          <w:tcPr>
+            <w:tcW w:w="6660" w:type="dxa"/>
+            <w:vAlign w:val="center"/>
+            <w:hideMark/>
+          </w:tcPr>
+          <w:p>
+            <w:pPr>
+              <w:cnfStyle w:val="000000000000" w:firstRow="0" w:lastRow="0" w:firstColumn="0" w:lastColumn="0" w:oddVBand="0" w:evenVBand="0" w:oddHBand="0" w:evenHBand="0" w:firstRowFirstColumn="0" w:firstRowLastColumn="0" w:lastRowFirstColumn="0" w:lastRowLastColumn="0"/>
+            </w:pPr>
+            <w:r>
+              <w:t>Reservation management, fleet management, branch operations</w:t>
+            </w:r>
+          </w:p>
+        </w:tc>
+      </w:tr>
+      <w:tr>
+        <w:trPr>
+          <w:cnfStyle w:val="000000100000" w:firstRow="0" w:lastRow="0" w:firstColumn="0" w:lastColumn="0" w:oddVBand="0" w:evenVBand="0" w:oddHBand="1" w:evenHBand="0" w:firstRowFirstColumn="0" w:firstRowLastColumn="0" w:lastRowFirstColumn="0" w:lastRowLastColumn="0"/>
+        </w:trPr>
+        <w:tc>
+          <w:tcPr>
+            <w:cnfStyle w:val="001000000000" w:firstRow="0" w:lastRow="0" w:firstColumn="1" w:lastColumn="0" w:oddVBand="0" w:evenVBand="0" w:oddHBand="0" w:evenHBand="0" w:firstRowFirstColumn="0" w:firstRowLastColumn="0" w:lastRowFirstColumn="0" w:lastRowLastColumn="0"/>
+            <w:tcW w:w="2515" w:type="dxa"/>
+            <w:vAlign w:val="center"/>
+            <w:hideMark/>
+          </w:tcPr>
+          <w:p>
+            <w:pPr>
+              <w:rPr>
+                <w:b w:val="0"/>
+                <w:bCs w:val="0"/>
+              </w:rPr>
+            </w:pPr>
+            <w:r>
+              <w:rPr>
+                <w:b w:val="0"/>
+                <w:bCs w:val="0"/>
+              </w:rPr>
+              <w:t>Agency Manager</w:t>
+            </w:r>
+          </w:p>
+        </w:tc>
+        <w:tc>
+          <w:tcPr>
+            <w:tcW w:w="6660" w:type="dxa"/>
+            <w:vAlign w:val="center"/>
+            <w:hideMark/>
+          </w:tcPr>
+          <w:p>
+            <w:pPr>
+              <w:cnfStyle w:val="000000100000" w:firstRow="0" w:lastRow="0" w:firstColumn="0" w:lastColumn="0" w:oddVBand="0" w:evenVBand="0" w:oddHBand="1" w:evenHBand="0" w:firstRowFirstColumn="0" w:firstRowLastColumn="0" w:lastRowFirstColumn="0" w:lastRowLastColumn="0"/>
+            </w:pPr>
+            <w:r>
+              <w:t>Agency administration, employee management, analytics</w:t>
+            </w:r>
+          </w:p>
+        </w:tc>
+      </w:tr>
+      <w:tr>
+        <w:tc>
+          <w:tcPr>
+            <w:cnfStyle w:val="001000000000" w:firstRow="0" w:lastRow="0" w:firstColumn="1" w:lastColumn="0" w:oddVBand="0" w:evenVBand="0" w:oddHBand="0" w:evenHBand="0" w:firstRowFirstColumn="0" w:firstRowLastColumn="0" w:lastRowFirstColumn="0" w:lastRowLastColumn="0"/>
+            <w:tcW w:w="2515" w:type="dxa"/>
+            <w:vAlign w:val="center"/>
+            <w:hideMark/>
+          </w:tcPr>
+          <w:p>
+            <w:pPr>
+              <w:rPr>
+                <w:b w:val="0"/>
+                <w:bCs w:val="0"/>
+              </w:rPr>
+            </w:pPr>
+            <w:r>
+              <w:rPr>
+                <w:b w:val="0"/>
+                <w:bCs w:val="0"/>
+              </w:rPr>
+              <w:t>Administrator</w:t>
+            </w:r>
+          </w:p>
+        </w:tc>
+        <w:tc>
+          <w:tcPr>
+            <w:tcW w:w="6660" w:type="dxa"/>
+            <w:vAlign w:val="center"/>
+            <w:hideMark/>
+          </w:tcPr>
+          <w:p>
+            <w:pPr>
+              <w:cnfStyle w:val="000000000000" w:firstRow="0" w:lastRow="0" w:firstColumn="0" w:lastColumn="0" w:oddVBand="0" w:evenVBand="0" w:oddHBand="0" w:evenHBand="0" w:firstRowFirstColumn="0" w:firstRowLastColumn="0" w:lastRowFirstColumn="0" w:lastRowLastColumn="0"/>
+            </w:pPr>
+            <w:r>
+              <w:t>Complete system administration and configuration</w:t>
+            </w:r>
+          </w:p>
+        </w:tc>
+      </w:tr>
+    </w:tbl>
+    <w:p>
+      <w:r>
         <w:lastRenderedPageBreak/>
-        <w:t>Integration Validation Summary</w:t>
-      </w:r>
-    </w:p>
-    <w:p>
-      <w:r>
-        <w:t>Integration validation proves that components of KriGo platform architecture can communicate properly through standard communication interfaces. Internal services operate in compliance with the given layered architecture, while external providers are integrated properly using dedicated service modules. Secure communication protocols, centralized validation and asynchronous processing altogether result in a reliable, scalable, and maintainable software architecture.</w:t>
+        <w:t>Authorization is checked prior to executing business logic to ensure that no unauthorized user has access to the resources.</w:t>
+      </w:r>
+    </w:p>
+    <w:p>
+      <w:r>
+        <w:t>In terms of the authorization model, least privilege is practiced where everyone gets only the minimum permissions required for the tasks assigned to him/her.</w:t>
+      </w:r>
+    </w:p>
+    <w:p>
+      <w:pPr>
+        <w:pStyle w:val="Heading3"/>
+      </w:pPr>
+      <w:r>
+        <w:t>Security Monitoring and Audit</w:t>
+      </w:r>
+    </w:p>
+    <w:p>
+      <w:r>
+        <w:t>In order to enhance the operational security, the platform has implemented centralized monitoring and audit systems for recording important events. Such actions as authentication attempt, payment transactions, admin tasks and system faults are registered in order to perform investigations and monitor the system performance.</w:t>
+      </w:r>
+    </w:p>
+    <w:p>
+      <w:r>
+        <w:t>Moreover, centralized exceptions processing helps to hide the internal implementations from client application while giving standardized responses on errors.</w:t>
+      </w:r>
+    </w:p>
+    <w:p>
+      <w:r>
+        <w:t>The process of security monitoring includes the following:</w:t>
+      </w:r>
+    </w:p>
+    <w:p>
+      <w:pPr>
+        <w:pStyle w:val="ListParagraph"/>
+        <w:numPr>
+          <w:ilvl w:val="0"/>
+          <w:numId w:val="190"/>
+        </w:numPr>
+      </w:pPr>
+      <w:r>
+        <w:t>Authentication logging.</w:t>
+      </w:r>
+    </w:p>
+    <w:p>
+      <w:pPr>
+        <w:pStyle w:val="ListParagraph"/>
+        <w:numPr>
+          <w:ilvl w:val="0"/>
+          <w:numId w:val="190"/>
+        </w:numPr>
+      </w:pPr>
+      <w:r>
+        <w:t>Detection of failed logins.</w:t>
+      </w:r>
+    </w:p>
+    <w:p>
+      <w:pPr>
+        <w:pStyle w:val="ListParagraph"/>
+        <w:numPr>
+          <w:ilvl w:val="0"/>
+          <w:numId w:val="190"/>
+        </w:numPr>
+      </w:pPr>
+      <w:r>
+        <w:t>Administrative audit logs.</w:t>
+      </w:r>
+    </w:p>
+    <w:p>
+      <w:pPr>
+        <w:pStyle w:val="ListParagraph"/>
+        <w:numPr>
+          <w:ilvl w:val="0"/>
+          <w:numId w:val="190"/>
+        </w:numPr>
+      </w:pPr>
+      <w:r>
+        <w:t>Logs for API requests.</w:t>
+      </w:r>
+    </w:p>
+    <w:p>
+      <w:pPr>
+        <w:pStyle w:val="ListParagraph"/>
+        <w:numPr>
+          <w:ilvl w:val="0"/>
+          <w:numId w:val="190"/>
+        </w:numPr>
+      </w:pPr>
+      <w:r>
+        <w:t>Exceptions monitoring.</w:t>
+      </w:r>
+    </w:p>
+    <w:p>
+      <w:pPr>
+        <w:pStyle w:val="ListParagraph"/>
+        <w:numPr>
+          <w:ilvl w:val="0"/>
+          <w:numId w:val="190"/>
+        </w:numPr>
+      </w:pPr>
+      <w:r>
+        <w:t>Detection of suspicious behavior.</w:t>
+      </w:r>
+    </w:p>
+    <w:p>
+      <w:pPr>
+        <w:pStyle w:val="Heading3"/>
+      </w:pPr>
+      <w:r>
+        <w:t>Advantages of Security Architecture</w:t>
+      </w:r>
+    </w:p>
+    <w:p>
+      <w:r>
+        <w:t>The chosen security architecture allows developing a complete protection framework which consists of authentication, authorization, encryption, and communication mechanisms. JWT authentication framework allows implementing stateless authentication in a scalable way, whereas role-based authorization ensures the controlled access to system resources. Data protection measures help to maintain the confidentiality and integrity of sensitive data. In addition, centralized monitoring and audit increase the traceability and abnormal behavior detection.</w:t>
+      </w:r>
+    </w:p>
+    <w:p>
+      <w:r>
+        <w:t>All this helps to create a secure basis for protecting the KriGo platform from typical security threats and development of the system.</w:t>
       </w:r>
     </w:p>
     <w:p/>
@@ -16558,6 +17042,119 @@
     </w:lvl>
   </w:abstractNum>
   <w:abstractNum w:abstractNumId="11" w15:restartNumberingAfterBreak="0">
+    <w:nsid w:val="0E3D737D"/>
+    <w:multiLevelType w:val="hybridMultilevel"/>
+    <w:tmpl w:val="83E8EA14"/>
+    <w:lvl w:ilvl="0" w:tplc="04090005">
+      <w:start w:val="1"/>
+      <w:numFmt w:val="bullet"/>
+      <w:lvlText w:val=""/>
+      <w:lvlJc w:val="left"/>
+      <w:pPr>
+        <w:ind w:left="720" w:hanging="360"/>
+      </w:pPr>
+      <w:rPr>
+        <w:rFonts w:ascii="Wingdings" w:hAnsi="Wingdings" w:hint="default"/>
+      </w:rPr>
+    </w:lvl>
+    <w:lvl w:ilvl="1" w:tplc="04090003" w:tentative="1">
+      <w:start w:val="1"/>
+      <w:numFmt w:val="bullet"/>
+      <w:lvlText w:val="o"/>
+      <w:lvlJc w:val="left"/>
+      <w:pPr>
+        <w:ind w:left="1440" w:hanging="360"/>
+      </w:pPr>
+      <w:rPr>
+        <w:rFonts w:ascii="Courier New" w:hAnsi="Courier New" w:cs="Courier New" w:hint="default"/>
+      </w:rPr>
+    </w:lvl>
+    <w:lvl w:ilvl="2" w:tplc="04090005" w:tentative="1">
+      <w:start w:val="1"/>
+      <w:numFmt w:val="bullet"/>
+      <w:lvlText w:val=""/>
+      <w:lvlJc w:val="left"/>
+      <w:pPr>
+        <w:ind w:left="2160" w:hanging="360"/>
+      </w:pPr>
+      <w:rPr>
+        <w:rFonts w:ascii="Wingdings" w:hAnsi="Wingdings" w:hint="default"/>
+      </w:rPr>
+    </w:lvl>
+    <w:lvl w:ilvl="3" w:tplc="04090001" w:tentative="1">
+      <w:start w:val="1"/>
+      <w:numFmt w:val="bullet"/>
+      <w:lvlText w:val=""/>
+      <w:lvlJc w:val="left"/>
+      <w:pPr>
+        <w:ind w:left="2880" w:hanging="360"/>
+      </w:pPr>
+      <w:rPr>
+        <w:rFonts w:ascii="Symbol" w:hAnsi="Symbol" w:hint="default"/>
+      </w:rPr>
+    </w:lvl>
+    <w:lvl w:ilvl="4" w:tplc="04090003" w:tentative="1">
+      <w:start w:val="1"/>
+      <w:numFmt w:val="bullet"/>
+      <w:lvlText w:val="o"/>
+      <w:lvlJc w:val="left"/>
+      <w:pPr>
+        <w:ind w:left="3600" w:hanging="360"/>
+      </w:pPr>
+      <w:rPr>
+        <w:rFonts w:ascii="Courier New" w:hAnsi="Courier New" w:cs="Courier New" w:hint="default"/>
+      </w:rPr>
+    </w:lvl>
+    <w:lvl w:ilvl="5" w:tplc="04090005" w:tentative="1">
+      <w:start w:val="1"/>
+      <w:numFmt w:val="bullet"/>
+      <w:lvlText w:val=""/>
+      <w:lvlJc w:val="left"/>
+      <w:pPr>
+        <w:ind w:left="4320" w:hanging="360"/>
+      </w:pPr>
+      <w:rPr>
+        <w:rFonts w:ascii="Wingdings" w:hAnsi="Wingdings" w:hint="default"/>
+      </w:rPr>
+    </w:lvl>
+    <w:lvl w:ilvl="6" w:tplc="04090001" w:tentative="1">
+      <w:start w:val="1"/>
+      <w:numFmt w:val="bullet"/>
+      <w:lvlText w:val=""/>
+      <w:lvlJc w:val="left"/>
+      <w:pPr>
+        <w:ind w:left="5040" w:hanging="360"/>
+      </w:pPr>
+      <w:rPr>
+        <w:rFonts w:ascii="Symbol" w:hAnsi="Symbol" w:hint="default"/>
+      </w:rPr>
+    </w:lvl>
+    <w:lvl w:ilvl="7" w:tplc="04090003" w:tentative="1">
+      <w:start w:val="1"/>
+      <w:numFmt w:val="bullet"/>
+      <w:lvlText w:val="o"/>
+      <w:lvlJc w:val="left"/>
+      <w:pPr>
+        <w:ind w:left="5760" w:hanging="360"/>
+      </w:pPr>
+      <w:rPr>
+        <w:rFonts w:ascii="Courier New" w:hAnsi="Courier New" w:cs="Courier New" w:hint="default"/>
+      </w:rPr>
+    </w:lvl>
+    <w:lvl w:ilvl="8" w:tplc="04090005" w:tentative="1">
+      <w:start w:val="1"/>
+      <w:numFmt w:val="bullet"/>
+      <w:lvlText w:val=""/>
+      <w:lvlJc w:val="left"/>
+      <w:pPr>
+        <w:ind w:left="6480" w:hanging="360"/>
+      </w:pPr>
+      <w:rPr>
+        <w:rFonts w:ascii="Wingdings" w:hAnsi="Wingdings" w:hint="default"/>
+      </w:rPr>
+    </w:lvl>
+  </w:abstractNum>
+  <w:abstractNum w:abstractNumId="12" w15:restartNumberingAfterBreak="0">
     <w:nsid w:val="0F4F06D8"/>
     <w:multiLevelType w:val="multilevel"/>
     <w:tmpl w:val="68E44DE0"/>
@@ -16706,7 +17303,7 @@
       </w:rPr>
     </w:lvl>
   </w:abstractNum>
-  <w:abstractNum w:abstractNumId="12" w15:restartNumberingAfterBreak="0">
+  <w:abstractNum w:abstractNumId="13" w15:restartNumberingAfterBreak="0">
     <w:nsid w:val="0FDE792A"/>
     <w:multiLevelType w:val="hybridMultilevel"/>
     <w:tmpl w:val="43823D74"/>
@@ -16818,7 +17415,7 @@
       </w:rPr>
     </w:lvl>
   </w:abstractNum>
-  <w:abstractNum w:abstractNumId="13" w15:restartNumberingAfterBreak="0">
+  <w:abstractNum w:abstractNumId="14" w15:restartNumberingAfterBreak="0">
     <w:nsid w:val="12201BE9"/>
     <w:multiLevelType w:val="multilevel"/>
     <w:tmpl w:val="CED6A096"/>
@@ -16967,7 +17564,7 @@
       </w:rPr>
     </w:lvl>
   </w:abstractNum>
-  <w:abstractNum w:abstractNumId="14" w15:restartNumberingAfterBreak="0">
+  <w:abstractNum w:abstractNumId="15" w15:restartNumberingAfterBreak="0">
     <w:nsid w:val="135C5CF3"/>
     <w:multiLevelType w:val="multilevel"/>
     <w:tmpl w:val="61D20A04"/>
@@ -17116,7 +17713,7 @@
       </w:rPr>
     </w:lvl>
   </w:abstractNum>
-  <w:abstractNum w:abstractNumId="15" w15:restartNumberingAfterBreak="0">
+  <w:abstractNum w:abstractNumId="16" w15:restartNumberingAfterBreak="0">
     <w:nsid w:val="137648CC"/>
     <w:multiLevelType w:val="multilevel"/>
     <w:tmpl w:val="EC983E9E"/>
@@ -17265,7 +17862,7 @@
       </w:rPr>
     </w:lvl>
   </w:abstractNum>
-  <w:abstractNum w:abstractNumId="16" w15:restartNumberingAfterBreak="0">
+  <w:abstractNum w:abstractNumId="17" w15:restartNumberingAfterBreak="0">
     <w:nsid w:val="141F262D"/>
     <w:multiLevelType w:val="hybridMultilevel"/>
     <w:tmpl w:val="7868BBFA"/>
@@ -17378,7 +17975,7 @@
       </w:rPr>
     </w:lvl>
   </w:abstractNum>
-  <w:abstractNum w:abstractNumId="17" w15:restartNumberingAfterBreak="0">
+  <w:abstractNum w:abstractNumId="18" w15:restartNumberingAfterBreak="0">
     <w:nsid w:val="15354085"/>
     <w:multiLevelType w:val="multilevel"/>
     <w:tmpl w:val="ED488EA0"/>
@@ -17527,7 +18124,7 @@
       </w:rPr>
     </w:lvl>
   </w:abstractNum>
-  <w:abstractNum w:abstractNumId="18" w15:restartNumberingAfterBreak="0">
+  <w:abstractNum w:abstractNumId="19" w15:restartNumberingAfterBreak="0">
     <w:nsid w:val="15923962"/>
     <w:multiLevelType w:val="hybridMultilevel"/>
     <w:tmpl w:val="2A8A437A"/>
@@ -17639,7 +18236,7 @@
       </w:rPr>
     </w:lvl>
   </w:abstractNum>
-  <w:abstractNum w:abstractNumId="19" w15:restartNumberingAfterBreak="0">
+  <w:abstractNum w:abstractNumId="20" w15:restartNumberingAfterBreak="0">
     <w:nsid w:val="15A463B3"/>
     <w:multiLevelType w:val="hybridMultilevel"/>
     <w:tmpl w:val="35F2F666"/>
@@ -17752,7 +18349,7 @@
       </w:rPr>
     </w:lvl>
   </w:abstractNum>
-  <w:abstractNum w:abstractNumId="20" w15:restartNumberingAfterBreak="0">
+  <w:abstractNum w:abstractNumId="21" w15:restartNumberingAfterBreak="0">
     <w:nsid w:val="15E231DD"/>
     <w:multiLevelType w:val="hybridMultilevel"/>
     <w:tmpl w:val="48B4AB8E"/>
@@ -17865,7 +18462,7 @@
       </w:rPr>
     </w:lvl>
   </w:abstractNum>
-  <w:abstractNum w:abstractNumId="21" w15:restartNumberingAfterBreak="0">
+  <w:abstractNum w:abstractNumId="22" w15:restartNumberingAfterBreak="0">
     <w:nsid w:val="15FB6E59"/>
     <w:multiLevelType w:val="multilevel"/>
     <w:tmpl w:val="63F4E6F0"/>
@@ -18014,7 +18611,7 @@
       </w:rPr>
     </w:lvl>
   </w:abstractNum>
-  <w:abstractNum w:abstractNumId="22" w15:restartNumberingAfterBreak="0">
+  <w:abstractNum w:abstractNumId="23" w15:restartNumberingAfterBreak="0">
     <w:nsid w:val="16057B40"/>
     <w:multiLevelType w:val="hybridMultilevel"/>
     <w:tmpl w:val="C63C7D68"/>
@@ -18126,7 +18723,7 @@
       </w:rPr>
     </w:lvl>
   </w:abstractNum>
-  <w:abstractNum w:abstractNumId="23" w15:restartNumberingAfterBreak="0">
+  <w:abstractNum w:abstractNumId="24" w15:restartNumberingAfterBreak="0">
     <w:nsid w:val="18441B3D"/>
     <w:multiLevelType w:val="hybridMultilevel"/>
     <w:tmpl w:val="F162D252"/>
@@ -18238,7 +18835,7 @@
       </w:rPr>
     </w:lvl>
   </w:abstractNum>
-  <w:abstractNum w:abstractNumId="24" w15:restartNumberingAfterBreak="0">
+  <w:abstractNum w:abstractNumId="25" w15:restartNumberingAfterBreak="0">
     <w:nsid w:val="185230B0"/>
     <w:multiLevelType w:val="hybridMultilevel"/>
     <w:tmpl w:val="FDFE89EE"/>
@@ -18351,7 +18948,7 @@
       </w:rPr>
     </w:lvl>
   </w:abstractNum>
-  <w:abstractNum w:abstractNumId="25" w15:restartNumberingAfterBreak="0">
+  <w:abstractNum w:abstractNumId="26" w15:restartNumberingAfterBreak="0">
     <w:nsid w:val="18A93E35"/>
     <w:multiLevelType w:val="hybridMultilevel"/>
     <w:tmpl w:val="7A6E3062"/>
@@ -18463,7 +19060,7 @@
       </w:rPr>
     </w:lvl>
   </w:abstractNum>
-  <w:abstractNum w:abstractNumId="26" w15:restartNumberingAfterBreak="0">
+  <w:abstractNum w:abstractNumId="27" w15:restartNumberingAfterBreak="0">
     <w:nsid w:val="18EC3D82"/>
     <w:multiLevelType w:val="hybridMultilevel"/>
     <w:tmpl w:val="BC5A743C"/>
@@ -18576,7 +19173,7 @@
       </w:rPr>
     </w:lvl>
   </w:abstractNum>
-  <w:abstractNum w:abstractNumId="27" w15:restartNumberingAfterBreak="0">
+  <w:abstractNum w:abstractNumId="28" w15:restartNumberingAfterBreak="0">
     <w:nsid w:val="18F46E01"/>
     <w:multiLevelType w:val="multilevel"/>
     <w:tmpl w:val="C77EDED0"/>
@@ -18725,7 +19322,7 @@
       </w:rPr>
     </w:lvl>
   </w:abstractNum>
-  <w:abstractNum w:abstractNumId="28" w15:restartNumberingAfterBreak="0">
+  <w:abstractNum w:abstractNumId="29" w15:restartNumberingAfterBreak="0">
     <w:nsid w:val="19AE5EE7"/>
     <w:multiLevelType w:val="hybridMultilevel"/>
     <w:tmpl w:val="00A4140C"/>
@@ -18838,7 +19435,7 @@
       </w:rPr>
     </w:lvl>
   </w:abstractNum>
-  <w:abstractNum w:abstractNumId="29" w15:restartNumberingAfterBreak="0">
+  <w:abstractNum w:abstractNumId="30" w15:restartNumberingAfterBreak="0">
     <w:nsid w:val="19C83C12"/>
     <w:multiLevelType w:val="multilevel"/>
     <w:tmpl w:val="7690D588"/>
@@ -18987,7 +19584,7 @@
       </w:rPr>
     </w:lvl>
   </w:abstractNum>
-  <w:abstractNum w:abstractNumId="30" w15:restartNumberingAfterBreak="0">
+  <w:abstractNum w:abstractNumId="31" w15:restartNumberingAfterBreak="0">
     <w:nsid w:val="1A236A44"/>
     <w:multiLevelType w:val="hybridMultilevel"/>
     <w:tmpl w:val="E06C248C"/>
@@ -19100,7 +19697,7 @@
       </w:rPr>
     </w:lvl>
   </w:abstractNum>
-  <w:abstractNum w:abstractNumId="31" w15:restartNumberingAfterBreak="0">
+  <w:abstractNum w:abstractNumId="32" w15:restartNumberingAfterBreak="0">
     <w:nsid w:val="1B247976"/>
     <w:multiLevelType w:val="hybridMultilevel"/>
     <w:tmpl w:val="01AC6F84"/>
@@ -19213,7 +19810,7 @@
       </w:rPr>
     </w:lvl>
   </w:abstractNum>
-  <w:abstractNum w:abstractNumId="32" w15:restartNumberingAfterBreak="0">
+  <w:abstractNum w:abstractNumId="33" w15:restartNumberingAfterBreak="0">
     <w:nsid w:val="1C511176"/>
     <w:multiLevelType w:val="multilevel"/>
     <w:tmpl w:val="201E7F12"/>
@@ -19362,7 +19959,7 @@
       </w:rPr>
     </w:lvl>
   </w:abstractNum>
-  <w:abstractNum w:abstractNumId="33" w15:restartNumberingAfterBreak="0">
+  <w:abstractNum w:abstractNumId="34" w15:restartNumberingAfterBreak="0">
     <w:nsid w:val="1D4C2E50"/>
     <w:multiLevelType w:val="multilevel"/>
     <w:tmpl w:val="63F4E6F0"/>
@@ -19511,7 +20108,7 @@
       </w:rPr>
     </w:lvl>
   </w:abstractNum>
-  <w:abstractNum w:abstractNumId="34" w15:restartNumberingAfterBreak="0">
+  <w:abstractNum w:abstractNumId="35" w15:restartNumberingAfterBreak="0">
     <w:nsid w:val="1EC4731F"/>
     <w:multiLevelType w:val="hybridMultilevel"/>
     <w:tmpl w:val="8E26D8F0"/>
@@ -19623,7 +20220,7 @@
       </w:rPr>
     </w:lvl>
   </w:abstractNum>
-  <w:abstractNum w:abstractNumId="35" w15:restartNumberingAfterBreak="0">
+  <w:abstractNum w:abstractNumId="36" w15:restartNumberingAfterBreak="0">
     <w:nsid w:val="1F5F33AA"/>
     <w:multiLevelType w:val="hybridMultilevel"/>
     <w:tmpl w:val="661235B2"/>
@@ -19736,7 +20333,7 @@
       </w:rPr>
     </w:lvl>
   </w:abstractNum>
-  <w:abstractNum w:abstractNumId="36" w15:restartNumberingAfterBreak="0">
+  <w:abstractNum w:abstractNumId="37" w15:restartNumberingAfterBreak="0">
     <w:nsid w:val="20017871"/>
     <w:multiLevelType w:val="hybridMultilevel"/>
     <w:tmpl w:val="EA76608A"/>
@@ -19849,7 +20446,7 @@
       </w:rPr>
     </w:lvl>
   </w:abstractNum>
-  <w:abstractNum w:abstractNumId="37" w15:restartNumberingAfterBreak="0">
+  <w:abstractNum w:abstractNumId="38" w15:restartNumberingAfterBreak="0">
     <w:nsid w:val="206A32F9"/>
     <w:multiLevelType w:val="hybridMultilevel"/>
     <w:tmpl w:val="7A405CA6"/>
@@ -19961,7 +20558,7 @@
       </w:rPr>
     </w:lvl>
   </w:abstractNum>
-  <w:abstractNum w:abstractNumId="38" w15:restartNumberingAfterBreak="0">
+  <w:abstractNum w:abstractNumId="39" w15:restartNumberingAfterBreak="0">
     <w:nsid w:val="20786568"/>
     <w:multiLevelType w:val="hybridMultilevel"/>
     <w:tmpl w:val="200CC0BC"/>
@@ -20073,7 +20670,7 @@
       </w:rPr>
     </w:lvl>
   </w:abstractNum>
-  <w:abstractNum w:abstractNumId="39" w15:restartNumberingAfterBreak="0">
+  <w:abstractNum w:abstractNumId="40" w15:restartNumberingAfterBreak="0">
     <w:nsid w:val="207D21A1"/>
     <w:multiLevelType w:val="hybridMultilevel"/>
     <w:tmpl w:val="AAAE4260"/>
@@ -20185,7 +20782,7 @@
       </w:rPr>
     </w:lvl>
   </w:abstractNum>
-  <w:abstractNum w:abstractNumId="40" w15:restartNumberingAfterBreak="0">
+  <w:abstractNum w:abstractNumId="41" w15:restartNumberingAfterBreak="0">
     <w:nsid w:val="20DC5034"/>
     <w:multiLevelType w:val="hybridMultilevel"/>
     <w:tmpl w:val="4B5425EA"/>
@@ -20297,7 +20894,7 @@
       </w:rPr>
     </w:lvl>
   </w:abstractNum>
-  <w:abstractNum w:abstractNumId="41" w15:restartNumberingAfterBreak="0">
+  <w:abstractNum w:abstractNumId="42" w15:restartNumberingAfterBreak="0">
     <w:nsid w:val="224C7C45"/>
     <w:multiLevelType w:val="multilevel"/>
     <w:tmpl w:val="5C800264"/>
@@ -20446,7 +21043,7 @@
       </w:rPr>
     </w:lvl>
   </w:abstractNum>
-  <w:abstractNum w:abstractNumId="42" w15:restartNumberingAfterBreak="0">
+  <w:abstractNum w:abstractNumId="43" w15:restartNumberingAfterBreak="0">
     <w:nsid w:val="23970AD1"/>
     <w:multiLevelType w:val="hybridMultilevel"/>
     <w:tmpl w:val="6A1E8A04"/>
@@ -20558,7 +21155,7 @@
       </w:rPr>
     </w:lvl>
   </w:abstractNum>
-  <w:abstractNum w:abstractNumId="43" w15:restartNumberingAfterBreak="0">
+  <w:abstractNum w:abstractNumId="44" w15:restartNumberingAfterBreak="0">
     <w:nsid w:val="243D731E"/>
     <w:multiLevelType w:val="multilevel"/>
     <w:tmpl w:val="51303158"/>
@@ -20707,7 +21304,7 @@
       </w:rPr>
     </w:lvl>
   </w:abstractNum>
-  <w:abstractNum w:abstractNumId="44" w15:restartNumberingAfterBreak="0">
+  <w:abstractNum w:abstractNumId="45" w15:restartNumberingAfterBreak="0">
     <w:nsid w:val="26BA6D3C"/>
     <w:multiLevelType w:val="hybridMultilevel"/>
     <w:tmpl w:val="F03CC954"/>
@@ -20819,7 +21416,7 @@
       </w:rPr>
     </w:lvl>
   </w:abstractNum>
-  <w:abstractNum w:abstractNumId="45" w15:restartNumberingAfterBreak="0">
+  <w:abstractNum w:abstractNumId="46" w15:restartNumberingAfterBreak="0">
     <w:nsid w:val="27F6417B"/>
     <w:multiLevelType w:val="hybridMultilevel"/>
     <w:tmpl w:val="BACA6538"/>
@@ -20932,7 +21529,7 @@
       </w:rPr>
     </w:lvl>
   </w:abstractNum>
-  <w:abstractNum w:abstractNumId="46" w15:restartNumberingAfterBreak="0">
+  <w:abstractNum w:abstractNumId="47" w15:restartNumberingAfterBreak="0">
     <w:nsid w:val="28765EA3"/>
     <w:multiLevelType w:val="hybridMultilevel"/>
     <w:tmpl w:val="1CFAEB30"/>
@@ -21045,7 +21642,7 @@
       </w:rPr>
     </w:lvl>
   </w:abstractNum>
-  <w:abstractNum w:abstractNumId="47" w15:restartNumberingAfterBreak="0">
+  <w:abstractNum w:abstractNumId="48" w15:restartNumberingAfterBreak="0">
     <w:nsid w:val="28940045"/>
     <w:multiLevelType w:val="multilevel"/>
     <w:tmpl w:val="23DE4804"/>
@@ -21194,7 +21791,7 @@
       </w:rPr>
     </w:lvl>
   </w:abstractNum>
-  <w:abstractNum w:abstractNumId="48" w15:restartNumberingAfterBreak="0">
+  <w:abstractNum w:abstractNumId="49" w15:restartNumberingAfterBreak="0">
     <w:nsid w:val="289938CC"/>
     <w:multiLevelType w:val="multilevel"/>
     <w:tmpl w:val="57745EE2"/>
@@ -21343,7 +21940,7 @@
       </w:rPr>
     </w:lvl>
   </w:abstractNum>
-  <w:abstractNum w:abstractNumId="49" w15:restartNumberingAfterBreak="0">
+  <w:abstractNum w:abstractNumId="50" w15:restartNumberingAfterBreak="0">
     <w:nsid w:val="2ADE3401"/>
     <w:multiLevelType w:val="multilevel"/>
     <w:tmpl w:val="63F4E6F0"/>
@@ -21492,7 +22089,7 @@
       </w:rPr>
     </w:lvl>
   </w:abstractNum>
-  <w:abstractNum w:abstractNumId="50" w15:restartNumberingAfterBreak="0">
+  <w:abstractNum w:abstractNumId="51" w15:restartNumberingAfterBreak="0">
     <w:nsid w:val="2B592B9C"/>
     <w:multiLevelType w:val="hybridMultilevel"/>
     <w:tmpl w:val="99D4C34E"/>
@@ -21605,7 +22202,7 @@
       </w:rPr>
     </w:lvl>
   </w:abstractNum>
-  <w:abstractNum w:abstractNumId="51" w15:restartNumberingAfterBreak="0">
+  <w:abstractNum w:abstractNumId="52" w15:restartNumberingAfterBreak="0">
     <w:nsid w:val="2B9413C9"/>
     <w:multiLevelType w:val="hybridMultilevel"/>
     <w:tmpl w:val="4F7A7546"/>
@@ -21717,7 +22314,7 @@
       </w:rPr>
     </w:lvl>
   </w:abstractNum>
-  <w:abstractNum w:abstractNumId="52" w15:restartNumberingAfterBreak="0">
+  <w:abstractNum w:abstractNumId="53" w15:restartNumberingAfterBreak="0">
     <w:nsid w:val="2B9539E3"/>
     <w:multiLevelType w:val="hybridMultilevel"/>
     <w:tmpl w:val="E6B8BBB6"/>
@@ -21829,7 +22426,7 @@
       </w:rPr>
     </w:lvl>
   </w:abstractNum>
-  <w:abstractNum w:abstractNumId="53" w15:restartNumberingAfterBreak="0">
+  <w:abstractNum w:abstractNumId="54" w15:restartNumberingAfterBreak="0">
     <w:nsid w:val="2D4B6488"/>
     <w:multiLevelType w:val="hybridMultilevel"/>
     <w:tmpl w:val="F82EB8B0"/>
@@ -21942,7 +22539,7 @@
       </w:rPr>
     </w:lvl>
   </w:abstractNum>
-  <w:abstractNum w:abstractNumId="54" w15:restartNumberingAfterBreak="0">
+  <w:abstractNum w:abstractNumId="55" w15:restartNumberingAfterBreak="0">
     <w:nsid w:val="2E164C9A"/>
     <w:multiLevelType w:val="hybridMultilevel"/>
     <w:tmpl w:val="C6BA489A"/>
@@ -22055,7 +22652,7 @@
       </w:rPr>
     </w:lvl>
   </w:abstractNum>
-  <w:abstractNum w:abstractNumId="55" w15:restartNumberingAfterBreak="0">
+  <w:abstractNum w:abstractNumId="56" w15:restartNumberingAfterBreak="0">
     <w:nsid w:val="2E34438D"/>
     <w:multiLevelType w:val="multilevel"/>
     <w:tmpl w:val="63F4E6F0"/>
@@ -22204,7 +22801,7 @@
       </w:rPr>
     </w:lvl>
   </w:abstractNum>
-  <w:abstractNum w:abstractNumId="56" w15:restartNumberingAfterBreak="0">
+  <w:abstractNum w:abstractNumId="57" w15:restartNumberingAfterBreak="0">
     <w:nsid w:val="2E5D6D2A"/>
     <w:multiLevelType w:val="hybridMultilevel"/>
     <w:tmpl w:val="5D5ADC98"/>
@@ -22317,7 +22914,7 @@
       </w:rPr>
     </w:lvl>
   </w:abstractNum>
-  <w:abstractNum w:abstractNumId="57" w15:restartNumberingAfterBreak="0">
+  <w:abstractNum w:abstractNumId="58" w15:restartNumberingAfterBreak="0">
     <w:nsid w:val="2E716C12"/>
     <w:multiLevelType w:val="hybridMultilevel"/>
     <w:tmpl w:val="6D90C552"/>
@@ -22430,7 +23027,7 @@
       </w:rPr>
     </w:lvl>
   </w:abstractNum>
-  <w:abstractNum w:abstractNumId="58" w15:restartNumberingAfterBreak="0">
+  <w:abstractNum w:abstractNumId="59" w15:restartNumberingAfterBreak="0">
     <w:nsid w:val="2F162517"/>
     <w:multiLevelType w:val="hybridMultilevel"/>
     <w:tmpl w:val="4E3CAB7C"/>
@@ -22542,7 +23139,7 @@
       </w:rPr>
     </w:lvl>
   </w:abstractNum>
-  <w:abstractNum w:abstractNumId="59" w15:restartNumberingAfterBreak="0">
+  <w:abstractNum w:abstractNumId="60" w15:restartNumberingAfterBreak="0">
     <w:nsid w:val="2F1F6483"/>
     <w:multiLevelType w:val="multilevel"/>
     <w:tmpl w:val="993E874E"/>
@@ -22691,7 +23288,7 @@
       </w:rPr>
     </w:lvl>
   </w:abstractNum>
-  <w:abstractNum w:abstractNumId="60" w15:restartNumberingAfterBreak="0">
+  <w:abstractNum w:abstractNumId="61" w15:restartNumberingAfterBreak="0">
     <w:nsid w:val="2F2B2F8E"/>
     <w:multiLevelType w:val="multilevel"/>
     <w:tmpl w:val="547EDCFE"/>
@@ -22840,7 +23437,7 @@
       </w:rPr>
     </w:lvl>
   </w:abstractNum>
-  <w:abstractNum w:abstractNumId="61" w15:restartNumberingAfterBreak="0">
+  <w:abstractNum w:abstractNumId="62" w15:restartNumberingAfterBreak="0">
     <w:nsid w:val="2FF161E6"/>
     <w:multiLevelType w:val="hybridMultilevel"/>
     <w:tmpl w:val="ED6AA478"/>
@@ -22952,7 +23549,7 @@
       </w:rPr>
     </w:lvl>
   </w:abstractNum>
-  <w:abstractNum w:abstractNumId="62" w15:restartNumberingAfterBreak="0">
+  <w:abstractNum w:abstractNumId="63" w15:restartNumberingAfterBreak="0">
     <w:nsid w:val="30CD5DF3"/>
     <w:multiLevelType w:val="hybridMultilevel"/>
     <w:tmpl w:val="127EBD02"/>
@@ -23064,7 +23661,7 @@
       </w:rPr>
     </w:lvl>
   </w:abstractNum>
-  <w:abstractNum w:abstractNumId="63" w15:restartNumberingAfterBreak="0">
+  <w:abstractNum w:abstractNumId="64" w15:restartNumberingAfterBreak="0">
     <w:nsid w:val="31A24DDF"/>
     <w:multiLevelType w:val="multilevel"/>
     <w:tmpl w:val="63F4E6F0"/>
@@ -23213,7 +23810,7 @@
       </w:rPr>
     </w:lvl>
   </w:abstractNum>
-  <w:abstractNum w:abstractNumId="64" w15:restartNumberingAfterBreak="0">
+  <w:abstractNum w:abstractNumId="65" w15:restartNumberingAfterBreak="0">
     <w:nsid w:val="321E65E6"/>
     <w:multiLevelType w:val="multilevel"/>
     <w:tmpl w:val="63F4E6F0"/>
@@ -23362,7 +23959,7 @@
       </w:rPr>
     </w:lvl>
   </w:abstractNum>
-  <w:abstractNum w:abstractNumId="65" w15:restartNumberingAfterBreak="0">
+  <w:abstractNum w:abstractNumId="66" w15:restartNumberingAfterBreak="0">
     <w:nsid w:val="32BD3E3A"/>
     <w:multiLevelType w:val="hybridMultilevel"/>
     <w:tmpl w:val="15A01DD2"/>
@@ -23475,7 +24072,7 @@
       </w:rPr>
     </w:lvl>
   </w:abstractNum>
-  <w:abstractNum w:abstractNumId="66" w15:restartNumberingAfterBreak="0">
+  <w:abstractNum w:abstractNumId="67" w15:restartNumberingAfterBreak="0">
     <w:nsid w:val="32BF1228"/>
     <w:multiLevelType w:val="hybridMultilevel"/>
     <w:tmpl w:val="EECA44F0"/>
@@ -23564,7 +24161,7 @@
       </w:pPr>
     </w:lvl>
   </w:abstractNum>
-  <w:abstractNum w:abstractNumId="67" w15:restartNumberingAfterBreak="0">
+  <w:abstractNum w:abstractNumId="68" w15:restartNumberingAfterBreak="0">
     <w:nsid w:val="32E40C4F"/>
     <w:multiLevelType w:val="hybridMultilevel"/>
     <w:tmpl w:val="EA4C1256"/>
@@ -23677,7 +24274,7 @@
       </w:rPr>
     </w:lvl>
   </w:abstractNum>
-  <w:abstractNum w:abstractNumId="68" w15:restartNumberingAfterBreak="0">
+  <w:abstractNum w:abstractNumId="69" w15:restartNumberingAfterBreak="0">
     <w:nsid w:val="332E29E8"/>
     <w:multiLevelType w:val="multilevel"/>
     <w:tmpl w:val="BF082128"/>
@@ -23826,7 +24423,7 @@
       </w:rPr>
     </w:lvl>
   </w:abstractNum>
-  <w:abstractNum w:abstractNumId="69" w15:restartNumberingAfterBreak="0">
+  <w:abstractNum w:abstractNumId="70" w15:restartNumberingAfterBreak="0">
     <w:nsid w:val="34251C5D"/>
     <w:multiLevelType w:val="multilevel"/>
     <w:tmpl w:val="C31CBCE0"/>
@@ -23975,7 +24572,7 @@
       </w:rPr>
     </w:lvl>
   </w:abstractNum>
-  <w:abstractNum w:abstractNumId="70" w15:restartNumberingAfterBreak="0">
+  <w:abstractNum w:abstractNumId="71" w15:restartNumberingAfterBreak="0">
     <w:nsid w:val="342A6150"/>
     <w:multiLevelType w:val="multilevel"/>
     <w:tmpl w:val="29E0BE1C"/>
@@ -24124,7 +24721,7 @@
       </w:rPr>
     </w:lvl>
   </w:abstractNum>
-  <w:abstractNum w:abstractNumId="71" w15:restartNumberingAfterBreak="0">
+  <w:abstractNum w:abstractNumId="72" w15:restartNumberingAfterBreak="0">
     <w:nsid w:val="343166B0"/>
     <w:multiLevelType w:val="hybridMultilevel"/>
     <w:tmpl w:val="91B8ED2A"/>
@@ -24237,7 +24834,7 @@
       </w:rPr>
     </w:lvl>
   </w:abstractNum>
-  <w:abstractNum w:abstractNumId="72" w15:restartNumberingAfterBreak="0">
+  <w:abstractNum w:abstractNumId="73" w15:restartNumberingAfterBreak="0">
     <w:nsid w:val="356F220A"/>
     <w:multiLevelType w:val="multilevel"/>
     <w:tmpl w:val="0FFA5254"/>
@@ -24386,7 +24983,7 @@
       </w:rPr>
     </w:lvl>
   </w:abstractNum>
-  <w:abstractNum w:abstractNumId="73" w15:restartNumberingAfterBreak="0">
+  <w:abstractNum w:abstractNumId="74" w15:restartNumberingAfterBreak="0">
     <w:nsid w:val="357B7363"/>
     <w:multiLevelType w:val="hybridMultilevel"/>
     <w:tmpl w:val="00D411EC"/>
@@ -24498,7 +25095,7 @@
       </w:rPr>
     </w:lvl>
   </w:abstractNum>
-  <w:abstractNum w:abstractNumId="74" w15:restartNumberingAfterBreak="0">
+  <w:abstractNum w:abstractNumId="75" w15:restartNumberingAfterBreak="0">
     <w:nsid w:val="3583100F"/>
     <w:multiLevelType w:val="hybridMultilevel"/>
     <w:tmpl w:val="848ECFAA"/>
@@ -24611,7 +25208,7 @@
       </w:rPr>
     </w:lvl>
   </w:abstractNum>
-  <w:abstractNum w:abstractNumId="75" w15:restartNumberingAfterBreak="0">
+  <w:abstractNum w:abstractNumId="76" w15:restartNumberingAfterBreak="0">
     <w:nsid w:val="3623194A"/>
     <w:multiLevelType w:val="multilevel"/>
     <w:tmpl w:val="63F4E6F0"/>
@@ -24760,7 +25357,7 @@
       </w:rPr>
     </w:lvl>
   </w:abstractNum>
-  <w:abstractNum w:abstractNumId="76" w15:restartNumberingAfterBreak="0">
+  <w:abstractNum w:abstractNumId="77" w15:restartNumberingAfterBreak="0">
     <w:nsid w:val="36371597"/>
     <w:multiLevelType w:val="hybridMultilevel"/>
     <w:tmpl w:val="D4FA2718"/>
@@ -24873,7 +25470,7 @@
       </w:rPr>
     </w:lvl>
   </w:abstractNum>
-  <w:abstractNum w:abstractNumId="77" w15:restartNumberingAfterBreak="0">
+  <w:abstractNum w:abstractNumId="78" w15:restartNumberingAfterBreak="0">
     <w:nsid w:val="36AD3FB0"/>
     <w:multiLevelType w:val="multilevel"/>
     <w:tmpl w:val="0644AEEA"/>
@@ -25022,7 +25619,7 @@
       </w:rPr>
     </w:lvl>
   </w:abstractNum>
-  <w:abstractNum w:abstractNumId="78" w15:restartNumberingAfterBreak="0">
+  <w:abstractNum w:abstractNumId="79" w15:restartNumberingAfterBreak="0">
     <w:nsid w:val="371A2CDE"/>
     <w:multiLevelType w:val="hybridMultilevel"/>
     <w:tmpl w:val="EA9C00CC"/>
@@ -25134,7 +25731,7 @@
       </w:rPr>
     </w:lvl>
   </w:abstractNum>
-  <w:abstractNum w:abstractNumId="79" w15:restartNumberingAfterBreak="0">
+  <w:abstractNum w:abstractNumId="80" w15:restartNumberingAfterBreak="0">
     <w:nsid w:val="373D5E48"/>
     <w:multiLevelType w:val="hybridMultilevel"/>
     <w:tmpl w:val="8A6E38C0"/>
@@ -25247,7 +25844,7 @@
       </w:rPr>
     </w:lvl>
   </w:abstractNum>
-  <w:abstractNum w:abstractNumId="80" w15:restartNumberingAfterBreak="0">
+  <w:abstractNum w:abstractNumId="81" w15:restartNumberingAfterBreak="0">
     <w:nsid w:val="382065B9"/>
     <w:multiLevelType w:val="hybridMultilevel"/>
     <w:tmpl w:val="71C28E6E"/>
@@ -25360,7 +25957,7 @@
       </w:rPr>
     </w:lvl>
   </w:abstractNum>
-  <w:abstractNum w:abstractNumId="81" w15:restartNumberingAfterBreak="0">
+  <w:abstractNum w:abstractNumId="82" w15:restartNumberingAfterBreak="0">
     <w:nsid w:val="3B446B2D"/>
     <w:multiLevelType w:val="hybridMultilevel"/>
     <w:tmpl w:val="B638176E"/>
@@ -25472,7 +26069,7 @@
       </w:rPr>
     </w:lvl>
   </w:abstractNum>
-  <w:abstractNum w:abstractNumId="82" w15:restartNumberingAfterBreak="0">
+  <w:abstractNum w:abstractNumId="83" w15:restartNumberingAfterBreak="0">
     <w:nsid w:val="3B6B41F5"/>
     <w:multiLevelType w:val="hybridMultilevel"/>
     <w:tmpl w:val="10A26168"/>
@@ -25584,7 +26181,7 @@
       </w:rPr>
     </w:lvl>
   </w:abstractNum>
-  <w:abstractNum w:abstractNumId="83" w15:restartNumberingAfterBreak="0">
+  <w:abstractNum w:abstractNumId="84" w15:restartNumberingAfterBreak="0">
     <w:nsid w:val="3BCD79E4"/>
     <w:multiLevelType w:val="hybridMultilevel"/>
     <w:tmpl w:val="FFFAC2AC"/>
@@ -25697,7 +26294,7 @@
       </w:rPr>
     </w:lvl>
   </w:abstractNum>
-  <w:abstractNum w:abstractNumId="84" w15:restartNumberingAfterBreak="0">
+  <w:abstractNum w:abstractNumId="85" w15:restartNumberingAfterBreak="0">
     <w:nsid w:val="3C5546BA"/>
     <w:multiLevelType w:val="hybridMultilevel"/>
     <w:tmpl w:val="3434F5E4"/>
@@ -25809,7 +26406,7 @@
       </w:rPr>
     </w:lvl>
   </w:abstractNum>
-  <w:abstractNum w:abstractNumId="85" w15:restartNumberingAfterBreak="0">
+  <w:abstractNum w:abstractNumId="86" w15:restartNumberingAfterBreak="0">
     <w:nsid w:val="3C623C55"/>
     <w:multiLevelType w:val="multilevel"/>
     <w:tmpl w:val="A0B0E8F4"/>
@@ -25958,7 +26555,7 @@
       </w:rPr>
     </w:lvl>
   </w:abstractNum>
-  <w:abstractNum w:abstractNumId="86" w15:restartNumberingAfterBreak="0">
+  <w:abstractNum w:abstractNumId="87" w15:restartNumberingAfterBreak="0">
     <w:nsid w:val="3CD27F78"/>
     <w:multiLevelType w:val="multilevel"/>
     <w:tmpl w:val="FCDE767A"/>
@@ -26107,7 +26704,7 @@
       </w:rPr>
     </w:lvl>
   </w:abstractNum>
-  <w:abstractNum w:abstractNumId="87" w15:restartNumberingAfterBreak="0">
+  <w:abstractNum w:abstractNumId="88" w15:restartNumberingAfterBreak="0">
     <w:nsid w:val="3CD74B18"/>
     <w:multiLevelType w:val="hybridMultilevel"/>
     <w:tmpl w:val="2FF42220"/>
@@ -26220,7 +26817,7 @@
       </w:rPr>
     </w:lvl>
   </w:abstractNum>
-  <w:abstractNum w:abstractNumId="88" w15:restartNumberingAfterBreak="0">
+  <w:abstractNum w:abstractNumId="89" w15:restartNumberingAfterBreak="0">
     <w:nsid w:val="3D2F7E79"/>
     <w:multiLevelType w:val="hybridMultilevel"/>
     <w:tmpl w:val="6ED674BE"/>
@@ -26332,7 +26929,7 @@
       </w:rPr>
     </w:lvl>
   </w:abstractNum>
-  <w:abstractNum w:abstractNumId="89" w15:restartNumberingAfterBreak="0">
+  <w:abstractNum w:abstractNumId="90" w15:restartNumberingAfterBreak="0">
     <w:nsid w:val="3D397287"/>
     <w:multiLevelType w:val="hybridMultilevel"/>
     <w:tmpl w:val="F4503122"/>
@@ -26444,7 +27041,7 @@
       </w:rPr>
     </w:lvl>
   </w:abstractNum>
-  <w:abstractNum w:abstractNumId="90" w15:restartNumberingAfterBreak="0">
+  <w:abstractNum w:abstractNumId="91" w15:restartNumberingAfterBreak="0">
     <w:nsid w:val="3DC14EA1"/>
     <w:multiLevelType w:val="hybridMultilevel"/>
     <w:tmpl w:val="DCAE9528"/>
@@ -26557,7 +27154,7 @@
       </w:rPr>
     </w:lvl>
   </w:abstractNum>
-  <w:abstractNum w:abstractNumId="91" w15:restartNumberingAfterBreak="0">
+  <w:abstractNum w:abstractNumId="92" w15:restartNumberingAfterBreak="0">
     <w:nsid w:val="3E685FF3"/>
     <w:multiLevelType w:val="multilevel"/>
     <w:tmpl w:val="7D20B538"/>
@@ -26706,7 +27303,7 @@
       </w:rPr>
     </w:lvl>
   </w:abstractNum>
-  <w:abstractNum w:abstractNumId="92" w15:restartNumberingAfterBreak="0">
+  <w:abstractNum w:abstractNumId="93" w15:restartNumberingAfterBreak="0">
     <w:nsid w:val="3F20785F"/>
     <w:multiLevelType w:val="hybridMultilevel"/>
     <w:tmpl w:val="49D612FC"/>
@@ -26819,7 +27416,7 @@
       </w:rPr>
     </w:lvl>
   </w:abstractNum>
-  <w:abstractNum w:abstractNumId="93" w15:restartNumberingAfterBreak="0">
+  <w:abstractNum w:abstractNumId="94" w15:restartNumberingAfterBreak="0">
     <w:nsid w:val="3F346C2C"/>
     <w:multiLevelType w:val="multilevel"/>
     <w:tmpl w:val="63F4E6F0"/>
@@ -26968,7 +27565,7 @@
       </w:rPr>
     </w:lvl>
   </w:abstractNum>
-  <w:abstractNum w:abstractNumId="94" w15:restartNumberingAfterBreak="0">
+  <w:abstractNum w:abstractNumId="95" w15:restartNumberingAfterBreak="0">
     <w:nsid w:val="3FCB1322"/>
     <w:multiLevelType w:val="hybridMultilevel"/>
     <w:tmpl w:val="55C012B2"/>
@@ -27080,7 +27677,7 @@
       </w:rPr>
     </w:lvl>
   </w:abstractNum>
-  <w:abstractNum w:abstractNumId="95" w15:restartNumberingAfterBreak="0">
+  <w:abstractNum w:abstractNumId="96" w15:restartNumberingAfterBreak="0">
     <w:nsid w:val="403501BA"/>
     <w:multiLevelType w:val="hybridMultilevel"/>
     <w:tmpl w:val="D95E90BC"/>
@@ -27193,7 +27790,7 @@
       </w:rPr>
     </w:lvl>
   </w:abstractNum>
-  <w:abstractNum w:abstractNumId="96" w15:restartNumberingAfterBreak="0">
+  <w:abstractNum w:abstractNumId="97" w15:restartNumberingAfterBreak="0">
     <w:nsid w:val="41A9344F"/>
     <w:multiLevelType w:val="hybridMultilevel"/>
     <w:tmpl w:val="0FB60038"/>
@@ -27306,7 +27903,7 @@
       </w:rPr>
     </w:lvl>
   </w:abstractNum>
-  <w:abstractNum w:abstractNumId="97" w15:restartNumberingAfterBreak="0">
+  <w:abstractNum w:abstractNumId="98" w15:restartNumberingAfterBreak="0">
     <w:nsid w:val="41B44F72"/>
     <w:multiLevelType w:val="hybridMultilevel"/>
     <w:tmpl w:val="1F58F614"/>
@@ -27420,7 +28017,7 @@
       </w:rPr>
     </w:lvl>
   </w:abstractNum>
-  <w:abstractNum w:abstractNumId="98" w15:restartNumberingAfterBreak="0">
+  <w:abstractNum w:abstractNumId="99" w15:restartNumberingAfterBreak="0">
     <w:nsid w:val="42004E1F"/>
     <w:multiLevelType w:val="hybridMultilevel"/>
     <w:tmpl w:val="770C8314"/>
@@ -27532,7 +28129,7 @@
       </w:rPr>
     </w:lvl>
   </w:abstractNum>
-  <w:abstractNum w:abstractNumId="99" w15:restartNumberingAfterBreak="0">
+  <w:abstractNum w:abstractNumId="100" w15:restartNumberingAfterBreak="0">
     <w:nsid w:val="439F7169"/>
     <w:multiLevelType w:val="hybridMultilevel"/>
     <w:tmpl w:val="1884EDCA"/>
@@ -27645,7 +28242,7 @@
       </w:rPr>
     </w:lvl>
   </w:abstractNum>
-  <w:abstractNum w:abstractNumId="100" w15:restartNumberingAfterBreak="0">
+  <w:abstractNum w:abstractNumId="101" w15:restartNumberingAfterBreak="0">
     <w:nsid w:val="43EA1D69"/>
     <w:multiLevelType w:val="multilevel"/>
     <w:tmpl w:val="DFEC23EC"/>
@@ -27794,7 +28391,7 @@
       </w:rPr>
     </w:lvl>
   </w:abstractNum>
-  <w:abstractNum w:abstractNumId="101" w15:restartNumberingAfterBreak="0">
+  <w:abstractNum w:abstractNumId="102" w15:restartNumberingAfterBreak="0">
     <w:nsid w:val="44320084"/>
     <w:multiLevelType w:val="hybridMultilevel"/>
     <w:tmpl w:val="CE5076D4"/>
@@ -27906,7 +28503,7 @@
       </w:rPr>
     </w:lvl>
   </w:abstractNum>
-  <w:abstractNum w:abstractNumId="102" w15:restartNumberingAfterBreak="0">
+  <w:abstractNum w:abstractNumId="103" w15:restartNumberingAfterBreak="0">
     <w:nsid w:val="44554567"/>
     <w:multiLevelType w:val="hybridMultilevel"/>
     <w:tmpl w:val="78748252"/>
@@ -28018,7 +28615,7 @@
       </w:rPr>
     </w:lvl>
   </w:abstractNum>
-  <w:abstractNum w:abstractNumId="103" w15:restartNumberingAfterBreak="0">
+  <w:abstractNum w:abstractNumId="104" w15:restartNumberingAfterBreak="0">
     <w:nsid w:val="49005094"/>
     <w:multiLevelType w:val="hybridMultilevel"/>
     <w:tmpl w:val="14848CBE"/>
@@ -28130,7 +28727,7 @@
       </w:rPr>
     </w:lvl>
   </w:abstractNum>
-  <w:abstractNum w:abstractNumId="104" w15:restartNumberingAfterBreak="0">
+  <w:abstractNum w:abstractNumId="105" w15:restartNumberingAfterBreak="0">
     <w:nsid w:val="49243794"/>
     <w:multiLevelType w:val="multilevel"/>
     <w:tmpl w:val="E7681528"/>
@@ -28279,7 +28876,7 @@
       </w:rPr>
     </w:lvl>
   </w:abstractNum>
-  <w:abstractNum w:abstractNumId="105" w15:restartNumberingAfterBreak="0">
+  <w:abstractNum w:abstractNumId="106" w15:restartNumberingAfterBreak="0">
     <w:nsid w:val="4A880990"/>
     <w:multiLevelType w:val="hybridMultilevel"/>
     <w:tmpl w:val="F17E12C2"/>
@@ -28391,7 +28988,7 @@
       </w:rPr>
     </w:lvl>
   </w:abstractNum>
-  <w:abstractNum w:abstractNumId="106" w15:restartNumberingAfterBreak="0">
+  <w:abstractNum w:abstractNumId="107" w15:restartNumberingAfterBreak="0">
     <w:nsid w:val="4B182B12"/>
     <w:multiLevelType w:val="hybridMultilevel"/>
     <w:tmpl w:val="31C486B4"/>
@@ -28503,7 +29100,7 @@
       </w:rPr>
     </w:lvl>
   </w:abstractNum>
-  <w:abstractNum w:abstractNumId="107" w15:restartNumberingAfterBreak="0">
+  <w:abstractNum w:abstractNumId="108" w15:restartNumberingAfterBreak="0">
     <w:nsid w:val="4B6E6D62"/>
     <w:multiLevelType w:val="hybridMultilevel"/>
     <w:tmpl w:val="54DC0C0C"/>
@@ -28616,7 +29213,7 @@
       </w:rPr>
     </w:lvl>
   </w:abstractNum>
-  <w:abstractNum w:abstractNumId="108" w15:restartNumberingAfterBreak="0">
+  <w:abstractNum w:abstractNumId="109" w15:restartNumberingAfterBreak="0">
     <w:nsid w:val="4BA13766"/>
     <w:multiLevelType w:val="multilevel"/>
     <w:tmpl w:val="63F4E6F0"/>
@@ -28765,7 +29362,7 @@
       </w:rPr>
     </w:lvl>
   </w:abstractNum>
-  <w:abstractNum w:abstractNumId="109" w15:restartNumberingAfterBreak="0">
+  <w:abstractNum w:abstractNumId="110" w15:restartNumberingAfterBreak="0">
     <w:nsid w:val="4D2E1CBE"/>
     <w:multiLevelType w:val="hybridMultilevel"/>
     <w:tmpl w:val="BFD86D7C"/>
@@ -28878,7 +29475,7 @@
       </w:rPr>
     </w:lvl>
   </w:abstractNum>
-  <w:abstractNum w:abstractNumId="110" w15:restartNumberingAfterBreak="0">
+  <w:abstractNum w:abstractNumId="111" w15:restartNumberingAfterBreak="0">
     <w:nsid w:val="4E65371E"/>
     <w:multiLevelType w:val="hybridMultilevel"/>
     <w:tmpl w:val="53EE4538"/>
@@ -28990,7 +29587,7 @@
       </w:rPr>
     </w:lvl>
   </w:abstractNum>
-  <w:abstractNum w:abstractNumId="111" w15:restartNumberingAfterBreak="0">
+  <w:abstractNum w:abstractNumId="112" w15:restartNumberingAfterBreak="0">
     <w:nsid w:val="4E9A3F16"/>
     <w:multiLevelType w:val="multilevel"/>
     <w:tmpl w:val="63F4E6F0"/>
@@ -29139,7 +29736,7 @@
       </w:rPr>
     </w:lvl>
   </w:abstractNum>
-  <w:abstractNum w:abstractNumId="112" w15:restartNumberingAfterBreak="0">
+  <w:abstractNum w:abstractNumId="113" w15:restartNumberingAfterBreak="0">
     <w:nsid w:val="500B790D"/>
     <w:multiLevelType w:val="multilevel"/>
     <w:tmpl w:val="63F4E6F0"/>
@@ -29288,7 +29885,7 @@
       </w:rPr>
     </w:lvl>
   </w:abstractNum>
-  <w:abstractNum w:abstractNumId="113" w15:restartNumberingAfterBreak="0">
+  <w:abstractNum w:abstractNumId="114" w15:restartNumberingAfterBreak="0">
     <w:nsid w:val="5037150E"/>
     <w:multiLevelType w:val="hybridMultilevel"/>
     <w:tmpl w:val="064034F8"/>
@@ -29401,7 +29998,7 @@
       </w:rPr>
     </w:lvl>
   </w:abstractNum>
-  <w:abstractNum w:abstractNumId="114" w15:restartNumberingAfterBreak="0">
+  <w:abstractNum w:abstractNumId="115" w15:restartNumberingAfterBreak="0">
     <w:nsid w:val="50A931C8"/>
     <w:multiLevelType w:val="hybridMultilevel"/>
     <w:tmpl w:val="ED3217DE"/>
@@ -29514,7 +30111,7 @@
       </w:rPr>
     </w:lvl>
   </w:abstractNum>
-  <w:abstractNum w:abstractNumId="115" w15:restartNumberingAfterBreak="0">
+  <w:abstractNum w:abstractNumId="116" w15:restartNumberingAfterBreak="0">
     <w:nsid w:val="51417BE1"/>
     <w:multiLevelType w:val="multilevel"/>
     <w:tmpl w:val="993C0E80"/>
@@ -29663,7 +30260,7 @@
       </w:rPr>
     </w:lvl>
   </w:abstractNum>
-  <w:abstractNum w:abstractNumId="116" w15:restartNumberingAfterBreak="0">
+  <w:abstractNum w:abstractNumId="117" w15:restartNumberingAfterBreak="0">
     <w:nsid w:val="526538B7"/>
     <w:multiLevelType w:val="hybridMultilevel"/>
     <w:tmpl w:val="E6A017F2"/>
@@ -29776,7 +30373,7 @@
       </w:rPr>
     </w:lvl>
   </w:abstractNum>
-  <w:abstractNum w:abstractNumId="117" w15:restartNumberingAfterBreak="0">
+  <w:abstractNum w:abstractNumId="118" w15:restartNumberingAfterBreak="0">
     <w:nsid w:val="537E56D9"/>
     <w:multiLevelType w:val="multilevel"/>
     <w:tmpl w:val="1B6E8B6A"/>
@@ -29925,7 +30522,7 @@
       </w:rPr>
     </w:lvl>
   </w:abstractNum>
-  <w:abstractNum w:abstractNumId="118" w15:restartNumberingAfterBreak="0">
+  <w:abstractNum w:abstractNumId="119" w15:restartNumberingAfterBreak="0">
     <w:nsid w:val="53E6601E"/>
     <w:multiLevelType w:val="hybridMultilevel"/>
     <w:tmpl w:val="66F0666A"/>
@@ -30038,7 +30635,7 @@
       </w:rPr>
     </w:lvl>
   </w:abstractNum>
-  <w:abstractNum w:abstractNumId="119" w15:restartNumberingAfterBreak="0">
+  <w:abstractNum w:abstractNumId="120" w15:restartNumberingAfterBreak="0">
     <w:nsid w:val="551D6F91"/>
     <w:multiLevelType w:val="hybridMultilevel"/>
     <w:tmpl w:val="9522B3C6"/>
@@ -30150,7 +30747,7 @@
       </w:rPr>
     </w:lvl>
   </w:abstractNum>
-  <w:abstractNum w:abstractNumId="120" w15:restartNumberingAfterBreak="0">
+  <w:abstractNum w:abstractNumId="121" w15:restartNumberingAfterBreak="0">
     <w:nsid w:val="5546258F"/>
     <w:multiLevelType w:val="multilevel"/>
     <w:tmpl w:val="0CAA196E"/>
@@ -30299,7 +30896,7 @@
       </w:rPr>
     </w:lvl>
   </w:abstractNum>
-  <w:abstractNum w:abstractNumId="121" w15:restartNumberingAfterBreak="0">
+  <w:abstractNum w:abstractNumId="122" w15:restartNumberingAfterBreak="0">
     <w:nsid w:val="55655B93"/>
     <w:multiLevelType w:val="multilevel"/>
     <w:tmpl w:val="9C88A4A8"/>
@@ -30448,7 +31045,7 @@
       </w:rPr>
     </w:lvl>
   </w:abstractNum>
-  <w:abstractNum w:abstractNumId="122" w15:restartNumberingAfterBreak="0">
+  <w:abstractNum w:abstractNumId="123" w15:restartNumberingAfterBreak="0">
     <w:nsid w:val="562D4F1F"/>
     <w:multiLevelType w:val="hybridMultilevel"/>
     <w:tmpl w:val="1FF8D31C"/>
@@ -30560,7 +31157,7 @@
       </w:rPr>
     </w:lvl>
   </w:abstractNum>
-  <w:abstractNum w:abstractNumId="123" w15:restartNumberingAfterBreak="0">
+  <w:abstractNum w:abstractNumId="124" w15:restartNumberingAfterBreak="0">
     <w:nsid w:val="565A0C8B"/>
     <w:multiLevelType w:val="multilevel"/>
     <w:tmpl w:val="AB24FF2E"/>
@@ -30709,7 +31306,7 @@
       </w:rPr>
     </w:lvl>
   </w:abstractNum>
-  <w:abstractNum w:abstractNumId="124" w15:restartNumberingAfterBreak="0">
+  <w:abstractNum w:abstractNumId="125" w15:restartNumberingAfterBreak="0">
     <w:nsid w:val="566E7C65"/>
     <w:multiLevelType w:val="multilevel"/>
     <w:tmpl w:val="28803B4C"/>
@@ -30858,7 +31455,7 @@
       </w:rPr>
     </w:lvl>
   </w:abstractNum>
-  <w:abstractNum w:abstractNumId="125" w15:restartNumberingAfterBreak="0">
+  <w:abstractNum w:abstractNumId="126" w15:restartNumberingAfterBreak="0">
     <w:nsid w:val="57407594"/>
     <w:multiLevelType w:val="multilevel"/>
     <w:tmpl w:val="E6E2F8AE"/>
@@ -31007,7 +31604,7 @@
       </w:rPr>
     </w:lvl>
   </w:abstractNum>
-  <w:abstractNum w:abstractNumId="126" w15:restartNumberingAfterBreak="0">
+  <w:abstractNum w:abstractNumId="127" w15:restartNumberingAfterBreak="0">
     <w:nsid w:val="5773128C"/>
     <w:multiLevelType w:val="hybridMultilevel"/>
     <w:tmpl w:val="945E5C1E"/>
@@ -31120,7 +31717,7 @@
       </w:rPr>
     </w:lvl>
   </w:abstractNum>
-  <w:abstractNum w:abstractNumId="127" w15:restartNumberingAfterBreak="0">
+  <w:abstractNum w:abstractNumId="128" w15:restartNumberingAfterBreak="0">
     <w:nsid w:val="577F771B"/>
     <w:multiLevelType w:val="hybridMultilevel"/>
     <w:tmpl w:val="0F2C5914"/>
@@ -31232,7 +31829,7 @@
       </w:rPr>
     </w:lvl>
   </w:abstractNum>
-  <w:abstractNum w:abstractNumId="128" w15:restartNumberingAfterBreak="0">
+  <w:abstractNum w:abstractNumId="129" w15:restartNumberingAfterBreak="0">
     <w:nsid w:val="57C43CDD"/>
     <w:multiLevelType w:val="hybridMultilevel"/>
     <w:tmpl w:val="6C94FB5E"/>
@@ -31345,7 +31942,7 @@
       </w:rPr>
     </w:lvl>
   </w:abstractNum>
-  <w:abstractNum w:abstractNumId="129" w15:restartNumberingAfterBreak="0">
+  <w:abstractNum w:abstractNumId="130" w15:restartNumberingAfterBreak="0">
     <w:nsid w:val="58393977"/>
     <w:multiLevelType w:val="hybridMultilevel"/>
     <w:tmpl w:val="985A5484"/>
@@ -31458,7 +32055,7 @@
       </w:rPr>
     </w:lvl>
   </w:abstractNum>
-  <w:abstractNum w:abstractNumId="130" w15:restartNumberingAfterBreak="0">
+  <w:abstractNum w:abstractNumId="131" w15:restartNumberingAfterBreak="0">
     <w:nsid w:val="59AB4A55"/>
     <w:multiLevelType w:val="hybridMultilevel"/>
     <w:tmpl w:val="B6486CD6"/>
@@ -31571,7 +32168,7 @@
       </w:rPr>
     </w:lvl>
   </w:abstractNum>
-  <w:abstractNum w:abstractNumId="131" w15:restartNumberingAfterBreak="0">
+  <w:abstractNum w:abstractNumId="132" w15:restartNumberingAfterBreak="0">
     <w:nsid w:val="59EB4CE4"/>
     <w:multiLevelType w:val="multilevel"/>
     <w:tmpl w:val="63F4E6F0"/>
@@ -31720,7 +32317,7 @@
       </w:rPr>
     </w:lvl>
   </w:abstractNum>
-  <w:abstractNum w:abstractNumId="132" w15:restartNumberingAfterBreak="0">
+  <w:abstractNum w:abstractNumId="133" w15:restartNumberingAfterBreak="0">
     <w:nsid w:val="59EC6D60"/>
     <w:multiLevelType w:val="hybridMultilevel"/>
     <w:tmpl w:val="97E6E6DE"/>
@@ -31833,7 +32430,7 @@
       </w:rPr>
     </w:lvl>
   </w:abstractNum>
-  <w:abstractNum w:abstractNumId="133" w15:restartNumberingAfterBreak="0">
+  <w:abstractNum w:abstractNumId="134" w15:restartNumberingAfterBreak="0">
     <w:nsid w:val="5BD11962"/>
     <w:multiLevelType w:val="hybridMultilevel"/>
     <w:tmpl w:val="89A4B834"/>
@@ -31922,7 +32519,7 @@
       </w:pPr>
     </w:lvl>
   </w:abstractNum>
-  <w:abstractNum w:abstractNumId="134" w15:restartNumberingAfterBreak="0">
+  <w:abstractNum w:abstractNumId="135" w15:restartNumberingAfterBreak="0">
     <w:nsid w:val="5C950DBA"/>
     <w:multiLevelType w:val="hybridMultilevel"/>
     <w:tmpl w:val="7D78F950"/>
@@ -32034,7 +32631,7 @@
       </w:rPr>
     </w:lvl>
   </w:abstractNum>
-  <w:abstractNum w:abstractNumId="135" w15:restartNumberingAfterBreak="0">
+  <w:abstractNum w:abstractNumId="136" w15:restartNumberingAfterBreak="0">
     <w:nsid w:val="5D2A5D3B"/>
     <w:multiLevelType w:val="hybridMultilevel"/>
     <w:tmpl w:val="3AF89EA6"/>
@@ -32125,7 +32722,7 @@
       </w:pPr>
     </w:lvl>
   </w:abstractNum>
-  <w:abstractNum w:abstractNumId="136" w15:restartNumberingAfterBreak="0">
+  <w:abstractNum w:abstractNumId="137" w15:restartNumberingAfterBreak="0">
     <w:nsid w:val="5D9E49FD"/>
     <w:multiLevelType w:val="hybridMultilevel"/>
     <w:tmpl w:val="4EE40BB4"/>
@@ -32237,7 +32834,7 @@
       </w:rPr>
     </w:lvl>
   </w:abstractNum>
-  <w:abstractNum w:abstractNumId="137" w15:restartNumberingAfterBreak="0">
+  <w:abstractNum w:abstractNumId="138" w15:restartNumberingAfterBreak="0">
     <w:nsid w:val="5DB7107D"/>
     <w:multiLevelType w:val="multilevel"/>
     <w:tmpl w:val="6520107A"/>
@@ -32386,7 +32983,7 @@
       </w:rPr>
     </w:lvl>
   </w:abstractNum>
-  <w:abstractNum w:abstractNumId="138" w15:restartNumberingAfterBreak="0">
+  <w:abstractNum w:abstractNumId="139" w15:restartNumberingAfterBreak="0">
     <w:nsid w:val="60421322"/>
     <w:multiLevelType w:val="hybridMultilevel"/>
     <w:tmpl w:val="447CDBDC"/>
@@ -32498,7 +33095,7 @@
       </w:rPr>
     </w:lvl>
   </w:abstractNum>
-  <w:abstractNum w:abstractNumId="139" w15:restartNumberingAfterBreak="0">
+  <w:abstractNum w:abstractNumId="140" w15:restartNumberingAfterBreak="0">
     <w:nsid w:val="60B43772"/>
     <w:multiLevelType w:val="hybridMultilevel"/>
     <w:tmpl w:val="04FC7310"/>
@@ -32612,7 +33209,7 @@
       </w:rPr>
     </w:lvl>
   </w:abstractNum>
-  <w:abstractNum w:abstractNumId="140" w15:restartNumberingAfterBreak="0">
+  <w:abstractNum w:abstractNumId="141" w15:restartNumberingAfterBreak="0">
     <w:nsid w:val="61926C31"/>
     <w:multiLevelType w:val="hybridMultilevel"/>
     <w:tmpl w:val="AFD27E5C"/>
@@ -32725,7 +33322,7 @@
       </w:rPr>
     </w:lvl>
   </w:abstractNum>
-  <w:abstractNum w:abstractNumId="141" w15:restartNumberingAfterBreak="0">
+  <w:abstractNum w:abstractNumId="142" w15:restartNumberingAfterBreak="0">
     <w:nsid w:val="622F5FC7"/>
     <w:multiLevelType w:val="hybridMultilevel"/>
     <w:tmpl w:val="49A6C2A6"/>
@@ -32838,7 +33435,7 @@
       </w:rPr>
     </w:lvl>
   </w:abstractNum>
-  <w:abstractNum w:abstractNumId="142" w15:restartNumberingAfterBreak="0">
+  <w:abstractNum w:abstractNumId="143" w15:restartNumberingAfterBreak="0">
     <w:nsid w:val="623A0E20"/>
     <w:multiLevelType w:val="hybridMultilevel"/>
     <w:tmpl w:val="3E360542"/>
@@ -32951,7 +33548,7 @@
       </w:rPr>
     </w:lvl>
   </w:abstractNum>
-  <w:abstractNum w:abstractNumId="143" w15:restartNumberingAfterBreak="0">
+  <w:abstractNum w:abstractNumId="144" w15:restartNumberingAfterBreak="0">
     <w:nsid w:val="62AC33B4"/>
     <w:multiLevelType w:val="multilevel"/>
     <w:tmpl w:val="A074F3CA"/>
@@ -33100,7 +33697,7 @@
       </w:rPr>
     </w:lvl>
   </w:abstractNum>
-  <w:abstractNum w:abstractNumId="144" w15:restartNumberingAfterBreak="0">
+  <w:abstractNum w:abstractNumId="145" w15:restartNumberingAfterBreak="0">
     <w:nsid w:val="63B44674"/>
     <w:multiLevelType w:val="multilevel"/>
     <w:tmpl w:val="08F4FA9A"/>
@@ -33249,7 +33846,7 @@
       </w:rPr>
     </w:lvl>
   </w:abstractNum>
-  <w:abstractNum w:abstractNumId="145" w15:restartNumberingAfterBreak="0">
+  <w:abstractNum w:abstractNumId="146" w15:restartNumberingAfterBreak="0">
     <w:nsid w:val="63C245D4"/>
     <w:multiLevelType w:val="hybridMultilevel"/>
     <w:tmpl w:val="E1563A56"/>
@@ -33361,7 +33958,7 @@
       </w:rPr>
     </w:lvl>
   </w:abstractNum>
-  <w:abstractNum w:abstractNumId="146" w15:restartNumberingAfterBreak="0">
+  <w:abstractNum w:abstractNumId="147" w15:restartNumberingAfterBreak="0">
     <w:nsid w:val="645F5F11"/>
     <w:multiLevelType w:val="hybridMultilevel"/>
     <w:tmpl w:val="D3423512"/>
@@ -33474,7 +34071,7 @@
       </w:rPr>
     </w:lvl>
   </w:abstractNum>
-  <w:abstractNum w:abstractNumId="147" w15:restartNumberingAfterBreak="0">
+  <w:abstractNum w:abstractNumId="148" w15:restartNumberingAfterBreak="0">
     <w:nsid w:val="64F30198"/>
     <w:multiLevelType w:val="multilevel"/>
     <w:tmpl w:val="63F4E6F0"/>
@@ -33623,7 +34220,7 @@
       </w:rPr>
     </w:lvl>
   </w:abstractNum>
-  <w:abstractNum w:abstractNumId="148" w15:restartNumberingAfterBreak="0">
+  <w:abstractNum w:abstractNumId="149" w15:restartNumberingAfterBreak="0">
     <w:nsid w:val="65AF2502"/>
     <w:multiLevelType w:val="hybridMultilevel"/>
     <w:tmpl w:val="FB2A44D8"/>
@@ -33736,7 +34333,7 @@
       </w:rPr>
     </w:lvl>
   </w:abstractNum>
-  <w:abstractNum w:abstractNumId="149" w15:restartNumberingAfterBreak="0">
+  <w:abstractNum w:abstractNumId="150" w15:restartNumberingAfterBreak="0">
     <w:nsid w:val="65E53C08"/>
     <w:multiLevelType w:val="hybridMultilevel"/>
     <w:tmpl w:val="8A44FBE2"/>
@@ -33849,7 +34446,7 @@
       </w:rPr>
     </w:lvl>
   </w:abstractNum>
-  <w:abstractNum w:abstractNumId="150" w15:restartNumberingAfterBreak="0">
+  <w:abstractNum w:abstractNumId="151" w15:restartNumberingAfterBreak="0">
     <w:nsid w:val="671614F0"/>
     <w:multiLevelType w:val="multilevel"/>
     <w:tmpl w:val="63F4E6F0"/>
@@ -33998,7 +34595,7 @@
       </w:rPr>
     </w:lvl>
   </w:abstractNum>
-  <w:abstractNum w:abstractNumId="151" w15:restartNumberingAfterBreak="0">
+  <w:abstractNum w:abstractNumId="152" w15:restartNumberingAfterBreak="0">
     <w:nsid w:val="6859691D"/>
     <w:multiLevelType w:val="multilevel"/>
     <w:tmpl w:val="826A9D48"/>
@@ -34147,7 +34744,7 @@
       </w:rPr>
     </w:lvl>
   </w:abstractNum>
-  <w:abstractNum w:abstractNumId="152" w15:restartNumberingAfterBreak="0">
+  <w:abstractNum w:abstractNumId="153" w15:restartNumberingAfterBreak="0">
     <w:nsid w:val="68817757"/>
     <w:multiLevelType w:val="multilevel"/>
     <w:tmpl w:val="34EE1968"/>
@@ -34296,7 +34893,7 @@
       </w:rPr>
     </w:lvl>
   </w:abstractNum>
-  <w:abstractNum w:abstractNumId="153" w15:restartNumberingAfterBreak="0">
+  <w:abstractNum w:abstractNumId="154" w15:restartNumberingAfterBreak="0">
     <w:nsid w:val="68BE10E8"/>
     <w:multiLevelType w:val="hybridMultilevel"/>
     <w:tmpl w:val="326CD592"/>
@@ -34409,7 +35006,7 @@
       </w:rPr>
     </w:lvl>
   </w:abstractNum>
-  <w:abstractNum w:abstractNumId="154" w15:restartNumberingAfterBreak="0">
+  <w:abstractNum w:abstractNumId="155" w15:restartNumberingAfterBreak="0">
     <w:nsid w:val="69996D9A"/>
     <w:multiLevelType w:val="multilevel"/>
     <w:tmpl w:val="1780FC38"/>
@@ -34558,7 +35155,7 @@
       </w:rPr>
     </w:lvl>
   </w:abstractNum>
-  <w:abstractNum w:abstractNumId="155" w15:restartNumberingAfterBreak="0">
+  <w:abstractNum w:abstractNumId="156" w15:restartNumberingAfterBreak="0">
     <w:nsid w:val="6B3C30B9"/>
     <w:multiLevelType w:val="hybridMultilevel"/>
     <w:tmpl w:val="C938F8DE"/>
@@ -34670,7 +35267,7 @@
       </w:rPr>
     </w:lvl>
   </w:abstractNum>
-  <w:abstractNum w:abstractNumId="156" w15:restartNumberingAfterBreak="0">
+  <w:abstractNum w:abstractNumId="157" w15:restartNumberingAfterBreak="0">
     <w:nsid w:val="6D1511A0"/>
     <w:multiLevelType w:val="hybridMultilevel"/>
     <w:tmpl w:val="AAD8B9B4"/>
@@ -34782,7 +35379,7 @@
       </w:rPr>
     </w:lvl>
   </w:abstractNum>
-  <w:abstractNum w:abstractNumId="157" w15:restartNumberingAfterBreak="0">
+  <w:abstractNum w:abstractNumId="158" w15:restartNumberingAfterBreak="0">
     <w:nsid w:val="6DD255F1"/>
     <w:multiLevelType w:val="hybridMultilevel"/>
     <w:tmpl w:val="ACBC1404"/>
@@ -34895,7 +35492,7 @@
       </w:rPr>
     </w:lvl>
   </w:abstractNum>
-  <w:abstractNum w:abstractNumId="158" w15:restartNumberingAfterBreak="0">
+  <w:abstractNum w:abstractNumId="159" w15:restartNumberingAfterBreak="0">
     <w:nsid w:val="6DDB4404"/>
     <w:multiLevelType w:val="hybridMultilevel"/>
     <w:tmpl w:val="06428E32"/>
@@ -35008,7 +35605,7 @@
       </w:rPr>
     </w:lvl>
   </w:abstractNum>
-  <w:abstractNum w:abstractNumId="159" w15:restartNumberingAfterBreak="0">
+  <w:abstractNum w:abstractNumId="160" w15:restartNumberingAfterBreak="0">
     <w:nsid w:val="6EE2159D"/>
     <w:multiLevelType w:val="hybridMultilevel"/>
     <w:tmpl w:val="36C69320"/>
@@ -35121,7 +35718,7 @@
       </w:rPr>
     </w:lvl>
   </w:abstractNum>
-  <w:abstractNum w:abstractNumId="160" w15:restartNumberingAfterBreak="0">
+  <w:abstractNum w:abstractNumId="161" w15:restartNumberingAfterBreak="0">
     <w:nsid w:val="6F014B3B"/>
     <w:multiLevelType w:val="hybridMultilevel"/>
     <w:tmpl w:val="C89A39BE"/>
@@ -35233,7 +35830,7 @@
       </w:rPr>
     </w:lvl>
   </w:abstractNum>
-  <w:abstractNum w:abstractNumId="161" w15:restartNumberingAfterBreak="0">
+  <w:abstractNum w:abstractNumId="162" w15:restartNumberingAfterBreak="0">
     <w:nsid w:val="6F171273"/>
     <w:multiLevelType w:val="multilevel"/>
     <w:tmpl w:val="0240C564"/>
@@ -35382,7 +35979,7 @@
       </w:rPr>
     </w:lvl>
   </w:abstractNum>
-  <w:abstractNum w:abstractNumId="162" w15:restartNumberingAfterBreak="0">
+  <w:abstractNum w:abstractNumId="163" w15:restartNumberingAfterBreak="0">
     <w:nsid w:val="6FB82AAA"/>
     <w:multiLevelType w:val="multilevel"/>
     <w:tmpl w:val="FC46C7C0"/>
@@ -35531,7 +36128,7 @@
       </w:rPr>
     </w:lvl>
   </w:abstractNum>
-  <w:abstractNum w:abstractNumId="163" w15:restartNumberingAfterBreak="0">
+  <w:abstractNum w:abstractNumId="164" w15:restartNumberingAfterBreak="0">
     <w:nsid w:val="6FD46DCF"/>
     <w:multiLevelType w:val="hybridMultilevel"/>
     <w:tmpl w:val="EF5E6EC6"/>
@@ -35644,7 +36241,7 @@
       </w:rPr>
     </w:lvl>
   </w:abstractNum>
-  <w:abstractNum w:abstractNumId="164" w15:restartNumberingAfterBreak="0">
+  <w:abstractNum w:abstractNumId="165" w15:restartNumberingAfterBreak="0">
     <w:nsid w:val="70484E38"/>
     <w:multiLevelType w:val="multilevel"/>
     <w:tmpl w:val="22B26DD2"/>
@@ -35793,7 +36390,7 @@
       </w:rPr>
     </w:lvl>
   </w:abstractNum>
-  <w:abstractNum w:abstractNumId="165" w15:restartNumberingAfterBreak="0">
+  <w:abstractNum w:abstractNumId="166" w15:restartNumberingAfterBreak="0">
     <w:nsid w:val="70CB723E"/>
     <w:multiLevelType w:val="multilevel"/>
     <w:tmpl w:val="63F4E6F0"/>
@@ -35942,7 +36539,7 @@
       </w:rPr>
     </w:lvl>
   </w:abstractNum>
-  <w:abstractNum w:abstractNumId="166" w15:restartNumberingAfterBreak="0">
+  <w:abstractNum w:abstractNumId="167" w15:restartNumberingAfterBreak="0">
     <w:nsid w:val="71C028F7"/>
     <w:multiLevelType w:val="hybridMultilevel"/>
     <w:tmpl w:val="85104F0A"/>
@@ -36055,7 +36652,7 @@
       </w:rPr>
     </w:lvl>
   </w:abstractNum>
-  <w:abstractNum w:abstractNumId="167" w15:restartNumberingAfterBreak="0">
+  <w:abstractNum w:abstractNumId="168" w15:restartNumberingAfterBreak="0">
     <w:nsid w:val="71DB3F58"/>
     <w:multiLevelType w:val="multilevel"/>
     <w:tmpl w:val="63F4E6F0"/>
@@ -36204,7 +36801,7 @@
       </w:rPr>
     </w:lvl>
   </w:abstractNum>
-  <w:abstractNum w:abstractNumId="168" w15:restartNumberingAfterBreak="0">
+  <w:abstractNum w:abstractNumId="169" w15:restartNumberingAfterBreak="0">
     <w:nsid w:val="720D204A"/>
     <w:multiLevelType w:val="hybridMultilevel"/>
     <w:tmpl w:val="70D646D0"/>
@@ -36318,7 +36915,7 @@
       </w:rPr>
     </w:lvl>
   </w:abstractNum>
-  <w:abstractNum w:abstractNumId="169" w15:restartNumberingAfterBreak="0">
+  <w:abstractNum w:abstractNumId="170" w15:restartNumberingAfterBreak="0">
     <w:nsid w:val="72F31FF2"/>
     <w:multiLevelType w:val="hybridMultilevel"/>
     <w:tmpl w:val="5C2693A0"/>
@@ -36430,7 +37027,7 @@
       </w:rPr>
     </w:lvl>
   </w:abstractNum>
-  <w:abstractNum w:abstractNumId="170" w15:restartNumberingAfterBreak="0">
+  <w:abstractNum w:abstractNumId="171" w15:restartNumberingAfterBreak="0">
     <w:nsid w:val="73B82579"/>
     <w:multiLevelType w:val="hybridMultilevel"/>
     <w:tmpl w:val="B8E8229C"/>
@@ -36543,7 +37140,7 @@
       </w:rPr>
     </w:lvl>
   </w:abstractNum>
-  <w:abstractNum w:abstractNumId="171" w15:restartNumberingAfterBreak="0">
+  <w:abstractNum w:abstractNumId="172" w15:restartNumberingAfterBreak="0">
     <w:nsid w:val="74522E8F"/>
     <w:multiLevelType w:val="hybridMultilevel"/>
     <w:tmpl w:val="9B1C2096"/>
@@ -36656,7 +37253,7 @@
       </w:rPr>
     </w:lvl>
   </w:abstractNum>
-  <w:abstractNum w:abstractNumId="172" w15:restartNumberingAfterBreak="0">
+  <w:abstractNum w:abstractNumId="173" w15:restartNumberingAfterBreak="0">
     <w:nsid w:val="75B45140"/>
     <w:multiLevelType w:val="hybridMultilevel"/>
     <w:tmpl w:val="93F8F3C4"/>
@@ -36769,7 +37366,7 @@
       </w:rPr>
     </w:lvl>
   </w:abstractNum>
-  <w:abstractNum w:abstractNumId="173" w15:restartNumberingAfterBreak="0">
+  <w:abstractNum w:abstractNumId="174" w15:restartNumberingAfterBreak="0">
     <w:nsid w:val="76F60FFE"/>
     <w:multiLevelType w:val="multilevel"/>
     <w:tmpl w:val="63F4E6F0"/>
@@ -36918,7 +37515,120 @@
       </w:rPr>
     </w:lvl>
   </w:abstractNum>
-  <w:abstractNum w:abstractNumId="174" w15:restartNumberingAfterBreak="0">
+  <w:abstractNum w:abstractNumId="175" w15:restartNumberingAfterBreak="0">
+    <w:nsid w:val="7742006E"/>
+    <w:multiLevelType w:val="hybridMultilevel"/>
+    <w:tmpl w:val="322ADDB6"/>
+    <w:lvl w:ilvl="0" w:tplc="04090005">
+      <w:start w:val="1"/>
+      <w:numFmt w:val="bullet"/>
+      <w:lvlText w:val=""/>
+      <w:lvlJc w:val="left"/>
+      <w:pPr>
+        <w:ind w:left="720" w:hanging="360"/>
+      </w:pPr>
+      <w:rPr>
+        <w:rFonts w:ascii="Wingdings" w:hAnsi="Wingdings" w:hint="default"/>
+      </w:rPr>
+    </w:lvl>
+    <w:lvl w:ilvl="1" w:tplc="04090003" w:tentative="1">
+      <w:start w:val="1"/>
+      <w:numFmt w:val="bullet"/>
+      <w:lvlText w:val="o"/>
+      <w:lvlJc w:val="left"/>
+      <w:pPr>
+        <w:ind w:left="1440" w:hanging="360"/>
+      </w:pPr>
+      <w:rPr>
+        <w:rFonts w:ascii="Courier New" w:hAnsi="Courier New" w:cs="Courier New" w:hint="default"/>
+      </w:rPr>
+    </w:lvl>
+    <w:lvl w:ilvl="2" w:tplc="04090005" w:tentative="1">
+      <w:start w:val="1"/>
+      <w:numFmt w:val="bullet"/>
+      <w:lvlText w:val=""/>
+      <w:lvlJc w:val="left"/>
+      <w:pPr>
+        <w:ind w:left="2160" w:hanging="360"/>
+      </w:pPr>
+      <w:rPr>
+        <w:rFonts w:ascii="Wingdings" w:hAnsi="Wingdings" w:hint="default"/>
+      </w:rPr>
+    </w:lvl>
+    <w:lvl w:ilvl="3" w:tplc="04090001" w:tentative="1">
+      <w:start w:val="1"/>
+      <w:numFmt w:val="bullet"/>
+      <w:lvlText w:val=""/>
+      <w:lvlJc w:val="left"/>
+      <w:pPr>
+        <w:ind w:left="2880" w:hanging="360"/>
+      </w:pPr>
+      <w:rPr>
+        <w:rFonts w:ascii="Symbol" w:hAnsi="Symbol" w:hint="default"/>
+      </w:rPr>
+    </w:lvl>
+    <w:lvl w:ilvl="4" w:tplc="04090003" w:tentative="1">
+      <w:start w:val="1"/>
+      <w:numFmt w:val="bullet"/>
+      <w:lvlText w:val="o"/>
+      <w:lvlJc w:val="left"/>
+      <w:pPr>
+        <w:ind w:left="3600" w:hanging="360"/>
+      </w:pPr>
+      <w:rPr>
+        <w:rFonts w:ascii="Courier New" w:hAnsi="Courier New" w:cs="Courier New" w:hint="default"/>
+      </w:rPr>
+    </w:lvl>
+    <w:lvl w:ilvl="5" w:tplc="04090005" w:tentative="1">
+      <w:start w:val="1"/>
+      <w:numFmt w:val="bullet"/>
+      <w:lvlText w:val=""/>
+      <w:lvlJc w:val="left"/>
+      <w:pPr>
+        <w:ind w:left="4320" w:hanging="360"/>
+      </w:pPr>
+      <w:rPr>
+        <w:rFonts w:ascii="Wingdings" w:hAnsi="Wingdings" w:hint="default"/>
+      </w:rPr>
+    </w:lvl>
+    <w:lvl w:ilvl="6" w:tplc="04090001" w:tentative="1">
+      <w:start w:val="1"/>
+      <w:numFmt w:val="bullet"/>
+      <w:lvlText w:val=""/>
+      <w:lvlJc w:val="left"/>
+      <w:pPr>
+        <w:ind w:left="5040" w:hanging="360"/>
+      </w:pPr>
+      <w:rPr>
+        <w:rFonts w:ascii="Symbol" w:hAnsi="Symbol" w:hint="default"/>
+      </w:rPr>
+    </w:lvl>
+    <w:lvl w:ilvl="7" w:tplc="04090003" w:tentative="1">
+      <w:start w:val="1"/>
+      <w:numFmt w:val="bullet"/>
+      <w:lvlText w:val="o"/>
+      <w:lvlJc w:val="left"/>
+      <w:pPr>
+        <w:ind w:left="5760" w:hanging="360"/>
+      </w:pPr>
+      <w:rPr>
+        <w:rFonts w:ascii="Courier New" w:hAnsi="Courier New" w:cs="Courier New" w:hint="default"/>
+      </w:rPr>
+    </w:lvl>
+    <w:lvl w:ilvl="8" w:tplc="04090005" w:tentative="1">
+      <w:start w:val="1"/>
+      <w:numFmt w:val="bullet"/>
+      <w:lvlText w:val=""/>
+      <w:lvlJc w:val="left"/>
+      <w:pPr>
+        <w:ind w:left="6480" w:hanging="360"/>
+      </w:pPr>
+      <w:rPr>
+        <w:rFonts w:ascii="Wingdings" w:hAnsi="Wingdings" w:hint="default"/>
+      </w:rPr>
+    </w:lvl>
+  </w:abstractNum>
+  <w:abstractNum w:abstractNumId="176" w15:restartNumberingAfterBreak="0">
     <w:nsid w:val="77572323"/>
     <w:multiLevelType w:val="multilevel"/>
     <w:tmpl w:val="63F4E6F0"/>
@@ -37067,7 +37777,7 @@
       </w:rPr>
     </w:lvl>
   </w:abstractNum>
-  <w:abstractNum w:abstractNumId="175" w15:restartNumberingAfterBreak="0">
+  <w:abstractNum w:abstractNumId="177" w15:restartNumberingAfterBreak="0">
     <w:nsid w:val="77B8201F"/>
     <w:multiLevelType w:val="hybridMultilevel"/>
     <w:tmpl w:val="D7160708"/>
@@ -37179,7 +37889,7 @@
       </w:rPr>
     </w:lvl>
   </w:abstractNum>
-  <w:abstractNum w:abstractNumId="176" w15:restartNumberingAfterBreak="0">
+  <w:abstractNum w:abstractNumId="178" w15:restartNumberingAfterBreak="0">
     <w:nsid w:val="79796FF9"/>
     <w:multiLevelType w:val="hybridMultilevel"/>
     <w:tmpl w:val="CFA8EF82"/>
@@ -37291,7 +38001,7 @@
       </w:rPr>
     </w:lvl>
   </w:abstractNum>
-  <w:abstractNum w:abstractNumId="177" w15:restartNumberingAfterBreak="0">
+  <w:abstractNum w:abstractNumId="179" w15:restartNumberingAfterBreak="0">
     <w:nsid w:val="79910410"/>
     <w:multiLevelType w:val="hybridMultilevel"/>
     <w:tmpl w:val="FC923542"/>
@@ -37403,7 +38113,7 @@
       </w:rPr>
     </w:lvl>
   </w:abstractNum>
-  <w:abstractNum w:abstractNumId="178" w15:restartNumberingAfterBreak="0">
+  <w:abstractNum w:abstractNumId="180" w15:restartNumberingAfterBreak="0">
     <w:nsid w:val="7AD51679"/>
     <w:multiLevelType w:val="hybridMultilevel"/>
     <w:tmpl w:val="C13E19C2"/>
@@ -37516,7 +38226,7 @@
       </w:rPr>
     </w:lvl>
   </w:abstractNum>
-  <w:abstractNum w:abstractNumId="179" w15:restartNumberingAfterBreak="0">
+  <w:abstractNum w:abstractNumId="181" w15:restartNumberingAfterBreak="0">
     <w:nsid w:val="7AFF575A"/>
     <w:multiLevelType w:val="hybridMultilevel"/>
     <w:tmpl w:val="A6323D3E"/>
@@ -37628,7 +38338,7 @@
       </w:rPr>
     </w:lvl>
   </w:abstractNum>
-  <w:abstractNum w:abstractNumId="180" w15:restartNumberingAfterBreak="0">
+  <w:abstractNum w:abstractNumId="182" w15:restartNumberingAfterBreak="0">
     <w:nsid w:val="7B4018BF"/>
     <w:multiLevelType w:val="multilevel"/>
     <w:tmpl w:val="63F4E6F0"/>
@@ -37777,7 +38487,7 @@
       </w:rPr>
     </w:lvl>
   </w:abstractNum>
-  <w:abstractNum w:abstractNumId="181" w15:restartNumberingAfterBreak="0">
+  <w:abstractNum w:abstractNumId="183" w15:restartNumberingAfterBreak="0">
     <w:nsid w:val="7B4D1B33"/>
     <w:multiLevelType w:val="hybridMultilevel"/>
     <w:tmpl w:val="5EAC717E"/>
@@ -37889,7 +38599,7 @@
       </w:rPr>
     </w:lvl>
   </w:abstractNum>
-  <w:abstractNum w:abstractNumId="182" w15:restartNumberingAfterBreak="0">
+  <w:abstractNum w:abstractNumId="184" w15:restartNumberingAfterBreak="0">
     <w:nsid w:val="7C437108"/>
     <w:multiLevelType w:val="hybridMultilevel"/>
     <w:tmpl w:val="3222D0E8"/>
@@ -38002,7 +38712,7 @@
       </w:rPr>
     </w:lvl>
   </w:abstractNum>
-  <w:abstractNum w:abstractNumId="183" w15:restartNumberingAfterBreak="0">
+  <w:abstractNum w:abstractNumId="185" w15:restartNumberingAfterBreak="0">
     <w:nsid w:val="7CAC27CD"/>
     <w:multiLevelType w:val="multilevel"/>
     <w:tmpl w:val="3BC20E58"/>
@@ -38151,7 +38861,7 @@
       </w:rPr>
     </w:lvl>
   </w:abstractNum>
-  <w:abstractNum w:abstractNumId="184" w15:restartNumberingAfterBreak="0">
+  <w:abstractNum w:abstractNumId="186" w15:restartNumberingAfterBreak="0">
     <w:nsid w:val="7DBE326E"/>
     <w:multiLevelType w:val="hybridMultilevel"/>
     <w:tmpl w:val="AFC0D8D6"/>
@@ -38264,7 +38974,7 @@
       </w:rPr>
     </w:lvl>
   </w:abstractNum>
-  <w:abstractNum w:abstractNumId="185" w15:restartNumberingAfterBreak="0">
+  <w:abstractNum w:abstractNumId="187" w15:restartNumberingAfterBreak="0">
     <w:nsid w:val="7E5978EA"/>
     <w:multiLevelType w:val="hybridMultilevel"/>
     <w:tmpl w:val="D74C0DB0"/>
@@ -38376,7 +39086,7 @@
       </w:rPr>
     </w:lvl>
   </w:abstractNum>
-  <w:abstractNum w:abstractNumId="186" w15:restartNumberingAfterBreak="0">
+  <w:abstractNum w:abstractNumId="188" w15:restartNumberingAfterBreak="0">
     <w:nsid w:val="7F106A5D"/>
     <w:multiLevelType w:val="hybridMultilevel"/>
     <w:tmpl w:val="A1CA4816"/>
@@ -38488,7 +39198,7 @@
       </w:rPr>
     </w:lvl>
   </w:abstractNum>
-  <w:abstractNum w:abstractNumId="187" w15:restartNumberingAfterBreak="0">
+  <w:abstractNum w:abstractNumId="189" w15:restartNumberingAfterBreak="0">
     <w:nsid w:val="7FD679F5"/>
     <w:multiLevelType w:val="hybridMultilevel"/>
     <w:tmpl w:val="1ED417E8"/>
@@ -38602,82 +39312,82 @@
     </w:lvl>
   </w:abstractNum>
   <w:num w:numId="1" w16cid:durableId="1882476756">
-    <w:abstractNumId w:val="104"/>
+    <w:abstractNumId w:val="105"/>
   </w:num>
   <w:num w:numId="2" w16cid:durableId="871453468">
-    <w:abstractNumId w:val="27"/>
+    <w:abstractNumId w:val="28"/>
   </w:num>
   <w:num w:numId="3" w16cid:durableId="698706805">
-    <w:abstractNumId w:val="43"/>
+    <w:abstractNumId w:val="44"/>
   </w:num>
   <w:num w:numId="4" w16cid:durableId="1105467722">
-    <w:abstractNumId w:val="85"/>
+    <w:abstractNumId w:val="86"/>
   </w:num>
   <w:num w:numId="5" w16cid:durableId="769932622">
-    <w:abstractNumId w:val="124"/>
+    <w:abstractNumId w:val="125"/>
   </w:num>
   <w:num w:numId="6" w16cid:durableId="575944109">
-    <w:abstractNumId w:val="47"/>
+    <w:abstractNumId w:val="48"/>
   </w:num>
   <w:num w:numId="7" w16cid:durableId="877661689">
-    <w:abstractNumId w:val="164"/>
+    <w:abstractNumId w:val="165"/>
   </w:num>
   <w:num w:numId="8" w16cid:durableId="1390107422">
-    <w:abstractNumId w:val="91"/>
+    <w:abstractNumId w:val="92"/>
   </w:num>
   <w:num w:numId="9" w16cid:durableId="881866424">
-    <w:abstractNumId w:val="121"/>
+    <w:abstractNumId w:val="122"/>
   </w:num>
   <w:num w:numId="10" w16cid:durableId="1037244995">
-    <w:abstractNumId w:val="154"/>
+    <w:abstractNumId w:val="155"/>
   </w:num>
   <w:num w:numId="11" w16cid:durableId="1575554597">
-    <w:abstractNumId w:val="72"/>
+    <w:abstractNumId w:val="73"/>
   </w:num>
   <w:num w:numId="12" w16cid:durableId="915364478">
-    <w:abstractNumId w:val="100"/>
+    <w:abstractNumId w:val="101"/>
   </w:num>
   <w:num w:numId="13" w16cid:durableId="1386294114">
+    <w:abstractNumId w:val="145"/>
+  </w:num>
+  <w:num w:numId="14" w16cid:durableId="1071851223">
+    <w:abstractNumId w:val="30"/>
+  </w:num>
+  <w:num w:numId="15" w16cid:durableId="1545557520">
+    <w:abstractNumId w:val="87"/>
+  </w:num>
+  <w:num w:numId="16" w16cid:durableId="1102919547">
+    <w:abstractNumId w:val="185"/>
+  </w:num>
+  <w:num w:numId="17" w16cid:durableId="294526838">
+    <w:abstractNumId w:val="60"/>
+  </w:num>
+  <w:num w:numId="18" w16cid:durableId="679889896">
+    <w:abstractNumId w:val="70"/>
+  </w:num>
+  <w:num w:numId="19" w16cid:durableId="2119449470">
+    <w:abstractNumId w:val="118"/>
+  </w:num>
+  <w:num w:numId="20" w16cid:durableId="1365054799">
+    <w:abstractNumId w:val="16"/>
+  </w:num>
+  <w:num w:numId="21" w16cid:durableId="1683512738">
+    <w:abstractNumId w:val="71"/>
+  </w:num>
+  <w:num w:numId="22" w16cid:durableId="1080098953">
+    <w:abstractNumId w:val="152"/>
+  </w:num>
+  <w:num w:numId="23" w16cid:durableId="1635717296">
+    <w:abstractNumId w:val="78"/>
+  </w:num>
+  <w:num w:numId="24" w16cid:durableId="544873123">
     <w:abstractNumId w:val="144"/>
   </w:num>
-  <w:num w:numId="14" w16cid:durableId="1071851223">
-    <w:abstractNumId w:val="29"/>
-  </w:num>
-  <w:num w:numId="15" w16cid:durableId="1545557520">
-    <w:abstractNumId w:val="86"/>
-  </w:num>
-  <w:num w:numId="16" w16cid:durableId="1102919547">
-    <w:abstractNumId w:val="183"/>
-  </w:num>
-  <w:num w:numId="17" w16cid:durableId="294526838">
-    <w:abstractNumId w:val="59"/>
-  </w:num>
-  <w:num w:numId="18" w16cid:durableId="679889896">
-    <w:abstractNumId w:val="69"/>
-  </w:num>
-  <w:num w:numId="19" w16cid:durableId="2119449470">
-    <w:abstractNumId w:val="117"/>
-  </w:num>
-  <w:num w:numId="20" w16cid:durableId="1365054799">
+  <w:num w:numId="25" w16cid:durableId="1128352778">
     <w:abstractNumId w:val="15"/>
   </w:num>
-  <w:num w:numId="21" w16cid:durableId="1683512738">
-    <w:abstractNumId w:val="70"/>
-  </w:num>
-  <w:num w:numId="22" w16cid:durableId="1080098953">
-    <w:abstractNumId w:val="151"/>
-  </w:num>
-  <w:num w:numId="23" w16cid:durableId="1635717296">
-    <w:abstractNumId w:val="77"/>
-  </w:num>
-  <w:num w:numId="24" w16cid:durableId="544873123">
-    <w:abstractNumId w:val="143"/>
-  </w:num>
-  <w:num w:numId="25" w16cid:durableId="1128352778">
-    <w:abstractNumId w:val="14"/>
-  </w:num>
   <w:num w:numId="26" w16cid:durableId="1732537407">
-    <w:abstractNumId w:val="158"/>
+    <w:abstractNumId w:val="159"/>
   </w:num>
   <w:num w:numId="27" w16cid:durableId="945502064">
     <w:abstractNumId w:val="8"/>
@@ -38686,292 +39396,292 @@
     <w:abstractNumId w:val="3"/>
   </w:num>
   <w:num w:numId="29" w16cid:durableId="815955639">
-    <w:abstractNumId w:val="68"/>
+    <w:abstractNumId w:val="69"/>
   </w:num>
   <w:num w:numId="30" w16cid:durableId="1500659483">
-    <w:abstractNumId w:val="96"/>
+    <w:abstractNumId w:val="97"/>
   </w:num>
   <w:num w:numId="31" w16cid:durableId="118301211">
-    <w:abstractNumId w:val="17"/>
+    <w:abstractNumId w:val="18"/>
   </w:num>
   <w:num w:numId="32" w16cid:durableId="732387979">
-    <w:abstractNumId w:val="48"/>
+    <w:abstractNumId w:val="49"/>
   </w:num>
   <w:num w:numId="33" w16cid:durableId="2129276417">
-    <w:abstractNumId w:val="20"/>
+    <w:abstractNumId w:val="21"/>
   </w:num>
   <w:num w:numId="34" w16cid:durableId="1470708820">
-    <w:abstractNumId w:val="54"/>
+    <w:abstractNumId w:val="55"/>
   </w:num>
   <w:num w:numId="35" w16cid:durableId="356852923">
-    <w:abstractNumId w:val="116"/>
+    <w:abstractNumId w:val="117"/>
   </w:num>
   <w:num w:numId="36" w16cid:durableId="430662559">
-    <w:abstractNumId w:val="23"/>
+    <w:abstractNumId w:val="24"/>
   </w:num>
   <w:num w:numId="37" w16cid:durableId="247080868">
-    <w:abstractNumId w:val="172"/>
+    <w:abstractNumId w:val="173"/>
   </w:num>
   <w:num w:numId="38" w16cid:durableId="158887408">
-    <w:abstractNumId w:val="140"/>
+    <w:abstractNumId w:val="141"/>
   </w:num>
   <w:num w:numId="39" w16cid:durableId="1681347932">
-    <w:abstractNumId w:val="163"/>
+    <w:abstractNumId w:val="164"/>
   </w:num>
   <w:num w:numId="40" w16cid:durableId="2101440158">
-    <w:abstractNumId w:val="89"/>
+    <w:abstractNumId w:val="90"/>
   </w:num>
   <w:num w:numId="41" w16cid:durableId="1250391122">
-    <w:abstractNumId w:val="135"/>
+    <w:abstractNumId w:val="136"/>
   </w:num>
   <w:num w:numId="42" w16cid:durableId="479083359">
-    <w:abstractNumId w:val="169"/>
+    <w:abstractNumId w:val="170"/>
   </w:num>
   <w:num w:numId="43" w16cid:durableId="1557860317">
-    <w:abstractNumId w:val="118"/>
+    <w:abstractNumId w:val="119"/>
   </w:num>
   <w:num w:numId="44" w16cid:durableId="2142183763">
     <w:abstractNumId w:val="10"/>
   </w:num>
   <w:num w:numId="45" w16cid:durableId="1357736349">
+    <w:abstractNumId w:val="179"/>
+  </w:num>
+  <w:num w:numId="46" w16cid:durableId="1519656040">
+    <w:abstractNumId w:val="178"/>
+  </w:num>
+  <w:num w:numId="47" w16cid:durableId="1078596852">
+    <w:abstractNumId w:val="188"/>
+  </w:num>
+  <w:num w:numId="48" w16cid:durableId="1027950100">
+    <w:abstractNumId w:val="41"/>
+  </w:num>
+  <w:num w:numId="49" w16cid:durableId="878516382">
+    <w:abstractNumId w:val="23"/>
+  </w:num>
+  <w:num w:numId="50" w16cid:durableId="363404927">
+    <w:abstractNumId w:val="79"/>
+  </w:num>
+  <w:num w:numId="51" w16cid:durableId="1128354320">
+    <w:abstractNumId w:val="157"/>
+  </w:num>
+  <w:num w:numId="52" w16cid:durableId="248543928">
+    <w:abstractNumId w:val="89"/>
+  </w:num>
+  <w:num w:numId="53" w16cid:durableId="965889214">
+    <w:abstractNumId w:val="123"/>
+  </w:num>
+  <w:num w:numId="54" w16cid:durableId="1827503240">
+    <w:abstractNumId w:val="134"/>
+  </w:num>
+  <w:num w:numId="55" w16cid:durableId="505748256">
+    <w:abstractNumId w:val="111"/>
+  </w:num>
+  <w:num w:numId="56" w16cid:durableId="2120370925">
+    <w:abstractNumId w:val="38"/>
+  </w:num>
+  <w:num w:numId="57" w16cid:durableId="369182267">
+    <w:abstractNumId w:val="19"/>
+  </w:num>
+  <w:num w:numId="58" w16cid:durableId="1000235123">
+    <w:abstractNumId w:val="120"/>
+  </w:num>
+  <w:num w:numId="59" w16cid:durableId="628516409">
+    <w:abstractNumId w:val="156"/>
+  </w:num>
+  <w:num w:numId="60" w16cid:durableId="2028865444">
+    <w:abstractNumId w:val="107"/>
+  </w:num>
+  <w:num w:numId="61" w16cid:durableId="943926811">
+    <w:abstractNumId w:val="183"/>
+  </w:num>
+  <w:num w:numId="62" w16cid:durableId="1841193257">
+    <w:abstractNumId w:val="82"/>
+  </w:num>
+  <w:num w:numId="63" w16cid:durableId="682322850">
+    <w:abstractNumId w:val="161"/>
+  </w:num>
+  <w:num w:numId="64" w16cid:durableId="2043705333">
+    <w:abstractNumId w:val="83"/>
+  </w:num>
+  <w:num w:numId="65" w16cid:durableId="1164854761">
+    <w:abstractNumId w:val="59"/>
+  </w:num>
+  <w:num w:numId="66" w16cid:durableId="1919972541">
+    <w:abstractNumId w:val="103"/>
+  </w:num>
+  <w:num w:numId="67" w16cid:durableId="463617329">
+    <w:abstractNumId w:val="63"/>
+  </w:num>
+  <w:num w:numId="68" w16cid:durableId="2064014330">
+    <w:abstractNumId w:val="128"/>
+  </w:num>
+  <w:num w:numId="69" w16cid:durableId="452797354">
+    <w:abstractNumId w:val="135"/>
+  </w:num>
+  <w:num w:numId="70" w16cid:durableId="1196650037">
+    <w:abstractNumId w:val="53"/>
+  </w:num>
+  <w:num w:numId="71" w16cid:durableId="940071828">
     <w:abstractNumId w:val="177"/>
   </w:num>
-  <w:num w:numId="46" w16cid:durableId="1519656040">
-    <w:abstractNumId w:val="176"/>
+  <w:num w:numId="72" w16cid:durableId="1608273926">
+    <w:abstractNumId w:val="85"/>
   </w:num>
-  <w:num w:numId="47" w16cid:durableId="1078596852">
-    <w:abstractNumId w:val="186"/>
+  <w:num w:numId="73" w16cid:durableId="2009864772">
+    <w:abstractNumId w:val="104"/>
   </w:num>
-  <w:num w:numId="48" w16cid:durableId="1027950100">
+  <w:num w:numId="74" w16cid:durableId="712267004">
     <w:abstractNumId w:val="40"/>
   </w:num>
-  <w:num w:numId="49" w16cid:durableId="878516382">
-    <w:abstractNumId w:val="22"/>
-  </w:num>
-  <w:num w:numId="50" w16cid:durableId="363404927">
-    <w:abstractNumId w:val="78"/>
-  </w:num>
-  <w:num w:numId="51" w16cid:durableId="1128354320">
-    <w:abstractNumId w:val="156"/>
-  </w:num>
-  <w:num w:numId="52" w16cid:durableId="248543928">
-    <w:abstractNumId w:val="88"/>
-  </w:num>
-  <w:num w:numId="53" w16cid:durableId="965889214">
-    <w:abstractNumId w:val="122"/>
-  </w:num>
-  <w:num w:numId="54" w16cid:durableId="1827503240">
-    <w:abstractNumId w:val="133"/>
-  </w:num>
-  <w:num w:numId="55" w16cid:durableId="505748256">
-    <w:abstractNumId w:val="110"/>
-  </w:num>
-  <w:num w:numId="56" w16cid:durableId="2120370925">
-    <w:abstractNumId w:val="37"/>
-  </w:num>
-  <w:num w:numId="57" w16cid:durableId="369182267">
-    <w:abstractNumId w:val="18"/>
-  </w:num>
-  <w:num w:numId="58" w16cid:durableId="1000235123">
-    <w:abstractNumId w:val="119"/>
-  </w:num>
-  <w:num w:numId="59" w16cid:durableId="628516409">
-    <w:abstractNumId w:val="155"/>
-  </w:num>
-  <w:num w:numId="60" w16cid:durableId="2028865444">
-    <w:abstractNumId w:val="106"/>
-  </w:num>
-  <w:num w:numId="61" w16cid:durableId="943926811">
-    <w:abstractNumId w:val="181"/>
-  </w:num>
-  <w:num w:numId="62" w16cid:durableId="1841193257">
-    <w:abstractNumId w:val="81"/>
-  </w:num>
-  <w:num w:numId="63" w16cid:durableId="682322850">
-    <w:abstractNumId w:val="160"/>
-  </w:num>
-  <w:num w:numId="64" w16cid:durableId="2043705333">
-    <w:abstractNumId w:val="82"/>
-  </w:num>
-  <w:num w:numId="65" w16cid:durableId="1164854761">
-    <w:abstractNumId w:val="58"/>
-  </w:num>
-  <w:num w:numId="66" w16cid:durableId="1919972541">
-    <w:abstractNumId w:val="102"/>
-  </w:num>
-  <w:num w:numId="67" w16cid:durableId="463617329">
-    <w:abstractNumId w:val="62"/>
-  </w:num>
-  <w:num w:numId="68" w16cid:durableId="2064014330">
-    <w:abstractNumId w:val="127"/>
-  </w:num>
-  <w:num w:numId="69" w16cid:durableId="452797354">
-    <w:abstractNumId w:val="134"/>
-  </w:num>
-  <w:num w:numId="70" w16cid:durableId="1196650037">
-    <w:abstractNumId w:val="52"/>
-  </w:num>
-  <w:num w:numId="71" w16cid:durableId="940071828">
-    <w:abstractNumId w:val="175"/>
-  </w:num>
-  <w:num w:numId="72" w16cid:durableId="1608273926">
-    <w:abstractNumId w:val="84"/>
-  </w:num>
-  <w:num w:numId="73" w16cid:durableId="2009864772">
-    <w:abstractNumId w:val="103"/>
-  </w:num>
-  <w:num w:numId="74" w16cid:durableId="712267004">
-    <w:abstractNumId w:val="39"/>
-  </w:num>
   <w:num w:numId="75" w16cid:durableId="506480902">
-    <w:abstractNumId w:val="34"/>
+    <w:abstractNumId w:val="35"/>
   </w:num>
   <w:num w:numId="76" w16cid:durableId="286202349">
-    <w:abstractNumId w:val="138"/>
+    <w:abstractNumId w:val="139"/>
   </w:num>
   <w:num w:numId="77" w16cid:durableId="156460757">
-    <w:abstractNumId w:val="73"/>
+    <w:abstractNumId w:val="74"/>
   </w:num>
   <w:num w:numId="78" w16cid:durableId="1230077056">
     <w:abstractNumId w:val="6"/>
   </w:num>
   <w:num w:numId="79" w16cid:durableId="1837106927">
-    <w:abstractNumId w:val="51"/>
+    <w:abstractNumId w:val="52"/>
   </w:num>
   <w:num w:numId="80" w16cid:durableId="287929152">
-    <w:abstractNumId w:val="38"/>
+    <w:abstractNumId w:val="39"/>
   </w:num>
   <w:num w:numId="81" w16cid:durableId="1672175260">
-    <w:abstractNumId w:val="98"/>
+    <w:abstractNumId w:val="99"/>
   </w:num>
   <w:num w:numId="82" w16cid:durableId="1954820163">
-    <w:abstractNumId w:val="61"/>
+    <w:abstractNumId w:val="62"/>
   </w:num>
   <w:num w:numId="83" w16cid:durableId="1990016594">
+    <w:abstractNumId w:val="26"/>
+  </w:num>
+  <w:num w:numId="84" w16cid:durableId="366876741">
+    <w:abstractNumId w:val="106"/>
+  </w:num>
+  <w:num w:numId="85" w16cid:durableId="15274915">
+    <w:abstractNumId w:val="42"/>
+  </w:num>
+  <w:num w:numId="86" w16cid:durableId="288124443">
+    <w:abstractNumId w:val="12"/>
+  </w:num>
+  <w:num w:numId="87" w16cid:durableId="591351385">
+    <w:abstractNumId w:val="124"/>
+  </w:num>
+  <w:num w:numId="88" w16cid:durableId="1361005725">
+    <w:abstractNumId w:val="181"/>
+  </w:num>
+  <w:num w:numId="89" w16cid:durableId="219681743">
+    <w:abstractNumId w:val="13"/>
+  </w:num>
+  <w:num w:numId="90" w16cid:durableId="194386594">
+    <w:abstractNumId w:val="137"/>
+  </w:num>
+  <w:num w:numId="91" w16cid:durableId="777793346">
+    <w:abstractNumId w:val="95"/>
+  </w:num>
+  <w:num w:numId="92" w16cid:durableId="173346871">
+    <w:abstractNumId w:val="102"/>
+  </w:num>
+  <w:num w:numId="93" w16cid:durableId="948700467">
+    <w:abstractNumId w:val="43"/>
+  </w:num>
+  <w:num w:numId="94" w16cid:durableId="1328363750">
     <w:abstractNumId w:val="25"/>
   </w:num>
-  <w:num w:numId="84" w16cid:durableId="366876741">
-    <w:abstractNumId w:val="105"/>
-  </w:num>
-  <w:num w:numId="85" w16cid:durableId="15274915">
-    <w:abstractNumId w:val="41"/>
-  </w:num>
-  <w:num w:numId="86" w16cid:durableId="288124443">
-    <w:abstractNumId w:val="11"/>
-  </w:num>
-  <w:num w:numId="87" w16cid:durableId="591351385">
-    <w:abstractNumId w:val="123"/>
-  </w:num>
-  <w:num w:numId="88" w16cid:durableId="1361005725">
-    <w:abstractNumId w:val="179"/>
-  </w:num>
-  <w:num w:numId="89" w16cid:durableId="219681743">
-    <w:abstractNumId w:val="12"/>
-  </w:num>
-  <w:num w:numId="90" w16cid:durableId="194386594">
-    <w:abstractNumId w:val="136"/>
-  </w:num>
-  <w:num w:numId="91" w16cid:durableId="777793346">
-    <w:abstractNumId w:val="94"/>
-  </w:num>
-  <w:num w:numId="92" w16cid:durableId="173346871">
-    <w:abstractNumId w:val="101"/>
-  </w:num>
-  <w:num w:numId="93" w16cid:durableId="948700467">
-    <w:abstractNumId w:val="42"/>
-  </w:num>
-  <w:num w:numId="94" w16cid:durableId="1328363750">
-    <w:abstractNumId w:val="24"/>
-  </w:num>
   <w:num w:numId="95" w16cid:durableId="541676570">
-    <w:abstractNumId w:val="74"/>
+    <w:abstractNumId w:val="75"/>
   </w:num>
   <w:num w:numId="96" w16cid:durableId="694119229">
-    <w:abstractNumId w:val="99"/>
+    <w:abstractNumId w:val="100"/>
   </w:num>
   <w:num w:numId="97" w16cid:durableId="704327987">
-    <w:abstractNumId w:val="56"/>
+    <w:abstractNumId w:val="57"/>
   </w:num>
   <w:num w:numId="98" w16cid:durableId="1157303613">
-    <w:abstractNumId w:val="26"/>
+    <w:abstractNumId w:val="27"/>
   </w:num>
   <w:num w:numId="99" w16cid:durableId="1706099794">
+    <w:abstractNumId w:val="163"/>
+  </w:num>
+  <w:num w:numId="100" w16cid:durableId="256404901">
     <w:abstractNumId w:val="162"/>
   </w:num>
-  <w:num w:numId="100" w16cid:durableId="256404901">
-    <w:abstractNumId w:val="161"/>
-  </w:num>
   <w:num w:numId="101" w16cid:durableId="924923012">
-    <w:abstractNumId w:val="32"/>
+    <w:abstractNumId w:val="33"/>
   </w:num>
   <w:num w:numId="102" w16cid:durableId="536550966">
-    <w:abstractNumId w:val="180"/>
+    <w:abstractNumId w:val="182"/>
   </w:num>
   <w:num w:numId="103" w16cid:durableId="425157302">
-    <w:abstractNumId w:val="75"/>
+    <w:abstractNumId w:val="76"/>
   </w:num>
   <w:num w:numId="104" w16cid:durableId="967664612">
-    <w:abstractNumId w:val="147"/>
+    <w:abstractNumId w:val="148"/>
   </w:num>
   <w:num w:numId="105" w16cid:durableId="361631616">
-    <w:abstractNumId w:val="108"/>
+    <w:abstractNumId w:val="109"/>
   </w:num>
   <w:num w:numId="106" w16cid:durableId="443623616">
-    <w:abstractNumId w:val="152"/>
+    <w:abstractNumId w:val="153"/>
   </w:num>
   <w:num w:numId="107" w16cid:durableId="150101619">
-    <w:abstractNumId w:val="13"/>
+    <w:abstractNumId w:val="14"/>
   </w:num>
   <w:num w:numId="108" w16cid:durableId="1431658174">
-    <w:abstractNumId w:val="60"/>
+    <w:abstractNumId w:val="61"/>
   </w:num>
   <w:num w:numId="109" w16cid:durableId="1050495440">
     <w:abstractNumId w:val="0"/>
   </w:num>
   <w:num w:numId="110" w16cid:durableId="712924661">
-    <w:abstractNumId w:val="131"/>
+    <w:abstractNumId w:val="132"/>
   </w:num>
   <w:num w:numId="111" w16cid:durableId="1917784113">
-    <w:abstractNumId w:val="125"/>
+    <w:abstractNumId w:val="126"/>
   </w:num>
   <w:num w:numId="112" w16cid:durableId="896237065">
-    <w:abstractNumId w:val="137"/>
+    <w:abstractNumId w:val="138"/>
   </w:num>
   <w:num w:numId="113" w16cid:durableId="1171681430">
-    <w:abstractNumId w:val="165"/>
+    <w:abstractNumId w:val="166"/>
   </w:num>
   <w:num w:numId="114" w16cid:durableId="1552573199">
-    <w:abstractNumId w:val="167"/>
+    <w:abstractNumId w:val="168"/>
   </w:num>
   <w:num w:numId="115" w16cid:durableId="1920869674">
-    <w:abstractNumId w:val="150"/>
+    <w:abstractNumId w:val="151"/>
   </w:num>
   <w:num w:numId="116" w16cid:durableId="476724716">
+    <w:abstractNumId w:val="113"/>
+  </w:num>
+  <w:num w:numId="117" w16cid:durableId="658919541">
     <w:abstractNumId w:val="112"/>
   </w:num>
-  <w:num w:numId="117" w16cid:durableId="658919541">
-    <w:abstractNumId w:val="111"/>
-  </w:num>
   <w:num w:numId="118" w16cid:durableId="1622418131">
-    <w:abstractNumId w:val="49"/>
+    <w:abstractNumId w:val="50"/>
   </w:num>
   <w:num w:numId="119" w16cid:durableId="1693994672">
     <w:abstractNumId w:val="2"/>
   </w:num>
   <w:num w:numId="120" w16cid:durableId="396828229">
-    <w:abstractNumId w:val="174"/>
+    <w:abstractNumId w:val="176"/>
   </w:num>
   <w:num w:numId="121" w16cid:durableId="986058889">
-    <w:abstractNumId w:val="21"/>
+    <w:abstractNumId w:val="22"/>
   </w:num>
   <w:num w:numId="122" w16cid:durableId="1224410703">
-    <w:abstractNumId w:val="64"/>
+    <w:abstractNumId w:val="65"/>
   </w:num>
   <w:num w:numId="123" w16cid:durableId="1804040304">
-    <w:abstractNumId w:val="93"/>
+    <w:abstractNumId w:val="94"/>
   </w:num>
   <w:num w:numId="124" w16cid:durableId="114181197">
-    <w:abstractNumId w:val="173"/>
+    <w:abstractNumId w:val="174"/>
   </w:num>
   <w:num w:numId="125" w16cid:durableId="772671624">
     <w:abstractNumId w:val="5"/>
@@ -38980,190 +39690,196 @@
     <w:abstractNumId w:val="9"/>
   </w:num>
   <w:num w:numId="127" w16cid:durableId="1818105337">
-    <w:abstractNumId w:val="55"/>
+    <w:abstractNumId w:val="56"/>
   </w:num>
   <w:num w:numId="128" w16cid:durableId="384987847">
-    <w:abstractNumId w:val="33"/>
+    <w:abstractNumId w:val="34"/>
   </w:num>
   <w:num w:numId="129" w16cid:durableId="659895420">
-    <w:abstractNumId w:val="63"/>
+    <w:abstractNumId w:val="64"/>
   </w:num>
   <w:num w:numId="130" w16cid:durableId="1168907903">
-    <w:abstractNumId w:val="153"/>
+    <w:abstractNumId w:val="154"/>
   </w:num>
   <w:num w:numId="131" w16cid:durableId="430206235">
-    <w:abstractNumId w:val="141"/>
+    <w:abstractNumId w:val="142"/>
   </w:num>
   <w:num w:numId="132" w16cid:durableId="1207327089">
-    <w:abstractNumId w:val="30"/>
+    <w:abstractNumId w:val="31"/>
   </w:num>
   <w:num w:numId="133" w16cid:durableId="596404292">
-    <w:abstractNumId w:val="128"/>
+    <w:abstractNumId w:val="129"/>
   </w:num>
   <w:num w:numId="134" w16cid:durableId="2070372549">
-    <w:abstractNumId w:val="46"/>
+    <w:abstractNumId w:val="47"/>
   </w:num>
   <w:num w:numId="135" w16cid:durableId="1841265039">
-    <w:abstractNumId w:val="50"/>
+    <w:abstractNumId w:val="51"/>
   </w:num>
   <w:num w:numId="136" w16cid:durableId="1988632595">
-    <w:abstractNumId w:val="44"/>
+    <w:abstractNumId w:val="45"/>
   </w:num>
   <w:num w:numId="137" w16cid:durableId="1218275126">
-    <w:abstractNumId w:val="79"/>
+    <w:abstractNumId w:val="80"/>
   </w:num>
   <w:num w:numId="138" w16cid:durableId="568660900">
-    <w:abstractNumId w:val="87"/>
+    <w:abstractNumId w:val="88"/>
   </w:num>
   <w:num w:numId="139" w16cid:durableId="967976864">
-    <w:abstractNumId w:val="129"/>
+    <w:abstractNumId w:val="130"/>
   </w:num>
   <w:num w:numId="140" w16cid:durableId="650643288">
-    <w:abstractNumId w:val="148"/>
+    <w:abstractNumId w:val="149"/>
   </w:num>
   <w:num w:numId="141" w16cid:durableId="219370247">
-    <w:abstractNumId w:val="145"/>
+    <w:abstractNumId w:val="146"/>
   </w:num>
   <w:num w:numId="142" w16cid:durableId="323239876">
-    <w:abstractNumId w:val="185"/>
+    <w:abstractNumId w:val="187"/>
   </w:num>
   <w:num w:numId="143" w16cid:durableId="1619793156">
-    <w:abstractNumId w:val="36"/>
+    <w:abstractNumId w:val="37"/>
   </w:num>
   <w:num w:numId="144" w16cid:durableId="1186332867">
-    <w:abstractNumId w:val="157"/>
+    <w:abstractNumId w:val="158"/>
   </w:num>
   <w:num w:numId="145" w16cid:durableId="89937035">
-    <w:abstractNumId w:val="57"/>
+    <w:abstractNumId w:val="58"/>
   </w:num>
   <w:num w:numId="146" w16cid:durableId="542210424">
-    <w:abstractNumId w:val="83"/>
+    <w:abstractNumId w:val="84"/>
   </w:num>
   <w:num w:numId="147" w16cid:durableId="1194659616">
     <w:abstractNumId w:val="7"/>
   </w:num>
   <w:num w:numId="148" w16cid:durableId="1544974653">
-    <w:abstractNumId w:val="170"/>
+    <w:abstractNumId w:val="171"/>
   </w:num>
   <w:num w:numId="149" w16cid:durableId="1664625526">
+    <w:abstractNumId w:val="67"/>
+  </w:num>
+  <w:num w:numId="150" w16cid:durableId="678197415">
+    <w:abstractNumId w:val="147"/>
+  </w:num>
+  <w:num w:numId="151" w16cid:durableId="1193106551">
+    <w:abstractNumId w:val="116"/>
+  </w:num>
+  <w:num w:numId="152" w16cid:durableId="1209760807">
     <w:abstractNumId w:val="66"/>
   </w:num>
-  <w:num w:numId="150" w16cid:durableId="678197415">
-    <w:abstractNumId w:val="146"/>
-  </w:num>
-  <w:num w:numId="151" w16cid:durableId="1193106551">
-    <w:abstractNumId w:val="115"/>
-  </w:num>
-  <w:num w:numId="152" w16cid:durableId="1209760807">
-    <w:abstractNumId w:val="65"/>
-  </w:num>
   <w:num w:numId="153" w16cid:durableId="1994025825">
-    <w:abstractNumId w:val="71"/>
+    <w:abstractNumId w:val="72"/>
   </w:num>
   <w:num w:numId="154" w16cid:durableId="2121295621">
-    <w:abstractNumId w:val="171"/>
+    <w:abstractNumId w:val="172"/>
   </w:num>
   <w:num w:numId="155" w16cid:durableId="292684904">
-    <w:abstractNumId w:val="90"/>
+    <w:abstractNumId w:val="91"/>
   </w:num>
   <w:num w:numId="156" w16cid:durableId="769400072">
-    <w:abstractNumId w:val="182"/>
+    <w:abstractNumId w:val="184"/>
   </w:num>
   <w:num w:numId="157" w16cid:durableId="1930693824">
-    <w:abstractNumId w:val="113"/>
+    <w:abstractNumId w:val="114"/>
   </w:num>
   <w:num w:numId="158" w16cid:durableId="813957946">
-    <w:abstractNumId w:val="166"/>
+    <w:abstractNumId w:val="167"/>
   </w:num>
   <w:num w:numId="159" w16cid:durableId="1782143679">
-    <w:abstractNumId w:val="35"/>
+    <w:abstractNumId w:val="36"/>
   </w:num>
   <w:num w:numId="160" w16cid:durableId="1278754750">
-    <w:abstractNumId w:val="31"/>
+    <w:abstractNumId w:val="32"/>
   </w:num>
   <w:num w:numId="161" w16cid:durableId="1052270864">
-    <w:abstractNumId w:val="142"/>
+    <w:abstractNumId w:val="143"/>
   </w:num>
   <w:num w:numId="162" w16cid:durableId="762337137">
-    <w:abstractNumId w:val="107"/>
+    <w:abstractNumId w:val="108"/>
   </w:num>
   <w:num w:numId="163" w16cid:durableId="1682507263">
-    <w:abstractNumId w:val="92"/>
+    <w:abstractNumId w:val="93"/>
   </w:num>
   <w:num w:numId="164" w16cid:durableId="871957078">
-    <w:abstractNumId w:val="126"/>
+    <w:abstractNumId w:val="127"/>
   </w:num>
   <w:num w:numId="165" w16cid:durableId="601960416">
-    <w:abstractNumId w:val="149"/>
+    <w:abstractNumId w:val="150"/>
   </w:num>
   <w:num w:numId="166" w16cid:durableId="574900497">
-    <w:abstractNumId w:val="139"/>
+    <w:abstractNumId w:val="140"/>
   </w:num>
   <w:num w:numId="167" w16cid:durableId="1477644837">
-    <w:abstractNumId w:val="97"/>
+    <w:abstractNumId w:val="98"/>
   </w:num>
   <w:num w:numId="168" w16cid:durableId="1618100933">
-    <w:abstractNumId w:val="168"/>
+    <w:abstractNumId w:val="169"/>
   </w:num>
   <w:num w:numId="169" w16cid:durableId="1266614374">
-    <w:abstractNumId w:val="178"/>
+    <w:abstractNumId w:val="180"/>
   </w:num>
   <w:num w:numId="170" w16cid:durableId="67534002">
     <w:abstractNumId w:val="1"/>
   </w:num>
   <w:num w:numId="171" w16cid:durableId="1336614003">
-    <w:abstractNumId w:val="53"/>
+    <w:abstractNumId w:val="54"/>
   </w:num>
   <w:num w:numId="172" w16cid:durableId="827554792">
-    <w:abstractNumId w:val="109"/>
+    <w:abstractNumId w:val="110"/>
   </w:num>
   <w:num w:numId="173" w16cid:durableId="186605808">
-    <w:abstractNumId w:val="28"/>
+    <w:abstractNumId w:val="29"/>
   </w:num>
   <w:num w:numId="174" w16cid:durableId="1000935913">
-    <w:abstractNumId w:val="130"/>
+    <w:abstractNumId w:val="131"/>
   </w:num>
   <w:num w:numId="175" w16cid:durableId="685984279">
-    <w:abstractNumId w:val="45"/>
+    <w:abstractNumId w:val="46"/>
   </w:num>
   <w:num w:numId="176" w16cid:durableId="355473142">
-    <w:abstractNumId w:val="184"/>
+    <w:abstractNumId w:val="186"/>
   </w:num>
   <w:num w:numId="177" w16cid:durableId="1580820927">
     <w:abstractNumId w:val="4"/>
   </w:num>
   <w:num w:numId="178" w16cid:durableId="1342977237">
-    <w:abstractNumId w:val="187"/>
+    <w:abstractNumId w:val="189"/>
   </w:num>
   <w:num w:numId="179" w16cid:durableId="1610351964">
-    <w:abstractNumId w:val="95"/>
+    <w:abstractNumId w:val="96"/>
   </w:num>
   <w:num w:numId="180" w16cid:durableId="1808428282">
-    <w:abstractNumId w:val="120"/>
+    <w:abstractNumId w:val="121"/>
   </w:num>
   <w:num w:numId="181" w16cid:durableId="1853181086">
-    <w:abstractNumId w:val="16"/>
+    <w:abstractNumId w:val="17"/>
   </w:num>
   <w:num w:numId="182" w16cid:durableId="1968733980">
-    <w:abstractNumId w:val="76"/>
+    <w:abstractNumId w:val="77"/>
   </w:num>
   <w:num w:numId="183" w16cid:durableId="1707484209">
-    <w:abstractNumId w:val="159"/>
+    <w:abstractNumId w:val="160"/>
   </w:num>
   <w:num w:numId="184" w16cid:durableId="525101864">
-    <w:abstractNumId w:val="67"/>
+    <w:abstractNumId w:val="68"/>
   </w:num>
   <w:num w:numId="185" w16cid:durableId="923611674">
-    <w:abstractNumId w:val="132"/>
+    <w:abstractNumId w:val="133"/>
   </w:num>
   <w:num w:numId="186" w16cid:durableId="379020453">
-    <w:abstractNumId w:val="114"/>
+    <w:abstractNumId w:val="115"/>
   </w:num>
   <w:num w:numId="187" w16cid:durableId="1417243495">
-    <w:abstractNumId w:val="19"/>
+    <w:abstractNumId w:val="20"/>
   </w:num>
   <w:num w:numId="188" w16cid:durableId="662010916">
-    <w:abstractNumId w:val="80"/>
+    <w:abstractNumId w:val="81"/>
+  </w:num>
+  <w:num w:numId="189" w16cid:durableId="987903292">
+    <w:abstractNumId w:val="11"/>
+  </w:num>
+  <w:num w:numId="190" w16cid:durableId="97912371">
+    <w:abstractNumId w:val="175"/>
   </w:num>
 </w:numbering>
 </file>

</xml_diff>

<commit_message>
Deployment Architecture Design (#368) Environment Design (#369) Infrastructure Design (#370) Deployment Strategy Design (#371)
</commit_message>
<xml_diff>
--- a/Software Architecture Design.docx
+++ b/Software Architecture Design.docx
@@ -15483,7 +15483,1137 @@
         <w:t>All this helps to create a secure basis for protecting the KriGo platform from typical security threats and development of the system.</w:t>
       </w:r>
     </w:p>
+    <w:p>
+      <w:pPr>
+        <w:spacing w:line="278" w:lineRule="auto"/>
+      </w:pPr>
+      <w:r>
+        <w:br w:type="page"/>
+      </w:r>
+    </w:p>
+    <w:p>
+      <w:pPr>
+        <w:pStyle w:val="Heading2"/>
+      </w:pPr>
+      <w:r>
+        <w:lastRenderedPageBreak/>
+        <w:t>Design of Deployment Architecture</w:t>
+      </w:r>
+    </w:p>
+    <w:p>
+      <w:r>
+        <w:t>Deployment architecture describes how the software components of the KriGo platform are distributed within the execution environment and cooperate to deliver dependable and scalable services. It describes the physical deployment of client applications, backend services, databases, messaging infrastructure, and integrations with external systems taking into account performance, availability, maintainability, and security aspects.</w:t>
+      </w:r>
+      <w:r>
+        <w:t xml:space="preserve"> </w:t>
+      </w:r>
+      <w:r>
+        <w:t>The KriGo platform utilizes a containerized deployment architecture relying on Docker technology. All major software components are deployed as independent containers that enable isolation, maintenance, and scaling of the services. Deployment and orchestration of the containers are provided using Coolify. Meanwhile, reverse proxy services allow redirecting external requests to application components.</w:t>
+      </w:r>
+    </w:p>
+    <w:p>
+      <w:pPr>
+        <w:pStyle w:val="Heading3"/>
+      </w:pPr>
+      <w:r>
+        <w:t>Environment Design</w:t>
+      </w:r>
+    </w:p>
+    <w:p>
+      <w:pPr>
+        <w:spacing w:after="0"/>
+      </w:pPr>
+      <w:r>
+        <w:t>Deployment architecture includes three logical environments that correspond to stages of the software development lifecycle. Every environment plays its role and is isolated from others in order to ensure stability and secure software delivery.</w:t>
+      </w:r>
+      <w:r>
+        <w:t xml:space="preserve"> </w:t>
+      </w:r>
+      <w:r>
+        <w:t>Development Environment is used for implementing and debugging the software. The application is executed locally via Docker Compose. It enables the development of backend services, databases, caching system, and messaging infrastructure within isolated containers.</w:t>
+      </w:r>
+      <w:r>
+        <w:t xml:space="preserve"> </w:t>
+      </w:r>
+      <w:r>
+        <w:t>Testing Environment provides an opportunity to test new functions prior to their deployment to production. It mimics production environment but allows conducting functional, integration, and performance tests without affecting real users.</w:t>
+      </w:r>
+      <w:r>
+        <w:t xml:space="preserve"> </w:t>
+      </w:r>
+      <w:r>
+        <w:t>Production Environment hosts the working instance of the KriGo platform. It is deployed at cloud-based Virtual Private Server where all the application services are executed within Docker containers orchestrated by Coolify. The application is available via secure HTTPS protocol delivered through NGINX and SSL certificate.</w:t>
+      </w:r>
+    </w:p>
+    <w:p>
+      <w:pPr>
+        <w:spacing w:after="0"/>
+      </w:pPr>
+    </w:p>
+    <w:tbl>
+      <w:tblPr>
+        <w:tblStyle w:val="PlainTable1"/>
+        <w:tblW w:w="0" w:type="auto"/>
+        <w:tblCellMar>
+          <w:top w:w="115" w:type="dxa"/>
+          <w:bottom w:w="115" w:type="dxa"/>
+        </w:tblCellMar>
+        <w:tblLook w:val="04A0" w:firstRow="1" w:lastRow="0" w:firstColumn="1" w:lastColumn="0" w:noHBand="0" w:noVBand="1"/>
+      </w:tblPr>
+      <w:tblGrid>
+        <w:gridCol w:w="1572"/>
+        <w:gridCol w:w="3617"/>
+        <w:gridCol w:w="4158"/>
+      </w:tblGrid>
+      <w:tr>
+        <w:trPr>
+          <w:cnfStyle w:val="100000000000" w:firstRow="1" w:lastRow="0" w:firstColumn="0" w:lastColumn="0" w:oddVBand="0" w:evenVBand="0" w:oddHBand="0" w:evenHBand="0" w:firstRowFirstColumn="0" w:firstRowLastColumn="0" w:lastRowFirstColumn="0" w:lastRowLastColumn="0"/>
+        </w:trPr>
+        <w:tc>
+          <w:tcPr>
+            <w:cnfStyle w:val="001000000000" w:firstRow="0" w:lastRow="0" w:firstColumn="1" w:lastColumn="0" w:oddVBand="0" w:evenVBand="0" w:oddHBand="0" w:evenHBand="0" w:firstRowFirstColumn="0" w:firstRowLastColumn="0" w:lastRowFirstColumn="0" w:lastRowLastColumn="0"/>
+            <w:tcW w:w="0" w:type="auto"/>
+            <w:vAlign w:val="center"/>
+            <w:hideMark/>
+          </w:tcPr>
+          <w:p>
+            <w:r>
+              <w:t>Environment</w:t>
+            </w:r>
+          </w:p>
+        </w:tc>
+        <w:tc>
+          <w:tcPr>
+            <w:tcW w:w="0" w:type="auto"/>
+            <w:vAlign w:val="center"/>
+            <w:hideMark/>
+          </w:tcPr>
+          <w:p>
+            <w:pPr>
+              <w:cnfStyle w:val="100000000000" w:firstRow="1" w:lastRow="0" w:firstColumn="0" w:lastColumn="0" w:oddVBand="0" w:evenVBand="0" w:oddHBand="0" w:evenHBand="0" w:firstRowFirstColumn="0" w:firstRowLastColumn="0" w:lastRowFirstColumn="0" w:lastRowLastColumn="0"/>
+            </w:pPr>
+            <w:r>
+              <w:t>Purpose</w:t>
+            </w:r>
+          </w:p>
+        </w:tc>
+        <w:tc>
+          <w:tcPr>
+            <w:tcW w:w="0" w:type="auto"/>
+            <w:vAlign w:val="center"/>
+            <w:hideMark/>
+          </w:tcPr>
+          <w:p>
+            <w:pPr>
+              <w:cnfStyle w:val="100000000000" w:firstRow="1" w:lastRow="0" w:firstColumn="0" w:lastColumn="0" w:oddVBand="0" w:evenVBand="0" w:oddHBand="0" w:evenHBand="0" w:firstRowFirstColumn="0" w:firstRowLastColumn="0" w:lastRowFirstColumn="0" w:lastRowLastColumn="0"/>
+            </w:pPr>
+            <w:r>
+              <w:t>Main Technologies</w:t>
+            </w:r>
+          </w:p>
+        </w:tc>
+      </w:tr>
+      <w:tr>
+        <w:trPr>
+          <w:cnfStyle w:val="000000100000" w:firstRow="0" w:lastRow="0" w:firstColumn="0" w:lastColumn="0" w:oddVBand="0" w:evenVBand="0" w:oddHBand="1" w:evenHBand="0" w:firstRowFirstColumn="0" w:firstRowLastColumn="0" w:lastRowFirstColumn="0" w:lastRowLastColumn="0"/>
+        </w:trPr>
+        <w:tc>
+          <w:tcPr>
+            <w:cnfStyle w:val="001000000000" w:firstRow="0" w:lastRow="0" w:firstColumn="1" w:lastColumn="0" w:oddVBand="0" w:evenVBand="0" w:oddHBand="0" w:evenHBand="0" w:firstRowFirstColumn="0" w:firstRowLastColumn="0" w:lastRowFirstColumn="0" w:lastRowLastColumn="0"/>
+            <w:tcW w:w="0" w:type="auto"/>
+            <w:vAlign w:val="center"/>
+            <w:hideMark/>
+          </w:tcPr>
+          <w:p>
+            <w:pPr>
+              <w:rPr>
+                <w:b w:val="0"/>
+                <w:bCs w:val="0"/>
+              </w:rPr>
+            </w:pPr>
+            <w:r>
+              <w:rPr>
+                <w:b w:val="0"/>
+                <w:bCs w:val="0"/>
+              </w:rPr>
+              <w:t>Development</w:t>
+            </w:r>
+          </w:p>
+        </w:tc>
+        <w:tc>
+          <w:tcPr>
+            <w:tcW w:w="0" w:type="auto"/>
+            <w:vAlign w:val="center"/>
+            <w:hideMark/>
+          </w:tcPr>
+          <w:p>
+            <w:pPr>
+              <w:cnfStyle w:val="000000100000" w:firstRow="0" w:lastRow="0" w:firstColumn="0" w:lastColumn="0" w:oddVBand="0" w:evenVBand="0" w:oddHBand="1" w:evenHBand="0" w:firstRowFirstColumn="0" w:firstRowLastColumn="0" w:lastRowFirstColumn="0" w:lastRowLastColumn="0"/>
+            </w:pPr>
+            <w:r>
+              <w:t>Software development and debugging</w:t>
+            </w:r>
+          </w:p>
+        </w:tc>
+        <w:tc>
+          <w:tcPr>
+            <w:tcW w:w="0" w:type="auto"/>
+            <w:vAlign w:val="center"/>
+            <w:hideMark/>
+          </w:tcPr>
+          <w:p>
+            <w:pPr>
+              <w:cnfStyle w:val="000000100000" w:firstRow="0" w:lastRow="0" w:firstColumn="0" w:lastColumn="0" w:oddVBand="0" w:evenVBand="0" w:oddHBand="1" w:evenHBand="0" w:firstRowFirstColumn="0" w:firstRowLastColumn="0" w:lastRowFirstColumn="0" w:lastRowLastColumn="0"/>
+            </w:pPr>
+            <w:r>
+              <w:t>Docker Compose, Local PostgreSQL, Redis</w:t>
+            </w:r>
+          </w:p>
+        </w:tc>
+      </w:tr>
+      <w:tr>
+        <w:tc>
+          <w:tcPr>
+            <w:cnfStyle w:val="001000000000" w:firstRow="0" w:lastRow="0" w:firstColumn="1" w:lastColumn="0" w:oddVBand="0" w:evenVBand="0" w:oddHBand="0" w:evenHBand="0" w:firstRowFirstColumn="0" w:firstRowLastColumn="0" w:lastRowFirstColumn="0" w:lastRowLastColumn="0"/>
+            <w:tcW w:w="0" w:type="auto"/>
+            <w:vAlign w:val="center"/>
+            <w:hideMark/>
+          </w:tcPr>
+          <w:p>
+            <w:pPr>
+              <w:rPr>
+                <w:b w:val="0"/>
+                <w:bCs w:val="0"/>
+              </w:rPr>
+            </w:pPr>
+            <w:r>
+              <w:rPr>
+                <w:b w:val="0"/>
+                <w:bCs w:val="0"/>
+              </w:rPr>
+              <w:t>Testing</w:t>
+            </w:r>
+          </w:p>
+        </w:tc>
+        <w:tc>
+          <w:tcPr>
+            <w:tcW w:w="0" w:type="auto"/>
+            <w:vAlign w:val="center"/>
+            <w:hideMark/>
+          </w:tcPr>
+          <w:p>
+            <w:pPr>
+              <w:cnfStyle w:val="000000000000" w:firstRow="0" w:lastRow="0" w:firstColumn="0" w:lastColumn="0" w:oddVBand="0" w:evenVBand="0" w:oddHBand="0" w:evenHBand="0" w:firstRowFirstColumn="0" w:firstRowLastColumn="0" w:lastRowFirstColumn="0" w:lastRowLastColumn="0"/>
+            </w:pPr>
+            <w:r>
+              <w:t>Functional and integration testing</w:t>
+            </w:r>
+          </w:p>
+        </w:tc>
+        <w:tc>
+          <w:tcPr>
+            <w:tcW w:w="0" w:type="auto"/>
+            <w:vAlign w:val="center"/>
+            <w:hideMark/>
+          </w:tcPr>
+          <w:p>
+            <w:pPr>
+              <w:cnfStyle w:val="000000000000" w:firstRow="0" w:lastRow="0" w:firstColumn="0" w:lastColumn="0" w:oddVBand="0" w:evenVBand="0" w:oddHBand="0" w:evenHBand="0" w:firstRowFirstColumn="0" w:firstRowLastColumn="0" w:lastRowFirstColumn="0" w:lastRowLastColumn="0"/>
+            </w:pPr>
+            <w:r>
+              <w:t>Docker, VPS Testing Server</w:t>
+            </w:r>
+          </w:p>
+        </w:tc>
+      </w:tr>
+      <w:tr>
+        <w:trPr>
+          <w:cnfStyle w:val="000000100000" w:firstRow="0" w:lastRow="0" w:firstColumn="0" w:lastColumn="0" w:oddVBand="0" w:evenVBand="0" w:oddHBand="1" w:evenHBand="0" w:firstRowFirstColumn="0" w:firstRowLastColumn="0" w:lastRowFirstColumn="0" w:lastRowLastColumn="0"/>
+        </w:trPr>
+        <w:tc>
+          <w:tcPr>
+            <w:cnfStyle w:val="001000000000" w:firstRow="0" w:lastRow="0" w:firstColumn="1" w:lastColumn="0" w:oddVBand="0" w:evenVBand="0" w:oddHBand="0" w:evenHBand="0" w:firstRowFirstColumn="0" w:firstRowLastColumn="0" w:lastRowFirstColumn="0" w:lastRowLastColumn="0"/>
+            <w:tcW w:w="0" w:type="auto"/>
+            <w:vAlign w:val="center"/>
+            <w:hideMark/>
+          </w:tcPr>
+          <w:p>
+            <w:pPr>
+              <w:rPr>
+                <w:b w:val="0"/>
+                <w:bCs w:val="0"/>
+              </w:rPr>
+            </w:pPr>
+            <w:r>
+              <w:rPr>
+                <w:b w:val="0"/>
+                <w:bCs w:val="0"/>
+              </w:rPr>
+              <w:t>Production</w:t>
+            </w:r>
+          </w:p>
+        </w:tc>
+        <w:tc>
+          <w:tcPr>
+            <w:tcW w:w="0" w:type="auto"/>
+            <w:vAlign w:val="center"/>
+            <w:hideMark/>
+          </w:tcPr>
+          <w:p>
+            <w:pPr>
+              <w:cnfStyle w:val="000000100000" w:firstRow="0" w:lastRow="0" w:firstColumn="0" w:lastColumn="0" w:oddVBand="0" w:evenVBand="0" w:oddHBand="1" w:evenHBand="0" w:firstRowFirstColumn="0" w:firstRowLastColumn="0" w:lastRowFirstColumn="0" w:lastRowLastColumn="0"/>
+            </w:pPr>
+            <w:r>
+              <w:t>Public system deployment</w:t>
+            </w:r>
+          </w:p>
+        </w:tc>
+        <w:tc>
+          <w:tcPr>
+            <w:tcW w:w="0" w:type="auto"/>
+            <w:vAlign w:val="center"/>
+            <w:hideMark/>
+          </w:tcPr>
+          <w:p>
+            <w:pPr>
+              <w:cnfStyle w:val="000000100000" w:firstRow="0" w:lastRow="0" w:firstColumn="0" w:lastColumn="0" w:oddVBand="0" w:evenVBand="0" w:oddHBand="1" w:evenHBand="0" w:firstRowFirstColumn="0" w:firstRowLastColumn="0" w:lastRowFirstColumn="0" w:lastRowLastColumn="0"/>
+            </w:pPr>
+            <w:r>
+              <w:t>Docker, Coolify, NGINX, VPS</w:t>
+            </w:r>
+          </w:p>
+        </w:tc>
+      </w:tr>
+    </w:tbl>
     <w:p/>
+    <w:p>
+      <w:pPr>
+        <w:pStyle w:val="Heading3"/>
+      </w:pPr>
+      <w:r>
+        <w:t>Infrastructure Architecture</w:t>
+      </w:r>
+    </w:p>
+    <w:p>
+      <w:r>
+        <w:t>Infrastructure architecture divides the platform into separate infrastructure components that work together to perform business operations. Each infrastructure component has a particular responsibility and is loosely coupled to other infrastructure components.</w:t>
+      </w:r>
+      <w:r>
+        <w:t xml:space="preserve"> </w:t>
+      </w:r>
+      <w:r>
+        <w:t>The NGINX Reverse Proxy acts as an interface for the entire platform. It accepts HTTPS connections, handles SSL certificates, and routes the requests to the backend API and frontend applications.</w:t>
+      </w:r>
+      <w:r>
+        <w:t xml:space="preserve"> </w:t>
+      </w:r>
+      <w:r>
+        <w:t>The NestJS Backend is where business logic is placed and exposes REST APIs and WebSocket services for consumption by web, mobile, administration, and agency applications.</w:t>
+      </w:r>
+      <w:r>
+        <w:t xml:space="preserve"> </w:t>
+      </w:r>
+      <w:r>
+        <w:t>Business data is stored in PostgreSQL databases, while Redis speeds up the processing of often-used data and handles session data. Asynchronous processing is performed via RabbitMQ and BullMQ, while Neo4j and pgvector provide artificial intelligence and recommendation services.</w:t>
+      </w:r>
+      <w:r>
+        <w:t xml:space="preserve"> </w:t>
+      </w:r>
+      <w:r>
+        <w:t xml:space="preserve">Vehicle images and </w:t>
+      </w:r>
+      <w:r>
+        <w:lastRenderedPageBreak/>
+        <w:t>agency verification documents are stored in cloud object storage systems such as Cloudflare R2 and Amazon S3. Thus, the burden on databases is reduced, increasing scalability.</w:t>
+      </w:r>
+    </w:p>
+    <w:p>
+      <w:r>
+        <w:t>The major infrastructure components are described below.</w:t>
+      </w:r>
+    </w:p>
+    <w:tbl>
+      <w:tblPr>
+        <w:tblStyle w:val="PlainTable1"/>
+        <w:tblW w:w="0" w:type="auto"/>
+        <w:tblCellMar>
+          <w:top w:w="144" w:type="dxa"/>
+          <w:bottom w:w="144" w:type="dxa"/>
+        </w:tblCellMar>
+        <w:tblLook w:val="04A0" w:firstRow="1" w:lastRow="0" w:firstColumn="1" w:lastColumn="0" w:noHBand="0" w:noVBand="1"/>
+      </w:tblPr>
+      <w:tblGrid>
+        <w:gridCol w:w="3685"/>
+        <w:gridCol w:w="5490"/>
+      </w:tblGrid>
+      <w:tr>
+        <w:trPr>
+          <w:cnfStyle w:val="100000000000" w:firstRow="1" w:lastRow="0" w:firstColumn="0" w:lastColumn="0" w:oddVBand="0" w:evenVBand="0" w:oddHBand="0" w:evenHBand="0" w:firstRowFirstColumn="0" w:firstRowLastColumn="0" w:lastRowFirstColumn="0" w:lastRowLastColumn="0"/>
+        </w:trPr>
+        <w:tc>
+          <w:tcPr>
+            <w:cnfStyle w:val="001000000000" w:firstRow="0" w:lastRow="0" w:firstColumn="1" w:lastColumn="0" w:oddVBand="0" w:evenVBand="0" w:oddHBand="0" w:evenHBand="0" w:firstRowFirstColumn="0" w:firstRowLastColumn="0" w:lastRowFirstColumn="0" w:lastRowLastColumn="0"/>
+            <w:tcW w:w="3685" w:type="dxa"/>
+            <w:vAlign w:val="center"/>
+            <w:hideMark/>
+          </w:tcPr>
+          <w:p>
+            <w:r>
+              <w:t>Infrastructure Component</w:t>
+            </w:r>
+          </w:p>
+        </w:tc>
+        <w:tc>
+          <w:tcPr>
+            <w:tcW w:w="5490" w:type="dxa"/>
+            <w:vAlign w:val="center"/>
+            <w:hideMark/>
+          </w:tcPr>
+          <w:p>
+            <w:pPr>
+              <w:cnfStyle w:val="100000000000" w:firstRow="1" w:lastRow="0" w:firstColumn="0" w:lastColumn="0" w:oddVBand="0" w:evenVBand="0" w:oddHBand="0" w:evenHBand="0" w:firstRowFirstColumn="0" w:firstRowLastColumn="0" w:lastRowFirstColumn="0" w:lastRowLastColumn="0"/>
+            </w:pPr>
+            <w:r>
+              <w:t>Function</w:t>
+            </w:r>
+          </w:p>
+        </w:tc>
+      </w:tr>
+      <w:tr>
+        <w:trPr>
+          <w:cnfStyle w:val="000000100000" w:firstRow="0" w:lastRow="0" w:firstColumn="0" w:lastColumn="0" w:oddVBand="0" w:evenVBand="0" w:oddHBand="1" w:evenHBand="0" w:firstRowFirstColumn="0" w:firstRowLastColumn="0" w:lastRowFirstColumn="0" w:lastRowLastColumn="0"/>
+        </w:trPr>
+        <w:tc>
+          <w:tcPr>
+            <w:cnfStyle w:val="001000000000" w:firstRow="0" w:lastRow="0" w:firstColumn="1" w:lastColumn="0" w:oddVBand="0" w:evenVBand="0" w:oddHBand="0" w:evenHBand="0" w:firstRowFirstColumn="0" w:firstRowLastColumn="0" w:lastRowFirstColumn="0" w:lastRowLastColumn="0"/>
+            <w:tcW w:w="3685" w:type="dxa"/>
+            <w:vAlign w:val="center"/>
+            <w:hideMark/>
+          </w:tcPr>
+          <w:p>
+            <w:pPr>
+              <w:rPr>
+                <w:b w:val="0"/>
+                <w:bCs w:val="0"/>
+              </w:rPr>
+            </w:pPr>
+            <w:r>
+              <w:rPr>
+                <w:b w:val="0"/>
+                <w:bCs w:val="0"/>
+              </w:rPr>
+              <w:t>NGINX</w:t>
+            </w:r>
+          </w:p>
+        </w:tc>
+        <w:tc>
+          <w:tcPr>
+            <w:tcW w:w="5490" w:type="dxa"/>
+            <w:vAlign w:val="center"/>
+            <w:hideMark/>
+          </w:tcPr>
+          <w:p>
+            <w:pPr>
+              <w:cnfStyle w:val="000000100000" w:firstRow="0" w:lastRow="0" w:firstColumn="0" w:lastColumn="0" w:oddVBand="0" w:evenVBand="0" w:oddHBand="1" w:evenHBand="0" w:firstRowFirstColumn="0" w:firstRowLastColumn="0" w:lastRowFirstColumn="0" w:lastRowLastColumn="0"/>
+            </w:pPr>
+            <w:r>
+              <w:t>Reverse proxy and HTTPS termination</w:t>
+            </w:r>
+          </w:p>
+        </w:tc>
+      </w:tr>
+      <w:tr>
+        <w:tc>
+          <w:tcPr>
+            <w:cnfStyle w:val="001000000000" w:firstRow="0" w:lastRow="0" w:firstColumn="1" w:lastColumn="0" w:oddVBand="0" w:evenVBand="0" w:oddHBand="0" w:evenHBand="0" w:firstRowFirstColumn="0" w:firstRowLastColumn="0" w:lastRowFirstColumn="0" w:lastRowLastColumn="0"/>
+            <w:tcW w:w="3685" w:type="dxa"/>
+            <w:vAlign w:val="center"/>
+            <w:hideMark/>
+          </w:tcPr>
+          <w:p>
+            <w:pPr>
+              <w:rPr>
+                <w:b w:val="0"/>
+                <w:bCs w:val="0"/>
+              </w:rPr>
+            </w:pPr>
+            <w:r>
+              <w:rPr>
+                <w:b w:val="0"/>
+                <w:bCs w:val="0"/>
+              </w:rPr>
+              <w:t>Docker</w:t>
+            </w:r>
+          </w:p>
+        </w:tc>
+        <w:tc>
+          <w:tcPr>
+            <w:tcW w:w="5490" w:type="dxa"/>
+            <w:vAlign w:val="center"/>
+            <w:hideMark/>
+          </w:tcPr>
+          <w:p>
+            <w:pPr>
+              <w:cnfStyle w:val="000000000000" w:firstRow="0" w:lastRow="0" w:firstColumn="0" w:lastColumn="0" w:oddVBand="0" w:evenVBand="0" w:oddHBand="0" w:evenHBand="0" w:firstRowFirstColumn="0" w:firstRowLastColumn="0" w:lastRowFirstColumn="0" w:lastRowLastColumn="0"/>
+            </w:pPr>
+            <w:r>
+              <w:t>Container execution</w:t>
+            </w:r>
+          </w:p>
+        </w:tc>
+      </w:tr>
+      <w:tr>
+        <w:trPr>
+          <w:cnfStyle w:val="000000100000" w:firstRow="0" w:lastRow="0" w:firstColumn="0" w:lastColumn="0" w:oddVBand="0" w:evenVBand="0" w:oddHBand="1" w:evenHBand="0" w:firstRowFirstColumn="0" w:firstRowLastColumn="0" w:lastRowFirstColumn="0" w:lastRowLastColumn="0"/>
+        </w:trPr>
+        <w:tc>
+          <w:tcPr>
+            <w:cnfStyle w:val="001000000000" w:firstRow="0" w:lastRow="0" w:firstColumn="1" w:lastColumn="0" w:oddVBand="0" w:evenVBand="0" w:oddHBand="0" w:evenHBand="0" w:firstRowFirstColumn="0" w:firstRowLastColumn="0" w:lastRowFirstColumn="0" w:lastRowLastColumn="0"/>
+            <w:tcW w:w="3685" w:type="dxa"/>
+            <w:vAlign w:val="center"/>
+            <w:hideMark/>
+          </w:tcPr>
+          <w:p>
+            <w:pPr>
+              <w:rPr>
+                <w:b w:val="0"/>
+                <w:bCs w:val="0"/>
+              </w:rPr>
+            </w:pPr>
+            <w:r>
+              <w:rPr>
+                <w:b w:val="0"/>
+                <w:bCs w:val="0"/>
+              </w:rPr>
+              <w:t>Coolify</w:t>
+            </w:r>
+          </w:p>
+        </w:tc>
+        <w:tc>
+          <w:tcPr>
+            <w:tcW w:w="5490" w:type="dxa"/>
+            <w:vAlign w:val="center"/>
+            <w:hideMark/>
+          </w:tcPr>
+          <w:p>
+            <w:pPr>
+              <w:cnfStyle w:val="000000100000" w:firstRow="0" w:lastRow="0" w:firstColumn="0" w:lastColumn="0" w:oddVBand="0" w:evenVBand="0" w:oddHBand="1" w:evenHBand="0" w:firstRowFirstColumn="0" w:firstRowLastColumn="0" w:lastRowFirstColumn="0" w:lastRowLastColumn="0"/>
+            </w:pPr>
+            <w:r>
+              <w:t>Container deployment management</w:t>
+            </w:r>
+          </w:p>
+        </w:tc>
+      </w:tr>
+      <w:tr>
+        <w:tc>
+          <w:tcPr>
+            <w:cnfStyle w:val="001000000000" w:firstRow="0" w:lastRow="0" w:firstColumn="1" w:lastColumn="0" w:oddVBand="0" w:evenVBand="0" w:oddHBand="0" w:evenHBand="0" w:firstRowFirstColumn="0" w:firstRowLastColumn="0" w:lastRowFirstColumn="0" w:lastRowLastColumn="0"/>
+            <w:tcW w:w="3685" w:type="dxa"/>
+            <w:vAlign w:val="center"/>
+            <w:hideMark/>
+          </w:tcPr>
+          <w:p>
+            <w:pPr>
+              <w:rPr>
+                <w:b w:val="0"/>
+                <w:bCs w:val="0"/>
+              </w:rPr>
+            </w:pPr>
+            <w:r>
+              <w:rPr>
+                <w:b w:val="0"/>
+                <w:bCs w:val="0"/>
+              </w:rPr>
+              <w:t>NestJS</w:t>
+            </w:r>
+          </w:p>
+        </w:tc>
+        <w:tc>
+          <w:tcPr>
+            <w:tcW w:w="5490" w:type="dxa"/>
+            <w:vAlign w:val="center"/>
+            <w:hideMark/>
+          </w:tcPr>
+          <w:p>
+            <w:pPr>
+              <w:cnfStyle w:val="000000000000" w:firstRow="0" w:lastRow="0" w:firstColumn="0" w:lastColumn="0" w:oddVBand="0" w:evenVBand="0" w:oddHBand="0" w:evenHBand="0" w:firstRowFirstColumn="0" w:firstRowLastColumn="0" w:lastRowFirstColumn="0" w:lastRowLastColumn="0"/>
+            </w:pPr>
+            <w:r>
+              <w:t>Backend services</w:t>
+            </w:r>
+          </w:p>
+        </w:tc>
+      </w:tr>
+      <w:tr>
+        <w:trPr>
+          <w:cnfStyle w:val="000000100000" w:firstRow="0" w:lastRow="0" w:firstColumn="0" w:lastColumn="0" w:oddVBand="0" w:evenVBand="0" w:oddHBand="1" w:evenHBand="0" w:firstRowFirstColumn="0" w:firstRowLastColumn="0" w:lastRowFirstColumn="0" w:lastRowLastColumn="0"/>
+        </w:trPr>
+        <w:tc>
+          <w:tcPr>
+            <w:cnfStyle w:val="001000000000" w:firstRow="0" w:lastRow="0" w:firstColumn="1" w:lastColumn="0" w:oddVBand="0" w:evenVBand="0" w:oddHBand="0" w:evenHBand="0" w:firstRowFirstColumn="0" w:firstRowLastColumn="0" w:lastRowFirstColumn="0" w:lastRowLastColumn="0"/>
+            <w:tcW w:w="3685" w:type="dxa"/>
+            <w:vAlign w:val="center"/>
+            <w:hideMark/>
+          </w:tcPr>
+          <w:p>
+            <w:pPr>
+              <w:rPr>
+                <w:b w:val="0"/>
+                <w:bCs w:val="0"/>
+              </w:rPr>
+            </w:pPr>
+            <w:r>
+              <w:rPr>
+                <w:b w:val="0"/>
+                <w:bCs w:val="0"/>
+              </w:rPr>
+              <w:t>PostgreSQL</w:t>
+            </w:r>
+          </w:p>
+        </w:tc>
+        <w:tc>
+          <w:tcPr>
+            <w:tcW w:w="5490" w:type="dxa"/>
+            <w:vAlign w:val="center"/>
+            <w:hideMark/>
+          </w:tcPr>
+          <w:p>
+            <w:pPr>
+              <w:cnfStyle w:val="000000100000" w:firstRow="0" w:lastRow="0" w:firstColumn="0" w:lastColumn="0" w:oddVBand="0" w:evenVBand="0" w:oddHBand="1" w:evenHBand="0" w:firstRowFirstColumn="0" w:firstRowLastColumn="0" w:lastRowFirstColumn="0" w:lastRowLastColumn="0"/>
+            </w:pPr>
+            <w:r>
+              <w:t>Relational database</w:t>
+            </w:r>
+          </w:p>
+        </w:tc>
+      </w:tr>
+      <w:tr>
+        <w:tc>
+          <w:tcPr>
+            <w:cnfStyle w:val="001000000000" w:firstRow="0" w:lastRow="0" w:firstColumn="1" w:lastColumn="0" w:oddVBand="0" w:evenVBand="0" w:oddHBand="0" w:evenHBand="0" w:firstRowFirstColumn="0" w:firstRowLastColumn="0" w:lastRowFirstColumn="0" w:lastRowLastColumn="0"/>
+            <w:tcW w:w="3685" w:type="dxa"/>
+            <w:vAlign w:val="center"/>
+            <w:hideMark/>
+          </w:tcPr>
+          <w:p>
+            <w:pPr>
+              <w:rPr>
+                <w:b w:val="0"/>
+                <w:bCs w:val="0"/>
+              </w:rPr>
+            </w:pPr>
+            <w:r>
+              <w:rPr>
+                <w:b w:val="0"/>
+                <w:bCs w:val="0"/>
+              </w:rPr>
+              <w:t>Redis</w:t>
+            </w:r>
+          </w:p>
+        </w:tc>
+        <w:tc>
+          <w:tcPr>
+            <w:tcW w:w="5490" w:type="dxa"/>
+            <w:vAlign w:val="center"/>
+            <w:hideMark/>
+          </w:tcPr>
+          <w:p>
+            <w:pPr>
+              <w:cnfStyle w:val="000000000000" w:firstRow="0" w:lastRow="0" w:firstColumn="0" w:lastColumn="0" w:oddVBand="0" w:evenVBand="0" w:oddHBand="0" w:evenHBand="0" w:firstRowFirstColumn="0" w:firstRowLastColumn="0" w:lastRowFirstColumn="0" w:lastRowLastColumn="0"/>
+            </w:pPr>
+            <w:r>
+              <w:t>Cache and session storage</w:t>
+            </w:r>
+          </w:p>
+        </w:tc>
+      </w:tr>
+      <w:tr>
+        <w:trPr>
+          <w:cnfStyle w:val="000000100000" w:firstRow="0" w:lastRow="0" w:firstColumn="0" w:lastColumn="0" w:oddVBand="0" w:evenVBand="0" w:oddHBand="1" w:evenHBand="0" w:firstRowFirstColumn="0" w:firstRowLastColumn="0" w:lastRowFirstColumn="0" w:lastRowLastColumn="0"/>
+        </w:trPr>
+        <w:tc>
+          <w:tcPr>
+            <w:cnfStyle w:val="001000000000" w:firstRow="0" w:lastRow="0" w:firstColumn="1" w:lastColumn="0" w:oddVBand="0" w:evenVBand="0" w:oddHBand="0" w:evenHBand="0" w:firstRowFirstColumn="0" w:firstRowLastColumn="0" w:lastRowFirstColumn="0" w:lastRowLastColumn="0"/>
+            <w:tcW w:w="3685" w:type="dxa"/>
+            <w:vAlign w:val="center"/>
+            <w:hideMark/>
+          </w:tcPr>
+          <w:p>
+            <w:pPr>
+              <w:rPr>
+                <w:b w:val="0"/>
+                <w:bCs w:val="0"/>
+              </w:rPr>
+            </w:pPr>
+            <w:r>
+              <w:rPr>
+                <w:b w:val="0"/>
+                <w:bCs w:val="0"/>
+              </w:rPr>
+              <w:t>RabbitMQ</w:t>
+            </w:r>
+          </w:p>
+        </w:tc>
+        <w:tc>
+          <w:tcPr>
+            <w:tcW w:w="5490" w:type="dxa"/>
+            <w:vAlign w:val="center"/>
+            <w:hideMark/>
+          </w:tcPr>
+          <w:p>
+            <w:pPr>
+              <w:cnfStyle w:val="000000100000" w:firstRow="0" w:lastRow="0" w:firstColumn="0" w:lastColumn="0" w:oddVBand="0" w:evenVBand="0" w:oddHBand="1" w:evenHBand="0" w:firstRowFirstColumn="0" w:firstRowLastColumn="0" w:lastRowFirstColumn="0" w:lastRowLastColumn="0"/>
+            </w:pPr>
+            <w:r>
+              <w:t>Message broker</w:t>
+            </w:r>
+          </w:p>
+        </w:tc>
+      </w:tr>
+      <w:tr>
+        <w:tc>
+          <w:tcPr>
+            <w:cnfStyle w:val="001000000000" w:firstRow="0" w:lastRow="0" w:firstColumn="1" w:lastColumn="0" w:oddVBand="0" w:evenVBand="0" w:oddHBand="0" w:evenHBand="0" w:firstRowFirstColumn="0" w:firstRowLastColumn="0" w:lastRowFirstColumn="0" w:lastRowLastColumn="0"/>
+            <w:tcW w:w="3685" w:type="dxa"/>
+            <w:vAlign w:val="center"/>
+            <w:hideMark/>
+          </w:tcPr>
+          <w:p>
+            <w:pPr>
+              <w:rPr>
+                <w:b w:val="0"/>
+                <w:bCs w:val="0"/>
+              </w:rPr>
+            </w:pPr>
+            <w:r>
+              <w:rPr>
+                <w:b w:val="0"/>
+                <w:bCs w:val="0"/>
+              </w:rPr>
+              <w:t>BullMQ</w:t>
+            </w:r>
+          </w:p>
+        </w:tc>
+        <w:tc>
+          <w:tcPr>
+            <w:tcW w:w="5490" w:type="dxa"/>
+            <w:vAlign w:val="center"/>
+            <w:hideMark/>
+          </w:tcPr>
+          <w:p>
+            <w:pPr>
+              <w:cnfStyle w:val="000000000000" w:firstRow="0" w:lastRow="0" w:firstColumn="0" w:lastColumn="0" w:oddVBand="0" w:evenVBand="0" w:oddHBand="0" w:evenHBand="0" w:firstRowFirstColumn="0" w:firstRowLastColumn="0" w:lastRowFirstColumn="0" w:lastRowLastColumn="0"/>
+            </w:pPr>
+            <w:r>
+              <w:t>Background job processing</w:t>
+            </w:r>
+          </w:p>
+        </w:tc>
+      </w:tr>
+      <w:tr>
+        <w:trPr>
+          <w:cnfStyle w:val="000000100000" w:firstRow="0" w:lastRow="0" w:firstColumn="0" w:lastColumn="0" w:oddVBand="0" w:evenVBand="0" w:oddHBand="1" w:evenHBand="0" w:firstRowFirstColumn="0" w:firstRowLastColumn="0" w:lastRowFirstColumn="0" w:lastRowLastColumn="0"/>
+        </w:trPr>
+        <w:tc>
+          <w:tcPr>
+            <w:cnfStyle w:val="001000000000" w:firstRow="0" w:lastRow="0" w:firstColumn="1" w:lastColumn="0" w:oddVBand="0" w:evenVBand="0" w:oddHBand="0" w:evenHBand="0" w:firstRowFirstColumn="0" w:firstRowLastColumn="0" w:lastRowFirstColumn="0" w:lastRowLastColumn="0"/>
+            <w:tcW w:w="3685" w:type="dxa"/>
+            <w:vAlign w:val="center"/>
+            <w:hideMark/>
+          </w:tcPr>
+          <w:p>
+            <w:pPr>
+              <w:rPr>
+                <w:b w:val="0"/>
+                <w:bCs w:val="0"/>
+              </w:rPr>
+            </w:pPr>
+            <w:r>
+              <w:rPr>
+                <w:b w:val="0"/>
+                <w:bCs w:val="0"/>
+              </w:rPr>
+              <w:t>Neo4j</w:t>
+            </w:r>
+          </w:p>
+        </w:tc>
+        <w:tc>
+          <w:tcPr>
+            <w:tcW w:w="5490" w:type="dxa"/>
+            <w:vAlign w:val="center"/>
+            <w:hideMark/>
+          </w:tcPr>
+          <w:p>
+            <w:pPr>
+              <w:cnfStyle w:val="000000100000" w:firstRow="0" w:lastRow="0" w:firstColumn="0" w:lastColumn="0" w:oddVBand="0" w:evenVBand="0" w:oddHBand="1" w:evenHBand="0" w:firstRowFirstColumn="0" w:firstRowLastColumn="0" w:lastRowFirstColumn="0" w:lastRowLastColumn="0"/>
+            </w:pPr>
+            <w:r>
+              <w:t>Graph database</w:t>
+            </w:r>
+          </w:p>
+        </w:tc>
+      </w:tr>
+      <w:tr>
+        <w:tc>
+          <w:tcPr>
+            <w:cnfStyle w:val="001000000000" w:firstRow="0" w:lastRow="0" w:firstColumn="1" w:lastColumn="0" w:oddVBand="0" w:evenVBand="0" w:oddHBand="0" w:evenHBand="0" w:firstRowFirstColumn="0" w:firstRowLastColumn="0" w:lastRowFirstColumn="0" w:lastRowLastColumn="0"/>
+            <w:tcW w:w="3685" w:type="dxa"/>
+            <w:vAlign w:val="center"/>
+            <w:hideMark/>
+          </w:tcPr>
+          <w:p>
+            <w:pPr>
+              <w:rPr>
+                <w:b w:val="0"/>
+                <w:bCs w:val="0"/>
+              </w:rPr>
+            </w:pPr>
+            <w:r>
+              <w:rPr>
+                <w:b w:val="0"/>
+                <w:bCs w:val="0"/>
+              </w:rPr>
+              <w:t>pgvector</w:t>
+            </w:r>
+          </w:p>
+        </w:tc>
+        <w:tc>
+          <w:tcPr>
+            <w:tcW w:w="5490" w:type="dxa"/>
+            <w:vAlign w:val="center"/>
+            <w:hideMark/>
+          </w:tcPr>
+          <w:p>
+            <w:pPr>
+              <w:cnfStyle w:val="000000000000" w:firstRow="0" w:lastRow="0" w:firstColumn="0" w:lastColumn="0" w:oddVBand="0" w:evenVBand="0" w:oddHBand="0" w:evenHBand="0" w:firstRowFirstColumn="0" w:firstRowLastColumn="0" w:lastRowFirstColumn="0" w:lastRowLastColumn="0"/>
+            </w:pPr>
+            <w:r>
+              <w:t>Vector similarity search</w:t>
+            </w:r>
+          </w:p>
+        </w:tc>
+      </w:tr>
+      <w:tr>
+        <w:trPr>
+          <w:cnfStyle w:val="000000100000" w:firstRow="0" w:lastRow="0" w:firstColumn="0" w:lastColumn="0" w:oddVBand="0" w:evenVBand="0" w:oddHBand="1" w:evenHBand="0" w:firstRowFirstColumn="0" w:firstRowLastColumn="0" w:lastRowFirstColumn="0" w:lastRowLastColumn="0"/>
+        </w:trPr>
+        <w:tc>
+          <w:tcPr>
+            <w:cnfStyle w:val="001000000000" w:firstRow="0" w:lastRow="0" w:firstColumn="1" w:lastColumn="0" w:oddVBand="0" w:evenVBand="0" w:oddHBand="0" w:evenHBand="0" w:firstRowFirstColumn="0" w:firstRowLastColumn="0" w:lastRowFirstColumn="0" w:lastRowLastColumn="0"/>
+            <w:tcW w:w="3685" w:type="dxa"/>
+            <w:vAlign w:val="center"/>
+            <w:hideMark/>
+          </w:tcPr>
+          <w:p>
+            <w:pPr>
+              <w:rPr>
+                <w:b w:val="0"/>
+                <w:bCs w:val="0"/>
+              </w:rPr>
+            </w:pPr>
+            <w:r>
+              <w:rPr>
+                <w:b w:val="0"/>
+                <w:bCs w:val="0"/>
+              </w:rPr>
+              <w:t>Cloudflare R2 / Amazon S3</w:t>
+            </w:r>
+          </w:p>
+        </w:tc>
+        <w:tc>
+          <w:tcPr>
+            <w:tcW w:w="5490" w:type="dxa"/>
+            <w:vAlign w:val="center"/>
+            <w:hideMark/>
+          </w:tcPr>
+          <w:p>
+            <w:pPr>
+              <w:cnfStyle w:val="000000100000" w:firstRow="0" w:lastRow="0" w:firstColumn="0" w:lastColumn="0" w:oddVBand="0" w:evenVBand="0" w:oddHBand="1" w:evenHBand="0" w:firstRowFirstColumn="0" w:firstRowLastColumn="0" w:lastRowFirstColumn="0" w:lastRowLastColumn="0"/>
+            </w:pPr>
+            <w:r>
+              <w:t>File storage</w:t>
+            </w:r>
+          </w:p>
+        </w:tc>
+      </w:tr>
+    </w:tbl>
+    <w:p/>
+    <w:p>
+      <w:r>
+        <w:t>This distributed infrastructure improves scalability, maintainability, and fault isolation while allowing each component to evolve independently.</w:t>
+      </w:r>
+    </w:p>
+    <w:p>
+      <w:pPr>
+        <w:spacing w:line="278" w:lineRule="auto"/>
+      </w:pPr>
+      <w:r>
+        <w:br w:type="page"/>
+      </w:r>
+    </w:p>
+    <w:p>
+      <w:pPr>
+        <w:pStyle w:val="Heading3"/>
+      </w:pPr>
+      <w:r>
+        <w:lastRenderedPageBreak/>
+        <w:t>Deployment Strategy Design</w:t>
+      </w:r>
+    </w:p>
+    <w:p>
+      <w:r>
+        <w:t>In terms of deployment strategy, KriGo platform employs automation and minimization of service disruption as its core features. Software components are packaged as Docker images and deployed independently, providing an opportunity to update them without disrupting other services.</w:t>
+      </w:r>
+      <w:r>
+        <w:t xml:space="preserve"> </w:t>
+      </w:r>
+      <w:r>
+        <w:t>Source code changes are pushed to the version control repository, and then the deployment platform builds and updates Docker images, replacing old containers. Databases are migrated automatically to ensure schema consistency while maintaining application data in place.</w:t>
+      </w:r>
+    </w:p>
+    <w:p>
+      <w:r>
+        <w:t>Deployment process proceeds as follows:</w:t>
+      </w:r>
+    </w:p>
+    <w:p>
+      <w:pPr>
+        <w:pStyle w:val="ListParagraph"/>
+        <w:numPr>
+          <w:ilvl w:val="0"/>
+          <w:numId w:val="191"/>
+        </w:numPr>
+      </w:pPr>
+      <w:r>
+        <w:t>Changes are committed to the source code repository.</w:t>
+      </w:r>
+    </w:p>
+    <w:p>
+      <w:pPr>
+        <w:pStyle w:val="ListParagraph"/>
+        <w:numPr>
+          <w:ilvl w:val="0"/>
+          <w:numId w:val="191"/>
+        </w:numPr>
+      </w:pPr>
+      <w:r>
+        <w:t>New version is stored in the source repository.</w:t>
+      </w:r>
+    </w:p>
+    <w:p>
+      <w:pPr>
+        <w:pStyle w:val="ListParagraph"/>
+        <w:numPr>
+          <w:ilvl w:val="0"/>
+          <w:numId w:val="191"/>
+        </w:numPr>
+      </w:pPr>
+      <w:r>
+        <w:t>Coolify builds Docker images.</w:t>
+      </w:r>
+    </w:p>
+    <w:p>
+      <w:pPr>
+        <w:pStyle w:val="ListParagraph"/>
+        <w:numPr>
+          <w:ilvl w:val="0"/>
+          <w:numId w:val="191"/>
+        </w:numPr>
+      </w:pPr>
+      <w:r>
+        <w:t>Updated containers are deployed.</w:t>
+      </w:r>
+    </w:p>
+    <w:p>
+      <w:pPr>
+        <w:pStyle w:val="ListParagraph"/>
+        <w:numPr>
+          <w:ilvl w:val="0"/>
+          <w:numId w:val="191"/>
+        </w:numPr>
+      </w:pPr>
+      <w:r>
+        <w:t>Database migrations are performed.</w:t>
+      </w:r>
+    </w:p>
+    <w:p>
+      <w:pPr>
+        <w:pStyle w:val="ListParagraph"/>
+        <w:numPr>
+          <w:ilvl w:val="0"/>
+          <w:numId w:val="191"/>
+        </w:numPr>
+      </w:pPr>
+      <w:r>
+        <w:t>Health checks are conducted to make sure that services are available.</w:t>
+      </w:r>
+    </w:p>
+    <w:p>
+      <w:pPr>
+        <w:pStyle w:val="ListParagraph"/>
+        <w:numPr>
+          <w:ilvl w:val="0"/>
+          <w:numId w:val="191"/>
+        </w:numPr>
+      </w:pPr>
+      <w:r>
+        <w:t>NGINX routes client requests to the updated services.</w:t>
+      </w:r>
+    </w:p>
+    <w:p>
+      <w:pPr>
+        <w:pStyle w:val="Heading3"/>
+      </w:pPr>
+      <w:r>
+        <w:t>Scalability and Availability</w:t>
+      </w:r>
+    </w:p>
+    <w:p>
+      <w:r>
+        <w:t>Containerized architecture allows for separate scaling of software components depending on workload requirements. Backend services can be replicated without touching the databases, and caching with Redis allows reducing the load of the databases in case of increased workload.</w:t>
+      </w:r>
+      <w:r>
+        <w:t xml:space="preserve"> </w:t>
+      </w:r>
+      <w:r>
+        <w:t>Background tasks execution using RabbitMQ and BullMQ allows avoiding long-term tasks from slowing down the process of handling user requests. Moreover, cloud object storage is capable of storing the uploaded files of unlimited size without using extra space in the database.</w:t>
+      </w:r>
+      <w:r>
+        <w:t xml:space="preserve"> </w:t>
+      </w:r>
+      <w:r>
+        <w:t>The deployment architecture is also designed in such a way that in case the platform needs more scalability in the future, it can be easily moved to the Kubernetes orchestration platform.</w:t>
+      </w:r>
+    </w:p>
+    <w:p>
+      <w:pPr>
+        <w:pStyle w:val="Heading3"/>
+      </w:pPr>
+      <w:r>
+        <w:t>Security Considerations</w:t>
+      </w:r>
+    </w:p>
+    <w:p>
+      <w:r>
+        <w:t>Some security measures are employed in the deployment architecture in order to protect infrastructure resources and communication channels. All communications between clients and servers use HTTPS encryption. Docker containers isolate applications and provide service isolation as well. Environment variables are used to store sensitive information such as database credentials, JWT secret, API keys, and credentials of third-party services.</w:t>
+      </w:r>
+      <w:r>
+        <w:t xml:space="preserve"> </w:t>
+      </w:r>
+      <w:r>
+        <w:t>Firewall is used in order to allow access to internal services only from inside the infrastructure and to prevent any external access except the one to the reverse proxy. Access to databases, caching infrastructure, and message brokers is restricted to internal network only.</w:t>
+      </w:r>
+    </w:p>
+    <w:p>
+      <w:r>
+        <w:t>Main security measures used in deployment include:</w:t>
+      </w:r>
+    </w:p>
+    <w:p>
+      <w:pPr>
+        <w:pStyle w:val="ListParagraph"/>
+        <w:numPr>
+          <w:ilvl w:val="0"/>
+          <w:numId w:val="192"/>
+        </w:numPr>
+      </w:pPr>
+      <w:r>
+        <w:t>HTTPS/TLS encryption.</w:t>
+      </w:r>
+    </w:p>
+    <w:p>
+      <w:pPr>
+        <w:pStyle w:val="ListParagraph"/>
+        <w:numPr>
+          <w:ilvl w:val="0"/>
+          <w:numId w:val="192"/>
+        </w:numPr>
+      </w:pPr>
+      <w:r>
+        <w:t>Docker container isolation.</w:t>
+      </w:r>
+    </w:p>
+    <w:p>
+      <w:pPr>
+        <w:pStyle w:val="ListParagraph"/>
+        <w:numPr>
+          <w:ilvl w:val="0"/>
+          <w:numId w:val="192"/>
+        </w:numPr>
+      </w:pPr>
+      <w:r>
+        <w:t>Internal service networking.</w:t>
+      </w:r>
+    </w:p>
+    <w:p>
+      <w:pPr>
+        <w:pStyle w:val="ListParagraph"/>
+        <w:numPr>
+          <w:ilvl w:val="0"/>
+          <w:numId w:val="192"/>
+        </w:numPr>
+      </w:pPr>
+      <w:r>
+        <w:t>Environment variable management.</w:t>
+      </w:r>
+    </w:p>
+    <w:p>
+      <w:pPr>
+        <w:pStyle w:val="ListParagraph"/>
+        <w:numPr>
+          <w:ilvl w:val="0"/>
+          <w:numId w:val="192"/>
+        </w:numPr>
+      </w:pPr>
+      <w:r>
+        <w:t>Firewall protection.</w:t>
+      </w:r>
+    </w:p>
+    <w:p>
+      <w:pPr>
+        <w:pStyle w:val="ListParagraph"/>
+        <w:numPr>
+          <w:ilvl w:val="0"/>
+          <w:numId w:val="192"/>
+        </w:numPr>
+      </w:pPr>
+      <w:r>
+        <w:t>Database security.</w:t>
+      </w:r>
+    </w:p>
+    <w:p>
+      <w:pPr>
+        <w:pStyle w:val="ListParagraph"/>
+        <w:numPr>
+          <w:ilvl w:val="0"/>
+          <w:numId w:val="192"/>
+        </w:numPr>
+      </w:pPr>
+      <w:r>
+        <w:t>Reverse proxy security.</w:t>
+      </w:r>
+    </w:p>
+    <w:p>
+      <w:pPr>
+        <w:pStyle w:val="ListParagraph"/>
+        <w:numPr>
+          <w:ilvl w:val="0"/>
+          <w:numId w:val="192"/>
+        </w:numPr>
+      </w:pPr>
+      <w:r>
+        <w:t>Automated SSL certificate management.</w:t>
+      </w:r>
+    </w:p>
+    <w:p>
+      <w:pPr>
+        <w:spacing w:line="278" w:lineRule="auto"/>
+      </w:pPr>
+      <w:r>
+        <w:br w:type="page"/>
+      </w:r>
+    </w:p>
     <w:sectPr>
       <w:headerReference w:type="default" r:id="rId27"/>
       <w:footerReference w:type="default" r:id="rId28"/>
@@ -21941,6 +23071,119 @@
     </w:lvl>
   </w:abstractNum>
   <w:abstractNum w:abstractNumId="50" w15:restartNumberingAfterBreak="0">
+    <w:nsid w:val="2A165A19"/>
+    <w:multiLevelType w:val="hybridMultilevel"/>
+    <w:tmpl w:val="6EFAE520"/>
+    <w:lvl w:ilvl="0" w:tplc="04090005">
+      <w:start w:val="1"/>
+      <w:numFmt w:val="bullet"/>
+      <w:lvlText w:val=""/>
+      <w:lvlJc w:val="left"/>
+      <w:pPr>
+        <w:ind w:left="720" w:hanging="360"/>
+      </w:pPr>
+      <w:rPr>
+        <w:rFonts w:ascii="Wingdings" w:hAnsi="Wingdings" w:hint="default"/>
+      </w:rPr>
+    </w:lvl>
+    <w:lvl w:ilvl="1" w:tplc="04090003" w:tentative="1">
+      <w:start w:val="1"/>
+      <w:numFmt w:val="bullet"/>
+      <w:lvlText w:val="o"/>
+      <w:lvlJc w:val="left"/>
+      <w:pPr>
+        <w:ind w:left="1440" w:hanging="360"/>
+      </w:pPr>
+      <w:rPr>
+        <w:rFonts w:ascii="Courier New" w:hAnsi="Courier New" w:cs="Courier New" w:hint="default"/>
+      </w:rPr>
+    </w:lvl>
+    <w:lvl w:ilvl="2" w:tplc="04090005" w:tentative="1">
+      <w:start w:val="1"/>
+      <w:numFmt w:val="bullet"/>
+      <w:lvlText w:val=""/>
+      <w:lvlJc w:val="left"/>
+      <w:pPr>
+        <w:ind w:left="2160" w:hanging="360"/>
+      </w:pPr>
+      <w:rPr>
+        <w:rFonts w:ascii="Wingdings" w:hAnsi="Wingdings" w:hint="default"/>
+      </w:rPr>
+    </w:lvl>
+    <w:lvl w:ilvl="3" w:tplc="04090001" w:tentative="1">
+      <w:start w:val="1"/>
+      <w:numFmt w:val="bullet"/>
+      <w:lvlText w:val=""/>
+      <w:lvlJc w:val="left"/>
+      <w:pPr>
+        <w:ind w:left="2880" w:hanging="360"/>
+      </w:pPr>
+      <w:rPr>
+        <w:rFonts w:ascii="Symbol" w:hAnsi="Symbol" w:hint="default"/>
+      </w:rPr>
+    </w:lvl>
+    <w:lvl w:ilvl="4" w:tplc="04090003" w:tentative="1">
+      <w:start w:val="1"/>
+      <w:numFmt w:val="bullet"/>
+      <w:lvlText w:val="o"/>
+      <w:lvlJc w:val="left"/>
+      <w:pPr>
+        <w:ind w:left="3600" w:hanging="360"/>
+      </w:pPr>
+      <w:rPr>
+        <w:rFonts w:ascii="Courier New" w:hAnsi="Courier New" w:cs="Courier New" w:hint="default"/>
+      </w:rPr>
+    </w:lvl>
+    <w:lvl w:ilvl="5" w:tplc="04090005" w:tentative="1">
+      <w:start w:val="1"/>
+      <w:numFmt w:val="bullet"/>
+      <w:lvlText w:val=""/>
+      <w:lvlJc w:val="left"/>
+      <w:pPr>
+        <w:ind w:left="4320" w:hanging="360"/>
+      </w:pPr>
+      <w:rPr>
+        <w:rFonts w:ascii="Wingdings" w:hAnsi="Wingdings" w:hint="default"/>
+      </w:rPr>
+    </w:lvl>
+    <w:lvl w:ilvl="6" w:tplc="04090001" w:tentative="1">
+      <w:start w:val="1"/>
+      <w:numFmt w:val="bullet"/>
+      <w:lvlText w:val=""/>
+      <w:lvlJc w:val="left"/>
+      <w:pPr>
+        <w:ind w:left="5040" w:hanging="360"/>
+      </w:pPr>
+      <w:rPr>
+        <w:rFonts w:ascii="Symbol" w:hAnsi="Symbol" w:hint="default"/>
+      </w:rPr>
+    </w:lvl>
+    <w:lvl w:ilvl="7" w:tplc="04090003" w:tentative="1">
+      <w:start w:val="1"/>
+      <w:numFmt w:val="bullet"/>
+      <w:lvlText w:val="o"/>
+      <w:lvlJc w:val="left"/>
+      <w:pPr>
+        <w:ind w:left="5760" w:hanging="360"/>
+      </w:pPr>
+      <w:rPr>
+        <w:rFonts w:ascii="Courier New" w:hAnsi="Courier New" w:cs="Courier New" w:hint="default"/>
+      </w:rPr>
+    </w:lvl>
+    <w:lvl w:ilvl="8" w:tplc="04090005" w:tentative="1">
+      <w:start w:val="1"/>
+      <w:numFmt w:val="bullet"/>
+      <w:lvlText w:val=""/>
+      <w:lvlJc w:val="left"/>
+      <w:pPr>
+        <w:ind w:left="6480" w:hanging="360"/>
+      </w:pPr>
+      <w:rPr>
+        <w:rFonts w:ascii="Wingdings" w:hAnsi="Wingdings" w:hint="default"/>
+      </w:rPr>
+    </w:lvl>
+  </w:abstractNum>
+  <w:abstractNum w:abstractNumId="51" w15:restartNumberingAfterBreak="0">
     <w:nsid w:val="2ADE3401"/>
     <w:multiLevelType w:val="multilevel"/>
     <w:tmpl w:val="63F4E6F0"/>
@@ -22089,7 +23332,7 @@
       </w:rPr>
     </w:lvl>
   </w:abstractNum>
-  <w:abstractNum w:abstractNumId="51" w15:restartNumberingAfterBreak="0">
+  <w:abstractNum w:abstractNumId="52" w15:restartNumberingAfterBreak="0">
     <w:nsid w:val="2B592B9C"/>
     <w:multiLevelType w:val="hybridMultilevel"/>
     <w:tmpl w:val="99D4C34E"/>
@@ -22202,7 +23445,7 @@
       </w:rPr>
     </w:lvl>
   </w:abstractNum>
-  <w:abstractNum w:abstractNumId="52" w15:restartNumberingAfterBreak="0">
+  <w:abstractNum w:abstractNumId="53" w15:restartNumberingAfterBreak="0">
     <w:nsid w:val="2B9413C9"/>
     <w:multiLevelType w:val="hybridMultilevel"/>
     <w:tmpl w:val="4F7A7546"/>
@@ -22314,7 +23557,7 @@
       </w:rPr>
     </w:lvl>
   </w:abstractNum>
-  <w:abstractNum w:abstractNumId="53" w15:restartNumberingAfterBreak="0">
+  <w:abstractNum w:abstractNumId="54" w15:restartNumberingAfterBreak="0">
     <w:nsid w:val="2B9539E3"/>
     <w:multiLevelType w:val="hybridMultilevel"/>
     <w:tmpl w:val="E6B8BBB6"/>
@@ -22426,7 +23669,7 @@
       </w:rPr>
     </w:lvl>
   </w:abstractNum>
-  <w:abstractNum w:abstractNumId="54" w15:restartNumberingAfterBreak="0">
+  <w:abstractNum w:abstractNumId="55" w15:restartNumberingAfterBreak="0">
     <w:nsid w:val="2D4B6488"/>
     <w:multiLevelType w:val="hybridMultilevel"/>
     <w:tmpl w:val="F82EB8B0"/>
@@ -22539,7 +23782,7 @@
       </w:rPr>
     </w:lvl>
   </w:abstractNum>
-  <w:abstractNum w:abstractNumId="55" w15:restartNumberingAfterBreak="0">
+  <w:abstractNum w:abstractNumId="56" w15:restartNumberingAfterBreak="0">
     <w:nsid w:val="2E164C9A"/>
     <w:multiLevelType w:val="hybridMultilevel"/>
     <w:tmpl w:val="C6BA489A"/>
@@ -22652,7 +23895,7 @@
       </w:rPr>
     </w:lvl>
   </w:abstractNum>
-  <w:abstractNum w:abstractNumId="56" w15:restartNumberingAfterBreak="0">
+  <w:abstractNum w:abstractNumId="57" w15:restartNumberingAfterBreak="0">
     <w:nsid w:val="2E34438D"/>
     <w:multiLevelType w:val="multilevel"/>
     <w:tmpl w:val="63F4E6F0"/>
@@ -22801,7 +24044,7 @@
       </w:rPr>
     </w:lvl>
   </w:abstractNum>
-  <w:abstractNum w:abstractNumId="57" w15:restartNumberingAfterBreak="0">
+  <w:abstractNum w:abstractNumId="58" w15:restartNumberingAfterBreak="0">
     <w:nsid w:val="2E5D6D2A"/>
     <w:multiLevelType w:val="hybridMultilevel"/>
     <w:tmpl w:val="5D5ADC98"/>
@@ -22914,7 +24157,7 @@
       </w:rPr>
     </w:lvl>
   </w:abstractNum>
-  <w:abstractNum w:abstractNumId="58" w15:restartNumberingAfterBreak="0">
+  <w:abstractNum w:abstractNumId="59" w15:restartNumberingAfterBreak="0">
     <w:nsid w:val="2E716C12"/>
     <w:multiLevelType w:val="hybridMultilevel"/>
     <w:tmpl w:val="6D90C552"/>
@@ -23027,7 +24270,7 @@
       </w:rPr>
     </w:lvl>
   </w:abstractNum>
-  <w:abstractNum w:abstractNumId="59" w15:restartNumberingAfterBreak="0">
+  <w:abstractNum w:abstractNumId="60" w15:restartNumberingAfterBreak="0">
     <w:nsid w:val="2F162517"/>
     <w:multiLevelType w:val="hybridMultilevel"/>
     <w:tmpl w:val="4E3CAB7C"/>
@@ -23139,7 +24382,7 @@
       </w:rPr>
     </w:lvl>
   </w:abstractNum>
-  <w:abstractNum w:abstractNumId="60" w15:restartNumberingAfterBreak="0">
+  <w:abstractNum w:abstractNumId="61" w15:restartNumberingAfterBreak="0">
     <w:nsid w:val="2F1F6483"/>
     <w:multiLevelType w:val="multilevel"/>
     <w:tmpl w:val="993E874E"/>
@@ -23288,7 +24531,7 @@
       </w:rPr>
     </w:lvl>
   </w:abstractNum>
-  <w:abstractNum w:abstractNumId="61" w15:restartNumberingAfterBreak="0">
+  <w:abstractNum w:abstractNumId="62" w15:restartNumberingAfterBreak="0">
     <w:nsid w:val="2F2B2F8E"/>
     <w:multiLevelType w:val="multilevel"/>
     <w:tmpl w:val="547EDCFE"/>
@@ -23437,7 +24680,7 @@
       </w:rPr>
     </w:lvl>
   </w:abstractNum>
-  <w:abstractNum w:abstractNumId="62" w15:restartNumberingAfterBreak="0">
+  <w:abstractNum w:abstractNumId="63" w15:restartNumberingAfterBreak="0">
     <w:nsid w:val="2FF161E6"/>
     <w:multiLevelType w:val="hybridMultilevel"/>
     <w:tmpl w:val="ED6AA478"/>
@@ -23549,7 +24792,7 @@
       </w:rPr>
     </w:lvl>
   </w:abstractNum>
-  <w:abstractNum w:abstractNumId="63" w15:restartNumberingAfterBreak="0">
+  <w:abstractNum w:abstractNumId="64" w15:restartNumberingAfterBreak="0">
     <w:nsid w:val="30CD5DF3"/>
     <w:multiLevelType w:val="hybridMultilevel"/>
     <w:tmpl w:val="127EBD02"/>
@@ -23661,7 +24904,7 @@
       </w:rPr>
     </w:lvl>
   </w:abstractNum>
-  <w:abstractNum w:abstractNumId="64" w15:restartNumberingAfterBreak="0">
+  <w:abstractNum w:abstractNumId="65" w15:restartNumberingAfterBreak="0">
     <w:nsid w:val="31A24DDF"/>
     <w:multiLevelType w:val="multilevel"/>
     <w:tmpl w:val="63F4E6F0"/>
@@ -23810,7 +25053,7 @@
       </w:rPr>
     </w:lvl>
   </w:abstractNum>
-  <w:abstractNum w:abstractNumId="65" w15:restartNumberingAfterBreak="0">
+  <w:abstractNum w:abstractNumId="66" w15:restartNumberingAfterBreak="0">
     <w:nsid w:val="321E65E6"/>
     <w:multiLevelType w:val="multilevel"/>
     <w:tmpl w:val="63F4E6F0"/>
@@ -23959,7 +25202,7 @@
       </w:rPr>
     </w:lvl>
   </w:abstractNum>
-  <w:abstractNum w:abstractNumId="66" w15:restartNumberingAfterBreak="0">
+  <w:abstractNum w:abstractNumId="67" w15:restartNumberingAfterBreak="0">
     <w:nsid w:val="32BD3E3A"/>
     <w:multiLevelType w:val="hybridMultilevel"/>
     <w:tmpl w:val="15A01DD2"/>
@@ -24072,7 +25315,7 @@
       </w:rPr>
     </w:lvl>
   </w:abstractNum>
-  <w:abstractNum w:abstractNumId="67" w15:restartNumberingAfterBreak="0">
+  <w:abstractNum w:abstractNumId="68" w15:restartNumberingAfterBreak="0">
     <w:nsid w:val="32BF1228"/>
     <w:multiLevelType w:val="hybridMultilevel"/>
     <w:tmpl w:val="EECA44F0"/>
@@ -24161,7 +25404,7 @@
       </w:pPr>
     </w:lvl>
   </w:abstractNum>
-  <w:abstractNum w:abstractNumId="68" w15:restartNumberingAfterBreak="0">
+  <w:abstractNum w:abstractNumId="69" w15:restartNumberingAfterBreak="0">
     <w:nsid w:val="32E40C4F"/>
     <w:multiLevelType w:val="hybridMultilevel"/>
     <w:tmpl w:val="EA4C1256"/>
@@ -24274,7 +25517,120 @@
       </w:rPr>
     </w:lvl>
   </w:abstractNum>
-  <w:abstractNum w:abstractNumId="69" w15:restartNumberingAfterBreak="0">
+  <w:abstractNum w:abstractNumId="70" w15:restartNumberingAfterBreak="0">
+    <w:nsid w:val="32EA781B"/>
+    <w:multiLevelType w:val="hybridMultilevel"/>
+    <w:tmpl w:val="0AD02CFE"/>
+    <w:lvl w:ilvl="0" w:tplc="04090005">
+      <w:start w:val="1"/>
+      <w:numFmt w:val="bullet"/>
+      <w:lvlText w:val=""/>
+      <w:lvlJc w:val="left"/>
+      <w:pPr>
+        <w:ind w:left="720" w:hanging="360"/>
+      </w:pPr>
+      <w:rPr>
+        <w:rFonts w:ascii="Wingdings" w:hAnsi="Wingdings" w:hint="default"/>
+      </w:rPr>
+    </w:lvl>
+    <w:lvl w:ilvl="1" w:tplc="04090003" w:tentative="1">
+      <w:start w:val="1"/>
+      <w:numFmt w:val="bullet"/>
+      <w:lvlText w:val="o"/>
+      <w:lvlJc w:val="left"/>
+      <w:pPr>
+        <w:ind w:left="1440" w:hanging="360"/>
+      </w:pPr>
+      <w:rPr>
+        <w:rFonts w:ascii="Courier New" w:hAnsi="Courier New" w:cs="Courier New" w:hint="default"/>
+      </w:rPr>
+    </w:lvl>
+    <w:lvl w:ilvl="2" w:tplc="04090005" w:tentative="1">
+      <w:start w:val="1"/>
+      <w:numFmt w:val="bullet"/>
+      <w:lvlText w:val=""/>
+      <w:lvlJc w:val="left"/>
+      <w:pPr>
+        <w:ind w:left="2160" w:hanging="360"/>
+      </w:pPr>
+      <w:rPr>
+        <w:rFonts w:ascii="Wingdings" w:hAnsi="Wingdings" w:hint="default"/>
+      </w:rPr>
+    </w:lvl>
+    <w:lvl w:ilvl="3" w:tplc="04090001" w:tentative="1">
+      <w:start w:val="1"/>
+      <w:numFmt w:val="bullet"/>
+      <w:lvlText w:val=""/>
+      <w:lvlJc w:val="left"/>
+      <w:pPr>
+        <w:ind w:left="2880" w:hanging="360"/>
+      </w:pPr>
+      <w:rPr>
+        <w:rFonts w:ascii="Symbol" w:hAnsi="Symbol" w:hint="default"/>
+      </w:rPr>
+    </w:lvl>
+    <w:lvl w:ilvl="4" w:tplc="04090003" w:tentative="1">
+      <w:start w:val="1"/>
+      <w:numFmt w:val="bullet"/>
+      <w:lvlText w:val="o"/>
+      <w:lvlJc w:val="left"/>
+      <w:pPr>
+        <w:ind w:left="3600" w:hanging="360"/>
+      </w:pPr>
+      <w:rPr>
+        <w:rFonts w:ascii="Courier New" w:hAnsi="Courier New" w:cs="Courier New" w:hint="default"/>
+      </w:rPr>
+    </w:lvl>
+    <w:lvl w:ilvl="5" w:tplc="04090005" w:tentative="1">
+      <w:start w:val="1"/>
+      <w:numFmt w:val="bullet"/>
+      <w:lvlText w:val=""/>
+      <w:lvlJc w:val="left"/>
+      <w:pPr>
+        <w:ind w:left="4320" w:hanging="360"/>
+      </w:pPr>
+      <w:rPr>
+        <w:rFonts w:ascii="Wingdings" w:hAnsi="Wingdings" w:hint="default"/>
+      </w:rPr>
+    </w:lvl>
+    <w:lvl w:ilvl="6" w:tplc="04090001" w:tentative="1">
+      <w:start w:val="1"/>
+      <w:numFmt w:val="bullet"/>
+      <w:lvlText w:val=""/>
+      <w:lvlJc w:val="left"/>
+      <w:pPr>
+        <w:ind w:left="5040" w:hanging="360"/>
+      </w:pPr>
+      <w:rPr>
+        <w:rFonts w:ascii="Symbol" w:hAnsi="Symbol" w:hint="default"/>
+      </w:rPr>
+    </w:lvl>
+    <w:lvl w:ilvl="7" w:tplc="04090003" w:tentative="1">
+      <w:start w:val="1"/>
+      <w:numFmt w:val="bullet"/>
+      <w:lvlText w:val="o"/>
+      <w:lvlJc w:val="left"/>
+      <w:pPr>
+        <w:ind w:left="5760" w:hanging="360"/>
+      </w:pPr>
+      <w:rPr>
+        <w:rFonts w:ascii="Courier New" w:hAnsi="Courier New" w:cs="Courier New" w:hint="default"/>
+      </w:rPr>
+    </w:lvl>
+    <w:lvl w:ilvl="8" w:tplc="04090005" w:tentative="1">
+      <w:start w:val="1"/>
+      <w:numFmt w:val="bullet"/>
+      <w:lvlText w:val=""/>
+      <w:lvlJc w:val="left"/>
+      <w:pPr>
+        <w:ind w:left="6480" w:hanging="360"/>
+      </w:pPr>
+      <w:rPr>
+        <w:rFonts w:ascii="Wingdings" w:hAnsi="Wingdings" w:hint="default"/>
+      </w:rPr>
+    </w:lvl>
+  </w:abstractNum>
+  <w:abstractNum w:abstractNumId="71" w15:restartNumberingAfterBreak="0">
     <w:nsid w:val="332E29E8"/>
     <w:multiLevelType w:val="multilevel"/>
     <w:tmpl w:val="BF082128"/>
@@ -24423,7 +25779,7 @@
       </w:rPr>
     </w:lvl>
   </w:abstractNum>
-  <w:abstractNum w:abstractNumId="70" w15:restartNumberingAfterBreak="0">
+  <w:abstractNum w:abstractNumId="72" w15:restartNumberingAfterBreak="0">
     <w:nsid w:val="34251C5D"/>
     <w:multiLevelType w:val="multilevel"/>
     <w:tmpl w:val="C31CBCE0"/>
@@ -24572,7 +25928,7 @@
       </w:rPr>
     </w:lvl>
   </w:abstractNum>
-  <w:abstractNum w:abstractNumId="71" w15:restartNumberingAfterBreak="0">
+  <w:abstractNum w:abstractNumId="73" w15:restartNumberingAfterBreak="0">
     <w:nsid w:val="342A6150"/>
     <w:multiLevelType w:val="multilevel"/>
     <w:tmpl w:val="29E0BE1C"/>
@@ -24721,7 +26077,7 @@
       </w:rPr>
     </w:lvl>
   </w:abstractNum>
-  <w:abstractNum w:abstractNumId="72" w15:restartNumberingAfterBreak="0">
+  <w:abstractNum w:abstractNumId="74" w15:restartNumberingAfterBreak="0">
     <w:nsid w:val="343166B0"/>
     <w:multiLevelType w:val="hybridMultilevel"/>
     <w:tmpl w:val="91B8ED2A"/>
@@ -24834,7 +26190,7 @@
       </w:rPr>
     </w:lvl>
   </w:abstractNum>
-  <w:abstractNum w:abstractNumId="73" w15:restartNumberingAfterBreak="0">
+  <w:abstractNum w:abstractNumId="75" w15:restartNumberingAfterBreak="0">
     <w:nsid w:val="356F220A"/>
     <w:multiLevelType w:val="multilevel"/>
     <w:tmpl w:val="0FFA5254"/>
@@ -24983,7 +26339,7 @@
       </w:rPr>
     </w:lvl>
   </w:abstractNum>
-  <w:abstractNum w:abstractNumId="74" w15:restartNumberingAfterBreak="0">
+  <w:abstractNum w:abstractNumId="76" w15:restartNumberingAfterBreak="0">
     <w:nsid w:val="357B7363"/>
     <w:multiLevelType w:val="hybridMultilevel"/>
     <w:tmpl w:val="00D411EC"/>
@@ -25095,7 +26451,7 @@
       </w:rPr>
     </w:lvl>
   </w:abstractNum>
-  <w:abstractNum w:abstractNumId="75" w15:restartNumberingAfterBreak="0">
+  <w:abstractNum w:abstractNumId="77" w15:restartNumberingAfterBreak="0">
     <w:nsid w:val="3583100F"/>
     <w:multiLevelType w:val="hybridMultilevel"/>
     <w:tmpl w:val="848ECFAA"/>
@@ -25208,7 +26564,7 @@
       </w:rPr>
     </w:lvl>
   </w:abstractNum>
-  <w:abstractNum w:abstractNumId="76" w15:restartNumberingAfterBreak="0">
+  <w:abstractNum w:abstractNumId="78" w15:restartNumberingAfterBreak="0">
     <w:nsid w:val="3623194A"/>
     <w:multiLevelType w:val="multilevel"/>
     <w:tmpl w:val="63F4E6F0"/>
@@ -25357,7 +26713,7 @@
       </w:rPr>
     </w:lvl>
   </w:abstractNum>
-  <w:abstractNum w:abstractNumId="77" w15:restartNumberingAfterBreak="0">
+  <w:abstractNum w:abstractNumId="79" w15:restartNumberingAfterBreak="0">
     <w:nsid w:val="36371597"/>
     <w:multiLevelType w:val="hybridMultilevel"/>
     <w:tmpl w:val="D4FA2718"/>
@@ -25470,7 +26826,7 @@
       </w:rPr>
     </w:lvl>
   </w:abstractNum>
-  <w:abstractNum w:abstractNumId="78" w15:restartNumberingAfterBreak="0">
+  <w:abstractNum w:abstractNumId="80" w15:restartNumberingAfterBreak="0">
     <w:nsid w:val="36AD3FB0"/>
     <w:multiLevelType w:val="multilevel"/>
     <w:tmpl w:val="0644AEEA"/>
@@ -25619,7 +26975,7 @@
       </w:rPr>
     </w:lvl>
   </w:abstractNum>
-  <w:abstractNum w:abstractNumId="79" w15:restartNumberingAfterBreak="0">
+  <w:abstractNum w:abstractNumId="81" w15:restartNumberingAfterBreak="0">
     <w:nsid w:val="371A2CDE"/>
     <w:multiLevelType w:val="hybridMultilevel"/>
     <w:tmpl w:val="EA9C00CC"/>
@@ -25731,7 +27087,7 @@
       </w:rPr>
     </w:lvl>
   </w:abstractNum>
-  <w:abstractNum w:abstractNumId="80" w15:restartNumberingAfterBreak="0">
+  <w:abstractNum w:abstractNumId="82" w15:restartNumberingAfterBreak="0">
     <w:nsid w:val="373D5E48"/>
     <w:multiLevelType w:val="hybridMultilevel"/>
     <w:tmpl w:val="8A6E38C0"/>
@@ -25844,7 +27200,7 @@
       </w:rPr>
     </w:lvl>
   </w:abstractNum>
-  <w:abstractNum w:abstractNumId="81" w15:restartNumberingAfterBreak="0">
+  <w:abstractNum w:abstractNumId="83" w15:restartNumberingAfterBreak="0">
     <w:nsid w:val="382065B9"/>
     <w:multiLevelType w:val="hybridMultilevel"/>
     <w:tmpl w:val="71C28E6E"/>
@@ -25957,7 +27313,7 @@
       </w:rPr>
     </w:lvl>
   </w:abstractNum>
-  <w:abstractNum w:abstractNumId="82" w15:restartNumberingAfterBreak="0">
+  <w:abstractNum w:abstractNumId="84" w15:restartNumberingAfterBreak="0">
     <w:nsid w:val="3B446B2D"/>
     <w:multiLevelType w:val="hybridMultilevel"/>
     <w:tmpl w:val="B638176E"/>
@@ -26069,7 +27425,7 @@
       </w:rPr>
     </w:lvl>
   </w:abstractNum>
-  <w:abstractNum w:abstractNumId="83" w15:restartNumberingAfterBreak="0">
+  <w:abstractNum w:abstractNumId="85" w15:restartNumberingAfterBreak="0">
     <w:nsid w:val="3B6B41F5"/>
     <w:multiLevelType w:val="hybridMultilevel"/>
     <w:tmpl w:val="10A26168"/>
@@ -26181,7 +27537,7 @@
       </w:rPr>
     </w:lvl>
   </w:abstractNum>
-  <w:abstractNum w:abstractNumId="84" w15:restartNumberingAfterBreak="0">
+  <w:abstractNum w:abstractNumId="86" w15:restartNumberingAfterBreak="0">
     <w:nsid w:val="3BCD79E4"/>
     <w:multiLevelType w:val="hybridMultilevel"/>
     <w:tmpl w:val="FFFAC2AC"/>
@@ -26294,7 +27650,7 @@
       </w:rPr>
     </w:lvl>
   </w:abstractNum>
-  <w:abstractNum w:abstractNumId="85" w15:restartNumberingAfterBreak="0">
+  <w:abstractNum w:abstractNumId="87" w15:restartNumberingAfterBreak="0">
     <w:nsid w:val="3C5546BA"/>
     <w:multiLevelType w:val="hybridMultilevel"/>
     <w:tmpl w:val="3434F5E4"/>
@@ -26406,7 +27762,7 @@
       </w:rPr>
     </w:lvl>
   </w:abstractNum>
-  <w:abstractNum w:abstractNumId="86" w15:restartNumberingAfterBreak="0">
+  <w:abstractNum w:abstractNumId="88" w15:restartNumberingAfterBreak="0">
     <w:nsid w:val="3C623C55"/>
     <w:multiLevelType w:val="multilevel"/>
     <w:tmpl w:val="A0B0E8F4"/>
@@ -26555,7 +27911,7 @@
       </w:rPr>
     </w:lvl>
   </w:abstractNum>
-  <w:abstractNum w:abstractNumId="87" w15:restartNumberingAfterBreak="0">
+  <w:abstractNum w:abstractNumId="89" w15:restartNumberingAfterBreak="0">
     <w:nsid w:val="3CD27F78"/>
     <w:multiLevelType w:val="multilevel"/>
     <w:tmpl w:val="FCDE767A"/>
@@ -26704,7 +28060,7 @@
       </w:rPr>
     </w:lvl>
   </w:abstractNum>
-  <w:abstractNum w:abstractNumId="88" w15:restartNumberingAfterBreak="0">
+  <w:abstractNum w:abstractNumId="90" w15:restartNumberingAfterBreak="0">
     <w:nsid w:val="3CD74B18"/>
     <w:multiLevelType w:val="hybridMultilevel"/>
     <w:tmpl w:val="2FF42220"/>
@@ -26817,7 +28173,7 @@
       </w:rPr>
     </w:lvl>
   </w:abstractNum>
-  <w:abstractNum w:abstractNumId="89" w15:restartNumberingAfterBreak="0">
+  <w:abstractNum w:abstractNumId="91" w15:restartNumberingAfterBreak="0">
     <w:nsid w:val="3D2F7E79"/>
     <w:multiLevelType w:val="hybridMultilevel"/>
     <w:tmpl w:val="6ED674BE"/>
@@ -26929,7 +28285,7 @@
       </w:rPr>
     </w:lvl>
   </w:abstractNum>
-  <w:abstractNum w:abstractNumId="90" w15:restartNumberingAfterBreak="0">
+  <w:abstractNum w:abstractNumId="92" w15:restartNumberingAfterBreak="0">
     <w:nsid w:val="3D397287"/>
     <w:multiLevelType w:val="hybridMultilevel"/>
     <w:tmpl w:val="F4503122"/>
@@ -27041,7 +28397,7 @@
       </w:rPr>
     </w:lvl>
   </w:abstractNum>
-  <w:abstractNum w:abstractNumId="91" w15:restartNumberingAfterBreak="0">
+  <w:abstractNum w:abstractNumId="93" w15:restartNumberingAfterBreak="0">
     <w:nsid w:val="3DC14EA1"/>
     <w:multiLevelType w:val="hybridMultilevel"/>
     <w:tmpl w:val="DCAE9528"/>
@@ -27154,7 +28510,7 @@
       </w:rPr>
     </w:lvl>
   </w:abstractNum>
-  <w:abstractNum w:abstractNumId="92" w15:restartNumberingAfterBreak="0">
+  <w:abstractNum w:abstractNumId="94" w15:restartNumberingAfterBreak="0">
     <w:nsid w:val="3E685FF3"/>
     <w:multiLevelType w:val="multilevel"/>
     <w:tmpl w:val="7D20B538"/>
@@ -27303,7 +28659,7 @@
       </w:rPr>
     </w:lvl>
   </w:abstractNum>
-  <w:abstractNum w:abstractNumId="93" w15:restartNumberingAfterBreak="0">
+  <w:abstractNum w:abstractNumId="95" w15:restartNumberingAfterBreak="0">
     <w:nsid w:val="3F20785F"/>
     <w:multiLevelType w:val="hybridMultilevel"/>
     <w:tmpl w:val="49D612FC"/>
@@ -27416,7 +28772,7 @@
       </w:rPr>
     </w:lvl>
   </w:abstractNum>
-  <w:abstractNum w:abstractNumId="94" w15:restartNumberingAfterBreak="0">
+  <w:abstractNum w:abstractNumId="96" w15:restartNumberingAfterBreak="0">
     <w:nsid w:val="3F346C2C"/>
     <w:multiLevelType w:val="multilevel"/>
     <w:tmpl w:val="63F4E6F0"/>
@@ -27565,7 +28921,7 @@
       </w:rPr>
     </w:lvl>
   </w:abstractNum>
-  <w:abstractNum w:abstractNumId="95" w15:restartNumberingAfterBreak="0">
+  <w:abstractNum w:abstractNumId="97" w15:restartNumberingAfterBreak="0">
     <w:nsid w:val="3FCB1322"/>
     <w:multiLevelType w:val="hybridMultilevel"/>
     <w:tmpl w:val="55C012B2"/>
@@ -27677,7 +29033,7 @@
       </w:rPr>
     </w:lvl>
   </w:abstractNum>
-  <w:abstractNum w:abstractNumId="96" w15:restartNumberingAfterBreak="0">
+  <w:abstractNum w:abstractNumId="98" w15:restartNumberingAfterBreak="0">
     <w:nsid w:val="403501BA"/>
     <w:multiLevelType w:val="hybridMultilevel"/>
     <w:tmpl w:val="D95E90BC"/>
@@ -27790,7 +29146,7 @@
       </w:rPr>
     </w:lvl>
   </w:abstractNum>
-  <w:abstractNum w:abstractNumId="97" w15:restartNumberingAfterBreak="0">
+  <w:abstractNum w:abstractNumId="99" w15:restartNumberingAfterBreak="0">
     <w:nsid w:val="41A9344F"/>
     <w:multiLevelType w:val="hybridMultilevel"/>
     <w:tmpl w:val="0FB60038"/>
@@ -27903,7 +29259,7 @@
       </w:rPr>
     </w:lvl>
   </w:abstractNum>
-  <w:abstractNum w:abstractNumId="98" w15:restartNumberingAfterBreak="0">
+  <w:abstractNum w:abstractNumId="100" w15:restartNumberingAfterBreak="0">
     <w:nsid w:val="41B44F72"/>
     <w:multiLevelType w:val="hybridMultilevel"/>
     <w:tmpl w:val="1F58F614"/>
@@ -28017,7 +29373,7 @@
       </w:rPr>
     </w:lvl>
   </w:abstractNum>
-  <w:abstractNum w:abstractNumId="99" w15:restartNumberingAfterBreak="0">
+  <w:abstractNum w:abstractNumId="101" w15:restartNumberingAfterBreak="0">
     <w:nsid w:val="42004E1F"/>
     <w:multiLevelType w:val="hybridMultilevel"/>
     <w:tmpl w:val="770C8314"/>
@@ -28129,7 +29485,7 @@
       </w:rPr>
     </w:lvl>
   </w:abstractNum>
-  <w:abstractNum w:abstractNumId="100" w15:restartNumberingAfterBreak="0">
+  <w:abstractNum w:abstractNumId="102" w15:restartNumberingAfterBreak="0">
     <w:nsid w:val="439F7169"/>
     <w:multiLevelType w:val="hybridMultilevel"/>
     <w:tmpl w:val="1884EDCA"/>
@@ -28242,7 +29598,7 @@
       </w:rPr>
     </w:lvl>
   </w:abstractNum>
-  <w:abstractNum w:abstractNumId="101" w15:restartNumberingAfterBreak="0">
+  <w:abstractNum w:abstractNumId="103" w15:restartNumberingAfterBreak="0">
     <w:nsid w:val="43EA1D69"/>
     <w:multiLevelType w:val="multilevel"/>
     <w:tmpl w:val="DFEC23EC"/>
@@ -28391,7 +29747,7 @@
       </w:rPr>
     </w:lvl>
   </w:abstractNum>
-  <w:abstractNum w:abstractNumId="102" w15:restartNumberingAfterBreak="0">
+  <w:abstractNum w:abstractNumId="104" w15:restartNumberingAfterBreak="0">
     <w:nsid w:val="44320084"/>
     <w:multiLevelType w:val="hybridMultilevel"/>
     <w:tmpl w:val="CE5076D4"/>
@@ -28503,7 +29859,7 @@
       </w:rPr>
     </w:lvl>
   </w:abstractNum>
-  <w:abstractNum w:abstractNumId="103" w15:restartNumberingAfterBreak="0">
+  <w:abstractNum w:abstractNumId="105" w15:restartNumberingAfterBreak="0">
     <w:nsid w:val="44554567"/>
     <w:multiLevelType w:val="hybridMultilevel"/>
     <w:tmpl w:val="78748252"/>
@@ -28615,7 +29971,7 @@
       </w:rPr>
     </w:lvl>
   </w:abstractNum>
-  <w:abstractNum w:abstractNumId="104" w15:restartNumberingAfterBreak="0">
+  <w:abstractNum w:abstractNumId="106" w15:restartNumberingAfterBreak="0">
     <w:nsid w:val="49005094"/>
     <w:multiLevelType w:val="hybridMultilevel"/>
     <w:tmpl w:val="14848CBE"/>
@@ -28727,7 +30083,7 @@
       </w:rPr>
     </w:lvl>
   </w:abstractNum>
-  <w:abstractNum w:abstractNumId="105" w15:restartNumberingAfterBreak="0">
+  <w:abstractNum w:abstractNumId="107" w15:restartNumberingAfterBreak="0">
     <w:nsid w:val="49243794"/>
     <w:multiLevelType w:val="multilevel"/>
     <w:tmpl w:val="E7681528"/>
@@ -28876,7 +30232,7 @@
       </w:rPr>
     </w:lvl>
   </w:abstractNum>
-  <w:abstractNum w:abstractNumId="106" w15:restartNumberingAfterBreak="0">
+  <w:abstractNum w:abstractNumId="108" w15:restartNumberingAfterBreak="0">
     <w:nsid w:val="4A880990"/>
     <w:multiLevelType w:val="hybridMultilevel"/>
     <w:tmpl w:val="F17E12C2"/>
@@ -28988,7 +30344,7 @@
       </w:rPr>
     </w:lvl>
   </w:abstractNum>
-  <w:abstractNum w:abstractNumId="107" w15:restartNumberingAfterBreak="0">
+  <w:abstractNum w:abstractNumId="109" w15:restartNumberingAfterBreak="0">
     <w:nsid w:val="4B182B12"/>
     <w:multiLevelType w:val="hybridMultilevel"/>
     <w:tmpl w:val="31C486B4"/>
@@ -29100,7 +30456,7 @@
       </w:rPr>
     </w:lvl>
   </w:abstractNum>
-  <w:abstractNum w:abstractNumId="108" w15:restartNumberingAfterBreak="0">
+  <w:abstractNum w:abstractNumId="110" w15:restartNumberingAfterBreak="0">
     <w:nsid w:val="4B6E6D62"/>
     <w:multiLevelType w:val="hybridMultilevel"/>
     <w:tmpl w:val="54DC0C0C"/>
@@ -29213,7 +30569,7 @@
       </w:rPr>
     </w:lvl>
   </w:abstractNum>
-  <w:abstractNum w:abstractNumId="109" w15:restartNumberingAfterBreak="0">
+  <w:abstractNum w:abstractNumId="111" w15:restartNumberingAfterBreak="0">
     <w:nsid w:val="4BA13766"/>
     <w:multiLevelType w:val="multilevel"/>
     <w:tmpl w:val="63F4E6F0"/>
@@ -29362,7 +30718,7 @@
       </w:rPr>
     </w:lvl>
   </w:abstractNum>
-  <w:abstractNum w:abstractNumId="110" w15:restartNumberingAfterBreak="0">
+  <w:abstractNum w:abstractNumId="112" w15:restartNumberingAfterBreak="0">
     <w:nsid w:val="4D2E1CBE"/>
     <w:multiLevelType w:val="hybridMultilevel"/>
     <w:tmpl w:val="BFD86D7C"/>
@@ -29475,7 +30831,7 @@
       </w:rPr>
     </w:lvl>
   </w:abstractNum>
-  <w:abstractNum w:abstractNumId="111" w15:restartNumberingAfterBreak="0">
+  <w:abstractNum w:abstractNumId="113" w15:restartNumberingAfterBreak="0">
     <w:nsid w:val="4E65371E"/>
     <w:multiLevelType w:val="hybridMultilevel"/>
     <w:tmpl w:val="53EE4538"/>
@@ -29587,7 +30943,7 @@
       </w:rPr>
     </w:lvl>
   </w:abstractNum>
-  <w:abstractNum w:abstractNumId="112" w15:restartNumberingAfterBreak="0">
+  <w:abstractNum w:abstractNumId="114" w15:restartNumberingAfterBreak="0">
     <w:nsid w:val="4E9A3F16"/>
     <w:multiLevelType w:val="multilevel"/>
     <w:tmpl w:val="63F4E6F0"/>
@@ -29736,7 +31092,7 @@
       </w:rPr>
     </w:lvl>
   </w:abstractNum>
-  <w:abstractNum w:abstractNumId="113" w15:restartNumberingAfterBreak="0">
+  <w:abstractNum w:abstractNumId="115" w15:restartNumberingAfterBreak="0">
     <w:nsid w:val="500B790D"/>
     <w:multiLevelType w:val="multilevel"/>
     <w:tmpl w:val="63F4E6F0"/>
@@ -29885,7 +31241,7 @@
       </w:rPr>
     </w:lvl>
   </w:abstractNum>
-  <w:abstractNum w:abstractNumId="114" w15:restartNumberingAfterBreak="0">
+  <w:abstractNum w:abstractNumId="116" w15:restartNumberingAfterBreak="0">
     <w:nsid w:val="5037150E"/>
     <w:multiLevelType w:val="hybridMultilevel"/>
     <w:tmpl w:val="064034F8"/>
@@ -29998,7 +31354,7 @@
       </w:rPr>
     </w:lvl>
   </w:abstractNum>
-  <w:abstractNum w:abstractNumId="115" w15:restartNumberingAfterBreak="0">
+  <w:abstractNum w:abstractNumId="117" w15:restartNumberingAfterBreak="0">
     <w:nsid w:val="50A931C8"/>
     <w:multiLevelType w:val="hybridMultilevel"/>
     <w:tmpl w:val="ED3217DE"/>
@@ -30111,7 +31467,7 @@
       </w:rPr>
     </w:lvl>
   </w:abstractNum>
-  <w:abstractNum w:abstractNumId="116" w15:restartNumberingAfterBreak="0">
+  <w:abstractNum w:abstractNumId="118" w15:restartNumberingAfterBreak="0">
     <w:nsid w:val="51417BE1"/>
     <w:multiLevelType w:val="multilevel"/>
     <w:tmpl w:val="993C0E80"/>
@@ -30260,7 +31616,7 @@
       </w:rPr>
     </w:lvl>
   </w:abstractNum>
-  <w:abstractNum w:abstractNumId="117" w15:restartNumberingAfterBreak="0">
+  <w:abstractNum w:abstractNumId="119" w15:restartNumberingAfterBreak="0">
     <w:nsid w:val="526538B7"/>
     <w:multiLevelType w:val="hybridMultilevel"/>
     <w:tmpl w:val="E6A017F2"/>
@@ -30373,7 +31729,7 @@
       </w:rPr>
     </w:lvl>
   </w:abstractNum>
-  <w:abstractNum w:abstractNumId="118" w15:restartNumberingAfterBreak="0">
+  <w:abstractNum w:abstractNumId="120" w15:restartNumberingAfterBreak="0">
     <w:nsid w:val="537E56D9"/>
     <w:multiLevelType w:val="multilevel"/>
     <w:tmpl w:val="1B6E8B6A"/>
@@ -30522,7 +31878,7 @@
       </w:rPr>
     </w:lvl>
   </w:abstractNum>
-  <w:abstractNum w:abstractNumId="119" w15:restartNumberingAfterBreak="0">
+  <w:abstractNum w:abstractNumId="121" w15:restartNumberingAfterBreak="0">
     <w:nsid w:val="53E6601E"/>
     <w:multiLevelType w:val="hybridMultilevel"/>
     <w:tmpl w:val="66F0666A"/>
@@ -30635,7 +31991,7 @@
       </w:rPr>
     </w:lvl>
   </w:abstractNum>
-  <w:abstractNum w:abstractNumId="120" w15:restartNumberingAfterBreak="0">
+  <w:abstractNum w:abstractNumId="122" w15:restartNumberingAfterBreak="0">
     <w:nsid w:val="551D6F91"/>
     <w:multiLevelType w:val="hybridMultilevel"/>
     <w:tmpl w:val="9522B3C6"/>
@@ -30747,7 +32103,7 @@
       </w:rPr>
     </w:lvl>
   </w:abstractNum>
-  <w:abstractNum w:abstractNumId="121" w15:restartNumberingAfterBreak="0">
+  <w:abstractNum w:abstractNumId="123" w15:restartNumberingAfterBreak="0">
     <w:nsid w:val="5546258F"/>
     <w:multiLevelType w:val="multilevel"/>
     <w:tmpl w:val="0CAA196E"/>
@@ -30896,7 +32252,7 @@
       </w:rPr>
     </w:lvl>
   </w:abstractNum>
-  <w:abstractNum w:abstractNumId="122" w15:restartNumberingAfterBreak="0">
+  <w:abstractNum w:abstractNumId="124" w15:restartNumberingAfterBreak="0">
     <w:nsid w:val="55655B93"/>
     <w:multiLevelType w:val="multilevel"/>
     <w:tmpl w:val="9C88A4A8"/>
@@ -31045,7 +32401,7 @@
       </w:rPr>
     </w:lvl>
   </w:abstractNum>
-  <w:abstractNum w:abstractNumId="123" w15:restartNumberingAfterBreak="0">
+  <w:abstractNum w:abstractNumId="125" w15:restartNumberingAfterBreak="0">
     <w:nsid w:val="562D4F1F"/>
     <w:multiLevelType w:val="hybridMultilevel"/>
     <w:tmpl w:val="1FF8D31C"/>
@@ -31157,7 +32513,7 @@
       </w:rPr>
     </w:lvl>
   </w:abstractNum>
-  <w:abstractNum w:abstractNumId="124" w15:restartNumberingAfterBreak="0">
+  <w:abstractNum w:abstractNumId="126" w15:restartNumberingAfterBreak="0">
     <w:nsid w:val="565A0C8B"/>
     <w:multiLevelType w:val="multilevel"/>
     <w:tmpl w:val="AB24FF2E"/>
@@ -31306,7 +32662,7 @@
       </w:rPr>
     </w:lvl>
   </w:abstractNum>
-  <w:abstractNum w:abstractNumId="125" w15:restartNumberingAfterBreak="0">
+  <w:abstractNum w:abstractNumId="127" w15:restartNumberingAfterBreak="0">
     <w:nsid w:val="566E7C65"/>
     <w:multiLevelType w:val="multilevel"/>
     <w:tmpl w:val="28803B4C"/>
@@ -31455,7 +32811,7 @@
       </w:rPr>
     </w:lvl>
   </w:abstractNum>
-  <w:abstractNum w:abstractNumId="126" w15:restartNumberingAfterBreak="0">
+  <w:abstractNum w:abstractNumId="128" w15:restartNumberingAfterBreak="0">
     <w:nsid w:val="57407594"/>
     <w:multiLevelType w:val="multilevel"/>
     <w:tmpl w:val="E6E2F8AE"/>
@@ -31604,7 +32960,7 @@
       </w:rPr>
     </w:lvl>
   </w:abstractNum>
-  <w:abstractNum w:abstractNumId="127" w15:restartNumberingAfterBreak="0">
+  <w:abstractNum w:abstractNumId="129" w15:restartNumberingAfterBreak="0">
     <w:nsid w:val="5773128C"/>
     <w:multiLevelType w:val="hybridMultilevel"/>
     <w:tmpl w:val="945E5C1E"/>
@@ -31717,7 +33073,7 @@
       </w:rPr>
     </w:lvl>
   </w:abstractNum>
-  <w:abstractNum w:abstractNumId="128" w15:restartNumberingAfterBreak="0">
+  <w:abstractNum w:abstractNumId="130" w15:restartNumberingAfterBreak="0">
     <w:nsid w:val="577F771B"/>
     <w:multiLevelType w:val="hybridMultilevel"/>
     <w:tmpl w:val="0F2C5914"/>
@@ -31829,7 +33185,7 @@
       </w:rPr>
     </w:lvl>
   </w:abstractNum>
-  <w:abstractNum w:abstractNumId="129" w15:restartNumberingAfterBreak="0">
+  <w:abstractNum w:abstractNumId="131" w15:restartNumberingAfterBreak="0">
     <w:nsid w:val="57C43CDD"/>
     <w:multiLevelType w:val="hybridMultilevel"/>
     <w:tmpl w:val="6C94FB5E"/>
@@ -31942,7 +33298,7 @@
       </w:rPr>
     </w:lvl>
   </w:abstractNum>
-  <w:abstractNum w:abstractNumId="130" w15:restartNumberingAfterBreak="0">
+  <w:abstractNum w:abstractNumId="132" w15:restartNumberingAfterBreak="0">
     <w:nsid w:val="58393977"/>
     <w:multiLevelType w:val="hybridMultilevel"/>
     <w:tmpl w:val="985A5484"/>
@@ -32055,7 +33411,7 @@
       </w:rPr>
     </w:lvl>
   </w:abstractNum>
-  <w:abstractNum w:abstractNumId="131" w15:restartNumberingAfterBreak="0">
+  <w:abstractNum w:abstractNumId="133" w15:restartNumberingAfterBreak="0">
     <w:nsid w:val="59AB4A55"/>
     <w:multiLevelType w:val="hybridMultilevel"/>
     <w:tmpl w:val="B6486CD6"/>
@@ -32168,7 +33524,7 @@
       </w:rPr>
     </w:lvl>
   </w:abstractNum>
-  <w:abstractNum w:abstractNumId="132" w15:restartNumberingAfterBreak="0">
+  <w:abstractNum w:abstractNumId="134" w15:restartNumberingAfterBreak="0">
     <w:nsid w:val="59EB4CE4"/>
     <w:multiLevelType w:val="multilevel"/>
     <w:tmpl w:val="63F4E6F0"/>
@@ -32317,7 +33673,7 @@
       </w:rPr>
     </w:lvl>
   </w:abstractNum>
-  <w:abstractNum w:abstractNumId="133" w15:restartNumberingAfterBreak="0">
+  <w:abstractNum w:abstractNumId="135" w15:restartNumberingAfterBreak="0">
     <w:nsid w:val="59EC6D60"/>
     <w:multiLevelType w:val="hybridMultilevel"/>
     <w:tmpl w:val="97E6E6DE"/>
@@ -32430,7 +33786,7 @@
       </w:rPr>
     </w:lvl>
   </w:abstractNum>
-  <w:abstractNum w:abstractNumId="134" w15:restartNumberingAfterBreak="0">
+  <w:abstractNum w:abstractNumId="136" w15:restartNumberingAfterBreak="0">
     <w:nsid w:val="5BD11962"/>
     <w:multiLevelType w:val="hybridMultilevel"/>
     <w:tmpl w:val="89A4B834"/>
@@ -32519,7 +33875,7 @@
       </w:pPr>
     </w:lvl>
   </w:abstractNum>
-  <w:abstractNum w:abstractNumId="135" w15:restartNumberingAfterBreak="0">
+  <w:abstractNum w:abstractNumId="137" w15:restartNumberingAfterBreak="0">
     <w:nsid w:val="5C950DBA"/>
     <w:multiLevelType w:val="hybridMultilevel"/>
     <w:tmpl w:val="7D78F950"/>
@@ -32631,7 +33987,7 @@
       </w:rPr>
     </w:lvl>
   </w:abstractNum>
-  <w:abstractNum w:abstractNumId="136" w15:restartNumberingAfterBreak="0">
+  <w:abstractNum w:abstractNumId="138" w15:restartNumberingAfterBreak="0">
     <w:nsid w:val="5D2A5D3B"/>
     <w:multiLevelType w:val="hybridMultilevel"/>
     <w:tmpl w:val="3AF89EA6"/>
@@ -32722,7 +34078,7 @@
       </w:pPr>
     </w:lvl>
   </w:abstractNum>
-  <w:abstractNum w:abstractNumId="137" w15:restartNumberingAfterBreak="0">
+  <w:abstractNum w:abstractNumId="139" w15:restartNumberingAfterBreak="0">
     <w:nsid w:val="5D9E49FD"/>
     <w:multiLevelType w:val="hybridMultilevel"/>
     <w:tmpl w:val="4EE40BB4"/>
@@ -32834,7 +34190,7 @@
       </w:rPr>
     </w:lvl>
   </w:abstractNum>
-  <w:abstractNum w:abstractNumId="138" w15:restartNumberingAfterBreak="0">
+  <w:abstractNum w:abstractNumId="140" w15:restartNumberingAfterBreak="0">
     <w:nsid w:val="5DB7107D"/>
     <w:multiLevelType w:val="multilevel"/>
     <w:tmpl w:val="6520107A"/>
@@ -32983,7 +34339,7 @@
       </w:rPr>
     </w:lvl>
   </w:abstractNum>
-  <w:abstractNum w:abstractNumId="139" w15:restartNumberingAfterBreak="0">
+  <w:abstractNum w:abstractNumId="141" w15:restartNumberingAfterBreak="0">
     <w:nsid w:val="60421322"/>
     <w:multiLevelType w:val="hybridMultilevel"/>
     <w:tmpl w:val="447CDBDC"/>
@@ -33095,7 +34451,7 @@
       </w:rPr>
     </w:lvl>
   </w:abstractNum>
-  <w:abstractNum w:abstractNumId="140" w15:restartNumberingAfterBreak="0">
+  <w:abstractNum w:abstractNumId="142" w15:restartNumberingAfterBreak="0">
     <w:nsid w:val="60B43772"/>
     <w:multiLevelType w:val="hybridMultilevel"/>
     <w:tmpl w:val="04FC7310"/>
@@ -33209,7 +34565,7 @@
       </w:rPr>
     </w:lvl>
   </w:abstractNum>
-  <w:abstractNum w:abstractNumId="141" w15:restartNumberingAfterBreak="0">
+  <w:abstractNum w:abstractNumId="143" w15:restartNumberingAfterBreak="0">
     <w:nsid w:val="61926C31"/>
     <w:multiLevelType w:val="hybridMultilevel"/>
     <w:tmpl w:val="AFD27E5C"/>
@@ -33322,7 +34678,7 @@
       </w:rPr>
     </w:lvl>
   </w:abstractNum>
-  <w:abstractNum w:abstractNumId="142" w15:restartNumberingAfterBreak="0">
+  <w:abstractNum w:abstractNumId="144" w15:restartNumberingAfterBreak="0">
     <w:nsid w:val="622F5FC7"/>
     <w:multiLevelType w:val="hybridMultilevel"/>
     <w:tmpl w:val="49A6C2A6"/>
@@ -33435,7 +34791,7 @@
       </w:rPr>
     </w:lvl>
   </w:abstractNum>
-  <w:abstractNum w:abstractNumId="143" w15:restartNumberingAfterBreak="0">
+  <w:abstractNum w:abstractNumId="145" w15:restartNumberingAfterBreak="0">
     <w:nsid w:val="623A0E20"/>
     <w:multiLevelType w:val="hybridMultilevel"/>
     <w:tmpl w:val="3E360542"/>
@@ -33548,7 +34904,7 @@
       </w:rPr>
     </w:lvl>
   </w:abstractNum>
-  <w:abstractNum w:abstractNumId="144" w15:restartNumberingAfterBreak="0">
+  <w:abstractNum w:abstractNumId="146" w15:restartNumberingAfterBreak="0">
     <w:nsid w:val="62AC33B4"/>
     <w:multiLevelType w:val="multilevel"/>
     <w:tmpl w:val="A074F3CA"/>
@@ -33697,7 +35053,7 @@
       </w:rPr>
     </w:lvl>
   </w:abstractNum>
-  <w:abstractNum w:abstractNumId="145" w15:restartNumberingAfterBreak="0">
+  <w:abstractNum w:abstractNumId="147" w15:restartNumberingAfterBreak="0">
     <w:nsid w:val="63B44674"/>
     <w:multiLevelType w:val="multilevel"/>
     <w:tmpl w:val="08F4FA9A"/>
@@ -33846,7 +35202,7 @@
       </w:rPr>
     </w:lvl>
   </w:abstractNum>
-  <w:abstractNum w:abstractNumId="146" w15:restartNumberingAfterBreak="0">
+  <w:abstractNum w:abstractNumId="148" w15:restartNumberingAfterBreak="0">
     <w:nsid w:val="63C245D4"/>
     <w:multiLevelType w:val="hybridMultilevel"/>
     <w:tmpl w:val="E1563A56"/>
@@ -33958,7 +35314,7 @@
       </w:rPr>
     </w:lvl>
   </w:abstractNum>
-  <w:abstractNum w:abstractNumId="147" w15:restartNumberingAfterBreak="0">
+  <w:abstractNum w:abstractNumId="149" w15:restartNumberingAfterBreak="0">
     <w:nsid w:val="645F5F11"/>
     <w:multiLevelType w:val="hybridMultilevel"/>
     <w:tmpl w:val="D3423512"/>
@@ -34071,7 +35427,7 @@
       </w:rPr>
     </w:lvl>
   </w:abstractNum>
-  <w:abstractNum w:abstractNumId="148" w15:restartNumberingAfterBreak="0">
+  <w:abstractNum w:abstractNumId="150" w15:restartNumberingAfterBreak="0">
     <w:nsid w:val="64F30198"/>
     <w:multiLevelType w:val="multilevel"/>
     <w:tmpl w:val="63F4E6F0"/>
@@ -34220,7 +35576,7 @@
       </w:rPr>
     </w:lvl>
   </w:abstractNum>
-  <w:abstractNum w:abstractNumId="149" w15:restartNumberingAfterBreak="0">
+  <w:abstractNum w:abstractNumId="151" w15:restartNumberingAfterBreak="0">
     <w:nsid w:val="65AF2502"/>
     <w:multiLevelType w:val="hybridMultilevel"/>
     <w:tmpl w:val="FB2A44D8"/>
@@ -34333,7 +35689,7 @@
       </w:rPr>
     </w:lvl>
   </w:abstractNum>
-  <w:abstractNum w:abstractNumId="150" w15:restartNumberingAfterBreak="0">
+  <w:abstractNum w:abstractNumId="152" w15:restartNumberingAfterBreak="0">
     <w:nsid w:val="65E53C08"/>
     <w:multiLevelType w:val="hybridMultilevel"/>
     <w:tmpl w:val="8A44FBE2"/>
@@ -34446,7 +35802,7 @@
       </w:rPr>
     </w:lvl>
   </w:abstractNum>
-  <w:abstractNum w:abstractNumId="151" w15:restartNumberingAfterBreak="0">
+  <w:abstractNum w:abstractNumId="153" w15:restartNumberingAfterBreak="0">
     <w:nsid w:val="671614F0"/>
     <w:multiLevelType w:val="multilevel"/>
     <w:tmpl w:val="63F4E6F0"/>
@@ -34595,7 +35951,7 @@
       </w:rPr>
     </w:lvl>
   </w:abstractNum>
-  <w:abstractNum w:abstractNumId="152" w15:restartNumberingAfterBreak="0">
+  <w:abstractNum w:abstractNumId="154" w15:restartNumberingAfterBreak="0">
     <w:nsid w:val="6859691D"/>
     <w:multiLevelType w:val="multilevel"/>
     <w:tmpl w:val="826A9D48"/>
@@ -34744,7 +36100,7 @@
       </w:rPr>
     </w:lvl>
   </w:abstractNum>
-  <w:abstractNum w:abstractNumId="153" w15:restartNumberingAfterBreak="0">
+  <w:abstractNum w:abstractNumId="155" w15:restartNumberingAfterBreak="0">
     <w:nsid w:val="68817757"/>
     <w:multiLevelType w:val="multilevel"/>
     <w:tmpl w:val="34EE1968"/>
@@ -34893,7 +36249,7 @@
       </w:rPr>
     </w:lvl>
   </w:abstractNum>
-  <w:abstractNum w:abstractNumId="154" w15:restartNumberingAfterBreak="0">
+  <w:abstractNum w:abstractNumId="156" w15:restartNumberingAfterBreak="0">
     <w:nsid w:val="68BE10E8"/>
     <w:multiLevelType w:val="hybridMultilevel"/>
     <w:tmpl w:val="326CD592"/>
@@ -35006,7 +36362,7 @@
       </w:rPr>
     </w:lvl>
   </w:abstractNum>
-  <w:abstractNum w:abstractNumId="155" w15:restartNumberingAfterBreak="0">
+  <w:abstractNum w:abstractNumId="157" w15:restartNumberingAfterBreak="0">
     <w:nsid w:val="69996D9A"/>
     <w:multiLevelType w:val="multilevel"/>
     <w:tmpl w:val="1780FC38"/>
@@ -35155,7 +36511,7 @@
       </w:rPr>
     </w:lvl>
   </w:abstractNum>
-  <w:abstractNum w:abstractNumId="156" w15:restartNumberingAfterBreak="0">
+  <w:abstractNum w:abstractNumId="158" w15:restartNumberingAfterBreak="0">
     <w:nsid w:val="6B3C30B9"/>
     <w:multiLevelType w:val="hybridMultilevel"/>
     <w:tmpl w:val="C938F8DE"/>
@@ -35267,7 +36623,7 @@
       </w:rPr>
     </w:lvl>
   </w:abstractNum>
-  <w:abstractNum w:abstractNumId="157" w15:restartNumberingAfterBreak="0">
+  <w:abstractNum w:abstractNumId="159" w15:restartNumberingAfterBreak="0">
     <w:nsid w:val="6D1511A0"/>
     <w:multiLevelType w:val="hybridMultilevel"/>
     <w:tmpl w:val="AAD8B9B4"/>
@@ -35379,7 +36735,7 @@
       </w:rPr>
     </w:lvl>
   </w:abstractNum>
-  <w:abstractNum w:abstractNumId="158" w15:restartNumberingAfterBreak="0">
+  <w:abstractNum w:abstractNumId="160" w15:restartNumberingAfterBreak="0">
     <w:nsid w:val="6DD255F1"/>
     <w:multiLevelType w:val="hybridMultilevel"/>
     <w:tmpl w:val="ACBC1404"/>
@@ -35492,7 +36848,7 @@
       </w:rPr>
     </w:lvl>
   </w:abstractNum>
-  <w:abstractNum w:abstractNumId="159" w15:restartNumberingAfterBreak="0">
+  <w:abstractNum w:abstractNumId="161" w15:restartNumberingAfterBreak="0">
     <w:nsid w:val="6DDB4404"/>
     <w:multiLevelType w:val="hybridMultilevel"/>
     <w:tmpl w:val="06428E32"/>
@@ -35605,7 +36961,7 @@
       </w:rPr>
     </w:lvl>
   </w:abstractNum>
-  <w:abstractNum w:abstractNumId="160" w15:restartNumberingAfterBreak="0">
+  <w:abstractNum w:abstractNumId="162" w15:restartNumberingAfterBreak="0">
     <w:nsid w:val="6EE2159D"/>
     <w:multiLevelType w:val="hybridMultilevel"/>
     <w:tmpl w:val="36C69320"/>
@@ -35718,7 +37074,7 @@
       </w:rPr>
     </w:lvl>
   </w:abstractNum>
-  <w:abstractNum w:abstractNumId="161" w15:restartNumberingAfterBreak="0">
+  <w:abstractNum w:abstractNumId="163" w15:restartNumberingAfterBreak="0">
     <w:nsid w:val="6F014B3B"/>
     <w:multiLevelType w:val="hybridMultilevel"/>
     <w:tmpl w:val="C89A39BE"/>
@@ -35830,7 +37186,7 @@
       </w:rPr>
     </w:lvl>
   </w:abstractNum>
-  <w:abstractNum w:abstractNumId="162" w15:restartNumberingAfterBreak="0">
+  <w:abstractNum w:abstractNumId="164" w15:restartNumberingAfterBreak="0">
     <w:nsid w:val="6F171273"/>
     <w:multiLevelType w:val="multilevel"/>
     <w:tmpl w:val="0240C564"/>
@@ -35979,7 +37335,7 @@
       </w:rPr>
     </w:lvl>
   </w:abstractNum>
-  <w:abstractNum w:abstractNumId="163" w15:restartNumberingAfterBreak="0">
+  <w:abstractNum w:abstractNumId="165" w15:restartNumberingAfterBreak="0">
     <w:nsid w:val="6FB82AAA"/>
     <w:multiLevelType w:val="multilevel"/>
     <w:tmpl w:val="FC46C7C0"/>
@@ -36128,7 +37484,7 @@
       </w:rPr>
     </w:lvl>
   </w:abstractNum>
-  <w:abstractNum w:abstractNumId="164" w15:restartNumberingAfterBreak="0">
+  <w:abstractNum w:abstractNumId="166" w15:restartNumberingAfterBreak="0">
     <w:nsid w:val="6FD46DCF"/>
     <w:multiLevelType w:val="hybridMultilevel"/>
     <w:tmpl w:val="EF5E6EC6"/>
@@ -36241,7 +37597,7 @@
       </w:rPr>
     </w:lvl>
   </w:abstractNum>
-  <w:abstractNum w:abstractNumId="165" w15:restartNumberingAfterBreak="0">
+  <w:abstractNum w:abstractNumId="167" w15:restartNumberingAfterBreak="0">
     <w:nsid w:val="70484E38"/>
     <w:multiLevelType w:val="multilevel"/>
     <w:tmpl w:val="22B26DD2"/>
@@ -36390,7 +37746,7 @@
       </w:rPr>
     </w:lvl>
   </w:abstractNum>
-  <w:abstractNum w:abstractNumId="166" w15:restartNumberingAfterBreak="0">
+  <w:abstractNum w:abstractNumId="168" w15:restartNumberingAfterBreak="0">
     <w:nsid w:val="70CB723E"/>
     <w:multiLevelType w:val="multilevel"/>
     <w:tmpl w:val="63F4E6F0"/>
@@ -36539,7 +37895,7 @@
       </w:rPr>
     </w:lvl>
   </w:abstractNum>
-  <w:abstractNum w:abstractNumId="167" w15:restartNumberingAfterBreak="0">
+  <w:abstractNum w:abstractNumId="169" w15:restartNumberingAfterBreak="0">
     <w:nsid w:val="71C028F7"/>
     <w:multiLevelType w:val="hybridMultilevel"/>
     <w:tmpl w:val="85104F0A"/>
@@ -36652,7 +38008,7 @@
       </w:rPr>
     </w:lvl>
   </w:abstractNum>
-  <w:abstractNum w:abstractNumId="168" w15:restartNumberingAfterBreak="0">
+  <w:abstractNum w:abstractNumId="170" w15:restartNumberingAfterBreak="0">
     <w:nsid w:val="71DB3F58"/>
     <w:multiLevelType w:val="multilevel"/>
     <w:tmpl w:val="63F4E6F0"/>
@@ -36801,7 +38157,7 @@
       </w:rPr>
     </w:lvl>
   </w:abstractNum>
-  <w:abstractNum w:abstractNumId="169" w15:restartNumberingAfterBreak="0">
+  <w:abstractNum w:abstractNumId="171" w15:restartNumberingAfterBreak="0">
     <w:nsid w:val="720D204A"/>
     <w:multiLevelType w:val="hybridMultilevel"/>
     <w:tmpl w:val="70D646D0"/>
@@ -36915,7 +38271,7 @@
       </w:rPr>
     </w:lvl>
   </w:abstractNum>
-  <w:abstractNum w:abstractNumId="170" w15:restartNumberingAfterBreak="0">
+  <w:abstractNum w:abstractNumId="172" w15:restartNumberingAfterBreak="0">
     <w:nsid w:val="72F31FF2"/>
     <w:multiLevelType w:val="hybridMultilevel"/>
     <w:tmpl w:val="5C2693A0"/>
@@ -37027,7 +38383,7 @@
       </w:rPr>
     </w:lvl>
   </w:abstractNum>
-  <w:abstractNum w:abstractNumId="171" w15:restartNumberingAfterBreak="0">
+  <w:abstractNum w:abstractNumId="173" w15:restartNumberingAfterBreak="0">
     <w:nsid w:val="73B82579"/>
     <w:multiLevelType w:val="hybridMultilevel"/>
     <w:tmpl w:val="B8E8229C"/>
@@ -37140,7 +38496,7 @@
       </w:rPr>
     </w:lvl>
   </w:abstractNum>
-  <w:abstractNum w:abstractNumId="172" w15:restartNumberingAfterBreak="0">
+  <w:abstractNum w:abstractNumId="174" w15:restartNumberingAfterBreak="0">
     <w:nsid w:val="74522E8F"/>
     <w:multiLevelType w:val="hybridMultilevel"/>
     <w:tmpl w:val="9B1C2096"/>
@@ -37253,7 +38609,7 @@
       </w:rPr>
     </w:lvl>
   </w:abstractNum>
-  <w:abstractNum w:abstractNumId="173" w15:restartNumberingAfterBreak="0">
+  <w:abstractNum w:abstractNumId="175" w15:restartNumberingAfterBreak="0">
     <w:nsid w:val="75B45140"/>
     <w:multiLevelType w:val="hybridMultilevel"/>
     <w:tmpl w:val="93F8F3C4"/>
@@ -37366,7 +38722,7 @@
       </w:rPr>
     </w:lvl>
   </w:abstractNum>
-  <w:abstractNum w:abstractNumId="174" w15:restartNumberingAfterBreak="0">
+  <w:abstractNum w:abstractNumId="176" w15:restartNumberingAfterBreak="0">
     <w:nsid w:val="76F60FFE"/>
     <w:multiLevelType w:val="multilevel"/>
     <w:tmpl w:val="63F4E6F0"/>
@@ -37515,7 +38871,7 @@
       </w:rPr>
     </w:lvl>
   </w:abstractNum>
-  <w:abstractNum w:abstractNumId="175" w15:restartNumberingAfterBreak="0">
+  <w:abstractNum w:abstractNumId="177" w15:restartNumberingAfterBreak="0">
     <w:nsid w:val="7742006E"/>
     <w:multiLevelType w:val="hybridMultilevel"/>
     <w:tmpl w:val="322ADDB6"/>
@@ -37628,7 +38984,7 @@
       </w:rPr>
     </w:lvl>
   </w:abstractNum>
-  <w:abstractNum w:abstractNumId="176" w15:restartNumberingAfterBreak="0">
+  <w:abstractNum w:abstractNumId="178" w15:restartNumberingAfterBreak="0">
     <w:nsid w:val="77572323"/>
     <w:multiLevelType w:val="multilevel"/>
     <w:tmpl w:val="63F4E6F0"/>
@@ -37777,7 +39133,7 @@
       </w:rPr>
     </w:lvl>
   </w:abstractNum>
-  <w:abstractNum w:abstractNumId="177" w15:restartNumberingAfterBreak="0">
+  <w:abstractNum w:abstractNumId="179" w15:restartNumberingAfterBreak="0">
     <w:nsid w:val="77B8201F"/>
     <w:multiLevelType w:val="hybridMultilevel"/>
     <w:tmpl w:val="D7160708"/>
@@ -37889,7 +39245,7 @@
       </w:rPr>
     </w:lvl>
   </w:abstractNum>
-  <w:abstractNum w:abstractNumId="178" w15:restartNumberingAfterBreak="0">
+  <w:abstractNum w:abstractNumId="180" w15:restartNumberingAfterBreak="0">
     <w:nsid w:val="79796FF9"/>
     <w:multiLevelType w:val="hybridMultilevel"/>
     <w:tmpl w:val="CFA8EF82"/>
@@ -38001,7 +39357,7 @@
       </w:rPr>
     </w:lvl>
   </w:abstractNum>
-  <w:abstractNum w:abstractNumId="179" w15:restartNumberingAfterBreak="0">
+  <w:abstractNum w:abstractNumId="181" w15:restartNumberingAfterBreak="0">
     <w:nsid w:val="79910410"/>
     <w:multiLevelType w:val="hybridMultilevel"/>
     <w:tmpl w:val="FC923542"/>
@@ -38113,7 +39469,7 @@
       </w:rPr>
     </w:lvl>
   </w:abstractNum>
-  <w:abstractNum w:abstractNumId="180" w15:restartNumberingAfterBreak="0">
+  <w:abstractNum w:abstractNumId="182" w15:restartNumberingAfterBreak="0">
     <w:nsid w:val="7AD51679"/>
     <w:multiLevelType w:val="hybridMultilevel"/>
     <w:tmpl w:val="C13E19C2"/>
@@ -38226,7 +39582,7 @@
       </w:rPr>
     </w:lvl>
   </w:abstractNum>
-  <w:abstractNum w:abstractNumId="181" w15:restartNumberingAfterBreak="0">
+  <w:abstractNum w:abstractNumId="183" w15:restartNumberingAfterBreak="0">
     <w:nsid w:val="7AFF575A"/>
     <w:multiLevelType w:val="hybridMultilevel"/>
     <w:tmpl w:val="A6323D3E"/>
@@ -38338,7 +39694,7 @@
       </w:rPr>
     </w:lvl>
   </w:abstractNum>
-  <w:abstractNum w:abstractNumId="182" w15:restartNumberingAfterBreak="0">
+  <w:abstractNum w:abstractNumId="184" w15:restartNumberingAfterBreak="0">
     <w:nsid w:val="7B4018BF"/>
     <w:multiLevelType w:val="multilevel"/>
     <w:tmpl w:val="63F4E6F0"/>
@@ -38487,7 +39843,7 @@
       </w:rPr>
     </w:lvl>
   </w:abstractNum>
-  <w:abstractNum w:abstractNumId="183" w15:restartNumberingAfterBreak="0">
+  <w:abstractNum w:abstractNumId="185" w15:restartNumberingAfterBreak="0">
     <w:nsid w:val="7B4D1B33"/>
     <w:multiLevelType w:val="hybridMultilevel"/>
     <w:tmpl w:val="5EAC717E"/>
@@ -38599,7 +39955,7 @@
       </w:rPr>
     </w:lvl>
   </w:abstractNum>
-  <w:abstractNum w:abstractNumId="184" w15:restartNumberingAfterBreak="0">
+  <w:abstractNum w:abstractNumId="186" w15:restartNumberingAfterBreak="0">
     <w:nsid w:val="7C437108"/>
     <w:multiLevelType w:val="hybridMultilevel"/>
     <w:tmpl w:val="3222D0E8"/>
@@ -38712,7 +40068,7 @@
       </w:rPr>
     </w:lvl>
   </w:abstractNum>
-  <w:abstractNum w:abstractNumId="185" w15:restartNumberingAfterBreak="0">
+  <w:abstractNum w:abstractNumId="187" w15:restartNumberingAfterBreak="0">
     <w:nsid w:val="7CAC27CD"/>
     <w:multiLevelType w:val="multilevel"/>
     <w:tmpl w:val="3BC20E58"/>
@@ -38861,7 +40217,7 @@
       </w:rPr>
     </w:lvl>
   </w:abstractNum>
-  <w:abstractNum w:abstractNumId="186" w15:restartNumberingAfterBreak="0">
+  <w:abstractNum w:abstractNumId="188" w15:restartNumberingAfterBreak="0">
     <w:nsid w:val="7DBE326E"/>
     <w:multiLevelType w:val="hybridMultilevel"/>
     <w:tmpl w:val="AFC0D8D6"/>
@@ -38974,7 +40330,7 @@
       </w:rPr>
     </w:lvl>
   </w:abstractNum>
-  <w:abstractNum w:abstractNumId="187" w15:restartNumberingAfterBreak="0">
+  <w:abstractNum w:abstractNumId="189" w15:restartNumberingAfterBreak="0">
     <w:nsid w:val="7E5978EA"/>
     <w:multiLevelType w:val="hybridMultilevel"/>
     <w:tmpl w:val="D74C0DB0"/>
@@ -39086,7 +40442,7 @@
       </w:rPr>
     </w:lvl>
   </w:abstractNum>
-  <w:abstractNum w:abstractNumId="188" w15:restartNumberingAfterBreak="0">
+  <w:abstractNum w:abstractNumId="190" w15:restartNumberingAfterBreak="0">
     <w:nsid w:val="7F106A5D"/>
     <w:multiLevelType w:val="hybridMultilevel"/>
     <w:tmpl w:val="A1CA4816"/>
@@ -39198,7 +40554,7 @@
       </w:rPr>
     </w:lvl>
   </w:abstractNum>
-  <w:abstractNum w:abstractNumId="189" w15:restartNumberingAfterBreak="0">
+  <w:abstractNum w:abstractNumId="191" w15:restartNumberingAfterBreak="0">
     <w:nsid w:val="7FD679F5"/>
     <w:multiLevelType w:val="hybridMultilevel"/>
     <w:tmpl w:val="1ED417E8"/>
@@ -39312,7 +40668,7 @@
     </w:lvl>
   </w:abstractNum>
   <w:num w:numId="1" w16cid:durableId="1882476756">
-    <w:abstractNumId w:val="105"/>
+    <w:abstractNumId w:val="107"/>
   </w:num>
   <w:num w:numId="2" w16cid:durableId="871453468">
     <w:abstractNumId w:val="28"/>
@@ -39321,73 +40677,73 @@
     <w:abstractNumId w:val="44"/>
   </w:num>
   <w:num w:numId="4" w16cid:durableId="1105467722">
-    <w:abstractNumId w:val="86"/>
+    <w:abstractNumId w:val="88"/>
   </w:num>
   <w:num w:numId="5" w16cid:durableId="769932622">
-    <w:abstractNumId w:val="125"/>
+    <w:abstractNumId w:val="127"/>
   </w:num>
   <w:num w:numId="6" w16cid:durableId="575944109">
     <w:abstractNumId w:val="48"/>
   </w:num>
   <w:num w:numId="7" w16cid:durableId="877661689">
-    <w:abstractNumId w:val="165"/>
+    <w:abstractNumId w:val="167"/>
   </w:num>
   <w:num w:numId="8" w16cid:durableId="1390107422">
-    <w:abstractNumId w:val="92"/>
+    <w:abstractNumId w:val="94"/>
   </w:num>
   <w:num w:numId="9" w16cid:durableId="881866424">
-    <w:abstractNumId w:val="122"/>
+    <w:abstractNumId w:val="124"/>
   </w:num>
   <w:num w:numId="10" w16cid:durableId="1037244995">
-    <w:abstractNumId w:val="155"/>
+    <w:abstractNumId w:val="157"/>
   </w:num>
   <w:num w:numId="11" w16cid:durableId="1575554597">
-    <w:abstractNumId w:val="73"/>
+    <w:abstractNumId w:val="75"/>
   </w:num>
   <w:num w:numId="12" w16cid:durableId="915364478">
-    <w:abstractNumId w:val="101"/>
+    <w:abstractNumId w:val="103"/>
   </w:num>
   <w:num w:numId="13" w16cid:durableId="1386294114">
-    <w:abstractNumId w:val="145"/>
+    <w:abstractNumId w:val="147"/>
   </w:num>
   <w:num w:numId="14" w16cid:durableId="1071851223">
     <w:abstractNumId w:val="30"/>
   </w:num>
   <w:num w:numId="15" w16cid:durableId="1545557520">
-    <w:abstractNumId w:val="87"/>
+    <w:abstractNumId w:val="89"/>
   </w:num>
   <w:num w:numId="16" w16cid:durableId="1102919547">
-    <w:abstractNumId w:val="185"/>
+    <w:abstractNumId w:val="187"/>
   </w:num>
   <w:num w:numId="17" w16cid:durableId="294526838">
-    <w:abstractNumId w:val="60"/>
+    <w:abstractNumId w:val="61"/>
   </w:num>
   <w:num w:numId="18" w16cid:durableId="679889896">
-    <w:abstractNumId w:val="70"/>
+    <w:abstractNumId w:val="72"/>
   </w:num>
   <w:num w:numId="19" w16cid:durableId="2119449470">
-    <w:abstractNumId w:val="118"/>
+    <w:abstractNumId w:val="120"/>
   </w:num>
   <w:num w:numId="20" w16cid:durableId="1365054799">
     <w:abstractNumId w:val="16"/>
   </w:num>
   <w:num w:numId="21" w16cid:durableId="1683512738">
-    <w:abstractNumId w:val="71"/>
+    <w:abstractNumId w:val="73"/>
   </w:num>
   <w:num w:numId="22" w16cid:durableId="1080098953">
-    <w:abstractNumId w:val="152"/>
+    <w:abstractNumId w:val="154"/>
   </w:num>
   <w:num w:numId="23" w16cid:durableId="1635717296">
-    <w:abstractNumId w:val="78"/>
+    <w:abstractNumId w:val="80"/>
   </w:num>
   <w:num w:numId="24" w16cid:durableId="544873123">
-    <w:abstractNumId w:val="144"/>
+    <w:abstractNumId w:val="146"/>
   </w:num>
   <w:num w:numId="25" w16cid:durableId="1128352778">
     <w:abstractNumId w:val="15"/>
   </w:num>
   <w:num w:numId="26" w16cid:durableId="1732537407">
-    <w:abstractNumId w:val="159"/>
+    <w:abstractNumId w:val="161"/>
   </w:num>
   <w:num w:numId="27" w16cid:durableId="945502064">
     <w:abstractNumId w:val="8"/>
@@ -39396,10 +40752,10 @@
     <w:abstractNumId w:val="3"/>
   </w:num>
   <w:num w:numId="29" w16cid:durableId="815955639">
-    <w:abstractNumId w:val="69"/>
+    <w:abstractNumId w:val="71"/>
   </w:num>
   <w:num w:numId="30" w16cid:durableId="1500659483">
-    <w:abstractNumId w:val="97"/>
+    <w:abstractNumId w:val="99"/>
   </w:num>
   <w:num w:numId="31" w16cid:durableId="118301211">
     <w:abstractNumId w:val="18"/>
@@ -39411,46 +40767,46 @@
     <w:abstractNumId w:val="21"/>
   </w:num>
   <w:num w:numId="34" w16cid:durableId="1470708820">
-    <w:abstractNumId w:val="55"/>
+    <w:abstractNumId w:val="56"/>
   </w:num>
   <w:num w:numId="35" w16cid:durableId="356852923">
-    <w:abstractNumId w:val="117"/>
+    <w:abstractNumId w:val="119"/>
   </w:num>
   <w:num w:numId="36" w16cid:durableId="430662559">
     <w:abstractNumId w:val="24"/>
   </w:num>
   <w:num w:numId="37" w16cid:durableId="247080868">
-    <w:abstractNumId w:val="173"/>
+    <w:abstractNumId w:val="175"/>
   </w:num>
   <w:num w:numId="38" w16cid:durableId="158887408">
-    <w:abstractNumId w:val="141"/>
+    <w:abstractNumId w:val="143"/>
   </w:num>
   <w:num w:numId="39" w16cid:durableId="1681347932">
-    <w:abstractNumId w:val="164"/>
+    <w:abstractNumId w:val="166"/>
   </w:num>
   <w:num w:numId="40" w16cid:durableId="2101440158">
-    <w:abstractNumId w:val="90"/>
+    <w:abstractNumId w:val="92"/>
   </w:num>
   <w:num w:numId="41" w16cid:durableId="1250391122">
-    <w:abstractNumId w:val="136"/>
+    <w:abstractNumId w:val="138"/>
   </w:num>
   <w:num w:numId="42" w16cid:durableId="479083359">
-    <w:abstractNumId w:val="170"/>
+    <w:abstractNumId w:val="172"/>
   </w:num>
   <w:num w:numId="43" w16cid:durableId="1557860317">
-    <w:abstractNumId w:val="119"/>
+    <w:abstractNumId w:val="121"/>
   </w:num>
   <w:num w:numId="44" w16cid:durableId="2142183763">
     <w:abstractNumId w:val="10"/>
   </w:num>
   <w:num w:numId="45" w16cid:durableId="1357736349">
-    <w:abstractNumId w:val="179"/>
+    <w:abstractNumId w:val="181"/>
   </w:num>
   <w:num w:numId="46" w16cid:durableId="1519656040">
-    <w:abstractNumId w:val="178"/>
+    <w:abstractNumId w:val="180"/>
   </w:num>
   <w:num w:numId="47" w16cid:durableId="1078596852">
-    <w:abstractNumId w:val="188"/>
+    <w:abstractNumId w:val="190"/>
   </w:num>
   <w:num w:numId="48" w16cid:durableId="1027950100">
     <w:abstractNumId w:val="41"/>
@@ -39459,22 +40815,22 @@
     <w:abstractNumId w:val="23"/>
   </w:num>
   <w:num w:numId="50" w16cid:durableId="363404927">
-    <w:abstractNumId w:val="79"/>
+    <w:abstractNumId w:val="81"/>
   </w:num>
   <w:num w:numId="51" w16cid:durableId="1128354320">
-    <w:abstractNumId w:val="157"/>
+    <w:abstractNumId w:val="159"/>
   </w:num>
   <w:num w:numId="52" w16cid:durableId="248543928">
-    <w:abstractNumId w:val="89"/>
+    <w:abstractNumId w:val="91"/>
   </w:num>
   <w:num w:numId="53" w16cid:durableId="965889214">
-    <w:abstractNumId w:val="123"/>
+    <w:abstractNumId w:val="125"/>
   </w:num>
   <w:num w:numId="54" w16cid:durableId="1827503240">
-    <w:abstractNumId w:val="134"/>
+    <w:abstractNumId w:val="136"/>
   </w:num>
   <w:num w:numId="55" w16cid:durableId="505748256">
-    <w:abstractNumId w:val="111"/>
+    <w:abstractNumId w:val="113"/>
   </w:num>
   <w:num w:numId="56" w16cid:durableId="2120370925">
     <w:abstractNumId w:val="38"/>
@@ -39483,52 +40839,52 @@
     <w:abstractNumId w:val="19"/>
   </w:num>
   <w:num w:numId="58" w16cid:durableId="1000235123">
-    <w:abstractNumId w:val="120"/>
+    <w:abstractNumId w:val="122"/>
   </w:num>
   <w:num w:numId="59" w16cid:durableId="628516409">
-    <w:abstractNumId w:val="156"/>
+    <w:abstractNumId w:val="158"/>
   </w:num>
   <w:num w:numId="60" w16cid:durableId="2028865444">
-    <w:abstractNumId w:val="107"/>
+    <w:abstractNumId w:val="109"/>
   </w:num>
   <w:num w:numId="61" w16cid:durableId="943926811">
-    <w:abstractNumId w:val="183"/>
+    <w:abstractNumId w:val="185"/>
   </w:num>
   <w:num w:numId="62" w16cid:durableId="1841193257">
-    <w:abstractNumId w:val="82"/>
+    <w:abstractNumId w:val="84"/>
   </w:num>
   <w:num w:numId="63" w16cid:durableId="682322850">
-    <w:abstractNumId w:val="161"/>
+    <w:abstractNumId w:val="163"/>
   </w:num>
   <w:num w:numId="64" w16cid:durableId="2043705333">
-    <w:abstractNumId w:val="83"/>
+    <w:abstractNumId w:val="85"/>
   </w:num>
   <w:num w:numId="65" w16cid:durableId="1164854761">
-    <w:abstractNumId w:val="59"/>
+    <w:abstractNumId w:val="60"/>
   </w:num>
   <w:num w:numId="66" w16cid:durableId="1919972541">
-    <w:abstractNumId w:val="103"/>
+    <w:abstractNumId w:val="105"/>
   </w:num>
   <w:num w:numId="67" w16cid:durableId="463617329">
-    <w:abstractNumId w:val="63"/>
+    <w:abstractNumId w:val="64"/>
   </w:num>
   <w:num w:numId="68" w16cid:durableId="2064014330">
-    <w:abstractNumId w:val="128"/>
+    <w:abstractNumId w:val="130"/>
   </w:num>
   <w:num w:numId="69" w16cid:durableId="452797354">
-    <w:abstractNumId w:val="135"/>
+    <w:abstractNumId w:val="137"/>
   </w:num>
   <w:num w:numId="70" w16cid:durableId="1196650037">
-    <w:abstractNumId w:val="53"/>
+    <w:abstractNumId w:val="54"/>
   </w:num>
   <w:num w:numId="71" w16cid:durableId="940071828">
-    <w:abstractNumId w:val="177"/>
+    <w:abstractNumId w:val="179"/>
   </w:num>
   <w:num w:numId="72" w16cid:durableId="1608273926">
-    <w:abstractNumId w:val="85"/>
+    <w:abstractNumId w:val="87"/>
   </w:num>
   <w:num w:numId="73" w16cid:durableId="2009864772">
-    <w:abstractNumId w:val="104"/>
+    <w:abstractNumId w:val="106"/>
   </w:num>
   <w:num w:numId="74" w16cid:durableId="712267004">
     <w:abstractNumId w:val="40"/>
@@ -39537,31 +40893,31 @@
     <w:abstractNumId w:val="35"/>
   </w:num>
   <w:num w:numId="76" w16cid:durableId="286202349">
-    <w:abstractNumId w:val="139"/>
+    <w:abstractNumId w:val="141"/>
   </w:num>
   <w:num w:numId="77" w16cid:durableId="156460757">
-    <w:abstractNumId w:val="74"/>
+    <w:abstractNumId w:val="76"/>
   </w:num>
   <w:num w:numId="78" w16cid:durableId="1230077056">
     <w:abstractNumId w:val="6"/>
   </w:num>
   <w:num w:numId="79" w16cid:durableId="1837106927">
-    <w:abstractNumId w:val="52"/>
+    <w:abstractNumId w:val="53"/>
   </w:num>
   <w:num w:numId="80" w16cid:durableId="287929152">
     <w:abstractNumId w:val="39"/>
   </w:num>
   <w:num w:numId="81" w16cid:durableId="1672175260">
-    <w:abstractNumId w:val="99"/>
+    <w:abstractNumId w:val="101"/>
   </w:num>
   <w:num w:numId="82" w16cid:durableId="1954820163">
-    <w:abstractNumId w:val="62"/>
+    <w:abstractNumId w:val="63"/>
   </w:num>
   <w:num w:numId="83" w16cid:durableId="1990016594">
     <w:abstractNumId w:val="26"/>
   </w:num>
   <w:num w:numId="84" w16cid:durableId="366876741">
-    <w:abstractNumId w:val="106"/>
+    <w:abstractNumId w:val="108"/>
   </w:num>
   <w:num w:numId="85" w16cid:durableId="15274915">
     <w:abstractNumId w:val="42"/>
@@ -39570,22 +40926,22 @@
     <w:abstractNumId w:val="12"/>
   </w:num>
   <w:num w:numId="87" w16cid:durableId="591351385">
-    <w:abstractNumId w:val="124"/>
+    <w:abstractNumId w:val="126"/>
   </w:num>
   <w:num w:numId="88" w16cid:durableId="1361005725">
-    <w:abstractNumId w:val="181"/>
+    <w:abstractNumId w:val="183"/>
   </w:num>
   <w:num w:numId="89" w16cid:durableId="219681743">
     <w:abstractNumId w:val="13"/>
   </w:num>
   <w:num w:numId="90" w16cid:durableId="194386594">
-    <w:abstractNumId w:val="137"/>
+    <w:abstractNumId w:val="139"/>
   </w:num>
   <w:num w:numId="91" w16cid:durableId="777793346">
-    <w:abstractNumId w:val="95"/>
+    <w:abstractNumId w:val="97"/>
   </w:num>
   <w:num w:numId="92" w16cid:durableId="173346871">
-    <w:abstractNumId w:val="102"/>
+    <w:abstractNumId w:val="104"/>
   </w:num>
   <w:num w:numId="93" w16cid:durableId="948700467">
     <w:abstractNumId w:val="43"/>
@@ -39594,94 +40950,94 @@
     <w:abstractNumId w:val="25"/>
   </w:num>
   <w:num w:numId="95" w16cid:durableId="541676570">
-    <w:abstractNumId w:val="75"/>
+    <w:abstractNumId w:val="77"/>
   </w:num>
   <w:num w:numId="96" w16cid:durableId="694119229">
-    <w:abstractNumId w:val="100"/>
+    <w:abstractNumId w:val="102"/>
   </w:num>
   <w:num w:numId="97" w16cid:durableId="704327987">
-    <w:abstractNumId w:val="57"/>
+    <w:abstractNumId w:val="58"/>
   </w:num>
   <w:num w:numId="98" w16cid:durableId="1157303613">
     <w:abstractNumId w:val="27"/>
   </w:num>
   <w:num w:numId="99" w16cid:durableId="1706099794">
-    <w:abstractNumId w:val="163"/>
+    <w:abstractNumId w:val="165"/>
   </w:num>
   <w:num w:numId="100" w16cid:durableId="256404901">
-    <w:abstractNumId w:val="162"/>
+    <w:abstractNumId w:val="164"/>
   </w:num>
   <w:num w:numId="101" w16cid:durableId="924923012">
     <w:abstractNumId w:val="33"/>
   </w:num>
   <w:num w:numId="102" w16cid:durableId="536550966">
-    <w:abstractNumId w:val="182"/>
+    <w:abstractNumId w:val="184"/>
   </w:num>
   <w:num w:numId="103" w16cid:durableId="425157302">
-    <w:abstractNumId w:val="76"/>
+    <w:abstractNumId w:val="78"/>
   </w:num>
   <w:num w:numId="104" w16cid:durableId="967664612">
-    <w:abstractNumId w:val="148"/>
+    <w:abstractNumId w:val="150"/>
   </w:num>
   <w:num w:numId="105" w16cid:durableId="361631616">
-    <w:abstractNumId w:val="109"/>
+    <w:abstractNumId w:val="111"/>
   </w:num>
   <w:num w:numId="106" w16cid:durableId="443623616">
-    <w:abstractNumId w:val="153"/>
+    <w:abstractNumId w:val="155"/>
   </w:num>
   <w:num w:numId="107" w16cid:durableId="150101619">
     <w:abstractNumId w:val="14"/>
   </w:num>
   <w:num w:numId="108" w16cid:durableId="1431658174">
-    <w:abstractNumId w:val="61"/>
+    <w:abstractNumId w:val="62"/>
   </w:num>
   <w:num w:numId="109" w16cid:durableId="1050495440">
     <w:abstractNumId w:val="0"/>
   </w:num>
   <w:num w:numId="110" w16cid:durableId="712924661">
-    <w:abstractNumId w:val="132"/>
+    <w:abstractNumId w:val="134"/>
   </w:num>
   <w:num w:numId="111" w16cid:durableId="1917784113">
-    <w:abstractNumId w:val="126"/>
+    <w:abstractNumId w:val="128"/>
   </w:num>
   <w:num w:numId="112" w16cid:durableId="896237065">
-    <w:abstractNumId w:val="138"/>
+    <w:abstractNumId w:val="140"/>
   </w:num>
   <w:num w:numId="113" w16cid:durableId="1171681430">
-    <w:abstractNumId w:val="166"/>
+    <w:abstractNumId w:val="168"/>
   </w:num>
   <w:num w:numId="114" w16cid:durableId="1552573199">
-    <w:abstractNumId w:val="168"/>
+    <w:abstractNumId w:val="170"/>
   </w:num>
   <w:num w:numId="115" w16cid:durableId="1920869674">
-    <w:abstractNumId w:val="151"/>
+    <w:abstractNumId w:val="153"/>
   </w:num>
   <w:num w:numId="116" w16cid:durableId="476724716">
-    <w:abstractNumId w:val="113"/>
+    <w:abstractNumId w:val="115"/>
   </w:num>
   <w:num w:numId="117" w16cid:durableId="658919541">
-    <w:abstractNumId w:val="112"/>
+    <w:abstractNumId w:val="114"/>
   </w:num>
   <w:num w:numId="118" w16cid:durableId="1622418131">
-    <w:abstractNumId w:val="50"/>
+    <w:abstractNumId w:val="51"/>
   </w:num>
   <w:num w:numId="119" w16cid:durableId="1693994672">
     <w:abstractNumId w:val="2"/>
   </w:num>
   <w:num w:numId="120" w16cid:durableId="396828229">
-    <w:abstractNumId w:val="176"/>
+    <w:abstractNumId w:val="178"/>
   </w:num>
   <w:num w:numId="121" w16cid:durableId="986058889">
     <w:abstractNumId w:val="22"/>
   </w:num>
   <w:num w:numId="122" w16cid:durableId="1224410703">
-    <w:abstractNumId w:val="65"/>
+    <w:abstractNumId w:val="66"/>
   </w:num>
   <w:num w:numId="123" w16cid:durableId="1804040304">
-    <w:abstractNumId w:val="94"/>
+    <w:abstractNumId w:val="96"/>
   </w:num>
   <w:num w:numId="124" w16cid:durableId="114181197">
-    <w:abstractNumId w:val="174"/>
+    <w:abstractNumId w:val="176"/>
   </w:num>
   <w:num w:numId="125" w16cid:durableId="772671624">
     <w:abstractNumId w:val="5"/>
@@ -39690,100 +41046,100 @@
     <w:abstractNumId w:val="9"/>
   </w:num>
   <w:num w:numId="127" w16cid:durableId="1818105337">
-    <w:abstractNumId w:val="56"/>
+    <w:abstractNumId w:val="57"/>
   </w:num>
   <w:num w:numId="128" w16cid:durableId="384987847">
     <w:abstractNumId w:val="34"/>
   </w:num>
   <w:num w:numId="129" w16cid:durableId="659895420">
-    <w:abstractNumId w:val="64"/>
+    <w:abstractNumId w:val="65"/>
   </w:num>
   <w:num w:numId="130" w16cid:durableId="1168907903">
-    <w:abstractNumId w:val="154"/>
+    <w:abstractNumId w:val="156"/>
   </w:num>
   <w:num w:numId="131" w16cid:durableId="430206235">
-    <w:abstractNumId w:val="142"/>
+    <w:abstractNumId w:val="144"/>
   </w:num>
   <w:num w:numId="132" w16cid:durableId="1207327089">
     <w:abstractNumId w:val="31"/>
   </w:num>
   <w:num w:numId="133" w16cid:durableId="596404292">
-    <w:abstractNumId w:val="129"/>
+    <w:abstractNumId w:val="131"/>
   </w:num>
   <w:num w:numId="134" w16cid:durableId="2070372549">
     <w:abstractNumId w:val="47"/>
   </w:num>
   <w:num w:numId="135" w16cid:durableId="1841265039">
-    <w:abstractNumId w:val="51"/>
+    <w:abstractNumId w:val="52"/>
   </w:num>
   <w:num w:numId="136" w16cid:durableId="1988632595">
     <w:abstractNumId w:val="45"/>
   </w:num>
   <w:num w:numId="137" w16cid:durableId="1218275126">
-    <w:abstractNumId w:val="80"/>
+    <w:abstractNumId w:val="82"/>
   </w:num>
   <w:num w:numId="138" w16cid:durableId="568660900">
-    <w:abstractNumId w:val="88"/>
+    <w:abstractNumId w:val="90"/>
   </w:num>
   <w:num w:numId="139" w16cid:durableId="967976864">
-    <w:abstractNumId w:val="130"/>
+    <w:abstractNumId w:val="132"/>
   </w:num>
   <w:num w:numId="140" w16cid:durableId="650643288">
-    <w:abstractNumId w:val="149"/>
+    <w:abstractNumId w:val="151"/>
   </w:num>
   <w:num w:numId="141" w16cid:durableId="219370247">
-    <w:abstractNumId w:val="146"/>
+    <w:abstractNumId w:val="148"/>
   </w:num>
   <w:num w:numId="142" w16cid:durableId="323239876">
-    <w:abstractNumId w:val="187"/>
+    <w:abstractNumId w:val="189"/>
   </w:num>
   <w:num w:numId="143" w16cid:durableId="1619793156">
     <w:abstractNumId w:val="37"/>
   </w:num>
   <w:num w:numId="144" w16cid:durableId="1186332867">
-    <w:abstractNumId w:val="158"/>
+    <w:abstractNumId w:val="160"/>
   </w:num>
   <w:num w:numId="145" w16cid:durableId="89937035">
-    <w:abstractNumId w:val="58"/>
+    <w:abstractNumId w:val="59"/>
   </w:num>
   <w:num w:numId="146" w16cid:durableId="542210424">
-    <w:abstractNumId w:val="84"/>
+    <w:abstractNumId w:val="86"/>
   </w:num>
   <w:num w:numId="147" w16cid:durableId="1194659616">
     <w:abstractNumId w:val="7"/>
   </w:num>
   <w:num w:numId="148" w16cid:durableId="1544974653">
-    <w:abstractNumId w:val="171"/>
+    <w:abstractNumId w:val="173"/>
   </w:num>
   <w:num w:numId="149" w16cid:durableId="1664625526">
+    <w:abstractNumId w:val="68"/>
+  </w:num>
+  <w:num w:numId="150" w16cid:durableId="678197415">
+    <w:abstractNumId w:val="149"/>
+  </w:num>
+  <w:num w:numId="151" w16cid:durableId="1193106551">
+    <w:abstractNumId w:val="118"/>
+  </w:num>
+  <w:num w:numId="152" w16cid:durableId="1209760807">
     <w:abstractNumId w:val="67"/>
   </w:num>
-  <w:num w:numId="150" w16cid:durableId="678197415">
-    <w:abstractNumId w:val="147"/>
+  <w:num w:numId="153" w16cid:durableId="1994025825">
+    <w:abstractNumId w:val="74"/>
   </w:num>
-  <w:num w:numId="151" w16cid:durableId="1193106551">
+  <w:num w:numId="154" w16cid:durableId="2121295621">
+    <w:abstractNumId w:val="174"/>
+  </w:num>
+  <w:num w:numId="155" w16cid:durableId="292684904">
+    <w:abstractNumId w:val="93"/>
+  </w:num>
+  <w:num w:numId="156" w16cid:durableId="769400072">
+    <w:abstractNumId w:val="186"/>
+  </w:num>
+  <w:num w:numId="157" w16cid:durableId="1930693824">
     <w:abstractNumId w:val="116"/>
   </w:num>
-  <w:num w:numId="152" w16cid:durableId="1209760807">
-    <w:abstractNumId w:val="66"/>
-  </w:num>
-  <w:num w:numId="153" w16cid:durableId="1994025825">
-    <w:abstractNumId w:val="72"/>
-  </w:num>
-  <w:num w:numId="154" w16cid:durableId="2121295621">
-    <w:abstractNumId w:val="172"/>
-  </w:num>
-  <w:num w:numId="155" w16cid:durableId="292684904">
-    <w:abstractNumId w:val="91"/>
-  </w:num>
-  <w:num w:numId="156" w16cid:durableId="769400072">
-    <w:abstractNumId w:val="184"/>
-  </w:num>
-  <w:num w:numId="157" w16cid:durableId="1930693824">
-    <w:abstractNumId w:val="114"/>
-  </w:num>
   <w:num w:numId="158" w16cid:durableId="813957946">
-    <w:abstractNumId w:val="167"/>
+    <w:abstractNumId w:val="169"/>
   </w:num>
   <w:num w:numId="159" w16cid:durableId="1782143679">
     <w:abstractNumId w:val="36"/>
@@ -39792,94 +41148,100 @@
     <w:abstractNumId w:val="32"/>
   </w:num>
   <w:num w:numId="161" w16cid:durableId="1052270864">
-    <w:abstractNumId w:val="143"/>
+    <w:abstractNumId w:val="145"/>
   </w:num>
   <w:num w:numId="162" w16cid:durableId="762337137">
-    <w:abstractNumId w:val="108"/>
+    <w:abstractNumId w:val="110"/>
   </w:num>
   <w:num w:numId="163" w16cid:durableId="1682507263">
-    <w:abstractNumId w:val="93"/>
+    <w:abstractNumId w:val="95"/>
   </w:num>
   <w:num w:numId="164" w16cid:durableId="871957078">
-    <w:abstractNumId w:val="127"/>
+    <w:abstractNumId w:val="129"/>
   </w:num>
   <w:num w:numId="165" w16cid:durableId="601960416">
-    <w:abstractNumId w:val="150"/>
+    <w:abstractNumId w:val="152"/>
   </w:num>
   <w:num w:numId="166" w16cid:durableId="574900497">
-    <w:abstractNumId w:val="140"/>
+    <w:abstractNumId w:val="142"/>
   </w:num>
   <w:num w:numId="167" w16cid:durableId="1477644837">
-    <w:abstractNumId w:val="98"/>
+    <w:abstractNumId w:val="100"/>
   </w:num>
   <w:num w:numId="168" w16cid:durableId="1618100933">
-    <w:abstractNumId w:val="169"/>
+    <w:abstractNumId w:val="171"/>
   </w:num>
   <w:num w:numId="169" w16cid:durableId="1266614374">
-    <w:abstractNumId w:val="180"/>
+    <w:abstractNumId w:val="182"/>
   </w:num>
   <w:num w:numId="170" w16cid:durableId="67534002">
     <w:abstractNumId w:val="1"/>
   </w:num>
   <w:num w:numId="171" w16cid:durableId="1336614003">
-    <w:abstractNumId w:val="54"/>
+    <w:abstractNumId w:val="55"/>
   </w:num>
   <w:num w:numId="172" w16cid:durableId="827554792">
-    <w:abstractNumId w:val="110"/>
+    <w:abstractNumId w:val="112"/>
   </w:num>
   <w:num w:numId="173" w16cid:durableId="186605808">
     <w:abstractNumId w:val="29"/>
   </w:num>
   <w:num w:numId="174" w16cid:durableId="1000935913">
-    <w:abstractNumId w:val="131"/>
+    <w:abstractNumId w:val="133"/>
   </w:num>
   <w:num w:numId="175" w16cid:durableId="685984279">
     <w:abstractNumId w:val="46"/>
   </w:num>
   <w:num w:numId="176" w16cid:durableId="355473142">
-    <w:abstractNumId w:val="186"/>
+    <w:abstractNumId w:val="188"/>
   </w:num>
   <w:num w:numId="177" w16cid:durableId="1580820927">
     <w:abstractNumId w:val="4"/>
   </w:num>
   <w:num w:numId="178" w16cid:durableId="1342977237">
-    <w:abstractNumId w:val="189"/>
+    <w:abstractNumId w:val="191"/>
   </w:num>
   <w:num w:numId="179" w16cid:durableId="1610351964">
-    <w:abstractNumId w:val="96"/>
+    <w:abstractNumId w:val="98"/>
   </w:num>
   <w:num w:numId="180" w16cid:durableId="1808428282">
-    <w:abstractNumId w:val="121"/>
+    <w:abstractNumId w:val="123"/>
   </w:num>
   <w:num w:numId="181" w16cid:durableId="1853181086">
     <w:abstractNumId w:val="17"/>
   </w:num>
   <w:num w:numId="182" w16cid:durableId="1968733980">
-    <w:abstractNumId w:val="77"/>
+    <w:abstractNumId w:val="79"/>
   </w:num>
   <w:num w:numId="183" w16cid:durableId="1707484209">
-    <w:abstractNumId w:val="160"/>
+    <w:abstractNumId w:val="162"/>
   </w:num>
   <w:num w:numId="184" w16cid:durableId="525101864">
-    <w:abstractNumId w:val="68"/>
+    <w:abstractNumId w:val="69"/>
   </w:num>
   <w:num w:numId="185" w16cid:durableId="923611674">
-    <w:abstractNumId w:val="133"/>
+    <w:abstractNumId w:val="135"/>
   </w:num>
   <w:num w:numId="186" w16cid:durableId="379020453">
-    <w:abstractNumId w:val="115"/>
+    <w:abstractNumId w:val="117"/>
   </w:num>
   <w:num w:numId="187" w16cid:durableId="1417243495">
     <w:abstractNumId w:val="20"/>
   </w:num>
   <w:num w:numId="188" w16cid:durableId="662010916">
-    <w:abstractNumId w:val="81"/>
+    <w:abstractNumId w:val="83"/>
   </w:num>
   <w:num w:numId="189" w16cid:durableId="987903292">
     <w:abstractNumId w:val="11"/>
   </w:num>
   <w:num w:numId="190" w16cid:durableId="97912371">
-    <w:abstractNumId w:val="175"/>
+    <w:abstractNumId w:val="177"/>
+  </w:num>
+  <w:num w:numId="191" w16cid:durableId="566036694">
+    <w:abstractNumId w:val="50"/>
+  </w:num>
+  <w:num w:numId="192" w16cid:durableId="1063261162">
+    <w:abstractNumId w:val="70"/>
   </w:num>
 </w:numbering>
 </file>

</xml_diff>

<commit_message>
High-Level Architecture Diagram (#373)
</commit_message>
<xml_diff>
--- a/Software Architecture Design.docx
+++ b/Software Architecture Design.docx
@@ -16608,11 +16608,113 @@
     </w:p>
     <w:p>
       <w:pPr>
+        <w:pStyle w:val="Heading2"/>
+      </w:pPr>
+      <w:r>
+        <w:br w:type="page"/>
+      </w:r>
+      <w:r>
+        <w:lastRenderedPageBreak/>
+        <w:t>Architecture Diagram Modeling</w:t>
+      </w:r>
+    </w:p>
+    <w:p>
+      <w:pPr>
         <w:spacing w:line="278" w:lineRule="auto"/>
       </w:pPr>
       <w:r>
-        <w:br w:type="page"/>
-      </w:r>
+        <w:t>Architecture diagram modeling plays an important role in the software design phase by creating graphical representations of the structure of the system, as well as the relationship between its components. While the previous chapters have outlined the architectural decision making in terms of the concepts, this chapter describes the same decisions in terms of architectural diagrams.</w:t>
+      </w:r>
+    </w:p>
+    <w:p>
+      <w:pPr>
+        <w:spacing w:line="278" w:lineRule="auto"/>
+      </w:pPr>
+      <w:r>
+        <w:t>The aim of architecture diagram modeling is to show how software layers, components, infrastructure resources, external services, and deployment environment work together to implement the functionality of the platform. These diagrams, along with architectural descriptions, give a complete view of the system from different viewpoints such as logical, physical, deployment, communication, and security views.</w:t>
+      </w:r>
+    </w:p>
+    <w:p>
+      <w:pPr>
+        <w:spacing w:line="278" w:lineRule="auto"/>
+      </w:pPr>
+      <w:r>
+        <w:t>The diagrams discussed in this chapter are created according to the architecture created for the KriGo platform and adhere to common software engineering practices. The diagrams reflect the modularity of the system, separation of concerns between architectural layers, interaction between internal components, and the integration of the system with external services.</w:t>
+      </w:r>
+    </w:p>
+    <w:p>
+      <w:pPr>
+        <w:spacing w:line="278" w:lineRule="auto"/>
+      </w:pPr>
+      <w:r>
+        <w:t>In the following subchapters, the main architectural diagrams of the KriGo platform will be introduced. This includes the layered architecture, component architecture, deployment architecture, integration architecture, security architecture, and communication architecture diagrams. The whole set of diagrams provides a complete view of the software architecture and can be used during both development and maintenance phases of the system.</w:t>
+      </w:r>
+    </w:p>
+    <w:p>
+      <w:pPr>
+        <w:pStyle w:val="Heading3"/>
+      </w:pPr>
+      <w:r>
+        <w:t>High-Level Architecture Diagram</w:t>
+      </w:r>
+    </w:p>
+    <w:p>
+      <w:pPr>
+        <w:spacing w:line="278" w:lineRule="auto"/>
+      </w:pPr>
+      <w:r>
+        <w:t>The high-level architecture diagram gives a broad view of the architecture of the KriGo platform by presenting the main layers of the platform's architecture and the interactions of the key software components. Contrary to the low-level architecture diagrams provided in previous sections, the high-level architecture diagram provides a general overview of the whole system, thus allowing understanding of the collaboration between different applications, backend services, infrastructure components and other external systems that work together to implement the functionality of the KriGo platform.</w:t>
+      </w:r>
+      <w:r>
+        <w:t xml:space="preserve"> </w:t>
+      </w:r>
+      <w:r>
+        <w:t>T</w:t>
+      </w:r>
+      <w:r>
+        <w:t>he architecture has a layered organization, which allows for the implementation of the separation of concerns principle and promotes modularity and maintenance. Each layer has a special function, communicates with adjacent layers through well-defined interfaces and, thus, makes the evolution of the system, its scalability and maintenance easier.</w:t>
+      </w:r>
+    </w:p>
+    <w:p>
+      <w:pPr>
+        <w:spacing w:line="278" w:lineRule="auto"/>
+      </w:pPr>
+      <w:r>
+        <w:t>The Presentation Layer consists of the client applications for different categories of users. It includes the Web Application for customers, the Mobile Application, the Agency Application and the Administration Application. These applications give graphical interfaces, where users can access the services provided by the KriGo platform.</w:t>
+      </w:r>
+    </w:p>
+    <w:p>
+      <w:pPr>
+        <w:spacing w:line="278" w:lineRule="auto"/>
+      </w:pPr>
+      <w:r>
+        <w:t xml:space="preserve">The Gateway Layer is the entrance point to the backend infrastructure. It uses the NGINX reverse proxy that handles HTTPS communication, SSL termination, request routing and load </w:t>
+      </w:r>
+      <w:r>
+        <w:lastRenderedPageBreak/>
+        <w:t>balancing. It provides the protection of the internal services from any direct external access and guarantees the safe communication between the client and the backend.</w:t>
+      </w:r>
+      <w:r>
+        <w:t xml:space="preserve"> </w:t>
+      </w:r>
+    </w:p>
+    <w:p>
+      <w:pPr>
+        <w:spacing w:line="278" w:lineRule="auto"/>
+      </w:pPr>
+      <w:r>
+        <w:t>The Application Layer is the backbone of the KriGo platform. It includes the set of modular backend services developed using the NestJS framework, including the authentication service, the reservation management, the fleet management, the payment processing, the agency management, the notifications service, the artificial intelligence service, analytics and the reviews management.</w:t>
+      </w:r>
+    </w:p>
+    <w:p>
+      <w:pPr>
+        <w:spacing w:line="278" w:lineRule="auto"/>
+      </w:pPr>
+    </w:p>
+    <w:p>
+      <w:pPr>
+        <w:spacing w:line="278" w:lineRule="auto"/>
+      </w:pPr>
     </w:p>
     <w:sectPr>
       <w:headerReference w:type="default" r:id="rId27"/>

</xml_diff>